<commit_message>
Six Entities section has been added
</commit_message>
<xml_diff>
--- a/Introduction to DB-CS350 Project.docx
+++ b/Introduction to DB-CS350 Project.docx
@@ -80,7 +80,6 @@
                               <w:dataBinding w:prefixMappings="xmlns:ns0='http://purl.org/dc/elements/1.1/' xmlns:ns1='http://schemas.openxmlformats.org/package/2006/metadata/core-properties' " w:xpath="/ns1:coreProperties[1]/ns0:title[1]" w:storeItemID="{6C3C8BC8-F283-45AE-878A-BAB7291924A1}"/>
                               <w:text/>
                             </w:sdtPr>
-                            <w:sdtEndPr/>
                             <w:sdtContent>
                               <w:p>
                                 <w:pPr>
@@ -138,7 +137,6 @@
                                 <w:dataBinding w:prefixMappings="xmlns:ns0='http://purl.org/dc/elements/1.1/' xmlns:ns1='http://schemas.openxmlformats.org/package/2006/metadata/core-properties' " w:xpath="/ns1:coreProperties[1]/ns0:subject[1]" w:storeItemID="{6C3C8BC8-F283-45AE-878A-BAB7291924A1}"/>
                                 <w:text/>
                               </w:sdtPr>
-                              <w:sdtEndPr/>
                               <w:sdtContent>
                                 <w:r>
                                   <w:rPr>
@@ -381,7 +379,6 @@
                               <w:dataBinding w:prefixMappings="xmlns:ns0='http://schemas.microsoft.com/office/2006/coverPageProps'" w:xpath="/ns0:CoverPageProperties[1]/ns0:Abstract[1]" w:storeItemID="{55AF091B-3C7A-41E3-B477-F2FDAA23CFDA}"/>
                               <w:text/>
                             </w:sdtPr>
-                            <w:sdtEndPr/>
                             <w:sdtContent>
                               <w:p>
                                 <w:pPr>
@@ -474,7 +471,6 @@
                         <w:dataBinding w:prefixMappings="xmlns:ns0='http://purl.org/dc/elements/1.1/' xmlns:ns1='http://schemas.openxmlformats.org/package/2006/metadata/core-properties' " w:xpath="/ns1:coreProperties[1]/ns0:title[1]" w:storeItemID="{6C3C8BC8-F283-45AE-878A-BAB7291924A1}"/>
                         <w:text/>
                       </w:sdtPr>
-                      <w:sdtEndPr/>
                       <w:sdtContent>
                         <w:p>
                           <w:pPr>
@@ -532,7 +528,6 @@
                           <w:dataBinding w:prefixMappings="xmlns:ns0='http://purl.org/dc/elements/1.1/' xmlns:ns1='http://schemas.openxmlformats.org/package/2006/metadata/core-properties' " w:xpath="/ns1:coreProperties[1]/ns0:subject[1]" w:storeItemID="{6C3C8BC8-F283-45AE-878A-BAB7291924A1}"/>
                           <w:text/>
                         </w:sdtPr>
-                        <w:sdtEndPr/>
                         <w:sdtContent>
                           <w:r>
                             <w:rPr>
@@ -775,7 +770,6 @@
                         <w:dataBinding w:prefixMappings="xmlns:ns0='http://schemas.microsoft.com/office/2006/coverPageProps'" w:xpath="/ns0:CoverPageProperties[1]/ns0:Abstract[1]" w:storeItemID="{55AF091B-3C7A-41E3-B477-F2FDAA23CFDA}"/>
                         <w:text/>
                       </w:sdtPr>
-                      <w:sdtEndPr/>
                       <w:sdtContent>
                         <w:p>
                           <w:pPr>
@@ -1110,7 +1104,6 @@
           <w:docPartUnique/>
         </w:docPartObj>
       </w:sdtPr>
-      <w:sdtEndPr/>
       <w:sdtContent>
         <w:p>
           <w:pPr>
@@ -2242,7 +2235,6 @@
                                     <w:dataBinding w:prefixMappings="xmlns:ns0='http://schemas.openxmlformats.org/officeDocument/2006/extended-properties' " w:xpath="/ns0:Properties[1]/ns0:Company[1]" w:storeItemID="{6668398D-A668-4E3E-A5EB-62B293D839F1}"/>
                                     <w:text/>
                                   </w:sdtPr>
-                                  <w:sdtEndPr/>
                                   <w:sdtContent>
                                     <w:r>
                                       <w:t>Student Details:                                            CRN:</w:t>
@@ -2331,6 +2323,35 @@
                                           <w:szCs w:val="28"/>
                                         </w:rPr>
                                         <w:t xml:space="preserve"> </w:t>
+                                      </w:r>
+                                      <w:r>
+                                        <w:rPr>
+                                          <w:b/>
+                                          <w:bCs/>
+                                          <w:sz w:val="28"/>
+                                          <w:szCs w:val="28"/>
+                                        </w:rPr>
+                                        <w:t xml:space="preserve">Ramadan </w:t>
+                                      </w:r>
+                                      <w:proofErr w:type="spellStart"/>
+                                      <w:r>
+                                        <w:rPr>
+                                          <w:b/>
+                                          <w:bCs/>
+                                          <w:sz w:val="28"/>
+                                          <w:szCs w:val="28"/>
+                                        </w:rPr>
+                                        <w:t>Moraya</w:t>
+                                      </w:r>
+                                      <w:proofErr w:type="spellEnd"/>
+                                      <w:r>
+                                        <w:rPr>
+                                          <w:b/>
+                                          <w:bCs/>
+                                          <w:sz w:val="28"/>
+                                          <w:szCs w:val="28"/>
+                                        </w:rPr>
+                                        <w:t xml:space="preserve"> Hakami</w:t>
                                       </w:r>
                                     </w:p>
                                     <w:p>
@@ -2467,6 +2488,24 @@
                                           <w:szCs w:val="28"/>
                                         </w:rPr>
                                         <w:t xml:space="preserve">ID: </w:t>
+                                      </w:r>
+                                      <w:r>
+                                        <w:rPr>
+                                          <w:b/>
+                                          <w:bCs/>
+                                          <w:sz w:val="28"/>
+                                          <w:szCs w:val="28"/>
+                                        </w:rPr>
+                                        <w:t>S</w:t>
+                                      </w:r>
+                                      <w:r>
+                                        <w:rPr>
+                                          <w:b/>
+                                          <w:bCs/>
+                                          <w:sz w:val="28"/>
+                                          <w:szCs w:val="28"/>
+                                        </w:rPr>
+                                        <w:t>240050857</w:t>
                                       </w:r>
                                     </w:p>
                                     <w:p>
@@ -2641,7 +2680,6 @@
                               <w:dataBinding w:prefixMappings="xmlns:ns0='http://schemas.openxmlformats.org/officeDocument/2006/extended-properties' " w:xpath="/ns0:Properties[1]/ns0:Company[1]" w:storeItemID="{6668398D-A668-4E3E-A5EB-62B293D839F1}"/>
                               <w:text/>
                             </w:sdtPr>
-                            <w:sdtEndPr/>
                             <w:sdtContent>
                               <w:r>
                                 <w:t>Student Details:                                            CRN:</w:t>
@@ -2730,6 +2768,35 @@
                                     <w:szCs w:val="28"/>
                                   </w:rPr>
                                   <w:t xml:space="preserve"> </w:t>
+                                </w:r>
+                                <w:r>
+                                  <w:rPr>
+                                    <w:b/>
+                                    <w:bCs/>
+                                    <w:sz w:val="28"/>
+                                    <w:szCs w:val="28"/>
+                                  </w:rPr>
+                                  <w:t xml:space="preserve">Ramadan </w:t>
+                                </w:r>
+                                <w:proofErr w:type="spellStart"/>
+                                <w:r>
+                                  <w:rPr>
+                                    <w:b/>
+                                    <w:bCs/>
+                                    <w:sz w:val="28"/>
+                                    <w:szCs w:val="28"/>
+                                  </w:rPr>
+                                  <w:t>Moraya</w:t>
+                                </w:r>
+                                <w:proofErr w:type="spellEnd"/>
+                                <w:r>
+                                  <w:rPr>
+                                    <w:b/>
+                                    <w:bCs/>
+                                    <w:sz w:val="28"/>
+                                    <w:szCs w:val="28"/>
+                                  </w:rPr>
+                                  <w:t xml:space="preserve"> Hakami</w:t>
                                 </w:r>
                               </w:p>
                               <w:p>
@@ -2866,6 +2933,24 @@
                                     <w:szCs w:val="28"/>
                                   </w:rPr>
                                   <w:t xml:space="preserve">ID: </w:t>
+                                </w:r>
+                                <w:r>
+                                  <w:rPr>
+                                    <w:b/>
+                                    <w:bCs/>
+                                    <w:sz w:val="28"/>
+                                    <w:szCs w:val="28"/>
+                                  </w:rPr>
+                                  <w:t>S</w:t>
+                                </w:r>
+                                <w:r>
+                                  <w:rPr>
+                                    <w:b/>
+                                    <w:bCs/>
+                                    <w:sz w:val="28"/>
+                                    <w:szCs w:val="28"/>
+                                  </w:rPr>
+                                  <w:t>240050857</w:t>
                                 </w:r>
                               </w:p>
                               <w:p>
@@ -3138,6 +3223,7 @@
         </w:rPr>
         <w:t xml:space="preserve">This project </w:t>
       </w:r>
+      <w:proofErr w:type="gramStart"/>
       <w:r>
         <w:rPr>
           <w:rFonts w:ascii="Times New Roman" w:hAnsi="Times New Roman" w:cs="Times New Roman"/>
@@ -3147,7 +3233,19 @@
           <w:sz w:val="24"/>
           <w:szCs w:val="24"/>
         </w:rPr>
-        <w:t xml:space="preserve">worth </w:t>
+        <w:t>worth</w:t>
+      </w:r>
+      <w:proofErr w:type="gramEnd"/>
+      <w:r>
+        <w:rPr>
+          <w:rFonts w:ascii="Times New Roman" w:hAnsi="Times New Roman" w:cs="Times New Roman"/>
+          <w:b/>
+          <w:bCs/>
+          <w:color w:val="auto"/>
+          <w:sz w:val="24"/>
+          <w:szCs w:val="24"/>
+        </w:rPr>
+        <w:t xml:space="preserve"> </w:t>
       </w:r>
       <w:r>
         <w:rPr>
@@ -3986,7 +4084,25 @@
           <w:sz w:val="24"/>
           <w:szCs w:val="24"/>
         </w:rPr>
-        <w:t xml:space="preserve"> describing the completed work, key decisions, challenges, future plan, and contribution of each group member.</w:t>
+        <w:t xml:space="preserve"> describing the completed work, key decisions, challenges, </w:t>
+      </w:r>
+      <w:proofErr w:type="gramStart"/>
+      <w:r>
+        <w:rPr>
+          <w:rFonts w:ascii="Times New Roman" w:hAnsi="Times New Roman" w:cs="Times New Roman"/>
+          <w:sz w:val="24"/>
+          <w:szCs w:val="24"/>
+        </w:rPr>
+        <w:t>future plan</w:t>
+      </w:r>
+      <w:proofErr w:type="gramEnd"/>
+      <w:r>
+        <w:rPr>
+          <w:rFonts w:ascii="Times New Roman" w:hAnsi="Times New Roman" w:cs="Times New Roman"/>
+          <w:sz w:val="24"/>
+          <w:szCs w:val="24"/>
+        </w:rPr>
+        <w:t>, and contribution of each group member.</w:t>
       </w:r>
     </w:p>
     <w:p>
@@ -4029,7 +4145,25 @@
           <w:sz w:val="24"/>
           <w:szCs w:val="24"/>
         </w:rPr>
-        <w:t xml:space="preserve"> to the live report document, GitHub/GitLab repository, and Google Colab notebook (if applicable) in the </w:t>
+        <w:t xml:space="preserve"> to the live report document, GitHub/GitLab repository, and Google </w:t>
+      </w:r>
+      <w:proofErr w:type="spellStart"/>
+      <w:r>
+        <w:rPr>
+          <w:rFonts w:ascii="Times New Roman" w:hAnsi="Times New Roman" w:cs="Times New Roman"/>
+          <w:sz w:val="24"/>
+          <w:szCs w:val="24"/>
+        </w:rPr>
+        <w:t>Colab</w:t>
+      </w:r>
+      <w:proofErr w:type="spellEnd"/>
+      <w:r>
+        <w:rPr>
+          <w:rFonts w:ascii="Times New Roman" w:hAnsi="Times New Roman" w:cs="Times New Roman"/>
+          <w:sz w:val="24"/>
+          <w:szCs w:val="24"/>
+        </w:rPr>
+        <w:t xml:space="preserve"> notebook (if applicable) in the </w:t>
       </w:r>
       <w:r>
         <w:rPr>
@@ -4719,7 +4853,25 @@
           <w:sz w:val="24"/>
           <w:szCs w:val="24"/>
         </w:rPr>
-        <w:t>A private clinic currently manages its patient information manually, making it difficult to organize appointments, treatments, and payments. The clinic has decided to develop a database system to improve data organization and retrieval.</w:t>
+        <w:t xml:space="preserve">A private clinic currently manages </w:t>
+      </w:r>
+      <w:proofErr w:type="gramStart"/>
+      <w:r>
+        <w:rPr>
+          <w:rFonts w:ascii="Times New Roman" w:hAnsi="Times New Roman" w:cs="Times New Roman"/>
+          <w:sz w:val="24"/>
+          <w:szCs w:val="24"/>
+        </w:rPr>
+        <w:t>its patient</w:t>
+      </w:r>
+      <w:proofErr w:type="gramEnd"/>
+      <w:r>
+        <w:rPr>
+          <w:rFonts w:ascii="Times New Roman" w:hAnsi="Times New Roman" w:cs="Times New Roman"/>
+          <w:sz w:val="24"/>
+          <w:szCs w:val="24"/>
+        </w:rPr>
+        <w:t xml:space="preserve"> information manually, making it difficult to organize appointments, treatments, and payments. The clinic has decided to develop a database system to improve data organization and retrieval.</w:t>
       </w:r>
     </w:p>
     <w:p>
@@ -4785,7 +4937,27 @@
           <w:szCs w:val="24"/>
           <w:lang w:val="es-ES"/>
         </w:rPr>
-        <w:t>A complete ER/EER diagram.</w:t>
+        <w:t xml:space="preserve">A complete ER/EER </w:t>
+      </w:r>
+      <w:proofErr w:type="spellStart"/>
+      <w:r>
+        <w:rPr>
+          <w:rFonts w:ascii="Times New Roman" w:hAnsi="Times New Roman" w:cs="Times New Roman"/>
+          <w:sz w:val="24"/>
+          <w:szCs w:val="24"/>
+          <w:lang w:val="es-ES"/>
+        </w:rPr>
+        <w:t>diagram</w:t>
+      </w:r>
+      <w:proofErr w:type="spellEnd"/>
+      <w:r>
+        <w:rPr>
+          <w:rFonts w:ascii="Times New Roman" w:hAnsi="Times New Roman" w:cs="Times New Roman"/>
+          <w:sz w:val="24"/>
+          <w:szCs w:val="24"/>
+          <w:lang w:val="es-ES"/>
+        </w:rPr>
+        <w:t>.</w:t>
       </w:r>
     </w:p>
     <w:p>
@@ -4859,6 +5031,293 @@
         </w:rPr>
         <w:t>Any assumptions made during the design process.</w:t>
       </w:r>
+    </w:p>
+    <w:p>
+      <w:pPr>
+        <w:pStyle w:val="ListBullet"/>
+        <w:numPr>
+          <w:ilvl w:val="0"/>
+          <w:numId w:val="0"/>
+        </w:numPr>
+        <w:ind w:left="576" w:hanging="288"/>
+        <w:rPr>
+          <w:rFonts w:ascii="Times New Roman" w:hAnsi="Times New Roman" w:cs="Times New Roman"/>
+          <w:sz w:val="24"/>
+          <w:szCs w:val="24"/>
+        </w:rPr>
+      </w:pPr>
+    </w:p>
+    <w:p>
+      <w:pPr>
+        <w:pStyle w:val="ListBullet"/>
+        <w:numPr>
+          <w:ilvl w:val="0"/>
+          <w:numId w:val="0"/>
+        </w:numPr>
+        <w:ind w:left="576" w:hanging="288"/>
+        <w:rPr>
+          <w:rFonts w:ascii="Times New Roman" w:hAnsi="Times New Roman" w:cs="Times New Roman"/>
+          <w:sz w:val="24"/>
+          <w:szCs w:val="24"/>
+        </w:rPr>
+      </w:pPr>
+    </w:p>
+    <w:p>
+      <w:pPr>
+        <w:pStyle w:val="ListBullet"/>
+        <w:numPr>
+          <w:ilvl w:val="0"/>
+          <w:numId w:val="30"/>
+        </w:numPr>
+        <w:rPr>
+          <w:rFonts w:ascii="Times New Roman" w:hAnsi="Times New Roman" w:cs="Times New Roman"/>
+          <w:b/>
+          <w:bCs/>
+          <w:color w:val="auto"/>
+          <w:sz w:val="28"/>
+          <w:szCs w:val="28"/>
+        </w:rPr>
+      </w:pPr>
+      <w:r>
+        <w:rPr>
+          <w:rFonts w:ascii="Times New Roman" w:hAnsi="Times New Roman" w:cs="Times New Roman"/>
+          <w:b/>
+          <w:bCs/>
+          <w:color w:val="auto"/>
+          <w:sz w:val="28"/>
+          <w:szCs w:val="28"/>
+        </w:rPr>
+        <w:t>Six Entities:</w:t>
+      </w:r>
+    </w:p>
+    <w:p>
+      <w:pPr>
+        <w:pStyle w:val="ListBullet"/>
+        <w:numPr>
+          <w:ilvl w:val="0"/>
+          <w:numId w:val="0"/>
+        </w:numPr>
+        <w:ind w:left="576" w:hanging="288"/>
+        <w:rPr>
+          <w:rFonts w:ascii="Times New Roman" w:hAnsi="Times New Roman" w:cs="Times New Roman"/>
+          <w:b/>
+          <w:bCs/>
+          <w:color w:val="auto"/>
+          <w:sz w:val="32"/>
+          <w:szCs w:val="32"/>
+        </w:rPr>
+      </w:pPr>
+    </w:p>
+    <w:p>
+      <w:pPr>
+        <w:pStyle w:val="ListBullet"/>
+        <w:numPr>
+          <w:ilvl w:val="0"/>
+          <w:numId w:val="28"/>
+        </w:numPr>
+        <w:rPr>
+          <w:rFonts w:ascii="Times New Roman" w:hAnsi="Times New Roman" w:cs="Times New Roman"/>
+          <w:color w:val="auto"/>
+          <w:sz w:val="24"/>
+          <w:szCs w:val="24"/>
+        </w:rPr>
+      </w:pPr>
+      <w:r>
+        <w:rPr>
+          <w:rFonts w:ascii="Times New Roman" w:hAnsi="Times New Roman" w:cs="Times New Roman"/>
+          <w:color w:val="auto"/>
+          <w:sz w:val="24"/>
+          <w:szCs w:val="24"/>
+        </w:rPr>
+        <w:t>Patient</w:t>
+      </w:r>
+    </w:p>
+    <w:p>
+      <w:pPr>
+        <w:pStyle w:val="ListBullet"/>
+        <w:numPr>
+          <w:ilvl w:val="0"/>
+          <w:numId w:val="28"/>
+        </w:numPr>
+        <w:rPr>
+          <w:rFonts w:ascii="Times New Roman" w:hAnsi="Times New Roman" w:cs="Times New Roman"/>
+          <w:color w:val="auto"/>
+          <w:sz w:val="24"/>
+          <w:szCs w:val="24"/>
+        </w:rPr>
+      </w:pPr>
+      <w:r>
+        <w:rPr>
+          <w:rFonts w:ascii="Times New Roman" w:hAnsi="Times New Roman" w:cs="Times New Roman"/>
+          <w:color w:val="auto"/>
+          <w:sz w:val="24"/>
+          <w:szCs w:val="24"/>
+        </w:rPr>
+        <w:t>Doctor</w:t>
+      </w:r>
+    </w:p>
+    <w:p>
+      <w:pPr>
+        <w:pStyle w:val="ListBullet"/>
+        <w:numPr>
+          <w:ilvl w:val="0"/>
+          <w:numId w:val="29"/>
+        </w:numPr>
+        <w:rPr>
+          <w:rFonts w:ascii="Times New Roman" w:hAnsi="Times New Roman" w:cs="Times New Roman"/>
+          <w:color w:val="auto"/>
+          <w:sz w:val="24"/>
+          <w:szCs w:val="24"/>
+        </w:rPr>
+      </w:pPr>
+      <w:proofErr w:type="spellStart"/>
+      <w:proofErr w:type="gramStart"/>
+      <w:r>
+        <w:rPr>
+          <w:rFonts w:ascii="Times New Roman" w:hAnsi="Times New Roman" w:cs="Times New Roman"/>
+          <w:color w:val="auto"/>
+          <w:sz w:val="24"/>
+          <w:szCs w:val="24"/>
+        </w:rPr>
+        <w:t>GeneralPractitioner</w:t>
+      </w:r>
+      <w:proofErr w:type="spellEnd"/>
+      <w:proofErr w:type="gramEnd"/>
+    </w:p>
+    <w:p>
+      <w:pPr>
+        <w:pStyle w:val="ListBullet"/>
+        <w:numPr>
+          <w:ilvl w:val="0"/>
+          <w:numId w:val="29"/>
+        </w:numPr>
+        <w:rPr>
+          <w:rFonts w:ascii="Times New Roman" w:hAnsi="Times New Roman" w:cs="Times New Roman"/>
+          <w:color w:val="auto"/>
+          <w:sz w:val="24"/>
+          <w:szCs w:val="24"/>
+        </w:rPr>
+      </w:pPr>
+      <w:r>
+        <w:rPr>
+          <w:rFonts w:ascii="Times New Roman" w:hAnsi="Times New Roman" w:cs="Times New Roman"/>
+          <w:color w:val="auto"/>
+          <w:sz w:val="24"/>
+          <w:szCs w:val="24"/>
+        </w:rPr>
+        <w:t>Specialist</w:t>
+      </w:r>
+    </w:p>
+    <w:p>
+      <w:pPr>
+        <w:pStyle w:val="ListBullet"/>
+        <w:numPr>
+          <w:ilvl w:val="0"/>
+          <w:numId w:val="28"/>
+        </w:numPr>
+        <w:rPr>
+          <w:rFonts w:ascii="Times New Roman" w:hAnsi="Times New Roman" w:cs="Times New Roman"/>
+          <w:color w:val="auto"/>
+          <w:sz w:val="24"/>
+          <w:szCs w:val="24"/>
+        </w:rPr>
+      </w:pPr>
+      <w:r>
+        <w:rPr>
+          <w:rFonts w:ascii="Times New Roman" w:hAnsi="Times New Roman" w:cs="Times New Roman"/>
+          <w:color w:val="auto"/>
+          <w:sz w:val="24"/>
+          <w:szCs w:val="24"/>
+        </w:rPr>
+        <w:t>Department</w:t>
+      </w:r>
+    </w:p>
+    <w:p>
+      <w:pPr>
+        <w:pStyle w:val="ListBullet"/>
+        <w:numPr>
+          <w:ilvl w:val="0"/>
+          <w:numId w:val="28"/>
+        </w:numPr>
+        <w:rPr>
+          <w:rFonts w:ascii="Times New Roman" w:hAnsi="Times New Roman" w:cs="Times New Roman"/>
+          <w:color w:val="auto"/>
+          <w:sz w:val="24"/>
+          <w:szCs w:val="24"/>
+        </w:rPr>
+      </w:pPr>
+      <w:r>
+        <w:rPr>
+          <w:rFonts w:ascii="Times New Roman" w:hAnsi="Times New Roman" w:cs="Times New Roman"/>
+          <w:color w:val="auto"/>
+          <w:sz w:val="24"/>
+          <w:szCs w:val="24"/>
+        </w:rPr>
+        <w:t>Appointment</w:t>
+      </w:r>
+    </w:p>
+    <w:p>
+      <w:pPr>
+        <w:pStyle w:val="ListBullet"/>
+        <w:numPr>
+          <w:ilvl w:val="0"/>
+          <w:numId w:val="28"/>
+        </w:numPr>
+        <w:rPr>
+          <w:rFonts w:ascii="Times New Roman" w:hAnsi="Times New Roman" w:cs="Times New Roman"/>
+          <w:color w:val="auto"/>
+          <w:sz w:val="24"/>
+          <w:szCs w:val="24"/>
+        </w:rPr>
+      </w:pPr>
+      <w:r>
+        <w:rPr>
+          <w:rFonts w:ascii="Times New Roman" w:hAnsi="Times New Roman" w:cs="Times New Roman"/>
+          <w:color w:val="auto"/>
+          <w:sz w:val="24"/>
+          <w:szCs w:val="24"/>
+        </w:rPr>
+        <w:t>Treatment</w:t>
+      </w:r>
+    </w:p>
+    <w:p>
+      <w:pPr>
+        <w:pStyle w:val="ListBullet"/>
+        <w:numPr>
+          <w:ilvl w:val="0"/>
+          <w:numId w:val="28"/>
+        </w:numPr>
+        <w:rPr>
+          <w:rFonts w:ascii="Times New Roman" w:hAnsi="Times New Roman" w:cs="Times New Roman"/>
+          <w:color w:val="auto"/>
+          <w:sz w:val="24"/>
+          <w:szCs w:val="24"/>
+        </w:rPr>
+      </w:pPr>
+      <w:r>
+        <w:rPr>
+          <w:rFonts w:ascii="Times New Roman" w:hAnsi="Times New Roman" w:cs="Times New Roman"/>
+          <w:color w:val="auto"/>
+          <w:sz w:val="24"/>
+          <w:szCs w:val="24"/>
+        </w:rPr>
+        <w:t>Payment</w:t>
+      </w:r>
+    </w:p>
+    <w:p>
+      <w:pPr>
+        <w:pStyle w:val="ListBullet"/>
+        <w:numPr>
+          <w:ilvl w:val="0"/>
+          <w:numId w:val="0"/>
+        </w:numPr>
+        <w:ind w:left="576" w:hanging="288"/>
+        <w:rPr>
+          <w:rFonts w:ascii="Times New Roman" w:hAnsi="Times New Roman" w:cs="Times New Roman"/>
+          <w:sz w:val="24"/>
+          <w:szCs w:val="24"/>
+        </w:rPr>
+      </w:pPr>
     </w:p>
     <w:p>
       <w:pPr>
@@ -5410,7 +5869,29 @@
           <w:sz w:val="24"/>
           <w:szCs w:val="24"/>
         </w:rPr>
-        <w:t>SQL Script (.sql)</w:t>
+        <w:t>SQL Script (.</w:t>
+      </w:r>
+      <w:proofErr w:type="spellStart"/>
+      <w:r>
+        <w:rPr>
+          <w:rFonts w:ascii="Times New Roman" w:hAnsi="Times New Roman" w:cs="Times New Roman"/>
+          <w:b/>
+          <w:bCs/>
+          <w:sz w:val="24"/>
+          <w:szCs w:val="24"/>
+        </w:rPr>
+        <w:t>sql</w:t>
+      </w:r>
+      <w:proofErr w:type="spellEnd"/>
+      <w:r>
+        <w:rPr>
+          <w:rFonts w:ascii="Times New Roman" w:hAnsi="Times New Roman" w:cs="Times New Roman"/>
+          <w:b/>
+          <w:bCs/>
+          <w:sz w:val="24"/>
+          <w:szCs w:val="24"/>
+        </w:rPr>
+        <w:t>)</w:t>
       </w:r>
       <w:r>
         <w:rPr>
@@ -5580,7 +6061,25 @@
           <w:sz w:val="24"/>
           <w:szCs w:val="24"/>
         </w:rPr>
-        <w:t>Google Colab notebook (if applicable): [link]</w:t>
+        <w:t xml:space="preserve">Google </w:t>
+      </w:r>
+      <w:proofErr w:type="spellStart"/>
+      <w:r>
+        <w:rPr>
+          <w:rFonts w:ascii="Times New Roman" w:hAnsi="Times New Roman" w:cs="Times New Roman"/>
+          <w:sz w:val="24"/>
+          <w:szCs w:val="24"/>
+        </w:rPr>
+        <w:t>Colab</w:t>
+      </w:r>
+      <w:proofErr w:type="spellEnd"/>
+      <w:r>
+        <w:rPr>
+          <w:rFonts w:ascii="Times New Roman" w:hAnsi="Times New Roman" w:cs="Times New Roman"/>
+          <w:sz w:val="24"/>
+          <w:szCs w:val="24"/>
+        </w:rPr>
+        <w:t xml:space="preserve"> notebook (if applicable): [link]</w:t>
       </w:r>
     </w:p>
     <w:p>
@@ -6535,7 +7034,7 @@
             <w:rPr>
               <w:noProof/>
             </w:rPr>
-            <w:instrText>Deliverables</w:instrText>
+            <w:instrText>Task 2 – Database Implementation (6 Marks)</w:instrText>
           </w:r>
           <w:r>
             <w:rPr>
@@ -6568,7 +7067,7 @@
             <w:rPr>
               <w:noProof/>
             </w:rPr>
-            <w:instrText>Deliverables</w:instrText>
+            <w:instrText>Task 2 – Database Implementation (6 Marks)</w:instrText>
           </w:r>
           <w:r>
             <w:rPr>
@@ -6586,7 +7085,7 @@
             <w:rPr>
               <w:noProof/>
             </w:rPr>
-            <w:t xml:space="preserve">Deliverables </w:t>
+            <w:t xml:space="preserve">Task 2 – Database Implementation (6 Marks) </w:t>
           </w:r>
           <w:r>
             <w:fldChar w:fldCharType="end"/>
@@ -7598,6 +8097,119 @@
     </w:lvl>
   </w:abstractNum>
   <w:abstractNum w:abstractNumId="10" w15:restartNumberingAfterBreak="0">
+    <w:nsid w:val="349B5FCE"/>
+    <w:multiLevelType w:val="hybridMultilevel"/>
+    <w:tmpl w:val="2A80DB70"/>
+    <w:lvl w:ilvl="0" w:tplc="B9D00D30">
+      <w:start w:val="1"/>
+      <w:numFmt w:val="bullet"/>
+      <w:lvlText w:val="-"/>
+      <w:lvlJc w:val="left"/>
+      <w:pPr>
+        <w:ind w:left="1368" w:hanging="360"/>
+      </w:pPr>
+      <w:rPr>
+        <w:rFonts w:ascii="Times New Roman" w:eastAsiaTheme="minorHAnsi" w:hAnsi="Times New Roman" w:cs="Times New Roman" w:hint="default"/>
+      </w:rPr>
+    </w:lvl>
+    <w:lvl w:ilvl="1" w:tplc="04090003" w:tentative="1">
+      <w:start w:val="1"/>
+      <w:numFmt w:val="bullet"/>
+      <w:lvlText w:val="o"/>
+      <w:lvlJc w:val="left"/>
+      <w:pPr>
+        <w:ind w:left="2088" w:hanging="360"/>
+      </w:pPr>
+      <w:rPr>
+        <w:rFonts w:ascii="Courier New" w:hAnsi="Courier New" w:cs="Courier New" w:hint="default"/>
+      </w:rPr>
+    </w:lvl>
+    <w:lvl w:ilvl="2" w:tplc="04090005" w:tentative="1">
+      <w:start w:val="1"/>
+      <w:numFmt w:val="bullet"/>
+      <w:lvlText w:val=""/>
+      <w:lvlJc w:val="left"/>
+      <w:pPr>
+        <w:ind w:left="2808" w:hanging="360"/>
+      </w:pPr>
+      <w:rPr>
+        <w:rFonts w:ascii="Wingdings" w:hAnsi="Wingdings" w:hint="default"/>
+      </w:rPr>
+    </w:lvl>
+    <w:lvl w:ilvl="3" w:tplc="04090001" w:tentative="1">
+      <w:start w:val="1"/>
+      <w:numFmt w:val="bullet"/>
+      <w:lvlText w:val=""/>
+      <w:lvlJc w:val="left"/>
+      <w:pPr>
+        <w:ind w:left="3528" w:hanging="360"/>
+      </w:pPr>
+      <w:rPr>
+        <w:rFonts w:ascii="Symbol" w:hAnsi="Symbol" w:hint="default"/>
+      </w:rPr>
+    </w:lvl>
+    <w:lvl w:ilvl="4" w:tplc="04090003" w:tentative="1">
+      <w:start w:val="1"/>
+      <w:numFmt w:val="bullet"/>
+      <w:lvlText w:val="o"/>
+      <w:lvlJc w:val="left"/>
+      <w:pPr>
+        <w:ind w:left="4248" w:hanging="360"/>
+      </w:pPr>
+      <w:rPr>
+        <w:rFonts w:ascii="Courier New" w:hAnsi="Courier New" w:cs="Courier New" w:hint="default"/>
+      </w:rPr>
+    </w:lvl>
+    <w:lvl w:ilvl="5" w:tplc="04090005" w:tentative="1">
+      <w:start w:val="1"/>
+      <w:numFmt w:val="bullet"/>
+      <w:lvlText w:val=""/>
+      <w:lvlJc w:val="left"/>
+      <w:pPr>
+        <w:ind w:left="4968" w:hanging="360"/>
+      </w:pPr>
+      <w:rPr>
+        <w:rFonts w:ascii="Wingdings" w:hAnsi="Wingdings" w:hint="default"/>
+      </w:rPr>
+    </w:lvl>
+    <w:lvl w:ilvl="6" w:tplc="04090001" w:tentative="1">
+      <w:start w:val="1"/>
+      <w:numFmt w:val="bullet"/>
+      <w:lvlText w:val=""/>
+      <w:lvlJc w:val="left"/>
+      <w:pPr>
+        <w:ind w:left="5688" w:hanging="360"/>
+      </w:pPr>
+      <w:rPr>
+        <w:rFonts w:ascii="Symbol" w:hAnsi="Symbol" w:hint="default"/>
+      </w:rPr>
+    </w:lvl>
+    <w:lvl w:ilvl="7" w:tplc="04090003" w:tentative="1">
+      <w:start w:val="1"/>
+      <w:numFmt w:val="bullet"/>
+      <w:lvlText w:val="o"/>
+      <w:lvlJc w:val="left"/>
+      <w:pPr>
+        <w:ind w:left="6408" w:hanging="360"/>
+      </w:pPr>
+      <w:rPr>
+        <w:rFonts w:ascii="Courier New" w:hAnsi="Courier New" w:cs="Courier New" w:hint="default"/>
+      </w:rPr>
+    </w:lvl>
+    <w:lvl w:ilvl="8" w:tplc="04090005" w:tentative="1">
+      <w:start w:val="1"/>
+      <w:numFmt w:val="bullet"/>
+      <w:lvlText w:val=""/>
+      <w:lvlJc w:val="left"/>
+      <w:pPr>
+        <w:ind w:left="7128" w:hanging="360"/>
+      </w:pPr>
+      <w:rPr>
+        <w:rFonts w:ascii="Wingdings" w:hAnsi="Wingdings" w:hint="default"/>
+      </w:rPr>
+    </w:lvl>
+  </w:abstractNum>
+  <w:abstractNum w:abstractNumId="11" w15:restartNumberingAfterBreak="0">
     <w:nsid w:val="367F6A45"/>
     <w:multiLevelType w:val="multilevel"/>
     <w:tmpl w:val="0436C7FE"/>
@@ -7720,7 +8332,7 @@
       </w:rPr>
     </w:lvl>
   </w:abstractNum>
-  <w:abstractNum w:abstractNumId="11" w15:restartNumberingAfterBreak="0">
+  <w:abstractNum w:abstractNumId="12" w15:restartNumberingAfterBreak="0">
     <w:nsid w:val="39DB541F"/>
     <w:multiLevelType w:val="multilevel"/>
     <w:tmpl w:val="CAACC624"/>
@@ -7833,7 +8445,7 @@
       </w:pPr>
     </w:lvl>
   </w:abstractNum>
-  <w:abstractNum w:abstractNumId="12" w15:restartNumberingAfterBreak="0">
+  <w:abstractNum w:abstractNumId="13" w15:restartNumberingAfterBreak="0">
     <w:nsid w:val="44EE13B5"/>
     <w:multiLevelType w:val="hybridMultilevel"/>
     <w:tmpl w:val="038E9900"/>
@@ -7949,7 +8561,120 @@
       </w:rPr>
     </w:lvl>
   </w:abstractNum>
-  <w:abstractNum w:abstractNumId="13" w15:restartNumberingAfterBreak="0">
+  <w:abstractNum w:abstractNumId="14" w15:restartNumberingAfterBreak="0">
+    <w:nsid w:val="55DA4CC9"/>
+    <w:multiLevelType w:val="hybridMultilevel"/>
+    <w:tmpl w:val="068EDCB2"/>
+    <w:lvl w:ilvl="0" w:tplc="04090001">
+      <w:start w:val="1"/>
+      <w:numFmt w:val="bullet"/>
+      <w:lvlText w:val=""/>
+      <w:lvlJc w:val="left"/>
+      <w:pPr>
+        <w:ind w:left="1008" w:hanging="360"/>
+      </w:pPr>
+      <w:rPr>
+        <w:rFonts w:ascii="Symbol" w:hAnsi="Symbol" w:hint="default"/>
+      </w:rPr>
+    </w:lvl>
+    <w:lvl w:ilvl="1" w:tplc="04090003" w:tentative="1">
+      <w:start w:val="1"/>
+      <w:numFmt w:val="bullet"/>
+      <w:lvlText w:val="o"/>
+      <w:lvlJc w:val="left"/>
+      <w:pPr>
+        <w:ind w:left="1728" w:hanging="360"/>
+      </w:pPr>
+      <w:rPr>
+        <w:rFonts w:ascii="Courier New" w:hAnsi="Courier New" w:cs="Courier New" w:hint="default"/>
+      </w:rPr>
+    </w:lvl>
+    <w:lvl w:ilvl="2" w:tplc="04090005" w:tentative="1">
+      <w:start w:val="1"/>
+      <w:numFmt w:val="bullet"/>
+      <w:lvlText w:val=""/>
+      <w:lvlJc w:val="left"/>
+      <w:pPr>
+        <w:ind w:left="2448" w:hanging="360"/>
+      </w:pPr>
+      <w:rPr>
+        <w:rFonts w:ascii="Wingdings" w:hAnsi="Wingdings" w:hint="default"/>
+      </w:rPr>
+    </w:lvl>
+    <w:lvl w:ilvl="3" w:tplc="04090001" w:tentative="1">
+      <w:start w:val="1"/>
+      <w:numFmt w:val="bullet"/>
+      <w:lvlText w:val=""/>
+      <w:lvlJc w:val="left"/>
+      <w:pPr>
+        <w:ind w:left="3168" w:hanging="360"/>
+      </w:pPr>
+      <w:rPr>
+        <w:rFonts w:ascii="Symbol" w:hAnsi="Symbol" w:hint="default"/>
+      </w:rPr>
+    </w:lvl>
+    <w:lvl w:ilvl="4" w:tplc="04090003" w:tentative="1">
+      <w:start w:val="1"/>
+      <w:numFmt w:val="bullet"/>
+      <w:lvlText w:val="o"/>
+      <w:lvlJc w:val="left"/>
+      <w:pPr>
+        <w:ind w:left="3888" w:hanging="360"/>
+      </w:pPr>
+      <w:rPr>
+        <w:rFonts w:ascii="Courier New" w:hAnsi="Courier New" w:cs="Courier New" w:hint="default"/>
+      </w:rPr>
+    </w:lvl>
+    <w:lvl w:ilvl="5" w:tplc="04090005" w:tentative="1">
+      <w:start w:val="1"/>
+      <w:numFmt w:val="bullet"/>
+      <w:lvlText w:val=""/>
+      <w:lvlJc w:val="left"/>
+      <w:pPr>
+        <w:ind w:left="4608" w:hanging="360"/>
+      </w:pPr>
+      <w:rPr>
+        <w:rFonts w:ascii="Wingdings" w:hAnsi="Wingdings" w:hint="default"/>
+      </w:rPr>
+    </w:lvl>
+    <w:lvl w:ilvl="6" w:tplc="04090001" w:tentative="1">
+      <w:start w:val="1"/>
+      <w:numFmt w:val="bullet"/>
+      <w:lvlText w:val=""/>
+      <w:lvlJc w:val="left"/>
+      <w:pPr>
+        <w:ind w:left="5328" w:hanging="360"/>
+      </w:pPr>
+      <w:rPr>
+        <w:rFonts w:ascii="Symbol" w:hAnsi="Symbol" w:hint="default"/>
+      </w:rPr>
+    </w:lvl>
+    <w:lvl w:ilvl="7" w:tplc="04090003" w:tentative="1">
+      <w:start w:val="1"/>
+      <w:numFmt w:val="bullet"/>
+      <w:lvlText w:val="o"/>
+      <w:lvlJc w:val="left"/>
+      <w:pPr>
+        <w:ind w:left="6048" w:hanging="360"/>
+      </w:pPr>
+      <w:rPr>
+        <w:rFonts w:ascii="Courier New" w:hAnsi="Courier New" w:cs="Courier New" w:hint="default"/>
+      </w:rPr>
+    </w:lvl>
+    <w:lvl w:ilvl="8" w:tplc="04090005" w:tentative="1">
+      <w:start w:val="1"/>
+      <w:numFmt w:val="bullet"/>
+      <w:lvlText w:val=""/>
+      <w:lvlJc w:val="left"/>
+      <w:pPr>
+        <w:ind w:left="6768" w:hanging="360"/>
+      </w:pPr>
+      <w:rPr>
+        <w:rFonts w:ascii="Wingdings" w:hAnsi="Wingdings" w:hint="default"/>
+      </w:rPr>
+    </w:lvl>
+  </w:abstractNum>
+  <w:abstractNum w:abstractNumId="15" w15:restartNumberingAfterBreak="0">
     <w:nsid w:val="55F84D01"/>
     <w:multiLevelType w:val="multilevel"/>
     <w:tmpl w:val="A9E06390"/>
@@ -8062,7 +8787,7 @@
       </w:pPr>
     </w:lvl>
   </w:abstractNum>
-  <w:abstractNum w:abstractNumId="14" w15:restartNumberingAfterBreak="0">
+  <w:abstractNum w:abstractNumId="16" w15:restartNumberingAfterBreak="0">
     <w:nsid w:val="57397E8F"/>
     <w:multiLevelType w:val="multilevel"/>
     <w:tmpl w:val="93162086"/>
@@ -8175,7 +8900,7 @@
       </w:pPr>
     </w:lvl>
   </w:abstractNum>
-  <w:abstractNum w:abstractNumId="15" w15:restartNumberingAfterBreak="0">
+  <w:abstractNum w:abstractNumId="17" w15:restartNumberingAfterBreak="0">
     <w:nsid w:val="5FFB796A"/>
     <w:multiLevelType w:val="multilevel"/>
     <w:tmpl w:val="6388B4E8"/>
@@ -8288,7 +9013,120 @@
       </w:pPr>
     </w:lvl>
   </w:abstractNum>
-  <w:abstractNum w:abstractNumId="16" w15:restartNumberingAfterBreak="0">
+  <w:abstractNum w:abstractNumId="18" w15:restartNumberingAfterBreak="0">
+    <w:nsid w:val="64B955EC"/>
+    <w:multiLevelType w:val="hybridMultilevel"/>
+    <w:tmpl w:val="05E8FB5A"/>
+    <w:lvl w:ilvl="0" w:tplc="04090009">
+      <w:start w:val="1"/>
+      <w:numFmt w:val="bullet"/>
+      <w:lvlText w:val=""/>
+      <w:lvlJc w:val="left"/>
+      <w:pPr>
+        <w:ind w:left="1008" w:hanging="360"/>
+      </w:pPr>
+      <w:rPr>
+        <w:rFonts w:ascii="Wingdings" w:hAnsi="Wingdings" w:hint="default"/>
+      </w:rPr>
+    </w:lvl>
+    <w:lvl w:ilvl="1" w:tplc="04090003" w:tentative="1">
+      <w:start w:val="1"/>
+      <w:numFmt w:val="bullet"/>
+      <w:lvlText w:val="o"/>
+      <w:lvlJc w:val="left"/>
+      <w:pPr>
+        <w:ind w:left="1728" w:hanging="360"/>
+      </w:pPr>
+      <w:rPr>
+        <w:rFonts w:ascii="Courier New" w:hAnsi="Courier New" w:cs="Courier New" w:hint="default"/>
+      </w:rPr>
+    </w:lvl>
+    <w:lvl w:ilvl="2" w:tplc="04090005" w:tentative="1">
+      <w:start w:val="1"/>
+      <w:numFmt w:val="bullet"/>
+      <w:lvlText w:val=""/>
+      <w:lvlJc w:val="left"/>
+      <w:pPr>
+        <w:ind w:left="2448" w:hanging="360"/>
+      </w:pPr>
+      <w:rPr>
+        <w:rFonts w:ascii="Wingdings" w:hAnsi="Wingdings" w:hint="default"/>
+      </w:rPr>
+    </w:lvl>
+    <w:lvl w:ilvl="3" w:tplc="04090001" w:tentative="1">
+      <w:start w:val="1"/>
+      <w:numFmt w:val="bullet"/>
+      <w:lvlText w:val=""/>
+      <w:lvlJc w:val="left"/>
+      <w:pPr>
+        <w:ind w:left="3168" w:hanging="360"/>
+      </w:pPr>
+      <w:rPr>
+        <w:rFonts w:ascii="Symbol" w:hAnsi="Symbol" w:hint="default"/>
+      </w:rPr>
+    </w:lvl>
+    <w:lvl w:ilvl="4" w:tplc="04090003" w:tentative="1">
+      <w:start w:val="1"/>
+      <w:numFmt w:val="bullet"/>
+      <w:lvlText w:val="o"/>
+      <w:lvlJc w:val="left"/>
+      <w:pPr>
+        <w:ind w:left="3888" w:hanging="360"/>
+      </w:pPr>
+      <w:rPr>
+        <w:rFonts w:ascii="Courier New" w:hAnsi="Courier New" w:cs="Courier New" w:hint="default"/>
+      </w:rPr>
+    </w:lvl>
+    <w:lvl w:ilvl="5" w:tplc="04090005" w:tentative="1">
+      <w:start w:val="1"/>
+      <w:numFmt w:val="bullet"/>
+      <w:lvlText w:val=""/>
+      <w:lvlJc w:val="left"/>
+      <w:pPr>
+        <w:ind w:left="4608" w:hanging="360"/>
+      </w:pPr>
+      <w:rPr>
+        <w:rFonts w:ascii="Wingdings" w:hAnsi="Wingdings" w:hint="default"/>
+      </w:rPr>
+    </w:lvl>
+    <w:lvl w:ilvl="6" w:tplc="04090001" w:tentative="1">
+      <w:start w:val="1"/>
+      <w:numFmt w:val="bullet"/>
+      <w:lvlText w:val=""/>
+      <w:lvlJc w:val="left"/>
+      <w:pPr>
+        <w:ind w:left="5328" w:hanging="360"/>
+      </w:pPr>
+      <w:rPr>
+        <w:rFonts w:ascii="Symbol" w:hAnsi="Symbol" w:hint="default"/>
+      </w:rPr>
+    </w:lvl>
+    <w:lvl w:ilvl="7" w:tplc="04090003" w:tentative="1">
+      <w:start w:val="1"/>
+      <w:numFmt w:val="bullet"/>
+      <w:lvlText w:val="o"/>
+      <w:lvlJc w:val="left"/>
+      <w:pPr>
+        <w:ind w:left="6048" w:hanging="360"/>
+      </w:pPr>
+      <w:rPr>
+        <w:rFonts w:ascii="Courier New" w:hAnsi="Courier New" w:cs="Courier New" w:hint="default"/>
+      </w:rPr>
+    </w:lvl>
+    <w:lvl w:ilvl="8" w:tplc="04090005" w:tentative="1">
+      <w:start w:val="1"/>
+      <w:numFmt w:val="bullet"/>
+      <w:lvlText w:val=""/>
+      <w:lvlJc w:val="left"/>
+      <w:pPr>
+        <w:ind w:left="6768" w:hanging="360"/>
+      </w:pPr>
+      <w:rPr>
+        <w:rFonts w:ascii="Wingdings" w:hAnsi="Wingdings" w:hint="default"/>
+      </w:rPr>
+    </w:lvl>
+  </w:abstractNum>
+  <w:abstractNum w:abstractNumId="19" w15:restartNumberingAfterBreak="0">
     <w:nsid w:val="667677D6"/>
     <w:multiLevelType w:val="hybridMultilevel"/>
     <w:tmpl w:val="D01692D8"/>
@@ -8377,7 +9215,7 @@
       </w:pPr>
     </w:lvl>
   </w:abstractNum>
-  <w:abstractNum w:abstractNumId="17" w15:restartNumberingAfterBreak="0">
+  <w:abstractNum w:abstractNumId="20" w15:restartNumberingAfterBreak="0">
     <w:nsid w:val="688927E2"/>
     <w:multiLevelType w:val="hybridMultilevel"/>
     <w:tmpl w:val="64F8DB74"/>
@@ -8467,7 +9305,7 @@
       </w:pPr>
     </w:lvl>
   </w:abstractNum>
-  <w:abstractNum w:abstractNumId="18" w15:restartNumberingAfterBreak="0">
+  <w:abstractNum w:abstractNumId="21" w15:restartNumberingAfterBreak="0">
     <w:nsid w:val="6FD51D52"/>
     <w:multiLevelType w:val="hybridMultilevel"/>
     <w:tmpl w:val="36305470"/>
@@ -8553,7 +9391,7 @@
       </w:pPr>
     </w:lvl>
   </w:abstractNum>
-  <w:abstractNum w:abstractNumId="19" w15:restartNumberingAfterBreak="0">
+  <w:abstractNum w:abstractNumId="22" w15:restartNumberingAfterBreak="0">
     <w:nsid w:val="704E3E7F"/>
     <w:multiLevelType w:val="hybridMultilevel"/>
     <w:tmpl w:val="E34C7444"/>
@@ -8642,7 +9480,7 @@
       </w:pPr>
     </w:lvl>
   </w:abstractNum>
-  <w:abstractNum w:abstractNumId="20" w15:restartNumberingAfterBreak="0">
+  <w:abstractNum w:abstractNumId="23" w15:restartNumberingAfterBreak="0">
     <w:nsid w:val="72C71C39"/>
     <w:multiLevelType w:val="hybridMultilevel"/>
     <w:tmpl w:val="C960FD86"/>
@@ -8767,7 +9605,7 @@
       </w:rPr>
     </w:lvl>
   </w:abstractNum>
-  <w:abstractNum w:abstractNumId="21" w15:restartNumberingAfterBreak="0">
+  <w:abstractNum w:abstractNumId="24" w15:restartNumberingAfterBreak="0">
     <w:nsid w:val="7823322B"/>
     <w:multiLevelType w:val="hybridMultilevel"/>
     <w:tmpl w:val="A0D81BB6"/>
@@ -8890,7 +9728,7 @@
     </w:lvlOverride>
   </w:num>
   <w:num w:numId="3" w16cid:durableId="1517813912">
-    <w:abstractNumId w:val="10"/>
+    <w:abstractNumId w:val="11"/>
   </w:num>
   <w:num w:numId="4" w16cid:durableId="798186098">
     <w:abstractNumId w:val="0"/>
@@ -8905,19 +9743,19 @@
     </w:lvlOverride>
   </w:num>
   <w:num w:numId="6" w16cid:durableId="2115830839">
-    <w:abstractNumId w:val="12"/>
+    <w:abstractNumId w:val="13"/>
   </w:num>
   <w:num w:numId="7" w16cid:durableId="471407680">
     <w:abstractNumId w:val="6"/>
   </w:num>
   <w:num w:numId="8" w16cid:durableId="893388596">
-    <w:abstractNumId w:val="19"/>
+    <w:abstractNumId w:val="22"/>
   </w:num>
   <w:num w:numId="9" w16cid:durableId="1862353387">
     <w:abstractNumId w:val="1"/>
   </w:num>
   <w:num w:numId="10" w16cid:durableId="583271442">
-    <w:abstractNumId w:val="20"/>
+    <w:abstractNumId w:val="23"/>
     <w:lvlOverride w:ilvl="0">
       <w:startOverride w:val="1"/>
     </w:lvlOverride>
@@ -8933,7 +9771,7 @@
     <w:lvlOverride w:ilvl="8"/>
   </w:num>
   <w:num w:numId="11" w16cid:durableId="783697976">
-    <w:abstractNumId w:val="12"/>
+    <w:abstractNumId w:val="13"/>
     <w:lvlOverride w:ilvl="0"/>
     <w:lvlOverride w:ilvl="1">
       <w:startOverride w:val="1"/>
@@ -8947,19 +9785,19 @@
     <w:lvlOverride w:ilvl="8"/>
   </w:num>
   <w:num w:numId="12" w16cid:durableId="1306158738">
-    <w:abstractNumId w:val="17"/>
+    <w:abstractNumId w:val="20"/>
   </w:num>
   <w:num w:numId="13" w16cid:durableId="1700812942">
-    <w:abstractNumId w:val="16"/>
+    <w:abstractNumId w:val="19"/>
   </w:num>
   <w:num w:numId="14" w16cid:durableId="1608192642">
-    <w:abstractNumId w:val="21"/>
+    <w:abstractNumId w:val="24"/>
   </w:num>
   <w:num w:numId="15" w16cid:durableId="114762884">
     <w:abstractNumId w:val="7"/>
   </w:num>
   <w:num w:numId="16" w16cid:durableId="1418284132">
-    <w:abstractNumId w:val="18"/>
+    <w:abstractNumId w:val="21"/>
   </w:num>
   <w:num w:numId="17" w16cid:durableId="70466096">
     <w:abstractNumId w:val="3"/>
@@ -8971,16 +9809,16 @@
     <w:abstractNumId w:val="8"/>
   </w:num>
   <w:num w:numId="20" w16cid:durableId="1865823307">
-    <w:abstractNumId w:val="15"/>
+    <w:abstractNumId w:val="17"/>
   </w:num>
   <w:num w:numId="21" w16cid:durableId="2074043917">
-    <w:abstractNumId w:val="14"/>
+    <w:abstractNumId w:val="16"/>
   </w:num>
   <w:num w:numId="22" w16cid:durableId="1745374221">
-    <w:abstractNumId w:val="11"/>
+    <w:abstractNumId w:val="12"/>
   </w:num>
   <w:num w:numId="23" w16cid:durableId="112403004">
-    <w:abstractNumId w:val="13"/>
+    <w:abstractNumId w:val="15"/>
   </w:num>
   <w:num w:numId="24" w16cid:durableId="207844976">
     <w:abstractNumId w:val="0"/>
@@ -8993,6 +9831,15 @@
   </w:num>
   <w:num w:numId="27" w16cid:durableId="2097969410">
     <w:abstractNumId w:val="2"/>
+  </w:num>
+  <w:num w:numId="28" w16cid:durableId="802769626">
+    <w:abstractNumId w:val="14"/>
+  </w:num>
+  <w:num w:numId="29" w16cid:durableId="1773864708">
+    <w:abstractNumId w:val="10"/>
+  </w:num>
+  <w:num w:numId="30" w16cid:durableId="1190679152">
+    <w:abstractNumId w:val="18"/>
   </w:num>
 </w:numbering>
 </file>
@@ -10520,6 +11367,7 @@
     <w:rsid w:val="002A69BE"/>
     <w:rsid w:val="00324ACF"/>
     <w:rsid w:val="00351A43"/>
+    <w:rsid w:val="003B34DF"/>
     <w:rsid w:val="004A7EE6"/>
     <w:rsid w:val="004E5C8C"/>
     <w:rsid w:val="005443A0"/>
@@ -10563,6 +11411,7 @@
     <w:rsid w:val="00E552F8"/>
     <w:rsid w:val="00E70F80"/>
     <w:rsid w:val="00E9596B"/>
+    <w:rsid w:val="00F17A05"/>
     <w:rsid w:val="00F64854"/>
     <w:rsid w:val="00FA6C85"/>
   </w:rsids>
@@ -10582,7 +11431,7 @@
   <w:themeFontLang w:val="en-GB" w:eastAsia="ja-JP" w:bidi="ar-SA"/>
   <w:clrSchemeMapping w:bg1="light1" w:t1="dark1" w:bg2="light2" w:t2="dark2" w:accent1="accent1" w:accent2="accent2" w:accent3="accent3" w:accent4="accent4" w:accent5="accent5" w:accent6="accent6" w:hyperlink="hyperlink" w:followedHyperlink="followedHyperlink"/>
   <w:decimalSymbol w:val="."/>
-  <w:listSeparator w:val=","/>
+  <w:listSeparator w:val=";"/>
   <w15:chartTrackingRefBased/>
 </w:settings>
 </file>
@@ -11389,16 +12238,16 @@
 </file>
 
 <file path=customXml/item2.xml><?xml version="1.0" encoding="utf-8"?>
+<b:Sources xmlns:b="http://schemas.openxmlformats.org/officeDocument/2006/bibliography" SelectedStyle="\APA.XSL" StyleName="APA"/>
+</file>
+
+<file path=customXml/item3.xml><?xml version="1.0" encoding="utf-8"?>
 <?mso-contentType ?>
 <FormTemplates xmlns="http://schemas.microsoft.com/sharepoint/v3/contenttype/forms">
   <Display>DocumentLibraryForm</Display>
   <Edit>AssetEditForm</Edit>
   <New>DocumentLibraryForm</New>
 </FormTemplates>
-</file>
-
-<file path=customXml/item3.xml><?xml version="1.0" encoding="utf-8"?>
-<b:Sources xmlns:b="http://schemas.openxmlformats.org/officeDocument/2006/bibliography" SelectedStyle="\APA.XSL" StyleName="APA"/>
 </file>
 
 <file path=customXml/itemProps1.xml><?xml version="1.0" encoding="utf-8"?>
@@ -11410,17 +12259,17 @@
 </file>
 
 <file path=customXml/itemProps2.xml><?xml version="1.0" encoding="utf-8"?>
+<ds:datastoreItem xmlns:ds="http://schemas.openxmlformats.org/officeDocument/2006/customXml" ds:itemID="{355C5113-D031-41DB-A6D8-43CE1A0E6695}">
+  <ds:schemaRefs>
+    <ds:schemaRef ds:uri="http://schemas.openxmlformats.org/officeDocument/2006/bibliography"/>
+  </ds:schemaRefs>
+</ds:datastoreItem>
+</file>
+
+<file path=customXml/itemProps3.xml><?xml version="1.0" encoding="utf-8"?>
 <ds:datastoreItem xmlns:ds="http://schemas.openxmlformats.org/officeDocument/2006/customXml" ds:itemID="{E34C63B7-A026-4A37-9535-4FBB4C03A11D}">
   <ds:schemaRefs>
     <ds:schemaRef ds:uri="http://schemas.microsoft.com/sharepoint/v3/contenttype/forms"/>
   </ds:schemaRefs>
 </ds:datastoreItem>
-</file>
-
-<file path=customXml/itemProps3.xml><?xml version="1.0" encoding="utf-8"?>
-<ds:datastoreItem xmlns:ds="http://schemas.openxmlformats.org/officeDocument/2006/customXml" ds:itemID="{355C5113-D031-41DB-A6D8-43CE1A0E6695}">
-  <ds:schemaRefs>
-    <ds:schemaRef ds:uri="http://schemas.openxmlformats.org/officeDocument/2006/bibliography"/>
-  </ds:schemaRefs>
-</ds:datastoreItem>
 </file>
</xml_diff>

<commit_message>
Specialization section has been added
</commit_message>
<xml_diff>
--- a/Introduction to DB-CS350 Project.docx
+++ b/Introduction to DB-CS350 Project.docx
@@ -83,7 +83,7 @@
                             <w:sdtContent>
                               <w:p>
                                 <w:pPr>
-                                  <w:pStyle w:val="Title"/>
+                                  <w:pStyle w:val="a9"/>
                                   <w:jc w:val="center"/>
                                   <w:rPr>
                                     <w:sz w:val="96"/>
@@ -102,7 +102,7 @@
                           </w:sdt>
                           <w:p>
                             <w:pPr>
-                              <w:pStyle w:val="Subtitle"/>
+                              <w:pStyle w:val="a6"/>
                               <w:ind w:left="709" w:right="720"/>
                               <w:jc w:val="center"/>
                               <w:rPr>
@@ -474,7 +474,7 @@
                       <w:sdtContent>
                         <w:p>
                           <w:pPr>
-                            <w:pStyle w:val="Title"/>
+                            <w:pStyle w:val="a9"/>
                             <w:jc w:val="center"/>
                             <w:rPr>
                               <w:sz w:val="96"/>
@@ -493,7 +493,7 @@
                     </w:sdt>
                     <w:p>
                       <w:pPr>
-                        <w:pStyle w:val="Subtitle"/>
+                        <w:pStyle w:val="a6"/>
                         <w:ind w:left="709" w:right="720"/>
                         <w:jc w:val="center"/>
                         <w:rPr>
@@ -1254,7 +1254,7 @@
                               <w:txbxContent>
                                 <w:p>
                                   <w:pPr>
-                                    <w:pStyle w:val="ListParagraph"/>
+                                    <w:pStyle w:val="af5"/>
                                     <w:numPr>
                                       <w:ilvl w:val="0"/>
                                       <w:numId w:val="6"/>
@@ -1323,7 +1323,7 @@
                                 </w:p>
                                 <w:p>
                                   <w:pPr>
-                                    <w:pStyle w:val="ListParagraph"/>
+                                    <w:pStyle w:val="af5"/>
                                     <w:numPr>
                                       <w:ilvl w:val="0"/>
                                       <w:numId w:val="6"/>
@@ -1344,7 +1344,7 @@
                                 </w:p>
                                 <w:p>
                                   <w:pPr>
-                                    <w:pStyle w:val="ListParagraph"/>
+                                    <w:pStyle w:val="af5"/>
                                     <w:numPr>
                                       <w:ilvl w:val="0"/>
                                       <w:numId w:val="6"/>
@@ -1456,7 +1456,7 @@
                                 </w:p>
                                 <w:p>
                                   <w:pPr>
-                                    <w:pStyle w:val="ListParagraph"/>
+                                    <w:pStyle w:val="af5"/>
                                     <w:numPr>
                                       <w:ilvl w:val="0"/>
                                       <w:numId w:val="6"/>
@@ -1478,7 +1478,7 @@
                                 </w:p>
                                 <w:p>
                                   <w:pPr>
-                                    <w:pStyle w:val="ListParagraph"/>
+                                    <w:pStyle w:val="af5"/>
                                     <w:numPr>
                                       <w:ilvl w:val="0"/>
                                       <w:numId w:val="6"/>
@@ -1506,7 +1506,7 @@
                                 </w:p>
                                 <w:p>
                                   <w:pPr>
-                                    <w:pStyle w:val="ListParagraph"/>
+                                    <w:pStyle w:val="af5"/>
                                     <w:numPr>
                                       <w:ilvl w:val="0"/>
                                       <w:numId w:val="6"/>
@@ -1528,7 +1528,7 @@
                                 </w:p>
                                 <w:p>
                                   <w:pPr>
-                                    <w:pStyle w:val="ListParagraph"/>
+                                    <w:pStyle w:val="af5"/>
                                     <w:numPr>
                                       <w:ilvl w:val="0"/>
                                       <w:numId w:val="6"/>
@@ -1575,7 +1575,7 @@
                                 </w:p>
                                 <w:p>
                                   <w:pPr>
-                                    <w:pStyle w:val="ListParagraph"/>
+                                    <w:pStyle w:val="af5"/>
                                     <w:numPr>
                                       <w:ilvl w:val="0"/>
                                       <w:numId w:val="6"/>
@@ -1597,7 +1597,7 @@
                                 </w:p>
                                 <w:p>
                                   <w:pPr>
-                                    <w:pStyle w:val="ListParagraph"/>
+                                    <w:pStyle w:val="af5"/>
                                     <w:numPr>
                                       <w:ilvl w:val="0"/>
                                       <w:numId w:val="6"/>
@@ -1637,7 +1637,7 @@
                                 </w:p>
                                 <w:p>
                                   <w:pPr>
-                                    <w:pStyle w:val="ListParagraph"/>
+                                    <w:pStyle w:val="af5"/>
                                     <w:numPr>
                                       <w:ilvl w:val="0"/>
                                       <w:numId w:val="6"/>
@@ -1734,7 +1734,7 @@
                         <w:txbxContent>
                           <w:p>
                             <w:pPr>
-                              <w:pStyle w:val="ListParagraph"/>
+                              <w:pStyle w:val="af5"/>
                               <w:numPr>
                                 <w:ilvl w:val="0"/>
                                 <w:numId w:val="6"/>
@@ -1803,7 +1803,7 @@
                           </w:p>
                           <w:p>
                             <w:pPr>
-                              <w:pStyle w:val="ListParagraph"/>
+                              <w:pStyle w:val="af5"/>
                               <w:numPr>
                                 <w:ilvl w:val="0"/>
                                 <w:numId w:val="6"/>
@@ -1824,7 +1824,7 @@
                           </w:p>
                           <w:p>
                             <w:pPr>
-                              <w:pStyle w:val="ListParagraph"/>
+                              <w:pStyle w:val="af5"/>
                               <w:numPr>
                                 <w:ilvl w:val="0"/>
                                 <w:numId w:val="6"/>
@@ -1936,7 +1936,7 @@
                           </w:p>
                           <w:p>
                             <w:pPr>
-                              <w:pStyle w:val="ListParagraph"/>
+                              <w:pStyle w:val="af5"/>
                               <w:numPr>
                                 <w:ilvl w:val="0"/>
                                 <w:numId w:val="6"/>
@@ -1958,7 +1958,7 @@
                           </w:p>
                           <w:p>
                             <w:pPr>
-                              <w:pStyle w:val="ListParagraph"/>
+                              <w:pStyle w:val="af5"/>
                               <w:numPr>
                                 <w:ilvl w:val="0"/>
                                 <w:numId w:val="6"/>
@@ -1986,7 +1986,7 @@
                           </w:p>
                           <w:p>
                             <w:pPr>
-                              <w:pStyle w:val="ListParagraph"/>
+                              <w:pStyle w:val="af5"/>
                               <w:numPr>
                                 <w:ilvl w:val="0"/>
                                 <w:numId w:val="6"/>
@@ -2008,7 +2008,7 @@
                           </w:p>
                           <w:p>
                             <w:pPr>
-                              <w:pStyle w:val="ListParagraph"/>
+                              <w:pStyle w:val="af5"/>
                               <w:numPr>
                                 <w:ilvl w:val="0"/>
                                 <w:numId w:val="6"/>
@@ -2055,7 +2055,7 @@
                           </w:p>
                           <w:p>
                             <w:pPr>
-                              <w:pStyle w:val="ListParagraph"/>
+                              <w:pStyle w:val="af5"/>
                               <w:numPr>
                                 <w:ilvl w:val="0"/>
                                 <w:numId w:val="6"/>
@@ -2077,7 +2077,7 @@
                           </w:p>
                           <w:p>
                             <w:pPr>
-                              <w:pStyle w:val="ListParagraph"/>
+                              <w:pStyle w:val="af5"/>
                               <w:numPr>
                                 <w:ilvl w:val="0"/>
                                 <w:numId w:val="6"/>
@@ -2117,7 +2117,7 @@
                           </w:p>
                           <w:p>
                             <w:pPr>
-                              <w:pStyle w:val="ListParagraph"/>
+                              <w:pStyle w:val="af5"/>
                               <w:numPr>
                                 <w:ilvl w:val="0"/>
                                 <w:numId w:val="6"/>
@@ -2298,7 +2298,7 @@
                                     </w:tcPr>
                                     <w:p>
                                       <w:pPr>
-                                        <w:pStyle w:val="Footer"/>
+                                        <w:pStyle w:val="a5"/>
                                         <w:rPr>
                                           <w:b/>
                                           <w:bCs/>
@@ -2331,32 +2331,12 @@
                                           <w:sz w:val="28"/>
                                           <w:szCs w:val="28"/>
                                         </w:rPr>
-                                        <w:t xml:space="preserve">Ramadan </w:t>
-                                      </w:r>
-                                      <w:proofErr w:type="spellStart"/>
-                                      <w:r>
-                                        <w:rPr>
-                                          <w:b/>
-                                          <w:bCs/>
-                                          <w:sz w:val="28"/>
-                                          <w:szCs w:val="28"/>
-                                        </w:rPr>
-                                        <w:t>Moraya</w:t>
-                                      </w:r>
-                                      <w:proofErr w:type="spellEnd"/>
-                                      <w:r>
-                                        <w:rPr>
-                                          <w:b/>
-                                          <w:bCs/>
-                                          <w:sz w:val="28"/>
-                                          <w:szCs w:val="28"/>
-                                        </w:rPr>
-                                        <w:t xml:space="preserve"> Hakami</w:t>
+                                        <w:t>Ramadan Moraya Hakami</w:t>
                                       </w:r>
                                     </w:p>
                                     <w:p>
                                       <w:pPr>
-                                        <w:pStyle w:val="Footer"/>
+                                        <w:pStyle w:val="a5"/>
                                         <w:rPr>
                                           <w:b/>
                                           <w:bCs/>
@@ -2373,10 +2353,28 @@
                                         </w:rPr>
                                         <w:t xml:space="preserve">Name: </w:t>
                                       </w:r>
+                                      <w:r>
+                                        <w:rPr>
+                                          <w:b/>
+                                          <w:bCs/>
+                                          <w:sz w:val="28"/>
+                                          <w:szCs w:val="28"/>
+                                        </w:rPr>
+                                        <w:t>Rakan A</w:t>
+                                      </w:r>
+                                      <w:r>
+                                        <w:rPr>
+                                          <w:b/>
+                                          <w:bCs/>
+                                          <w:sz w:val="28"/>
+                                          <w:szCs w:val="28"/>
+                                        </w:rPr>
+                                        <w:t>lqu</w:t>
+                                      </w:r>
                                     </w:p>
                                     <w:p>
                                       <w:pPr>
-                                        <w:pStyle w:val="Footer"/>
+                                        <w:pStyle w:val="a5"/>
                                         <w:rPr>
                                           <w:b/>
                                           <w:bCs/>
@@ -2405,7 +2403,7 @@
                                     </w:p>
                                     <w:p>
                                       <w:pPr>
-                                        <w:pStyle w:val="Footer"/>
+                                        <w:pStyle w:val="a5"/>
                                         <w:rPr>
                                           <w:b/>
                                           <w:bCs/>
@@ -2434,7 +2432,7 @@
                                     </w:p>
                                     <w:p>
                                       <w:pPr>
-                                        <w:pStyle w:val="Footer"/>
+                                        <w:pStyle w:val="a5"/>
                                         <w:ind w:left="0"/>
                                         <w:rPr>
                                           <w:b/>
@@ -2454,7 +2452,7 @@
                                     </w:tcPr>
                                     <w:p>
                                       <w:pPr>
-                                        <w:pStyle w:val="Footer"/>
+                                        <w:pStyle w:val="a5"/>
                                         <w:ind w:left="0"/>
                                         <w:rPr>
                                           <w:b/>
@@ -2472,7 +2470,7 @@
                                     </w:tcPr>
                                     <w:p>
                                       <w:pPr>
-                                        <w:pStyle w:val="Footer"/>
+                                        <w:pStyle w:val="a5"/>
                                         <w:rPr>
                                           <w:b/>
                                           <w:bCs/>
@@ -2510,7 +2508,45 @@
                                     </w:p>
                                     <w:p>
                                       <w:pPr>
-                                        <w:pStyle w:val="Footer"/>
+                                        <w:pStyle w:val="a5"/>
+                                        <w:rPr>
+                                          <w:b/>
+                                          <w:bCs/>
+                                          <w:sz w:val="28"/>
+                                          <w:szCs w:val="28"/>
+                                        </w:rPr>
+                                      </w:pPr>
+                                      <w:r>
+                                        <w:rPr>
+                                          <w:b/>
+                                          <w:bCs/>
+                                          <w:sz w:val="28"/>
+                                          <w:szCs w:val="28"/>
+                                        </w:rPr>
+                                        <w:t>ID:</w:t>
+                                      </w:r>
+                                      <w:r>
+                                        <w:rPr>
+                                          <w:b/>
+                                          <w:bCs/>
+                                          <w:sz w:val="28"/>
+                                          <w:szCs w:val="28"/>
+                                        </w:rPr>
+                                        <w:t xml:space="preserve"> </w:t>
+                                      </w:r>
+                                      <w:r>
+                                        <w:rPr>
+                                          <w:b/>
+                                          <w:bCs/>
+                                          <w:sz w:val="28"/>
+                                          <w:szCs w:val="28"/>
+                                        </w:rPr>
+                                        <w:t>S240048280</w:t>
+                                      </w:r>
+                                    </w:p>
+                                    <w:p>
+                                      <w:pPr>
+                                        <w:pStyle w:val="a5"/>
                                         <w:rPr>
                                           <w:b/>
                                           <w:bCs/>
@@ -2539,36 +2575,7 @@
                                     </w:p>
                                     <w:p>
                                       <w:pPr>
-                                        <w:pStyle w:val="Footer"/>
-                                        <w:rPr>
-                                          <w:b/>
-                                          <w:bCs/>
-                                          <w:sz w:val="28"/>
-                                          <w:szCs w:val="28"/>
-                                        </w:rPr>
-                                      </w:pPr>
-                                      <w:r>
-                                        <w:rPr>
-                                          <w:b/>
-                                          <w:bCs/>
-                                          <w:sz w:val="28"/>
-                                          <w:szCs w:val="28"/>
-                                        </w:rPr>
-                                        <w:t>ID:</w:t>
-                                      </w:r>
-                                      <w:r>
-                                        <w:rPr>
-                                          <w:b/>
-                                          <w:bCs/>
-                                          <w:sz w:val="28"/>
-                                          <w:szCs w:val="28"/>
-                                        </w:rPr>
-                                        <w:t xml:space="preserve"> </w:t>
-                                      </w:r>
-                                    </w:p>
-                                    <w:p>
-                                      <w:pPr>
-                                        <w:pStyle w:val="Footer"/>
+                                        <w:pStyle w:val="a5"/>
                                         <w:rPr>
                                           <w:b/>
                                           <w:bCs/>
@@ -2609,7 +2616,7 @@
                                     </w:tcPr>
                                     <w:p>
                                       <w:pPr>
-                                        <w:pStyle w:val="Footer"/>
+                                        <w:pStyle w:val="a5"/>
                                         <w:ind w:left="0"/>
                                       </w:pPr>
                                     </w:p>
@@ -2621,7 +2628,7 @@
                                     </w:tcPr>
                                     <w:p>
                                       <w:pPr>
-                                        <w:pStyle w:val="Footer"/>
+                                        <w:pStyle w:val="a5"/>
                                       </w:pPr>
                                     </w:p>
                                   </w:tc>
@@ -2632,7 +2639,7 @@
                                     </w:tcPr>
                                     <w:p>
                                       <w:pPr>
-                                        <w:pStyle w:val="Footer"/>
+                                        <w:pStyle w:val="a5"/>
                                       </w:pPr>
                                     </w:p>
                                   </w:tc>
@@ -2640,7 +2647,7 @@
                               </w:tbl>
                               <w:p>
                                 <w:pPr>
-                                  <w:pStyle w:val="NoSpacing"/>
+                                  <w:pStyle w:val="ad"/>
                                 </w:pPr>
                               </w:p>
                             </w:txbxContent>
@@ -2743,7 +2750,7 @@
                               </w:tcPr>
                               <w:p>
                                 <w:pPr>
-                                  <w:pStyle w:val="Footer"/>
+                                  <w:pStyle w:val="a5"/>
                                   <w:rPr>
                                     <w:b/>
                                     <w:bCs/>
@@ -2776,32 +2783,12 @@
                                     <w:sz w:val="28"/>
                                     <w:szCs w:val="28"/>
                                   </w:rPr>
-                                  <w:t xml:space="preserve">Ramadan </w:t>
-                                </w:r>
-                                <w:proofErr w:type="spellStart"/>
-                                <w:r>
-                                  <w:rPr>
-                                    <w:b/>
-                                    <w:bCs/>
-                                    <w:sz w:val="28"/>
-                                    <w:szCs w:val="28"/>
-                                  </w:rPr>
-                                  <w:t>Moraya</w:t>
-                                </w:r>
-                                <w:proofErr w:type="spellEnd"/>
-                                <w:r>
-                                  <w:rPr>
-                                    <w:b/>
-                                    <w:bCs/>
-                                    <w:sz w:val="28"/>
-                                    <w:szCs w:val="28"/>
-                                  </w:rPr>
-                                  <w:t xml:space="preserve"> Hakami</w:t>
+                                  <w:t>Ramadan Moraya Hakami</w:t>
                                 </w:r>
                               </w:p>
                               <w:p>
                                 <w:pPr>
-                                  <w:pStyle w:val="Footer"/>
+                                  <w:pStyle w:val="a5"/>
                                   <w:rPr>
                                     <w:b/>
                                     <w:bCs/>
@@ -2818,10 +2805,28 @@
                                   </w:rPr>
                                   <w:t xml:space="preserve">Name: </w:t>
                                 </w:r>
+                                <w:r>
+                                  <w:rPr>
+                                    <w:b/>
+                                    <w:bCs/>
+                                    <w:sz w:val="28"/>
+                                    <w:szCs w:val="28"/>
+                                  </w:rPr>
+                                  <w:t>Rakan A</w:t>
+                                </w:r>
+                                <w:r>
+                                  <w:rPr>
+                                    <w:b/>
+                                    <w:bCs/>
+                                    <w:sz w:val="28"/>
+                                    <w:szCs w:val="28"/>
+                                  </w:rPr>
+                                  <w:t>lqu</w:t>
+                                </w:r>
                               </w:p>
                               <w:p>
                                 <w:pPr>
-                                  <w:pStyle w:val="Footer"/>
+                                  <w:pStyle w:val="a5"/>
                                   <w:rPr>
                                     <w:b/>
                                     <w:bCs/>
@@ -2850,7 +2855,7 @@
                               </w:p>
                               <w:p>
                                 <w:pPr>
-                                  <w:pStyle w:val="Footer"/>
+                                  <w:pStyle w:val="a5"/>
                                   <w:rPr>
                                     <w:b/>
                                     <w:bCs/>
@@ -2879,7 +2884,7 @@
                               </w:p>
                               <w:p>
                                 <w:pPr>
-                                  <w:pStyle w:val="Footer"/>
+                                  <w:pStyle w:val="a5"/>
                                   <w:ind w:left="0"/>
                                   <w:rPr>
                                     <w:b/>
@@ -2899,7 +2904,7 @@
                               </w:tcPr>
                               <w:p>
                                 <w:pPr>
-                                  <w:pStyle w:val="Footer"/>
+                                  <w:pStyle w:val="a5"/>
                                   <w:ind w:left="0"/>
                                   <w:rPr>
                                     <w:b/>
@@ -2917,7 +2922,7 @@
                               </w:tcPr>
                               <w:p>
                                 <w:pPr>
-                                  <w:pStyle w:val="Footer"/>
+                                  <w:pStyle w:val="a5"/>
                                   <w:rPr>
                                     <w:b/>
                                     <w:bCs/>
@@ -2955,7 +2960,45 @@
                               </w:p>
                               <w:p>
                                 <w:pPr>
-                                  <w:pStyle w:val="Footer"/>
+                                  <w:pStyle w:val="a5"/>
+                                  <w:rPr>
+                                    <w:b/>
+                                    <w:bCs/>
+                                    <w:sz w:val="28"/>
+                                    <w:szCs w:val="28"/>
+                                  </w:rPr>
+                                </w:pPr>
+                                <w:r>
+                                  <w:rPr>
+                                    <w:b/>
+                                    <w:bCs/>
+                                    <w:sz w:val="28"/>
+                                    <w:szCs w:val="28"/>
+                                  </w:rPr>
+                                  <w:t>ID:</w:t>
+                                </w:r>
+                                <w:r>
+                                  <w:rPr>
+                                    <w:b/>
+                                    <w:bCs/>
+                                    <w:sz w:val="28"/>
+                                    <w:szCs w:val="28"/>
+                                  </w:rPr>
+                                  <w:t xml:space="preserve"> </w:t>
+                                </w:r>
+                                <w:r>
+                                  <w:rPr>
+                                    <w:b/>
+                                    <w:bCs/>
+                                    <w:sz w:val="28"/>
+                                    <w:szCs w:val="28"/>
+                                  </w:rPr>
+                                  <w:t>S240048280</w:t>
+                                </w:r>
+                              </w:p>
+                              <w:p>
+                                <w:pPr>
+                                  <w:pStyle w:val="a5"/>
                                   <w:rPr>
                                     <w:b/>
                                     <w:bCs/>
@@ -2984,36 +3027,7 @@
                               </w:p>
                               <w:p>
                                 <w:pPr>
-                                  <w:pStyle w:val="Footer"/>
-                                  <w:rPr>
-                                    <w:b/>
-                                    <w:bCs/>
-                                    <w:sz w:val="28"/>
-                                    <w:szCs w:val="28"/>
-                                  </w:rPr>
-                                </w:pPr>
-                                <w:r>
-                                  <w:rPr>
-                                    <w:b/>
-                                    <w:bCs/>
-                                    <w:sz w:val="28"/>
-                                    <w:szCs w:val="28"/>
-                                  </w:rPr>
-                                  <w:t>ID:</w:t>
-                                </w:r>
-                                <w:r>
-                                  <w:rPr>
-                                    <w:b/>
-                                    <w:bCs/>
-                                    <w:sz w:val="28"/>
-                                    <w:szCs w:val="28"/>
-                                  </w:rPr>
-                                  <w:t xml:space="preserve"> </w:t>
-                                </w:r>
-                              </w:p>
-                              <w:p>
-                                <w:pPr>
-                                  <w:pStyle w:val="Footer"/>
+                                  <w:pStyle w:val="a5"/>
                                   <w:rPr>
                                     <w:b/>
                                     <w:bCs/>
@@ -3054,7 +3068,7 @@
                               </w:tcPr>
                               <w:p>
                                 <w:pPr>
-                                  <w:pStyle w:val="Footer"/>
+                                  <w:pStyle w:val="a5"/>
                                   <w:ind w:left="0"/>
                                 </w:pPr>
                               </w:p>
@@ -3066,7 +3080,7 @@
                               </w:tcPr>
                               <w:p>
                                 <w:pPr>
-                                  <w:pStyle w:val="Footer"/>
+                                  <w:pStyle w:val="a5"/>
                                 </w:pPr>
                               </w:p>
                             </w:tc>
@@ -3077,7 +3091,7 @@
                               </w:tcPr>
                               <w:p>
                                 <w:pPr>
-                                  <w:pStyle w:val="Footer"/>
+                                  <w:pStyle w:val="a5"/>
                                 </w:pPr>
                               </w:p>
                             </w:tc>
@@ -3085,7 +3099,7 @@
                         </w:tbl>
                         <w:p>
                           <w:pPr>
-                            <w:pStyle w:val="NoSpacing"/>
+                            <w:pStyle w:val="ad"/>
                           </w:pPr>
                         </w:p>
                       </w:txbxContent>
@@ -3127,7 +3141,7 @@
     </w:p>
     <w:p>
       <w:pPr>
-        <w:pStyle w:val="Heading1"/>
+        <w:pStyle w:val="1"/>
         <w:spacing w:before="0" w:after="0"/>
         <w:rPr>
           <w:rFonts w:ascii="Times New Roman" w:hAnsi="Times New Roman" w:cs="Times New Roman"/>
@@ -3223,7 +3237,6 @@
         </w:rPr>
         <w:t xml:space="preserve">This project </w:t>
       </w:r>
-      <w:proofErr w:type="gramStart"/>
       <w:r>
         <w:rPr>
           <w:rFonts w:ascii="Times New Roman" w:hAnsi="Times New Roman" w:cs="Times New Roman"/>
@@ -3233,9 +3246,8 @@
           <w:sz w:val="24"/>
           <w:szCs w:val="24"/>
         </w:rPr>
-        <w:t>worth</w:t>
-      </w:r>
-      <w:proofErr w:type="gramEnd"/>
+        <w:t xml:space="preserve">worth </w:t>
+      </w:r>
       <w:r>
         <w:rPr>
           <w:rFonts w:ascii="Times New Roman" w:hAnsi="Times New Roman" w:cs="Times New Roman"/>
@@ -3245,7 +3257,7 @@
           <w:sz w:val="24"/>
           <w:szCs w:val="24"/>
         </w:rPr>
-        <w:t xml:space="preserve"> </w:t>
+        <w:t>20</w:t>
       </w:r>
       <w:r>
         <w:rPr>
@@ -3256,17 +3268,6 @@
           <w:sz w:val="24"/>
           <w:szCs w:val="24"/>
         </w:rPr>
-        <w:t>20</w:t>
-      </w:r>
-      <w:r>
-        <w:rPr>
-          <w:rFonts w:ascii="Times New Roman" w:hAnsi="Times New Roman" w:cs="Times New Roman"/>
-          <w:b/>
-          <w:bCs/>
-          <w:color w:val="auto"/>
-          <w:sz w:val="24"/>
-          <w:szCs w:val="24"/>
-        </w:rPr>
         <w:t xml:space="preserve"> marks</w:t>
       </w:r>
       <w:r>
@@ -3281,7 +3282,7 @@
     </w:p>
     <w:p>
       <w:pPr>
-        <w:pStyle w:val="ListParagraph"/>
+        <w:pStyle w:val="af5"/>
         <w:numPr>
           <w:ilvl w:val="1"/>
           <w:numId w:val="6"/>
@@ -3360,7 +3361,7 @@
     </w:p>
     <w:p>
       <w:pPr>
-        <w:pStyle w:val="ListParagraph"/>
+        <w:pStyle w:val="af5"/>
         <w:numPr>
           <w:ilvl w:val="1"/>
           <w:numId w:val="6"/>
@@ -3446,7 +3447,7 @@
     </w:p>
     <w:p>
       <w:pPr>
-        <w:pStyle w:val="ListParagraph"/>
+        <w:pStyle w:val="af5"/>
         <w:numPr>
           <w:ilvl w:val="1"/>
           <w:numId w:val="6"/>
@@ -3532,7 +3533,7 @@
     </w:p>
     <w:p>
       <w:pPr>
-        <w:pStyle w:val="ListParagraph"/>
+        <w:pStyle w:val="af5"/>
         <w:numPr>
           <w:ilvl w:val="1"/>
           <w:numId w:val="6"/>
@@ -3778,7 +3779,7 @@
     </w:p>
     <w:p>
       <w:pPr>
-        <w:pStyle w:val="ListParagraph"/>
+        <w:pStyle w:val="af5"/>
         <w:numPr>
           <w:ilvl w:val="0"/>
           <w:numId w:val="19"/>
@@ -3803,7 +3804,7 @@
     </w:p>
     <w:p>
       <w:pPr>
-        <w:pStyle w:val="ListParagraph"/>
+        <w:pStyle w:val="af5"/>
         <w:numPr>
           <w:ilvl w:val="0"/>
           <w:numId w:val="19"/>
@@ -3828,7 +3829,7 @@
     </w:p>
     <w:p>
       <w:pPr>
-        <w:pStyle w:val="ListParagraph"/>
+        <w:pStyle w:val="af5"/>
         <w:numPr>
           <w:ilvl w:val="0"/>
           <w:numId w:val="19"/>
@@ -3925,7 +3926,7 @@
     </w:p>
     <w:p>
       <w:pPr>
-        <w:pStyle w:val="ListParagraph"/>
+        <w:pStyle w:val="af5"/>
         <w:numPr>
           <w:ilvl w:val="0"/>
           <w:numId w:val="19"/>
@@ -4084,25 +4085,7 @@
           <w:sz w:val="24"/>
           <w:szCs w:val="24"/>
         </w:rPr>
-        <w:t xml:space="preserve"> describing the completed work, key decisions, challenges, </w:t>
-      </w:r>
-      <w:proofErr w:type="gramStart"/>
-      <w:r>
-        <w:rPr>
-          <w:rFonts w:ascii="Times New Roman" w:hAnsi="Times New Roman" w:cs="Times New Roman"/>
-          <w:sz w:val="24"/>
-          <w:szCs w:val="24"/>
-        </w:rPr>
-        <w:t>future plan</w:t>
-      </w:r>
-      <w:proofErr w:type="gramEnd"/>
-      <w:r>
-        <w:rPr>
-          <w:rFonts w:ascii="Times New Roman" w:hAnsi="Times New Roman" w:cs="Times New Roman"/>
-          <w:sz w:val="24"/>
-          <w:szCs w:val="24"/>
-        </w:rPr>
-        <w:t>, and contribution of each group member.</w:t>
+        <w:t xml:space="preserve"> describing the completed work, key decisions, challenges, future plan, and contribution of each group member.</w:t>
       </w:r>
     </w:p>
     <w:p>
@@ -4145,25 +4128,7 @@
           <w:sz w:val="24"/>
           <w:szCs w:val="24"/>
         </w:rPr>
-        <w:t xml:space="preserve"> to the live report document, GitHub/GitLab repository, and Google </w:t>
-      </w:r>
-      <w:proofErr w:type="spellStart"/>
-      <w:r>
-        <w:rPr>
-          <w:rFonts w:ascii="Times New Roman" w:hAnsi="Times New Roman" w:cs="Times New Roman"/>
-          <w:sz w:val="24"/>
-          <w:szCs w:val="24"/>
-        </w:rPr>
-        <w:t>Colab</w:t>
-      </w:r>
-      <w:proofErr w:type="spellEnd"/>
-      <w:r>
-        <w:rPr>
-          <w:rFonts w:ascii="Times New Roman" w:hAnsi="Times New Roman" w:cs="Times New Roman"/>
-          <w:sz w:val="24"/>
-          <w:szCs w:val="24"/>
-        </w:rPr>
-        <w:t xml:space="preserve"> notebook (if applicable) in the </w:t>
+        <w:t xml:space="preserve"> to the live report document, GitHub/GitLab repository, and Google Colab notebook (if applicable) in the </w:t>
       </w:r>
       <w:r>
         <w:rPr>
@@ -4324,7 +4289,7 @@
     </w:p>
     <w:p>
       <w:pPr>
-        <w:pStyle w:val="ListParagraph"/>
+        <w:pStyle w:val="af5"/>
         <w:numPr>
           <w:ilvl w:val="0"/>
           <w:numId w:val="7"/>
@@ -4362,7 +4327,7 @@
     </w:p>
     <w:p>
       <w:pPr>
-        <w:pStyle w:val="ListParagraph"/>
+        <w:pStyle w:val="af5"/>
         <w:numPr>
           <w:ilvl w:val="0"/>
           <w:numId w:val="7"/>
@@ -4478,7 +4443,7 @@
     </w:p>
     <w:p>
       <w:pPr>
-        <w:pStyle w:val="Heading1"/>
+        <w:pStyle w:val="1"/>
         <w:rPr>
           <w:rFonts w:ascii="Times New Roman" w:hAnsi="Times New Roman" w:cs="Times New Roman"/>
           <w:color w:val="auto"/>
@@ -4597,16 +4562,16 @@
                         <w:txbxContent>
                           <w:p>
                             <w:pPr>
-                              <w:pStyle w:val="Quote"/>
+                              <w:pStyle w:val="af"/>
                               <w:rPr>
-                                <w:rStyle w:val="QuoteChar"/>
+                                <w:rStyle w:val="Char5"/>
                                 <w:i/>
                                 <w:iCs/>
                               </w:rPr>
                             </w:pPr>
                             <w:r>
                               <w:rPr>
-                                <w:rStyle w:val="QuoteChar"/>
+                                <w:rStyle w:val="Char5"/>
                                 <w:i/>
                                 <w:iCs/>
                               </w:rPr>
@@ -4624,7 +4589,7 @@
                           </w:p>
                           <w:p>
                             <w:pPr>
-                              <w:pStyle w:val="NormalWeb"/>
+                              <w:pStyle w:val="af6"/>
                               <w:shd w:val="clear" w:color="auto" w:fill="FFFFFF"/>
                               <w:spacing w:before="0" w:beforeAutospacing="0" w:after="0" w:afterAutospacing="0" w:line="360" w:lineRule="auto"/>
                               <w:jc w:val="both"/>
@@ -4652,7 +4617,7 @@
                           </w:p>
                           <w:p>
                             <w:pPr>
-                              <w:pStyle w:val="NormalWeb"/>
+                              <w:pStyle w:val="af6"/>
                               <w:shd w:val="clear" w:color="auto" w:fill="FFFFFF"/>
                               <w:spacing w:before="0" w:beforeAutospacing="0" w:after="0" w:afterAutospacing="0"/>
                               <w:rPr>
@@ -4720,16 +4685,16 @@
                   <w:txbxContent>
                     <w:p>
                       <w:pPr>
-                        <w:pStyle w:val="Quote"/>
+                        <w:pStyle w:val="af"/>
                         <w:rPr>
-                          <w:rStyle w:val="QuoteChar"/>
+                          <w:rStyle w:val="Char5"/>
                           <w:i/>
                           <w:iCs/>
                         </w:rPr>
                       </w:pPr>
                       <w:r>
                         <w:rPr>
-                          <w:rStyle w:val="QuoteChar"/>
+                          <w:rStyle w:val="Char5"/>
                           <w:i/>
                           <w:iCs/>
                         </w:rPr>
@@ -4747,7 +4712,7 @@
                     </w:p>
                     <w:p>
                       <w:pPr>
-                        <w:pStyle w:val="NormalWeb"/>
+                        <w:pStyle w:val="af6"/>
                         <w:shd w:val="clear" w:color="auto" w:fill="FFFFFF"/>
                         <w:spacing w:before="0" w:beforeAutospacing="0" w:after="0" w:afterAutospacing="0" w:line="360" w:lineRule="auto"/>
                         <w:jc w:val="both"/>
@@ -4775,7 +4740,7 @@
                     </w:p>
                     <w:p>
                       <w:pPr>
-                        <w:pStyle w:val="NormalWeb"/>
+                        <w:pStyle w:val="af6"/>
                         <w:shd w:val="clear" w:color="auto" w:fill="FFFFFF"/>
                         <w:spacing w:before="0" w:beforeAutospacing="0" w:after="0" w:afterAutospacing="0"/>
                         <w:rPr>
@@ -4853,25 +4818,7 @@
           <w:sz w:val="24"/>
           <w:szCs w:val="24"/>
         </w:rPr>
-        <w:t xml:space="preserve">A private clinic currently manages </w:t>
-      </w:r>
-      <w:proofErr w:type="gramStart"/>
-      <w:r>
-        <w:rPr>
-          <w:rFonts w:ascii="Times New Roman" w:hAnsi="Times New Roman" w:cs="Times New Roman"/>
-          <w:sz w:val="24"/>
-          <w:szCs w:val="24"/>
-        </w:rPr>
-        <w:t>its patient</w:t>
-      </w:r>
-      <w:proofErr w:type="gramEnd"/>
-      <w:r>
-        <w:rPr>
-          <w:rFonts w:ascii="Times New Roman" w:hAnsi="Times New Roman" w:cs="Times New Roman"/>
-          <w:sz w:val="24"/>
-          <w:szCs w:val="24"/>
-        </w:rPr>
-        <w:t xml:space="preserve"> information manually, making it difficult to organize appointments, treatments, and payments. The clinic has decided to develop a database system to improve data organization and retrieval.</w:t>
+        <w:t>A private clinic currently manages its patient information manually, making it difficult to organize appointments, treatments, and payments. The clinic has decided to develop a database system to improve data organization and retrieval.</w:t>
       </w:r>
     </w:p>
     <w:p>
@@ -4895,7 +4842,7 @@
     </w:p>
     <w:p>
       <w:pPr>
-        <w:pStyle w:val="Heading1"/>
+        <w:pStyle w:val="1"/>
       </w:pPr>
       <w:r>
         <w:lastRenderedPageBreak/>
@@ -4904,7 +4851,7 @@
     </w:p>
     <w:p>
       <w:pPr>
-        <w:pStyle w:val="ListBullet"/>
+        <w:pStyle w:val="a"/>
         <w:rPr>
           <w:rFonts w:ascii="Times New Roman" w:hAnsi="Times New Roman" w:cs="Times New Roman"/>
           <w:sz w:val="24"/>
@@ -4922,7 +4869,7 @@
     </w:p>
     <w:p>
       <w:pPr>
-        <w:pStyle w:val="ListBullet"/>
+        <w:pStyle w:val="a"/>
         <w:rPr>
           <w:rFonts w:ascii="Times New Roman" w:hAnsi="Times New Roman" w:cs="Times New Roman"/>
           <w:sz w:val="24"/>
@@ -4937,32 +4884,12 @@
           <w:szCs w:val="24"/>
           <w:lang w:val="es-ES"/>
         </w:rPr>
-        <w:t xml:space="preserve">A complete ER/EER </w:t>
-      </w:r>
-      <w:proofErr w:type="spellStart"/>
-      <w:r>
-        <w:rPr>
-          <w:rFonts w:ascii="Times New Roman" w:hAnsi="Times New Roman" w:cs="Times New Roman"/>
-          <w:sz w:val="24"/>
-          <w:szCs w:val="24"/>
-          <w:lang w:val="es-ES"/>
-        </w:rPr>
-        <w:t>diagram</w:t>
-      </w:r>
-      <w:proofErr w:type="spellEnd"/>
-      <w:r>
-        <w:rPr>
-          <w:rFonts w:ascii="Times New Roman" w:hAnsi="Times New Roman" w:cs="Times New Roman"/>
-          <w:sz w:val="24"/>
-          <w:szCs w:val="24"/>
-          <w:lang w:val="es-ES"/>
-        </w:rPr>
-        <w:t>.</w:t>
+        <w:t>A complete ER/EER diagram.</w:t>
       </w:r>
     </w:p>
     <w:p>
       <w:pPr>
-        <w:pStyle w:val="ListBullet"/>
+        <w:pStyle w:val="a"/>
         <w:rPr>
           <w:rFonts w:ascii="Times New Roman" w:hAnsi="Times New Roman" w:cs="Times New Roman"/>
           <w:sz w:val="24"/>
@@ -4980,7 +4907,7 @@
     </w:p>
     <w:p>
       <w:pPr>
-        <w:pStyle w:val="ListBullet"/>
+        <w:pStyle w:val="a"/>
         <w:rPr>
           <w:rFonts w:ascii="Times New Roman" w:hAnsi="Times New Roman" w:cs="Times New Roman"/>
           <w:sz w:val="24"/>
@@ -4998,7 +4925,7 @@
     </w:p>
     <w:p>
       <w:pPr>
-        <w:pStyle w:val="ListBullet"/>
+        <w:pStyle w:val="a"/>
         <w:rPr>
           <w:rFonts w:ascii="Times New Roman" w:hAnsi="Times New Roman" w:cs="Times New Roman"/>
           <w:sz w:val="24"/>
@@ -5016,7 +4943,7 @@
     </w:p>
     <w:p>
       <w:pPr>
-        <w:pStyle w:val="ListBullet"/>
+        <w:pStyle w:val="a"/>
         <w:rPr>
           <w:rFonts w:ascii="Times New Roman" w:hAnsi="Times New Roman" w:cs="Times New Roman"/>
           <w:sz w:val="24"/>
@@ -5034,7 +4961,7 @@
     </w:p>
     <w:p>
       <w:pPr>
-        <w:pStyle w:val="ListBullet"/>
+        <w:pStyle w:val="a"/>
         <w:numPr>
           <w:ilvl w:val="0"/>
           <w:numId w:val="0"/>
@@ -5049,7 +4976,7 @@
     </w:p>
     <w:p>
       <w:pPr>
-        <w:pStyle w:val="ListBullet"/>
+        <w:pStyle w:val="a"/>
         <w:numPr>
           <w:ilvl w:val="0"/>
           <w:numId w:val="0"/>
@@ -5064,7 +4991,7 @@
     </w:p>
     <w:p>
       <w:pPr>
-        <w:pStyle w:val="ListBullet"/>
+        <w:pStyle w:val="a"/>
         <w:numPr>
           <w:ilvl w:val="0"/>
           <w:numId w:val="30"/>
@@ -5092,7 +5019,7 @@
     </w:p>
     <w:p>
       <w:pPr>
-        <w:pStyle w:val="ListBullet"/>
+        <w:pStyle w:val="a"/>
         <w:numPr>
           <w:ilvl w:val="0"/>
           <w:numId w:val="0"/>
@@ -5110,7 +5037,7 @@
     </w:p>
     <w:p>
       <w:pPr>
-        <w:pStyle w:val="ListBullet"/>
+        <w:pStyle w:val="a"/>
         <w:numPr>
           <w:ilvl w:val="0"/>
           <w:numId w:val="28"/>
@@ -5134,7 +5061,7 @@
     </w:p>
     <w:p>
       <w:pPr>
-        <w:pStyle w:val="ListBullet"/>
+        <w:pStyle w:val="a"/>
         <w:numPr>
           <w:ilvl w:val="0"/>
           <w:numId w:val="28"/>
@@ -5158,7 +5085,7 @@
     </w:p>
     <w:p>
       <w:pPr>
-        <w:pStyle w:val="ListBullet"/>
+        <w:pStyle w:val="a"/>
         <w:numPr>
           <w:ilvl w:val="0"/>
           <w:numId w:val="29"/>
@@ -5170,8 +5097,6 @@
           <w:szCs w:val="24"/>
         </w:rPr>
       </w:pPr>
-      <w:proofErr w:type="spellStart"/>
-      <w:proofErr w:type="gramStart"/>
       <w:r>
         <w:rPr>
           <w:rFonts w:ascii="Times New Roman" w:hAnsi="Times New Roman" w:cs="Times New Roman"/>
@@ -5181,12 +5106,10 @@
         </w:rPr>
         <w:t>GeneralPractitioner</w:t>
       </w:r>
-      <w:proofErr w:type="spellEnd"/>
-      <w:proofErr w:type="gramEnd"/>
     </w:p>
     <w:p>
       <w:pPr>
-        <w:pStyle w:val="ListBullet"/>
+        <w:pStyle w:val="a"/>
         <w:numPr>
           <w:ilvl w:val="0"/>
           <w:numId w:val="29"/>
@@ -5210,7 +5133,7 @@
     </w:p>
     <w:p>
       <w:pPr>
-        <w:pStyle w:val="ListBullet"/>
+        <w:pStyle w:val="a"/>
         <w:numPr>
           <w:ilvl w:val="0"/>
           <w:numId w:val="28"/>
@@ -5234,7 +5157,7 @@
     </w:p>
     <w:p>
       <w:pPr>
-        <w:pStyle w:val="ListBullet"/>
+        <w:pStyle w:val="a"/>
         <w:numPr>
           <w:ilvl w:val="0"/>
           <w:numId w:val="28"/>
@@ -5258,7 +5181,7 @@
     </w:p>
     <w:p>
       <w:pPr>
-        <w:pStyle w:val="ListBullet"/>
+        <w:pStyle w:val="a"/>
         <w:numPr>
           <w:ilvl w:val="0"/>
           <w:numId w:val="28"/>
@@ -5282,7 +5205,7 @@
     </w:p>
     <w:p>
       <w:pPr>
-        <w:pStyle w:val="ListBullet"/>
+        <w:pStyle w:val="a"/>
         <w:numPr>
           <w:ilvl w:val="0"/>
           <w:numId w:val="28"/>
@@ -5306,7 +5229,7 @@
     </w:p>
     <w:p>
       <w:pPr>
-        <w:pStyle w:val="ListBullet"/>
+        <w:pStyle w:val="a"/>
         <w:numPr>
           <w:ilvl w:val="0"/>
           <w:numId w:val="0"/>
@@ -5321,262 +5244,175 @@
     </w:p>
     <w:p>
       <w:pPr>
-        <w:pStyle w:val="Heading1"/>
-      </w:pPr>
-      <w:r>
-        <w:lastRenderedPageBreak/>
-        <w:t>Task 2 – Database Implementation (6 Marks)</w:t>
-      </w:r>
-    </w:p>
-    <w:p>
-      <w:pPr>
-        <w:pStyle w:val="ListBullet"/>
+        <w:pStyle w:val="a"/>
         <w:numPr>
           <w:ilvl w:val="0"/>
           <w:numId w:val="0"/>
         </w:numPr>
-        <w:rPr>
-          <w:rFonts w:ascii="Times New Roman" w:hAnsi="Times New Roman" w:cs="Times New Roman"/>
-          <w:color w:val="auto"/>
-          <w:sz w:val="24"/>
-          <w:szCs w:val="24"/>
-        </w:rPr>
-      </w:pPr>
-      <w:r>
-        <w:rPr>
-          <w:rFonts w:ascii="Times New Roman" w:hAnsi="Times New Roman" w:cs="Times New Roman"/>
-          <w:color w:val="auto"/>
-          <w:sz w:val="24"/>
-          <w:szCs w:val="24"/>
-        </w:rPr>
-        <w:t>Complete the following tasks using MySQL. Include screenshots of both your SQL code and the corresponding output (results) for each task:</w:t>
-      </w:r>
+        <w:ind w:left="576" w:hanging="288"/>
+        <w:rPr>
+          <w:rFonts w:ascii="Times New Roman" w:hAnsi="Times New Roman" w:cs="Times New Roman"/>
+          <w:sz w:val="24"/>
+          <w:szCs w:val="24"/>
+        </w:rPr>
+      </w:pPr>
     </w:p>
     <w:p>
       <w:pPr>
-        <w:pStyle w:val="ListBullet"/>
-        <w:rPr>
-          <w:rFonts w:ascii="Times New Roman" w:hAnsi="Times New Roman" w:cs="Times New Roman"/>
-          <w:color w:val="auto"/>
-          <w:sz w:val="24"/>
-          <w:szCs w:val="24"/>
-        </w:rPr>
-      </w:pPr>
-      <w:r>
-        <w:rPr>
-          <w:rFonts w:ascii="Times New Roman" w:hAnsi="Times New Roman" w:cs="Times New Roman"/>
-          <w:color w:val="auto"/>
-          <w:sz w:val="24"/>
-          <w:szCs w:val="24"/>
-        </w:rPr>
-        <w:t>Create the database and all required tables.</w:t>
-      </w:r>
-    </w:p>
-    <w:p>
-      <w:pPr>
-        <w:pStyle w:val="ListBullet"/>
-        <w:rPr>
-          <w:rFonts w:ascii="Times New Roman" w:hAnsi="Times New Roman" w:cs="Times New Roman"/>
-          <w:color w:val="auto"/>
-          <w:sz w:val="24"/>
-          <w:szCs w:val="24"/>
-        </w:rPr>
-      </w:pPr>
-      <w:r>
-        <w:rPr>
-          <w:rFonts w:ascii="Times New Roman" w:hAnsi="Times New Roman" w:cs="Times New Roman"/>
-          <w:color w:val="auto"/>
-          <w:sz w:val="24"/>
-          <w:szCs w:val="24"/>
-        </w:rPr>
-        <w:t>Use appropriate data types and constraints (PRIMARY KEY, FOREIGN KEY, NOT NULL, UNIQUE, etc.).</w:t>
-      </w:r>
-    </w:p>
-    <w:p>
-      <w:pPr>
-        <w:pStyle w:val="ListBullet"/>
-        <w:rPr>
-          <w:rFonts w:ascii="Times New Roman" w:hAnsi="Times New Roman" w:cs="Times New Roman"/>
-          <w:color w:val="auto"/>
-          <w:sz w:val="24"/>
-          <w:szCs w:val="24"/>
-        </w:rPr>
-      </w:pPr>
-      <w:r>
-        <w:rPr>
-          <w:rFonts w:ascii="Times New Roman" w:hAnsi="Times New Roman" w:cs="Times New Roman"/>
-          <w:color w:val="auto"/>
-          <w:sz w:val="24"/>
-          <w:szCs w:val="24"/>
-        </w:rPr>
-        <w:t>Insert at least 5 records into each main table.</w:t>
-      </w:r>
-    </w:p>
-    <w:p>
-      <w:pPr>
-        <w:pStyle w:val="Heading1"/>
-      </w:pPr>
-      <w:r>
-        <w:lastRenderedPageBreak/>
-        <w:t>Task 3 – SQL Operations (6 Marks)</w:t>
-      </w:r>
-    </w:p>
-    <w:p>
-      <w:pPr>
-        <w:pStyle w:val="ListBullet"/>
+        <w:pStyle w:val="a"/>
         <w:numPr>
           <w:ilvl w:val="0"/>
           <w:numId w:val="0"/>
         </w:numPr>
-        <w:rPr>
-          <w:rFonts w:ascii="Times New Roman" w:hAnsi="Times New Roman" w:cs="Times New Roman"/>
-          <w:color w:val="auto"/>
-          <w:sz w:val="24"/>
-          <w:szCs w:val="24"/>
-        </w:rPr>
-      </w:pPr>
-      <w:r>
-        <w:rPr>
-          <w:rFonts w:ascii="Times New Roman" w:hAnsi="Times New Roman" w:cs="Times New Roman"/>
-          <w:color w:val="auto"/>
-          <w:sz w:val="24"/>
-          <w:szCs w:val="24"/>
-        </w:rPr>
-        <w:t>Co</w:t>
-      </w:r>
-      <w:r>
-        <w:rPr>
-          <w:rFonts w:ascii="Times New Roman" w:hAnsi="Times New Roman" w:cs="Times New Roman"/>
-          <w:color w:val="auto"/>
-          <w:sz w:val="24"/>
-          <w:szCs w:val="24"/>
-        </w:rPr>
-        <w:t>mplete the following tasks using MySQL. For each task, include screenshots of both your SQL code and the corresponding output (results), along with a brief description (one to two sentences) explaining the purpose of the query and the information it is intended to retrieve.</w:t>
-      </w:r>
+        <w:ind w:left="288"/>
+        <w:rPr>
+          <w:rFonts w:ascii="Times New Roman" w:hAnsi="Times New Roman" w:cs="Times New Roman"/>
+          <w:sz w:val="24"/>
+          <w:szCs w:val="24"/>
+        </w:rPr>
+      </w:pPr>
     </w:p>
     <w:p>
       <w:pPr>
-        <w:pStyle w:val="ListBullet"/>
-        <w:rPr>
-          <w:rFonts w:ascii="Times New Roman" w:hAnsi="Times New Roman" w:cs="Times New Roman"/>
-          <w:color w:val="auto"/>
-          <w:sz w:val="24"/>
-          <w:szCs w:val="24"/>
-        </w:rPr>
-      </w:pPr>
-      <w:r>
-        <w:rPr>
-          <w:rFonts w:ascii="Times New Roman" w:hAnsi="Times New Roman" w:cs="Times New Roman"/>
-          <w:color w:val="auto"/>
-          <w:sz w:val="24"/>
-          <w:szCs w:val="24"/>
-        </w:rPr>
-        <w:t>Write SELECT statements.</w:t>
+        <w:pStyle w:val="a"/>
+        <w:numPr>
+          <w:ilvl w:val="0"/>
+          <w:numId w:val="30"/>
+        </w:numPr>
+        <w:rPr>
+          <w:rFonts w:ascii="Times New Roman" w:hAnsi="Times New Roman" w:cs="Times New Roman"/>
+          <w:b/>
+          <w:bCs/>
+          <w:color w:val="262626" w:themeColor="accent6" w:themeShade="80"/>
+          <w:sz w:val="28"/>
+          <w:szCs w:val="28"/>
+        </w:rPr>
+      </w:pPr>
+      <w:r>
+        <w:rPr>
+          <w:rFonts w:ascii="Times New Roman" w:hAnsi="Times New Roman" w:cs="Times New Roman"/>
+          <w:b/>
+          <w:bCs/>
+          <w:color w:val="262626" w:themeColor="accent6" w:themeShade="80"/>
+          <w:sz w:val="28"/>
+          <w:szCs w:val="28"/>
+        </w:rPr>
+        <w:t>Specialization / Generalization:</w:t>
       </w:r>
     </w:p>
     <w:p>
       <w:pPr>
-        <w:pStyle w:val="ListBullet"/>
-        <w:rPr>
-          <w:rFonts w:ascii="Times New Roman" w:hAnsi="Times New Roman" w:cs="Times New Roman"/>
-          <w:color w:val="auto"/>
-          <w:sz w:val="24"/>
-          <w:szCs w:val="24"/>
-        </w:rPr>
-      </w:pPr>
-      <w:r>
-        <w:rPr>
-          <w:rFonts w:ascii="Times New Roman" w:hAnsi="Times New Roman" w:cs="Times New Roman"/>
-          <w:color w:val="auto"/>
-          <w:sz w:val="24"/>
-          <w:szCs w:val="24"/>
-        </w:rPr>
-        <w:t>Write JOIN queries.</w:t>
-      </w:r>
+        <w:pStyle w:val="a"/>
+        <w:numPr>
+          <w:ilvl w:val="0"/>
+          <w:numId w:val="0"/>
+        </w:numPr>
+        <w:ind w:left="576"/>
+        <w:rPr>
+          <w:rFonts w:ascii="Times New Roman" w:hAnsi="Times New Roman" w:cs="Times New Roman"/>
+          <w:color w:val="262626" w:themeColor="accent6" w:themeShade="80"/>
+          <w:sz w:val="24"/>
+          <w:szCs w:val="24"/>
+        </w:rPr>
+      </w:pPr>
     </w:p>
     <w:p>
       <w:pPr>
-        <w:pStyle w:val="ListBullet"/>
-        <w:rPr>
-          <w:rFonts w:ascii="Times New Roman" w:hAnsi="Times New Roman" w:cs="Times New Roman"/>
-          <w:color w:val="auto"/>
-          <w:sz w:val="24"/>
-          <w:szCs w:val="24"/>
-        </w:rPr>
-      </w:pPr>
-      <w:r>
-        <w:rPr>
-          <w:rFonts w:ascii="Times New Roman" w:hAnsi="Times New Roman" w:cs="Times New Roman"/>
-          <w:color w:val="auto"/>
-          <w:sz w:val="24"/>
-          <w:szCs w:val="24"/>
-        </w:rPr>
-        <w:t>Write nested queries.</w:t>
+        <w:pStyle w:val="a"/>
+        <w:numPr>
+          <w:ilvl w:val="0"/>
+          <w:numId w:val="0"/>
+        </w:numPr>
+        <w:ind w:left="576" w:hanging="288"/>
+        <w:rPr>
+          <w:rFonts w:ascii="Times New Roman" w:hAnsi="Times New Roman" w:cs="Times New Roman"/>
+          <w:color w:val="262626" w:themeColor="accent6" w:themeShade="80"/>
+          <w:sz w:val="24"/>
+          <w:szCs w:val="24"/>
+        </w:rPr>
+      </w:pPr>
+      <w:r>
+        <w:rPr>
+          <w:rFonts w:ascii="Times New Roman" w:hAnsi="Times New Roman" w:cs="Times New Roman"/>
+          <w:color w:val="262626" w:themeColor="accent6" w:themeShade="80"/>
+          <w:sz w:val="24"/>
+          <w:szCs w:val="24"/>
+        </w:rPr>
+        <w:t>The Doctor entity is specialized into two subtypes:</w:t>
       </w:r>
     </w:p>
     <w:p>
       <w:pPr>
-        <w:pStyle w:val="ListBullet"/>
-        <w:rPr>
-          <w:rFonts w:ascii="Times New Roman" w:hAnsi="Times New Roman" w:cs="Times New Roman"/>
-          <w:color w:val="auto"/>
-          <w:sz w:val="24"/>
-          <w:szCs w:val="24"/>
-        </w:rPr>
-      </w:pPr>
-      <w:r>
-        <w:rPr>
-          <w:rFonts w:ascii="Times New Roman" w:hAnsi="Times New Roman" w:cs="Times New Roman"/>
-          <w:color w:val="auto"/>
-          <w:sz w:val="24"/>
-          <w:szCs w:val="24"/>
-        </w:rPr>
-        <w:t>Use aggregate functions with GROUP BY.</w:t>
+        <w:pStyle w:val="a"/>
+        <w:numPr>
+          <w:ilvl w:val="0"/>
+          <w:numId w:val="32"/>
+        </w:numPr>
+        <w:rPr>
+          <w:rFonts w:ascii="Times New Roman" w:hAnsi="Times New Roman" w:cs="Times New Roman"/>
+          <w:b/>
+          <w:bCs/>
+          <w:color w:val="262626" w:themeColor="accent6" w:themeShade="80"/>
+          <w:sz w:val="24"/>
+          <w:szCs w:val="24"/>
+        </w:rPr>
+      </w:pPr>
+      <w:r>
+        <w:rPr>
+          <w:rFonts w:ascii="Times New Roman" w:hAnsi="Times New Roman" w:cs="Times New Roman"/>
+          <w:b/>
+          <w:bCs/>
+          <w:color w:val="262626" w:themeColor="accent6" w:themeShade="80"/>
+          <w:sz w:val="24"/>
+          <w:szCs w:val="24"/>
+        </w:rPr>
+        <w:t>GeneralPractitioner</w:t>
       </w:r>
     </w:p>
     <w:p>
       <w:pPr>
-        <w:pStyle w:val="ListBullet"/>
-        <w:rPr>
-          <w:rFonts w:ascii="Times New Roman" w:hAnsi="Times New Roman" w:cs="Times New Roman"/>
-          <w:color w:val="auto"/>
-          <w:sz w:val="24"/>
-          <w:szCs w:val="24"/>
-        </w:rPr>
-      </w:pPr>
-      <w:r>
-        <w:rPr>
-          <w:rFonts w:ascii="Times New Roman" w:hAnsi="Times New Roman" w:cs="Times New Roman"/>
-          <w:color w:val="auto"/>
-          <w:sz w:val="24"/>
-          <w:szCs w:val="24"/>
-        </w:rPr>
-        <w:t>Write UPDATE and DELETE statements.</w:t>
+        <w:pStyle w:val="a"/>
+        <w:numPr>
+          <w:ilvl w:val="0"/>
+          <w:numId w:val="32"/>
+        </w:numPr>
+        <w:rPr>
+          <w:rFonts w:ascii="Times New Roman" w:hAnsi="Times New Roman" w:cs="Times New Roman"/>
+          <w:b/>
+          <w:bCs/>
+          <w:color w:val="262626" w:themeColor="accent6" w:themeShade="80"/>
+          <w:sz w:val="24"/>
+          <w:szCs w:val="24"/>
+        </w:rPr>
+      </w:pPr>
+      <w:r>
+        <w:rPr>
+          <w:rFonts w:ascii="Times New Roman" w:hAnsi="Times New Roman" w:cs="Times New Roman"/>
+          <w:b/>
+          <w:bCs/>
+          <w:color w:val="262626" w:themeColor="accent6" w:themeShade="80"/>
+          <w:sz w:val="24"/>
+          <w:szCs w:val="24"/>
+        </w:rPr>
+        <w:t>Specialist</w:t>
       </w:r>
     </w:p>
     <w:p>
       <w:pPr>
-        <w:pStyle w:val="ListBullet"/>
-        <w:rPr>
-          <w:rFonts w:ascii="Times New Roman" w:hAnsi="Times New Roman" w:cs="Times New Roman"/>
-          <w:color w:val="auto"/>
-          <w:sz w:val="24"/>
-          <w:szCs w:val="24"/>
-        </w:rPr>
-      </w:pPr>
-      <w:r>
-        <w:rPr>
-          <w:rFonts w:ascii="Times New Roman" w:hAnsi="Times New Roman" w:cs="Times New Roman"/>
-          <w:color w:val="auto"/>
-          <w:sz w:val="24"/>
-          <w:szCs w:val="24"/>
-        </w:rPr>
-        <w:t>Create one VIEW.</w:t>
+        <w:pStyle w:val="1"/>
+      </w:pPr>
+      <w:r>
+        <w:lastRenderedPageBreak/>
+        <w:t>Task 2 – Database Implementation (6 Marks)</w:t>
       </w:r>
     </w:p>
     <w:p>
       <w:pPr>
-        <w:pStyle w:val="ListBullet"/>
+        <w:pStyle w:val="a"/>
+        <w:numPr>
+          <w:ilvl w:val="0"/>
+          <w:numId w:val="0"/>
+        </w:numPr>
         <w:rPr>
           <w:rFonts w:ascii="Times New Roman" w:hAnsi="Times New Roman" w:cs="Times New Roman"/>
           <w:color w:val="auto"/>
@@ -5591,12 +5427,254 @@
           <w:sz w:val="24"/>
           <w:szCs w:val="24"/>
         </w:rPr>
-        <w:t>Create one TRIGGER.</w:t>
+        <w:t>Complete the following tasks using MySQL. Include screenshots of both your SQL code and the corresponding output (results) for each task:</w:t>
       </w:r>
     </w:p>
     <w:p>
       <w:pPr>
-        <w:pStyle w:val="Heading1"/>
+        <w:pStyle w:val="a"/>
+        <w:rPr>
+          <w:rFonts w:ascii="Times New Roman" w:hAnsi="Times New Roman" w:cs="Times New Roman"/>
+          <w:color w:val="auto"/>
+          <w:sz w:val="24"/>
+          <w:szCs w:val="24"/>
+        </w:rPr>
+      </w:pPr>
+      <w:r>
+        <w:rPr>
+          <w:rFonts w:ascii="Times New Roman" w:hAnsi="Times New Roman" w:cs="Times New Roman"/>
+          <w:color w:val="auto"/>
+          <w:sz w:val="24"/>
+          <w:szCs w:val="24"/>
+        </w:rPr>
+        <w:t>Create the database and all required tables.</w:t>
+      </w:r>
+    </w:p>
+    <w:p>
+      <w:pPr>
+        <w:pStyle w:val="a"/>
+        <w:rPr>
+          <w:rFonts w:ascii="Times New Roman" w:hAnsi="Times New Roman" w:cs="Times New Roman"/>
+          <w:color w:val="auto"/>
+          <w:sz w:val="24"/>
+          <w:szCs w:val="24"/>
+        </w:rPr>
+      </w:pPr>
+      <w:r>
+        <w:rPr>
+          <w:rFonts w:ascii="Times New Roman" w:hAnsi="Times New Roman" w:cs="Times New Roman"/>
+          <w:color w:val="auto"/>
+          <w:sz w:val="24"/>
+          <w:szCs w:val="24"/>
+        </w:rPr>
+        <w:t>Use appropriate data types and constraints (PRIMARY KEY, FOREIGN KEY, NOT NULL, UNIQUE, etc.).</w:t>
+      </w:r>
+    </w:p>
+    <w:p>
+      <w:pPr>
+        <w:pStyle w:val="a"/>
+        <w:rPr>
+          <w:rFonts w:ascii="Times New Roman" w:hAnsi="Times New Roman" w:cs="Times New Roman"/>
+          <w:color w:val="auto"/>
+          <w:sz w:val="24"/>
+          <w:szCs w:val="24"/>
+        </w:rPr>
+      </w:pPr>
+      <w:r>
+        <w:rPr>
+          <w:rFonts w:ascii="Times New Roman" w:hAnsi="Times New Roman" w:cs="Times New Roman"/>
+          <w:color w:val="auto"/>
+          <w:sz w:val="24"/>
+          <w:szCs w:val="24"/>
+        </w:rPr>
+        <w:t>Insert at least 5 records into each main table.</w:t>
+      </w:r>
+    </w:p>
+    <w:p>
+      <w:pPr>
+        <w:pStyle w:val="1"/>
+      </w:pPr>
+      <w:r>
+        <w:lastRenderedPageBreak/>
+        <w:t>Task 3 – SQL Operations (6 Marks)</w:t>
+      </w:r>
+    </w:p>
+    <w:p>
+      <w:pPr>
+        <w:pStyle w:val="a"/>
+        <w:numPr>
+          <w:ilvl w:val="0"/>
+          <w:numId w:val="0"/>
+        </w:numPr>
+        <w:rPr>
+          <w:rFonts w:ascii="Times New Roman" w:hAnsi="Times New Roman" w:cs="Times New Roman"/>
+          <w:color w:val="auto"/>
+          <w:sz w:val="24"/>
+          <w:szCs w:val="24"/>
+        </w:rPr>
+      </w:pPr>
+      <w:r>
+        <w:rPr>
+          <w:rFonts w:ascii="Times New Roman" w:hAnsi="Times New Roman" w:cs="Times New Roman"/>
+          <w:color w:val="auto"/>
+          <w:sz w:val="24"/>
+          <w:szCs w:val="24"/>
+        </w:rPr>
+        <w:t>Co</w:t>
+      </w:r>
+      <w:r>
+        <w:rPr>
+          <w:rFonts w:ascii="Times New Roman" w:hAnsi="Times New Roman" w:cs="Times New Roman"/>
+          <w:color w:val="auto"/>
+          <w:sz w:val="24"/>
+          <w:szCs w:val="24"/>
+        </w:rPr>
+        <w:t>mplete the following tasks using MySQL. For each task, include screenshots of both your SQL code and the corresponding output (results), along with a brief description (one to two sentences) explaining the purpose of the query and the information it is intended to retrieve.</w:t>
+      </w:r>
+    </w:p>
+    <w:p>
+      <w:pPr>
+        <w:pStyle w:val="a"/>
+        <w:rPr>
+          <w:rFonts w:ascii="Times New Roman" w:hAnsi="Times New Roman" w:cs="Times New Roman"/>
+          <w:color w:val="auto"/>
+          <w:sz w:val="24"/>
+          <w:szCs w:val="24"/>
+        </w:rPr>
+      </w:pPr>
+      <w:r>
+        <w:rPr>
+          <w:rFonts w:ascii="Times New Roman" w:hAnsi="Times New Roman" w:cs="Times New Roman"/>
+          <w:color w:val="auto"/>
+          <w:sz w:val="24"/>
+          <w:szCs w:val="24"/>
+        </w:rPr>
+        <w:t>Write SELECT statements.</w:t>
+      </w:r>
+    </w:p>
+    <w:p>
+      <w:pPr>
+        <w:pStyle w:val="a"/>
+        <w:rPr>
+          <w:rFonts w:ascii="Times New Roman" w:hAnsi="Times New Roman" w:cs="Times New Roman"/>
+          <w:color w:val="auto"/>
+          <w:sz w:val="24"/>
+          <w:szCs w:val="24"/>
+        </w:rPr>
+      </w:pPr>
+      <w:r>
+        <w:rPr>
+          <w:rFonts w:ascii="Times New Roman" w:hAnsi="Times New Roman" w:cs="Times New Roman"/>
+          <w:color w:val="auto"/>
+          <w:sz w:val="24"/>
+          <w:szCs w:val="24"/>
+        </w:rPr>
+        <w:t>Write JOIN queries.</w:t>
+      </w:r>
+    </w:p>
+    <w:p>
+      <w:pPr>
+        <w:pStyle w:val="a"/>
+        <w:rPr>
+          <w:rFonts w:ascii="Times New Roman" w:hAnsi="Times New Roman" w:cs="Times New Roman"/>
+          <w:color w:val="auto"/>
+          <w:sz w:val="24"/>
+          <w:szCs w:val="24"/>
+        </w:rPr>
+      </w:pPr>
+      <w:r>
+        <w:rPr>
+          <w:rFonts w:ascii="Times New Roman" w:hAnsi="Times New Roman" w:cs="Times New Roman"/>
+          <w:color w:val="auto"/>
+          <w:sz w:val="24"/>
+          <w:szCs w:val="24"/>
+        </w:rPr>
+        <w:t>Write nested queries.</w:t>
+      </w:r>
+    </w:p>
+    <w:p>
+      <w:pPr>
+        <w:pStyle w:val="a"/>
+        <w:rPr>
+          <w:rFonts w:ascii="Times New Roman" w:hAnsi="Times New Roman" w:cs="Times New Roman"/>
+          <w:color w:val="auto"/>
+          <w:sz w:val="24"/>
+          <w:szCs w:val="24"/>
+        </w:rPr>
+      </w:pPr>
+      <w:r>
+        <w:rPr>
+          <w:rFonts w:ascii="Times New Roman" w:hAnsi="Times New Roman" w:cs="Times New Roman"/>
+          <w:color w:val="auto"/>
+          <w:sz w:val="24"/>
+          <w:szCs w:val="24"/>
+        </w:rPr>
+        <w:t>Use aggregate functions with GROUP BY.</w:t>
+      </w:r>
+    </w:p>
+    <w:p>
+      <w:pPr>
+        <w:pStyle w:val="a"/>
+        <w:rPr>
+          <w:rFonts w:ascii="Times New Roman" w:hAnsi="Times New Roman" w:cs="Times New Roman"/>
+          <w:color w:val="auto"/>
+          <w:sz w:val="24"/>
+          <w:szCs w:val="24"/>
+        </w:rPr>
+      </w:pPr>
+      <w:r>
+        <w:rPr>
+          <w:rFonts w:ascii="Times New Roman" w:hAnsi="Times New Roman" w:cs="Times New Roman"/>
+          <w:color w:val="auto"/>
+          <w:sz w:val="24"/>
+          <w:szCs w:val="24"/>
+        </w:rPr>
+        <w:t>Write UPDATE and DELETE statements.</w:t>
+      </w:r>
+    </w:p>
+    <w:p>
+      <w:pPr>
+        <w:pStyle w:val="a"/>
+        <w:rPr>
+          <w:rFonts w:ascii="Times New Roman" w:hAnsi="Times New Roman" w:cs="Times New Roman"/>
+          <w:color w:val="auto"/>
+          <w:sz w:val="24"/>
+          <w:szCs w:val="24"/>
+        </w:rPr>
+      </w:pPr>
+      <w:r>
+        <w:rPr>
+          <w:rFonts w:ascii="Times New Roman" w:hAnsi="Times New Roman" w:cs="Times New Roman"/>
+          <w:color w:val="auto"/>
+          <w:sz w:val="24"/>
+          <w:szCs w:val="24"/>
+        </w:rPr>
+        <w:t>Create one VIEW.</w:t>
+      </w:r>
+    </w:p>
+    <w:p>
+      <w:pPr>
+        <w:pStyle w:val="a"/>
+        <w:rPr>
+          <w:rFonts w:ascii="Times New Roman" w:hAnsi="Times New Roman" w:cs="Times New Roman"/>
+          <w:color w:val="auto"/>
+          <w:sz w:val="24"/>
+          <w:szCs w:val="24"/>
+        </w:rPr>
+      </w:pPr>
+      <w:r>
+        <w:rPr>
+          <w:rFonts w:ascii="Times New Roman" w:hAnsi="Times New Roman" w:cs="Times New Roman"/>
+          <w:color w:val="auto"/>
+          <w:sz w:val="24"/>
+          <w:szCs w:val="24"/>
+        </w:rPr>
+        <w:t>Create one TRIGGER.</w:t>
+      </w:r>
+    </w:p>
+    <w:p>
+      <w:pPr>
+        <w:pStyle w:val="1"/>
       </w:pPr>
       <w:r>
         <w:lastRenderedPageBreak/>
@@ -5611,7 +5689,7 @@
     </w:p>
     <w:p>
       <w:pPr>
-        <w:pStyle w:val="ListBullet"/>
+        <w:pStyle w:val="a"/>
         <w:numPr>
           <w:ilvl w:val="0"/>
           <w:numId w:val="0"/>
@@ -5653,7 +5731,7 @@
     </w:p>
     <w:p>
       <w:pPr>
-        <w:pStyle w:val="ListBullet"/>
+        <w:pStyle w:val="a"/>
         <w:numPr>
           <w:ilvl w:val="0"/>
           <w:numId w:val="0"/>
@@ -5677,7 +5755,7 @@
     </w:p>
     <w:p>
       <w:pPr>
-        <w:pStyle w:val="ListBullet"/>
+        <w:pStyle w:val="a"/>
         <w:numPr>
           <w:ilvl w:val="0"/>
           <w:numId w:val="0"/>
@@ -5701,7 +5779,7 @@
     </w:p>
     <w:p>
       <w:pPr>
-        <w:pStyle w:val="ListBullet"/>
+        <w:pStyle w:val="a"/>
         <w:numPr>
           <w:ilvl w:val="0"/>
           <w:numId w:val="25"/>
@@ -5724,7 +5802,7 @@
     </w:p>
     <w:p>
       <w:pPr>
-        <w:pStyle w:val="ListBullet"/>
+        <w:pStyle w:val="a"/>
         <w:numPr>
           <w:ilvl w:val="0"/>
           <w:numId w:val="25"/>
@@ -5747,7 +5825,7 @@
     </w:p>
     <w:p>
       <w:pPr>
-        <w:pStyle w:val="ListBullet"/>
+        <w:pStyle w:val="a"/>
         <w:numPr>
           <w:ilvl w:val="0"/>
           <w:numId w:val="25"/>
@@ -5770,7 +5848,7 @@
     </w:p>
     <w:p>
       <w:pPr>
-        <w:pStyle w:val="ListBullet"/>
+        <w:pStyle w:val="a"/>
         <w:numPr>
           <w:ilvl w:val="0"/>
           <w:numId w:val="25"/>
@@ -5793,7 +5871,7 @@
     </w:p>
     <w:p>
       <w:pPr>
-        <w:pStyle w:val="ListBullet"/>
+        <w:pStyle w:val="a"/>
         <w:numPr>
           <w:ilvl w:val="0"/>
           <w:numId w:val="0"/>
@@ -5809,7 +5887,7 @@
     </w:p>
     <w:p>
       <w:pPr>
-        <w:pStyle w:val="Heading1"/>
+        <w:pStyle w:val="1"/>
       </w:pPr>
       <w:r>
         <w:lastRenderedPageBreak/>
@@ -5869,29 +5947,7 @@
           <w:sz w:val="24"/>
           <w:szCs w:val="24"/>
         </w:rPr>
-        <w:t>SQL Script (.</w:t>
-      </w:r>
-      <w:proofErr w:type="spellStart"/>
-      <w:r>
-        <w:rPr>
-          <w:rFonts w:ascii="Times New Roman" w:hAnsi="Times New Roman" w:cs="Times New Roman"/>
-          <w:b/>
-          <w:bCs/>
-          <w:sz w:val="24"/>
-          <w:szCs w:val="24"/>
-        </w:rPr>
-        <w:t>sql</w:t>
-      </w:r>
-      <w:proofErr w:type="spellEnd"/>
-      <w:r>
-        <w:rPr>
-          <w:rFonts w:ascii="Times New Roman" w:hAnsi="Times New Roman" w:cs="Times New Roman"/>
-          <w:b/>
-          <w:bCs/>
-          <w:sz w:val="24"/>
-          <w:szCs w:val="24"/>
-        </w:rPr>
-        <w:t>)</w:t>
+        <w:t>SQL Script (.sql)</w:t>
       </w:r>
       <w:r>
         <w:rPr>
@@ -6061,25 +6117,7 @@
           <w:sz w:val="24"/>
           <w:szCs w:val="24"/>
         </w:rPr>
-        <w:t xml:space="preserve">Google </w:t>
-      </w:r>
-      <w:proofErr w:type="spellStart"/>
-      <w:r>
-        <w:rPr>
-          <w:rFonts w:ascii="Times New Roman" w:hAnsi="Times New Roman" w:cs="Times New Roman"/>
-          <w:sz w:val="24"/>
-          <w:szCs w:val="24"/>
-        </w:rPr>
-        <w:t>Colab</w:t>
-      </w:r>
-      <w:proofErr w:type="spellEnd"/>
-      <w:r>
-        <w:rPr>
-          <w:rFonts w:ascii="Times New Roman" w:hAnsi="Times New Roman" w:cs="Times New Roman"/>
-          <w:sz w:val="24"/>
-          <w:szCs w:val="24"/>
-        </w:rPr>
-        <w:t xml:space="preserve"> notebook (if applicable): [link]</w:t>
+        <w:t>Google Colab notebook (if applicable): [link]</w:t>
       </w:r>
     </w:p>
     <w:p>
@@ -6156,7 +6194,7 @@
 <w:ftr xmlns:wpc="http://schemas.microsoft.com/office/word/2010/wordprocessingCanvas" xmlns:cx="http://schemas.microsoft.com/office/drawing/2014/chartex" xmlns:cx1="http://schemas.microsoft.com/office/drawing/2015/9/8/chartex" xmlns:cx2="http://schemas.microsoft.com/office/drawing/2015/10/21/chartex" xmlns:cx3="http://schemas.microsoft.com/office/drawing/2016/5/9/chartex" xmlns:cx4="http://schemas.microsoft.com/office/drawing/2016/5/10/chartex" xmlns:cx5="http://schemas.microsoft.com/office/drawing/2016/5/11/chartex" xmlns:cx6="http://schemas.microsoft.com/office/drawing/2016/5/12/chartex" xmlns:cx7="http://schemas.microsoft.com/office/drawing/2016/5/13/chartex" xmlns:cx8="http://schemas.microsoft.com/office/drawing/2016/5/14/chartex" xmlns:mc="http://schemas.openxmlformats.org/markup-compatibility/2006" xmlns:aink="http://schemas.microsoft.com/office/drawing/2016/ink" xmlns:am3d="http://schemas.microsoft.com/office/drawing/2017/model3d" xmlns:o="urn:schemas-microsoft-com:office:office" xmlns:oel="http://schemas.microsoft.com/office/2019/extlst" xmlns:r="http://schemas.openxmlformats.org/officeDocument/2006/relationships" xmlns:m="http://schemas.openxmlformats.org/officeDocument/2006/math" xmlns:v="urn:schemas-microsoft-com:vml" xmlns:wp14="http://schemas.microsoft.com/office/word/2010/wordprocessingDrawing" xmlns:wp="http://schemas.openxmlformats.org/drawingml/2006/wordprocessingDrawing" xmlns:w10="urn:schemas-microsoft-com:office:word" xmlns:w="http://schemas.openxmlformats.org/wordprocessingml/2006/main" xmlns:w14="http://schemas.microsoft.com/office/word/2010/wordml" xmlns:w15="http://schemas.microsoft.com/office/word/2012/wordml" xmlns:w16cex="http://schemas.microsoft.com/office/word/2018/wordml/cex" xmlns:w16cid="http://schemas.microsoft.com/office/word/2016/wordml/cid" xmlns:w16="http://schemas.microsoft.com/office/word/2018/wordml" xmlns:w16du="http://schemas.microsoft.com/office/word/2023/wordml/word16du" xmlns:w16sdtdh="http://schemas.microsoft.com/office/word/2020/wordml/sdtdatahash" xmlns:w16sdtfl="http://schemas.microsoft.com/office/word/2024/wordml/sdtformatlock" xmlns:w16se="http://schemas.microsoft.com/office/word/2015/wordml/symex" xmlns:wpg="http://schemas.microsoft.com/office/word/2010/wordprocessingGroup" xmlns:wpi="http://schemas.microsoft.com/office/word/2010/wordprocessingInk" xmlns:wne="http://schemas.microsoft.com/office/word/2006/wordml" xmlns:wps="http://schemas.microsoft.com/office/word/2010/wordprocessingShape" mc:Ignorable="w14 w15 w16se w16cid w16 w16cex w16sdtdh w16sdtfl w16du wp14">
   <w:p>
     <w:pPr>
-      <w:pStyle w:val="Footer"/>
+      <w:pStyle w:val="a5"/>
     </w:pPr>
     <w:r>
       <w:rPr>
@@ -6313,7 +6351,7 @@
 <w:ftr xmlns:wpc="http://schemas.microsoft.com/office/word/2010/wordprocessingCanvas" xmlns:cx="http://schemas.microsoft.com/office/drawing/2014/chartex" xmlns:cx1="http://schemas.microsoft.com/office/drawing/2015/9/8/chartex" xmlns:cx2="http://schemas.microsoft.com/office/drawing/2015/10/21/chartex" xmlns:cx3="http://schemas.microsoft.com/office/drawing/2016/5/9/chartex" xmlns:cx4="http://schemas.microsoft.com/office/drawing/2016/5/10/chartex" xmlns:cx5="http://schemas.microsoft.com/office/drawing/2016/5/11/chartex" xmlns:cx6="http://schemas.microsoft.com/office/drawing/2016/5/12/chartex" xmlns:cx7="http://schemas.microsoft.com/office/drawing/2016/5/13/chartex" xmlns:cx8="http://schemas.microsoft.com/office/drawing/2016/5/14/chartex" xmlns:mc="http://schemas.openxmlformats.org/markup-compatibility/2006" xmlns:aink="http://schemas.microsoft.com/office/drawing/2016/ink" xmlns:am3d="http://schemas.microsoft.com/office/drawing/2017/model3d" xmlns:o="urn:schemas-microsoft-com:office:office" xmlns:oel="http://schemas.microsoft.com/office/2019/extlst" xmlns:r="http://schemas.openxmlformats.org/officeDocument/2006/relationships" xmlns:m="http://schemas.openxmlformats.org/officeDocument/2006/math" xmlns:v="urn:schemas-microsoft-com:vml" xmlns:wp14="http://schemas.microsoft.com/office/word/2010/wordprocessingDrawing" xmlns:wp="http://schemas.openxmlformats.org/drawingml/2006/wordprocessingDrawing" xmlns:w10="urn:schemas-microsoft-com:office:word" xmlns:w="http://schemas.openxmlformats.org/wordprocessingml/2006/main" xmlns:w14="http://schemas.microsoft.com/office/word/2010/wordml" xmlns:w15="http://schemas.microsoft.com/office/word/2012/wordml" xmlns:w16cex="http://schemas.microsoft.com/office/word/2018/wordml/cex" xmlns:w16cid="http://schemas.microsoft.com/office/word/2016/wordml/cid" xmlns:w16="http://schemas.microsoft.com/office/word/2018/wordml" xmlns:w16du="http://schemas.microsoft.com/office/word/2023/wordml/word16du" xmlns:w16sdtdh="http://schemas.microsoft.com/office/word/2020/wordml/sdtdatahash" xmlns:w16sdtfl="http://schemas.microsoft.com/office/word/2024/wordml/sdtformatlock" xmlns:w16se="http://schemas.microsoft.com/office/word/2015/wordml/symex" xmlns:wpg="http://schemas.microsoft.com/office/word/2010/wordprocessingGroup" xmlns:wpi="http://schemas.microsoft.com/office/word/2010/wordprocessingInk" xmlns:wne="http://schemas.microsoft.com/office/word/2006/wordml" xmlns:wps="http://schemas.microsoft.com/office/word/2010/wordprocessingShape" mc:Ignorable="w14 w15 w16se w16cid w16 w16cex w16sdtdh w16sdtfl w16du wp14">
   <w:p>
     <w:pPr>
-      <w:pStyle w:val="Footer"/>
+      <w:pStyle w:val="a5"/>
     </w:pPr>
     <w:r>
       <w:rPr>
@@ -6470,7 +6508,7 @@
 <w:ftr xmlns:wpc="http://schemas.microsoft.com/office/word/2010/wordprocessingCanvas" xmlns:cx="http://schemas.microsoft.com/office/drawing/2014/chartex" xmlns:cx1="http://schemas.microsoft.com/office/drawing/2015/9/8/chartex" xmlns:cx2="http://schemas.microsoft.com/office/drawing/2015/10/21/chartex" xmlns:cx3="http://schemas.microsoft.com/office/drawing/2016/5/9/chartex" xmlns:cx4="http://schemas.microsoft.com/office/drawing/2016/5/10/chartex" xmlns:cx5="http://schemas.microsoft.com/office/drawing/2016/5/11/chartex" xmlns:cx6="http://schemas.microsoft.com/office/drawing/2016/5/12/chartex" xmlns:cx7="http://schemas.microsoft.com/office/drawing/2016/5/13/chartex" xmlns:cx8="http://schemas.microsoft.com/office/drawing/2016/5/14/chartex" xmlns:mc="http://schemas.openxmlformats.org/markup-compatibility/2006" xmlns:aink="http://schemas.microsoft.com/office/drawing/2016/ink" xmlns:am3d="http://schemas.microsoft.com/office/drawing/2017/model3d" xmlns:o="urn:schemas-microsoft-com:office:office" xmlns:oel="http://schemas.microsoft.com/office/2019/extlst" xmlns:r="http://schemas.openxmlformats.org/officeDocument/2006/relationships" xmlns:m="http://schemas.openxmlformats.org/officeDocument/2006/math" xmlns:v="urn:schemas-microsoft-com:vml" xmlns:wp14="http://schemas.microsoft.com/office/word/2010/wordprocessingDrawing" xmlns:wp="http://schemas.openxmlformats.org/drawingml/2006/wordprocessingDrawing" xmlns:w10="urn:schemas-microsoft-com:office:word" xmlns:w="http://schemas.openxmlformats.org/wordprocessingml/2006/main" xmlns:w14="http://schemas.microsoft.com/office/word/2010/wordml" xmlns:w15="http://schemas.microsoft.com/office/word/2012/wordml" xmlns:w16cex="http://schemas.microsoft.com/office/word/2018/wordml/cex" xmlns:w16cid="http://schemas.microsoft.com/office/word/2016/wordml/cid" xmlns:w16="http://schemas.microsoft.com/office/word/2018/wordml" xmlns:w16du="http://schemas.microsoft.com/office/word/2023/wordml/word16du" xmlns:w16sdtdh="http://schemas.microsoft.com/office/word/2020/wordml/sdtdatahash" xmlns:w16sdtfl="http://schemas.microsoft.com/office/word/2024/wordml/sdtformatlock" xmlns:w16se="http://schemas.microsoft.com/office/word/2015/wordml/symex" xmlns:wpg="http://schemas.microsoft.com/office/word/2010/wordprocessingGroup" xmlns:wpi="http://schemas.microsoft.com/office/word/2010/wordprocessingInk" xmlns:wne="http://schemas.microsoft.com/office/word/2006/wordml" xmlns:wps="http://schemas.microsoft.com/office/word/2010/wordprocessingShape" mc:Ignorable="w14 w15 w16se w16cid w16 w16cex w16sdtdh w16sdtfl w16du wp14">
   <w:p>
     <w:pPr>
-      <w:pStyle w:val="Footer"/>
+      <w:pStyle w:val="a5"/>
     </w:pPr>
     <w:r>
       <w:rPr>
@@ -6717,7 +6755,7 @@
         </w:tcPr>
         <w:p>
           <w:pPr>
-            <w:pStyle w:val="Header"/>
+            <w:pStyle w:val="a7"/>
           </w:pPr>
         </w:p>
       </w:tc>
@@ -6727,7 +6765,7 @@
         </w:tcPr>
         <w:p>
           <w:pPr>
-            <w:pStyle w:val="Header"/>
+            <w:pStyle w:val="a7"/>
           </w:pPr>
         </w:p>
       </w:tc>
@@ -6738,7 +6776,7 @@
         </w:tcPr>
         <w:p>
           <w:pPr>
-            <w:pStyle w:val="Header"/>
+            <w:pStyle w:val="a7"/>
           </w:pPr>
         </w:p>
       </w:tc>
@@ -6746,7 +6784,7 @@
   </w:tbl>
   <w:p>
     <w:pPr>
-      <w:pStyle w:val="Header"/>
+      <w:pStyle w:val="a7"/>
     </w:pPr>
   </w:p>
 </w:hdr>
@@ -7032,9 +7070,26 @@
           </w:r>
           <w:r>
             <w:rPr>
+              <w:rFonts w:hint="cs"/>
+              <w:noProof/>
+              <w:rtl/>
+            </w:rPr>
+            <w:instrText xml:space="preserve">خطأ! استخدم علامة التبويب "الصفحة الرئيسية" لتطبيق </w:instrText>
+          </w:r>
+          <w:r>
+            <w:rPr>
+              <w:rFonts w:hint="cs"/>
               <w:noProof/>
             </w:rPr>
-            <w:instrText>Task 2 – Database Implementation (6 Marks)</w:instrText>
+            <w:instrText>Heading 1</w:instrText>
+          </w:r>
+          <w:r>
+            <w:rPr>
+              <w:rFonts w:hint="cs"/>
+              <w:noProof/>
+              <w:rtl/>
+            </w:rPr>
+            <w:instrText xml:space="preserve"> على النص الذي ترغب في أن يظهر هنا.</w:instrText>
           </w:r>
           <w:r>
             <w:rPr>
@@ -7065,9 +7120,26 @@
           </w:r>
           <w:r>
             <w:rPr>
+              <w:rFonts w:hint="cs"/>
+              <w:noProof/>
+              <w:rtl/>
+            </w:rPr>
+            <w:instrText xml:space="preserve">خطأ! استخدم علامة التبويب "الصفحة الرئيسية" لتطبيق </w:instrText>
+          </w:r>
+          <w:r>
+            <w:rPr>
+              <w:rFonts w:hint="cs"/>
               <w:noProof/>
             </w:rPr>
-            <w:instrText>Task 2 – Database Implementation (6 Marks)</w:instrText>
+            <w:instrText>Heading 1</w:instrText>
+          </w:r>
+          <w:r>
+            <w:rPr>
+              <w:rFonts w:hint="cs"/>
+              <w:noProof/>
+              <w:rtl/>
+            </w:rPr>
+            <w:instrText xml:space="preserve"> على النص الذي ترغب في أن يظهر هنا.</w:instrText>
           </w:r>
           <w:r>
             <w:rPr>
@@ -7083,9 +7155,32 @@
           </w:r>
           <w:r>
             <w:rPr>
+              <w:rFonts w:hint="cs"/>
+              <w:noProof/>
+              <w:rtl/>
+            </w:rPr>
+            <w:t xml:space="preserve">خطأ! استخدم علامة التبويب "الصفحة الرئيسية" لتطبيق </w:t>
+          </w:r>
+          <w:r>
+            <w:rPr>
+              <w:rFonts w:hint="cs"/>
               <w:noProof/>
             </w:rPr>
-            <w:t xml:space="preserve">Task 2 – Database Implementation (6 Marks) </w:t>
+            <w:t>Heading 1</w:t>
+          </w:r>
+          <w:r>
+            <w:rPr>
+              <w:rFonts w:hint="cs"/>
+              <w:noProof/>
+              <w:rtl/>
+            </w:rPr>
+            <w:t xml:space="preserve"> على النص الذي ترغب في أن يظهر هنا.</w:t>
+          </w:r>
+          <w:r>
+            <w:rPr>
+              <w:noProof/>
+            </w:rPr>
+            <w:t xml:space="preserve"> </w:t>
           </w:r>
           <w:r>
             <w:fldChar w:fldCharType="end"/>
@@ -7151,7 +7246,7 @@
     <w:lvl w:ilvl="0">
       <w:start w:val="1"/>
       <w:numFmt w:val="bullet"/>
-      <w:pStyle w:val="ListBullet"/>
+      <w:pStyle w:val="a"/>
       <w:lvlText w:val="•"/>
       <w:lvlJc w:val="left"/>
       <w:pPr>
@@ -8216,7 +8311,7 @@
     <w:lvl w:ilvl="0">
       <w:start w:val="1"/>
       <w:numFmt w:val="decimal"/>
-      <w:pStyle w:val="ListNumber"/>
+      <w:pStyle w:val="a0"/>
       <w:lvlText w:val="%1."/>
       <w:lvlJc w:val="left"/>
       <w:pPr>
@@ -8230,7 +8325,7 @@
     <w:lvl w:ilvl="1">
       <w:start w:val="1"/>
       <w:numFmt w:val="decimal"/>
-      <w:pStyle w:val="ListNumber2"/>
+      <w:pStyle w:val="2"/>
       <w:suff w:val="space"/>
       <w:lvlText w:val="%1.%2"/>
       <w:lvlJc w:val="left"/>
@@ -8245,7 +8340,7 @@
     <w:lvl w:ilvl="2">
       <w:start w:val="1"/>
       <w:numFmt w:val="lowerLetter"/>
-      <w:pStyle w:val="ListNumber3"/>
+      <w:pStyle w:val="3"/>
       <w:lvlText w:val="%3."/>
       <w:lvlJc w:val="left"/>
       <w:pPr>
@@ -8259,7 +8354,7 @@
     <w:lvl w:ilvl="3">
       <w:start w:val="1"/>
       <w:numFmt w:val="lowerRoman"/>
-      <w:pStyle w:val="ListNumber4"/>
+      <w:pStyle w:val="4"/>
       <w:lvlText w:val="%4."/>
       <w:lvlJc w:val="left"/>
       <w:pPr>
@@ -8273,7 +8368,7 @@
     <w:lvl w:ilvl="4">
       <w:start w:val="1"/>
       <w:numFmt w:val="lowerLetter"/>
-      <w:pStyle w:val="ListNumber5"/>
+      <w:pStyle w:val="5"/>
       <w:lvlText w:val="(%5)"/>
       <w:lvlJc w:val="left"/>
       <w:pPr>
@@ -8446,6 +8541,304 @@
     </w:lvl>
   </w:abstractNum>
   <w:abstractNum w:abstractNumId="13" w15:restartNumberingAfterBreak="0">
+    <w:nsid w:val="3D423FD0"/>
+    <w:multiLevelType w:val="multilevel"/>
+    <w:tmpl w:val="A0461074"/>
+    <w:lvl w:ilvl="0">
+      <w:start w:val="1"/>
+      <w:numFmt w:val="bullet"/>
+      <w:lvlText w:val=""/>
+      <w:lvlJc w:val="left"/>
+      <w:pPr>
+        <w:tabs>
+          <w:tab w:val="num" w:pos="720"/>
+        </w:tabs>
+        <w:ind w:left="720" w:hanging="360"/>
+      </w:pPr>
+      <w:rPr>
+        <w:rFonts w:ascii="Symbol" w:hAnsi="Symbol" w:hint="default"/>
+        <w:sz w:val="20"/>
+      </w:rPr>
+    </w:lvl>
+    <w:lvl w:ilvl="1" w:tentative="1">
+      <w:start w:val="1"/>
+      <w:numFmt w:val="bullet"/>
+      <w:lvlText w:val="o"/>
+      <w:lvlJc w:val="left"/>
+      <w:pPr>
+        <w:tabs>
+          <w:tab w:val="num" w:pos="1440"/>
+        </w:tabs>
+        <w:ind w:left="1440" w:hanging="360"/>
+      </w:pPr>
+      <w:rPr>
+        <w:rFonts w:ascii="Courier New" w:hAnsi="Courier New" w:hint="default"/>
+        <w:sz w:val="20"/>
+      </w:rPr>
+    </w:lvl>
+    <w:lvl w:ilvl="2" w:tentative="1">
+      <w:start w:val="1"/>
+      <w:numFmt w:val="bullet"/>
+      <w:lvlText w:val=""/>
+      <w:lvlJc w:val="left"/>
+      <w:pPr>
+        <w:tabs>
+          <w:tab w:val="num" w:pos="2160"/>
+        </w:tabs>
+        <w:ind w:left="2160" w:hanging="360"/>
+      </w:pPr>
+      <w:rPr>
+        <w:rFonts w:ascii="Wingdings" w:hAnsi="Wingdings" w:hint="default"/>
+        <w:sz w:val="20"/>
+      </w:rPr>
+    </w:lvl>
+    <w:lvl w:ilvl="3" w:tentative="1">
+      <w:start w:val="1"/>
+      <w:numFmt w:val="bullet"/>
+      <w:lvlText w:val=""/>
+      <w:lvlJc w:val="left"/>
+      <w:pPr>
+        <w:tabs>
+          <w:tab w:val="num" w:pos="2880"/>
+        </w:tabs>
+        <w:ind w:left="2880" w:hanging="360"/>
+      </w:pPr>
+      <w:rPr>
+        <w:rFonts w:ascii="Wingdings" w:hAnsi="Wingdings" w:hint="default"/>
+        <w:sz w:val="20"/>
+      </w:rPr>
+    </w:lvl>
+    <w:lvl w:ilvl="4" w:tentative="1">
+      <w:start w:val="1"/>
+      <w:numFmt w:val="bullet"/>
+      <w:lvlText w:val=""/>
+      <w:lvlJc w:val="left"/>
+      <w:pPr>
+        <w:tabs>
+          <w:tab w:val="num" w:pos="3600"/>
+        </w:tabs>
+        <w:ind w:left="3600" w:hanging="360"/>
+      </w:pPr>
+      <w:rPr>
+        <w:rFonts w:ascii="Wingdings" w:hAnsi="Wingdings" w:hint="default"/>
+        <w:sz w:val="20"/>
+      </w:rPr>
+    </w:lvl>
+    <w:lvl w:ilvl="5" w:tentative="1">
+      <w:start w:val="1"/>
+      <w:numFmt w:val="bullet"/>
+      <w:lvlText w:val=""/>
+      <w:lvlJc w:val="left"/>
+      <w:pPr>
+        <w:tabs>
+          <w:tab w:val="num" w:pos="4320"/>
+        </w:tabs>
+        <w:ind w:left="4320" w:hanging="360"/>
+      </w:pPr>
+      <w:rPr>
+        <w:rFonts w:ascii="Wingdings" w:hAnsi="Wingdings" w:hint="default"/>
+        <w:sz w:val="20"/>
+      </w:rPr>
+    </w:lvl>
+    <w:lvl w:ilvl="6" w:tentative="1">
+      <w:start w:val="1"/>
+      <w:numFmt w:val="bullet"/>
+      <w:lvlText w:val=""/>
+      <w:lvlJc w:val="left"/>
+      <w:pPr>
+        <w:tabs>
+          <w:tab w:val="num" w:pos="5040"/>
+        </w:tabs>
+        <w:ind w:left="5040" w:hanging="360"/>
+      </w:pPr>
+      <w:rPr>
+        <w:rFonts w:ascii="Wingdings" w:hAnsi="Wingdings" w:hint="default"/>
+        <w:sz w:val="20"/>
+      </w:rPr>
+    </w:lvl>
+    <w:lvl w:ilvl="7" w:tentative="1">
+      <w:start w:val="1"/>
+      <w:numFmt w:val="bullet"/>
+      <w:lvlText w:val=""/>
+      <w:lvlJc w:val="left"/>
+      <w:pPr>
+        <w:tabs>
+          <w:tab w:val="num" w:pos="5760"/>
+        </w:tabs>
+        <w:ind w:left="5760" w:hanging="360"/>
+      </w:pPr>
+      <w:rPr>
+        <w:rFonts w:ascii="Wingdings" w:hAnsi="Wingdings" w:hint="default"/>
+        <w:sz w:val="20"/>
+      </w:rPr>
+    </w:lvl>
+    <w:lvl w:ilvl="8" w:tentative="1">
+      <w:start w:val="1"/>
+      <w:numFmt w:val="bullet"/>
+      <w:lvlText w:val=""/>
+      <w:lvlJc w:val="left"/>
+      <w:pPr>
+        <w:tabs>
+          <w:tab w:val="num" w:pos="6480"/>
+        </w:tabs>
+        <w:ind w:left="6480" w:hanging="360"/>
+      </w:pPr>
+      <w:rPr>
+        <w:rFonts w:ascii="Wingdings" w:hAnsi="Wingdings" w:hint="default"/>
+        <w:sz w:val="20"/>
+      </w:rPr>
+    </w:lvl>
+  </w:abstractNum>
+  <w:abstractNum w:abstractNumId="14" w15:restartNumberingAfterBreak="0">
+    <w:nsid w:val="3FDD4EA2"/>
+    <w:multiLevelType w:val="multilevel"/>
+    <w:tmpl w:val="D1AC6F7E"/>
+    <w:lvl w:ilvl="0">
+      <w:start w:val="1"/>
+      <w:numFmt w:val="bullet"/>
+      <w:lvlText w:val=""/>
+      <w:lvlJc w:val="left"/>
+      <w:pPr>
+        <w:tabs>
+          <w:tab w:val="num" w:pos="720"/>
+        </w:tabs>
+        <w:ind w:left="720" w:hanging="360"/>
+      </w:pPr>
+      <w:rPr>
+        <w:rFonts w:ascii="Symbol" w:hAnsi="Symbol" w:hint="default"/>
+        <w:sz w:val="20"/>
+      </w:rPr>
+    </w:lvl>
+    <w:lvl w:ilvl="1" w:tentative="1">
+      <w:start w:val="1"/>
+      <w:numFmt w:val="bullet"/>
+      <w:lvlText w:val="o"/>
+      <w:lvlJc w:val="left"/>
+      <w:pPr>
+        <w:tabs>
+          <w:tab w:val="num" w:pos="1440"/>
+        </w:tabs>
+        <w:ind w:left="1440" w:hanging="360"/>
+      </w:pPr>
+      <w:rPr>
+        <w:rFonts w:ascii="Courier New" w:hAnsi="Courier New" w:hint="default"/>
+        <w:sz w:val="20"/>
+      </w:rPr>
+    </w:lvl>
+    <w:lvl w:ilvl="2" w:tentative="1">
+      <w:start w:val="1"/>
+      <w:numFmt w:val="bullet"/>
+      <w:lvlText w:val=""/>
+      <w:lvlJc w:val="left"/>
+      <w:pPr>
+        <w:tabs>
+          <w:tab w:val="num" w:pos="2160"/>
+        </w:tabs>
+        <w:ind w:left="2160" w:hanging="360"/>
+      </w:pPr>
+      <w:rPr>
+        <w:rFonts w:ascii="Wingdings" w:hAnsi="Wingdings" w:hint="default"/>
+        <w:sz w:val="20"/>
+      </w:rPr>
+    </w:lvl>
+    <w:lvl w:ilvl="3" w:tentative="1">
+      <w:start w:val="1"/>
+      <w:numFmt w:val="bullet"/>
+      <w:lvlText w:val=""/>
+      <w:lvlJc w:val="left"/>
+      <w:pPr>
+        <w:tabs>
+          <w:tab w:val="num" w:pos="2880"/>
+        </w:tabs>
+        <w:ind w:left="2880" w:hanging="360"/>
+      </w:pPr>
+      <w:rPr>
+        <w:rFonts w:ascii="Wingdings" w:hAnsi="Wingdings" w:hint="default"/>
+        <w:sz w:val="20"/>
+      </w:rPr>
+    </w:lvl>
+    <w:lvl w:ilvl="4" w:tentative="1">
+      <w:start w:val="1"/>
+      <w:numFmt w:val="bullet"/>
+      <w:lvlText w:val=""/>
+      <w:lvlJc w:val="left"/>
+      <w:pPr>
+        <w:tabs>
+          <w:tab w:val="num" w:pos="3600"/>
+        </w:tabs>
+        <w:ind w:left="3600" w:hanging="360"/>
+      </w:pPr>
+      <w:rPr>
+        <w:rFonts w:ascii="Wingdings" w:hAnsi="Wingdings" w:hint="default"/>
+        <w:sz w:val="20"/>
+      </w:rPr>
+    </w:lvl>
+    <w:lvl w:ilvl="5" w:tentative="1">
+      <w:start w:val="1"/>
+      <w:numFmt w:val="bullet"/>
+      <w:lvlText w:val=""/>
+      <w:lvlJc w:val="left"/>
+      <w:pPr>
+        <w:tabs>
+          <w:tab w:val="num" w:pos="4320"/>
+        </w:tabs>
+        <w:ind w:left="4320" w:hanging="360"/>
+      </w:pPr>
+      <w:rPr>
+        <w:rFonts w:ascii="Wingdings" w:hAnsi="Wingdings" w:hint="default"/>
+        <w:sz w:val="20"/>
+      </w:rPr>
+    </w:lvl>
+    <w:lvl w:ilvl="6" w:tentative="1">
+      <w:start w:val="1"/>
+      <w:numFmt w:val="bullet"/>
+      <w:lvlText w:val=""/>
+      <w:lvlJc w:val="left"/>
+      <w:pPr>
+        <w:tabs>
+          <w:tab w:val="num" w:pos="5040"/>
+        </w:tabs>
+        <w:ind w:left="5040" w:hanging="360"/>
+      </w:pPr>
+      <w:rPr>
+        <w:rFonts w:ascii="Wingdings" w:hAnsi="Wingdings" w:hint="default"/>
+        <w:sz w:val="20"/>
+      </w:rPr>
+    </w:lvl>
+    <w:lvl w:ilvl="7" w:tentative="1">
+      <w:start w:val="1"/>
+      <w:numFmt w:val="bullet"/>
+      <w:lvlText w:val=""/>
+      <w:lvlJc w:val="left"/>
+      <w:pPr>
+        <w:tabs>
+          <w:tab w:val="num" w:pos="5760"/>
+        </w:tabs>
+        <w:ind w:left="5760" w:hanging="360"/>
+      </w:pPr>
+      <w:rPr>
+        <w:rFonts w:ascii="Wingdings" w:hAnsi="Wingdings" w:hint="default"/>
+        <w:sz w:val="20"/>
+      </w:rPr>
+    </w:lvl>
+    <w:lvl w:ilvl="8" w:tentative="1">
+      <w:start w:val="1"/>
+      <w:numFmt w:val="bullet"/>
+      <w:lvlText w:val=""/>
+      <w:lvlJc w:val="left"/>
+      <w:pPr>
+        <w:tabs>
+          <w:tab w:val="num" w:pos="6480"/>
+        </w:tabs>
+        <w:ind w:left="6480" w:hanging="360"/>
+      </w:pPr>
+      <w:rPr>
+        <w:rFonts w:ascii="Wingdings" w:hAnsi="Wingdings" w:hint="default"/>
+        <w:sz w:val="20"/>
+      </w:rPr>
+    </w:lvl>
+  </w:abstractNum>
+  <w:abstractNum w:abstractNumId="15" w15:restartNumberingAfterBreak="0">
     <w:nsid w:val="44EE13B5"/>
     <w:multiLevelType w:val="hybridMultilevel"/>
     <w:tmpl w:val="038E9900"/>
@@ -8561,7 +8954,7 @@
       </w:rPr>
     </w:lvl>
   </w:abstractNum>
-  <w:abstractNum w:abstractNumId="14" w15:restartNumberingAfterBreak="0">
+  <w:abstractNum w:abstractNumId="16" w15:restartNumberingAfterBreak="0">
     <w:nsid w:val="55DA4CC9"/>
     <w:multiLevelType w:val="hybridMultilevel"/>
     <w:tmpl w:val="068EDCB2"/>
@@ -8674,7 +9067,7 @@
       </w:rPr>
     </w:lvl>
   </w:abstractNum>
-  <w:abstractNum w:abstractNumId="15" w15:restartNumberingAfterBreak="0">
+  <w:abstractNum w:abstractNumId="17" w15:restartNumberingAfterBreak="0">
     <w:nsid w:val="55F84D01"/>
     <w:multiLevelType w:val="multilevel"/>
     <w:tmpl w:val="A9E06390"/>
@@ -8787,7 +9180,7 @@
       </w:pPr>
     </w:lvl>
   </w:abstractNum>
-  <w:abstractNum w:abstractNumId="16" w15:restartNumberingAfterBreak="0">
+  <w:abstractNum w:abstractNumId="18" w15:restartNumberingAfterBreak="0">
     <w:nsid w:val="57397E8F"/>
     <w:multiLevelType w:val="multilevel"/>
     <w:tmpl w:val="93162086"/>
@@ -8900,7 +9293,7 @@
       </w:pPr>
     </w:lvl>
   </w:abstractNum>
-  <w:abstractNum w:abstractNumId="17" w15:restartNumberingAfterBreak="0">
+  <w:abstractNum w:abstractNumId="19" w15:restartNumberingAfterBreak="0">
     <w:nsid w:val="5FFB796A"/>
     <w:multiLevelType w:val="multilevel"/>
     <w:tmpl w:val="6388B4E8"/>
@@ -9013,10 +9406,10 @@
       </w:pPr>
     </w:lvl>
   </w:abstractNum>
-  <w:abstractNum w:abstractNumId="18" w15:restartNumberingAfterBreak="0">
+  <w:abstractNum w:abstractNumId="20" w15:restartNumberingAfterBreak="0">
     <w:nsid w:val="64B955EC"/>
     <w:multiLevelType w:val="hybridMultilevel"/>
-    <w:tmpl w:val="05E8FB5A"/>
+    <w:tmpl w:val="950A10D8"/>
     <w:lvl w:ilvl="0" w:tplc="04090009">
       <w:start w:val="1"/>
       <w:numFmt w:val="bullet"/>
@@ -9126,7 +9519,7 @@
       </w:rPr>
     </w:lvl>
   </w:abstractNum>
-  <w:abstractNum w:abstractNumId="19" w15:restartNumberingAfterBreak="0">
+  <w:abstractNum w:abstractNumId="21" w15:restartNumberingAfterBreak="0">
     <w:nsid w:val="667677D6"/>
     <w:multiLevelType w:val="hybridMultilevel"/>
     <w:tmpl w:val="D01692D8"/>
@@ -9215,7 +9608,7 @@
       </w:pPr>
     </w:lvl>
   </w:abstractNum>
-  <w:abstractNum w:abstractNumId="20" w15:restartNumberingAfterBreak="0">
+  <w:abstractNum w:abstractNumId="22" w15:restartNumberingAfterBreak="0">
     <w:nsid w:val="688927E2"/>
     <w:multiLevelType w:val="hybridMultilevel"/>
     <w:tmpl w:val="64F8DB74"/>
@@ -9305,7 +9698,7 @@
       </w:pPr>
     </w:lvl>
   </w:abstractNum>
-  <w:abstractNum w:abstractNumId="21" w15:restartNumberingAfterBreak="0">
+  <w:abstractNum w:abstractNumId="23" w15:restartNumberingAfterBreak="0">
     <w:nsid w:val="6FD51D52"/>
     <w:multiLevelType w:val="hybridMultilevel"/>
     <w:tmpl w:val="36305470"/>
@@ -9391,7 +9784,7 @@
       </w:pPr>
     </w:lvl>
   </w:abstractNum>
-  <w:abstractNum w:abstractNumId="22" w15:restartNumberingAfterBreak="0">
+  <w:abstractNum w:abstractNumId="24" w15:restartNumberingAfterBreak="0">
     <w:nsid w:val="704E3E7F"/>
     <w:multiLevelType w:val="hybridMultilevel"/>
     <w:tmpl w:val="E34C7444"/>
@@ -9480,7 +9873,7 @@
       </w:pPr>
     </w:lvl>
   </w:abstractNum>
-  <w:abstractNum w:abstractNumId="23" w15:restartNumberingAfterBreak="0">
+  <w:abstractNum w:abstractNumId="25" w15:restartNumberingAfterBreak="0">
     <w:nsid w:val="72C71C39"/>
     <w:multiLevelType w:val="hybridMultilevel"/>
     <w:tmpl w:val="C960FD86"/>
@@ -9605,7 +9998,7 @@
       </w:rPr>
     </w:lvl>
   </w:abstractNum>
-  <w:abstractNum w:abstractNumId="24" w15:restartNumberingAfterBreak="0">
+  <w:abstractNum w:abstractNumId="26" w15:restartNumberingAfterBreak="0">
     <w:nsid w:val="7823322B"/>
     <w:multiLevelType w:val="hybridMultilevel"/>
     <w:tmpl w:val="A0D81BB6"/>
@@ -9743,19 +10136,19 @@
     </w:lvlOverride>
   </w:num>
   <w:num w:numId="6" w16cid:durableId="2115830839">
-    <w:abstractNumId w:val="13"/>
+    <w:abstractNumId w:val="15"/>
   </w:num>
   <w:num w:numId="7" w16cid:durableId="471407680">
     <w:abstractNumId w:val="6"/>
   </w:num>
   <w:num w:numId="8" w16cid:durableId="893388596">
-    <w:abstractNumId w:val="22"/>
+    <w:abstractNumId w:val="24"/>
   </w:num>
   <w:num w:numId="9" w16cid:durableId="1862353387">
     <w:abstractNumId w:val="1"/>
   </w:num>
   <w:num w:numId="10" w16cid:durableId="583271442">
-    <w:abstractNumId w:val="23"/>
+    <w:abstractNumId w:val="25"/>
     <w:lvlOverride w:ilvl="0">
       <w:startOverride w:val="1"/>
     </w:lvlOverride>
@@ -9771,7 +10164,7 @@
     <w:lvlOverride w:ilvl="8"/>
   </w:num>
   <w:num w:numId="11" w16cid:durableId="783697976">
-    <w:abstractNumId w:val="13"/>
+    <w:abstractNumId w:val="15"/>
     <w:lvlOverride w:ilvl="0"/>
     <w:lvlOverride w:ilvl="1">
       <w:startOverride w:val="1"/>
@@ -9785,19 +10178,19 @@
     <w:lvlOverride w:ilvl="8"/>
   </w:num>
   <w:num w:numId="12" w16cid:durableId="1306158738">
-    <w:abstractNumId w:val="20"/>
+    <w:abstractNumId w:val="22"/>
   </w:num>
   <w:num w:numId="13" w16cid:durableId="1700812942">
-    <w:abstractNumId w:val="19"/>
+    <w:abstractNumId w:val="21"/>
   </w:num>
   <w:num w:numId="14" w16cid:durableId="1608192642">
-    <w:abstractNumId w:val="24"/>
+    <w:abstractNumId w:val="26"/>
   </w:num>
   <w:num w:numId="15" w16cid:durableId="114762884">
     <w:abstractNumId w:val="7"/>
   </w:num>
   <w:num w:numId="16" w16cid:durableId="1418284132">
-    <w:abstractNumId w:val="21"/>
+    <w:abstractNumId w:val="23"/>
   </w:num>
   <w:num w:numId="17" w16cid:durableId="70466096">
     <w:abstractNumId w:val="3"/>
@@ -9809,16 +10202,16 @@
     <w:abstractNumId w:val="8"/>
   </w:num>
   <w:num w:numId="20" w16cid:durableId="1865823307">
-    <w:abstractNumId w:val="17"/>
+    <w:abstractNumId w:val="19"/>
   </w:num>
   <w:num w:numId="21" w16cid:durableId="2074043917">
-    <w:abstractNumId w:val="16"/>
+    <w:abstractNumId w:val="18"/>
   </w:num>
   <w:num w:numId="22" w16cid:durableId="1745374221">
     <w:abstractNumId w:val="12"/>
   </w:num>
   <w:num w:numId="23" w16cid:durableId="112403004">
-    <w:abstractNumId w:val="15"/>
+    <w:abstractNumId w:val="17"/>
   </w:num>
   <w:num w:numId="24" w16cid:durableId="207844976">
     <w:abstractNumId w:val="0"/>
@@ -9833,13 +10226,19 @@
     <w:abstractNumId w:val="2"/>
   </w:num>
   <w:num w:numId="28" w16cid:durableId="802769626">
-    <w:abstractNumId w:val="14"/>
+    <w:abstractNumId w:val="16"/>
   </w:num>
   <w:num w:numId="29" w16cid:durableId="1773864708">
     <w:abstractNumId w:val="10"/>
   </w:num>
   <w:num w:numId="30" w16cid:durableId="1190679152">
-    <w:abstractNumId w:val="18"/>
+    <w:abstractNumId w:val="20"/>
+  </w:num>
+  <w:num w:numId="31" w16cid:durableId="1496416065">
+    <w:abstractNumId w:val="14"/>
+  </w:num>
+  <w:num w:numId="32" w16cid:durableId="1261530086">
+    <w:abstractNumId w:val="13"/>
   </w:num>
 </w:numbering>
 </file>
@@ -10238,16 +10637,16 @@
     <w:lsdException w:name="Unresolved Mention" w:semiHidden="1" w:unhideWhenUsed="1"/>
     <w:lsdException w:name="Smart Link" w:semiHidden="1" w:unhideWhenUsed="1"/>
   </w:latentStyles>
-  <w:style w:type="paragraph" w:default="1" w:styleId="Normal">
+  <w:style w:type="paragraph" w:default="1" w:styleId="a1">
     <w:name w:val="Normal"/>
     <w:qFormat/>
     <w:rsid w:val="00407799"/>
   </w:style>
-  <w:style w:type="paragraph" w:styleId="Heading1">
+  <w:style w:type="paragraph" w:styleId="1">
     <w:name w:val="heading 1"/>
-    <w:basedOn w:val="Normal"/>
-    <w:next w:val="Normal"/>
-    <w:link w:val="Heading1Char"/>
+    <w:basedOn w:val="a1"/>
+    <w:next w:val="a1"/>
+    <w:link w:val="1Char"/>
     <w:uiPriority w:val="1"/>
     <w:qFormat/>
     <w:pPr>
@@ -10266,11 +10665,11 @@
       <w:sz w:val="40"/>
     </w:rPr>
   </w:style>
-  <w:style w:type="paragraph" w:styleId="Heading2">
+  <w:style w:type="paragraph" w:styleId="20">
     <w:name w:val="heading 2"/>
-    <w:basedOn w:val="Normal"/>
-    <w:next w:val="Normal"/>
-    <w:link w:val="Heading2Char"/>
+    <w:basedOn w:val="a1"/>
+    <w:next w:val="a1"/>
+    <w:link w:val="2Char"/>
     <w:uiPriority w:val="1"/>
     <w:unhideWhenUsed/>
     <w:qFormat/>
@@ -10288,13 +10687,13 @@
       <w:sz w:val="28"/>
     </w:rPr>
   </w:style>
-  <w:style w:type="character" w:default="1" w:styleId="DefaultParagraphFont">
+  <w:style w:type="character" w:default="1" w:styleId="a2">
     <w:name w:val="Default Paragraph Font"/>
     <w:uiPriority w:val="1"/>
     <w:semiHidden/>
     <w:unhideWhenUsed/>
   </w:style>
-  <w:style w:type="table" w:default="1" w:styleId="TableNormal">
+  <w:style w:type="table" w:default="1" w:styleId="a3">
     <w:name w:val="Normal Table"/>
     <w:uiPriority w:val="99"/>
     <w:semiHidden/>
@@ -10309,16 +10708,16 @@
       </w:tblCellMar>
     </w:tblPr>
   </w:style>
-  <w:style w:type="numbering" w:default="1" w:styleId="NoList">
+  <w:style w:type="numbering" w:default="1" w:styleId="a4">
     <w:name w:val="No List"/>
     <w:uiPriority w:val="99"/>
     <w:semiHidden/>
     <w:unhideWhenUsed/>
   </w:style>
-  <w:style w:type="paragraph" w:styleId="Footer">
+  <w:style w:type="paragraph" w:styleId="a5">
     <w:name w:val="footer"/>
-    <w:basedOn w:val="Normal"/>
-    <w:link w:val="FooterChar"/>
+    <w:basedOn w:val="a1"/>
+    <w:link w:val="Char"/>
     <w:uiPriority w:val="99"/>
     <w:unhideWhenUsed/>
     <w:qFormat/>
@@ -10330,20 +10729,20 @@
       <w:color w:val="EF4623" w:themeColor="accent1"/>
     </w:rPr>
   </w:style>
-  <w:style w:type="character" w:customStyle="1" w:styleId="FooterChar">
-    <w:name w:val="Footer Char"/>
-    <w:basedOn w:val="DefaultParagraphFont"/>
-    <w:link w:val="Footer"/>
+  <w:style w:type="character" w:customStyle="1" w:styleId="Char">
+    <w:name w:val="تذييل الصفحة Char"/>
+    <w:basedOn w:val="a2"/>
+    <w:link w:val="a5"/>
     <w:uiPriority w:val="99"/>
     <w:rPr>
       <w:color w:val="EF4623" w:themeColor="accent1"/>
     </w:rPr>
   </w:style>
-  <w:style w:type="paragraph" w:styleId="Subtitle">
+  <w:style w:type="paragraph" w:styleId="a6">
     <w:name w:val="Subtitle"/>
-    <w:basedOn w:val="Normal"/>
-    <w:next w:val="Normal"/>
-    <w:link w:val="SubtitleChar"/>
+    <w:basedOn w:val="a1"/>
+    <w:next w:val="a1"/>
+    <w:link w:val="Char0"/>
     <w:uiPriority w:val="3"/>
     <w:unhideWhenUsed/>
     <w:qFormat/>
@@ -10366,36 +10765,36 @@
   </w:style>
   <w:style w:type="paragraph" w:customStyle="1" w:styleId="Graphic">
     <w:name w:val="Graphic"/>
-    <w:basedOn w:val="Normal"/>
+    <w:basedOn w:val="a1"/>
     <w:uiPriority w:val="99"/>
     <w:pPr>
       <w:spacing w:after="80" w:line="240" w:lineRule="auto"/>
       <w:jc w:val="center"/>
     </w:pPr>
   </w:style>
-  <w:style w:type="paragraph" w:styleId="Header">
+  <w:style w:type="paragraph" w:styleId="a7">
     <w:name w:val="header"/>
-    <w:basedOn w:val="Normal"/>
-    <w:link w:val="HeaderChar"/>
+    <w:basedOn w:val="a1"/>
+    <w:link w:val="Char1"/>
     <w:uiPriority w:val="99"/>
     <w:qFormat/>
     <w:pPr>
       <w:spacing w:after="380" w:line="240" w:lineRule="auto"/>
     </w:pPr>
   </w:style>
-  <w:style w:type="character" w:customStyle="1" w:styleId="HeaderChar">
-    <w:name w:val="Header Char"/>
-    <w:basedOn w:val="DefaultParagraphFont"/>
-    <w:link w:val="Header"/>
+  <w:style w:type="character" w:customStyle="1" w:styleId="Char1">
+    <w:name w:val="رأس الصفحة Char"/>
+    <w:basedOn w:val="a2"/>
+    <w:link w:val="a7"/>
     <w:uiPriority w:val="99"/>
     <w:rPr>
       <w:color w:val="404040" w:themeColor="text1" w:themeTint="BF"/>
       <w:sz w:val="20"/>
     </w:rPr>
   </w:style>
-  <w:style w:type="table" w:styleId="TableGrid">
+  <w:style w:type="table" w:styleId="a8">
     <w:name w:val="Table Grid"/>
-    <w:basedOn w:val="TableNormal"/>
+    <w:basedOn w:val="a3"/>
     <w:uiPriority w:val="39"/>
     <w:pPr>
       <w:spacing w:before="120" w:after="120" w:line="240" w:lineRule="auto"/>
@@ -10452,7 +10851,7 @@
   </w:style>
   <w:style w:type="paragraph" w:customStyle="1" w:styleId="InfoHeading">
     <w:name w:val="Info Heading"/>
-    <w:basedOn w:val="Normal"/>
+    <w:basedOn w:val="a1"/>
     <w:uiPriority w:val="2"/>
     <w:qFormat/>
     <w:pPr>
@@ -10469,8 +10868,8 @@
   </w:style>
   <w:style w:type="paragraph" w:customStyle="1" w:styleId="Page">
     <w:name w:val="Page"/>
-    <w:basedOn w:val="Normal"/>
-    <w:next w:val="Normal"/>
+    <w:basedOn w:val="a1"/>
+    <w:next w:val="a1"/>
     <w:uiPriority w:val="99"/>
     <w:unhideWhenUsed/>
     <w:qFormat/>
@@ -10483,11 +10882,11 @@
       <w:sz w:val="36"/>
     </w:rPr>
   </w:style>
-  <w:style w:type="paragraph" w:styleId="Title">
+  <w:style w:type="paragraph" w:styleId="a9">
     <w:name w:val="Title"/>
-    <w:basedOn w:val="Normal"/>
-    <w:next w:val="Normal"/>
-    <w:link w:val="TitleChar"/>
+    <w:basedOn w:val="a1"/>
+    <w:next w:val="a1"/>
+    <w:link w:val="Char2"/>
     <w:uiPriority w:val="2"/>
     <w:qFormat/>
     <w:pPr>
@@ -10501,10 +10900,10 @@
       <w:sz w:val="200"/>
     </w:rPr>
   </w:style>
-  <w:style w:type="character" w:customStyle="1" w:styleId="TitleChar">
-    <w:name w:val="Title Char"/>
-    <w:basedOn w:val="DefaultParagraphFont"/>
-    <w:link w:val="Title"/>
+  <w:style w:type="character" w:customStyle="1" w:styleId="Char2">
+    <w:name w:val="العنوان Char"/>
+    <w:basedOn w:val="a2"/>
+    <w:link w:val="a9"/>
     <w:uiPriority w:val="2"/>
     <w:rPr>
       <w:rFonts w:asciiTheme="majorHAnsi" w:eastAsiaTheme="majorEastAsia" w:hAnsiTheme="majorHAnsi" w:cstheme="majorBidi"/>
@@ -10514,19 +10913,19 @@
       <w:sz w:val="200"/>
     </w:rPr>
   </w:style>
-  <w:style w:type="character" w:styleId="PlaceholderText">
+  <w:style w:type="character" w:styleId="aa">
     <w:name w:val="Placeholder Text"/>
-    <w:basedOn w:val="DefaultParagraphFont"/>
+    <w:basedOn w:val="a2"/>
     <w:uiPriority w:val="99"/>
     <w:semiHidden/>
     <w:rPr>
       <w:color w:val="808080"/>
     </w:rPr>
   </w:style>
-  <w:style w:type="paragraph" w:styleId="BalloonText">
+  <w:style w:type="paragraph" w:styleId="ab">
     <w:name w:val="Balloon Text"/>
-    <w:basedOn w:val="Normal"/>
-    <w:link w:val="BalloonTextChar"/>
+    <w:basedOn w:val="a1"/>
+    <w:link w:val="Char3"/>
     <w:uiPriority w:val="99"/>
     <w:semiHidden/>
     <w:unhideWhenUsed/>
@@ -10538,10 +10937,10 @@
       <w:sz w:val="16"/>
     </w:rPr>
   </w:style>
-  <w:style w:type="character" w:customStyle="1" w:styleId="BalloonTextChar">
-    <w:name w:val="Balloon Text Char"/>
-    <w:basedOn w:val="DefaultParagraphFont"/>
-    <w:link w:val="BalloonText"/>
+  <w:style w:type="character" w:customStyle="1" w:styleId="Char3">
+    <w:name w:val="نص في بالون Char"/>
+    <w:basedOn w:val="a2"/>
+    <w:link w:val="ab"/>
     <w:uiPriority w:val="99"/>
     <w:semiHidden/>
     <w:rPr>
@@ -10549,9 +10948,9 @@
       <w:sz w:val="16"/>
     </w:rPr>
   </w:style>
-  <w:style w:type="character" w:styleId="Strong">
+  <w:style w:type="character" w:styleId="ac">
     <w:name w:val="Strong"/>
-    <w:basedOn w:val="DefaultParagraphFont"/>
+    <w:basedOn w:val="a2"/>
     <w:uiPriority w:val="10"/>
     <w:qFormat/>
     <w:rPr>
@@ -10559,10 +10958,10 @@
       <w:bCs/>
     </w:rPr>
   </w:style>
-  <w:style w:type="character" w:customStyle="1" w:styleId="SubtitleChar">
-    <w:name w:val="Subtitle Char"/>
-    <w:basedOn w:val="DefaultParagraphFont"/>
-    <w:link w:val="Subtitle"/>
+  <w:style w:type="character" w:customStyle="1" w:styleId="Char0">
+    <w:name w:val="عنوان فرعي Char"/>
+    <w:basedOn w:val="a2"/>
+    <w:link w:val="a6"/>
     <w:uiPriority w:val="3"/>
     <w:rPr>
       <w:rFonts w:asciiTheme="majorHAnsi" w:eastAsiaTheme="majorEastAsia" w:hAnsiTheme="majorHAnsi" w:cstheme="majorBidi"/>
@@ -10576,7 +10975,7 @@
   </w:style>
   <w:style w:type="paragraph" w:customStyle="1" w:styleId="Abstract">
     <w:name w:val="Abstract"/>
-    <w:basedOn w:val="Normal"/>
+    <w:basedOn w:val="a1"/>
     <w:uiPriority w:val="3"/>
     <w:qFormat/>
     <w:pPr>
@@ -10590,9 +10989,9 @@
       <w:sz w:val="28"/>
     </w:rPr>
   </w:style>
-  <w:style w:type="paragraph" w:styleId="NoSpacing">
+  <w:style w:type="paragraph" w:styleId="ad">
     <w:name w:val="No Spacing"/>
-    <w:link w:val="NoSpacingChar"/>
+    <w:link w:val="Char4"/>
     <w:uiPriority w:val="1"/>
     <w:unhideWhenUsed/>
     <w:qFormat/>
@@ -10602,7 +11001,7 @@
   </w:style>
   <w:style w:type="character" w:styleId="Hyperlink">
     <w:name w:val="Hyperlink"/>
-    <w:basedOn w:val="DefaultParagraphFont"/>
+    <w:basedOn w:val="a2"/>
     <w:uiPriority w:val="99"/>
     <w:unhideWhenUsed/>
     <w:rPr>
@@ -10610,10 +11009,10 @@
       <w:u w:val="single"/>
     </w:rPr>
   </w:style>
-  <w:style w:type="paragraph" w:styleId="TOC1">
+  <w:style w:type="paragraph" w:styleId="10">
     <w:name w:val="toc 1"/>
-    <w:basedOn w:val="Normal"/>
-    <w:next w:val="Normal"/>
+    <w:basedOn w:val="a1"/>
+    <w:next w:val="a1"/>
     <w:autoRedefine/>
     <w:uiPriority w:val="39"/>
     <w:unhideWhenUsed/>
@@ -10628,10 +11027,10 @@
       <w:kern w:val="20"/>
     </w:rPr>
   </w:style>
-  <w:style w:type="character" w:customStyle="1" w:styleId="Heading1Char">
-    <w:name w:val="Heading 1 Char"/>
-    <w:basedOn w:val="DefaultParagraphFont"/>
-    <w:link w:val="Heading1"/>
+  <w:style w:type="character" w:customStyle="1" w:styleId="1Char">
+    <w:name w:val="العنوان 1 Char"/>
+    <w:basedOn w:val="a2"/>
+    <w:link w:val="1"/>
     <w:uiPriority w:val="1"/>
     <w:rPr>
       <w:rFonts w:asciiTheme="majorHAnsi" w:eastAsiaTheme="majorEastAsia" w:hAnsiTheme="majorHAnsi" w:cstheme="majorBidi"/>
@@ -10641,10 +11040,10 @@
       <w:sz w:val="40"/>
     </w:rPr>
   </w:style>
-  <w:style w:type="paragraph" w:styleId="TOCHeading">
+  <w:style w:type="paragraph" w:styleId="ae">
     <w:name w:val="TOC Heading"/>
-    <w:basedOn w:val="Heading1"/>
-    <w:next w:val="Normal"/>
+    <w:basedOn w:val="1"/>
+    <w:next w:val="a1"/>
     <w:uiPriority w:val="39"/>
     <w:unhideWhenUsed/>
     <w:qFormat/>
@@ -10661,10 +11060,10 @@
       <w:sz w:val="44"/>
     </w:rPr>
   </w:style>
-  <w:style w:type="character" w:customStyle="1" w:styleId="Heading2Char">
-    <w:name w:val="Heading 2 Char"/>
-    <w:basedOn w:val="DefaultParagraphFont"/>
-    <w:link w:val="Heading2"/>
+  <w:style w:type="character" w:customStyle="1" w:styleId="2Char">
+    <w:name w:val="عنوان 2 Char"/>
+    <w:basedOn w:val="a2"/>
+    <w:link w:val="20"/>
     <w:uiPriority w:val="1"/>
     <w:rPr>
       <w:rFonts w:asciiTheme="majorHAnsi" w:eastAsiaTheme="majorEastAsia" w:hAnsiTheme="majorHAnsi" w:cstheme="majorBidi"/>
@@ -10674,11 +11073,11 @@
       <w:sz w:val="28"/>
     </w:rPr>
   </w:style>
-  <w:style w:type="paragraph" w:styleId="Quote">
+  <w:style w:type="paragraph" w:styleId="af">
     <w:name w:val="Quote"/>
-    <w:basedOn w:val="Normal"/>
-    <w:next w:val="Normal"/>
-    <w:link w:val="QuoteChar"/>
+    <w:basedOn w:val="a1"/>
+    <w:next w:val="a1"/>
+    <w:link w:val="Char5"/>
     <w:uiPriority w:val="1"/>
     <w:unhideWhenUsed/>
     <w:qFormat/>
@@ -10693,10 +11092,10 @@
       <w:sz w:val="24"/>
     </w:rPr>
   </w:style>
-  <w:style w:type="character" w:customStyle="1" w:styleId="QuoteChar">
-    <w:name w:val="Quote Char"/>
-    <w:basedOn w:val="DefaultParagraphFont"/>
-    <w:link w:val="Quote"/>
+  <w:style w:type="character" w:customStyle="1" w:styleId="Char5">
+    <w:name w:val="اقتباس Char"/>
+    <w:basedOn w:val="a2"/>
+    <w:link w:val="af"/>
     <w:uiPriority w:val="1"/>
     <w:rPr>
       <w:i/>
@@ -10706,10 +11105,10 @@
       <w:sz w:val="24"/>
     </w:rPr>
   </w:style>
-  <w:style w:type="paragraph" w:styleId="Signature">
+  <w:style w:type="paragraph" w:styleId="af0">
     <w:name w:val="Signature"/>
-    <w:basedOn w:val="Normal"/>
-    <w:link w:val="SignatureChar"/>
+    <w:basedOn w:val="a1"/>
+    <w:link w:val="Char6"/>
     <w:uiPriority w:val="9"/>
     <w:unhideWhenUsed/>
     <w:qFormat/>
@@ -10722,25 +11121,25 @@
       <w:kern w:val="20"/>
     </w:rPr>
   </w:style>
-  <w:style w:type="character" w:customStyle="1" w:styleId="SignatureChar">
-    <w:name w:val="Signature Char"/>
-    <w:basedOn w:val="DefaultParagraphFont"/>
-    <w:link w:val="Signature"/>
+  <w:style w:type="character" w:customStyle="1" w:styleId="Char6">
+    <w:name w:val="توقيع Char"/>
+    <w:basedOn w:val="a2"/>
+    <w:link w:val="af0"/>
     <w:uiPriority w:val="9"/>
     <w:rPr>
       <w:color w:val="595959" w:themeColor="text1" w:themeTint="A6"/>
       <w:kern w:val="20"/>
     </w:rPr>
   </w:style>
-  <w:style w:type="character" w:customStyle="1" w:styleId="NoSpacingChar">
-    <w:name w:val="No Spacing Char"/>
-    <w:basedOn w:val="DefaultParagraphFont"/>
-    <w:link w:val="NoSpacing"/>
+  <w:style w:type="character" w:customStyle="1" w:styleId="Char4">
+    <w:name w:val="بلا تباعد Char"/>
+    <w:basedOn w:val="a2"/>
+    <w:link w:val="ad"/>
     <w:uiPriority w:val="1"/>
   </w:style>
-  <w:style w:type="paragraph" w:styleId="ListBullet">
+  <w:style w:type="paragraph" w:styleId="a">
     <w:name w:val="List Bullet"/>
-    <w:basedOn w:val="Normal"/>
+    <w:basedOn w:val="a1"/>
     <w:uiPriority w:val="99"/>
     <w:unhideWhenUsed/>
     <w:qFormat/>
@@ -10755,9 +11154,9 @@
       <w:kern w:val="20"/>
     </w:rPr>
   </w:style>
-  <w:style w:type="paragraph" w:styleId="ListNumber">
+  <w:style w:type="paragraph" w:styleId="a0">
     <w:name w:val="List Number"/>
-    <w:basedOn w:val="Normal"/>
+    <w:basedOn w:val="a1"/>
     <w:uiPriority w:val="1"/>
     <w:unhideWhenUsed/>
     <w:qFormat/>
@@ -10773,9 +11172,9 @@
       <w:kern w:val="20"/>
     </w:rPr>
   </w:style>
-  <w:style w:type="paragraph" w:styleId="ListNumber2">
+  <w:style w:type="paragraph" w:styleId="2">
     <w:name w:val="List Number 2"/>
-    <w:basedOn w:val="Normal"/>
+    <w:basedOn w:val="a1"/>
     <w:uiPriority w:val="1"/>
     <w:unhideWhenUsed/>
     <w:qFormat/>
@@ -10792,9 +11191,9 @@
       <w:kern w:val="20"/>
     </w:rPr>
   </w:style>
-  <w:style w:type="paragraph" w:styleId="ListNumber3">
+  <w:style w:type="paragraph" w:styleId="3">
     <w:name w:val="List Number 3"/>
-    <w:basedOn w:val="Normal"/>
+    <w:basedOn w:val="a1"/>
     <w:uiPriority w:val="18"/>
     <w:unhideWhenUsed/>
     <w:pPr>
@@ -10810,9 +11209,9 @@
       <w:kern w:val="20"/>
     </w:rPr>
   </w:style>
-  <w:style w:type="paragraph" w:styleId="ListNumber4">
+  <w:style w:type="paragraph" w:styleId="4">
     <w:name w:val="List Number 4"/>
-    <w:basedOn w:val="Normal"/>
+    <w:basedOn w:val="a1"/>
     <w:uiPriority w:val="18"/>
     <w:unhideWhenUsed/>
     <w:pPr>
@@ -10828,9 +11227,9 @@
       <w:kern w:val="20"/>
     </w:rPr>
   </w:style>
-  <w:style w:type="paragraph" w:styleId="ListNumber5">
+  <w:style w:type="paragraph" w:styleId="5">
     <w:name w:val="List Number 5"/>
-    <w:basedOn w:val="Normal"/>
+    <w:basedOn w:val="a1"/>
     <w:uiPriority w:val="18"/>
     <w:unhideWhenUsed/>
     <w:pPr>
@@ -10848,7 +11247,7 @@
   </w:style>
   <w:style w:type="table" w:customStyle="1" w:styleId="FinancialTable">
     <w:name w:val="Financial Table"/>
-    <w:basedOn w:val="TableNormal"/>
+    <w:basedOn w:val="a3"/>
     <w:uiPriority w:val="99"/>
     <w:pPr>
       <w:spacing w:before="60" w:after="60" w:line="240" w:lineRule="auto"/>
@@ -10890,9 +11289,9 @@
       </w:rPr>
     </w:tblStylePr>
   </w:style>
-  <w:style w:type="character" w:styleId="CommentReference">
+  <w:style w:type="character" w:styleId="af1">
     <w:name w:val="annotation reference"/>
-    <w:basedOn w:val="DefaultParagraphFont"/>
+    <w:basedOn w:val="a2"/>
     <w:uiPriority w:val="99"/>
     <w:semiHidden/>
     <w:unhideWhenUsed/>
@@ -10900,27 +11299,27 @@
       <w:sz w:val="16"/>
     </w:rPr>
   </w:style>
-  <w:style w:type="paragraph" w:styleId="CommentText">
+  <w:style w:type="paragraph" w:styleId="af2">
     <w:name w:val="annotation text"/>
-    <w:basedOn w:val="Normal"/>
-    <w:link w:val="CommentTextChar"/>
+    <w:basedOn w:val="a1"/>
+    <w:link w:val="Char7"/>
     <w:uiPriority w:val="99"/>
     <w:unhideWhenUsed/>
     <w:pPr>
       <w:spacing w:line="240" w:lineRule="auto"/>
     </w:pPr>
   </w:style>
-  <w:style w:type="character" w:customStyle="1" w:styleId="CommentTextChar">
-    <w:name w:val="Comment Text Char"/>
-    <w:basedOn w:val="DefaultParagraphFont"/>
-    <w:link w:val="CommentText"/>
+  <w:style w:type="character" w:customStyle="1" w:styleId="Char7">
+    <w:name w:val="نص تعليق Char"/>
+    <w:basedOn w:val="a2"/>
+    <w:link w:val="af2"/>
     <w:uiPriority w:val="99"/>
   </w:style>
-  <w:style w:type="paragraph" w:styleId="CommentSubject">
+  <w:style w:type="paragraph" w:styleId="af3">
     <w:name w:val="annotation subject"/>
-    <w:basedOn w:val="CommentText"/>
-    <w:next w:val="CommentText"/>
-    <w:link w:val="CommentSubjectChar"/>
+    <w:basedOn w:val="af2"/>
+    <w:next w:val="af2"/>
+    <w:link w:val="Char8"/>
     <w:uiPriority w:val="99"/>
     <w:semiHidden/>
     <w:unhideWhenUsed/>
@@ -10929,10 +11328,10 @@
       <w:bCs/>
     </w:rPr>
   </w:style>
-  <w:style w:type="character" w:customStyle="1" w:styleId="CommentSubjectChar">
-    <w:name w:val="Comment Subject Char"/>
-    <w:basedOn w:val="CommentTextChar"/>
-    <w:link w:val="CommentSubject"/>
+  <w:style w:type="character" w:customStyle="1" w:styleId="Char8">
+    <w:name w:val="موضوع تعليق Char"/>
+    <w:basedOn w:val="Char7"/>
+    <w:link w:val="af3"/>
     <w:uiPriority w:val="99"/>
     <w:semiHidden/>
     <w:rPr>
@@ -10940,9 +11339,9 @@
       <w:bCs/>
     </w:rPr>
   </w:style>
-  <w:style w:type="table" w:styleId="LightShading">
+  <w:style w:type="table" w:styleId="af4">
     <w:name w:val="Light Shading"/>
-    <w:basedOn w:val="TableNormal"/>
+    <w:basedOn w:val="a3"/>
     <w:uiPriority w:val="60"/>
     <w:pPr>
       <w:spacing w:after="0" w:line="240" w:lineRule="auto"/>
@@ -11037,7 +11436,7 @@
   </w:style>
   <w:style w:type="paragraph" w:customStyle="1" w:styleId="TableTextDecimal">
     <w:name w:val="Table Text Decimal"/>
-    <w:basedOn w:val="Normal"/>
+    <w:basedOn w:val="a1"/>
     <w:uiPriority w:val="1"/>
     <w:qFormat/>
     <w:pPr>
@@ -11049,7 +11448,7 @@
   </w:style>
   <w:style w:type="paragraph" w:customStyle="1" w:styleId="TableText">
     <w:name w:val="Table Text"/>
-    <w:basedOn w:val="Normal"/>
+    <w:basedOn w:val="a1"/>
     <w:uiPriority w:val="1"/>
     <w:qFormat/>
     <w:pPr>
@@ -11058,7 +11457,7 @@
   </w:style>
   <w:style w:type="paragraph" w:customStyle="1" w:styleId="Organization">
     <w:name w:val="Organization"/>
-    <w:basedOn w:val="Normal"/>
+    <w:basedOn w:val="a1"/>
     <w:uiPriority w:val="2"/>
     <w:qFormat/>
     <w:pPr>
@@ -11072,9 +11471,9 @@
       <w:sz w:val="36"/>
     </w:rPr>
   </w:style>
-  <w:style w:type="paragraph" w:styleId="ListParagraph">
+  <w:style w:type="paragraph" w:styleId="af5">
     <w:name w:val="List Paragraph"/>
-    <w:basedOn w:val="Normal"/>
+    <w:basedOn w:val="a1"/>
     <w:uiPriority w:val="34"/>
     <w:qFormat/>
     <w:rsid w:val="001B698D"/>
@@ -11083,9 +11482,9 @@
       <w:contextualSpacing/>
     </w:pPr>
   </w:style>
-  <w:style w:type="paragraph" w:styleId="NormalWeb">
+  <w:style w:type="paragraph" w:styleId="af6">
     <w:name w:val="Normal (Web)"/>
-    <w:basedOn w:val="Normal"/>
+    <w:basedOn w:val="a1"/>
     <w:uiPriority w:val="99"/>
     <w:unhideWhenUsed/>
     <w:rsid w:val="00852E5F"/>
@@ -11102,7 +11501,7 @@
   </w:style>
   <w:style w:type="character" w:styleId="HTMLCode">
     <w:name w:val="HTML Code"/>
-    <w:basedOn w:val="DefaultParagraphFont"/>
+    <w:basedOn w:val="a2"/>
     <w:uiPriority w:val="99"/>
     <w:semiHidden/>
     <w:unhideWhenUsed/>
@@ -11115,17 +11514,17 @@
   </w:style>
   <w:style w:type="character" w:customStyle="1" w:styleId="8">
     <w:name w:val="ͼ8"/>
-    <w:basedOn w:val="DefaultParagraphFont"/>
+    <w:basedOn w:val="a2"/>
     <w:rsid w:val="00A442D9"/>
   </w:style>
   <w:style w:type="character" w:customStyle="1" w:styleId="b">
     <w:name w:val="ͼb"/>
-    <w:basedOn w:val="DefaultParagraphFont"/>
+    <w:basedOn w:val="a2"/>
     <w:rsid w:val="00A442D9"/>
   </w:style>
   <w:style w:type="paragraph" w:customStyle="1" w:styleId="font-claude-response-body">
     <w:name w:val="font-claude-response-body"/>
-    <w:basedOn w:val="Normal"/>
+    <w:basedOn w:val="a1"/>
     <w:rsid w:val="00EC2668"/>
     <w:pPr>
       <w:spacing w:before="100" w:beforeAutospacing="1" w:after="100" w:afterAutospacing="1" w:line="240" w:lineRule="auto"/>
@@ -11321,7 +11720,7 @@
     <w:lvl w:ilvl="0">
       <w:start w:val="1"/>
       <w:numFmt w:val="bullet"/>
-      <w:pStyle w:val="ListBullet"/>
+      <w:pStyle w:val="a"/>
       <w:lvlText w:val="•"/>
       <w:lvlJc w:val="left"/>
       <w:pPr>
@@ -11389,6 +11788,7 @@
     <w:rsid w:val="009955B4"/>
     <w:rsid w:val="009A2761"/>
     <w:rsid w:val="00A53609"/>
+    <w:rsid w:val="00A65CD8"/>
     <w:rsid w:val="00A90B6D"/>
     <w:rsid w:val="00AC3A9C"/>
     <w:rsid w:val="00AC55E9"/>
@@ -11396,12 +11796,15 @@
     <w:rsid w:val="00B023C2"/>
     <w:rsid w:val="00B1289C"/>
     <w:rsid w:val="00B4602D"/>
+    <w:rsid w:val="00B833D3"/>
+    <w:rsid w:val="00BC2CBC"/>
     <w:rsid w:val="00BF275B"/>
     <w:rsid w:val="00C346F5"/>
     <w:rsid w:val="00C40158"/>
     <w:rsid w:val="00C77297"/>
     <w:rsid w:val="00CC6F9F"/>
     <w:rsid w:val="00CE38B6"/>
+    <w:rsid w:val="00D20A87"/>
     <w:rsid w:val="00D248BA"/>
     <w:rsid w:val="00D40038"/>
     <w:rsid w:val="00D56FB7"/>
@@ -11831,17 +12234,17 @@
     <w:lsdException w:name="Unresolved Mention" w:semiHidden="1" w:unhideWhenUsed="1"/>
     <w:lsdException w:name="Smart Link" w:semiHidden="1" w:unhideWhenUsed="1"/>
   </w:latentStyles>
-  <w:style w:type="paragraph" w:default="1" w:styleId="Normal">
+  <w:style w:type="paragraph" w:default="1" w:styleId="a0">
     <w:name w:val="Normal"/>
     <w:qFormat/>
   </w:style>
-  <w:style w:type="character" w:default="1" w:styleId="DefaultParagraphFont">
+  <w:style w:type="character" w:default="1" w:styleId="a1">
     <w:name w:val="Default Paragraph Font"/>
     <w:uiPriority w:val="1"/>
     <w:semiHidden/>
     <w:unhideWhenUsed/>
   </w:style>
-  <w:style w:type="table" w:default="1" w:styleId="TableNormal">
+  <w:style w:type="table" w:default="1" w:styleId="a2">
     <w:name w:val="Normal Table"/>
     <w:uiPriority w:val="99"/>
     <w:semiHidden/>
@@ -11856,15 +12259,15 @@
       </w:tblCellMar>
     </w:tblPr>
   </w:style>
-  <w:style w:type="numbering" w:default="1" w:styleId="NoList">
+  <w:style w:type="numbering" w:default="1" w:styleId="a3">
     <w:name w:val="No List"/>
     <w:uiPriority w:val="99"/>
     <w:semiHidden/>
     <w:unhideWhenUsed/>
   </w:style>
-  <w:style w:type="paragraph" w:styleId="ListBullet">
+  <w:style w:type="paragraph" w:styleId="a">
     <w:name w:val="List Bullet"/>
-    <w:basedOn w:val="Normal"/>
+    <w:basedOn w:val="a0"/>
     <w:uiPriority w:val="1"/>
     <w:unhideWhenUsed/>
     <w:qFormat/>
@@ -11881,9 +12284,9 @@
       <w:lang w:val="en-US" w:eastAsia="en-US"/>
     </w:rPr>
   </w:style>
-  <w:style w:type="character" w:styleId="Strong">
+  <w:style w:type="character" w:styleId="a4">
     <w:name w:val="Strong"/>
-    <w:basedOn w:val="DefaultParagraphFont"/>
+    <w:basedOn w:val="a1"/>
     <w:uiPriority w:val="10"/>
     <w:qFormat/>
     <w:rPr>

</xml_diff>

<commit_message>
Task 2 has been added
</commit_message>
<xml_diff>
--- a/Introduction to DB-CS350 Project.docx
+++ b/Introduction to DB-CS350 Project.docx
@@ -83,7 +83,7 @@
                             <w:sdtContent>
                               <w:p>
                                 <w:pPr>
-                                  <w:pStyle w:val="a9"/>
+                                  <w:pStyle w:val="Title"/>
                                   <w:jc w:val="center"/>
                                   <w:rPr>
                                     <w:sz w:val="96"/>
@@ -102,7 +102,7 @@
                           </w:sdt>
                           <w:p>
                             <w:pPr>
-                              <w:pStyle w:val="a6"/>
+                              <w:pStyle w:val="Subtitle"/>
                               <w:ind w:left="709" w:right="720"/>
                               <w:jc w:val="center"/>
                               <w:rPr>
@@ -474,7 +474,7 @@
                       <w:sdtContent>
                         <w:p>
                           <w:pPr>
-                            <w:pStyle w:val="a9"/>
+                            <w:pStyle w:val="Title"/>
                             <w:jc w:val="center"/>
                             <w:rPr>
                               <w:sz w:val="96"/>
@@ -493,7 +493,7 @@
                     </w:sdt>
                     <w:p>
                       <w:pPr>
-                        <w:pStyle w:val="a6"/>
+                        <w:pStyle w:val="Subtitle"/>
                         <w:ind w:left="709" w:right="720"/>
                         <w:jc w:val="center"/>
                         <w:rPr>
@@ -1254,7 +1254,7 @@
                               <w:txbxContent>
                                 <w:p>
                                   <w:pPr>
-                                    <w:pStyle w:val="af5"/>
+                                    <w:pStyle w:val="ListParagraph"/>
                                     <w:numPr>
                                       <w:ilvl w:val="0"/>
                                       <w:numId w:val="6"/>
@@ -1323,7 +1323,7 @@
                                 </w:p>
                                 <w:p>
                                   <w:pPr>
-                                    <w:pStyle w:val="af5"/>
+                                    <w:pStyle w:val="ListParagraph"/>
                                     <w:numPr>
                                       <w:ilvl w:val="0"/>
                                       <w:numId w:val="6"/>
@@ -1344,7 +1344,7 @@
                                 </w:p>
                                 <w:p>
                                   <w:pPr>
-                                    <w:pStyle w:val="af5"/>
+                                    <w:pStyle w:val="ListParagraph"/>
                                     <w:numPr>
                                       <w:ilvl w:val="0"/>
                                       <w:numId w:val="6"/>
@@ -1456,7 +1456,7 @@
                                 </w:p>
                                 <w:p>
                                   <w:pPr>
-                                    <w:pStyle w:val="af5"/>
+                                    <w:pStyle w:val="ListParagraph"/>
                                     <w:numPr>
                                       <w:ilvl w:val="0"/>
                                       <w:numId w:val="6"/>
@@ -1478,7 +1478,7 @@
                                 </w:p>
                                 <w:p>
                                   <w:pPr>
-                                    <w:pStyle w:val="af5"/>
+                                    <w:pStyle w:val="ListParagraph"/>
                                     <w:numPr>
                                       <w:ilvl w:val="0"/>
                                       <w:numId w:val="6"/>
@@ -1506,7 +1506,7 @@
                                 </w:p>
                                 <w:p>
                                   <w:pPr>
-                                    <w:pStyle w:val="af5"/>
+                                    <w:pStyle w:val="ListParagraph"/>
                                     <w:numPr>
                                       <w:ilvl w:val="0"/>
                                       <w:numId w:val="6"/>
@@ -1528,7 +1528,7 @@
                                 </w:p>
                                 <w:p>
                                   <w:pPr>
-                                    <w:pStyle w:val="af5"/>
+                                    <w:pStyle w:val="ListParagraph"/>
                                     <w:numPr>
                                       <w:ilvl w:val="0"/>
                                       <w:numId w:val="6"/>
@@ -1575,7 +1575,7 @@
                                 </w:p>
                                 <w:p>
                                   <w:pPr>
-                                    <w:pStyle w:val="af5"/>
+                                    <w:pStyle w:val="ListParagraph"/>
                                     <w:numPr>
                                       <w:ilvl w:val="0"/>
                                       <w:numId w:val="6"/>
@@ -1597,7 +1597,7 @@
                                 </w:p>
                                 <w:p>
                                   <w:pPr>
-                                    <w:pStyle w:val="af5"/>
+                                    <w:pStyle w:val="ListParagraph"/>
                                     <w:numPr>
                                       <w:ilvl w:val="0"/>
                                       <w:numId w:val="6"/>
@@ -1637,7 +1637,7 @@
                                 </w:p>
                                 <w:p>
                                   <w:pPr>
-                                    <w:pStyle w:val="af5"/>
+                                    <w:pStyle w:val="ListParagraph"/>
                                     <w:numPr>
                                       <w:ilvl w:val="0"/>
                                       <w:numId w:val="6"/>
@@ -1734,7 +1734,7 @@
                         <w:txbxContent>
                           <w:p>
                             <w:pPr>
-                              <w:pStyle w:val="af5"/>
+                              <w:pStyle w:val="ListParagraph"/>
                               <w:numPr>
                                 <w:ilvl w:val="0"/>
                                 <w:numId w:val="6"/>
@@ -1803,7 +1803,7 @@
                           </w:p>
                           <w:p>
                             <w:pPr>
-                              <w:pStyle w:val="af5"/>
+                              <w:pStyle w:val="ListParagraph"/>
                               <w:numPr>
                                 <w:ilvl w:val="0"/>
                                 <w:numId w:val="6"/>
@@ -1824,7 +1824,7 @@
                           </w:p>
                           <w:p>
                             <w:pPr>
-                              <w:pStyle w:val="af5"/>
+                              <w:pStyle w:val="ListParagraph"/>
                               <w:numPr>
                                 <w:ilvl w:val="0"/>
                                 <w:numId w:val="6"/>
@@ -1936,7 +1936,7 @@
                           </w:p>
                           <w:p>
                             <w:pPr>
-                              <w:pStyle w:val="af5"/>
+                              <w:pStyle w:val="ListParagraph"/>
                               <w:numPr>
                                 <w:ilvl w:val="0"/>
                                 <w:numId w:val="6"/>
@@ -1958,7 +1958,7 @@
                           </w:p>
                           <w:p>
                             <w:pPr>
-                              <w:pStyle w:val="af5"/>
+                              <w:pStyle w:val="ListParagraph"/>
                               <w:numPr>
                                 <w:ilvl w:val="0"/>
                                 <w:numId w:val="6"/>
@@ -1986,7 +1986,7 @@
                           </w:p>
                           <w:p>
                             <w:pPr>
-                              <w:pStyle w:val="af5"/>
+                              <w:pStyle w:val="ListParagraph"/>
                               <w:numPr>
                                 <w:ilvl w:val="0"/>
                                 <w:numId w:val="6"/>
@@ -2008,7 +2008,7 @@
                           </w:p>
                           <w:p>
                             <w:pPr>
-                              <w:pStyle w:val="af5"/>
+                              <w:pStyle w:val="ListParagraph"/>
                               <w:numPr>
                                 <w:ilvl w:val="0"/>
                                 <w:numId w:val="6"/>
@@ -2055,7 +2055,7 @@
                           </w:p>
                           <w:p>
                             <w:pPr>
-                              <w:pStyle w:val="af5"/>
+                              <w:pStyle w:val="ListParagraph"/>
                               <w:numPr>
                                 <w:ilvl w:val="0"/>
                                 <w:numId w:val="6"/>
@@ -2077,7 +2077,7 @@
                           </w:p>
                           <w:p>
                             <w:pPr>
-                              <w:pStyle w:val="af5"/>
+                              <w:pStyle w:val="ListParagraph"/>
                               <w:numPr>
                                 <w:ilvl w:val="0"/>
                                 <w:numId w:val="6"/>
@@ -2117,7 +2117,7 @@
                           </w:p>
                           <w:p>
                             <w:pPr>
-                              <w:pStyle w:val="af5"/>
+                              <w:pStyle w:val="ListParagraph"/>
                               <w:numPr>
                                 <w:ilvl w:val="0"/>
                                 <w:numId w:val="6"/>
@@ -2298,7 +2298,7 @@
                                     </w:tcPr>
                                     <w:p>
                                       <w:pPr>
-                                        <w:pStyle w:val="a5"/>
+                                        <w:pStyle w:val="Footer"/>
                                         <w:rPr>
                                           <w:b/>
                                           <w:bCs/>
@@ -2336,7 +2336,7 @@
                                     </w:p>
                                     <w:p>
                                       <w:pPr>
-                                        <w:pStyle w:val="a5"/>
+                                        <w:pStyle w:val="Footer"/>
                                         <w:rPr>
                                           <w:b/>
                                           <w:bCs/>
@@ -2360,7 +2360,17 @@
                                           <w:sz w:val="28"/>
                                           <w:szCs w:val="28"/>
                                         </w:rPr>
-                                        <w:t>Rakan A</w:t>
+                                        <w:t xml:space="preserve">Rakan </w:t>
+                                      </w:r>
+                                      <w:proofErr w:type="spellStart"/>
+                                      <w:r>
+                                        <w:rPr>
+                                          <w:b/>
+                                          <w:bCs/>
+                                          <w:sz w:val="28"/>
+                                          <w:szCs w:val="28"/>
+                                        </w:rPr>
+                                        <w:t>A</w:t>
                                       </w:r>
                                       <w:r>
                                         <w:rPr>
@@ -2371,10 +2381,49 @@
                                         </w:rPr>
                                         <w:t>lqu</w:t>
                                       </w:r>
+                                      <w:proofErr w:type="spellEnd"/>
                                     </w:p>
                                     <w:p>
                                       <w:pPr>
-                                        <w:pStyle w:val="a5"/>
+                                        <w:pStyle w:val="Footer"/>
+                                        <w:rPr>
+                                          <w:b/>
+                                          <w:bCs/>
+                                          <w:sz w:val="28"/>
+                                          <w:szCs w:val="28"/>
+                                        </w:rPr>
+                                      </w:pPr>
+                                      <w:r>
+                                        <w:rPr>
+                                          <w:b/>
+                                          <w:bCs/>
+                                          <w:sz w:val="28"/>
+                                          <w:szCs w:val="28"/>
+                                        </w:rPr>
+                                        <w:t>Name:</w:t>
+                                      </w:r>
+                                      <w:r>
+                                        <w:rPr>
+                                          <w:b/>
+                                          <w:bCs/>
+                                          <w:sz w:val="28"/>
+                                          <w:szCs w:val="28"/>
+                                        </w:rPr>
+                                        <w:t xml:space="preserve"> </w:t>
+                                      </w:r>
+                                      <w:r>
+                                        <w:rPr>
+                                          <w:b/>
+                                          <w:bCs/>
+                                          <w:sz w:val="28"/>
+                                          <w:szCs w:val="28"/>
+                                        </w:rPr>
+                                        <w:t>Mohammed Al Shuaibi</w:t>
+                                      </w:r>
+                                    </w:p>
+                                    <w:p>
+                                      <w:pPr>
+                                        <w:pStyle w:val="Footer"/>
                                         <w:rPr>
                                           <w:b/>
                                           <w:bCs/>
@@ -2403,36 +2452,7 @@
                                     </w:p>
                                     <w:p>
                                       <w:pPr>
-                                        <w:pStyle w:val="a5"/>
-                                        <w:rPr>
-                                          <w:b/>
-                                          <w:bCs/>
-                                          <w:sz w:val="28"/>
-                                          <w:szCs w:val="28"/>
-                                        </w:rPr>
-                                      </w:pPr>
-                                      <w:r>
-                                        <w:rPr>
-                                          <w:b/>
-                                          <w:bCs/>
-                                          <w:sz w:val="28"/>
-                                          <w:szCs w:val="28"/>
-                                        </w:rPr>
-                                        <w:t>Name:</w:t>
-                                      </w:r>
-                                      <w:r>
-                                        <w:rPr>
-                                          <w:b/>
-                                          <w:bCs/>
-                                          <w:sz w:val="28"/>
-                                          <w:szCs w:val="28"/>
-                                        </w:rPr>
-                                        <w:t xml:space="preserve"> </w:t>
-                                      </w:r>
-                                    </w:p>
-                                    <w:p>
-                                      <w:pPr>
-                                        <w:pStyle w:val="a5"/>
+                                        <w:pStyle w:val="Footer"/>
                                         <w:ind w:left="0"/>
                                         <w:rPr>
                                           <w:b/>
@@ -2452,7 +2472,7 @@
                                     </w:tcPr>
                                     <w:p>
                                       <w:pPr>
-                                        <w:pStyle w:val="a5"/>
+                                        <w:pStyle w:val="Footer"/>
                                         <w:ind w:left="0"/>
                                         <w:rPr>
                                           <w:b/>
@@ -2470,7 +2490,7 @@
                                     </w:tcPr>
                                     <w:p>
                                       <w:pPr>
-                                        <w:pStyle w:val="a5"/>
+                                        <w:pStyle w:val="Footer"/>
                                         <w:rPr>
                                           <w:b/>
                                           <w:bCs/>
@@ -2508,7 +2528,7 @@
                                     </w:p>
                                     <w:p>
                                       <w:pPr>
-                                        <w:pStyle w:val="a5"/>
+                                        <w:pStyle w:val="Footer"/>
                                         <w:rPr>
                                           <w:b/>
                                           <w:bCs/>
@@ -2546,7 +2566,7 @@
                                     </w:p>
                                     <w:p>
                                       <w:pPr>
-                                        <w:pStyle w:val="a5"/>
+                                        <w:pStyle w:val="Footer"/>
                                         <w:rPr>
                                           <w:b/>
                                           <w:bCs/>
@@ -2572,10 +2592,19 @@
                                         </w:rPr>
                                         <w:t xml:space="preserve"> </w:t>
                                       </w:r>
+                                      <w:r>
+                                        <w:rPr>
+                                          <w:b/>
+                                          <w:bCs/>
+                                          <w:sz w:val="28"/>
+                                          <w:szCs w:val="28"/>
+                                        </w:rPr>
+                                        <w:t>S240024427</w:t>
+                                      </w:r>
                                     </w:p>
                                     <w:p>
                                       <w:pPr>
-                                        <w:pStyle w:val="a5"/>
+                                        <w:pStyle w:val="Footer"/>
                                         <w:rPr>
                                           <w:b/>
                                           <w:bCs/>
@@ -2616,7 +2645,7 @@
                                     </w:tcPr>
                                     <w:p>
                                       <w:pPr>
-                                        <w:pStyle w:val="a5"/>
+                                        <w:pStyle w:val="Footer"/>
                                         <w:ind w:left="0"/>
                                       </w:pPr>
                                     </w:p>
@@ -2628,7 +2657,7 @@
                                     </w:tcPr>
                                     <w:p>
                                       <w:pPr>
-                                        <w:pStyle w:val="a5"/>
+                                        <w:pStyle w:val="Footer"/>
                                       </w:pPr>
                                     </w:p>
                                   </w:tc>
@@ -2639,7 +2668,7 @@
                                     </w:tcPr>
                                     <w:p>
                                       <w:pPr>
-                                        <w:pStyle w:val="a5"/>
+                                        <w:pStyle w:val="Footer"/>
                                       </w:pPr>
                                     </w:p>
                                   </w:tc>
@@ -2647,7 +2676,7 @@
                               </w:tbl>
                               <w:p>
                                 <w:pPr>
-                                  <w:pStyle w:val="ad"/>
+                                  <w:pStyle w:val="NoSpacing"/>
                                 </w:pPr>
                               </w:p>
                             </w:txbxContent>
@@ -2750,7 +2779,7 @@
                               </w:tcPr>
                               <w:p>
                                 <w:pPr>
-                                  <w:pStyle w:val="a5"/>
+                                  <w:pStyle w:val="Footer"/>
                                   <w:rPr>
                                     <w:b/>
                                     <w:bCs/>
@@ -2788,7 +2817,7 @@
                               </w:p>
                               <w:p>
                                 <w:pPr>
-                                  <w:pStyle w:val="a5"/>
+                                  <w:pStyle w:val="Footer"/>
                                   <w:rPr>
                                     <w:b/>
                                     <w:bCs/>
@@ -2812,7 +2841,17 @@
                                     <w:sz w:val="28"/>
                                     <w:szCs w:val="28"/>
                                   </w:rPr>
-                                  <w:t>Rakan A</w:t>
+                                  <w:t xml:space="preserve">Rakan </w:t>
+                                </w:r>
+                                <w:proofErr w:type="spellStart"/>
+                                <w:r>
+                                  <w:rPr>
+                                    <w:b/>
+                                    <w:bCs/>
+                                    <w:sz w:val="28"/>
+                                    <w:szCs w:val="28"/>
+                                  </w:rPr>
+                                  <w:t>A</w:t>
                                 </w:r>
                                 <w:r>
                                   <w:rPr>
@@ -2823,10 +2862,49 @@
                                   </w:rPr>
                                   <w:t>lqu</w:t>
                                 </w:r>
+                                <w:proofErr w:type="spellEnd"/>
                               </w:p>
                               <w:p>
                                 <w:pPr>
-                                  <w:pStyle w:val="a5"/>
+                                  <w:pStyle w:val="Footer"/>
+                                  <w:rPr>
+                                    <w:b/>
+                                    <w:bCs/>
+                                    <w:sz w:val="28"/>
+                                    <w:szCs w:val="28"/>
+                                  </w:rPr>
+                                </w:pPr>
+                                <w:r>
+                                  <w:rPr>
+                                    <w:b/>
+                                    <w:bCs/>
+                                    <w:sz w:val="28"/>
+                                    <w:szCs w:val="28"/>
+                                  </w:rPr>
+                                  <w:t>Name:</w:t>
+                                </w:r>
+                                <w:r>
+                                  <w:rPr>
+                                    <w:b/>
+                                    <w:bCs/>
+                                    <w:sz w:val="28"/>
+                                    <w:szCs w:val="28"/>
+                                  </w:rPr>
+                                  <w:t xml:space="preserve"> </w:t>
+                                </w:r>
+                                <w:r>
+                                  <w:rPr>
+                                    <w:b/>
+                                    <w:bCs/>
+                                    <w:sz w:val="28"/>
+                                    <w:szCs w:val="28"/>
+                                  </w:rPr>
+                                  <w:t>Mohammed Al Shuaibi</w:t>
+                                </w:r>
+                              </w:p>
+                              <w:p>
+                                <w:pPr>
+                                  <w:pStyle w:val="Footer"/>
                                   <w:rPr>
                                     <w:b/>
                                     <w:bCs/>
@@ -2855,36 +2933,7 @@
                               </w:p>
                               <w:p>
                                 <w:pPr>
-                                  <w:pStyle w:val="a5"/>
-                                  <w:rPr>
-                                    <w:b/>
-                                    <w:bCs/>
-                                    <w:sz w:val="28"/>
-                                    <w:szCs w:val="28"/>
-                                  </w:rPr>
-                                </w:pPr>
-                                <w:r>
-                                  <w:rPr>
-                                    <w:b/>
-                                    <w:bCs/>
-                                    <w:sz w:val="28"/>
-                                    <w:szCs w:val="28"/>
-                                  </w:rPr>
-                                  <w:t>Name:</w:t>
-                                </w:r>
-                                <w:r>
-                                  <w:rPr>
-                                    <w:b/>
-                                    <w:bCs/>
-                                    <w:sz w:val="28"/>
-                                    <w:szCs w:val="28"/>
-                                  </w:rPr>
-                                  <w:t xml:space="preserve"> </w:t>
-                                </w:r>
-                              </w:p>
-                              <w:p>
-                                <w:pPr>
-                                  <w:pStyle w:val="a5"/>
+                                  <w:pStyle w:val="Footer"/>
                                   <w:ind w:left="0"/>
                                   <w:rPr>
                                     <w:b/>
@@ -2904,7 +2953,7 @@
                               </w:tcPr>
                               <w:p>
                                 <w:pPr>
-                                  <w:pStyle w:val="a5"/>
+                                  <w:pStyle w:val="Footer"/>
                                   <w:ind w:left="0"/>
                                   <w:rPr>
                                     <w:b/>
@@ -2922,7 +2971,7 @@
                               </w:tcPr>
                               <w:p>
                                 <w:pPr>
-                                  <w:pStyle w:val="a5"/>
+                                  <w:pStyle w:val="Footer"/>
                                   <w:rPr>
                                     <w:b/>
                                     <w:bCs/>
@@ -2960,7 +3009,7 @@
                               </w:p>
                               <w:p>
                                 <w:pPr>
-                                  <w:pStyle w:val="a5"/>
+                                  <w:pStyle w:val="Footer"/>
                                   <w:rPr>
                                     <w:b/>
                                     <w:bCs/>
@@ -2998,7 +3047,7 @@
                               </w:p>
                               <w:p>
                                 <w:pPr>
-                                  <w:pStyle w:val="a5"/>
+                                  <w:pStyle w:val="Footer"/>
                                   <w:rPr>
                                     <w:b/>
                                     <w:bCs/>
@@ -3024,10 +3073,19 @@
                                   </w:rPr>
                                   <w:t xml:space="preserve"> </w:t>
                                 </w:r>
+                                <w:r>
+                                  <w:rPr>
+                                    <w:b/>
+                                    <w:bCs/>
+                                    <w:sz w:val="28"/>
+                                    <w:szCs w:val="28"/>
+                                  </w:rPr>
+                                  <w:t>S240024427</w:t>
+                                </w:r>
                               </w:p>
                               <w:p>
                                 <w:pPr>
-                                  <w:pStyle w:val="a5"/>
+                                  <w:pStyle w:val="Footer"/>
                                   <w:rPr>
                                     <w:b/>
                                     <w:bCs/>
@@ -3068,7 +3126,7 @@
                               </w:tcPr>
                               <w:p>
                                 <w:pPr>
-                                  <w:pStyle w:val="a5"/>
+                                  <w:pStyle w:val="Footer"/>
                                   <w:ind w:left="0"/>
                                 </w:pPr>
                               </w:p>
@@ -3080,7 +3138,7 @@
                               </w:tcPr>
                               <w:p>
                                 <w:pPr>
-                                  <w:pStyle w:val="a5"/>
+                                  <w:pStyle w:val="Footer"/>
                                 </w:pPr>
                               </w:p>
                             </w:tc>
@@ -3091,7 +3149,7 @@
                               </w:tcPr>
                               <w:p>
                                 <w:pPr>
-                                  <w:pStyle w:val="a5"/>
+                                  <w:pStyle w:val="Footer"/>
                                 </w:pPr>
                               </w:p>
                             </w:tc>
@@ -3099,7 +3157,7 @@
                         </w:tbl>
                         <w:p>
                           <w:pPr>
-                            <w:pStyle w:val="ad"/>
+                            <w:pStyle w:val="NoSpacing"/>
                           </w:pPr>
                         </w:p>
                       </w:txbxContent>
@@ -3141,7 +3199,7 @@
     </w:p>
     <w:p>
       <w:pPr>
-        <w:pStyle w:val="1"/>
+        <w:pStyle w:val="Heading1"/>
         <w:spacing w:before="0" w:after="0"/>
         <w:rPr>
           <w:rFonts w:ascii="Times New Roman" w:hAnsi="Times New Roman" w:cs="Times New Roman"/>
@@ -3282,7 +3340,7 @@
     </w:p>
     <w:p>
       <w:pPr>
-        <w:pStyle w:val="af5"/>
+        <w:pStyle w:val="ListParagraph"/>
         <w:numPr>
           <w:ilvl w:val="1"/>
           <w:numId w:val="6"/>
@@ -3361,7 +3419,7 @@
     </w:p>
     <w:p>
       <w:pPr>
-        <w:pStyle w:val="af5"/>
+        <w:pStyle w:val="ListParagraph"/>
         <w:numPr>
           <w:ilvl w:val="1"/>
           <w:numId w:val="6"/>
@@ -3447,7 +3505,7 @@
     </w:p>
     <w:p>
       <w:pPr>
-        <w:pStyle w:val="af5"/>
+        <w:pStyle w:val="ListParagraph"/>
         <w:numPr>
           <w:ilvl w:val="1"/>
           <w:numId w:val="6"/>
@@ -3533,7 +3591,7 @@
     </w:p>
     <w:p>
       <w:pPr>
-        <w:pStyle w:val="af5"/>
+        <w:pStyle w:val="ListParagraph"/>
         <w:numPr>
           <w:ilvl w:val="1"/>
           <w:numId w:val="6"/>
@@ -3779,7 +3837,7 @@
     </w:p>
     <w:p>
       <w:pPr>
-        <w:pStyle w:val="af5"/>
+        <w:pStyle w:val="ListParagraph"/>
         <w:numPr>
           <w:ilvl w:val="0"/>
           <w:numId w:val="19"/>
@@ -3799,12 +3857,30 @@
           <w:sz w:val="24"/>
           <w:szCs w:val="24"/>
         </w:rPr>
-        <w:t>Task 1 : database design</w:t>
+        <w:t xml:space="preserve">Task </w:t>
+      </w:r>
+      <w:proofErr w:type="gramStart"/>
+      <w:r>
+        <w:rPr>
+          <w:rFonts w:ascii="Times New Roman" w:hAnsi="Times New Roman" w:cs="Times New Roman"/>
+          <w:sz w:val="24"/>
+          <w:szCs w:val="24"/>
+        </w:rPr>
+        <w:t>1 :</w:t>
+      </w:r>
+      <w:proofErr w:type="gramEnd"/>
+      <w:r>
+        <w:rPr>
+          <w:rFonts w:ascii="Times New Roman" w:hAnsi="Times New Roman" w:cs="Times New Roman"/>
+          <w:sz w:val="24"/>
+          <w:szCs w:val="24"/>
+        </w:rPr>
+        <w:t xml:space="preserve"> database design</w:t>
       </w:r>
     </w:p>
     <w:p>
       <w:pPr>
-        <w:pStyle w:val="af5"/>
+        <w:pStyle w:val="ListParagraph"/>
         <w:numPr>
           <w:ilvl w:val="0"/>
           <w:numId w:val="19"/>
@@ -3829,7 +3905,7 @@
     </w:p>
     <w:p>
       <w:pPr>
-        <w:pStyle w:val="af5"/>
+        <w:pStyle w:val="ListParagraph"/>
         <w:numPr>
           <w:ilvl w:val="0"/>
           <w:numId w:val="19"/>
@@ -3926,7 +4002,7 @@
     </w:p>
     <w:p>
       <w:pPr>
-        <w:pStyle w:val="af5"/>
+        <w:pStyle w:val="ListParagraph"/>
         <w:numPr>
           <w:ilvl w:val="0"/>
           <w:numId w:val="19"/>
@@ -4128,7 +4204,25 @@
           <w:sz w:val="24"/>
           <w:szCs w:val="24"/>
         </w:rPr>
-        <w:t xml:space="preserve"> to the live report document, GitHub/GitLab repository, and Google Colab notebook (if applicable) in the </w:t>
+        <w:t xml:space="preserve"> to the live report document, GitHub/GitLab repository, and Google </w:t>
+      </w:r>
+      <w:proofErr w:type="spellStart"/>
+      <w:r>
+        <w:rPr>
+          <w:rFonts w:ascii="Times New Roman" w:hAnsi="Times New Roman" w:cs="Times New Roman"/>
+          <w:sz w:val="24"/>
+          <w:szCs w:val="24"/>
+        </w:rPr>
+        <w:t>Colab</w:t>
+      </w:r>
+      <w:proofErr w:type="spellEnd"/>
+      <w:r>
+        <w:rPr>
+          <w:rFonts w:ascii="Times New Roman" w:hAnsi="Times New Roman" w:cs="Times New Roman"/>
+          <w:sz w:val="24"/>
+          <w:szCs w:val="24"/>
+        </w:rPr>
+        <w:t xml:space="preserve"> notebook (if applicable) in the </w:t>
       </w:r>
       <w:r>
         <w:rPr>
@@ -4289,7 +4383,7 @@
     </w:p>
     <w:p>
       <w:pPr>
-        <w:pStyle w:val="af5"/>
+        <w:pStyle w:val="ListParagraph"/>
         <w:numPr>
           <w:ilvl w:val="0"/>
           <w:numId w:val="7"/>
@@ -4327,7 +4421,7 @@
     </w:p>
     <w:p>
       <w:pPr>
-        <w:pStyle w:val="af5"/>
+        <w:pStyle w:val="ListParagraph"/>
         <w:numPr>
           <w:ilvl w:val="0"/>
           <w:numId w:val="7"/>
@@ -4443,7 +4537,7 @@
     </w:p>
     <w:p>
       <w:pPr>
-        <w:pStyle w:val="1"/>
+        <w:pStyle w:val="Heading1"/>
         <w:rPr>
           <w:rFonts w:ascii="Times New Roman" w:hAnsi="Times New Roman" w:cs="Times New Roman"/>
           <w:color w:val="auto"/>
@@ -4562,16 +4656,16 @@
                         <w:txbxContent>
                           <w:p>
                             <w:pPr>
-                              <w:pStyle w:val="af"/>
+                              <w:pStyle w:val="Quote"/>
                               <w:rPr>
-                                <w:rStyle w:val="Char5"/>
+                                <w:rStyle w:val="QuoteChar"/>
                                 <w:i/>
                                 <w:iCs/>
                               </w:rPr>
                             </w:pPr>
                             <w:r>
                               <w:rPr>
-                                <w:rStyle w:val="Char5"/>
+                                <w:rStyle w:val="QuoteChar"/>
                                 <w:i/>
                                 <w:iCs/>
                               </w:rPr>
@@ -4589,7 +4683,7 @@
                           </w:p>
                           <w:p>
                             <w:pPr>
-                              <w:pStyle w:val="af6"/>
+                              <w:pStyle w:val="NormalWeb"/>
                               <w:shd w:val="clear" w:color="auto" w:fill="FFFFFF"/>
                               <w:spacing w:before="0" w:beforeAutospacing="0" w:after="0" w:afterAutospacing="0" w:line="360" w:lineRule="auto"/>
                               <w:jc w:val="both"/>
@@ -4617,7 +4711,7 @@
                           </w:p>
                           <w:p>
                             <w:pPr>
-                              <w:pStyle w:val="af6"/>
+                              <w:pStyle w:val="NormalWeb"/>
                               <w:shd w:val="clear" w:color="auto" w:fill="FFFFFF"/>
                               <w:spacing w:before="0" w:beforeAutospacing="0" w:after="0" w:afterAutospacing="0"/>
                               <w:rPr>
@@ -4685,16 +4779,16 @@
                   <w:txbxContent>
                     <w:p>
                       <w:pPr>
-                        <w:pStyle w:val="af"/>
+                        <w:pStyle w:val="Quote"/>
                         <w:rPr>
-                          <w:rStyle w:val="Char5"/>
+                          <w:rStyle w:val="QuoteChar"/>
                           <w:i/>
                           <w:iCs/>
                         </w:rPr>
                       </w:pPr>
                       <w:r>
                         <w:rPr>
-                          <w:rStyle w:val="Char5"/>
+                          <w:rStyle w:val="QuoteChar"/>
                           <w:i/>
                           <w:iCs/>
                         </w:rPr>
@@ -4712,7 +4806,7 @@
                     </w:p>
                     <w:p>
                       <w:pPr>
-                        <w:pStyle w:val="af6"/>
+                        <w:pStyle w:val="NormalWeb"/>
                         <w:shd w:val="clear" w:color="auto" w:fill="FFFFFF"/>
                         <w:spacing w:before="0" w:beforeAutospacing="0" w:after="0" w:afterAutospacing="0" w:line="360" w:lineRule="auto"/>
                         <w:jc w:val="both"/>
@@ -4740,7 +4834,7 @@
                     </w:p>
                     <w:p>
                       <w:pPr>
-                        <w:pStyle w:val="af6"/>
+                        <w:pStyle w:val="NormalWeb"/>
                         <w:shd w:val="clear" w:color="auto" w:fill="FFFFFF"/>
                         <w:spacing w:before="0" w:beforeAutospacing="0" w:after="0" w:afterAutospacing="0"/>
                         <w:rPr>
@@ -4842,7 +4936,7 @@
     </w:p>
     <w:p>
       <w:pPr>
-        <w:pStyle w:val="1"/>
+        <w:pStyle w:val="Heading1"/>
       </w:pPr>
       <w:r>
         <w:lastRenderedPageBreak/>
@@ -4851,7 +4945,7 @@
     </w:p>
     <w:p>
       <w:pPr>
-        <w:pStyle w:val="a"/>
+        <w:pStyle w:val="ListBullet"/>
         <w:rPr>
           <w:rFonts w:ascii="Times New Roman" w:hAnsi="Times New Roman" w:cs="Times New Roman"/>
           <w:sz w:val="24"/>
@@ -4869,7 +4963,7 @@
     </w:p>
     <w:p>
       <w:pPr>
-        <w:pStyle w:val="a"/>
+        <w:pStyle w:val="ListBullet"/>
         <w:rPr>
           <w:rFonts w:ascii="Times New Roman" w:hAnsi="Times New Roman" w:cs="Times New Roman"/>
           <w:sz w:val="24"/>
@@ -4884,12 +4978,32 @@
           <w:szCs w:val="24"/>
           <w:lang w:val="es-ES"/>
         </w:rPr>
-        <w:t>A complete ER/EER diagram.</w:t>
+        <w:t xml:space="preserve">A complete ER/EER </w:t>
+      </w:r>
+      <w:proofErr w:type="spellStart"/>
+      <w:r>
+        <w:rPr>
+          <w:rFonts w:ascii="Times New Roman" w:hAnsi="Times New Roman" w:cs="Times New Roman"/>
+          <w:sz w:val="24"/>
+          <w:szCs w:val="24"/>
+          <w:lang w:val="es-ES"/>
+        </w:rPr>
+        <w:t>diagram</w:t>
+      </w:r>
+      <w:proofErr w:type="spellEnd"/>
+      <w:r>
+        <w:rPr>
+          <w:rFonts w:ascii="Times New Roman" w:hAnsi="Times New Roman" w:cs="Times New Roman"/>
+          <w:sz w:val="24"/>
+          <w:szCs w:val="24"/>
+          <w:lang w:val="es-ES"/>
+        </w:rPr>
+        <w:t>.</w:t>
       </w:r>
     </w:p>
     <w:p>
       <w:pPr>
-        <w:pStyle w:val="a"/>
+        <w:pStyle w:val="ListBullet"/>
         <w:rPr>
           <w:rFonts w:ascii="Times New Roman" w:hAnsi="Times New Roman" w:cs="Times New Roman"/>
           <w:sz w:val="24"/>
@@ -4907,7 +5021,7 @@
     </w:p>
     <w:p>
       <w:pPr>
-        <w:pStyle w:val="a"/>
+        <w:pStyle w:val="ListBullet"/>
         <w:rPr>
           <w:rFonts w:ascii="Times New Roman" w:hAnsi="Times New Roman" w:cs="Times New Roman"/>
           <w:sz w:val="24"/>
@@ -4925,7 +5039,7 @@
     </w:p>
     <w:p>
       <w:pPr>
-        <w:pStyle w:val="a"/>
+        <w:pStyle w:val="ListBullet"/>
         <w:rPr>
           <w:rFonts w:ascii="Times New Roman" w:hAnsi="Times New Roman" w:cs="Times New Roman"/>
           <w:sz w:val="24"/>
@@ -4943,7 +5057,7 @@
     </w:p>
     <w:p>
       <w:pPr>
-        <w:pStyle w:val="a"/>
+        <w:pStyle w:val="ListBullet"/>
         <w:rPr>
           <w:rFonts w:ascii="Times New Roman" w:hAnsi="Times New Roman" w:cs="Times New Roman"/>
           <w:sz w:val="24"/>
@@ -4961,7 +5075,7 @@
     </w:p>
     <w:p>
       <w:pPr>
-        <w:pStyle w:val="a"/>
+        <w:pStyle w:val="ListBullet"/>
         <w:numPr>
           <w:ilvl w:val="0"/>
           <w:numId w:val="0"/>
@@ -4976,7 +5090,7 @@
     </w:p>
     <w:p>
       <w:pPr>
-        <w:pStyle w:val="a"/>
+        <w:pStyle w:val="ListBullet"/>
         <w:numPr>
           <w:ilvl w:val="0"/>
           <w:numId w:val="0"/>
@@ -4991,7 +5105,7 @@
     </w:p>
     <w:p>
       <w:pPr>
-        <w:pStyle w:val="a"/>
+        <w:pStyle w:val="ListBullet"/>
         <w:numPr>
           <w:ilvl w:val="0"/>
           <w:numId w:val="30"/>
@@ -5019,7 +5133,7 @@
     </w:p>
     <w:p>
       <w:pPr>
-        <w:pStyle w:val="a"/>
+        <w:pStyle w:val="ListBullet"/>
         <w:numPr>
           <w:ilvl w:val="0"/>
           <w:numId w:val="0"/>
@@ -5037,7 +5151,7 @@
     </w:p>
     <w:p>
       <w:pPr>
-        <w:pStyle w:val="a"/>
+        <w:pStyle w:val="ListBullet"/>
         <w:numPr>
           <w:ilvl w:val="0"/>
           <w:numId w:val="28"/>
@@ -5061,7 +5175,7 @@
     </w:p>
     <w:p>
       <w:pPr>
-        <w:pStyle w:val="a"/>
+        <w:pStyle w:val="ListBullet"/>
         <w:numPr>
           <w:ilvl w:val="0"/>
           <w:numId w:val="28"/>
@@ -5085,7 +5199,7 @@
     </w:p>
     <w:p>
       <w:pPr>
-        <w:pStyle w:val="a"/>
+        <w:pStyle w:val="ListBullet"/>
         <w:numPr>
           <w:ilvl w:val="0"/>
           <w:numId w:val="29"/>
@@ -5097,6 +5211,7 @@
           <w:szCs w:val="24"/>
         </w:rPr>
       </w:pPr>
+      <w:proofErr w:type="spellStart"/>
       <w:r>
         <w:rPr>
           <w:rFonts w:ascii="Times New Roman" w:hAnsi="Times New Roman" w:cs="Times New Roman"/>
@@ -5106,10 +5221,11 @@
         </w:rPr>
         <w:t>GeneralPractitioner</w:t>
       </w:r>
+      <w:proofErr w:type="spellEnd"/>
     </w:p>
     <w:p>
       <w:pPr>
-        <w:pStyle w:val="a"/>
+        <w:pStyle w:val="ListBullet"/>
         <w:numPr>
           <w:ilvl w:val="0"/>
           <w:numId w:val="29"/>
@@ -5133,7 +5249,7 @@
     </w:p>
     <w:p>
       <w:pPr>
-        <w:pStyle w:val="a"/>
+        <w:pStyle w:val="ListBullet"/>
         <w:numPr>
           <w:ilvl w:val="0"/>
           <w:numId w:val="28"/>
@@ -5157,7 +5273,7 @@
     </w:p>
     <w:p>
       <w:pPr>
-        <w:pStyle w:val="a"/>
+        <w:pStyle w:val="ListBullet"/>
         <w:numPr>
           <w:ilvl w:val="0"/>
           <w:numId w:val="28"/>
@@ -5181,7 +5297,7 @@
     </w:p>
     <w:p>
       <w:pPr>
-        <w:pStyle w:val="a"/>
+        <w:pStyle w:val="ListBullet"/>
         <w:numPr>
           <w:ilvl w:val="0"/>
           <w:numId w:val="28"/>
@@ -5205,7 +5321,7 @@
     </w:p>
     <w:p>
       <w:pPr>
-        <w:pStyle w:val="a"/>
+        <w:pStyle w:val="ListBullet"/>
         <w:numPr>
           <w:ilvl w:val="0"/>
           <w:numId w:val="28"/>
@@ -5229,7 +5345,7 @@
     </w:p>
     <w:p>
       <w:pPr>
-        <w:pStyle w:val="a"/>
+        <w:pStyle w:val="ListBullet"/>
         <w:numPr>
           <w:ilvl w:val="0"/>
           <w:numId w:val="0"/>
@@ -5244,7 +5360,7 @@
     </w:p>
     <w:p>
       <w:pPr>
-        <w:pStyle w:val="a"/>
+        <w:pStyle w:val="ListBullet"/>
         <w:numPr>
           <w:ilvl w:val="0"/>
           <w:numId w:val="0"/>
@@ -5259,7 +5375,7 @@
     </w:p>
     <w:p>
       <w:pPr>
-        <w:pStyle w:val="a"/>
+        <w:pStyle w:val="ListBullet"/>
         <w:numPr>
           <w:ilvl w:val="0"/>
           <w:numId w:val="0"/>
@@ -5274,7 +5390,7 @@
     </w:p>
     <w:p>
       <w:pPr>
-        <w:pStyle w:val="a"/>
+        <w:pStyle w:val="ListBullet"/>
         <w:numPr>
           <w:ilvl w:val="0"/>
           <w:numId w:val="30"/>
@@ -5302,7 +5418,7 @@
     </w:p>
     <w:p>
       <w:pPr>
-        <w:pStyle w:val="a"/>
+        <w:pStyle w:val="ListBullet"/>
         <w:numPr>
           <w:ilvl w:val="0"/>
           <w:numId w:val="0"/>
@@ -5318,7 +5434,7 @@
     </w:p>
     <w:p>
       <w:pPr>
-        <w:pStyle w:val="a"/>
+        <w:pStyle w:val="ListBullet"/>
         <w:numPr>
           <w:ilvl w:val="0"/>
           <w:numId w:val="0"/>
@@ -5343,7 +5459,7 @@
     </w:p>
     <w:p>
       <w:pPr>
-        <w:pStyle w:val="a"/>
+        <w:pStyle w:val="ListBullet"/>
         <w:numPr>
           <w:ilvl w:val="0"/>
           <w:numId w:val="32"/>
@@ -5357,6 +5473,7 @@
           <w:szCs w:val="24"/>
         </w:rPr>
       </w:pPr>
+      <w:proofErr w:type="spellStart"/>
       <w:r>
         <w:rPr>
           <w:rFonts w:ascii="Times New Roman" w:hAnsi="Times New Roman" w:cs="Times New Roman"/>
@@ -5368,10 +5485,11 @@
         </w:rPr>
         <w:t>GeneralPractitioner</w:t>
       </w:r>
+      <w:proofErr w:type="spellEnd"/>
     </w:p>
     <w:p>
       <w:pPr>
-        <w:pStyle w:val="a"/>
+        <w:pStyle w:val="ListBullet"/>
         <w:numPr>
           <w:ilvl w:val="0"/>
           <w:numId w:val="32"/>
@@ -5399,7 +5517,7 @@
     </w:p>
     <w:p>
       <w:pPr>
-        <w:pStyle w:val="1"/>
+        <w:pStyle w:val="Heading1"/>
       </w:pPr>
       <w:r>
         <w:lastRenderedPageBreak/>
@@ -5408,7 +5526,7 @@
     </w:p>
     <w:p>
       <w:pPr>
-        <w:pStyle w:val="a"/>
+        <w:pStyle w:val="ListBullet"/>
         <w:numPr>
           <w:ilvl w:val="0"/>
           <w:numId w:val="0"/>
@@ -5432,7 +5550,7 @@
     </w:p>
     <w:p>
       <w:pPr>
-        <w:pStyle w:val="a"/>
+        <w:pStyle w:val="ListBullet"/>
         <w:rPr>
           <w:rFonts w:ascii="Times New Roman" w:hAnsi="Times New Roman" w:cs="Times New Roman"/>
           <w:color w:val="auto"/>
@@ -5452,7 +5570,7 @@
     </w:p>
     <w:p>
       <w:pPr>
-        <w:pStyle w:val="a"/>
+        <w:pStyle w:val="ListBullet"/>
         <w:rPr>
           <w:rFonts w:ascii="Times New Roman" w:hAnsi="Times New Roman" w:cs="Times New Roman"/>
           <w:color w:val="auto"/>
@@ -5472,7 +5590,7 @@
     </w:p>
     <w:p>
       <w:pPr>
-        <w:pStyle w:val="a"/>
+        <w:pStyle w:val="ListBullet"/>
         <w:rPr>
           <w:rFonts w:ascii="Times New Roman" w:hAnsi="Times New Roman" w:cs="Times New Roman"/>
           <w:color w:val="auto"/>
@@ -5489,10 +5607,1083 @@
         </w:rPr>
         <w:t>Insert at least 5 records into each main table.</w:t>
       </w:r>
+    </w:p>
+    <w:tbl>
+      <w:tblPr>
+        <w:tblW w:w="0" w:type="auto"/>
+        <w:tblCellMar>
+          <w:top w:w="15" w:type="dxa"/>
+          <w:left w:w="15" w:type="dxa"/>
+          <w:bottom w:w="15" w:type="dxa"/>
+          <w:right w:w="15" w:type="dxa"/>
+        </w:tblCellMar>
+        <w:tblLook w:val="04A0" w:firstRow="1" w:lastRow="0" w:firstColumn="1" w:lastColumn="0" w:noHBand="0" w:noVBand="1"/>
+      </w:tblPr>
+      <w:tblGrid>
+        <w:gridCol w:w="2642"/>
+        <w:gridCol w:w="5762"/>
+      </w:tblGrid>
+      <w:tr>
+        <w:tc>
+          <w:tcPr>
+            <w:tcW w:w="0" w:type="auto"/>
+            <w:tcBorders>
+              <w:top w:val="single" w:sz="8" w:space="0" w:color="000000"/>
+              <w:left w:val="single" w:sz="8" w:space="0" w:color="000000"/>
+              <w:bottom w:val="single" w:sz="8" w:space="0" w:color="000000"/>
+              <w:right w:val="single" w:sz="8" w:space="0" w:color="000000"/>
+            </w:tcBorders>
+            <w:tcMar>
+              <w:top w:w="100" w:type="dxa"/>
+              <w:left w:w="100" w:type="dxa"/>
+              <w:bottom w:w="100" w:type="dxa"/>
+              <w:right w:w="100" w:type="dxa"/>
+            </w:tcMar>
+            <w:hideMark/>
+          </w:tcPr>
+          <w:p>
+            <w:pPr>
+              <w:pStyle w:val="ListBullet"/>
+              <w:rPr>
+                <w:rFonts w:ascii="Times New Roman" w:hAnsi="Times New Roman" w:cs="Times New Roman"/>
+                <w:color w:val="auto"/>
+                <w:sz w:val="24"/>
+                <w:szCs w:val="24"/>
+              </w:rPr>
+            </w:pPr>
+            <w:r>
+              <w:rPr>
+                <w:rFonts w:ascii="Times New Roman" w:hAnsi="Times New Roman" w:cs="Times New Roman"/>
+                <w:b/>
+                <w:bCs/>
+                <w:color w:val="auto"/>
+                <w:sz w:val="24"/>
+                <w:szCs w:val="24"/>
+              </w:rPr>
+              <w:t>Entity </w:t>
+            </w:r>
+          </w:p>
+        </w:tc>
+        <w:tc>
+          <w:tcPr>
+            <w:tcW w:w="0" w:type="auto"/>
+            <w:tcBorders>
+              <w:top w:val="single" w:sz="8" w:space="0" w:color="000000"/>
+              <w:left w:val="single" w:sz="8" w:space="0" w:color="000000"/>
+              <w:bottom w:val="single" w:sz="8" w:space="0" w:color="000000"/>
+              <w:right w:val="single" w:sz="8" w:space="0" w:color="000000"/>
+            </w:tcBorders>
+            <w:tcMar>
+              <w:top w:w="100" w:type="dxa"/>
+              <w:left w:w="100" w:type="dxa"/>
+              <w:bottom w:w="100" w:type="dxa"/>
+              <w:right w:w="100" w:type="dxa"/>
+            </w:tcMar>
+            <w:hideMark/>
+          </w:tcPr>
+          <w:p>
+            <w:pPr>
+              <w:pStyle w:val="ListBullet"/>
+              <w:rPr>
+                <w:rFonts w:ascii="Times New Roman" w:hAnsi="Times New Roman" w:cs="Times New Roman"/>
+                <w:color w:val="auto"/>
+                <w:sz w:val="24"/>
+                <w:szCs w:val="24"/>
+              </w:rPr>
+            </w:pPr>
+            <w:r>
+              <w:rPr>
+                <w:rFonts w:ascii="Times New Roman" w:hAnsi="Times New Roman" w:cs="Times New Roman"/>
+                <w:b/>
+                <w:bCs/>
+                <w:color w:val="auto"/>
+                <w:sz w:val="24"/>
+                <w:szCs w:val="24"/>
+              </w:rPr>
+              <w:t>Attributes (Primary and foreign keys)</w:t>
+            </w:r>
+          </w:p>
+        </w:tc>
+      </w:tr>
+      <w:tr>
+        <w:tc>
+          <w:tcPr>
+            <w:tcW w:w="0" w:type="auto"/>
+            <w:tcBorders>
+              <w:top w:val="single" w:sz="8" w:space="0" w:color="000000"/>
+              <w:left w:val="single" w:sz="8" w:space="0" w:color="000000"/>
+              <w:bottom w:val="single" w:sz="8" w:space="0" w:color="000000"/>
+              <w:right w:val="single" w:sz="8" w:space="0" w:color="000000"/>
+            </w:tcBorders>
+            <w:tcMar>
+              <w:top w:w="100" w:type="dxa"/>
+              <w:left w:w="100" w:type="dxa"/>
+              <w:bottom w:w="100" w:type="dxa"/>
+              <w:right w:w="100" w:type="dxa"/>
+            </w:tcMar>
+            <w:hideMark/>
+          </w:tcPr>
+          <w:p>
+            <w:pPr>
+              <w:pStyle w:val="ListBullet"/>
+              <w:rPr>
+                <w:rFonts w:ascii="Times New Roman" w:hAnsi="Times New Roman" w:cs="Times New Roman"/>
+                <w:color w:val="auto"/>
+                <w:sz w:val="24"/>
+                <w:szCs w:val="24"/>
+              </w:rPr>
+            </w:pPr>
+            <w:r>
+              <w:rPr>
+                <w:rFonts w:ascii="Times New Roman" w:hAnsi="Times New Roman" w:cs="Times New Roman"/>
+                <w:color w:val="auto"/>
+                <w:sz w:val="24"/>
+                <w:szCs w:val="24"/>
+              </w:rPr>
+              <w:t>Patient</w:t>
+            </w:r>
+          </w:p>
+        </w:tc>
+        <w:tc>
+          <w:tcPr>
+            <w:tcW w:w="0" w:type="auto"/>
+            <w:tcBorders>
+              <w:top w:val="single" w:sz="8" w:space="0" w:color="000000"/>
+              <w:left w:val="single" w:sz="8" w:space="0" w:color="000000"/>
+              <w:bottom w:val="single" w:sz="8" w:space="0" w:color="000000"/>
+              <w:right w:val="single" w:sz="8" w:space="0" w:color="000000"/>
+            </w:tcBorders>
+            <w:tcMar>
+              <w:top w:w="100" w:type="dxa"/>
+              <w:left w:w="100" w:type="dxa"/>
+              <w:bottom w:w="100" w:type="dxa"/>
+              <w:right w:w="100" w:type="dxa"/>
+            </w:tcMar>
+            <w:hideMark/>
+          </w:tcPr>
+          <w:p>
+            <w:pPr>
+              <w:pStyle w:val="ListBullet"/>
+              <w:rPr>
+                <w:rFonts w:ascii="Times New Roman" w:hAnsi="Times New Roman" w:cs="Times New Roman"/>
+                <w:color w:val="auto"/>
+                <w:sz w:val="24"/>
+                <w:szCs w:val="24"/>
+              </w:rPr>
+            </w:pPr>
+            <w:proofErr w:type="spellStart"/>
+            <w:r>
+              <w:rPr>
+                <w:rFonts w:ascii="Times New Roman" w:hAnsi="Times New Roman" w:cs="Times New Roman"/>
+                <w:color w:val="auto"/>
+                <w:sz w:val="24"/>
+                <w:szCs w:val="24"/>
+              </w:rPr>
+              <w:t>PatientID</w:t>
+            </w:r>
+            <w:proofErr w:type="spellEnd"/>
+            <w:r>
+              <w:rPr>
+                <w:rFonts w:ascii="Times New Roman" w:hAnsi="Times New Roman" w:cs="Times New Roman"/>
+                <w:color w:val="auto"/>
+                <w:sz w:val="24"/>
+                <w:szCs w:val="24"/>
+              </w:rPr>
+              <w:t xml:space="preserve"> (PK), FirstName, LastName, Gender, Phone</w:t>
+            </w:r>
+          </w:p>
+        </w:tc>
+      </w:tr>
+      <w:tr>
+        <w:tc>
+          <w:tcPr>
+            <w:tcW w:w="0" w:type="auto"/>
+            <w:tcBorders>
+              <w:top w:val="single" w:sz="8" w:space="0" w:color="000000"/>
+              <w:left w:val="single" w:sz="8" w:space="0" w:color="000000"/>
+              <w:bottom w:val="single" w:sz="8" w:space="0" w:color="000000"/>
+              <w:right w:val="single" w:sz="8" w:space="0" w:color="000000"/>
+            </w:tcBorders>
+            <w:tcMar>
+              <w:top w:w="100" w:type="dxa"/>
+              <w:left w:w="100" w:type="dxa"/>
+              <w:bottom w:w="100" w:type="dxa"/>
+              <w:right w:w="100" w:type="dxa"/>
+            </w:tcMar>
+            <w:hideMark/>
+          </w:tcPr>
+          <w:p>
+            <w:pPr>
+              <w:pStyle w:val="ListBullet"/>
+              <w:rPr>
+                <w:rFonts w:ascii="Times New Roman" w:hAnsi="Times New Roman" w:cs="Times New Roman"/>
+                <w:color w:val="auto"/>
+                <w:sz w:val="24"/>
+                <w:szCs w:val="24"/>
+              </w:rPr>
+            </w:pPr>
+            <w:r>
+              <w:rPr>
+                <w:rFonts w:ascii="Times New Roman" w:hAnsi="Times New Roman" w:cs="Times New Roman"/>
+                <w:color w:val="auto"/>
+                <w:sz w:val="24"/>
+                <w:szCs w:val="24"/>
+              </w:rPr>
+              <w:t>Department</w:t>
+            </w:r>
+          </w:p>
+        </w:tc>
+        <w:tc>
+          <w:tcPr>
+            <w:tcW w:w="0" w:type="auto"/>
+            <w:tcBorders>
+              <w:top w:val="single" w:sz="8" w:space="0" w:color="000000"/>
+              <w:left w:val="single" w:sz="8" w:space="0" w:color="000000"/>
+              <w:bottom w:val="single" w:sz="8" w:space="0" w:color="000000"/>
+              <w:right w:val="single" w:sz="8" w:space="0" w:color="000000"/>
+            </w:tcBorders>
+            <w:tcMar>
+              <w:top w:w="100" w:type="dxa"/>
+              <w:left w:w="100" w:type="dxa"/>
+              <w:bottom w:w="100" w:type="dxa"/>
+              <w:right w:w="100" w:type="dxa"/>
+            </w:tcMar>
+            <w:hideMark/>
+          </w:tcPr>
+          <w:p>
+            <w:pPr>
+              <w:pStyle w:val="ListBullet"/>
+              <w:rPr>
+                <w:rFonts w:ascii="Times New Roman" w:hAnsi="Times New Roman" w:cs="Times New Roman"/>
+                <w:color w:val="auto"/>
+                <w:sz w:val="24"/>
+                <w:szCs w:val="24"/>
+              </w:rPr>
+            </w:pPr>
+            <w:proofErr w:type="spellStart"/>
+            <w:r>
+              <w:rPr>
+                <w:rFonts w:ascii="Times New Roman" w:hAnsi="Times New Roman" w:cs="Times New Roman"/>
+                <w:color w:val="auto"/>
+                <w:sz w:val="24"/>
+                <w:szCs w:val="24"/>
+              </w:rPr>
+              <w:t>DepartmentID</w:t>
+            </w:r>
+            <w:proofErr w:type="spellEnd"/>
+            <w:r>
+              <w:rPr>
+                <w:rFonts w:ascii="Times New Roman" w:hAnsi="Times New Roman" w:cs="Times New Roman"/>
+                <w:color w:val="auto"/>
+                <w:sz w:val="24"/>
+                <w:szCs w:val="24"/>
+              </w:rPr>
+              <w:t xml:space="preserve"> (PK), </w:t>
+            </w:r>
+            <w:proofErr w:type="spellStart"/>
+            <w:r>
+              <w:rPr>
+                <w:rFonts w:ascii="Times New Roman" w:hAnsi="Times New Roman" w:cs="Times New Roman"/>
+                <w:color w:val="auto"/>
+                <w:sz w:val="24"/>
+                <w:szCs w:val="24"/>
+              </w:rPr>
+              <w:t>DepartmentName</w:t>
+            </w:r>
+            <w:proofErr w:type="spellEnd"/>
+          </w:p>
+        </w:tc>
+      </w:tr>
+      <w:tr>
+        <w:tc>
+          <w:tcPr>
+            <w:tcW w:w="0" w:type="auto"/>
+            <w:tcBorders>
+              <w:top w:val="single" w:sz="8" w:space="0" w:color="000000"/>
+              <w:left w:val="single" w:sz="8" w:space="0" w:color="000000"/>
+              <w:bottom w:val="single" w:sz="8" w:space="0" w:color="000000"/>
+              <w:right w:val="single" w:sz="8" w:space="0" w:color="000000"/>
+            </w:tcBorders>
+            <w:tcMar>
+              <w:top w:w="100" w:type="dxa"/>
+              <w:left w:w="100" w:type="dxa"/>
+              <w:bottom w:w="100" w:type="dxa"/>
+              <w:right w:w="100" w:type="dxa"/>
+            </w:tcMar>
+            <w:hideMark/>
+          </w:tcPr>
+          <w:p>
+            <w:pPr>
+              <w:pStyle w:val="ListBullet"/>
+              <w:rPr>
+                <w:rFonts w:ascii="Times New Roman" w:hAnsi="Times New Roman" w:cs="Times New Roman"/>
+                <w:color w:val="auto"/>
+                <w:sz w:val="24"/>
+                <w:szCs w:val="24"/>
+              </w:rPr>
+            </w:pPr>
+            <w:r>
+              <w:rPr>
+                <w:rFonts w:ascii="Times New Roman" w:hAnsi="Times New Roman" w:cs="Times New Roman"/>
+                <w:color w:val="auto"/>
+                <w:sz w:val="24"/>
+                <w:szCs w:val="24"/>
+              </w:rPr>
+              <w:t>Doctor</w:t>
+            </w:r>
+          </w:p>
+        </w:tc>
+        <w:tc>
+          <w:tcPr>
+            <w:tcW w:w="0" w:type="auto"/>
+            <w:tcBorders>
+              <w:top w:val="single" w:sz="8" w:space="0" w:color="000000"/>
+              <w:left w:val="single" w:sz="8" w:space="0" w:color="000000"/>
+              <w:bottom w:val="single" w:sz="8" w:space="0" w:color="000000"/>
+              <w:right w:val="single" w:sz="8" w:space="0" w:color="000000"/>
+            </w:tcBorders>
+            <w:tcMar>
+              <w:top w:w="100" w:type="dxa"/>
+              <w:left w:w="100" w:type="dxa"/>
+              <w:bottom w:w="100" w:type="dxa"/>
+              <w:right w:w="100" w:type="dxa"/>
+            </w:tcMar>
+            <w:hideMark/>
+          </w:tcPr>
+          <w:p>
+            <w:pPr>
+              <w:pStyle w:val="ListBullet"/>
+              <w:rPr>
+                <w:rFonts w:ascii="Times New Roman" w:hAnsi="Times New Roman" w:cs="Times New Roman"/>
+                <w:color w:val="auto"/>
+                <w:sz w:val="24"/>
+                <w:szCs w:val="24"/>
+              </w:rPr>
+            </w:pPr>
+            <w:proofErr w:type="spellStart"/>
+            <w:r>
+              <w:rPr>
+                <w:rFonts w:ascii="Times New Roman" w:hAnsi="Times New Roman" w:cs="Times New Roman"/>
+                <w:color w:val="auto"/>
+                <w:sz w:val="24"/>
+                <w:szCs w:val="24"/>
+              </w:rPr>
+              <w:t>DoctorID</w:t>
+            </w:r>
+            <w:proofErr w:type="spellEnd"/>
+            <w:r>
+              <w:rPr>
+                <w:rFonts w:ascii="Times New Roman" w:hAnsi="Times New Roman" w:cs="Times New Roman"/>
+                <w:color w:val="auto"/>
+                <w:sz w:val="24"/>
+                <w:szCs w:val="24"/>
+              </w:rPr>
+              <w:t xml:space="preserve"> (PK), FirstName, LastName, Phone, </w:t>
+            </w:r>
+            <w:proofErr w:type="spellStart"/>
+            <w:r>
+              <w:rPr>
+                <w:rFonts w:ascii="Times New Roman" w:hAnsi="Times New Roman" w:cs="Times New Roman"/>
+                <w:color w:val="auto"/>
+                <w:sz w:val="24"/>
+                <w:szCs w:val="24"/>
+              </w:rPr>
+              <w:t>DepartmentID</w:t>
+            </w:r>
+            <w:proofErr w:type="spellEnd"/>
+            <w:r>
+              <w:rPr>
+                <w:rFonts w:ascii="Times New Roman" w:hAnsi="Times New Roman" w:cs="Times New Roman"/>
+                <w:color w:val="auto"/>
+                <w:sz w:val="24"/>
+                <w:szCs w:val="24"/>
+              </w:rPr>
+              <w:t xml:space="preserve"> (FK)</w:t>
+            </w:r>
+          </w:p>
+        </w:tc>
+      </w:tr>
+      <w:tr>
+        <w:tc>
+          <w:tcPr>
+            <w:tcW w:w="0" w:type="auto"/>
+            <w:tcBorders>
+              <w:top w:val="single" w:sz="8" w:space="0" w:color="000000"/>
+              <w:left w:val="single" w:sz="8" w:space="0" w:color="000000"/>
+              <w:bottom w:val="single" w:sz="8" w:space="0" w:color="000000"/>
+              <w:right w:val="single" w:sz="8" w:space="0" w:color="000000"/>
+            </w:tcBorders>
+            <w:tcMar>
+              <w:top w:w="100" w:type="dxa"/>
+              <w:left w:w="100" w:type="dxa"/>
+              <w:bottom w:w="100" w:type="dxa"/>
+              <w:right w:w="100" w:type="dxa"/>
+            </w:tcMar>
+            <w:hideMark/>
+          </w:tcPr>
+          <w:p>
+            <w:pPr>
+              <w:pStyle w:val="ListBullet"/>
+              <w:rPr>
+                <w:rFonts w:ascii="Times New Roman" w:hAnsi="Times New Roman" w:cs="Times New Roman"/>
+                <w:color w:val="auto"/>
+                <w:sz w:val="24"/>
+                <w:szCs w:val="24"/>
+              </w:rPr>
+            </w:pPr>
+            <w:proofErr w:type="spellStart"/>
+            <w:r>
+              <w:rPr>
+                <w:rFonts w:ascii="Times New Roman" w:hAnsi="Times New Roman" w:cs="Times New Roman"/>
+                <w:color w:val="auto"/>
+                <w:sz w:val="24"/>
+                <w:szCs w:val="24"/>
+              </w:rPr>
+              <w:t>GenetalPractitioner</w:t>
+            </w:r>
+            <w:proofErr w:type="spellEnd"/>
+          </w:p>
+        </w:tc>
+        <w:tc>
+          <w:tcPr>
+            <w:tcW w:w="0" w:type="auto"/>
+            <w:tcBorders>
+              <w:top w:val="single" w:sz="8" w:space="0" w:color="000000"/>
+              <w:left w:val="single" w:sz="8" w:space="0" w:color="000000"/>
+              <w:bottom w:val="single" w:sz="8" w:space="0" w:color="000000"/>
+              <w:right w:val="single" w:sz="8" w:space="0" w:color="000000"/>
+            </w:tcBorders>
+            <w:tcMar>
+              <w:top w:w="100" w:type="dxa"/>
+              <w:left w:w="100" w:type="dxa"/>
+              <w:bottom w:w="100" w:type="dxa"/>
+              <w:right w:w="100" w:type="dxa"/>
+            </w:tcMar>
+            <w:hideMark/>
+          </w:tcPr>
+          <w:p>
+            <w:pPr>
+              <w:pStyle w:val="ListBullet"/>
+              <w:rPr>
+                <w:rFonts w:ascii="Times New Roman" w:hAnsi="Times New Roman" w:cs="Times New Roman"/>
+                <w:color w:val="auto"/>
+                <w:sz w:val="24"/>
+                <w:szCs w:val="24"/>
+              </w:rPr>
+            </w:pPr>
+            <w:proofErr w:type="spellStart"/>
+            <w:proofErr w:type="gramStart"/>
+            <w:r>
+              <w:rPr>
+                <w:rFonts w:ascii="Times New Roman" w:hAnsi="Times New Roman" w:cs="Times New Roman"/>
+                <w:color w:val="auto"/>
+                <w:sz w:val="24"/>
+                <w:szCs w:val="24"/>
+              </w:rPr>
+              <w:t>DoctorID</w:t>
+            </w:r>
+            <w:proofErr w:type="spellEnd"/>
+            <w:r>
+              <w:rPr>
+                <w:rFonts w:ascii="Times New Roman" w:hAnsi="Times New Roman" w:cs="Times New Roman"/>
+                <w:color w:val="auto"/>
+                <w:sz w:val="24"/>
+                <w:szCs w:val="24"/>
+              </w:rPr>
+              <w:t>(</w:t>
+            </w:r>
+            <w:proofErr w:type="gramEnd"/>
+            <w:r>
+              <w:rPr>
+                <w:rFonts w:ascii="Times New Roman" w:hAnsi="Times New Roman" w:cs="Times New Roman"/>
+                <w:color w:val="auto"/>
+                <w:sz w:val="24"/>
+                <w:szCs w:val="24"/>
+              </w:rPr>
+              <w:t>PK, FK)</w:t>
+            </w:r>
+          </w:p>
+        </w:tc>
+      </w:tr>
+      <w:tr>
+        <w:tc>
+          <w:tcPr>
+            <w:tcW w:w="0" w:type="auto"/>
+            <w:tcBorders>
+              <w:top w:val="single" w:sz="8" w:space="0" w:color="000000"/>
+              <w:left w:val="single" w:sz="8" w:space="0" w:color="000000"/>
+              <w:bottom w:val="single" w:sz="8" w:space="0" w:color="000000"/>
+              <w:right w:val="single" w:sz="8" w:space="0" w:color="000000"/>
+            </w:tcBorders>
+            <w:tcMar>
+              <w:top w:w="100" w:type="dxa"/>
+              <w:left w:w="100" w:type="dxa"/>
+              <w:bottom w:w="100" w:type="dxa"/>
+              <w:right w:w="100" w:type="dxa"/>
+            </w:tcMar>
+            <w:hideMark/>
+          </w:tcPr>
+          <w:p>
+            <w:pPr>
+              <w:pStyle w:val="ListBullet"/>
+              <w:rPr>
+                <w:rFonts w:ascii="Times New Roman" w:hAnsi="Times New Roman" w:cs="Times New Roman"/>
+                <w:color w:val="auto"/>
+                <w:sz w:val="24"/>
+                <w:szCs w:val="24"/>
+              </w:rPr>
+            </w:pPr>
+            <w:r>
+              <w:rPr>
+                <w:rFonts w:ascii="Times New Roman" w:hAnsi="Times New Roman" w:cs="Times New Roman"/>
+                <w:color w:val="auto"/>
+                <w:sz w:val="24"/>
+                <w:szCs w:val="24"/>
+              </w:rPr>
+              <w:t>Specialist</w:t>
+            </w:r>
+          </w:p>
+        </w:tc>
+        <w:tc>
+          <w:tcPr>
+            <w:tcW w:w="0" w:type="auto"/>
+            <w:tcBorders>
+              <w:top w:val="single" w:sz="8" w:space="0" w:color="000000"/>
+              <w:left w:val="single" w:sz="8" w:space="0" w:color="000000"/>
+              <w:bottom w:val="single" w:sz="8" w:space="0" w:color="000000"/>
+              <w:right w:val="single" w:sz="8" w:space="0" w:color="000000"/>
+            </w:tcBorders>
+            <w:tcMar>
+              <w:top w:w="100" w:type="dxa"/>
+              <w:left w:w="100" w:type="dxa"/>
+              <w:bottom w:w="100" w:type="dxa"/>
+              <w:right w:w="100" w:type="dxa"/>
+            </w:tcMar>
+            <w:hideMark/>
+          </w:tcPr>
+          <w:p>
+            <w:pPr>
+              <w:pStyle w:val="ListBullet"/>
+              <w:rPr>
+                <w:rFonts w:ascii="Times New Roman" w:hAnsi="Times New Roman" w:cs="Times New Roman"/>
+                <w:color w:val="auto"/>
+                <w:sz w:val="24"/>
+                <w:szCs w:val="24"/>
+              </w:rPr>
+            </w:pPr>
+            <w:proofErr w:type="spellStart"/>
+            <w:proofErr w:type="gramStart"/>
+            <w:r>
+              <w:rPr>
+                <w:rFonts w:ascii="Times New Roman" w:hAnsi="Times New Roman" w:cs="Times New Roman"/>
+                <w:color w:val="auto"/>
+                <w:sz w:val="24"/>
+                <w:szCs w:val="24"/>
+              </w:rPr>
+              <w:t>DoctorID</w:t>
+            </w:r>
+            <w:proofErr w:type="spellEnd"/>
+            <w:r>
+              <w:rPr>
+                <w:rFonts w:ascii="Times New Roman" w:hAnsi="Times New Roman" w:cs="Times New Roman"/>
+                <w:color w:val="auto"/>
+                <w:sz w:val="24"/>
+                <w:szCs w:val="24"/>
+              </w:rPr>
+              <w:t>(PK,FK</w:t>
+            </w:r>
+            <w:proofErr w:type="gramEnd"/>
+            <w:r>
+              <w:rPr>
+                <w:rFonts w:ascii="Times New Roman" w:hAnsi="Times New Roman" w:cs="Times New Roman"/>
+                <w:color w:val="auto"/>
+                <w:sz w:val="24"/>
+                <w:szCs w:val="24"/>
+              </w:rPr>
+              <w:t>), Specialty </w:t>
+            </w:r>
+          </w:p>
+        </w:tc>
+      </w:tr>
+      <w:tr>
+        <w:tc>
+          <w:tcPr>
+            <w:tcW w:w="0" w:type="auto"/>
+            <w:tcBorders>
+              <w:top w:val="single" w:sz="8" w:space="0" w:color="000000"/>
+              <w:left w:val="single" w:sz="8" w:space="0" w:color="000000"/>
+              <w:bottom w:val="single" w:sz="8" w:space="0" w:color="000000"/>
+              <w:right w:val="single" w:sz="8" w:space="0" w:color="000000"/>
+            </w:tcBorders>
+            <w:tcMar>
+              <w:top w:w="100" w:type="dxa"/>
+              <w:left w:w="100" w:type="dxa"/>
+              <w:bottom w:w="100" w:type="dxa"/>
+              <w:right w:w="100" w:type="dxa"/>
+            </w:tcMar>
+            <w:hideMark/>
+          </w:tcPr>
+          <w:p>
+            <w:pPr>
+              <w:pStyle w:val="ListBullet"/>
+              <w:rPr>
+                <w:rFonts w:ascii="Times New Roman" w:hAnsi="Times New Roman" w:cs="Times New Roman"/>
+                <w:color w:val="auto"/>
+                <w:sz w:val="24"/>
+                <w:szCs w:val="24"/>
+              </w:rPr>
+            </w:pPr>
+            <w:r>
+              <w:rPr>
+                <w:rFonts w:ascii="Times New Roman" w:hAnsi="Times New Roman" w:cs="Times New Roman"/>
+                <w:color w:val="auto"/>
+                <w:sz w:val="24"/>
+                <w:szCs w:val="24"/>
+              </w:rPr>
+              <w:t>Appointment</w:t>
+            </w:r>
+          </w:p>
+        </w:tc>
+        <w:tc>
+          <w:tcPr>
+            <w:tcW w:w="0" w:type="auto"/>
+            <w:tcBorders>
+              <w:top w:val="single" w:sz="8" w:space="0" w:color="000000"/>
+              <w:left w:val="single" w:sz="8" w:space="0" w:color="000000"/>
+              <w:bottom w:val="single" w:sz="8" w:space="0" w:color="000000"/>
+              <w:right w:val="single" w:sz="8" w:space="0" w:color="000000"/>
+            </w:tcBorders>
+            <w:tcMar>
+              <w:top w:w="100" w:type="dxa"/>
+              <w:left w:w="100" w:type="dxa"/>
+              <w:bottom w:w="100" w:type="dxa"/>
+              <w:right w:w="100" w:type="dxa"/>
+            </w:tcMar>
+            <w:hideMark/>
+          </w:tcPr>
+          <w:p>
+            <w:pPr>
+              <w:pStyle w:val="ListBullet"/>
+              <w:rPr>
+                <w:rFonts w:ascii="Times New Roman" w:hAnsi="Times New Roman" w:cs="Times New Roman"/>
+                <w:color w:val="auto"/>
+                <w:sz w:val="24"/>
+                <w:szCs w:val="24"/>
+              </w:rPr>
+            </w:pPr>
+            <w:proofErr w:type="spellStart"/>
+            <w:proofErr w:type="gramStart"/>
+            <w:r>
+              <w:rPr>
+                <w:rFonts w:ascii="Times New Roman" w:hAnsi="Times New Roman" w:cs="Times New Roman"/>
+                <w:color w:val="auto"/>
+                <w:sz w:val="24"/>
+                <w:szCs w:val="24"/>
+              </w:rPr>
+              <w:t>AppointmentID</w:t>
+            </w:r>
+            <w:proofErr w:type="spellEnd"/>
+            <w:r>
+              <w:rPr>
+                <w:rFonts w:ascii="Times New Roman" w:hAnsi="Times New Roman" w:cs="Times New Roman"/>
+                <w:color w:val="auto"/>
+                <w:sz w:val="24"/>
+                <w:szCs w:val="24"/>
+              </w:rPr>
+              <w:t>(</w:t>
+            </w:r>
+            <w:proofErr w:type="gramEnd"/>
+            <w:r>
+              <w:rPr>
+                <w:rFonts w:ascii="Times New Roman" w:hAnsi="Times New Roman" w:cs="Times New Roman"/>
+                <w:color w:val="auto"/>
+                <w:sz w:val="24"/>
+                <w:szCs w:val="24"/>
+              </w:rPr>
+              <w:t xml:space="preserve">PK), </w:t>
+            </w:r>
+            <w:proofErr w:type="spellStart"/>
+            <w:r>
+              <w:rPr>
+                <w:rFonts w:ascii="Times New Roman" w:hAnsi="Times New Roman" w:cs="Times New Roman"/>
+                <w:color w:val="auto"/>
+                <w:sz w:val="24"/>
+                <w:szCs w:val="24"/>
+              </w:rPr>
+              <w:t>AppointmentDate</w:t>
+            </w:r>
+            <w:proofErr w:type="spellEnd"/>
+            <w:r>
+              <w:rPr>
+                <w:rFonts w:ascii="Times New Roman" w:hAnsi="Times New Roman" w:cs="Times New Roman"/>
+                <w:color w:val="auto"/>
+                <w:sz w:val="24"/>
+                <w:szCs w:val="24"/>
+              </w:rPr>
+              <w:t xml:space="preserve">, Status, </w:t>
+            </w:r>
+            <w:proofErr w:type="spellStart"/>
+            <w:proofErr w:type="gramStart"/>
+            <w:r>
+              <w:rPr>
+                <w:rFonts w:ascii="Times New Roman" w:hAnsi="Times New Roman" w:cs="Times New Roman"/>
+                <w:color w:val="auto"/>
+                <w:sz w:val="24"/>
+                <w:szCs w:val="24"/>
+              </w:rPr>
+              <w:t>PatientID</w:t>
+            </w:r>
+            <w:proofErr w:type="spellEnd"/>
+            <w:r>
+              <w:rPr>
+                <w:rFonts w:ascii="Times New Roman" w:hAnsi="Times New Roman" w:cs="Times New Roman"/>
+                <w:color w:val="auto"/>
+                <w:sz w:val="24"/>
+                <w:szCs w:val="24"/>
+              </w:rPr>
+              <w:t>(</w:t>
+            </w:r>
+            <w:proofErr w:type="gramEnd"/>
+            <w:r>
+              <w:rPr>
+                <w:rFonts w:ascii="Times New Roman" w:hAnsi="Times New Roman" w:cs="Times New Roman"/>
+                <w:color w:val="auto"/>
+                <w:sz w:val="24"/>
+                <w:szCs w:val="24"/>
+              </w:rPr>
+              <w:t xml:space="preserve">FK), </w:t>
+            </w:r>
+            <w:proofErr w:type="spellStart"/>
+            <w:proofErr w:type="gramStart"/>
+            <w:r>
+              <w:rPr>
+                <w:rFonts w:ascii="Times New Roman" w:hAnsi="Times New Roman" w:cs="Times New Roman"/>
+                <w:color w:val="auto"/>
+                <w:sz w:val="24"/>
+                <w:szCs w:val="24"/>
+              </w:rPr>
+              <w:t>DoctorID</w:t>
+            </w:r>
+            <w:proofErr w:type="spellEnd"/>
+            <w:r>
+              <w:rPr>
+                <w:rFonts w:ascii="Times New Roman" w:hAnsi="Times New Roman" w:cs="Times New Roman"/>
+                <w:color w:val="auto"/>
+                <w:sz w:val="24"/>
+                <w:szCs w:val="24"/>
+              </w:rPr>
+              <w:t>(</w:t>
+            </w:r>
+            <w:proofErr w:type="gramEnd"/>
+            <w:r>
+              <w:rPr>
+                <w:rFonts w:ascii="Times New Roman" w:hAnsi="Times New Roman" w:cs="Times New Roman"/>
+                <w:color w:val="auto"/>
+                <w:sz w:val="24"/>
+                <w:szCs w:val="24"/>
+              </w:rPr>
+              <w:t>FK)</w:t>
+            </w:r>
+          </w:p>
+        </w:tc>
+      </w:tr>
+      <w:tr>
+        <w:tc>
+          <w:tcPr>
+            <w:tcW w:w="0" w:type="auto"/>
+            <w:tcBorders>
+              <w:top w:val="single" w:sz="8" w:space="0" w:color="000000"/>
+              <w:left w:val="single" w:sz="8" w:space="0" w:color="000000"/>
+              <w:bottom w:val="single" w:sz="8" w:space="0" w:color="000000"/>
+              <w:right w:val="single" w:sz="8" w:space="0" w:color="000000"/>
+            </w:tcBorders>
+            <w:tcMar>
+              <w:top w:w="100" w:type="dxa"/>
+              <w:left w:w="100" w:type="dxa"/>
+              <w:bottom w:w="100" w:type="dxa"/>
+              <w:right w:w="100" w:type="dxa"/>
+            </w:tcMar>
+            <w:hideMark/>
+          </w:tcPr>
+          <w:p>
+            <w:pPr>
+              <w:pStyle w:val="ListBullet"/>
+              <w:rPr>
+                <w:rFonts w:ascii="Times New Roman" w:hAnsi="Times New Roman" w:cs="Times New Roman"/>
+                <w:color w:val="auto"/>
+                <w:sz w:val="24"/>
+                <w:szCs w:val="24"/>
+              </w:rPr>
+            </w:pPr>
+            <w:r>
+              <w:rPr>
+                <w:rFonts w:ascii="Times New Roman" w:hAnsi="Times New Roman" w:cs="Times New Roman"/>
+                <w:color w:val="auto"/>
+                <w:sz w:val="24"/>
+                <w:szCs w:val="24"/>
+              </w:rPr>
+              <w:t>Treatment</w:t>
+            </w:r>
+          </w:p>
+        </w:tc>
+        <w:tc>
+          <w:tcPr>
+            <w:tcW w:w="0" w:type="auto"/>
+            <w:tcBorders>
+              <w:top w:val="single" w:sz="8" w:space="0" w:color="000000"/>
+              <w:left w:val="single" w:sz="8" w:space="0" w:color="000000"/>
+              <w:bottom w:val="single" w:sz="8" w:space="0" w:color="000000"/>
+              <w:right w:val="single" w:sz="8" w:space="0" w:color="000000"/>
+            </w:tcBorders>
+            <w:tcMar>
+              <w:top w:w="100" w:type="dxa"/>
+              <w:left w:w="100" w:type="dxa"/>
+              <w:bottom w:w="100" w:type="dxa"/>
+              <w:right w:w="100" w:type="dxa"/>
+            </w:tcMar>
+            <w:hideMark/>
+          </w:tcPr>
+          <w:p>
+            <w:pPr>
+              <w:pStyle w:val="ListBullet"/>
+              <w:rPr>
+                <w:rFonts w:ascii="Times New Roman" w:hAnsi="Times New Roman" w:cs="Times New Roman"/>
+                <w:color w:val="auto"/>
+                <w:sz w:val="24"/>
+                <w:szCs w:val="24"/>
+              </w:rPr>
+            </w:pPr>
+            <w:proofErr w:type="spellStart"/>
+            <w:proofErr w:type="gramStart"/>
+            <w:r>
+              <w:rPr>
+                <w:rFonts w:ascii="Times New Roman" w:hAnsi="Times New Roman" w:cs="Times New Roman"/>
+                <w:color w:val="auto"/>
+                <w:sz w:val="24"/>
+                <w:szCs w:val="24"/>
+              </w:rPr>
+              <w:t>TreatmentID</w:t>
+            </w:r>
+            <w:proofErr w:type="spellEnd"/>
+            <w:r>
+              <w:rPr>
+                <w:rFonts w:ascii="Times New Roman" w:hAnsi="Times New Roman" w:cs="Times New Roman"/>
+                <w:color w:val="auto"/>
+                <w:sz w:val="24"/>
+                <w:szCs w:val="24"/>
+              </w:rPr>
+              <w:t>(</w:t>
+            </w:r>
+            <w:proofErr w:type="gramEnd"/>
+            <w:r>
+              <w:rPr>
+                <w:rFonts w:ascii="Times New Roman" w:hAnsi="Times New Roman" w:cs="Times New Roman"/>
+                <w:color w:val="auto"/>
+                <w:sz w:val="24"/>
+                <w:szCs w:val="24"/>
+              </w:rPr>
+              <w:t xml:space="preserve">PK), Diagnosis, </w:t>
+            </w:r>
+            <w:proofErr w:type="spellStart"/>
+            <w:proofErr w:type="gramStart"/>
+            <w:r>
+              <w:rPr>
+                <w:rFonts w:ascii="Times New Roman" w:hAnsi="Times New Roman" w:cs="Times New Roman"/>
+                <w:color w:val="auto"/>
+                <w:sz w:val="24"/>
+                <w:szCs w:val="24"/>
+              </w:rPr>
+              <w:t>AppointmentID</w:t>
+            </w:r>
+            <w:proofErr w:type="spellEnd"/>
+            <w:r>
+              <w:rPr>
+                <w:rFonts w:ascii="Times New Roman" w:hAnsi="Times New Roman" w:cs="Times New Roman"/>
+                <w:color w:val="auto"/>
+                <w:sz w:val="24"/>
+                <w:szCs w:val="24"/>
+              </w:rPr>
+              <w:t>(</w:t>
+            </w:r>
+            <w:proofErr w:type="gramEnd"/>
+            <w:r>
+              <w:rPr>
+                <w:rFonts w:ascii="Times New Roman" w:hAnsi="Times New Roman" w:cs="Times New Roman"/>
+                <w:color w:val="auto"/>
+                <w:sz w:val="24"/>
+                <w:szCs w:val="24"/>
+              </w:rPr>
+              <w:t>FK)</w:t>
+            </w:r>
+          </w:p>
+        </w:tc>
+      </w:tr>
+      <w:tr>
+        <w:tc>
+          <w:tcPr>
+            <w:tcW w:w="0" w:type="auto"/>
+            <w:tcBorders>
+              <w:top w:val="single" w:sz="8" w:space="0" w:color="000000"/>
+              <w:left w:val="single" w:sz="8" w:space="0" w:color="000000"/>
+              <w:bottom w:val="single" w:sz="8" w:space="0" w:color="000000"/>
+              <w:right w:val="single" w:sz="8" w:space="0" w:color="000000"/>
+            </w:tcBorders>
+            <w:tcMar>
+              <w:top w:w="100" w:type="dxa"/>
+              <w:left w:w="100" w:type="dxa"/>
+              <w:bottom w:w="100" w:type="dxa"/>
+              <w:right w:w="100" w:type="dxa"/>
+            </w:tcMar>
+            <w:hideMark/>
+          </w:tcPr>
+          <w:p>
+            <w:pPr>
+              <w:pStyle w:val="ListBullet"/>
+              <w:rPr>
+                <w:rFonts w:ascii="Times New Roman" w:hAnsi="Times New Roman" w:cs="Times New Roman"/>
+                <w:color w:val="auto"/>
+                <w:sz w:val="24"/>
+                <w:szCs w:val="24"/>
+              </w:rPr>
+            </w:pPr>
+            <w:r>
+              <w:rPr>
+                <w:rFonts w:ascii="Times New Roman" w:hAnsi="Times New Roman" w:cs="Times New Roman"/>
+                <w:color w:val="auto"/>
+                <w:sz w:val="24"/>
+                <w:szCs w:val="24"/>
+              </w:rPr>
+              <w:t>Payment</w:t>
+            </w:r>
+          </w:p>
+        </w:tc>
+        <w:tc>
+          <w:tcPr>
+            <w:tcW w:w="0" w:type="auto"/>
+            <w:tcBorders>
+              <w:top w:val="single" w:sz="8" w:space="0" w:color="000000"/>
+              <w:left w:val="single" w:sz="8" w:space="0" w:color="000000"/>
+              <w:bottom w:val="single" w:sz="8" w:space="0" w:color="000000"/>
+              <w:right w:val="single" w:sz="8" w:space="0" w:color="000000"/>
+            </w:tcBorders>
+            <w:tcMar>
+              <w:top w:w="100" w:type="dxa"/>
+              <w:left w:w="100" w:type="dxa"/>
+              <w:bottom w:w="100" w:type="dxa"/>
+              <w:right w:w="100" w:type="dxa"/>
+            </w:tcMar>
+            <w:hideMark/>
+          </w:tcPr>
+          <w:p>
+            <w:pPr>
+              <w:pStyle w:val="ListBullet"/>
+              <w:rPr>
+                <w:rFonts w:ascii="Times New Roman" w:hAnsi="Times New Roman" w:cs="Times New Roman"/>
+                <w:color w:val="auto"/>
+                <w:sz w:val="24"/>
+                <w:szCs w:val="24"/>
+              </w:rPr>
+            </w:pPr>
+            <w:proofErr w:type="spellStart"/>
+            <w:proofErr w:type="gramStart"/>
+            <w:r>
+              <w:rPr>
+                <w:rFonts w:ascii="Times New Roman" w:hAnsi="Times New Roman" w:cs="Times New Roman"/>
+                <w:color w:val="auto"/>
+                <w:sz w:val="24"/>
+                <w:szCs w:val="24"/>
+              </w:rPr>
+              <w:t>PaymentID</w:t>
+            </w:r>
+            <w:proofErr w:type="spellEnd"/>
+            <w:r>
+              <w:rPr>
+                <w:rFonts w:ascii="Times New Roman" w:hAnsi="Times New Roman" w:cs="Times New Roman"/>
+                <w:color w:val="auto"/>
+                <w:sz w:val="24"/>
+                <w:szCs w:val="24"/>
+              </w:rPr>
+              <w:t>(</w:t>
+            </w:r>
+            <w:proofErr w:type="gramEnd"/>
+            <w:r>
+              <w:rPr>
+                <w:rFonts w:ascii="Times New Roman" w:hAnsi="Times New Roman" w:cs="Times New Roman"/>
+                <w:color w:val="auto"/>
+                <w:sz w:val="24"/>
+                <w:szCs w:val="24"/>
+              </w:rPr>
+              <w:t xml:space="preserve">PK), Amount, </w:t>
+            </w:r>
+            <w:proofErr w:type="spellStart"/>
+            <w:r>
+              <w:rPr>
+                <w:rFonts w:ascii="Times New Roman" w:hAnsi="Times New Roman" w:cs="Times New Roman"/>
+                <w:color w:val="auto"/>
+                <w:sz w:val="24"/>
+                <w:szCs w:val="24"/>
+              </w:rPr>
+              <w:t>PaymentMethod</w:t>
+            </w:r>
+            <w:proofErr w:type="spellEnd"/>
+            <w:r>
+              <w:rPr>
+                <w:rFonts w:ascii="Times New Roman" w:hAnsi="Times New Roman" w:cs="Times New Roman"/>
+                <w:color w:val="auto"/>
+                <w:sz w:val="24"/>
+                <w:szCs w:val="24"/>
+              </w:rPr>
+              <w:t xml:space="preserve">, </w:t>
+            </w:r>
+            <w:proofErr w:type="spellStart"/>
+            <w:proofErr w:type="gramStart"/>
+            <w:r>
+              <w:rPr>
+                <w:rFonts w:ascii="Times New Roman" w:hAnsi="Times New Roman" w:cs="Times New Roman"/>
+                <w:color w:val="auto"/>
+                <w:sz w:val="24"/>
+                <w:szCs w:val="24"/>
+              </w:rPr>
+              <w:t>AppointmentID</w:t>
+            </w:r>
+            <w:proofErr w:type="spellEnd"/>
+            <w:r>
+              <w:rPr>
+                <w:rFonts w:ascii="Times New Roman" w:hAnsi="Times New Roman" w:cs="Times New Roman"/>
+                <w:color w:val="auto"/>
+                <w:sz w:val="24"/>
+                <w:szCs w:val="24"/>
+              </w:rPr>
+              <w:t>(</w:t>
+            </w:r>
+            <w:proofErr w:type="gramEnd"/>
+            <w:r>
+              <w:rPr>
+                <w:rFonts w:ascii="Times New Roman" w:hAnsi="Times New Roman" w:cs="Times New Roman"/>
+                <w:color w:val="auto"/>
+                <w:sz w:val="24"/>
+                <w:szCs w:val="24"/>
+              </w:rPr>
+              <w:t>FK)</w:t>
+            </w:r>
+          </w:p>
+        </w:tc>
+      </w:tr>
+    </w:tbl>
+    <w:p>
+      <w:pPr>
+        <w:pStyle w:val="ListBullet"/>
+        <w:rPr>
+          <w:rFonts w:ascii="Times New Roman" w:hAnsi="Times New Roman" w:cs="Times New Roman"/>
+          <w:color w:val="auto"/>
+          <w:sz w:val="24"/>
+          <w:szCs w:val="24"/>
+        </w:rPr>
+      </w:pPr>
     </w:p>
     <w:p>
       <w:pPr>
-        <w:pStyle w:val="1"/>
+        <w:pStyle w:val="Heading1"/>
       </w:pPr>
       <w:r>
         <w:lastRenderedPageBreak/>
@@ -5501,7 +6692,7 @@
     </w:p>
     <w:p>
       <w:pPr>
-        <w:pStyle w:val="a"/>
+        <w:pStyle w:val="ListBullet"/>
         <w:numPr>
           <w:ilvl w:val="0"/>
           <w:numId w:val="0"/>
@@ -5534,7 +6725,7 @@
     </w:p>
     <w:p>
       <w:pPr>
-        <w:pStyle w:val="a"/>
+        <w:pStyle w:val="ListBullet"/>
         <w:rPr>
           <w:rFonts w:ascii="Times New Roman" w:hAnsi="Times New Roman" w:cs="Times New Roman"/>
           <w:color w:val="auto"/>
@@ -5554,7 +6745,7 @@
     </w:p>
     <w:p>
       <w:pPr>
-        <w:pStyle w:val="a"/>
+        <w:pStyle w:val="ListBullet"/>
         <w:rPr>
           <w:rFonts w:ascii="Times New Roman" w:hAnsi="Times New Roman" w:cs="Times New Roman"/>
           <w:color w:val="auto"/>
@@ -5574,7 +6765,7 @@
     </w:p>
     <w:p>
       <w:pPr>
-        <w:pStyle w:val="a"/>
+        <w:pStyle w:val="ListBullet"/>
         <w:rPr>
           <w:rFonts w:ascii="Times New Roman" w:hAnsi="Times New Roman" w:cs="Times New Roman"/>
           <w:color w:val="auto"/>
@@ -5594,7 +6785,7 @@
     </w:p>
     <w:p>
       <w:pPr>
-        <w:pStyle w:val="a"/>
+        <w:pStyle w:val="ListBullet"/>
         <w:rPr>
           <w:rFonts w:ascii="Times New Roman" w:hAnsi="Times New Roman" w:cs="Times New Roman"/>
           <w:color w:val="auto"/>
@@ -5614,7 +6805,7 @@
     </w:p>
     <w:p>
       <w:pPr>
-        <w:pStyle w:val="a"/>
+        <w:pStyle w:val="ListBullet"/>
         <w:rPr>
           <w:rFonts w:ascii="Times New Roman" w:hAnsi="Times New Roman" w:cs="Times New Roman"/>
           <w:color w:val="auto"/>
@@ -5634,7 +6825,7 @@
     </w:p>
     <w:p>
       <w:pPr>
-        <w:pStyle w:val="a"/>
+        <w:pStyle w:val="ListBullet"/>
         <w:rPr>
           <w:rFonts w:ascii="Times New Roman" w:hAnsi="Times New Roman" w:cs="Times New Roman"/>
           <w:color w:val="auto"/>
@@ -5654,7 +6845,7 @@
     </w:p>
     <w:p>
       <w:pPr>
-        <w:pStyle w:val="a"/>
+        <w:pStyle w:val="ListBullet"/>
         <w:rPr>
           <w:rFonts w:ascii="Times New Roman" w:hAnsi="Times New Roman" w:cs="Times New Roman"/>
           <w:color w:val="auto"/>
@@ -5674,7 +6865,7 @@
     </w:p>
     <w:p>
       <w:pPr>
-        <w:pStyle w:val="1"/>
+        <w:pStyle w:val="Heading1"/>
       </w:pPr>
       <w:r>
         <w:lastRenderedPageBreak/>
@@ -5689,7 +6880,7 @@
     </w:p>
     <w:p>
       <w:pPr>
-        <w:pStyle w:val="a"/>
+        <w:pStyle w:val="ListBullet"/>
         <w:numPr>
           <w:ilvl w:val="0"/>
           <w:numId w:val="0"/>
@@ -5731,7 +6922,7 @@
     </w:p>
     <w:p>
       <w:pPr>
-        <w:pStyle w:val="a"/>
+        <w:pStyle w:val="ListBullet"/>
         <w:numPr>
           <w:ilvl w:val="0"/>
           <w:numId w:val="0"/>
@@ -5755,7 +6946,7 @@
     </w:p>
     <w:p>
       <w:pPr>
-        <w:pStyle w:val="a"/>
+        <w:pStyle w:val="ListBullet"/>
         <w:numPr>
           <w:ilvl w:val="0"/>
           <w:numId w:val="0"/>
@@ -5779,7 +6970,7 @@
     </w:p>
     <w:p>
       <w:pPr>
-        <w:pStyle w:val="a"/>
+        <w:pStyle w:val="ListBullet"/>
         <w:numPr>
           <w:ilvl w:val="0"/>
           <w:numId w:val="25"/>
@@ -5802,7 +6993,7 @@
     </w:p>
     <w:p>
       <w:pPr>
-        <w:pStyle w:val="a"/>
+        <w:pStyle w:val="ListBullet"/>
         <w:numPr>
           <w:ilvl w:val="0"/>
           <w:numId w:val="25"/>
@@ -5825,7 +7016,7 @@
     </w:p>
     <w:p>
       <w:pPr>
-        <w:pStyle w:val="a"/>
+        <w:pStyle w:val="ListBullet"/>
         <w:numPr>
           <w:ilvl w:val="0"/>
           <w:numId w:val="25"/>
@@ -5848,7 +7039,7 @@
     </w:p>
     <w:p>
       <w:pPr>
-        <w:pStyle w:val="a"/>
+        <w:pStyle w:val="ListBullet"/>
         <w:numPr>
           <w:ilvl w:val="0"/>
           <w:numId w:val="25"/>
@@ -5871,7 +7062,7 @@
     </w:p>
     <w:p>
       <w:pPr>
-        <w:pStyle w:val="a"/>
+        <w:pStyle w:val="ListBullet"/>
         <w:numPr>
           <w:ilvl w:val="0"/>
           <w:numId w:val="0"/>
@@ -5887,7 +7078,7 @@
     </w:p>
     <w:p>
       <w:pPr>
-        <w:pStyle w:val="1"/>
+        <w:pStyle w:val="Heading1"/>
       </w:pPr>
       <w:r>
         <w:lastRenderedPageBreak/>
@@ -5947,7 +7138,29 @@
           <w:sz w:val="24"/>
           <w:szCs w:val="24"/>
         </w:rPr>
-        <w:t>SQL Script (.sql)</w:t>
+        <w:t>SQL Script (.</w:t>
+      </w:r>
+      <w:proofErr w:type="spellStart"/>
+      <w:r>
+        <w:rPr>
+          <w:rFonts w:ascii="Times New Roman" w:hAnsi="Times New Roman" w:cs="Times New Roman"/>
+          <w:b/>
+          <w:bCs/>
+          <w:sz w:val="24"/>
+          <w:szCs w:val="24"/>
+        </w:rPr>
+        <w:t>sql</w:t>
+      </w:r>
+      <w:proofErr w:type="spellEnd"/>
+      <w:r>
+        <w:rPr>
+          <w:rFonts w:ascii="Times New Roman" w:hAnsi="Times New Roman" w:cs="Times New Roman"/>
+          <w:b/>
+          <w:bCs/>
+          <w:sz w:val="24"/>
+          <w:szCs w:val="24"/>
+        </w:rPr>
+        <w:t>)</w:t>
       </w:r>
       <w:r>
         <w:rPr>
@@ -6117,7 +7330,25 @@
           <w:sz w:val="24"/>
           <w:szCs w:val="24"/>
         </w:rPr>
-        <w:t>Google Colab notebook (if applicable): [link]</w:t>
+        <w:t xml:space="preserve">Google </w:t>
+      </w:r>
+      <w:proofErr w:type="spellStart"/>
+      <w:r>
+        <w:rPr>
+          <w:rFonts w:ascii="Times New Roman" w:hAnsi="Times New Roman" w:cs="Times New Roman"/>
+          <w:sz w:val="24"/>
+          <w:szCs w:val="24"/>
+        </w:rPr>
+        <w:t>Colab</w:t>
+      </w:r>
+      <w:proofErr w:type="spellEnd"/>
+      <w:r>
+        <w:rPr>
+          <w:rFonts w:ascii="Times New Roman" w:hAnsi="Times New Roman" w:cs="Times New Roman"/>
+          <w:sz w:val="24"/>
+          <w:szCs w:val="24"/>
+        </w:rPr>
+        <w:t xml:space="preserve"> notebook (if applicable): [link]</w:t>
       </w:r>
     </w:p>
     <w:p>
@@ -6194,7 +7425,7 @@
 <w:ftr xmlns:wpc="http://schemas.microsoft.com/office/word/2010/wordprocessingCanvas" xmlns:cx="http://schemas.microsoft.com/office/drawing/2014/chartex" xmlns:cx1="http://schemas.microsoft.com/office/drawing/2015/9/8/chartex" xmlns:cx2="http://schemas.microsoft.com/office/drawing/2015/10/21/chartex" xmlns:cx3="http://schemas.microsoft.com/office/drawing/2016/5/9/chartex" xmlns:cx4="http://schemas.microsoft.com/office/drawing/2016/5/10/chartex" xmlns:cx5="http://schemas.microsoft.com/office/drawing/2016/5/11/chartex" xmlns:cx6="http://schemas.microsoft.com/office/drawing/2016/5/12/chartex" xmlns:cx7="http://schemas.microsoft.com/office/drawing/2016/5/13/chartex" xmlns:cx8="http://schemas.microsoft.com/office/drawing/2016/5/14/chartex" xmlns:mc="http://schemas.openxmlformats.org/markup-compatibility/2006" xmlns:aink="http://schemas.microsoft.com/office/drawing/2016/ink" xmlns:am3d="http://schemas.microsoft.com/office/drawing/2017/model3d" xmlns:o="urn:schemas-microsoft-com:office:office" xmlns:oel="http://schemas.microsoft.com/office/2019/extlst" xmlns:r="http://schemas.openxmlformats.org/officeDocument/2006/relationships" xmlns:m="http://schemas.openxmlformats.org/officeDocument/2006/math" xmlns:v="urn:schemas-microsoft-com:vml" xmlns:wp14="http://schemas.microsoft.com/office/word/2010/wordprocessingDrawing" xmlns:wp="http://schemas.openxmlformats.org/drawingml/2006/wordprocessingDrawing" xmlns:w10="urn:schemas-microsoft-com:office:word" xmlns:w="http://schemas.openxmlformats.org/wordprocessingml/2006/main" xmlns:w14="http://schemas.microsoft.com/office/word/2010/wordml" xmlns:w15="http://schemas.microsoft.com/office/word/2012/wordml" xmlns:w16cex="http://schemas.microsoft.com/office/word/2018/wordml/cex" xmlns:w16cid="http://schemas.microsoft.com/office/word/2016/wordml/cid" xmlns:w16="http://schemas.microsoft.com/office/word/2018/wordml" xmlns:w16du="http://schemas.microsoft.com/office/word/2023/wordml/word16du" xmlns:w16sdtdh="http://schemas.microsoft.com/office/word/2020/wordml/sdtdatahash" xmlns:w16sdtfl="http://schemas.microsoft.com/office/word/2024/wordml/sdtformatlock" xmlns:w16se="http://schemas.microsoft.com/office/word/2015/wordml/symex" xmlns:wpg="http://schemas.microsoft.com/office/word/2010/wordprocessingGroup" xmlns:wpi="http://schemas.microsoft.com/office/word/2010/wordprocessingInk" xmlns:wne="http://schemas.microsoft.com/office/word/2006/wordml" xmlns:wps="http://schemas.microsoft.com/office/word/2010/wordprocessingShape" mc:Ignorable="w14 w15 w16se w16cid w16 w16cex w16sdtdh w16sdtfl w16du wp14">
   <w:p>
     <w:pPr>
-      <w:pStyle w:val="a5"/>
+      <w:pStyle w:val="Footer"/>
     </w:pPr>
     <w:r>
       <w:rPr>
@@ -6351,7 +7582,7 @@
 <w:ftr xmlns:wpc="http://schemas.microsoft.com/office/word/2010/wordprocessingCanvas" xmlns:cx="http://schemas.microsoft.com/office/drawing/2014/chartex" xmlns:cx1="http://schemas.microsoft.com/office/drawing/2015/9/8/chartex" xmlns:cx2="http://schemas.microsoft.com/office/drawing/2015/10/21/chartex" xmlns:cx3="http://schemas.microsoft.com/office/drawing/2016/5/9/chartex" xmlns:cx4="http://schemas.microsoft.com/office/drawing/2016/5/10/chartex" xmlns:cx5="http://schemas.microsoft.com/office/drawing/2016/5/11/chartex" xmlns:cx6="http://schemas.microsoft.com/office/drawing/2016/5/12/chartex" xmlns:cx7="http://schemas.microsoft.com/office/drawing/2016/5/13/chartex" xmlns:cx8="http://schemas.microsoft.com/office/drawing/2016/5/14/chartex" xmlns:mc="http://schemas.openxmlformats.org/markup-compatibility/2006" xmlns:aink="http://schemas.microsoft.com/office/drawing/2016/ink" xmlns:am3d="http://schemas.microsoft.com/office/drawing/2017/model3d" xmlns:o="urn:schemas-microsoft-com:office:office" xmlns:oel="http://schemas.microsoft.com/office/2019/extlst" xmlns:r="http://schemas.openxmlformats.org/officeDocument/2006/relationships" xmlns:m="http://schemas.openxmlformats.org/officeDocument/2006/math" xmlns:v="urn:schemas-microsoft-com:vml" xmlns:wp14="http://schemas.microsoft.com/office/word/2010/wordprocessingDrawing" xmlns:wp="http://schemas.openxmlformats.org/drawingml/2006/wordprocessingDrawing" xmlns:w10="urn:schemas-microsoft-com:office:word" xmlns:w="http://schemas.openxmlformats.org/wordprocessingml/2006/main" xmlns:w14="http://schemas.microsoft.com/office/word/2010/wordml" xmlns:w15="http://schemas.microsoft.com/office/word/2012/wordml" xmlns:w16cex="http://schemas.microsoft.com/office/word/2018/wordml/cex" xmlns:w16cid="http://schemas.microsoft.com/office/word/2016/wordml/cid" xmlns:w16="http://schemas.microsoft.com/office/word/2018/wordml" xmlns:w16du="http://schemas.microsoft.com/office/word/2023/wordml/word16du" xmlns:w16sdtdh="http://schemas.microsoft.com/office/word/2020/wordml/sdtdatahash" xmlns:w16sdtfl="http://schemas.microsoft.com/office/word/2024/wordml/sdtformatlock" xmlns:w16se="http://schemas.microsoft.com/office/word/2015/wordml/symex" xmlns:wpg="http://schemas.microsoft.com/office/word/2010/wordprocessingGroup" xmlns:wpi="http://schemas.microsoft.com/office/word/2010/wordprocessingInk" xmlns:wne="http://schemas.microsoft.com/office/word/2006/wordml" xmlns:wps="http://schemas.microsoft.com/office/word/2010/wordprocessingShape" mc:Ignorable="w14 w15 w16se w16cid w16 w16cex w16sdtdh w16sdtfl w16du wp14">
   <w:p>
     <w:pPr>
-      <w:pStyle w:val="a5"/>
+      <w:pStyle w:val="Footer"/>
     </w:pPr>
     <w:r>
       <w:rPr>
@@ -6508,7 +7739,7 @@
 <w:ftr xmlns:wpc="http://schemas.microsoft.com/office/word/2010/wordprocessingCanvas" xmlns:cx="http://schemas.microsoft.com/office/drawing/2014/chartex" xmlns:cx1="http://schemas.microsoft.com/office/drawing/2015/9/8/chartex" xmlns:cx2="http://schemas.microsoft.com/office/drawing/2015/10/21/chartex" xmlns:cx3="http://schemas.microsoft.com/office/drawing/2016/5/9/chartex" xmlns:cx4="http://schemas.microsoft.com/office/drawing/2016/5/10/chartex" xmlns:cx5="http://schemas.microsoft.com/office/drawing/2016/5/11/chartex" xmlns:cx6="http://schemas.microsoft.com/office/drawing/2016/5/12/chartex" xmlns:cx7="http://schemas.microsoft.com/office/drawing/2016/5/13/chartex" xmlns:cx8="http://schemas.microsoft.com/office/drawing/2016/5/14/chartex" xmlns:mc="http://schemas.openxmlformats.org/markup-compatibility/2006" xmlns:aink="http://schemas.microsoft.com/office/drawing/2016/ink" xmlns:am3d="http://schemas.microsoft.com/office/drawing/2017/model3d" xmlns:o="urn:schemas-microsoft-com:office:office" xmlns:oel="http://schemas.microsoft.com/office/2019/extlst" xmlns:r="http://schemas.openxmlformats.org/officeDocument/2006/relationships" xmlns:m="http://schemas.openxmlformats.org/officeDocument/2006/math" xmlns:v="urn:schemas-microsoft-com:vml" xmlns:wp14="http://schemas.microsoft.com/office/word/2010/wordprocessingDrawing" xmlns:wp="http://schemas.openxmlformats.org/drawingml/2006/wordprocessingDrawing" xmlns:w10="urn:schemas-microsoft-com:office:word" xmlns:w="http://schemas.openxmlformats.org/wordprocessingml/2006/main" xmlns:w14="http://schemas.microsoft.com/office/word/2010/wordml" xmlns:w15="http://schemas.microsoft.com/office/word/2012/wordml" xmlns:w16cex="http://schemas.microsoft.com/office/word/2018/wordml/cex" xmlns:w16cid="http://schemas.microsoft.com/office/word/2016/wordml/cid" xmlns:w16="http://schemas.microsoft.com/office/word/2018/wordml" xmlns:w16du="http://schemas.microsoft.com/office/word/2023/wordml/word16du" xmlns:w16sdtdh="http://schemas.microsoft.com/office/word/2020/wordml/sdtdatahash" xmlns:w16sdtfl="http://schemas.microsoft.com/office/word/2024/wordml/sdtformatlock" xmlns:w16se="http://schemas.microsoft.com/office/word/2015/wordml/symex" xmlns:wpg="http://schemas.microsoft.com/office/word/2010/wordprocessingGroup" xmlns:wpi="http://schemas.microsoft.com/office/word/2010/wordprocessingInk" xmlns:wne="http://schemas.microsoft.com/office/word/2006/wordml" xmlns:wps="http://schemas.microsoft.com/office/word/2010/wordprocessingShape" mc:Ignorable="w14 w15 w16se w16cid w16 w16cex w16sdtdh w16sdtfl w16du wp14">
   <w:p>
     <w:pPr>
-      <w:pStyle w:val="a5"/>
+      <w:pStyle w:val="Footer"/>
     </w:pPr>
     <w:r>
       <w:rPr>
@@ -6755,7 +7986,7 @@
         </w:tcPr>
         <w:p>
           <w:pPr>
-            <w:pStyle w:val="a7"/>
+            <w:pStyle w:val="Header"/>
           </w:pPr>
         </w:p>
       </w:tc>
@@ -6765,7 +7996,7 @@
         </w:tcPr>
         <w:p>
           <w:pPr>
-            <w:pStyle w:val="a7"/>
+            <w:pStyle w:val="Header"/>
           </w:pPr>
         </w:p>
       </w:tc>
@@ -6776,7 +8007,7 @@
         </w:tcPr>
         <w:p>
           <w:pPr>
-            <w:pStyle w:val="a7"/>
+            <w:pStyle w:val="Header"/>
           </w:pPr>
         </w:p>
       </w:tc>
@@ -6784,7 +8015,7 @@
   </w:tbl>
   <w:p>
     <w:pPr>
-      <w:pStyle w:val="a7"/>
+      <w:pStyle w:val="Header"/>
     </w:pPr>
   </w:p>
 </w:hdr>
@@ -7070,26 +8301,9 @@
           </w:r>
           <w:r>
             <w:rPr>
-              <w:rFonts w:hint="cs"/>
-              <w:noProof/>
-              <w:rtl/>
-            </w:rPr>
-            <w:instrText xml:space="preserve">خطأ! استخدم علامة التبويب "الصفحة الرئيسية" لتطبيق </w:instrText>
-          </w:r>
-          <w:r>
-            <w:rPr>
-              <w:rFonts w:hint="cs"/>
               <w:noProof/>
             </w:rPr>
-            <w:instrText>Heading 1</w:instrText>
-          </w:r>
-          <w:r>
-            <w:rPr>
-              <w:rFonts w:hint="cs"/>
-              <w:noProof/>
-              <w:rtl/>
-            </w:rPr>
-            <w:instrText xml:space="preserve"> على النص الذي ترغب في أن يظهر هنا.</w:instrText>
+            <w:instrText>Deliverables</w:instrText>
           </w:r>
           <w:r>
             <w:rPr>
@@ -7120,26 +8334,9 @@
           </w:r>
           <w:r>
             <w:rPr>
-              <w:rFonts w:hint="cs"/>
-              <w:noProof/>
-              <w:rtl/>
-            </w:rPr>
-            <w:instrText xml:space="preserve">خطأ! استخدم علامة التبويب "الصفحة الرئيسية" لتطبيق </w:instrText>
-          </w:r>
-          <w:r>
-            <w:rPr>
-              <w:rFonts w:hint="cs"/>
               <w:noProof/>
             </w:rPr>
-            <w:instrText>Heading 1</w:instrText>
-          </w:r>
-          <w:r>
-            <w:rPr>
-              <w:rFonts w:hint="cs"/>
-              <w:noProof/>
-              <w:rtl/>
-            </w:rPr>
-            <w:instrText xml:space="preserve"> على النص الذي ترغب في أن يظهر هنا.</w:instrText>
+            <w:instrText>Deliverables</w:instrText>
           </w:r>
           <w:r>
             <w:rPr>
@@ -7155,32 +8352,9 @@
           </w:r>
           <w:r>
             <w:rPr>
-              <w:rFonts w:hint="cs"/>
-              <w:noProof/>
-              <w:rtl/>
-            </w:rPr>
-            <w:t xml:space="preserve">خطأ! استخدم علامة التبويب "الصفحة الرئيسية" لتطبيق </w:t>
-          </w:r>
-          <w:r>
-            <w:rPr>
-              <w:rFonts w:hint="cs"/>
               <w:noProof/>
             </w:rPr>
-            <w:t>Heading 1</w:t>
-          </w:r>
-          <w:r>
-            <w:rPr>
-              <w:rFonts w:hint="cs"/>
-              <w:noProof/>
-              <w:rtl/>
-            </w:rPr>
-            <w:t xml:space="preserve"> على النص الذي ترغب في أن يظهر هنا.</w:t>
-          </w:r>
-          <w:r>
-            <w:rPr>
-              <w:noProof/>
-            </w:rPr>
-            <w:t xml:space="preserve"> </w:t>
+            <w:t xml:space="preserve">Deliverables </w:t>
           </w:r>
           <w:r>
             <w:fldChar w:fldCharType="end"/>
@@ -7246,7 +8420,7 @@
     <w:lvl w:ilvl="0">
       <w:start w:val="1"/>
       <w:numFmt w:val="bullet"/>
-      <w:pStyle w:val="a"/>
+      <w:pStyle w:val="ListBullet"/>
       <w:lvlText w:val="•"/>
       <w:lvlJc w:val="left"/>
       <w:pPr>
@@ -8311,7 +9485,7 @@
     <w:lvl w:ilvl="0">
       <w:start w:val="1"/>
       <w:numFmt w:val="decimal"/>
-      <w:pStyle w:val="a0"/>
+      <w:pStyle w:val="ListNumber"/>
       <w:lvlText w:val="%1."/>
       <w:lvlJc w:val="left"/>
       <w:pPr>
@@ -8325,7 +9499,7 @@
     <w:lvl w:ilvl="1">
       <w:start w:val="1"/>
       <w:numFmt w:val="decimal"/>
-      <w:pStyle w:val="2"/>
+      <w:pStyle w:val="ListNumber2"/>
       <w:suff w:val="space"/>
       <w:lvlText w:val="%1.%2"/>
       <w:lvlJc w:val="left"/>
@@ -8340,7 +9514,7 @@
     <w:lvl w:ilvl="2">
       <w:start w:val="1"/>
       <w:numFmt w:val="lowerLetter"/>
-      <w:pStyle w:val="3"/>
+      <w:pStyle w:val="ListNumber3"/>
       <w:lvlText w:val="%3."/>
       <w:lvlJc w:val="left"/>
       <w:pPr>
@@ -8354,7 +9528,7 @@
     <w:lvl w:ilvl="3">
       <w:start w:val="1"/>
       <w:numFmt w:val="lowerRoman"/>
-      <w:pStyle w:val="4"/>
+      <w:pStyle w:val="ListNumber4"/>
       <w:lvlText w:val="%4."/>
       <w:lvlJc w:val="left"/>
       <w:pPr>
@@ -8368,7 +9542,7 @@
     <w:lvl w:ilvl="4">
       <w:start w:val="1"/>
       <w:numFmt w:val="lowerLetter"/>
-      <w:pStyle w:val="5"/>
+      <w:pStyle w:val="ListNumber5"/>
       <w:lvlText w:val="(%5)"/>
       <w:lvlJc w:val="left"/>
       <w:pPr>
@@ -10637,16 +11811,16 @@
     <w:lsdException w:name="Unresolved Mention" w:semiHidden="1" w:unhideWhenUsed="1"/>
     <w:lsdException w:name="Smart Link" w:semiHidden="1" w:unhideWhenUsed="1"/>
   </w:latentStyles>
-  <w:style w:type="paragraph" w:default="1" w:styleId="a1">
+  <w:style w:type="paragraph" w:default="1" w:styleId="Normal">
     <w:name w:val="Normal"/>
     <w:qFormat/>
     <w:rsid w:val="00407799"/>
   </w:style>
-  <w:style w:type="paragraph" w:styleId="1">
+  <w:style w:type="paragraph" w:styleId="Heading1">
     <w:name w:val="heading 1"/>
-    <w:basedOn w:val="a1"/>
-    <w:next w:val="a1"/>
-    <w:link w:val="1Char"/>
+    <w:basedOn w:val="Normal"/>
+    <w:next w:val="Normal"/>
+    <w:link w:val="Heading1Char"/>
     <w:uiPriority w:val="1"/>
     <w:qFormat/>
     <w:pPr>
@@ -10665,11 +11839,11 @@
       <w:sz w:val="40"/>
     </w:rPr>
   </w:style>
-  <w:style w:type="paragraph" w:styleId="20">
+  <w:style w:type="paragraph" w:styleId="Heading2">
     <w:name w:val="heading 2"/>
-    <w:basedOn w:val="a1"/>
-    <w:next w:val="a1"/>
-    <w:link w:val="2Char"/>
+    <w:basedOn w:val="Normal"/>
+    <w:next w:val="Normal"/>
+    <w:link w:val="Heading2Char"/>
     <w:uiPriority w:val="1"/>
     <w:unhideWhenUsed/>
     <w:qFormat/>
@@ -10687,13 +11861,12 @@
       <w:sz w:val="28"/>
     </w:rPr>
   </w:style>
-  <w:style w:type="character" w:default="1" w:styleId="a2">
+  <w:style w:type="character" w:default="1" w:styleId="DefaultParagraphFont">
     <w:name w:val="Default Paragraph Font"/>
     <w:uiPriority w:val="1"/>
-    <w:semiHidden/>
     <w:unhideWhenUsed/>
   </w:style>
-  <w:style w:type="table" w:default="1" w:styleId="a3">
+  <w:style w:type="table" w:default="1" w:styleId="TableNormal">
     <w:name w:val="Normal Table"/>
     <w:uiPriority w:val="99"/>
     <w:semiHidden/>
@@ -10708,16 +11881,16 @@
       </w:tblCellMar>
     </w:tblPr>
   </w:style>
-  <w:style w:type="numbering" w:default="1" w:styleId="a4">
+  <w:style w:type="numbering" w:default="1" w:styleId="NoList">
     <w:name w:val="No List"/>
     <w:uiPriority w:val="99"/>
     <w:semiHidden/>
     <w:unhideWhenUsed/>
   </w:style>
-  <w:style w:type="paragraph" w:styleId="a5">
+  <w:style w:type="paragraph" w:styleId="Footer">
     <w:name w:val="footer"/>
-    <w:basedOn w:val="a1"/>
-    <w:link w:val="Char"/>
+    <w:basedOn w:val="Normal"/>
+    <w:link w:val="FooterChar"/>
     <w:uiPriority w:val="99"/>
     <w:unhideWhenUsed/>
     <w:qFormat/>
@@ -10729,20 +11902,20 @@
       <w:color w:val="EF4623" w:themeColor="accent1"/>
     </w:rPr>
   </w:style>
-  <w:style w:type="character" w:customStyle="1" w:styleId="Char">
-    <w:name w:val="تذييل الصفحة Char"/>
-    <w:basedOn w:val="a2"/>
-    <w:link w:val="a5"/>
+  <w:style w:type="character" w:customStyle="1" w:styleId="FooterChar">
+    <w:name w:val="Footer Char"/>
+    <w:basedOn w:val="DefaultParagraphFont"/>
+    <w:link w:val="Footer"/>
     <w:uiPriority w:val="99"/>
     <w:rPr>
       <w:color w:val="EF4623" w:themeColor="accent1"/>
     </w:rPr>
   </w:style>
-  <w:style w:type="paragraph" w:styleId="a6">
+  <w:style w:type="paragraph" w:styleId="Subtitle">
     <w:name w:val="Subtitle"/>
-    <w:basedOn w:val="a1"/>
-    <w:next w:val="a1"/>
-    <w:link w:val="Char0"/>
+    <w:basedOn w:val="Normal"/>
+    <w:next w:val="Normal"/>
+    <w:link w:val="SubtitleChar"/>
     <w:uiPriority w:val="3"/>
     <w:unhideWhenUsed/>
     <w:qFormat/>
@@ -10765,36 +11938,36 @@
   </w:style>
   <w:style w:type="paragraph" w:customStyle="1" w:styleId="Graphic">
     <w:name w:val="Graphic"/>
-    <w:basedOn w:val="a1"/>
+    <w:basedOn w:val="Normal"/>
     <w:uiPriority w:val="99"/>
     <w:pPr>
       <w:spacing w:after="80" w:line="240" w:lineRule="auto"/>
       <w:jc w:val="center"/>
     </w:pPr>
   </w:style>
-  <w:style w:type="paragraph" w:styleId="a7">
+  <w:style w:type="paragraph" w:styleId="Header">
     <w:name w:val="header"/>
-    <w:basedOn w:val="a1"/>
-    <w:link w:val="Char1"/>
+    <w:basedOn w:val="Normal"/>
+    <w:link w:val="HeaderChar"/>
     <w:uiPriority w:val="99"/>
     <w:qFormat/>
     <w:pPr>
       <w:spacing w:after="380" w:line="240" w:lineRule="auto"/>
     </w:pPr>
   </w:style>
-  <w:style w:type="character" w:customStyle="1" w:styleId="Char1">
-    <w:name w:val="رأس الصفحة Char"/>
-    <w:basedOn w:val="a2"/>
-    <w:link w:val="a7"/>
+  <w:style w:type="character" w:customStyle="1" w:styleId="HeaderChar">
+    <w:name w:val="Header Char"/>
+    <w:basedOn w:val="DefaultParagraphFont"/>
+    <w:link w:val="Header"/>
     <w:uiPriority w:val="99"/>
     <w:rPr>
       <w:color w:val="404040" w:themeColor="text1" w:themeTint="BF"/>
       <w:sz w:val="20"/>
     </w:rPr>
   </w:style>
-  <w:style w:type="table" w:styleId="a8">
+  <w:style w:type="table" w:styleId="TableGrid">
     <w:name w:val="Table Grid"/>
-    <w:basedOn w:val="a3"/>
+    <w:basedOn w:val="TableNormal"/>
     <w:uiPriority w:val="39"/>
     <w:pPr>
       <w:spacing w:before="120" w:after="120" w:line="240" w:lineRule="auto"/>
@@ -10851,7 +12024,7 @@
   </w:style>
   <w:style w:type="paragraph" w:customStyle="1" w:styleId="InfoHeading">
     <w:name w:val="Info Heading"/>
-    <w:basedOn w:val="a1"/>
+    <w:basedOn w:val="Normal"/>
     <w:uiPriority w:val="2"/>
     <w:qFormat/>
     <w:pPr>
@@ -10868,8 +12041,8 @@
   </w:style>
   <w:style w:type="paragraph" w:customStyle="1" w:styleId="Page">
     <w:name w:val="Page"/>
-    <w:basedOn w:val="a1"/>
-    <w:next w:val="a1"/>
+    <w:basedOn w:val="Normal"/>
+    <w:next w:val="Normal"/>
     <w:uiPriority w:val="99"/>
     <w:unhideWhenUsed/>
     <w:qFormat/>
@@ -10882,11 +12055,11 @@
       <w:sz w:val="36"/>
     </w:rPr>
   </w:style>
-  <w:style w:type="paragraph" w:styleId="a9">
+  <w:style w:type="paragraph" w:styleId="Title">
     <w:name w:val="Title"/>
-    <w:basedOn w:val="a1"/>
-    <w:next w:val="a1"/>
-    <w:link w:val="Char2"/>
+    <w:basedOn w:val="Normal"/>
+    <w:next w:val="Normal"/>
+    <w:link w:val="TitleChar"/>
     <w:uiPriority w:val="2"/>
     <w:qFormat/>
     <w:pPr>
@@ -10900,10 +12073,10 @@
       <w:sz w:val="200"/>
     </w:rPr>
   </w:style>
-  <w:style w:type="character" w:customStyle="1" w:styleId="Char2">
-    <w:name w:val="العنوان Char"/>
-    <w:basedOn w:val="a2"/>
-    <w:link w:val="a9"/>
+  <w:style w:type="character" w:customStyle="1" w:styleId="TitleChar">
+    <w:name w:val="Title Char"/>
+    <w:basedOn w:val="DefaultParagraphFont"/>
+    <w:link w:val="Title"/>
     <w:uiPriority w:val="2"/>
     <w:rPr>
       <w:rFonts w:asciiTheme="majorHAnsi" w:eastAsiaTheme="majorEastAsia" w:hAnsiTheme="majorHAnsi" w:cstheme="majorBidi"/>
@@ -10913,19 +12086,19 @@
       <w:sz w:val="200"/>
     </w:rPr>
   </w:style>
-  <w:style w:type="character" w:styleId="aa">
+  <w:style w:type="character" w:styleId="PlaceholderText">
     <w:name w:val="Placeholder Text"/>
-    <w:basedOn w:val="a2"/>
+    <w:basedOn w:val="DefaultParagraphFont"/>
     <w:uiPriority w:val="99"/>
     <w:semiHidden/>
     <w:rPr>
       <w:color w:val="808080"/>
     </w:rPr>
   </w:style>
-  <w:style w:type="paragraph" w:styleId="ab">
+  <w:style w:type="paragraph" w:styleId="BalloonText">
     <w:name w:val="Balloon Text"/>
-    <w:basedOn w:val="a1"/>
-    <w:link w:val="Char3"/>
+    <w:basedOn w:val="Normal"/>
+    <w:link w:val="BalloonTextChar"/>
     <w:uiPriority w:val="99"/>
     <w:semiHidden/>
     <w:unhideWhenUsed/>
@@ -10937,10 +12110,10 @@
       <w:sz w:val="16"/>
     </w:rPr>
   </w:style>
-  <w:style w:type="character" w:customStyle="1" w:styleId="Char3">
-    <w:name w:val="نص في بالون Char"/>
-    <w:basedOn w:val="a2"/>
-    <w:link w:val="ab"/>
+  <w:style w:type="character" w:customStyle="1" w:styleId="BalloonTextChar">
+    <w:name w:val="Balloon Text Char"/>
+    <w:basedOn w:val="DefaultParagraphFont"/>
+    <w:link w:val="BalloonText"/>
     <w:uiPriority w:val="99"/>
     <w:semiHidden/>
     <w:rPr>
@@ -10948,9 +12121,9 @@
       <w:sz w:val="16"/>
     </w:rPr>
   </w:style>
-  <w:style w:type="character" w:styleId="ac">
+  <w:style w:type="character" w:styleId="Strong">
     <w:name w:val="Strong"/>
-    <w:basedOn w:val="a2"/>
+    <w:basedOn w:val="DefaultParagraphFont"/>
     <w:uiPriority w:val="10"/>
     <w:qFormat/>
     <w:rPr>
@@ -10958,10 +12131,10 @@
       <w:bCs/>
     </w:rPr>
   </w:style>
-  <w:style w:type="character" w:customStyle="1" w:styleId="Char0">
-    <w:name w:val="عنوان فرعي Char"/>
-    <w:basedOn w:val="a2"/>
-    <w:link w:val="a6"/>
+  <w:style w:type="character" w:customStyle="1" w:styleId="SubtitleChar">
+    <w:name w:val="Subtitle Char"/>
+    <w:basedOn w:val="DefaultParagraphFont"/>
+    <w:link w:val="Subtitle"/>
     <w:uiPriority w:val="3"/>
     <w:rPr>
       <w:rFonts w:asciiTheme="majorHAnsi" w:eastAsiaTheme="majorEastAsia" w:hAnsiTheme="majorHAnsi" w:cstheme="majorBidi"/>
@@ -10975,7 +12148,7 @@
   </w:style>
   <w:style w:type="paragraph" w:customStyle="1" w:styleId="Abstract">
     <w:name w:val="Abstract"/>
-    <w:basedOn w:val="a1"/>
+    <w:basedOn w:val="Normal"/>
     <w:uiPriority w:val="3"/>
     <w:qFormat/>
     <w:pPr>
@@ -10989,9 +12162,9 @@
       <w:sz w:val="28"/>
     </w:rPr>
   </w:style>
-  <w:style w:type="paragraph" w:styleId="ad">
+  <w:style w:type="paragraph" w:styleId="NoSpacing">
     <w:name w:val="No Spacing"/>
-    <w:link w:val="Char4"/>
+    <w:link w:val="NoSpacingChar"/>
     <w:uiPriority w:val="1"/>
     <w:unhideWhenUsed/>
     <w:qFormat/>
@@ -11001,7 +12174,7 @@
   </w:style>
   <w:style w:type="character" w:styleId="Hyperlink">
     <w:name w:val="Hyperlink"/>
-    <w:basedOn w:val="a2"/>
+    <w:basedOn w:val="DefaultParagraphFont"/>
     <w:uiPriority w:val="99"/>
     <w:unhideWhenUsed/>
     <w:rPr>
@@ -11009,10 +12182,10 @@
       <w:u w:val="single"/>
     </w:rPr>
   </w:style>
-  <w:style w:type="paragraph" w:styleId="10">
+  <w:style w:type="paragraph" w:styleId="TOC1">
     <w:name w:val="toc 1"/>
-    <w:basedOn w:val="a1"/>
-    <w:next w:val="a1"/>
+    <w:basedOn w:val="Normal"/>
+    <w:next w:val="Normal"/>
     <w:autoRedefine/>
     <w:uiPriority w:val="39"/>
     <w:unhideWhenUsed/>
@@ -11027,10 +12200,10 @@
       <w:kern w:val="20"/>
     </w:rPr>
   </w:style>
-  <w:style w:type="character" w:customStyle="1" w:styleId="1Char">
-    <w:name w:val="العنوان 1 Char"/>
-    <w:basedOn w:val="a2"/>
-    <w:link w:val="1"/>
+  <w:style w:type="character" w:customStyle="1" w:styleId="Heading1Char">
+    <w:name w:val="Heading 1 Char"/>
+    <w:basedOn w:val="DefaultParagraphFont"/>
+    <w:link w:val="Heading1"/>
     <w:uiPriority w:val="1"/>
     <w:rPr>
       <w:rFonts w:asciiTheme="majorHAnsi" w:eastAsiaTheme="majorEastAsia" w:hAnsiTheme="majorHAnsi" w:cstheme="majorBidi"/>
@@ -11040,10 +12213,10 @@
       <w:sz w:val="40"/>
     </w:rPr>
   </w:style>
-  <w:style w:type="paragraph" w:styleId="ae">
+  <w:style w:type="paragraph" w:styleId="TOCHeading">
     <w:name w:val="TOC Heading"/>
-    <w:basedOn w:val="1"/>
-    <w:next w:val="a1"/>
+    <w:basedOn w:val="Heading1"/>
+    <w:next w:val="Normal"/>
     <w:uiPriority w:val="39"/>
     <w:unhideWhenUsed/>
     <w:qFormat/>
@@ -11060,10 +12233,10 @@
       <w:sz w:val="44"/>
     </w:rPr>
   </w:style>
-  <w:style w:type="character" w:customStyle="1" w:styleId="2Char">
-    <w:name w:val="عنوان 2 Char"/>
-    <w:basedOn w:val="a2"/>
-    <w:link w:val="20"/>
+  <w:style w:type="character" w:customStyle="1" w:styleId="Heading2Char">
+    <w:name w:val="Heading 2 Char"/>
+    <w:basedOn w:val="DefaultParagraphFont"/>
+    <w:link w:val="Heading2"/>
     <w:uiPriority w:val="1"/>
     <w:rPr>
       <w:rFonts w:asciiTheme="majorHAnsi" w:eastAsiaTheme="majorEastAsia" w:hAnsiTheme="majorHAnsi" w:cstheme="majorBidi"/>
@@ -11073,11 +12246,11 @@
       <w:sz w:val="28"/>
     </w:rPr>
   </w:style>
-  <w:style w:type="paragraph" w:styleId="af">
+  <w:style w:type="paragraph" w:styleId="Quote">
     <w:name w:val="Quote"/>
-    <w:basedOn w:val="a1"/>
-    <w:next w:val="a1"/>
-    <w:link w:val="Char5"/>
+    <w:basedOn w:val="Normal"/>
+    <w:next w:val="Normal"/>
+    <w:link w:val="QuoteChar"/>
     <w:uiPriority w:val="1"/>
     <w:unhideWhenUsed/>
     <w:qFormat/>
@@ -11092,10 +12265,10 @@
       <w:sz w:val="24"/>
     </w:rPr>
   </w:style>
-  <w:style w:type="character" w:customStyle="1" w:styleId="Char5">
-    <w:name w:val="اقتباس Char"/>
-    <w:basedOn w:val="a2"/>
-    <w:link w:val="af"/>
+  <w:style w:type="character" w:customStyle="1" w:styleId="QuoteChar">
+    <w:name w:val="Quote Char"/>
+    <w:basedOn w:val="DefaultParagraphFont"/>
+    <w:link w:val="Quote"/>
     <w:uiPriority w:val="1"/>
     <w:rPr>
       <w:i/>
@@ -11105,10 +12278,10 @@
       <w:sz w:val="24"/>
     </w:rPr>
   </w:style>
-  <w:style w:type="paragraph" w:styleId="af0">
+  <w:style w:type="paragraph" w:styleId="Signature">
     <w:name w:val="Signature"/>
-    <w:basedOn w:val="a1"/>
-    <w:link w:val="Char6"/>
+    <w:basedOn w:val="Normal"/>
+    <w:link w:val="SignatureChar"/>
     <w:uiPriority w:val="9"/>
     <w:unhideWhenUsed/>
     <w:qFormat/>
@@ -11121,25 +12294,25 @@
       <w:kern w:val="20"/>
     </w:rPr>
   </w:style>
-  <w:style w:type="character" w:customStyle="1" w:styleId="Char6">
-    <w:name w:val="توقيع Char"/>
-    <w:basedOn w:val="a2"/>
-    <w:link w:val="af0"/>
+  <w:style w:type="character" w:customStyle="1" w:styleId="SignatureChar">
+    <w:name w:val="Signature Char"/>
+    <w:basedOn w:val="DefaultParagraphFont"/>
+    <w:link w:val="Signature"/>
     <w:uiPriority w:val="9"/>
     <w:rPr>
       <w:color w:val="595959" w:themeColor="text1" w:themeTint="A6"/>
       <w:kern w:val="20"/>
     </w:rPr>
   </w:style>
-  <w:style w:type="character" w:customStyle="1" w:styleId="Char4">
-    <w:name w:val="بلا تباعد Char"/>
-    <w:basedOn w:val="a2"/>
-    <w:link w:val="ad"/>
+  <w:style w:type="character" w:customStyle="1" w:styleId="NoSpacingChar">
+    <w:name w:val="No Spacing Char"/>
+    <w:basedOn w:val="DefaultParagraphFont"/>
+    <w:link w:val="NoSpacing"/>
     <w:uiPriority w:val="1"/>
   </w:style>
-  <w:style w:type="paragraph" w:styleId="a">
+  <w:style w:type="paragraph" w:styleId="ListBullet">
     <w:name w:val="List Bullet"/>
-    <w:basedOn w:val="a1"/>
+    <w:basedOn w:val="Normal"/>
     <w:uiPriority w:val="99"/>
     <w:unhideWhenUsed/>
     <w:qFormat/>
@@ -11154,9 +12327,9 @@
       <w:kern w:val="20"/>
     </w:rPr>
   </w:style>
-  <w:style w:type="paragraph" w:styleId="a0">
+  <w:style w:type="paragraph" w:styleId="ListNumber">
     <w:name w:val="List Number"/>
-    <w:basedOn w:val="a1"/>
+    <w:basedOn w:val="Normal"/>
     <w:uiPriority w:val="1"/>
     <w:unhideWhenUsed/>
     <w:qFormat/>
@@ -11172,9 +12345,9 @@
       <w:kern w:val="20"/>
     </w:rPr>
   </w:style>
-  <w:style w:type="paragraph" w:styleId="2">
+  <w:style w:type="paragraph" w:styleId="ListNumber2">
     <w:name w:val="List Number 2"/>
-    <w:basedOn w:val="a1"/>
+    <w:basedOn w:val="Normal"/>
     <w:uiPriority w:val="1"/>
     <w:unhideWhenUsed/>
     <w:qFormat/>
@@ -11191,9 +12364,9 @@
       <w:kern w:val="20"/>
     </w:rPr>
   </w:style>
-  <w:style w:type="paragraph" w:styleId="3">
+  <w:style w:type="paragraph" w:styleId="ListNumber3">
     <w:name w:val="List Number 3"/>
-    <w:basedOn w:val="a1"/>
+    <w:basedOn w:val="Normal"/>
     <w:uiPriority w:val="18"/>
     <w:unhideWhenUsed/>
     <w:pPr>
@@ -11209,9 +12382,9 @@
       <w:kern w:val="20"/>
     </w:rPr>
   </w:style>
-  <w:style w:type="paragraph" w:styleId="4">
+  <w:style w:type="paragraph" w:styleId="ListNumber4">
     <w:name w:val="List Number 4"/>
-    <w:basedOn w:val="a1"/>
+    <w:basedOn w:val="Normal"/>
     <w:uiPriority w:val="18"/>
     <w:unhideWhenUsed/>
     <w:pPr>
@@ -11227,9 +12400,9 @@
       <w:kern w:val="20"/>
     </w:rPr>
   </w:style>
-  <w:style w:type="paragraph" w:styleId="5">
+  <w:style w:type="paragraph" w:styleId="ListNumber5">
     <w:name w:val="List Number 5"/>
-    <w:basedOn w:val="a1"/>
+    <w:basedOn w:val="Normal"/>
     <w:uiPriority w:val="18"/>
     <w:unhideWhenUsed/>
     <w:pPr>
@@ -11247,7 +12420,7 @@
   </w:style>
   <w:style w:type="table" w:customStyle="1" w:styleId="FinancialTable">
     <w:name w:val="Financial Table"/>
-    <w:basedOn w:val="a3"/>
+    <w:basedOn w:val="TableNormal"/>
     <w:uiPriority w:val="99"/>
     <w:pPr>
       <w:spacing w:before="60" w:after="60" w:line="240" w:lineRule="auto"/>
@@ -11289,9 +12462,9 @@
       </w:rPr>
     </w:tblStylePr>
   </w:style>
-  <w:style w:type="character" w:styleId="af1">
+  <w:style w:type="character" w:styleId="CommentReference">
     <w:name w:val="annotation reference"/>
-    <w:basedOn w:val="a2"/>
+    <w:basedOn w:val="DefaultParagraphFont"/>
     <w:uiPriority w:val="99"/>
     <w:semiHidden/>
     <w:unhideWhenUsed/>
@@ -11299,27 +12472,27 @@
       <w:sz w:val="16"/>
     </w:rPr>
   </w:style>
-  <w:style w:type="paragraph" w:styleId="af2">
+  <w:style w:type="paragraph" w:styleId="CommentText">
     <w:name w:val="annotation text"/>
-    <w:basedOn w:val="a1"/>
-    <w:link w:val="Char7"/>
+    <w:basedOn w:val="Normal"/>
+    <w:link w:val="CommentTextChar"/>
     <w:uiPriority w:val="99"/>
     <w:unhideWhenUsed/>
     <w:pPr>
       <w:spacing w:line="240" w:lineRule="auto"/>
     </w:pPr>
   </w:style>
-  <w:style w:type="character" w:customStyle="1" w:styleId="Char7">
-    <w:name w:val="نص تعليق Char"/>
-    <w:basedOn w:val="a2"/>
-    <w:link w:val="af2"/>
+  <w:style w:type="character" w:customStyle="1" w:styleId="CommentTextChar">
+    <w:name w:val="Comment Text Char"/>
+    <w:basedOn w:val="DefaultParagraphFont"/>
+    <w:link w:val="CommentText"/>
     <w:uiPriority w:val="99"/>
   </w:style>
-  <w:style w:type="paragraph" w:styleId="af3">
+  <w:style w:type="paragraph" w:styleId="CommentSubject">
     <w:name w:val="annotation subject"/>
-    <w:basedOn w:val="af2"/>
-    <w:next w:val="af2"/>
-    <w:link w:val="Char8"/>
+    <w:basedOn w:val="CommentText"/>
+    <w:next w:val="CommentText"/>
+    <w:link w:val="CommentSubjectChar"/>
     <w:uiPriority w:val="99"/>
     <w:semiHidden/>
     <w:unhideWhenUsed/>
@@ -11328,10 +12501,10 @@
       <w:bCs/>
     </w:rPr>
   </w:style>
-  <w:style w:type="character" w:customStyle="1" w:styleId="Char8">
-    <w:name w:val="موضوع تعليق Char"/>
-    <w:basedOn w:val="Char7"/>
-    <w:link w:val="af3"/>
+  <w:style w:type="character" w:customStyle="1" w:styleId="CommentSubjectChar">
+    <w:name w:val="Comment Subject Char"/>
+    <w:basedOn w:val="CommentTextChar"/>
+    <w:link w:val="CommentSubject"/>
     <w:uiPriority w:val="99"/>
     <w:semiHidden/>
     <w:rPr>
@@ -11339,9 +12512,9 @@
       <w:bCs/>
     </w:rPr>
   </w:style>
-  <w:style w:type="table" w:styleId="af4">
+  <w:style w:type="table" w:styleId="LightShading">
     <w:name w:val="Light Shading"/>
-    <w:basedOn w:val="a3"/>
+    <w:basedOn w:val="TableNormal"/>
     <w:uiPriority w:val="60"/>
     <w:pPr>
       <w:spacing w:after="0" w:line="240" w:lineRule="auto"/>
@@ -11436,7 +12609,7 @@
   </w:style>
   <w:style w:type="paragraph" w:customStyle="1" w:styleId="TableTextDecimal">
     <w:name w:val="Table Text Decimal"/>
-    <w:basedOn w:val="a1"/>
+    <w:basedOn w:val="Normal"/>
     <w:uiPriority w:val="1"/>
     <w:qFormat/>
     <w:pPr>
@@ -11448,7 +12621,7 @@
   </w:style>
   <w:style w:type="paragraph" w:customStyle="1" w:styleId="TableText">
     <w:name w:val="Table Text"/>
-    <w:basedOn w:val="a1"/>
+    <w:basedOn w:val="Normal"/>
     <w:uiPriority w:val="1"/>
     <w:qFormat/>
     <w:pPr>
@@ -11457,7 +12630,7 @@
   </w:style>
   <w:style w:type="paragraph" w:customStyle="1" w:styleId="Organization">
     <w:name w:val="Organization"/>
-    <w:basedOn w:val="a1"/>
+    <w:basedOn w:val="Normal"/>
     <w:uiPriority w:val="2"/>
     <w:qFormat/>
     <w:pPr>
@@ -11471,9 +12644,9 @@
       <w:sz w:val="36"/>
     </w:rPr>
   </w:style>
-  <w:style w:type="paragraph" w:styleId="af5">
+  <w:style w:type="paragraph" w:styleId="ListParagraph">
     <w:name w:val="List Paragraph"/>
-    <w:basedOn w:val="a1"/>
+    <w:basedOn w:val="Normal"/>
     <w:uiPriority w:val="34"/>
     <w:qFormat/>
     <w:rsid w:val="001B698D"/>
@@ -11482,9 +12655,9 @@
       <w:contextualSpacing/>
     </w:pPr>
   </w:style>
-  <w:style w:type="paragraph" w:styleId="af6">
+  <w:style w:type="paragraph" w:styleId="NormalWeb">
     <w:name w:val="Normal (Web)"/>
-    <w:basedOn w:val="a1"/>
+    <w:basedOn w:val="Normal"/>
     <w:uiPriority w:val="99"/>
     <w:unhideWhenUsed/>
     <w:rsid w:val="00852E5F"/>
@@ -11501,7 +12674,7 @@
   </w:style>
   <w:style w:type="character" w:styleId="HTMLCode">
     <w:name w:val="HTML Code"/>
-    <w:basedOn w:val="a2"/>
+    <w:basedOn w:val="DefaultParagraphFont"/>
     <w:uiPriority w:val="99"/>
     <w:semiHidden/>
     <w:unhideWhenUsed/>
@@ -11514,17 +12687,17 @@
   </w:style>
   <w:style w:type="character" w:customStyle="1" w:styleId="8">
     <w:name w:val="ͼ8"/>
-    <w:basedOn w:val="a2"/>
+    <w:basedOn w:val="DefaultParagraphFont"/>
     <w:rsid w:val="00A442D9"/>
   </w:style>
   <w:style w:type="character" w:customStyle="1" w:styleId="b">
     <w:name w:val="ͼb"/>
-    <w:basedOn w:val="a2"/>
+    <w:basedOn w:val="DefaultParagraphFont"/>
     <w:rsid w:val="00A442D9"/>
   </w:style>
   <w:style w:type="paragraph" w:customStyle="1" w:styleId="font-claude-response-body">
     <w:name w:val="font-claude-response-body"/>
-    <w:basedOn w:val="a1"/>
+    <w:basedOn w:val="Normal"/>
     <w:rsid w:val="00EC2668"/>
     <w:pPr>
       <w:spacing w:before="100" w:beforeAutospacing="1" w:after="100" w:afterAutospacing="1" w:line="240" w:lineRule="auto"/>
@@ -11689,6 +12862,13 @@
     <w:pitch w:val="variable"/>
     <w:sig w:usb0="20000287" w:usb1="00000003" w:usb2="00000000" w:usb3="00000000" w:csb0="0000019F" w:csb1="00000000"/>
   </w:font>
+  <w:font w:name="Calibri">
+    <w:panose1 w:val="020F0502020204030204"/>
+    <w:charset w:val="00"/>
+    <w:family w:val="swiss"/>
+    <w:pitch w:val="variable"/>
+    <w:sig w:usb0="E4002EFF" w:usb1="C200247B" w:usb2="00000009" w:usb3="00000000" w:csb0="000001FF" w:csb1="00000000"/>
+  </w:font>
   <w:font w:name="Yu Mincho">
     <w:charset w:val="80"/>
     <w:family w:val="roman"/>
@@ -11696,17 +12876,19 @@
     <w:sig w:usb0="800002E7" w:usb1="2AC7FCFF" w:usb2="00000012" w:usb3="00000000" w:csb0="0002009F" w:csb1="00000000"/>
   </w:font>
   <w:font w:name="Yu Gothic Light">
+    <w:altName w:val="游ゴシック Light"/>
     <w:panose1 w:val="020B0300000000000000"/>
     <w:charset w:val="80"/>
     <w:family w:val="swiss"/>
     <w:pitch w:val="variable"/>
     <w:sig w:usb0="E00002FF" w:usb1="2AC7FDFF" w:usb2="00000016" w:usb3="00000000" w:csb0="0002009F" w:csb1="00000000"/>
   </w:font>
-  <w:font w:name="Aptos Display">
+  <w:font w:name="Calibri Light">
+    <w:panose1 w:val="020F0302020204030204"/>
     <w:charset w:val="00"/>
     <w:family w:val="swiss"/>
     <w:pitch w:val="variable"/>
-    <w:sig w:usb0="20000287" w:usb1="00000003" w:usb2="00000000" w:usb3="00000000" w:csb0="0000019F" w:csb1="00000000"/>
+    <w:sig w:usb0="E4002EFF" w:usb1="C200247B" w:usb2="00000009" w:usb3="00000000" w:csb0="000001FF" w:csb1="00000000"/>
   </w:font>
 </w:fonts>
 </file>
@@ -11720,7 +12902,7 @@
     <w:lvl w:ilvl="0">
       <w:start w:val="1"/>
       <w:numFmt w:val="bullet"/>
-      <w:pStyle w:val="a"/>
+      <w:pStyle w:val="ListBullet"/>
       <w:lvlText w:val="•"/>
       <w:lvlJc w:val="left"/>
       <w:pPr>
@@ -11728,7 +12910,7 @@
       </w:pPr>
       <w:rPr>
         <w:rFonts w:ascii="Cambria" w:hAnsi="Cambria" w:hint="default"/>
-        <w:color w:val="156082" w:themeColor="accent1"/>
+        <w:color w:val="4472C4" w:themeColor="accent1"/>
       </w:rPr>
     </w:lvl>
   </w:abstractNum>
@@ -11754,6 +12936,7 @@
   </w:compat>
   <w:rsids>
     <w:rsidRoot w:val="00324ACF"/>
+    <w:rsid w:val="00007A03"/>
     <w:rsid w:val="00046943"/>
     <w:rsid w:val="00051231"/>
     <w:rsid w:val="00096A42"/>
@@ -11782,6 +12965,7 @@
     <w:rsid w:val="006D7F43"/>
     <w:rsid w:val="006E2B58"/>
     <w:rsid w:val="008A4AE7"/>
+    <w:rsid w:val="008C7F6D"/>
     <w:rsid w:val="00900C2A"/>
     <w:rsid w:val="00902777"/>
     <w:rsid w:val="00977680"/>
@@ -11834,7 +13018,7 @@
   <w:themeFontLang w:val="en-GB" w:eastAsia="ja-JP" w:bidi="ar-SA"/>
   <w:clrSchemeMapping w:bg1="light1" w:t1="dark1" w:bg2="light2" w:t2="dark2" w:accent1="accent1" w:accent2="accent2" w:accent3="accent3" w:accent4="accent4" w:accent5="accent5" w:accent6="accent6" w:hyperlink="hyperlink" w:followedHyperlink="followedHyperlink"/>
   <w:decimalSymbol w:val="."/>
-  <w:listSeparator w:val=";"/>
+  <w:listSeparator w:val=","/>
   <w15:chartTrackingRefBased/>
 </w:settings>
 </file>
@@ -12234,17 +13418,17 @@
     <w:lsdException w:name="Unresolved Mention" w:semiHidden="1" w:unhideWhenUsed="1"/>
     <w:lsdException w:name="Smart Link" w:semiHidden="1" w:unhideWhenUsed="1"/>
   </w:latentStyles>
-  <w:style w:type="paragraph" w:default="1" w:styleId="a0">
+  <w:style w:type="paragraph" w:default="1" w:styleId="Normal">
     <w:name w:val="Normal"/>
     <w:qFormat/>
   </w:style>
-  <w:style w:type="character" w:default="1" w:styleId="a1">
+  <w:style w:type="character" w:default="1" w:styleId="DefaultParagraphFont">
     <w:name w:val="Default Paragraph Font"/>
     <w:uiPriority w:val="1"/>
     <w:semiHidden/>
     <w:unhideWhenUsed/>
   </w:style>
-  <w:style w:type="table" w:default="1" w:styleId="a2">
+  <w:style w:type="table" w:default="1" w:styleId="TableNormal">
     <w:name w:val="Normal Table"/>
     <w:uiPriority w:val="99"/>
     <w:semiHidden/>
@@ -12259,15 +13443,15 @@
       </w:tblCellMar>
     </w:tblPr>
   </w:style>
-  <w:style w:type="numbering" w:default="1" w:styleId="a3">
+  <w:style w:type="numbering" w:default="1" w:styleId="NoList">
     <w:name w:val="No List"/>
     <w:uiPriority w:val="99"/>
     <w:semiHidden/>
     <w:unhideWhenUsed/>
   </w:style>
-  <w:style w:type="paragraph" w:styleId="a">
+  <w:style w:type="paragraph" w:styleId="ListBullet">
     <w:name w:val="List Bullet"/>
-    <w:basedOn w:val="a0"/>
+    <w:basedOn w:val="Normal"/>
     <w:uiPriority w:val="1"/>
     <w:unhideWhenUsed/>
     <w:qFormat/>
@@ -12284,9 +13468,9 @@
       <w:lang w:val="en-US" w:eastAsia="en-US"/>
     </w:rPr>
   </w:style>
-  <w:style w:type="character" w:styleId="a4">
+  <w:style w:type="character" w:styleId="Strong">
     <w:name w:val="Strong"/>
-    <w:basedOn w:val="a1"/>
+    <w:basedOn w:val="DefaultParagraphFont"/>
     <w:uiPriority w:val="10"/>
     <w:qFormat/>
     <w:rPr>
@@ -12641,16 +13825,16 @@
 </file>
 
 <file path=customXml/item2.xml><?xml version="1.0" encoding="utf-8"?>
-<b:Sources xmlns:b="http://schemas.openxmlformats.org/officeDocument/2006/bibliography" SelectedStyle="\APA.XSL" StyleName="APA"/>
-</file>
-
-<file path=customXml/item3.xml><?xml version="1.0" encoding="utf-8"?>
 <?mso-contentType ?>
 <FormTemplates xmlns="http://schemas.microsoft.com/sharepoint/v3/contenttype/forms">
   <Display>DocumentLibraryForm</Display>
   <Edit>AssetEditForm</Edit>
   <New>DocumentLibraryForm</New>
 </FormTemplates>
+</file>
+
+<file path=customXml/item3.xml><?xml version="1.0" encoding="utf-8"?>
+<b:Sources xmlns:b="http://schemas.openxmlformats.org/officeDocument/2006/bibliography" SelectedStyle="\APA.XSL" StyleName="APA"/>
 </file>
 
 <file path=customXml/itemProps1.xml><?xml version="1.0" encoding="utf-8"?>
@@ -12662,17 +13846,17 @@
 </file>
 
 <file path=customXml/itemProps2.xml><?xml version="1.0" encoding="utf-8"?>
+<ds:datastoreItem xmlns:ds="http://schemas.openxmlformats.org/officeDocument/2006/customXml" ds:itemID="{E34C63B7-A026-4A37-9535-4FBB4C03A11D}">
+  <ds:schemaRefs>
+    <ds:schemaRef ds:uri="http://schemas.microsoft.com/sharepoint/v3/contenttype/forms"/>
+  </ds:schemaRefs>
+</ds:datastoreItem>
+</file>
+
+<file path=customXml/itemProps3.xml><?xml version="1.0" encoding="utf-8"?>
 <ds:datastoreItem xmlns:ds="http://schemas.openxmlformats.org/officeDocument/2006/customXml" ds:itemID="{355C5113-D031-41DB-A6D8-43CE1A0E6695}">
   <ds:schemaRefs>
     <ds:schemaRef ds:uri="http://schemas.openxmlformats.org/officeDocument/2006/bibliography"/>
   </ds:schemaRefs>
 </ds:datastoreItem>
-</file>
-
-<file path=customXml/itemProps3.xml><?xml version="1.0" encoding="utf-8"?>
-<ds:datastoreItem xmlns:ds="http://schemas.openxmlformats.org/officeDocument/2006/customXml" ds:itemID="{E34C63B7-A026-4A37-9535-4FBB4C03A11D}">
-  <ds:schemaRefs>
-    <ds:schemaRef ds:uri="http://schemas.microsoft.com/sharepoint/v3/contenttype/forms"/>
-  </ds:schemaRefs>
-</ds:datastoreItem>
 </file>
</xml_diff>

<commit_message>
confirmation of data and organization
</commit_message>
<xml_diff>
--- a/Introduction to DB-CS350 Project.docx
+++ b/Introduction to DB-CS350 Project.docx
@@ -83,7 +83,7 @@
                             <w:sdtContent>
                               <w:p>
                                 <w:pPr>
-                                  <w:pStyle w:val="Title"/>
+                                  <w:pStyle w:val="a9"/>
                                   <w:jc w:val="center"/>
                                   <w:rPr>
                                     <w:sz w:val="96"/>
@@ -102,7 +102,7 @@
                           </w:sdt>
                           <w:p>
                             <w:pPr>
-                              <w:pStyle w:val="Subtitle"/>
+                              <w:pStyle w:val="a6"/>
                               <w:ind w:left="709" w:right="720"/>
                               <w:jc w:val="center"/>
                               <w:rPr>
@@ -474,7 +474,7 @@
                       <w:sdtContent>
                         <w:p>
                           <w:pPr>
-                            <w:pStyle w:val="Title"/>
+                            <w:pStyle w:val="a9"/>
                             <w:jc w:val="center"/>
                             <w:rPr>
                               <w:sz w:val="96"/>
@@ -493,7 +493,7 @@
                     </w:sdt>
                     <w:p>
                       <w:pPr>
-                        <w:pStyle w:val="Subtitle"/>
+                        <w:pStyle w:val="a6"/>
                         <w:ind w:left="709" w:right="720"/>
                         <w:jc w:val="center"/>
                         <w:rPr>
@@ -1254,7 +1254,7 @@
                               <w:txbxContent>
                                 <w:p>
                                   <w:pPr>
-                                    <w:pStyle w:val="ListParagraph"/>
+                                    <w:pStyle w:val="af5"/>
                                     <w:numPr>
                                       <w:ilvl w:val="0"/>
                                       <w:numId w:val="6"/>
@@ -1323,7 +1323,7 @@
                                 </w:p>
                                 <w:p>
                                   <w:pPr>
-                                    <w:pStyle w:val="ListParagraph"/>
+                                    <w:pStyle w:val="af5"/>
                                     <w:numPr>
                                       <w:ilvl w:val="0"/>
                                       <w:numId w:val="6"/>
@@ -1344,7 +1344,7 @@
                                 </w:p>
                                 <w:p>
                                   <w:pPr>
-                                    <w:pStyle w:val="ListParagraph"/>
+                                    <w:pStyle w:val="af5"/>
                                     <w:numPr>
                                       <w:ilvl w:val="0"/>
                                       <w:numId w:val="6"/>
@@ -1456,7 +1456,7 @@
                                 </w:p>
                                 <w:p>
                                   <w:pPr>
-                                    <w:pStyle w:val="ListParagraph"/>
+                                    <w:pStyle w:val="af5"/>
                                     <w:numPr>
                                       <w:ilvl w:val="0"/>
                                       <w:numId w:val="6"/>
@@ -1478,7 +1478,7 @@
                                 </w:p>
                                 <w:p>
                                   <w:pPr>
-                                    <w:pStyle w:val="ListParagraph"/>
+                                    <w:pStyle w:val="af5"/>
                                     <w:numPr>
                                       <w:ilvl w:val="0"/>
                                       <w:numId w:val="6"/>
@@ -1506,7 +1506,7 @@
                                 </w:p>
                                 <w:p>
                                   <w:pPr>
-                                    <w:pStyle w:val="ListParagraph"/>
+                                    <w:pStyle w:val="af5"/>
                                     <w:numPr>
                                       <w:ilvl w:val="0"/>
                                       <w:numId w:val="6"/>
@@ -1528,7 +1528,7 @@
                                 </w:p>
                                 <w:p>
                                   <w:pPr>
-                                    <w:pStyle w:val="ListParagraph"/>
+                                    <w:pStyle w:val="af5"/>
                                     <w:numPr>
                                       <w:ilvl w:val="0"/>
                                       <w:numId w:val="6"/>
@@ -1575,7 +1575,7 @@
                                 </w:p>
                                 <w:p>
                                   <w:pPr>
-                                    <w:pStyle w:val="ListParagraph"/>
+                                    <w:pStyle w:val="af5"/>
                                     <w:numPr>
                                       <w:ilvl w:val="0"/>
                                       <w:numId w:val="6"/>
@@ -1597,7 +1597,7 @@
                                 </w:p>
                                 <w:p>
                                   <w:pPr>
-                                    <w:pStyle w:val="ListParagraph"/>
+                                    <w:pStyle w:val="af5"/>
                                     <w:numPr>
                                       <w:ilvl w:val="0"/>
                                       <w:numId w:val="6"/>
@@ -1637,7 +1637,7 @@
                                 </w:p>
                                 <w:p>
                                   <w:pPr>
-                                    <w:pStyle w:val="ListParagraph"/>
+                                    <w:pStyle w:val="af5"/>
                                     <w:numPr>
                                       <w:ilvl w:val="0"/>
                                       <w:numId w:val="6"/>
@@ -1734,7 +1734,7 @@
                         <w:txbxContent>
                           <w:p>
                             <w:pPr>
-                              <w:pStyle w:val="ListParagraph"/>
+                              <w:pStyle w:val="af5"/>
                               <w:numPr>
                                 <w:ilvl w:val="0"/>
                                 <w:numId w:val="6"/>
@@ -1803,7 +1803,7 @@
                           </w:p>
                           <w:p>
                             <w:pPr>
-                              <w:pStyle w:val="ListParagraph"/>
+                              <w:pStyle w:val="af5"/>
                               <w:numPr>
                                 <w:ilvl w:val="0"/>
                                 <w:numId w:val="6"/>
@@ -1824,7 +1824,7 @@
                           </w:p>
                           <w:p>
                             <w:pPr>
-                              <w:pStyle w:val="ListParagraph"/>
+                              <w:pStyle w:val="af5"/>
                               <w:numPr>
                                 <w:ilvl w:val="0"/>
                                 <w:numId w:val="6"/>
@@ -1936,7 +1936,7 @@
                           </w:p>
                           <w:p>
                             <w:pPr>
-                              <w:pStyle w:val="ListParagraph"/>
+                              <w:pStyle w:val="af5"/>
                               <w:numPr>
                                 <w:ilvl w:val="0"/>
                                 <w:numId w:val="6"/>
@@ -1958,7 +1958,7 @@
                           </w:p>
                           <w:p>
                             <w:pPr>
-                              <w:pStyle w:val="ListParagraph"/>
+                              <w:pStyle w:val="af5"/>
                               <w:numPr>
                                 <w:ilvl w:val="0"/>
                                 <w:numId w:val="6"/>
@@ -1986,7 +1986,7 @@
                           </w:p>
                           <w:p>
                             <w:pPr>
-                              <w:pStyle w:val="ListParagraph"/>
+                              <w:pStyle w:val="af5"/>
                               <w:numPr>
                                 <w:ilvl w:val="0"/>
                                 <w:numId w:val="6"/>
@@ -2008,7 +2008,7 @@
                           </w:p>
                           <w:p>
                             <w:pPr>
-                              <w:pStyle w:val="ListParagraph"/>
+                              <w:pStyle w:val="af5"/>
                               <w:numPr>
                                 <w:ilvl w:val="0"/>
                                 <w:numId w:val="6"/>
@@ -2055,7 +2055,7 @@
                           </w:p>
                           <w:p>
                             <w:pPr>
-                              <w:pStyle w:val="ListParagraph"/>
+                              <w:pStyle w:val="af5"/>
                               <w:numPr>
                                 <w:ilvl w:val="0"/>
                                 <w:numId w:val="6"/>
@@ -2077,7 +2077,7 @@
                           </w:p>
                           <w:p>
                             <w:pPr>
-                              <w:pStyle w:val="ListParagraph"/>
+                              <w:pStyle w:val="af5"/>
                               <w:numPr>
                                 <w:ilvl w:val="0"/>
                                 <w:numId w:val="6"/>
@@ -2117,7 +2117,7 @@
                           </w:p>
                           <w:p>
                             <w:pPr>
-                              <w:pStyle w:val="ListParagraph"/>
+                              <w:pStyle w:val="af5"/>
                               <w:numPr>
                                 <w:ilvl w:val="0"/>
                                 <w:numId w:val="6"/>
@@ -2298,7 +2298,7 @@
                                     </w:tcPr>
                                     <w:p>
                                       <w:pPr>
-                                        <w:pStyle w:val="Footer"/>
+                                        <w:pStyle w:val="a5"/>
                                         <w:rPr>
                                           <w:b/>
                                           <w:bCs/>
@@ -2336,7 +2336,7 @@
                                     </w:p>
                                     <w:p>
                                       <w:pPr>
-                                        <w:pStyle w:val="Footer"/>
+                                        <w:pStyle w:val="a5"/>
                                         <w:rPr>
                                           <w:b/>
                                           <w:bCs/>
@@ -2385,7 +2385,7 @@
                                     </w:p>
                                     <w:p>
                                       <w:pPr>
-                                        <w:pStyle w:val="Footer"/>
+                                        <w:pStyle w:val="a5"/>
                                         <w:rPr>
                                           <w:b/>
                                           <w:bCs/>
@@ -2423,7 +2423,7 @@
                                     </w:p>
                                     <w:p>
                                       <w:pPr>
-                                        <w:pStyle w:val="Footer"/>
+                                        <w:pStyle w:val="a5"/>
                                         <w:rPr>
                                           <w:b/>
                                           <w:bCs/>
@@ -2449,10 +2449,19 @@
                                         </w:rPr>
                                         <w:t xml:space="preserve"> </w:t>
                                       </w:r>
+                                      <w:r>
+                                        <w:rPr>
+                                          <w:b/>
+                                          <w:bCs/>
+                                          <w:sz w:val="28"/>
+                                          <w:szCs w:val="28"/>
+                                        </w:rPr>
+                                        <w:t>Ahmed Almuqrin</w:t>
+                                      </w:r>
                                     </w:p>
                                     <w:p>
                                       <w:pPr>
-                                        <w:pStyle w:val="Footer"/>
+                                        <w:pStyle w:val="a5"/>
                                         <w:ind w:left="0"/>
                                         <w:rPr>
                                           <w:b/>
@@ -2472,7 +2481,7 @@
                                     </w:tcPr>
                                     <w:p>
                                       <w:pPr>
-                                        <w:pStyle w:val="Footer"/>
+                                        <w:pStyle w:val="a5"/>
                                         <w:ind w:left="0"/>
                                         <w:rPr>
                                           <w:b/>
@@ -2490,7 +2499,7 @@
                                     </w:tcPr>
                                     <w:p>
                                       <w:pPr>
-                                        <w:pStyle w:val="Footer"/>
+                                        <w:pStyle w:val="a5"/>
                                         <w:rPr>
                                           <w:b/>
                                           <w:bCs/>
@@ -2528,7 +2537,7 @@
                                     </w:p>
                                     <w:p>
                                       <w:pPr>
-                                        <w:pStyle w:val="Footer"/>
+                                        <w:pStyle w:val="a5"/>
                                         <w:rPr>
                                           <w:b/>
                                           <w:bCs/>
@@ -2566,7 +2575,7 @@
                                     </w:p>
                                     <w:p>
                                       <w:pPr>
-                                        <w:pStyle w:val="Footer"/>
+                                        <w:pStyle w:val="a5"/>
                                         <w:rPr>
                                           <w:b/>
                                           <w:bCs/>
@@ -2604,7 +2613,7 @@
                                     </w:p>
                                     <w:p>
                                       <w:pPr>
-                                        <w:pStyle w:val="Footer"/>
+                                        <w:pStyle w:val="a5"/>
                                         <w:rPr>
                                           <w:b/>
                                           <w:bCs/>
@@ -2630,6 +2639,15 @@
                                         </w:rPr>
                                         <w:t xml:space="preserve"> </w:t>
                                       </w:r>
+                                      <w:r>
+                                        <w:rPr>
+                                          <w:b/>
+                                          <w:bCs/>
+                                          <w:sz w:val="28"/>
+                                          <w:szCs w:val="28"/>
+                                        </w:rPr>
+                                        <w:t>S210024447</w:t>
+                                      </w:r>
                                     </w:p>
                                   </w:tc>
                                 </w:tr>
@@ -2645,7 +2663,7 @@
                                     </w:tcPr>
                                     <w:p>
                                       <w:pPr>
-                                        <w:pStyle w:val="Footer"/>
+                                        <w:pStyle w:val="a5"/>
                                         <w:ind w:left="0"/>
                                       </w:pPr>
                                     </w:p>
@@ -2657,7 +2675,7 @@
                                     </w:tcPr>
                                     <w:p>
                                       <w:pPr>
-                                        <w:pStyle w:val="Footer"/>
+                                        <w:pStyle w:val="a5"/>
                                       </w:pPr>
                                     </w:p>
                                   </w:tc>
@@ -2668,7 +2686,7 @@
                                     </w:tcPr>
                                     <w:p>
                                       <w:pPr>
-                                        <w:pStyle w:val="Footer"/>
+                                        <w:pStyle w:val="a5"/>
                                       </w:pPr>
                                     </w:p>
                                   </w:tc>
@@ -2676,7 +2694,7 @@
                               </w:tbl>
                               <w:p>
                                 <w:pPr>
-                                  <w:pStyle w:val="NoSpacing"/>
+                                  <w:pStyle w:val="ad"/>
                                 </w:pPr>
                               </w:p>
                             </w:txbxContent>
@@ -2779,7 +2797,7 @@
                               </w:tcPr>
                               <w:p>
                                 <w:pPr>
-                                  <w:pStyle w:val="Footer"/>
+                                  <w:pStyle w:val="a5"/>
                                   <w:rPr>
                                     <w:b/>
                                     <w:bCs/>
@@ -2817,7 +2835,7 @@
                               </w:p>
                               <w:p>
                                 <w:pPr>
-                                  <w:pStyle w:val="Footer"/>
+                                  <w:pStyle w:val="a5"/>
                                   <w:rPr>
                                     <w:b/>
                                     <w:bCs/>
@@ -2866,7 +2884,7 @@
                               </w:p>
                               <w:p>
                                 <w:pPr>
-                                  <w:pStyle w:val="Footer"/>
+                                  <w:pStyle w:val="a5"/>
                                   <w:rPr>
                                     <w:b/>
                                     <w:bCs/>
@@ -2904,7 +2922,7 @@
                               </w:p>
                               <w:p>
                                 <w:pPr>
-                                  <w:pStyle w:val="Footer"/>
+                                  <w:pStyle w:val="a5"/>
                                   <w:rPr>
                                     <w:b/>
                                     <w:bCs/>
@@ -2930,10 +2948,19 @@
                                   </w:rPr>
                                   <w:t xml:space="preserve"> </w:t>
                                 </w:r>
+                                <w:r>
+                                  <w:rPr>
+                                    <w:b/>
+                                    <w:bCs/>
+                                    <w:sz w:val="28"/>
+                                    <w:szCs w:val="28"/>
+                                  </w:rPr>
+                                  <w:t>Ahmed Almuqrin</w:t>
+                                </w:r>
                               </w:p>
                               <w:p>
                                 <w:pPr>
-                                  <w:pStyle w:val="Footer"/>
+                                  <w:pStyle w:val="a5"/>
                                   <w:ind w:left="0"/>
                                   <w:rPr>
                                     <w:b/>
@@ -2953,7 +2980,7 @@
                               </w:tcPr>
                               <w:p>
                                 <w:pPr>
-                                  <w:pStyle w:val="Footer"/>
+                                  <w:pStyle w:val="a5"/>
                                   <w:ind w:left="0"/>
                                   <w:rPr>
                                     <w:b/>
@@ -2971,7 +2998,7 @@
                               </w:tcPr>
                               <w:p>
                                 <w:pPr>
-                                  <w:pStyle w:val="Footer"/>
+                                  <w:pStyle w:val="a5"/>
                                   <w:rPr>
                                     <w:b/>
                                     <w:bCs/>
@@ -3009,7 +3036,7 @@
                               </w:p>
                               <w:p>
                                 <w:pPr>
-                                  <w:pStyle w:val="Footer"/>
+                                  <w:pStyle w:val="a5"/>
                                   <w:rPr>
                                     <w:b/>
                                     <w:bCs/>
@@ -3047,7 +3074,7 @@
                               </w:p>
                               <w:p>
                                 <w:pPr>
-                                  <w:pStyle w:val="Footer"/>
+                                  <w:pStyle w:val="a5"/>
                                   <w:rPr>
                                     <w:b/>
                                     <w:bCs/>
@@ -3085,7 +3112,7 @@
                               </w:p>
                               <w:p>
                                 <w:pPr>
-                                  <w:pStyle w:val="Footer"/>
+                                  <w:pStyle w:val="a5"/>
                                   <w:rPr>
                                     <w:b/>
                                     <w:bCs/>
@@ -3111,6 +3138,15 @@
                                   </w:rPr>
                                   <w:t xml:space="preserve"> </w:t>
                                 </w:r>
+                                <w:r>
+                                  <w:rPr>
+                                    <w:b/>
+                                    <w:bCs/>
+                                    <w:sz w:val="28"/>
+                                    <w:szCs w:val="28"/>
+                                  </w:rPr>
+                                  <w:t>S210024447</w:t>
+                                </w:r>
                               </w:p>
                             </w:tc>
                           </w:tr>
@@ -3126,7 +3162,7 @@
                               </w:tcPr>
                               <w:p>
                                 <w:pPr>
-                                  <w:pStyle w:val="Footer"/>
+                                  <w:pStyle w:val="a5"/>
                                   <w:ind w:left="0"/>
                                 </w:pPr>
                               </w:p>
@@ -3138,7 +3174,7 @@
                               </w:tcPr>
                               <w:p>
                                 <w:pPr>
-                                  <w:pStyle w:val="Footer"/>
+                                  <w:pStyle w:val="a5"/>
                                 </w:pPr>
                               </w:p>
                             </w:tc>
@@ -3149,7 +3185,7 @@
                               </w:tcPr>
                               <w:p>
                                 <w:pPr>
-                                  <w:pStyle w:val="Footer"/>
+                                  <w:pStyle w:val="a5"/>
                                 </w:pPr>
                               </w:p>
                             </w:tc>
@@ -3157,7 +3193,7 @@
                         </w:tbl>
                         <w:p>
                           <w:pPr>
-                            <w:pStyle w:val="NoSpacing"/>
+                            <w:pStyle w:val="ad"/>
                           </w:pPr>
                         </w:p>
                       </w:txbxContent>
@@ -3199,7 +3235,7 @@
     </w:p>
     <w:p>
       <w:pPr>
-        <w:pStyle w:val="Heading1"/>
+        <w:pStyle w:val="1"/>
         <w:spacing w:before="0" w:after="0"/>
         <w:rPr>
           <w:rFonts w:ascii="Times New Roman" w:hAnsi="Times New Roman" w:cs="Times New Roman"/>
@@ -3340,7 +3376,7 @@
     </w:p>
     <w:p>
       <w:pPr>
-        <w:pStyle w:val="ListParagraph"/>
+        <w:pStyle w:val="af5"/>
         <w:numPr>
           <w:ilvl w:val="1"/>
           <w:numId w:val="6"/>
@@ -3419,7 +3455,7 @@
     </w:p>
     <w:p>
       <w:pPr>
-        <w:pStyle w:val="ListParagraph"/>
+        <w:pStyle w:val="af5"/>
         <w:numPr>
           <w:ilvl w:val="1"/>
           <w:numId w:val="6"/>
@@ -3505,7 +3541,7 @@
     </w:p>
     <w:p>
       <w:pPr>
-        <w:pStyle w:val="ListParagraph"/>
+        <w:pStyle w:val="af5"/>
         <w:numPr>
           <w:ilvl w:val="1"/>
           <w:numId w:val="6"/>
@@ -3591,7 +3627,7 @@
     </w:p>
     <w:p>
       <w:pPr>
-        <w:pStyle w:val="ListParagraph"/>
+        <w:pStyle w:val="af5"/>
         <w:numPr>
           <w:ilvl w:val="1"/>
           <w:numId w:val="6"/>
@@ -3837,7 +3873,7 @@
     </w:p>
     <w:p>
       <w:pPr>
-        <w:pStyle w:val="ListParagraph"/>
+        <w:pStyle w:val="af5"/>
         <w:numPr>
           <w:ilvl w:val="0"/>
           <w:numId w:val="19"/>
@@ -3880,7 +3916,7 @@
     </w:p>
     <w:p>
       <w:pPr>
-        <w:pStyle w:val="ListParagraph"/>
+        <w:pStyle w:val="af5"/>
         <w:numPr>
           <w:ilvl w:val="0"/>
           <w:numId w:val="19"/>
@@ -3905,7 +3941,7 @@
     </w:p>
     <w:p>
       <w:pPr>
-        <w:pStyle w:val="ListParagraph"/>
+        <w:pStyle w:val="af5"/>
         <w:numPr>
           <w:ilvl w:val="0"/>
           <w:numId w:val="19"/>
@@ -4002,7 +4038,7 @@
     </w:p>
     <w:p>
       <w:pPr>
-        <w:pStyle w:val="ListParagraph"/>
+        <w:pStyle w:val="af5"/>
         <w:numPr>
           <w:ilvl w:val="0"/>
           <w:numId w:val="19"/>
@@ -4383,7 +4419,7 @@
     </w:p>
     <w:p>
       <w:pPr>
-        <w:pStyle w:val="ListParagraph"/>
+        <w:pStyle w:val="af5"/>
         <w:numPr>
           <w:ilvl w:val="0"/>
           <w:numId w:val="7"/>
@@ -4421,7 +4457,7 @@
     </w:p>
     <w:p>
       <w:pPr>
-        <w:pStyle w:val="ListParagraph"/>
+        <w:pStyle w:val="af5"/>
         <w:numPr>
           <w:ilvl w:val="0"/>
           <w:numId w:val="7"/>
@@ -4537,7 +4573,7 @@
     </w:p>
     <w:p>
       <w:pPr>
-        <w:pStyle w:val="Heading1"/>
+        <w:pStyle w:val="1"/>
         <w:rPr>
           <w:rFonts w:ascii="Times New Roman" w:hAnsi="Times New Roman" w:cs="Times New Roman"/>
           <w:color w:val="auto"/>
@@ -4656,16 +4692,16 @@
                         <w:txbxContent>
                           <w:p>
                             <w:pPr>
-                              <w:pStyle w:val="Quote"/>
+                              <w:pStyle w:val="af"/>
                               <w:rPr>
-                                <w:rStyle w:val="QuoteChar"/>
+                                <w:rStyle w:val="Char5"/>
                                 <w:i/>
                                 <w:iCs/>
                               </w:rPr>
                             </w:pPr>
                             <w:r>
                               <w:rPr>
-                                <w:rStyle w:val="QuoteChar"/>
+                                <w:rStyle w:val="Char5"/>
                                 <w:i/>
                                 <w:iCs/>
                               </w:rPr>
@@ -4683,7 +4719,7 @@
                           </w:p>
                           <w:p>
                             <w:pPr>
-                              <w:pStyle w:val="NormalWeb"/>
+                              <w:pStyle w:val="af6"/>
                               <w:shd w:val="clear" w:color="auto" w:fill="FFFFFF"/>
                               <w:spacing w:before="0" w:beforeAutospacing="0" w:after="0" w:afterAutospacing="0" w:line="360" w:lineRule="auto"/>
                               <w:jc w:val="both"/>
@@ -4711,7 +4747,7 @@
                           </w:p>
                           <w:p>
                             <w:pPr>
-                              <w:pStyle w:val="NormalWeb"/>
+                              <w:pStyle w:val="af6"/>
                               <w:shd w:val="clear" w:color="auto" w:fill="FFFFFF"/>
                               <w:spacing w:before="0" w:beforeAutospacing="0" w:after="0" w:afterAutospacing="0"/>
                               <w:rPr>
@@ -4779,16 +4815,16 @@
                   <w:txbxContent>
                     <w:p>
                       <w:pPr>
-                        <w:pStyle w:val="Quote"/>
+                        <w:pStyle w:val="af"/>
                         <w:rPr>
-                          <w:rStyle w:val="QuoteChar"/>
+                          <w:rStyle w:val="Char5"/>
                           <w:i/>
                           <w:iCs/>
                         </w:rPr>
                       </w:pPr>
                       <w:r>
                         <w:rPr>
-                          <w:rStyle w:val="QuoteChar"/>
+                          <w:rStyle w:val="Char5"/>
                           <w:i/>
                           <w:iCs/>
                         </w:rPr>
@@ -4806,7 +4842,7 @@
                     </w:p>
                     <w:p>
                       <w:pPr>
-                        <w:pStyle w:val="NormalWeb"/>
+                        <w:pStyle w:val="af6"/>
                         <w:shd w:val="clear" w:color="auto" w:fill="FFFFFF"/>
                         <w:spacing w:before="0" w:beforeAutospacing="0" w:after="0" w:afterAutospacing="0" w:line="360" w:lineRule="auto"/>
                         <w:jc w:val="both"/>
@@ -4834,7 +4870,7 @@
                     </w:p>
                     <w:p>
                       <w:pPr>
-                        <w:pStyle w:val="NormalWeb"/>
+                        <w:pStyle w:val="af6"/>
                         <w:shd w:val="clear" w:color="auto" w:fill="FFFFFF"/>
                         <w:spacing w:before="0" w:beforeAutospacing="0" w:after="0" w:afterAutospacing="0"/>
                         <w:rPr>
@@ -4936,7 +4972,7 @@
     </w:p>
     <w:p>
       <w:pPr>
-        <w:pStyle w:val="Heading1"/>
+        <w:pStyle w:val="1"/>
       </w:pPr>
       <w:r>
         <w:lastRenderedPageBreak/>
@@ -4945,7 +4981,7 @@
     </w:p>
     <w:p>
       <w:pPr>
-        <w:pStyle w:val="ListBullet"/>
+        <w:pStyle w:val="a"/>
         <w:rPr>
           <w:rFonts w:ascii="Times New Roman" w:hAnsi="Times New Roman" w:cs="Times New Roman"/>
           <w:sz w:val="24"/>
@@ -4963,7 +4999,7 @@
     </w:p>
     <w:p>
       <w:pPr>
-        <w:pStyle w:val="ListBullet"/>
+        <w:pStyle w:val="a"/>
         <w:rPr>
           <w:rFonts w:ascii="Times New Roman" w:hAnsi="Times New Roman" w:cs="Times New Roman"/>
           <w:sz w:val="24"/>
@@ -5003,7 +5039,7 @@
     </w:p>
     <w:p>
       <w:pPr>
-        <w:pStyle w:val="ListBullet"/>
+        <w:pStyle w:val="a"/>
         <w:rPr>
           <w:rFonts w:ascii="Times New Roman" w:hAnsi="Times New Roman" w:cs="Times New Roman"/>
           <w:sz w:val="24"/>
@@ -5021,7 +5057,7 @@
     </w:p>
     <w:p>
       <w:pPr>
-        <w:pStyle w:val="ListBullet"/>
+        <w:pStyle w:val="a"/>
         <w:rPr>
           <w:rFonts w:ascii="Times New Roman" w:hAnsi="Times New Roman" w:cs="Times New Roman"/>
           <w:sz w:val="24"/>
@@ -5039,7 +5075,7 @@
     </w:p>
     <w:p>
       <w:pPr>
-        <w:pStyle w:val="ListBullet"/>
+        <w:pStyle w:val="a"/>
         <w:rPr>
           <w:rFonts w:ascii="Times New Roman" w:hAnsi="Times New Roman" w:cs="Times New Roman"/>
           <w:sz w:val="24"/>
@@ -5057,7 +5093,7 @@
     </w:p>
     <w:p>
       <w:pPr>
-        <w:pStyle w:val="ListBullet"/>
+        <w:pStyle w:val="a"/>
         <w:rPr>
           <w:rFonts w:ascii="Times New Roman" w:hAnsi="Times New Roman" w:cs="Times New Roman"/>
           <w:sz w:val="24"/>
@@ -5075,7 +5111,7 @@
     </w:p>
     <w:p>
       <w:pPr>
-        <w:pStyle w:val="ListBullet"/>
+        <w:pStyle w:val="a"/>
         <w:numPr>
           <w:ilvl w:val="0"/>
           <w:numId w:val="0"/>
@@ -5090,7 +5126,7 @@
     </w:p>
     <w:p>
       <w:pPr>
-        <w:pStyle w:val="ListBullet"/>
+        <w:pStyle w:val="a"/>
         <w:numPr>
           <w:ilvl w:val="0"/>
           <w:numId w:val="0"/>
@@ -5105,7 +5141,7 @@
     </w:p>
     <w:p>
       <w:pPr>
-        <w:pStyle w:val="ListBullet"/>
+        <w:pStyle w:val="a"/>
         <w:numPr>
           <w:ilvl w:val="0"/>
           <w:numId w:val="30"/>
@@ -5133,7 +5169,7 @@
     </w:p>
     <w:p>
       <w:pPr>
-        <w:pStyle w:val="ListBullet"/>
+        <w:pStyle w:val="a"/>
         <w:numPr>
           <w:ilvl w:val="0"/>
           <w:numId w:val="0"/>
@@ -5151,7 +5187,7 @@
     </w:p>
     <w:p>
       <w:pPr>
-        <w:pStyle w:val="ListBullet"/>
+        <w:pStyle w:val="a"/>
         <w:numPr>
           <w:ilvl w:val="0"/>
           <w:numId w:val="28"/>
@@ -5175,7 +5211,7 @@
     </w:p>
     <w:p>
       <w:pPr>
-        <w:pStyle w:val="ListBullet"/>
+        <w:pStyle w:val="a"/>
         <w:numPr>
           <w:ilvl w:val="0"/>
           <w:numId w:val="28"/>
@@ -5199,7 +5235,7 @@
     </w:p>
     <w:p>
       <w:pPr>
-        <w:pStyle w:val="ListBullet"/>
+        <w:pStyle w:val="a"/>
         <w:numPr>
           <w:ilvl w:val="0"/>
           <w:numId w:val="29"/>
@@ -5225,7 +5261,7 @@
     </w:p>
     <w:p>
       <w:pPr>
-        <w:pStyle w:val="ListBullet"/>
+        <w:pStyle w:val="a"/>
         <w:numPr>
           <w:ilvl w:val="0"/>
           <w:numId w:val="29"/>
@@ -5249,7 +5285,7 @@
     </w:p>
     <w:p>
       <w:pPr>
-        <w:pStyle w:val="ListBullet"/>
+        <w:pStyle w:val="a"/>
         <w:numPr>
           <w:ilvl w:val="0"/>
           <w:numId w:val="28"/>
@@ -5273,7 +5309,7 @@
     </w:p>
     <w:p>
       <w:pPr>
-        <w:pStyle w:val="ListBullet"/>
+        <w:pStyle w:val="a"/>
         <w:numPr>
           <w:ilvl w:val="0"/>
           <w:numId w:val="28"/>
@@ -5297,7 +5333,7 @@
     </w:p>
     <w:p>
       <w:pPr>
-        <w:pStyle w:val="ListBullet"/>
+        <w:pStyle w:val="a"/>
         <w:numPr>
           <w:ilvl w:val="0"/>
           <w:numId w:val="28"/>
@@ -5321,7 +5357,7 @@
     </w:p>
     <w:p>
       <w:pPr>
-        <w:pStyle w:val="ListBullet"/>
+        <w:pStyle w:val="a"/>
         <w:numPr>
           <w:ilvl w:val="0"/>
           <w:numId w:val="28"/>
@@ -5345,7 +5381,7 @@
     </w:p>
     <w:p>
       <w:pPr>
-        <w:pStyle w:val="ListBullet"/>
+        <w:pStyle w:val="a"/>
         <w:numPr>
           <w:ilvl w:val="0"/>
           <w:numId w:val="0"/>
@@ -5360,7 +5396,7 @@
     </w:p>
     <w:p>
       <w:pPr>
-        <w:pStyle w:val="ListBullet"/>
+        <w:pStyle w:val="a"/>
         <w:numPr>
           <w:ilvl w:val="0"/>
           <w:numId w:val="0"/>
@@ -5375,7 +5411,7 @@
     </w:p>
     <w:p>
       <w:pPr>
-        <w:pStyle w:val="ListBullet"/>
+        <w:pStyle w:val="a"/>
         <w:numPr>
           <w:ilvl w:val="0"/>
           <w:numId w:val="0"/>
@@ -5390,7 +5426,7 @@
     </w:p>
     <w:p>
       <w:pPr>
-        <w:pStyle w:val="ListBullet"/>
+        <w:pStyle w:val="a"/>
         <w:numPr>
           <w:ilvl w:val="0"/>
           <w:numId w:val="30"/>
@@ -5418,7 +5454,7 @@
     </w:p>
     <w:p>
       <w:pPr>
-        <w:pStyle w:val="ListBullet"/>
+        <w:pStyle w:val="a"/>
         <w:numPr>
           <w:ilvl w:val="0"/>
           <w:numId w:val="0"/>
@@ -5434,7 +5470,7 @@
     </w:p>
     <w:p>
       <w:pPr>
-        <w:pStyle w:val="ListBullet"/>
+        <w:pStyle w:val="a"/>
         <w:numPr>
           <w:ilvl w:val="0"/>
           <w:numId w:val="0"/>
@@ -5459,11 +5495,64 @@
     </w:p>
     <w:p>
       <w:pPr>
-        <w:pStyle w:val="ListBullet"/>
+        <w:pStyle w:val="a"/>
         <w:numPr>
           <w:ilvl w:val="0"/>
-          <w:numId w:val="32"/>
+          <w:numId w:val="28"/>
         </w:numPr>
+        <w:rPr>
+          <w:rFonts w:ascii="Times New Roman" w:hAnsi="Times New Roman" w:cs="Times New Roman"/>
+          <w:color w:val="auto"/>
+          <w:sz w:val="24"/>
+          <w:szCs w:val="24"/>
+        </w:rPr>
+      </w:pPr>
+      <w:proofErr w:type="spellStart"/>
+      <w:proofErr w:type="gramStart"/>
+      <w:r>
+        <w:rPr>
+          <w:rFonts w:ascii="Times New Roman" w:hAnsi="Times New Roman" w:cs="Times New Roman"/>
+          <w:color w:val="auto"/>
+          <w:sz w:val="24"/>
+          <w:szCs w:val="24"/>
+        </w:rPr>
+        <w:t>GeneralPractitioner</w:t>
+      </w:r>
+      <w:proofErr w:type="spellEnd"/>
+      <w:proofErr w:type="gramEnd"/>
+    </w:p>
+    <w:p>
+      <w:pPr>
+        <w:pStyle w:val="a"/>
+        <w:numPr>
+          <w:ilvl w:val="0"/>
+          <w:numId w:val="28"/>
+        </w:numPr>
+        <w:rPr>
+          <w:rFonts w:ascii="Times New Roman" w:hAnsi="Times New Roman" w:cs="Times New Roman"/>
+          <w:color w:val="auto"/>
+          <w:sz w:val="24"/>
+          <w:szCs w:val="24"/>
+        </w:rPr>
+      </w:pPr>
+      <w:r>
+        <w:rPr>
+          <w:rFonts w:ascii="Times New Roman" w:hAnsi="Times New Roman" w:cs="Times New Roman"/>
+          <w:color w:val="auto"/>
+          <w:sz w:val="24"/>
+          <w:szCs w:val="24"/>
+        </w:rPr>
+        <w:t>Specialist</w:t>
+      </w:r>
+    </w:p>
+    <w:p>
+      <w:pPr>
+        <w:pStyle w:val="a"/>
+        <w:numPr>
+          <w:ilvl w:val="0"/>
+          <w:numId w:val="0"/>
+        </w:numPr>
+        <w:ind w:left="576" w:hanging="288"/>
         <w:rPr>
           <w:rFonts w:ascii="Times New Roman" w:hAnsi="Times New Roman" w:cs="Times New Roman"/>
           <w:b/>
@@ -5473,37 +5562,43 @@
           <w:szCs w:val="24"/>
         </w:rPr>
       </w:pPr>
-      <w:proofErr w:type="spellStart"/>
-      <w:r>
+    </w:p>
+    <w:p>
+      <w:pPr>
+        <w:pStyle w:val="a"/>
+        <w:numPr>
+          <w:ilvl w:val="0"/>
+          <w:numId w:val="30"/>
+        </w:numPr>
         <w:rPr>
           <w:rFonts w:ascii="Times New Roman" w:hAnsi="Times New Roman" w:cs="Times New Roman"/>
           <w:b/>
           <w:bCs/>
           <w:color w:val="262626" w:themeColor="accent6" w:themeShade="80"/>
-          <w:sz w:val="24"/>
-          <w:szCs w:val="24"/>
-        </w:rPr>
-        <w:t>GeneralPractitioner</w:t>
-      </w:r>
-      <w:proofErr w:type="spellEnd"/>
-    </w:p>
-    <w:p>
-      <w:pPr>
-        <w:pStyle w:val="ListBullet"/>
-        <w:numPr>
-          <w:ilvl w:val="0"/>
-          <w:numId w:val="32"/>
-        </w:numPr>
+          <w:sz w:val="28"/>
+          <w:szCs w:val="28"/>
+        </w:rPr>
+      </w:pPr>
+      <w:r>
         <w:rPr>
           <w:rFonts w:ascii="Times New Roman" w:hAnsi="Times New Roman" w:cs="Times New Roman"/>
           <w:b/>
           <w:bCs/>
           <w:color w:val="262626" w:themeColor="accent6" w:themeShade="80"/>
-          <w:sz w:val="24"/>
-          <w:szCs w:val="24"/>
-        </w:rPr>
-      </w:pPr>
-      <w:r>
+          <w:sz w:val="28"/>
+          <w:szCs w:val="28"/>
+        </w:rPr>
+        <w:lastRenderedPageBreak/>
+        <w:t>Entity Attributes (Primary and Foreign keys):</w:t>
+      </w:r>
+    </w:p>
+    <w:p>
+      <w:pPr>
+        <w:pStyle w:val="a"/>
+        <w:numPr>
+          <w:ilvl w:val="0"/>
+          <w:numId w:val="0"/>
+        </w:numPr>
         <w:rPr>
           <w:rFonts w:ascii="Times New Roman" w:hAnsi="Times New Roman" w:cs="Times New Roman"/>
           <w:b/>
@@ -5512,8 +5607,7 @@
           <w:sz w:val="24"/>
           <w:szCs w:val="24"/>
         </w:rPr>
-        <w:t>Specialist</w:t>
-      </w:r>
+      </w:pPr>
     </w:p>
     <w:tbl>
       <w:tblPr>
@@ -5527,8 +5621,8 @@
         <w:tblLook w:val="04A0" w:firstRow="1" w:lastRow="0" w:firstColumn="1" w:lastColumn="0" w:noHBand="0" w:noVBand="1"/>
       </w:tblPr>
       <w:tblGrid>
-        <w:gridCol w:w="2354"/>
-        <w:gridCol w:w="6050"/>
+        <w:gridCol w:w="2368"/>
+        <w:gridCol w:w="6036"/>
       </w:tblGrid>
       <w:tr>
         <w:tc>
@@ -5550,7 +5644,7 @@
           </w:tcPr>
           <w:p>
             <w:pPr>
-              <w:pStyle w:val="ListBullet"/>
+              <w:pStyle w:val="a"/>
               <w:numPr>
                 <w:ilvl w:val="0"/>
                 <w:numId w:val="0"/>
@@ -5572,7 +5666,6 @@
                 <w:sz w:val="24"/>
                 <w:szCs w:val="24"/>
               </w:rPr>
-              <w:lastRenderedPageBreak/>
               <w:t>Entity </w:t>
             </w:r>
           </w:p>
@@ -5596,7 +5689,7 @@
           </w:tcPr>
           <w:p>
             <w:pPr>
-              <w:pStyle w:val="ListBullet"/>
+              <w:pStyle w:val="a"/>
               <w:numPr>
                 <w:ilvl w:val="0"/>
                 <w:numId w:val="0"/>
@@ -5643,7 +5736,7 @@
           </w:tcPr>
           <w:p>
             <w:pPr>
-              <w:pStyle w:val="ListBullet"/>
+              <w:pStyle w:val="a"/>
               <w:numPr>
                 <w:ilvl w:val="0"/>
                 <w:numId w:val="0"/>
@@ -5686,7 +5779,7 @@
           </w:tcPr>
           <w:p>
             <w:pPr>
-              <w:pStyle w:val="ListBullet"/>
+              <w:pStyle w:val="a"/>
               <w:numPr>
                 <w:ilvl w:val="0"/>
                 <w:numId w:val="0"/>
@@ -5742,7 +5835,7 @@
           </w:tcPr>
           <w:p>
             <w:pPr>
-              <w:pStyle w:val="ListBullet"/>
+              <w:pStyle w:val="a"/>
               <w:numPr>
                 <w:ilvl w:val="0"/>
                 <w:numId w:val="0"/>
@@ -5785,7 +5878,7 @@
           </w:tcPr>
           <w:p>
             <w:pPr>
-              <w:pStyle w:val="ListBullet"/>
+              <w:pStyle w:val="a"/>
               <w:numPr>
                 <w:ilvl w:val="0"/>
                 <w:numId w:val="0"/>
@@ -5852,7 +5945,7 @@
           </w:tcPr>
           <w:p>
             <w:pPr>
-              <w:pStyle w:val="ListBullet"/>
+              <w:pStyle w:val="a"/>
               <w:numPr>
                 <w:ilvl w:val="0"/>
                 <w:numId w:val="0"/>
@@ -5895,7 +5988,7 @@
           </w:tcPr>
           <w:p>
             <w:pPr>
-              <w:pStyle w:val="ListBullet"/>
+              <w:pStyle w:val="a"/>
               <w:numPr>
                 <w:ilvl w:val="0"/>
                 <w:numId w:val="0"/>
@@ -5971,7 +6064,7 @@
           </w:tcPr>
           <w:p>
             <w:pPr>
-              <w:pStyle w:val="ListBullet"/>
+              <w:pStyle w:val="a"/>
               <w:numPr>
                 <w:ilvl w:val="0"/>
                 <w:numId w:val="0"/>
@@ -5992,7 +6085,7 @@
                 <w:sz w:val="24"/>
                 <w:szCs w:val="24"/>
               </w:rPr>
-              <w:t>GenetalPractitioner</w:t>
+              <w:t>GeneralPractitioner</w:t>
             </w:r>
             <w:proofErr w:type="spellEnd"/>
           </w:p>
@@ -6016,7 +6109,7 @@
           </w:tcPr>
           <w:p>
             <w:pPr>
-              <w:pStyle w:val="ListBullet"/>
+              <w:pStyle w:val="a"/>
               <w:numPr>
                 <w:ilvl w:val="0"/>
                 <w:numId w:val="0"/>
@@ -6030,7 +6123,6 @@
               </w:rPr>
             </w:pPr>
             <w:proofErr w:type="spellStart"/>
-            <w:proofErr w:type="gramStart"/>
             <w:r>
               <w:rPr>
                 <w:rFonts w:ascii="Times New Roman" w:hAnsi="Times New Roman" w:cs="Times New Roman"/>
@@ -6048,9 +6140,8 @@
                 <w:sz w:val="24"/>
                 <w:szCs w:val="24"/>
               </w:rPr>
-              <w:t>(</w:t>
+              <w:t xml:space="preserve"> </w:t>
             </w:r>
-            <w:proofErr w:type="gramEnd"/>
             <w:r>
               <w:rPr>
                 <w:rFonts w:ascii="Times New Roman" w:hAnsi="Times New Roman" w:cs="Times New Roman"/>
@@ -6058,7 +6149,7 @@
                 <w:sz w:val="24"/>
                 <w:szCs w:val="24"/>
               </w:rPr>
-              <w:t>PK, FK)</w:t>
+              <w:t>(PK, FK)</w:t>
             </w:r>
           </w:p>
         </w:tc>
@@ -6083,7 +6174,7 @@
           </w:tcPr>
           <w:p>
             <w:pPr>
-              <w:pStyle w:val="ListBullet"/>
+              <w:pStyle w:val="a"/>
               <w:numPr>
                 <w:ilvl w:val="0"/>
                 <w:numId w:val="0"/>
@@ -6126,7 +6217,7 @@
           </w:tcPr>
           <w:p>
             <w:pPr>
-              <w:pStyle w:val="ListBullet"/>
+              <w:pStyle w:val="a"/>
               <w:numPr>
                 <w:ilvl w:val="0"/>
                 <w:numId w:val="0"/>
@@ -6140,7 +6231,6 @@
               </w:rPr>
             </w:pPr>
             <w:proofErr w:type="spellStart"/>
-            <w:proofErr w:type="gramStart"/>
             <w:r>
               <w:rPr>
                 <w:rFonts w:ascii="Times New Roman" w:hAnsi="Times New Roman" w:cs="Times New Roman"/>
@@ -6158,7 +6248,26 @@
                 <w:sz w:val="24"/>
                 <w:szCs w:val="24"/>
               </w:rPr>
-              <w:t>(PK,FK</w:t>
+              <w:t xml:space="preserve"> </w:t>
+            </w:r>
+            <w:r>
+              <w:rPr>
+                <w:rFonts w:ascii="Times New Roman" w:hAnsi="Times New Roman" w:cs="Times New Roman"/>
+                <w:color w:val="auto"/>
+                <w:sz w:val="24"/>
+                <w:szCs w:val="24"/>
+              </w:rPr>
+              <w:t>(</w:t>
+            </w:r>
+            <w:proofErr w:type="gramStart"/>
+            <w:r>
+              <w:rPr>
+                <w:rFonts w:ascii="Times New Roman" w:hAnsi="Times New Roman" w:cs="Times New Roman"/>
+                <w:color w:val="auto"/>
+                <w:sz w:val="24"/>
+                <w:szCs w:val="24"/>
+              </w:rPr>
+              <w:t>PK,FK</w:t>
             </w:r>
             <w:proofErr w:type="gramEnd"/>
             <w:r>
@@ -6193,7 +6302,7 @@
           </w:tcPr>
           <w:p>
             <w:pPr>
-              <w:pStyle w:val="ListBullet"/>
+              <w:pStyle w:val="a"/>
               <w:numPr>
                 <w:ilvl w:val="0"/>
                 <w:numId w:val="0"/>
@@ -6236,7 +6345,7 @@
           </w:tcPr>
           <w:p>
             <w:pPr>
-              <w:pStyle w:val="ListBullet"/>
+              <w:pStyle w:val="a"/>
               <w:numPr>
                 <w:ilvl w:val="0"/>
                 <w:numId w:val="0"/>
@@ -6250,7 +6359,6 @@
               </w:rPr>
             </w:pPr>
             <w:proofErr w:type="spellStart"/>
-            <w:proofErr w:type="gramStart"/>
             <w:r>
               <w:rPr>
                 <w:rFonts w:ascii="Times New Roman" w:hAnsi="Times New Roman" w:cs="Times New Roman"/>
@@ -6268,9 +6376,8 @@
                 <w:sz w:val="24"/>
                 <w:szCs w:val="24"/>
               </w:rPr>
-              <w:t>(</w:t>
+              <w:t xml:space="preserve"> </w:t>
             </w:r>
-            <w:proofErr w:type="gramEnd"/>
             <w:r>
               <w:rPr>
                 <w:rFonts w:ascii="Times New Roman" w:hAnsi="Times New Roman" w:cs="Times New Roman"/>
@@ -6278,7 +6385,7 @@
                 <w:sz w:val="24"/>
                 <w:szCs w:val="24"/>
               </w:rPr>
-              <w:t xml:space="preserve">PK), </w:t>
+              <w:t xml:space="preserve">(PK), </w:t>
             </w:r>
             <w:proofErr w:type="spellStart"/>
             <w:r>
@@ -6301,7 +6408,6 @@
               <w:t xml:space="preserve">, Status, </w:t>
             </w:r>
             <w:proofErr w:type="spellStart"/>
-            <w:proofErr w:type="gramStart"/>
             <w:r>
               <w:rPr>
                 <w:rFonts w:ascii="Times New Roman" w:hAnsi="Times New Roman" w:cs="Times New Roman"/>
@@ -6319,9 +6425,8 @@
                 <w:sz w:val="24"/>
                 <w:szCs w:val="24"/>
               </w:rPr>
-              <w:t>(</w:t>
+              <w:t xml:space="preserve"> </w:t>
             </w:r>
-            <w:proofErr w:type="gramEnd"/>
             <w:r>
               <w:rPr>
                 <w:rFonts w:ascii="Times New Roman" w:hAnsi="Times New Roman" w:cs="Times New Roman"/>
@@ -6329,10 +6434,9 @@
                 <w:sz w:val="24"/>
                 <w:szCs w:val="24"/>
               </w:rPr>
-              <w:t xml:space="preserve">FK), </w:t>
+              <w:t xml:space="preserve">(FK), </w:t>
             </w:r>
             <w:proofErr w:type="spellStart"/>
-            <w:proofErr w:type="gramStart"/>
             <w:r>
               <w:rPr>
                 <w:rFonts w:ascii="Times New Roman" w:hAnsi="Times New Roman" w:cs="Times New Roman"/>
@@ -6350,9 +6454,8 @@
                 <w:sz w:val="24"/>
                 <w:szCs w:val="24"/>
               </w:rPr>
-              <w:t>(</w:t>
+              <w:t xml:space="preserve"> </w:t>
             </w:r>
-            <w:proofErr w:type="gramEnd"/>
             <w:r>
               <w:rPr>
                 <w:rFonts w:ascii="Times New Roman" w:hAnsi="Times New Roman" w:cs="Times New Roman"/>
@@ -6360,7 +6463,7 @@
                 <w:sz w:val="24"/>
                 <w:szCs w:val="24"/>
               </w:rPr>
-              <w:t>FK)</w:t>
+              <w:t>(FK)</w:t>
             </w:r>
           </w:p>
         </w:tc>
@@ -6385,7 +6488,7 @@
           </w:tcPr>
           <w:p>
             <w:pPr>
-              <w:pStyle w:val="ListBullet"/>
+              <w:pStyle w:val="a"/>
               <w:numPr>
                 <w:ilvl w:val="0"/>
                 <w:numId w:val="0"/>
@@ -6428,7 +6531,7 @@
           </w:tcPr>
           <w:p>
             <w:pPr>
-              <w:pStyle w:val="ListBullet"/>
+              <w:pStyle w:val="a"/>
               <w:numPr>
                 <w:ilvl w:val="0"/>
                 <w:numId w:val="0"/>
@@ -6442,7 +6545,6 @@
               </w:rPr>
             </w:pPr>
             <w:proofErr w:type="spellStart"/>
-            <w:proofErr w:type="gramStart"/>
             <w:r>
               <w:rPr>
                 <w:rFonts w:ascii="Times New Roman" w:hAnsi="Times New Roman" w:cs="Times New Roman"/>
@@ -6460,9 +6562,8 @@
                 <w:sz w:val="24"/>
                 <w:szCs w:val="24"/>
               </w:rPr>
-              <w:t>(</w:t>
+              <w:t xml:space="preserve"> </w:t>
             </w:r>
-            <w:proofErr w:type="gramEnd"/>
             <w:r>
               <w:rPr>
                 <w:rFonts w:ascii="Times New Roman" w:hAnsi="Times New Roman" w:cs="Times New Roman"/>
@@ -6470,10 +6571,9 @@
                 <w:sz w:val="24"/>
                 <w:szCs w:val="24"/>
               </w:rPr>
-              <w:t xml:space="preserve">PK), Diagnosis, </w:t>
+              <w:t xml:space="preserve">(PK), Diagnosis, </w:t>
             </w:r>
             <w:proofErr w:type="spellStart"/>
-            <w:proofErr w:type="gramStart"/>
             <w:r>
               <w:rPr>
                 <w:rFonts w:ascii="Times New Roman" w:hAnsi="Times New Roman" w:cs="Times New Roman"/>
@@ -6491,9 +6591,8 @@
                 <w:sz w:val="24"/>
                 <w:szCs w:val="24"/>
               </w:rPr>
-              <w:t>(</w:t>
+              <w:t xml:space="preserve"> </w:t>
             </w:r>
-            <w:proofErr w:type="gramEnd"/>
             <w:r>
               <w:rPr>
                 <w:rFonts w:ascii="Times New Roman" w:hAnsi="Times New Roman" w:cs="Times New Roman"/>
@@ -6501,7 +6600,7 @@
                 <w:sz w:val="24"/>
                 <w:szCs w:val="24"/>
               </w:rPr>
-              <w:t>FK)</w:t>
+              <w:t>(FK)</w:t>
             </w:r>
           </w:p>
         </w:tc>
@@ -6526,7 +6625,7 @@
           </w:tcPr>
           <w:p>
             <w:pPr>
-              <w:pStyle w:val="ListBullet"/>
+              <w:pStyle w:val="a"/>
               <w:numPr>
                 <w:ilvl w:val="0"/>
                 <w:numId w:val="0"/>
@@ -6569,7 +6668,7 @@
           </w:tcPr>
           <w:p>
             <w:pPr>
-              <w:pStyle w:val="ListBullet"/>
+              <w:pStyle w:val="a"/>
               <w:numPr>
                 <w:ilvl w:val="0"/>
                 <w:numId w:val="0"/>
@@ -6583,7 +6682,6 @@
               </w:rPr>
             </w:pPr>
             <w:proofErr w:type="spellStart"/>
-            <w:proofErr w:type="gramStart"/>
             <w:r>
               <w:rPr>
                 <w:rFonts w:ascii="Times New Roman" w:hAnsi="Times New Roman" w:cs="Times New Roman"/>
@@ -6601,9 +6699,8 @@
                 <w:sz w:val="24"/>
                 <w:szCs w:val="24"/>
               </w:rPr>
-              <w:t>(</w:t>
+              <w:t xml:space="preserve"> </w:t>
             </w:r>
-            <w:proofErr w:type="gramEnd"/>
             <w:r>
               <w:rPr>
                 <w:rFonts w:ascii="Times New Roman" w:hAnsi="Times New Roman" w:cs="Times New Roman"/>
@@ -6611,7 +6708,7 @@
                 <w:sz w:val="24"/>
                 <w:szCs w:val="24"/>
               </w:rPr>
-              <w:t xml:space="preserve">PK), Amount, </w:t>
+              <w:t xml:space="preserve">(PK), Amount, </w:t>
             </w:r>
             <w:proofErr w:type="spellStart"/>
             <w:r>
@@ -6634,7 +6731,6 @@
               <w:t xml:space="preserve">, </w:t>
             </w:r>
             <w:proofErr w:type="spellStart"/>
-            <w:proofErr w:type="gramStart"/>
             <w:r>
               <w:rPr>
                 <w:rFonts w:ascii="Times New Roman" w:hAnsi="Times New Roman" w:cs="Times New Roman"/>
@@ -6652,9 +6748,8 @@
                 <w:sz w:val="24"/>
                 <w:szCs w:val="24"/>
               </w:rPr>
-              <w:t>(</w:t>
+              <w:t xml:space="preserve"> </w:t>
             </w:r>
-            <w:proofErr w:type="gramEnd"/>
             <w:r>
               <w:rPr>
                 <w:rFonts w:ascii="Times New Roman" w:hAnsi="Times New Roman" w:cs="Times New Roman"/>
@@ -6662,7 +6757,7 @@
                 <w:sz w:val="24"/>
                 <w:szCs w:val="24"/>
               </w:rPr>
-              <w:t>FK)</w:t>
+              <w:t>(FK)</w:t>
             </w:r>
           </w:p>
         </w:tc>
@@ -6670,7 +6765,7 @@
     </w:tbl>
     <w:p>
       <w:pPr>
-        <w:pStyle w:val="ListBullet"/>
+        <w:pStyle w:val="a"/>
         <w:numPr>
           <w:ilvl w:val="0"/>
           <w:numId w:val="0"/>
@@ -6688,7 +6783,7 @@
     </w:p>
     <w:p>
       <w:pPr>
-        <w:pStyle w:val="Heading1"/>
+        <w:pStyle w:val="1"/>
       </w:pPr>
       <w:r>
         <w:lastRenderedPageBreak/>
@@ -6697,7 +6792,7 @@
     </w:p>
     <w:p>
       <w:pPr>
-        <w:pStyle w:val="ListBullet"/>
+        <w:pStyle w:val="a"/>
         <w:numPr>
           <w:ilvl w:val="0"/>
           <w:numId w:val="0"/>
@@ -6721,7 +6816,7 @@
     </w:p>
     <w:p>
       <w:pPr>
-        <w:pStyle w:val="ListBullet"/>
+        <w:pStyle w:val="a"/>
         <w:rPr>
           <w:rFonts w:ascii="Times New Roman" w:hAnsi="Times New Roman" w:cs="Times New Roman"/>
           <w:color w:val="auto"/>
@@ -6741,7 +6836,7 @@
     </w:p>
     <w:p>
       <w:pPr>
-        <w:pStyle w:val="ListBullet"/>
+        <w:pStyle w:val="a"/>
         <w:rPr>
           <w:rFonts w:ascii="Times New Roman" w:hAnsi="Times New Roman" w:cs="Times New Roman"/>
           <w:color w:val="auto"/>
@@ -6761,7 +6856,7 @@
     </w:p>
     <w:p>
       <w:pPr>
-        <w:pStyle w:val="ListBullet"/>
+        <w:pStyle w:val="a"/>
         <w:rPr>
           <w:rFonts w:ascii="Times New Roman" w:hAnsi="Times New Roman" w:cs="Times New Roman"/>
           <w:color w:val="auto"/>
@@ -6781,7 +6876,7 @@
     </w:p>
     <w:p>
       <w:pPr>
-        <w:pStyle w:val="ListBullet"/>
+        <w:pStyle w:val="a"/>
         <w:numPr>
           <w:ilvl w:val="0"/>
           <w:numId w:val="0"/>
@@ -6797,7 +6892,7 @@
     </w:p>
     <w:p>
       <w:pPr>
-        <w:pStyle w:val="Heading1"/>
+        <w:pStyle w:val="1"/>
       </w:pPr>
       <w:r>
         <w:lastRenderedPageBreak/>
@@ -6806,7 +6901,7 @@
     </w:p>
     <w:p>
       <w:pPr>
-        <w:pStyle w:val="ListBullet"/>
+        <w:pStyle w:val="a"/>
         <w:numPr>
           <w:ilvl w:val="0"/>
           <w:numId w:val="0"/>
@@ -6839,7 +6934,7 @@
     </w:p>
     <w:p>
       <w:pPr>
-        <w:pStyle w:val="ListBullet"/>
+        <w:pStyle w:val="a"/>
         <w:rPr>
           <w:rFonts w:ascii="Times New Roman" w:hAnsi="Times New Roman" w:cs="Times New Roman"/>
           <w:color w:val="auto"/>
@@ -6859,7 +6954,7 @@
     </w:p>
     <w:p>
       <w:pPr>
-        <w:pStyle w:val="ListBullet"/>
+        <w:pStyle w:val="a"/>
         <w:rPr>
           <w:rFonts w:ascii="Times New Roman" w:hAnsi="Times New Roman" w:cs="Times New Roman"/>
           <w:color w:val="auto"/>
@@ -6879,7 +6974,7 @@
     </w:p>
     <w:p>
       <w:pPr>
-        <w:pStyle w:val="ListBullet"/>
+        <w:pStyle w:val="a"/>
         <w:rPr>
           <w:rFonts w:ascii="Times New Roman" w:hAnsi="Times New Roman" w:cs="Times New Roman"/>
           <w:color w:val="auto"/>
@@ -6899,7 +6994,7 @@
     </w:p>
     <w:p>
       <w:pPr>
-        <w:pStyle w:val="ListBullet"/>
+        <w:pStyle w:val="a"/>
         <w:rPr>
           <w:rFonts w:ascii="Times New Roman" w:hAnsi="Times New Roman" w:cs="Times New Roman"/>
           <w:color w:val="auto"/>
@@ -6919,7 +7014,7 @@
     </w:p>
     <w:p>
       <w:pPr>
-        <w:pStyle w:val="ListBullet"/>
+        <w:pStyle w:val="a"/>
         <w:rPr>
           <w:rFonts w:ascii="Times New Roman" w:hAnsi="Times New Roman" w:cs="Times New Roman"/>
           <w:color w:val="auto"/>
@@ -6939,7 +7034,7 @@
     </w:p>
     <w:p>
       <w:pPr>
-        <w:pStyle w:val="ListBullet"/>
+        <w:pStyle w:val="a"/>
         <w:rPr>
           <w:rFonts w:ascii="Times New Roman" w:hAnsi="Times New Roman" w:cs="Times New Roman"/>
           <w:color w:val="auto"/>
@@ -6959,7 +7054,7 @@
     </w:p>
     <w:p>
       <w:pPr>
-        <w:pStyle w:val="ListBullet"/>
+        <w:pStyle w:val="a"/>
         <w:rPr>
           <w:rFonts w:ascii="Times New Roman" w:hAnsi="Times New Roman" w:cs="Times New Roman"/>
           <w:color w:val="auto"/>
@@ -6979,7 +7074,7 @@
     </w:p>
     <w:p>
       <w:pPr>
-        <w:pStyle w:val="Heading1"/>
+        <w:pStyle w:val="1"/>
       </w:pPr>
       <w:r>
         <w:lastRenderedPageBreak/>
@@ -6994,7 +7089,7 @@
     </w:p>
     <w:p>
       <w:pPr>
-        <w:pStyle w:val="ListBullet"/>
+        <w:pStyle w:val="a"/>
         <w:numPr>
           <w:ilvl w:val="0"/>
           <w:numId w:val="0"/>
@@ -7036,7 +7131,7 @@
     </w:p>
     <w:p>
       <w:pPr>
-        <w:pStyle w:val="ListBullet"/>
+        <w:pStyle w:val="a"/>
         <w:numPr>
           <w:ilvl w:val="0"/>
           <w:numId w:val="0"/>
@@ -7060,7 +7155,7 @@
     </w:p>
     <w:p>
       <w:pPr>
-        <w:pStyle w:val="ListBullet"/>
+        <w:pStyle w:val="a"/>
         <w:numPr>
           <w:ilvl w:val="0"/>
           <w:numId w:val="0"/>
@@ -7084,7 +7179,7 @@
     </w:p>
     <w:p>
       <w:pPr>
-        <w:pStyle w:val="ListBullet"/>
+        <w:pStyle w:val="a"/>
         <w:numPr>
           <w:ilvl w:val="0"/>
           <w:numId w:val="25"/>
@@ -7107,7 +7202,7 @@
     </w:p>
     <w:p>
       <w:pPr>
-        <w:pStyle w:val="ListBullet"/>
+        <w:pStyle w:val="a"/>
         <w:numPr>
           <w:ilvl w:val="0"/>
           <w:numId w:val="25"/>
@@ -7130,7 +7225,7 @@
     </w:p>
     <w:p>
       <w:pPr>
-        <w:pStyle w:val="ListBullet"/>
+        <w:pStyle w:val="a"/>
         <w:numPr>
           <w:ilvl w:val="0"/>
           <w:numId w:val="25"/>
@@ -7153,7 +7248,7 @@
     </w:p>
     <w:p>
       <w:pPr>
-        <w:pStyle w:val="ListBullet"/>
+        <w:pStyle w:val="a"/>
         <w:numPr>
           <w:ilvl w:val="0"/>
           <w:numId w:val="25"/>
@@ -7176,7 +7271,7 @@
     </w:p>
     <w:p>
       <w:pPr>
-        <w:pStyle w:val="ListBullet"/>
+        <w:pStyle w:val="a"/>
         <w:numPr>
           <w:ilvl w:val="0"/>
           <w:numId w:val="0"/>
@@ -7192,7 +7287,7 @@
     </w:p>
     <w:p>
       <w:pPr>
-        <w:pStyle w:val="Heading1"/>
+        <w:pStyle w:val="1"/>
       </w:pPr>
       <w:r>
         <w:lastRenderedPageBreak/>
@@ -7539,7 +7634,7 @@
 <w:ftr xmlns:wpc="http://schemas.microsoft.com/office/word/2010/wordprocessingCanvas" xmlns:cx="http://schemas.microsoft.com/office/drawing/2014/chartex" xmlns:cx1="http://schemas.microsoft.com/office/drawing/2015/9/8/chartex" xmlns:cx2="http://schemas.microsoft.com/office/drawing/2015/10/21/chartex" xmlns:cx3="http://schemas.microsoft.com/office/drawing/2016/5/9/chartex" xmlns:cx4="http://schemas.microsoft.com/office/drawing/2016/5/10/chartex" xmlns:cx5="http://schemas.microsoft.com/office/drawing/2016/5/11/chartex" xmlns:cx6="http://schemas.microsoft.com/office/drawing/2016/5/12/chartex" xmlns:cx7="http://schemas.microsoft.com/office/drawing/2016/5/13/chartex" xmlns:cx8="http://schemas.microsoft.com/office/drawing/2016/5/14/chartex" xmlns:mc="http://schemas.openxmlformats.org/markup-compatibility/2006" xmlns:aink="http://schemas.microsoft.com/office/drawing/2016/ink" xmlns:am3d="http://schemas.microsoft.com/office/drawing/2017/model3d" xmlns:o="urn:schemas-microsoft-com:office:office" xmlns:oel="http://schemas.microsoft.com/office/2019/extlst" xmlns:r="http://schemas.openxmlformats.org/officeDocument/2006/relationships" xmlns:m="http://schemas.openxmlformats.org/officeDocument/2006/math" xmlns:v="urn:schemas-microsoft-com:vml" xmlns:wp14="http://schemas.microsoft.com/office/word/2010/wordprocessingDrawing" xmlns:wp="http://schemas.openxmlformats.org/drawingml/2006/wordprocessingDrawing" xmlns:w10="urn:schemas-microsoft-com:office:word" xmlns:w="http://schemas.openxmlformats.org/wordprocessingml/2006/main" xmlns:w14="http://schemas.microsoft.com/office/word/2010/wordml" xmlns:w15="http://schemas.microsoft.com/office/word/2012/wordml" xmlns:w16cex="http://schemas.microsoft.com/office/word/2018/wordml/cex" xmlns:w16cid="http://schemas.microsoft.com/office/word/2016/wordml/cid" xmlns:w16="http://schemas.microsoft.com/office/word/2018/wordml" xmlns:w16du="http://schemas.microsoft.com/office/word/2023/wordml/word16du" xmlns:w16sdtdh="http://schemas.microsoft.com/office/word/2020/wordml/sdtdatahash" xmlns:w16sdtfl="http://schemas.microsoft.com/office/word/2024/wordml/sdtformatlock" xmlns:w16se="http://schemas.microsoft.com/office/word/2015/wordml/symex" xmlns:wpg="http://schemas.microsoft.com/office/word/2010/wordprocessingGroup" xmlns:wpi="http://schemas.microsoft.com/office/word/2010/wordprocessingInk" xmlns:wne="http://schemas.microsoft.com/office/word/2006/wordml" xmlns:wps="http://schemas.microsoft.com/office/word/2010/wordprocessingShape" mc:Ignorable="w14 w15 w16se w16cid w16 w16cex w16sdtdh w16sdtfl w16du wp14">
   <w:p>
     <w:pPr>
-      <w:pStyle w:val="Footer"/>
+      <w:pStyle w:val="a5"/>
     </w:pPr>
     <w:r>
       <w:rPr>
@@ -7696,7 +7791,7 @@
 <w:ftr xmlns:wpc="http://schemas.microsoft.com/office/word/2010/wordprocessingCanvas" xmlns:cx="http://schemas.microsoft.com/office/drawing/2014/chartex" xmlns:cx1="http://schemas.microsoft.com/office/drawing/2015/9/8/chartex" xmlns:cx2="http://schemas.microsoft.com/office/drawing/2015/10/21/chartex" xmlns:cx3="http://schemas.microsoft.com/office/drawing/2016/5/9/chartex" xmlns:cx4="http://schemas.microsoft.com/office/drawing/2016/5/10/chartex" xmlns:cx5="http://schemas.microsoft.com/office/drawing/2016/5/11/chartex" xmlns:cx6="http://schemas.microsoft.com/office/drawing/2016/5/12/chartex" xmlns:cx7="http://schemas.microsoft.com/office/drawing/2016/5/13/chartex" xmlns:cx8="http://schemas.microsoft.com/office/drawing/2016/5/14/chartex" xmlns:mc="http://schemas.openxmlformats.org/markup-compatibility/2006" xmlns:aink="http://schemas.microsoft.com/office/drawing/2016/ink" xmlns:am3d="http://schemas.microsoft.com/office/drawing/2017/model3d" xmlns:o="urn:schemas-microsoft-com:office:office" xmlns:oel="http://schemas.microsoft.com/office/2019/extlst" xmlns:r="http://schemas.openxmlformats.org/officeDocument/2006/relationships" xmlns:m="http://schemas.openxmlformats.org/officeDocument/2006/math" xmlns:v="urn:schemas-microsoft-com:vml" xmlns:wp14="http://schemas.microsoft.com/office/word/2010/wordprocessingDrawing" xmlns:wp="http://schemas.openxmlformats.org/drawingml/2006/wordprocessingDrawing" xmlns:w10="urn:schemas-microsoft-com:office:word" xmlns:w="http://schemas.openxmlformats.org/wordprocessingml/2006/main" xmlns:w14="http://schemas.microsoft.com/office/word/2010/wordml" xmlns:w15="http://schemas.microsoft.com/office/word/2012/wordml" xmlns:w16cex="http://schemas.microsoft.com/office/word/2018/wordml/cex" xmlns:w16cid="http://schemas.microsoft.com/office/word/2016/wordml/cid" xmlns:w16="http://schemas.microsoft.com/office/word/2018/wordml" xmlns:w16du="http://schemas.microsoft.com/office/word/2023/wordml/word16du" xmlns:w16sdtdh="http://schemas.microsoft.com/office/word/2020/wordml/sdtdatahash" xmlns:w16sdtfl="http://schemas.microsoft.com/office/word/2024/wordml/sdtformatlock" xmlns:w16se="http://schemas.microsoft.com/office/word/2015/wordml/symex" xmlns:wpg="http://schemas.microsoft.com/office/word/2010/wordprocessingGroup" xmlns:wpi="http://schemas.microsoft.com/office/word/2010/wordprocessingInk" xmlns:wne="http://schemas.microsoft.com/office/word/2006/wordml" xmlns:wps="http://schemas.microsoft.com/office/word/2010/wordprocessingShape" mc:Ignorable="w14 w15 w16se w16cid w16 w16cex w16sdtdh w16sdtfl w16du wp14">
   <w:p>
     <w:pPr>
-      <w:pStyle w:val="Footer"/>
+      <w:pStyle w:val="a5"/>
     </w:pPr>
     <w:r>
       <w:rPr>
@@ -7853,7 +7948,7 @@
 <w:ftr xmlns:wpc="http://schemas.microsoft.com/office/word/2010/wordprocessingCanvas" xmlns:cx="http://schemas.microsoft.com/office/drawing/2014/chartex" xmlns:cx1="http://schemas.microsoft.com/office/drawing/2015/9/8/chartex" xmlns:cx2="http://schemas.microsoft.com/office/drawing/2015/10/21/chartex" xmlns:cx3="http://schemas.microsoft.com/office/drawing/2016/5/9/chartex" xmlns:cx4="http://schemas.microsoft.com/office/drawing/2016/5/10/chartex" xmlns:cx5="http://schemas.microsoft.com/office/drawing/2016/5/11/chartex" xmlns:cx6="http://schemas.microsoft.com/office/drawing/2016/5/12/chartex" xmlns:cx7="http://schemas.microsoft.com/office/drawing/2016/5/13/chartex" xmlns:cx8="http://schemas.microsoft.com/office/drawing/2016/5/14/chartex" xmlns:mc="http://schemas.openxmlformats.org/markup-compatibility/2006" xmlns:aink="http://schemas.microsoft.com/office/drawing/2016/ink" xmlns:am3d="http://schemas.microsoft.com/office/drawing/2017/model3d" xmlns:o="urn:schemas-microsoft-com:office:office" xmlns:oel="http://schemas.microsoft.com/office/2019/extlst" xmlns:r="http://schemas.openxmlformats.org/officeDocument/2006/relationships" xmlns:m="http://schemas.openxmlformats.org/officeDocument/2006/math" xmlns:v="urn:schemas-microsoft-com:vml" xmlns:wp14="http://schemas.microsoft.com/office/word/2010/wordprocessingDrawing" xmlns:wp="http://schemas.openxmlformats.org/drawingml/2006/wordprocessingDrawing" xmlns:w10="urn:schemas-microsoft-com:office:word" xmlns:w="http://schemas.openxmlformats.org/wordprocessingml/2006/main" xmlns:w14="http://schemas.microsoft.com/office/word/2010/wordml" xmlns:w15="http://schemas.microsoft.com/office/word/2012/wordml" xmlns:w16cex="http://schemas.microsoft.com/office/word/2018/wordml/cex" xmlns:w16cid="http://schemas.microsoft.com/office/word/2016/wordml/cid" xmlns:w16="http://schemas.microsoft.com/office/word/2018/wordml" xmlns:w16du="http://schemas.microsoft.com/office/word/2023/wordml/word16du" xmlns:w16sdtdh="http://schemas.microsoft.com/office/word/2020/wordml/sdtdatahash" xmlns:w16sdtfl="http://schemas.microsoft.com/office/word/2024/wordml/sdtformatlock" xmlns:w16se="http://schemas.microsoft.com/office/word/2015/wordml/symex" xmlns:wpg="http://schemas.microsoft.com/office/word/2010/wordprocessingGroup" xmlns:wpi="http://schemas.microsoft.com/office/word/2010/wordprocessingInk" xmlns:wne="http://schemas.microsoft.com/office/word/2006/wordml" xmlns:wps="http://schemas.microsoft.com/office/word/2010/wordprocessingShape" mc:Ignorable="w14 w15 w16se w16cid w16 w16cex w16sdtdh w16sdtfl w16du wp14">
   <w:p>
     <w:pPr>
-      <w:pStyle w:val="Footer"/>
+      <w:pStyle w:val="a5"/>
     </w:pPr>
     <w:r>
       <w:rPr>
@@ -8100,7 +8195,7 @@
         </w:tcPr>
         <w:p>
           <w:pPr>
-            <w:pStyle w:val="Header"/>
+            <w:pStyle w:val="a7"/>
           </w:pPr>
         </w:p>
       </w:tc>
@@ -8110,7 +8205,7 @@
         </w:tcPr>
         <w:p>
           <w:pPr>
-            <w:pStyle w:val="Header"/>
+            <w:pStyle w:val="a7"/>
           </w:pPr>
         </w:p>
       </w:tc>
@@ -8121,7 +8216,7 @@
         </w:tcPr>
         <w:p>
           <w:pPr>
-            <w:pStyle w:val="Header"/>
+            <w:pStyle w:val="a7"/>
           </w:pPr>
         </w:p>
       </w:tc>
@@ -8129,7 +8224,7 @@
   </w:tbl>
   <w:p>
     <w:pPr>
-      <w:pStyle w:val="Header"/>
+      <w:pStyle w:val="a7"/>
     </w:pPr>
   </w:p>
 </w:hdr>
@@ -8415,9 +8510,32 @@
           </w:r>
           <w:r>
             <w:rPr>
+              <w:rFonts w:hint="cs"/>
+              <w:b w:val="0"/>
+              <w:bCs w:val="0"/>
+              <w:noProof/>
+              <w:rtl/>
+            </w:rPr>
+            <w:instrText xml:space="preserve">خطأ! استخدم علامة التبويب "الصفحة الرئيسية" لتطبيق </w:instrText>
+          </w:r>
+          <w:r>
+            <w:rPr>
+              <w:rFonts w:hint="cs"/>
+              <w:b w:val="0"/>
+              <w:bCs w:val="0"/>
               <w:noProof/>
             </w:rPr>
-            <w:instrText>Task 2 – Database Implementation (6 Marks)</w:instrText>
+            <w:instrText>Heading 1</w:instrText>
+          </w:r>
+          <w:r>
+            <w:rPr>
+              <w:rFonts w:hint="cs"/>
+              <w:b w:val="0"/>
+              <w:bCs w:val="0"/>
+              <w:noProof/>
+              <w:rtl/>
+            </w:rPr>
+            <w:instrText xml:space="preserve"> على النص الذي ترغب في أن يظهر هنا.</w:instrText>
           </w:r>
           <w:r>
             <w:rPr>
@@ -8448,9 +8566,32 @@
           </w:r>
           <w:r>
             <w:rPr>
+              <w:rFonts w:hint="cs"/>
+              <w:b w:val="0"/>
+              <w:bCs w:val="0"/>
+              <w:noProof/>
+              <w:rtl/>
+            </w:rPr>
+            <w:instrText xml:space="preserve">خطأ! استخدم علامة التبويب "الصفحة الرئيسية" لتطبيق </w:instrText>
+          </w:r>
+          <w:r>
+            <w:rPr>
+              <w:rFonts w:hint="cs"/>
+              <w:b w:val="0"/>
+              <w:bCs w:val="0"/>
               <w:noProof/>
             </w:rPr>
-            <w:instrText>Task 2 – Database Implementation (6 Marks)</w:instrText>
+            <w:instrText>Heading 1</w:instrText>
+          </w:r>
+          <w:r>
+            <w:rPr>
+              <w:rFonts w:hint="cs"/>
+              <w:b w:val="0"/>
+              <w:bCs w:val="0"/>
+              <w:noProof/>
+              <w:rtl/>
+            </w:rPr>
+            <w:instrText xml:space="preserve"> على النص الذي ترغب في أن يظهر هنا.</w:instrText>
           </w:r>
           <w:r>
             <w:rPr>
@@ -8466,9 +8607,38 @@
           </w:r>
           <w:r>
             <w:rPr>
+              <w:rFonts w:hint="cs"/>
+              <w:b w:val="0"/>
+              <w:bCs w:val="0"/>
+              <w:noProof/>
+              <w:rtl/>
+            </w:rPr>
+            <w:t xml:space="preserve">خطأ! استخدم علامة التبويب "الصفحة الرئيسية" لتطبيق </w:t>
+          </w:r>
+          <w:r>
+            <w:rPr>
+              <w:rFonts w:hint="cs"/>
+              <w:b w:val="0"/>
+              <w:bCs w:val="0"/>
               <w:noProof/>
             </w:rPr>
-            <w:t xml:space="preserve">Task 2 – Database Implementation (6 Marks) </w:t>
+            <w:t>Heading 1</w:t>
+          </w:r>
+          <w:r>
+            <w:rPr>
+              <w:rFonts w:hint="cs"/>
+              <w:b w:val="0"/>
+              <w:bCs w:val="0"/>
+              <w:noProof/>
+              <w:rtl/>
+            </w:rPr>
+            <w:t xml:space="preserve"> على النص الذي ترغب في أن يظهر هنا.</w:t>
+          </w:r>
+          <w:r>
+            <w:rPr>
+              <w:noProof/>
+            </w:rPr>
+            <w:t xml:space="preserve"> </w:t>
           </w:r>
           <w:r>
             <w:fldChar w:fldCharType="end"/>
@@ -8534,7 +8704,7 @@
     <w:lvl w:ilvl="0">
       <w:start w:val="1"/>
       <w:numFmt w:val="bullet"/>
-      <w:pStyle w:val="ListBullet"/>
+      <w:pStyle w:val="a"/>
       <w:lvlText w:val="•"/>
       <w:lvlJc w:val="left"/>
       <w:pPr>
@@ -9599,7 +9769,7 @@
     <w:lvl w:ilvl="0">
       <w:start w:val="1"/>
       <w:numFmt w:val="decimal"/>
-      <w:pStyle w:val="ListNumber"/>
+      <w:pStyle w:val="a0"/>
       <w:lvlText w:val="%1."/>
       <w:lvlJc w:val="left"/>
       <w:pPr>
@@ -9613,7 +9783,7 @@
     <w:lvl w:ilvl="1">
       <w:start w:val="1"/>
       <w:numFmt w:val="decimal"/>
-      <w:pStyle w:val="ListNumber2"/>
+      <w:pStyle w:val="2"/>
       <w:suff w:val="space"/>
       <w:lvlText w:val="%1.%2"/>
       <w:lvlJc w:val="left"/>
@@ -9628,7 +9798,7 @@
     <w:lvl w:ilvl="2">
       <w:start w:val="1"/>
       <w:numFmt w:val="lowerLetter"/>
-      <w:pStyle w:val="ListNumber3"/>
+      <w:pStyle w:val="3"/>
       <w:lvlText w:val="%3."/>
       <w:lvlJc w:val="left"/>
       <w:pPr>
@@ -9642,7 +9812,7 @@
     <w:lvl w:ilvl="3">
       <w:start w:val="1"/>
       <w:numFmt w:val="lowerRoman"/>
-      <w:pStyle w:val="ListNumber4"/>
+      <w:pStyle w:val="4"/>
       <w:lvlText w:val="%4."/>
       <w:lvlJc w:val="left"/>
       <w:pPr>
@@ -9656,7 +9826,7 @@
     <w:lvl w:ilvl="4">
       <w:start w:val="1"/>
       <w:numFmt w:val="lowerLetter"/>
-      <w:pStyle w:val="ListNumber5"/>
+      <w:pStyle w:val="5"/>
       <w:lvlText w:val="(%5)"/>
       <w:lvlJc w:val="left"/>
       <w:pPr>
@@ -9831,7 +10001,7 @@
   <w:abstractNum w:abstractNumId="13" w15:restartNumberingAfterBreak="0">
     <w:nsid w:val="3D423FD0"/>
     <w:multiLevelType w:val="multilevel"/>
-    <w:tmpl w:val="A0461074"/>
+    <w:tmpl w:val="B502C206"/>
     <w:lvl w:ilvl="0">
       <w:start w:val="1"/>
       <w:numFmt w:val="bullet"/>
@@ -9845,7 +10015,8 @@
       </w:pPr>
       <w:rPr>
         <w:rFonts w:ascii="Symbol" w:hAnsi="Symbol" w:hint="default"/>
-        <w:sz w:val="20"/>
+        <w:sz w:val="24"/>
+        <w:szCs w:val="32"/>
       </w:rPr>
     </w:lvl>
     <w:lvl w:ilvl="1" w:tentative="1">
@@ -11527,6 +11698,18 @@
   </w:num>
   <w:num w:numId="32" w16cid:durableId="1261530086">
     <w:abstractNumId w:val="13"/>
+  </w:num>
+  <w:num w:numId="33" w16cid:durableId="1046442775">
+    <w:abstractNumId w:val="0"/>
+  </w:num>
+  <w:num w:numId="34" w16cid:durableId="1501235889">
+    <w:abstractNumId w:val="0"/>
+  </w:num>
+  <w:num w:numId="35" w16cid:durableId="1310867021">
+    <w:abstractNumId w:val="0"/>
+  </w:num>
+  <w:num w:numId="36" w16cid:durableId="964850623">
+    <w:abstractNumId w:val="0"/>
   </w:num>
 </w:numbering>
 </file>
@@ -11925,16 +12108,16 @@
     <w:lsdException w:name="Unresolved Mention" w:semiHidden="1" w:unhideWhenUsed="1"/>
     <w:lsdException w:name="Smart Link" w:semiHidden="1" w:unhideWhenUsed="1"/>
   </w:latentStyles>
-  <w:style w:type="paragraph" w:default="1" w:styleId="Normal">
+  <w:style w:type="paragraph" w:default="1" w:styleId="a1">
     <w:name w:val="Normal"/>
     <w:qFormat/>
     <w:rsid w:val="00407799"/>
   </w:style>
-  <w:style w:type="paragraph" w:styleId="Heading1">
+  <w:style w:type="paragraph" w:styleId="1">
     <w:name w:val="heading 1"/>
-    <w:basedOn w:val="Normal"/>
-    <w:next w:val="Normal"/>
-    <w:link w:val="Heading1Char"/>
+    <w:basedOn w:val="a1"/>
+    <w:next w:val="a1"/>
+    <w:link w:val="1Char"/>
     <w:uiPriority w:val="1"/>
     <w:qFormat/>
     <w:pPr>
@@ -11953,11 +12136,11 @@
       <w:sz w:val="40"/>
     </w:rPr>
   </w:style>
-  <w:style w:type="paragraph" w:styleId="Heading2">
+  <w:style w:type="paragraph" w:styleId="20">
     <w:name w:val="heading 2"/>
-    <w:basedOn w:val="Normal"/>
-    <w:next w:val="Normal"/>
-    <w:link w:val="Heading2Char"/>
+    <w:basedOn w:val="a1"/>
+    <w:next w:val="a1"/>
+    <w:link w:val="2Char"/>
     <w:uiPriority w:val="1"/>
     <w:unhideWhenUsed/>
     <w:qFormat/>
@@ -11975,13 +12158,13 @@
       <w:sz w:val="28"/>
     </w:rPr>
   </w:style>
-  <w:style w:type="character" w:default="1" w:styleId="DefaultParagraphFont">
+  <w:style w:type="character" w:default="1" w:styleId="a2">
     <w:name w:val="Default Paragraph Font"/>
     <w:uiPriority w:val="1"/>
     <w:semiHidden/>
     <w:unhideWhenUsed/>
   </w:style>
-  <w:style w:type="table" w:default="1" w:styleId="TableNormal">
+  <w:style w:type="table" w:default="1" w:styleId="a3">
     <w:name w:val="Normal Table"/>
     <w:uiPriority w:val="99"/>
     <w:semiHidden/>
@@ -11996,16 +12179,16 @@
       </w:tblCellMar>
     </w:tblPr>
   </w:style>
-  <w:style w:type="numbering" w:default="1" w:styleId="NoList">
+  <w:style w:type="numbering" w:default="1" w:styleId="a4">
     <w:name w:val="No List"/>
     <w:uiPriority w:val="99"/>
     <w:semiHidden/>
     <w:unhideWhenUsed/>
   </w:style>
-  <w:style w:type="paragraph" w:styleId="Footer">
+  <w:style w:type="paragraph" w:styleId="a5">
     <w:name w:val="footer"/>
-    <w:basedOn w:val="Normal"/>
-    <w:link w:val="FooterChar"/>
+    <w:basedOn w:val="a1"/>
+    <w:link w:val="Char"/>
     <w:uiPriority w:val="99"/>
     <w:unhideWhenUsed/>
     <w:qFormat/>
@@ -12017,20 +12200,20 @@
       <w:color w:val="EF4623" w:themeColor="accent1"/>
     </w:rPr>
   </w:style>
-  <w:style w:type="character" w:customStyle="1" w:styleId="FooterChar">
-    <w:name w:val="Footer Char"/>
-    <w:basedOn w:val="DefaultParagraphFont"/>
-    <w:link w:val="Footer"/>
+  <w:style w:type="character" w:customStyle="1" w:styleId="Char">
+    <w:name w:val="تذييل الصفحة Char"/>
+    <w:basedOn w:val="a2"/>
+    <w:link w:val="a5"/>
     <w:uiPriority w:val="99"/>
     <w:rPr>
       <w:color w:val="EF4623" w:themeColor="accent1"/>
     </w:rPr>
   </w:style>
-  <w:style w:type="paragraph" w:styleId="Subtitle">
+  <w:style w:type="paragraph" w:styleId="a6">
     <w:name w:val="Subtitle"/>
-    <w:basedOn w:val="Normal"/>
-    <w:next w:val="Normal"/>
-    <w:link w:val="SubtitleChar"/>
+    <w:basedOn w:val="a1"/>
+    <w:next w:val="a1"/>
+    <w:link w:val="Char0"/>
     <w:uiPriority w:val="3"/>
     <w:unhideWhenUsed/>
     <w:qFormat/>
@@ -12053,36 +12236,36 @@
   </w:style>
   <w:style w:type="paragraph" w:customStyle="1" w:styleId="Graphic">
     <w:name w:val="Graphic"/>
-    <w:basedOn w:val="Normal"/>
+    <w:basedOn w:val="a1"/>
     <w:uiPriority w:val="99"/>
     <w:pPr>
       <w:spacing w:after="80" w:line="240" w:lineRule="auto"/>
       <w:jc w:val="center"/>
     </w:pPr>
   </w:style>
-  <w:style w:type="paragraph" w:styleId="Header">
+  <w:style w:type="paragraph" w:styleId="a7">
     <w:name w:val="header"/>
-    <w:basedOn w:val="Normal"/>
-    <w:link w:val="HeaderChar"/>
+    <w:basedOn w:val="a1"/>
+    <w:link w:val="Char1"/>
     <w:uiPriority w:val="99"/>
     <w:qFormat/>
     <w:pPr>
       <w:spacing w:after="380" w:line="240" w:lineRule="auto"/>
     </w:pPr>
   </w:style>
-  <w:style w:type="character" w:customStyle="1" w:styleId="HeaderChar">
-    <w:name w:val="Header Char"/>
-    <w:basedOn w:val="DefaultParagraphFont"/>
-    <w:link w:val="Header"/>
+  <w:style w:type="character" w:customStyle="1" w:styleId="Char1">
+    <w:name w:val="رأس الصفحة Char"/>
+    <w:basedOn w:val="a2"/>
+    <w:link w:val="a7"/>
     <w:uiPriority w:val="99"/>
     <w:rPr>
       <w:color w:val="404040" w:themeColor="text1" w:themeTint="BF"/>
       <w:sz w:val="20"/>
     </w:rPr>
   </w:style>
-  <w:style w:type="table" w:styleId="TableGrid">
+  <w:style w:type="table" w:styleId="a8">
     <w:name w:val="Table Grid"/>
-    <w:basedOn w:val="TableNormal"/>
+    <w:basedOn w:val="a3"/>
     <w:uiPriority w:val="39"/>
     <w:pPr>
       <w:spacing w:before="120" w:after="120" w:line="240" w:lineRule="auto"/>
@@ -12139,7 +12322,7 @@
   </w:style>
   <w:style w:type="paragraph" w:customStyle="1" w:styleId="InfoHeading">
     <w:name w:val="Info Heading"/>
-    <w:basedOn w:val="Normal"/>
+    <w:basedOn w:val="a1"/>
     <w:uiPriority w:val="2"/>
     <w:qFormat/>
     <w:pPr>
@@ -12156,8 +12339,8 @@
   </w:style>
   <w:style w:type="paragraph" w:customStyle="1" w:styleId="Page">
     <w:name w:val="Page"/>
-    <w:basedOn w:val="Normal"/>
-    <w:next w:val="Normal"/>
+    <w:basedOn w:val="a1"/>
+    <w:next w:val="a1"/>
     <w:uiPriority w:val="99"/>
     <w:unhideWhenUsed/>
     <w:qFormat/>
@@ -12170,11 +12353,11 @@
       <w:sz w:val="36"/>
     </w:rPr>
   </w:style>
-  <w:style w:type="paragraph" w:styleId="Title">
+  <w:style w:type="paragraph" w:styleId="a9">
     <w:name w:val="Title"/>
-    <w:basedOn w:val="Normal"/>
-    <w:next w:val="Normal"/>
-    <w:link w:val="TitleChar"/>
+    <w:basedOn w:val="a1"/>
+    <w:next w:val="a1"/>
+    <w:link w:val="Char2"/>
     <w:uiPriority w:val="2"/>
     <w:qFormat/>
     <w:pPr>
@@ -12188,10 +12371,10 @@
       <w:sz w:val="200"/>
     </w:rPr>
   </w:style>
-  <w:style w:type="character" w:customStyle="1" w:styleId="TitleChar">
-    <w:name w:val="Title Char"/>
-    <w:basedOn w:val="DefaultParagraphFont"/>
-    <w:link w:val="Title"/>
+  <w:style w:type="character" w:customStyle="1" w:styleId="Char2">
+    <w:name w:val="العنوان Char"/>
+    <w:basedOn w:val="a2"/>
+    <w:link w:val="a9"/>
     <w:uiPriority w:val="2"/>
     <w:rPr>
       <w:rFonts w:asciiTheme="majorHAnsi" w:eastAsiaTheme="majorEastAsia" w:hAnsiTheme="majorHAnsi" w:cstheme="majorBidi"/>
@@ -12201,19 +12384,19 @@
       <w:sz w:val="200"/>
     </w:rPr>
   </w:style>
-  <w:style w:type="character" w:styleId="PlaceholderText">
+  <w:style w:type="character" w:styleId="aa">
     <w:name w:val="Placeholder Text"/>
-    <w:basedOn w:val="DefaultParagraphFont"/>
+    <w:basedOn w:val="a2"/>
     <w:uiPriority w:val="99"/>
     <w:semiHidden/>
     <w:rPr>
       <w:color w:val="808080"/>
     </w:rPr>
   </w:style>
-  <w:style w:type="paragraph" w:styleId="BalloonText">
+  <w:style w:type="paragraph" w:styleId="ab">
     <w:name w:val="Balloon Text"/>
-    <w:basedOn w:val="Normal"/>
-    <w:link w:val="BalloonTextChar"/>
+    <w:basedOn w:val="a1"/>
+    <w:link w:val="Char3"/>
     <w:uiPriority w:val="99"/>
     <w:semiHidden/>
     <w:unhideWhenUsed/>
@@ -12225,10 +12408,10 @@
       <w:sz w:val="16"/>
     </w:rPr>
   </w:style>
-  <w:style w:type="character" w:customStyle="1" w:styleId="BalloonTextChar">
-    <w:name w:val="Balloon Text Char"/>
-    <w:basedOn w:val="DefaultParagraphFont"/>
-    <w:link w:val="BalloonText"/>
+  <w:style w:type="character" w:customStyle="1" w:styleId="Char3">
+    <w:name w:val="نص في بالون Char"/>
+    <w:basedOn w:val="a2"/>
+    <w:link w:val="ab"/>
     <w:uiPriority w:val="99"/>
     <w:semiHidden/>
     <w:rPr>
@@ -12236,9 +12419,9 @@
       <w:sz w:val="16"/>
     </w:rPr>
   </w:style>
-  <w:style w:type="character" w:styleId="Strong">
+  <w:style w:type="character" w:styleId="ac">
     <w:name w:val="Strong"/>
-    <w:basedOn w:val="DefaultParagraphFont"/>
+    <w:basedOn w:val="a2"/>
     <w:uiPriority w:val="10"/>
     <w:qFormat/>
     <w:rPr>
@@ -12246,10 +12429,10 @@
       <w:bCs/>
     </w:rPr>
   </w:style>
-  <w:style w:type="character" w:customStyle="1" w:styleId="SubtitleChar">
-    <w:name w:val="Subtitle Char"/>
-    <w:basedOn w:val="DefaultParagraphFont"/>
-    <w:link w:val="Subtitle"/>
+  <w:style w:type="character" w:customStyle="1" w:styleId="Char0">
+    <w:name w:val="عنوان فرعي Char"/>
+    <w:basedOn w:val="a2"/>
+    <w:link w:val="a6"/>
     <w:uiPriority w:val="3"/>
     <w:rPr>
       <w:rFonts w:asciiTheme="majorHAnsi" w:eastAsiaTheme="majorEastAsia" w:hAnsiTheme="majorHAnsi" w:cstheme="majorBidi"/>
@@ -12263,7 +12446,7 @@
   </w:style>
   <w:style w:type="paragraph" w:customStyle="1" w:styleId="Abstract">
     <w:name w:val="Abstract"/>
-    <w:basedOn w:val="Normal"/>
+    <w:basedOn w:val="a1"/>
     <w:uiPriority w:val="3"/>
     <w:qFormat/>
     <w:pPr>
@@ -12277,9 +12460,9 @@
       <w:sz w:val="28"/>
     </w:rPr>
   </w:style>
-  <w:style w:type="paragraph" w:styleId="NoSpacing">
+  <w:style w:type="paragraph" w:styleId="ad">
     <w:name w:val="No Spacing"/>
-    <w:link w:val="NoSpacingChar"/>
+    <w:link w:val="Char4"/>
     <w:uiPriority w:val="1"/>
     <w:unhideWhenUsed/>
     <w:qFormat/>
@@ -12289,7 +12472,7 @@
   </w:style>
   <w:style w:type="character" w:styleId="Hyperlink">
     <w:name w:val="Hyperlink"/>
-    <w:basedOn w:val="DefaultParagraphFont"/>
+    <w:basedOn w:val="a2"/>
     <w:uiPriority w:val="99"/>
     <w:unhideWhenUsed/>
     <w:rPr>
@@ -12297,10 +12480,10 @@
       <w:u w:val="single"/>
     </w:rPr>
   </w:style>
-  <w:style w:type="paragraph" w:styleId="TOC1">
+  <w:style w:type="paragraph" w:styleId="10">
     <w:name w:val="toc 1"/>
-    <w:basedOn w:val="Normal"/>
-    <w:next w:val="Normal"/>
+    <w:basedOn w:val="a1"/>
+    <w:next w:val="a1"/>
     <w:autoRedefine/>
     <w:uiPriority w:val="39"/>
     <w:unhideWhenUsed/>
@@ -12315,10 +12498,10 @@
       <w:kern w:val="20"/>
     </w:rPr>
   </w:style>
-  <w:style w:type="character" w:customStyle="1" w:styleId="Heading1Char">
-    <w:name w:val="Heading 1 Char"/>
-    <w:basedOn w:val="DefaultParagraphFont"/>
-    <w:link w:val="Heading1"/>
+  <w:style w:type="character" w:customStyle="1" w:styleId="1Char">
+    <w:name w:val="العنوان 1 Char"/>
+    <w:basedOn w:val="a2"/>
+    <w:link w:val="1"/>
     <w:uiPriority w:val="1"/>
     <w:rPr>
       <w:rFonts w:asciiTheme="majorHAnsi" w:eastAsiaTheme="majorEastAsia" w:hAnsiTheme="majorHAnsi" w:cstheme="majorBidi"/>
@@ -12328,10 +12511,10 @@
       <w:sz w:val="40"/>
     </w:rPr>
   </w:style>
-  <w:style w:type="paragraph" w:styleId="TOCHeading">
+  <w:style w:type="paragraph" w:styleId="ae">
     <w:name w:val="TOC Heading"/>
-    <w:basedOn w:val="Heading1"/>
-    <w:next w:val="Normal"/>
+    <w:basedOn w:val="1"/>
+    <w:next w:val="a1"/>
     <w:uiPriority w:val="39"/>
     <w:unhideWhenUsed/>
     <w:qFormat/>
@@ -12348,10 +12531,10 @@
       <w:sz w:val="44"/>
     </w:rPr>
   </w:style>
-  <w:style w:type="character" w:customStyle="1" w:styleId="Heading2Char">
-    <w:name w:val="Heading 2 Char"/>
-    <w:basedOn w:val="DefaultParagraphFont"/>
-    <w:link w:val="Heading2"/>
+  <w:style w:type="character" w:customStyle="1" w:styleId="2Char">
+    <w:name w:val="عنوان 2 Char"/>
+    <w:basedOn w:val="a2"/>
+    <w:link w:val="20"/>
     <w:uiPriority w:val="1"/>
     <w:rPr>
       <w:rFonts w:asciiTheme="majorHAnsi" w:eastAsiaTheme="majorEastAsia" w:hAnsiTheme="majorHAnsi" w:cstheme="majorBidi"/>
@@ -12361,11 +12544,11 @@
       <w:sz w:val="28"/>
     </w:rPr>
   </w:style>
-  <w:style w:type="paragraph" w:styleId="Quote">
+  <w:style w:type="paragraph" w:styleId="af">
     <w:name w:val="Quote"/>
-    <w:basedOn w:val="Normal"/>
-    <w:next w:val="Normal"/>
-    <w:link w:val="QuoteChar"/>
+    <w:basedOn w:val="a1"/>
+    <w:next w:val="a1"/>
+    <w:link w:val="Char5"/>
     <w:uiPriority w:val="1"/>
     <w:unhideWhenUsed/>
     <w:qFormat/>
@@ -12380,10 +12563,10 @@
       <w:sz w:val="24"/>
     </w:rPr>
   </w:style>
-  <w:style w:type="character" w:customStyle="1" w:styleId="QuoteChar">
-    <w:name w:val="Quote Char"/>
-    <w:basedOn w:val="DefaultParagraphFont"/>
-    <w:link w:val="Quote"/>
+  <w:style w:type="character" w:customStyle="1" w:styleId="Char5">
+    <w:name w:val="اقتباس Char"/>
+    <w:basedOn w:val="a2"/>
+    <w:link w:val="af"/>
     <w:uiPriority w:val="1"/>
     <w:rPr>
       <w:i/>
@@ -12393,10 +12576,10 @@
       <w:sz w:val="24"/>
     </w:rPr>
   </w:style>
-  <w:style w:type="paragraph" w:styleId="Signature">
+  <w:style w:type="paragraph" w:styleId="af0">
     <w:name w:val="Signature"/>
-    <w:basedOn w:val="Normal"/>
-    <w:link w:val="SignatureChar"/>
+    <w:basedOn w:val="a1"/>
+    <w:link w:val="Char6"/>
     <w:uiPriority w:val="9"/>
     <w:unhideWhenUsed/>
     <w:qFormat/>
@@ -12409,25 +12592,25 @@
       <w:kern w:val="20"/>
     </w:rPr>
   </w:style>
-  <w:style w:type="character" w:customStyle="1" w:styleId="SignatureChar">
-    <w:name w:val="Signature Char"/>
-    <w:basedOn w:val="DefaultParagraphFont"/>
-    <w:link w:val="Signature"/>
+  <w:style w:type="character" w:customStyle="1" w:styleId="Char6">
+    <w:name w:val="توقيع Char"/>
+    <w:basedOn w:val="a2"/>
+    <w:link w:val="af0"/>
     <w:uiPriority w:val="9"/>
     <w:rPr>
       <w:color w:val="595959" w:themeColor="text1" w:themeTint="A6"/>
       <w:kern w:val="20"/>
     </w:rPr>
   </w:style>
-  <w:style w:type="character" w:customStyle="1" w:styleId="NoSpacingChar">
-    <w:name w:val="No Spacing Char"/>
-    <w:basedOn w:val="DefaultParagraphFont"/>
-    <w:link w:val="NoSpacing"/>
+  <w:style w:type="character" w:customStyle="1" w:styleId="Char4">
+    <w:name w:val="بلا تباعد Char"/>
+    <w:basedOn w:val="a2"/>
+    <w:link w:val="ad"/>
     <w:uiPriority w:val="1"/>
   </w:style>
-  <w:style w:type="paragraph" w:styleId="ListBullet">
+  <w:style w:type="paragraph" w:styleId="a">
     <w:name w:val="List Bullet"/>
-    <w:basedOn w:val="Normal"/>
+    <w:basedOn w:val="a1"/>
     <w:uiPriority w:val="99"/>
     <w:unhideWhenUsed/>
     <w:qFormat/>
@@ -12442,9 +12625,9 @@
       <w:kern w:val="20"/>
     </w:rPr>
   </w:style>
-  <w:style w:type="paragraph" w:styleId="ListNumber">
+  <w:style w:type="paragraph" w:styleId="a0">
     <w:name w:val="List Number"/>
-    <w:basedOn w:val="Normal"/>
+    <w:basedOn w:val="a1"/>
     <w:uiPriority w:val="1"/>
     <w:unhideWhenUsed/>
     <w:qFormat/>
@@ -12460,9 +12643,9 @@
       <w:kern w:val="20"/>
     </w:rPr>
   </w:style>
-  <w:style w:type="paragraph" w:styleId="ListNumber2">
+  <w:style w:type="paragraph" w:styleId="2">
     <w:name w:val="List Number 2"/>
-    <w:basedOn w:val="Normal"/>
+    <w:basedOn w:val="a1"/>
     <w:uiPriority w:val="1"/>
     <w:unhideWhenUsed/>
     <w:qFormat/>
@@ -12479,9 +12662,9 @@
       <w:kern w:val="20"/>
     </w:rPr>
   </w:style>
-  <w:style w:type="paragraph" w:styleId="ListNumber3">
+  <w:style w:type="paragraph" w:styleId="3">
     <w:name w:val="List Number 3"/>
-    <w:basedOn w:val="Normal"/>
+    <w:basedOn w:val="a1"/>
     <w:uiPriority w:val="18"/>
     <w:unhideWhenUsed/>
     <w:pPr>
@@ -12497,9 +12680,9 @@
       <w:kern w:val="20"/>
     </w:rPr>
   </w:style>
-  <w:style w:type="paragraph" w:styleId="ListNumber4">
+  <w:style w:type="paragraph" w:styleId="4">
     <w:name w:val="List Number 4"/>
-    <w:basedOn w:val="Normal"/>
+    <w:basedOn w:val="a1"/>
     <w:uiPriority w:val="18"/>
     <w:unhideWhenUsed/>
     <w:pPr>
@@ -12515,9 +12698,9 @@
       <w:kern w:val="20"/>
     </w:rPr>
   </w:style>
-  <w:style w:type="paragraph" w:styleId="ListNumber5">
+  <w:style w:type="paragraph" w:styleId="5">
     <w:name w:val="List Number 5"/>
-    <w:basedOn w:val="Normal"/>
+    <w:basedOn w:val="a1"/>
     <w:uiPriority w:val="18"/>
     <w:unhideWhenUsed/>
     <w:pPr>
@@ -12535,7 +12718,7 @@
   </w:style>
   <w:style w:type="table" w:customStyle="1" w:styleId="FinancialTable">
     <w:name w:val="Financial Table"/>
-    <w:basedOn w:val="TableNormal"/>
+    <w:basedOn w:val="a3"/>
     <w:uiPriority w:val="99"/>
     <w:pPr>
       <w:spacing w:before="60" w:after="60" w:line="240" w:lineRule="auto"/>
@@ -12577,9 +12760,9 @@
       </w:rPr>
     </w:tblStylePr>
   </w:style>
-  <w:style w:type="character" w:styleId="CommentReference">
+  <w:style w:type="character" w:styleId="af1">
     <w:name w:val="annotation reference"/>
-    <w:basedOn w:val="DefaultParagraphFont"/>
+    <w:basedOn w:val="a2"/>
     <w:uiPriority w:val="99"/>
     <w:semiHidden/>
     <w:unhideWhenUsed/>
@@ -12587,27 +12770,27 @@
       <w:sz w:val="16"/>
     </w:rPr>
   </w:style>
-  <w:style w:type="paragraph" w:styleId="CommentText">
+  <w:style w:type="paragraph" w:styleId="af2">
     <w:name w:val="annotation text"/>
-    <w:basedOn w:val="Normal"/>
-    <w:link w:val="CommentTextChar"/>
+    <w:basedOn w:val="a1"/>
+    <w:link w:val="Char7"/>
     <w:uiPriority w:val="99"/>
     <w:unhideWhenUsed/>
     <w:pPr>
       <w:spacing w:line="240" w:lineRule="auto"/>
     </w:pPr>
   </w:style>
-  <w:style w:type="character" w:customStyle="1" w:styleId="CommentTextChar">
-    <w:name w:val="Comment Text Char"/>
-    <w:basedOn w:val="DefaultParagraphFont"/>
-    <w:link w:val="CommentText"/>
+  <w:style w:type="character" w:customStyle="1" w:styleId="Char7">
+    <w:name w:val="نص تعليق Char"/>
+    <w:basedOn w:val="a2"/>
+    <w:link w:val="af2"/>
     <w:uiPriority w:val="99"/>
   </w:style>
-  <w:style w:type="paragraph" w:styleId="CommentSubject">
+  <w:style w:type="paragraph" w:styleId="af3">
     <w:name w:val="annotation subject"/>
-    <w:basedOn w:val="CommentText"/>
-    <w:next w:val="CommentText"/>
-    <w:link w:val="CommentSubjectChar"/>
+    <w:basedOn w:val="af2"/>
+    <w:next w:val="af2"/>
+    <w:link w:val="Char8"/>
     <w:uiPriority w:val="99"/>
     <w:semiHidden/>
     <w:unhideWhenUsed/>
@@ -12616,10 +12799,10 @@
       <w:bCs/>
     </w:rPr>
   </w:style>
-  <w:style w:type="character" w:customStyle="1" w:styleId="CommentSubjectChar">
-    <w:name w:val="Comment Subject Char"/>
-    <w:basedOn w:val="CommentTextChar"/>
-    <w:link w:val="CommentSubject"/>
+  <w:style w:type="character" w:customStyle="1" w:styleId="Char8">
+    <w:name w:val="موضوع تعليق Char"/>
+    <w:basedOn w:val="Char7"/>
+    <w:link w:val="af3"/>
     <w:uiPriority w:val="99"/>
     <w:semiHidden/>
     <w:rPr>
@@ -12627,9 +12810,9 @@
       <w:bCs/>
     </w:rPr>
   </w:style>
-  <w:style w:type="table" w:styleId="LightShading">
+  <w:style w:type="table" w:styleId="af4">
     <w:name w:val="Light Shading"/>
-    <w:basedOn w:val="TableNormal"/>
+    <w:basedOn w:val="a3"/>
     <w:uiPriority w:val="60"/>
     <w:pPr>
       <w:spacing w:after="0" w:line="240" w:lineRule="auto"/>
@@ -12724,7 +12907,7 @@
   </w:style>
   <w:style w:type="paragraph" w:customStyle="1" w:styleId="TableTextDecimal">
     <w:name w:val="Table Text Decimal"/>
-    <w:basedOn w:val="Normal"/>
+    <w:basedOn w:val="a1"/>
     <w:uiPriority w:val="1"/>
     <w:qFormat/>
     <w:pPr>
@@ -12736,7 +12919,7 @@
   </w:style>
   <w:style w:type="paragraph" w:customStyle="1" w:styleId="TableText">
     <w:name w:val="Table Text"/>
-    <w:basedOn w:val="Normal"/>
+    <w:basedOn w:val="a1"/>
     <w:uiPriority w:val="1"/>
     <w:qFormat/>
     <w:pPr>
@@ -12745,7 +12928,7 @@
   </w:style>
   <w:style w:type="paragraph" w:customStyle="1" w:styleId="Organization">
     <w:name w:val="Organization"/>
-    <w:basedOn w:val="Normal"/>
+    <w:basedOn w:val="a1"/>
     <w:uiPriority w:val="2"/>
     <w:qFormat/>
     <w:pPr>
@@ -12759,9 +12942,9 @@
       <w:sz w:val="36"/>
     </w:rPr>
   </w:style>
-  <w:style w:type="paragraph" w:styleId="ListParagraph">
+  <w:style w:type="paragraph" w:styleId="af5">
     <w:name w:val="List Paragraph"/>
-    <w:basedOn w:val="Normal"/>
+    <w:basedOn w:val="a1"/>
     <w:uiPriority w:val="34"/>
     <w:qFormat/>
     <w:rsid w:val="001B698D"/>
@@ -12770,9 +12953,9 @@
       <w:contextualSpacing/>
     </w:pPr>
   </w:style>
-  <w:style w:type="paragraph" w:styleId="NormalWeb">
+  <w:style w:type="paragraph" w:styleId="af6">
     <w:name w:val="Normal (Web)"/>
-    <w:basedOn w:val="Normal"/>
+    <w:basedOn w:val="a1"/>
     <w:uiPriority w:val="99"/>
     <w:unhideWhenUsed/>
     <w:rsid w:val="00852E5F"/>
@@ -12789,7 +12972,7 @@
   </w:style>
   <w:style w:type="character" w:styleId="HTMLCode">
     <w:name w:val="HTML Code"/>
-    <w:basedOn w:val="DefaultParagraphFont"/>
+    <w:basedOn w:val="a2"/>
     <w:uiPriority w:val="99"/>
     <w:semiHidden/>
     <w:unhideWhenUsed/>
@@ -12802,17 +12985,17 @@
   </w:style>
   <w:style w:type="character" w:customStyle="1" w:styleId="8">
     <w:name w:val="ͼ8"/>
-    <w:basedOn w:val="DefaultParagraphFont"/>
+    <w:basedOn w:val="a2"/>
     <w:rsid w:val="00A442D9"/>
   </w:style>
   <w:style w:type="character" w:customStyle="1" w:styleId="b">
     <w:name w:val="ͼb"/>
-    <w:basedOn w:val="DefaultParagraphFont"/>
+    <w:basedOn w:val="a2"/>
     <w:rsid w:val="00A442D9"/>
   </w:style>
   <w:style w:type="paragraph" w:customStyle="1" w:styleId="font-claude-response-body">
     <w:name w:val="font-claude-response-body"/>
-    <w:basedOn w:val="Normal"/>
+    <w:basedOn w:val="a1"/>
     <w:rsid w:val="00EC2668"/>
     <w:pPr>
       <w:spacing w:before="100" w:beforeAutospacing="1" w:after="100" w:afterAutospacing="1" w:line="240" w:lineRule="auto"/>
@@ -12977,13 +13160,6 @@
     <w:pitch w:val="variable"/>
     <w:sig w:usb0="20000287" w:usb1="00000003" w:usb2="00000000" w:usb3="00000000" w:csb0="0000019F" w:csb1="00000000"/>
   </w:font>
-  <w:font w:name="Calibri">
-    <w:panose1 w:val="020F0502020204030204"/>
-    <w:charset w:val="00"/>
-    <w:family w:val="swiss"/>
-    <w:pitch w:val="variable"/>
-    <w:sig w:usb0="E4002EFF" w:usb1="C200247B" w:usb2="00000009" w:usb3="00000000" w:csb0="000001FF" w:csb1="00000000"/>
-  </w:font>
   <w:font w:name="Yu Mincho">
     <w:charset w:val="80"/>
     <w:family w:val="roman"/>
@@ -12998,12 +13174,11 @@
     <w:pitch w:val="variable"/>
     <w:sig w:usb0="E00002FF" w:usb1="2AC7FDFF" w:usb2="00000016" w:usb3="00000000" w:csb0="0002009F" w:csb1="00000000"/>
   </w:font>
-  <w:font w:name="Calibri Light">
-    <w:panose1 w:val="020F0302020204030204"/>
+  <w:font w:name="Aptos Display">
     <w:charset w:val="00"/>
     <w:family w:val="swiss"/>
     <w:pitch w:val="variable"/>
-    <w:sig w:usb0="E4002EFF" w:usb1="C200247B" w:usb2="00000009" w:usb3="00000000" w:csb0="000001FF" w:csb1="00000000"/>
+    <w:sig w:usb0="20000287" w:usb1="00000003" w:usb2="00000000" w:usb3="00000000" w:csb0="0000019F" w:csb1="00000000"/>
   </w:font>
 </w:fonts>
 </file>
@@ -13017,7 +13192,7 @@
     <w:lvl w:ilvl="0">
       <w:start w:val="1"/>
       <w:numFmt w:val="bullet"/>
-      <w:pStyle w:val="ListBullet"/>
+      <w:pStyle w:val="a"/>
       <w:lvlText w:val="•"/>
       <w:lvlJc w:val="left"/>
       <w:pPr>
@@ -13025,7 +13200,7 @@
       </w:pPr>
       <w:rPr>
         <w:rFonts w:ascii="Cambria" w:hAnsi="Cambria" w:hint="default"/>
-        <w:color w:val="4472C4" w:themeColor="accent1"/>
+        <w:color w:val="156082" w:themeColor="accent1"/>
       </w:rPr>
     </w:lvl>
   </w:abstractNum>
@@ -13065,6 +13240,7 @@
     <w:rsid w:val="002A69BE"/>
     <w:rsid w:val="00324ACF"/>
     <w:rsid w:val="00351A43"/>
+    <w:rsid w:val="00366F01"/>
     <w:rsid w:val="003B34DF"/>
     <w:rsid w:val="004A7EE6"/>
     <w:rsid w:val="004E5C8C"/>
@@ -13096,6 +13272,7 @@
     <w:rsid w:val="00AD54E3"/>
     <w:rsid w:val="00B023C2"/>
     <w:rsid w:val="00B1289C"/>
+    <w:rsid w:val="00B26526"/>
     <w:rsid w:val="00B4602D"/>
     <w:rsid w:val="00B833D3"/>
     <w:rsid w:val="00BC2CBC"/>
@@ -13110,6 +13287,7 @@
     <w:rsid w:val="00D40038"/>
     <w:rsid w:val="00D56FB7"/>
     <w:rsid w:val="00D57C07"/>
+    <w:rsid w:val="00D7353A"/>
     <w:rsid w:val="00D93E49"/>
     <w:rsid w:val="00DC401B"/>
     <w:rsid w:val="00E552F8"/>
@@ -13117,6 +13295,7 @@
     <w:rsid w:val="00E9596B"/>
     <w:rsid w:val="00F17A05"/>
     <w:rsid w:val="00F64854"/>
+    <w:rsid w:val="00F8158D"/>
     <w:rsid w:val="00FA6C85"/>
   </w:rsids>
   <m:mathPr>
@@ -13535,17 +13714,17 @@
     <w:lsdException w:name="Unresolved Mention" w:semiHidden="1" w:unhideWhenUsed="1"/>
     <w:lsdException w:name="Smart Link" w:semiHidden="1" w:unhideWhenUsed="1"/>
   </w:latentStyles>
-  <w:style w:type="paragraph" w:default="1" w:styleId="Normal">
+  <w:style w:type="paragraph" w:default="1" w:styleId="a0">
     <w:name w:val="Normal"/>
     <w:qFormat/>
   </w:style>
-  <w:style w:type="character" w:default="1" w:styleId="DefaultParagraphFont">
+  <w:style w:type="character" w:default="1" w:styleId="a1">
     <w:name w:val="Default Paragraph Font"/>
     <w:uiPriority w:val="1"/>
     <w:semiHidden/>
     <w:unhideWhenUsed/>
   </w:style>
-  <w:style w:type="table" w:default="1" w:styleId="TableNormal">
+  <w:style w:type="table" w:default="1" w:styleId="a2">
     <w:name w:val="Normal Table"/>
     <w:uiPriority w:val="99"/>
     <w:semiHidden/>
@@ -13560,15 +13739,15 @@
       </w:tblCellMar>
     </w:tblPr>
   </w:style>
-  <w:style w:type="numbering" w:default="1" w:styleId="NoList">
+  <w:style w:type="numbering" w:default="1" w:styleId="a3">
     <w:name w:val="No List"/>
     <w:uiPriority w:val="99"/>
     <w:semiHidden/>
     <w:unhideWhenUsed/>
   </w:style>
-  <w:style w:type="paragraph" w:styleId="ListBullet">
+  <w:style w:type="paragraph" w:styleId="a">
     <w:name w:val="List Bullet"/>
-    <w:basedOn w:val="Normal"/>
+    <w:basedOn w:val="a0"/>
     <w:uiPriority w:val="1"/>
     <w:unhideWhenUsed/>
     <w:qFormat/>
@@ -13585,9 +13764,9 @@
       <w:lang w:val="en-US" w:eastAsia="en-US"/>
     </w:rPr>
   </w:style>
-  <w:style w:type="character" w:styleId="Strong">
+  <w:style w:type="character" w:styleId="a4">
     <w:name w:val="Strong"/>
-    <w:basedOn w:val="DefaultParagraphFont"/>
+    <w:basedOn w:val="a1"/>
     <w:uiPriority w:val="10"/>
     <w:qFormat/>
     <w:rPr>

</xml_diff>

<commit_message>
Assumptions have been added
</commit_message>
<xml_diff>
--- a/Introduction to DB-CS350 Project.docx
+++ b/Introduction to DB-CS350 Project.docx
@@ -1,6 +1,6 @@
 
 <file path=word/document.xml><?xml version="1.0" encoding="utf-8"?>
-<w:document xmlns:wpc="http://schemas.microsoft.com/office/word/2010/wordprocessingCanvas" xmlns:cx="http://schemas.microsoft.com/office/drawing/2014/chartex" xmlns:cx1="http://schemas.microsoft.com/office/drawing/2015/9/8/chartex" xmlns:cx2="http://schemas.microsoft.com/office/drawing/2015/10/21/chartex" xmlns:cx3="http://schemas.microsoft.com/office/drawing/2016/5/9/chartex" xmlns:cx4="http://schemas.microsoft.com/office/drawing/2016/5/10/chartex" xmlns:cx5="http://schemas.microsoft.com/office/drawing/2016/5/11/chartex" xmlns:cx6="http://schemas.microsoft.com/office/drawing/2016/5/12/chartex" xmlns:cx7="http://schemas.microsoft.com/office/drawing/2016/5/13/chartex" xmlns:cx8="http://schemas.microsoft.com/office/drawing/2016/5/14/chartex" xmlns:mc="http://schemas.openxmlformats.org/markup-compatibility/2006" xmlns:aink="http://schemas.microsoft.com/office/drawing/2016/ink" xmlns:am3d="http://schemas.microsoft.com/office/drawing/2017/model3d" xmlns:o="urn:schemas-microsoft-com:office:office" xmlns:oel="http://schemas.microsoft.com/office/2019/extlst" xmlns:r="http://schemas.openxmlformats.org/officeDocument/2006/relationships" xmlns:m="http://schemas.openxmlformats.org/officeDocument/2006/math" xmlns:v="urn:schemas-microsoft-com:vml" xmlns:wp14="http://schemas.microsoft.com/office/word/2010/wordprocessingDrawing" xmlns:wp="http://schemas.openxmlformats.org/drawingml/2006/wordprocessingDrawing" xmlns:w10="urn:schemas-microsoft-com:office:word" xmlns:w="http://schemas.openxmlformats.org/wordprocessingml/2006/main" xmlns:w14="http://schemas.microsoft.com/office/word/2010/wordml" xmlns:w15="http://schemas.microsoft.com/office/word/2012/wordml" xmlns:w16cex="http://schemas.microsoft.com/office/word/2018/wordml/cex" xmlns:w16cid="http://schemas.microsoft.com/office/word/2016/wordml/cid" xmlns:w16="http://schemas.microsoft.com/office/word/2018/wordml" xmlns:w16du="http://schemas.microsoft.com/office/word/2023/wordml/word16du" xmlns:w16sdtdh="http://schemas.microsoft.com/office/word/2020/wordml/sdtdatahash" xmlns:w16sdtfl="http://schemas.microsoft.com/office/word/2024/wordml/sdtformatlock" xmlns:w16se="http://schemas.microsoft.com/office/word/2015/wordml/symex" xmlns:wpg="http://schemas.microsoft.com/office/word/2010/wordprocessingGroup" xmlns:wpi="http://schemas.microsoft.com/office/word/2010/wordprocessingInk" xmlns:wne="http://schemas.microsoft.com/office/word/2006/wordml" xmlns:wps="http://schemas.microsoft.com/office/word/2010/wordprocessingShape" mc:Ignorable="w14 w15 w16se w16cid w16 w16cex w16sdtdh w16sdtfl w16du wp14">
+<w:document xmlns:wpc="http://schemas.microsoft.com/office/word/2010/wordprocessingCanvas" xmlns:cx="http://schemas.microsoft.com/office/drawing/2014/chartex" xmlns:cx1="http://schemas.microsoft.com/office/drawing/2015/9/8/chartex" xmlns:cx2="http://schemas.microsoft.com/office/drawing/2015/10/21/chartex" xmlns:cx3="http://schemas.microsoft.com/office/drawing/2016/5/9/chartex" xmlns:cx4="http://schemas.microsoft.com/office/drawing/2016/5/10/chartex" xmlns:cx5="http://schemas.microsoft.com/office/drawing/2016/5/11/chartex" xmlns:cx6="http://schemas.microsoft.com/office/drawing/2016/5/12/chartex" xmlns:cx7="http://schemas.microsoft.com/office/drawing/2016/5/13/chartex" xmlns:cx8="http://schemas.microsoft.com/office/drawing/2016/5/14/chartex" xmlns:mc="http://schemas.openxmlformats.org/markup-compatibility/2006" xmlns:aink="http://schemas.microsoft.com/office/drawing/2016/ink" xmlns:am3d="http://schemas.microsoft.com/office/drawing/2017/model3d" xmlns:o="urn:schemas-microsoft-com:office:office" xmlns:oel="http://schemas.microsoft.com/office/2019/extlst" xmlns:r="http://schemas.openxmlformats.org/officeDocument/2006/relationships" xmlns:m="http://schemas.openxmlformats.org/officeDocument/2006/math" xmlns:v="urn:schemas-microsoft-com:vml" xmlns:wp14="http://schemas.microsoft.com/office/word/2010/wordprocessingDrawing" xmlns:wp="http://schemas.openxmlformats.org/drawingml/2006/wordprocessingDrawing" xmlns:w10="urn:schemas-microsoft-com:office:word" xmlns:w="http://schemas.openxmlformats.org/wordprocessingml/2006/main" xmlns:w14="http://schemas.microsoft.com/office/word/2010/wordml" xmlns:w15="http://schemas.microsoft.com/office/word/2012/wordml" xmlns:w16cei="http://schemas.microsoft.com/office/word/2026/wordml/cei" xmlns:w16cex="http://schemas.microsoft.com/office/word/2018/wordml/cex" xmlns:w16cid="http://schemas.microsoft.com/office/word/2016/wordml/cid" xmlns:w16="http://schemas.microsoft.com/office/word/2018/wordml" xmlns:w16du="http://schemas.microsoft.com/office/word/2023/wordml/word16du" xmlns:w16sdtdh="http://schemas.microsoft.com/office/word/2020/wordml/sdtdatahash" xmlns:w16sdtfl="http://schemas.microsoft.com/office/word/2024/wordml/sdtformatlock" xmlns:w16se="http://schemas.microsoft.com/office/word/2015/wordml/symex" xmlns:wpg="http://schemas.microsoft.com/office/word/2010/wordprocessingGroup" xmlns:wpi="http://schemas.microsoft.com/office/word/2010/wordprocessingInk" xmlns:wne="http://schemas.microsoft.com/office/word/2006/wordml" xmlns:wps="http://schemas.microsoft.com/office/word/2010/wordprocessingShape" mc:Ignorable="w14 w15 w16se w16cid w16 w16cex w16sdtdh w16sdtfl w16du wp14">
   <w:body>
     <w:p>
       <w:pPr>
@@ -83,7 +83,7 @@
                             <w:sdtContent>
                               <w:p>
                                 <w:pPr>
-                                  <w:pStyle w:val="Title"/>
+                                  <w:pStyle w:val="a9"/>
                                   <w:jc w:val="center"/>
                                   <w:rPr>
                                     <w:sz w:val="96"/>
@@ -102,7 +102,7 @@
                           </w:sdt>
                           <w:p>
                             <w:pPr>
-                              <w:pStyle w:val="Subtitle"/>
+                              <w:pStyle w:val="a6"/>
                               <w:ind w:left="709" w:right="720"/>
                               <w:jc w:val="center"/>
                               <w:rPr>
@@ -474,7 +474,7 @@
                       <w:sdtContent>
                         <w:p>
                           <w:pPr>
-                            <w:pStyle w:val="Title"/>
+                            <w:pStyle w:val="a9"/>
                             <w:jc w:val="center"/>
                             <w:rPr>
                               <w:sz w:val="96"/>
@@ -493,7 +493,7 @@
                     </w:sdt>
                     <w:p>
                       <w:pPr>
-                        <w:pStyle w:val="Subtitle"/>
+                        <w:pStyle w:val="a6"/>
                         <w:ind w:left="709" w:right="720"/>
                         <w:jc w:val="center"/>
                         <w:rPr>
@@ -1254,7 +1254,7 @@
                               <w:txbxContent>
                                 <w:p>
                                   <w:pPr>
-                                    <w:pStyle w:val="ListParagraph"/>
+                                    <w:pStyle w:val="af5"/>
                                     <w:numPr>
                                       <w:ilvl w:val="0"/>
                                       <w:numId w:val="6"/>
@@ -1323,7 +1323,7 @@
                                 </w:p>
                                 <w:p>
                                   <w:pPr>
-                                    <w:pStyle w:val="ListParagraph"/>
+                                    <w:pStyle w:val="af5"/>
                                     <w:numPr>
                                       <w:ilvl w:val="0"/>
                                       <w:numId w:val="6"/>
@@ -1344,7 +1344,7 @@
                                 </w:p>
                                 <w:p>
                                   <w:pPr>
-                                    <w:pStyle w:val="ListParagraph"/>
+                                    <w:pStyle w:val="af5"/>
                                     <w:numPr>
                                       <w:ilvl w:val="0"/>
                                       <w:numId w:val="6"/>
@@ -1456,7 +1456,7 @@
                                 </w:p>
                                 <w:p>
                                   <w:pPr>
-                                    <w:pStyle w:val="ListParagraph"/>
+                                    <w:pStyle w:val="af5"/>
                                     <w:numPr>
                                       <w:ilvl w:val="0"/>
                                       <w:numId w:val="6"/>
@@ -1478,7 +1478,7 @@
                                 </w:p>
                                 <w:p>
                                   <w:pPr>
-                                    <w:pStyle w:val="ListParagraph"/>
+                                    <w:pStyle w:val="af5"/>
                                     <w:numPr>
                                       <w:ilvl w:val="0"/>
                                       <w:numId w:val="6"/>
@@ -1506,7 +1506,7 @@
                                 </w:p>
                                 <w:p>
                                   <w:pPr>
-                                    <w:pStyle w:val="ListParagraph"/>
+                                    <w:pStyle w:val="af5"/>
                                     <w:numPr>
                                       <w:ilvl w:val="0"/>
                                       <w:numId w:val="6"/>
@@ -1528,7 +1528,7 @@
                                 </w:p>
                                 <w:p>
                                   <w:pPr>
-                                    <w:pStyle w:val="ListParagraph"/>
+                                    <w:pStyle w:val="af5"/>
                                     <w:numPr>
                                       <w:ilvl w:val="0"/>
                                       <w:numId w:val="6"/>
@@ -1575,7 +1575,7 @@
                                 </w:p>
                                 <w:p>
                                   <w:pPr>
-                                    <w:pStyle w:val="ListParagraph"/>
+                                    <w:pStyle w:val="af5"/>
                                     <w:numPr>
                                       <w:ilvl w:val="0"/>
                                       <w:numId w:val="6"/>
@@ -1597,7 +1597,7 @@
                                 </w:p>
                                 <w:p>
                                   <w:pPr>
-                                    <w:pStyle w:val="ListParagraph"/>
+                                    <w:pStyle w:val="af5"/>
                                     <w:numPr>
                                       <w:ilvl w:val="0"/>
                                       <w:numId w:val="6"/>
@@ -1637,7 +1637,7 @@
                                 </w:p>
                                 <w:p>
                                   <w:pPr>
-                                    <w:pStyle w:val="ListParagraph"/>
+                                    <w:pStyle w:val="af5"/>
                                     <w:numPr>
                                       <w:ilvl w:val="0"/>
                                       <w:numId w:val="6"/>
@@ -1734,7 +1734,7 @@
                         <w:txbxContent>
                           <w:p>
                             <w:pPr>
-                              <w:pStyle w:val="ListParagraph"/>
+                              <w:pStyle w:val="af5"/>
                               <w:numPr>
                                 <w:ilvl w:val="0"/>
                                 <w:numId w:val="6"/>
@@ -1803,7 +1803,7 @@
                           </w:p>
                           <w:p>
                             <w:pPr>
-                              <w:pStyle w:val="ListParagraph"/>
+                              <w:pStyle w:val="af5"/>
                               <w:numPr>
                                 <w:ilvl w:val="0"/>
                                 <w:numId w:val="6"/>
@@ -1824,7 +1824,7 @@
                           </w:p>
                           <w:p>
                             <w:pPr>
-                              <w:pStyle w:val="ListParagraph"/>
+                              <w:pStyle w:val="af5"/>
                               <w:numPr>
                                 <w:ilvl w:val="0"/>
                                 <w:numId w:val="6"/>
@@ -1936,7 +1936,7 @@
                           </w:p>
                           <w:p>
                             <w:pPr>
-                              <w:pStyle w:val="ListParagraph"/>
+                              <w:pStyle w:val="af5"/>
                               <w:numPr>
                                 <w:ilvl w:val="0"/>
                                 <w:numId w:val="6"/>
@@ -1958,7 +1958,7 @@
                           </w:p>
                           <w:p>
                             <w:pPr>
-                              <w:pStyle w:val="ListParagraph"/>
+                              <w:pStyle w:val="af5"/>
                               <w:numPr>
                                 <w:ilvl w:val="0"/>
                                 <w:numId w:val="6"/>
@@ -1986,7 +1986,7 @@
                           </w:p>
                           <w:p>
                             <w:pPr>
-                              <w:pStyle w:val="ListParagraph"/>
+                              <w:pStyle w:val="af5"/>
                               <w:numPr>
                                 <w:ilvl w:val="0"/>
                                 <w:numId w:val="6"/>
@@ -2008,7 +2008,7 @@
                           </w:p>
                           <w:p>
                             <w:pPr>
-                              <w:pStyle w:val="ListParagraph"/>
+                              <w:pStyle w:val="af5"/>
                               <w:numPr>
                                 <w:ilvl w:val="0"/>
                                 <w:numId w:val="6"/>
@@ -2055,7 +2055,7 @@
                           </w:p>
                           <w:p>
                             <w:pPr>
-                              <w:pStyle w:val="ListParagraph"/>
+                              <w:pStyle w:val="af5"/>
                               <w:numPr>
                                 <w:ilvl w:val="0"/>
                                 <w:numId w:val="6"/>
@@ -2077,7 +2077,7 @@
                           </w:p>
                           <w:p>
                             <w:pPr>
-                              <w:pStyle w:val="ListParagraph"/>
+                              <w:pStyle w:val="af5"/>
                               <w:numPr>
                                 <w:ilvl w:val="0"/>
                                 <w:numId w:val="6"/>
@@ -2117,7 +2117,7 @@
                           </w:p>
                           <w:p>
                             <w:pPr>
-                              <w:pStyle w:val="ListParagraph"/>
+                              <w:pStyle w:val="af5"/>
                               <w:numPr>
                                 <w:ilvl w:val="0"/>
                                 <w:numId w:val="6"/>
@@ -2298,7 +2298,7 @@
                                     </w:tcPr>
                                     <w:p>
                                       <w:pPr>
-                                        <w:pStyle w:val="Footer"/>
+                                        <w:pStyle w:val="a5"/>
                                         <w:rPr>
                                           <w:b/>
                                           <w:bCs/>
@@ -2336,7 +2336,7 @@
                                     </w:p>
                                     <w:p>
                                       <w:pPr>
-                                        <w:pStyle w:val="Footer"/>
+                                        <w:pStyle w:val="a5"/>
                                         <w:rPr>
                                           <w:b/>
                                           <w:bCs/>
@@ -2385,7 +2385,7 @@
                                     </w:p>
                                     <w:p>
                                       <w:pPr>
-                                        <w:pStyle w:val="Footer"/>
+                                        <w:pStyle w:val="a5"/>
                                         <w:rPr>
                                           <w:b/>
                                           <w:bCs/>
@@ -2423,7 +2423,7 @@
                                     </w:p>
                                     <w:p>
                                       <w:pPr>
-                                        <w:pStyle w:val="Footer"/>
+                                        <w:pStyle w:val="a5"/>
                                         <w:rPr>
                                           <w:b/>
                                           <w:bCs/>
@@ -2461,7 +2461,7 @@
                                     </w:p>
                                     <w:p>
                                       <w:pPr>
-                                        <w:pStyle w:val="Footer"/>
+                                        <w:pStyle w:val="a5"/>
                                         <w:ind w:left="0"/>
                                         <w:rPr>
                                           <w:b/>
@@ -2481,7 +2481,7 @@
                                     </w:tcPr>
                                     <w:p>
                                       <w:pPr>
-                                        <w:pStyle w:val="Footer"/>
+                                        <w:pStyle w:val="a5"/>
                                         <w:ind w:left="0"/>
                                         <w:rPr>
                                           <w:b/>
@@ -2499,7 +2499,7 @@
                                     </w:tcPr>
                                     <w:p>
                                       <w:pPr>
-                                        <w:pStyle w:val="Footer"/>
+                                        <w:pStyle w:val="a5"/>
                                         <w:rPr>
                                           <w:b/>
                                           <w:bCs/>
@@ -2537,7 +2537,7 @@
                                     </w:p>
                                     <w:p>
                                       <w:pPr>
-                                        <w:pStyle w:val="Footer"/>
+                                        <w:pStyle w:val="a5"/>
                                         <w:rPr>
                                           <w:b/>
                                           <w:bCs/>
@@ -2575,7 +2575,7 @@
                                     </w:p>
                                     <w:p>
                                       <w:pPr>
-                                        <w:pStyle w:val="Footer"/>
+                                        <w:pStyle w:val="a5"/>
                                         <w:rPr>
                                           <w:b/>
                                           <w:bCs/>
@@ -2613,7 +2613,7 @@
                                     </w:p>
                                     <w:p>
                                       <w:pPr>
-                                        <w:pStyle w:val="Footer"/>
+                                        <w:pStyle w:val="a5"/>
                                         <w:rPr>
                                           <w:b/>
                                           <w:bCs/>
@@ -2663,7 +2663,7 @@
                                     </w:tcPr>
                                     <w:p>
                                       <w:pPr>
-                                        <w:pStyle w:val="Footer"/>
+                                        <w:pStyle w:val="a5"/>
                                         <w:ind w:left="0"/>
                                       </w:pPr>
                                     </w:p>
@@ -2675,7 +2675,7 @@
                                     </w:tcPr>
                                     <w:p>
                                       <w:pPr>
-                                        <w:pStyle w:val="Footer"/>
+                                        <w:pStyle w:val="a5"/>
                                       </w:pPr>
                                     </w:p>
                                   </w:tc>
@@ -2686,7 +2686,7 @@
                                     </w:tcPr>
                                     <w:p>
                                       <w:pPr>
-                                        <w:pStyle w:val="Footer"/>
+                                        <w:pStyle w:val="a5"/>
                                       </w:pPr>
                                     </w:p>
                                   </w:tc>
@@ -2694,7 +2694,7 @@
                               </w:tbl>
                               <w:p>
                                 <w:pPr>
-                                  <w:pStyle w:val="NoSpacing"/>
+                                  <w:pStyle w:val="ad"/>
                                 </w:pPr>
                               </w:p>
                             </w:txbxContent>
@@ -2797,7 +2797,7 @@
                               </w:tcPr>
                               <w:p>
                                 <w:pPr>
-                                  <w:pStyle w:val="Footer"/>
+                                  <w:pStyle w:val="a5"/>
                                   <w:rPr>
                                     <w:b/>
                                     <w:bCs/>
@@ -2835,7 +2835,7 @@
                               </w:p>
                               <w:p>
                                 <w:pPr>
-                                  <w:pStyle w:val="Footer"/>
+                                  <w:pStyle w:val="a5"/>
                                   <w:rPr>
                                     <w:b/>
                                     <w:bCs/>
@@ -2884,7 +2884,7 @@
                               </w:p>
                               <w:p>
                                 <w:pPr>
-                                  <w:pStyle w:val="Footer"/>
+                                  <w:pStyle w:val="a5"/>
                                   <w:rPr>
                                     <w:b/>
                                     <w:bCs/>
@@ -2922,7 +2922,7 @@
                               </w:p>
                               <w:p>
                                 <w:pPr>
-                                  <w:pStyle w:val="Footer"/>
+                                  <w:pStyle w:val="a5"/>
                                   <w:rPr>
                                     <w:b/>
                                     <w:bCs/>
@@ -2960,7 +2960,7 @@
                               </w:p>
                               <w:p>
                                 <w:pPr>
-                                  <w:pStyle w:val="Footer"/>
+                                  <w:pStyle w:val="a5"/>
                                   <w:ind w:left="0"/>
                                   <w:rPr>
                                     <w:b/>
@@ -2980,7 +2980,7 @@
                               </w:tcPr>
                               <w:p>
                                 <w:pPr>
-                                  <w:pStyle w:val="Footer"/>
+                                  <w:pStyle w:val="a5"/>
                                   <w:ind w:left="0"/>
                                   <w:rPr>
                                     <w:b/>
@@ -2998,7 +2998,7 @@
                               </w:tcPr>
                               <w:p>
                                 <w:pPr>
-                                  <w:pStyle w:val="Footer"/>
+                                  <w:pStyle w:val="a5"/>
                                   <w:rPr>
                                     <w:b/>
                                     <w:bCs/>
@@ -3036,7 +3036,7 @@
                               </w:p>
                               <w:p>
                                 <w:pPr>
-                                  <w:pStyle w:val="Footer"/>
+                                  <w:pStyle w:val="a5"/>
                                   <w:rPr>
                                     <w:b/>
                                     <w:bCs/>
@@ -3074,7 +3074,7 @@
                               </w:p>
                               <w:p>
                                 <w:pPr>
-                                  <w:pStyle w:val="Footer"/>
+                                  <w:pStyle w:val="a5"/>
                                   <w:rPr>
                                     <w:b/>
                                     <w:bCs/>
@@ -3112,7 +3112,7 @@
                               </w:p>
                               <w:p>
                                 <w:pPr>
-                                  <w:pStyle w:val="Footer"/>
+                                  <w:pStyle w:val="a5"/>
                                   <w:rPr>
                                     <w:b/>
                                     <w:bCs/>
@@ -3162,7 +3162,7 @@
                               </w:tcPr>
                               <w:p>
                                 <w:pPr>
-                                  <w:pStyle w:val="Footer"/>
+                                  <w:pStyle w:val="a5"/>
                                   <w:ind w:left="0"/>
                                 </w:pPr>
                               </w:p>
@@ -3174,7 +3174,7 @@
                               </w:tcPr>
                               <w:p>
                                 <w:pPr>
-                                  <w:pStyle w:val="Footer"/>
+                                  <w:pStyle w:val="a5"/>
                                 </w:pPr>
                               </w:p>
                             </w:tc>
@@ -3185,7 +3185,7 @@
                               </w:tcPr>
                               <w:p>
                                 <w:pPr>
-                                  <w:pStyle w:val="Footer"/>
+                                  <w:pStyle w:val="a5"/>
                                 </w:pPr>
                               </w:p>
                             </w:tc>
@@ -3193,7 +3193,7 @@
                         </w:tbl>
                         <w:p>
                           <w:pPr>
-                            <w:pStyle w:val="NoSpacing"/>
+                            <w:pStyle w:val="ad"/>
                           </w:pPr>
                         </w:p>
                       </w:txbxContent>
@@ -3235,7 +3235,7 @@
     </w:p>
     <w:p>
       <w:pPr>
-        <w:pStyle w:val="Heading1"/>
+        <w:pStyle w:val="1"/>
         <w:spacing w:before="0" w:after="0"/>
         <w:rPr>
           <w:rFonts w:ascii="Times New Roman" w:hAnsi="Times New Roman" w:cs="Times New Roman"/>
@@ -3376,7 +3376,7 @@
     </w:p>
     <w:p>
       <w:pPr>
-        <w:pStyle w:val="ListParagraph"/>
+        <w:pStyle w:val="af5"/>
         <w:numPr>
           <w:ilvl w:val="1"/>
           <w:numId w:val="6"/>
@@ -3455,7 +3455,7 @@
     </w:p>
     <w:p>
       <w:pPr>
-        <w:pStyle w:val="ListParagraph"/>
+        <w:pStyle w:val="af5"/>
         <w:numPr>
           <w:ilvl w:val="1"/>
           <w:numId w:val="6"/>
@@ -3541,7 +3541,7 @@
     </w:p>
     <w:p>
       <w:pPr>
-        <w:pStyle w:val="ListParagraph"/>
+        <w:pStyle w:val="af5"/>
         <w:numPr>
           <w:ilvl w:val="1"/>
           <w:numId w:val="6"/>
@@ -3627,7 +3627,7 @@
     </w:p>
     <w:p>
       <w:pPr>
-        <w:pStyle w:val="ListParagraph"/>
+        <w:pStyle w:val="af5"/>
         <w:numPr>
           <w:ilvl w:val="1"/>
           <w:numId w:val="6"/>
@@ -3873,7 +3873,7 @@
     </w:p>
     <w:p>
       <w:pPr>
-        <w:pStyle w:val="ListParagraph"/>
+        <w:pStyle w:val="af5"/>
         <w:numPr>
           <w:ilvl w:val="0"/>
           <w:numId w:val="19"/>
@@ -3898,7 +3898,7 @@
     </w:p>
     <w:p>
       <w:pPr>
-        <w:pStyle w:val="ListParagraph"/>
+        <w:pStyle w:val="af5"/>
         <w:numPr>
           <w:ilvl w:val="0"/>
           <w:numId w:val="19"/>
@@ -3923,7 +3923,7 @@
     </w:p>
     <w:p>
       <w:pPr>
-        <w:pStyle w:val="ListParagraph"/>
+        <w:pStyle w:val="af5"/>
         <w:numPr>
           <w:ilvl w:val="0"/>
           <w:numId w:val="19"/>
@@ -4020,7 +4020,7 @@
     </w:p>
     <w:p>
       <w:pPr>
-        <w:pStyle w:val="ListParagraph"/>
+        <w:pStyle w:val="af5"/>
         <w:numPr>
           <w:ilvl w:val="0"/>
           <w:numId w:val="19"/>
@@ -4401,7 +4401,7 @@
     </w:p>
     <w:p>
       <w:pPr>
-        <w:pStyle w:val="ListParagraph"/>
+        <w:pStyle w:val="af5"/>
         <w:numPr>
           <w:ilvl w:val="0"/>
           <w:numId w:val="7"/>
@@ -4439,7 +4439,7 @@
     </w:p>
     <w:p>
       <w:pPr>
-        <w:pStyle w:val="ListParagraph"/>
+        <w:pStyle w:val="af5"/>
         <w:numPr>
           <w:ilvl w:val="0"/>
           <w:numId w:val="7"/>
@@ -4555,7 +4555,7 @@
     </w:p>
     <w:p>
       <w:pPr>
-        <w:pStyle w:val="Heading1"/>
+        <w:pStyle w:val="1"/>
         <w:rPr>
           <w:rFonts w:ascii="Times New Roman" w:hAnsi="Times New Roman" w:cs="Times New Roman"/>
           <w:color w:val="auto"/>
@@ -4674,16 +4674,16 @@
                         <w:txbxContent>
                           <w:p>
                             <w:pPr>
-                              <w:pStyle w:val="Quote"/>
+                              <w:pStyle w:val="af"/>
                               <w:rPr>
-                                <w:rStyle w:val="QuoteChar"/>
+                                <w:rStyle w:val="Char5"/>
                                 <w:i/>
                                 <w:iCs/>
                               </w:rPr>
                             </w:pPr>
                             <w:r>
                               <w:rPr>
-                                <w:rStyle w:val="QuoteChar"/>
+                                <w:rStyle w:val="Char5"/>
                                 <w:i/>
                                 <w:iCs/>
                               </w:rPr>
@@ -4701,7 +4701,7 @@
                           </w:p>
                           <w:p>
                             <w:pPr>
-                              <w:pStyle w:val="NormalWeb"/>
+                              <w:pStyle w:val="af6"/>
                               <w:shd w:val="clear" w:color="auto" w:fill="FFFFFF"/>
                               <w:spacing w:before="0" w:beforeAutospacing="0" w:after="0" w:afterAutospacing="0" w:line="360" w:lineRule="auto"/>
                               <w:jc w:val="both"/>
@@ -4729,7 +4729,7 @@
                           </w:p>
                           <w:p>
                             <w:pPr>
-                              <w:pStyle w:val="NormalWeb"/>
+                              <w:pStyle w:val="af6"/>
                               <w:shd w:val="clear" w:color="auto" w:fill="FFFFFF"/>
                               <w:spacing w:before="0" w:beforeAutospacing="0" w:after="0" w:afterAutospacing="0"/>
                               <w:rPr>
@@ -4797,16 +4797,16 @@
                   <w:txbxContent>
                     <w:p>
                       <w:pPr>
-                        <w:pStyle w:val="Quote"/>
+                        <w:pStyle w:val="af"/>
                         <w:rPr>
-                          <w:rStyle w:val="QuoteChar"/>
+                          <w:rStyle w:val="Char5"/>
                           <w:i/>
                           <w:iCs/>
                         </w:rPr>
                       </w:pPr>
                       <w:r>
                         <w:rPr>
-                          <w:rStyle w:val="QuoteChar"/>
+                          <w:rStyle w:val="Char5"/>
                           <w:i/>
                           <w:iCs/>
                         </w:rPr>
@@ -4824,7 +4824,7 @@
                     </w:p>
                     <w:p>
                       <w:pPr>
-                        <w:pStyle w:val="NormalWeb"/>
+                        <w:pStyle w:val="af6"/>
                         <w:shd w:val="clear" w:color="auto" w:fill="FFFFFF"/>
                         <w:spacing w:before="0" w:beforeAutospacing="0" w:after="0" w:afterAutospacing="0" w:line="360" w:lineRule="auto"/>
                         <w:jc w:val="both"/>
@@ -4852,7 +4852,7 @@
                     </w:p>
                     <w:p>
                       <w:pPr>
-                        <w:pStyle w:val="NormalWeb"/>
+                        <w:pStyle w:val="af6"/>
                         <w:shd w:val="clear" w:color="auto" w:fill="FFFFFF"/>
                         <w:spacing w:before="0" w:beforeAutospacing="0" w:after="0" w:afterAutospacing="0"/>
                         <w:rPr>
@@ -4954,7 +4954,7 @@
     </w:p>
     <w:p>
       <w:pPr>
-        <w:pStyle w:val="Heading1"/>
+        <w:pStyle w:val="1"/>
       </w:pPr>
       <w:r>
         <w:lastRenderedPageBreak/>
@@ -4963,7 +4963,7 @@
     </w:p>
     <w:p>
       <w:pPr>
-        <w:pStyle w:val="ListBullet"/>
+        <w:pStyle w:val="a"/>
         <w:rPr>
           <w:rFonts w:ascii="Times New Roman" w:hAnsi="Times New Roman" w:cs="Times New Roman"/>
           <w:sz w:val="24"/>
@@ -4981,7 +4981,7 @@
     </w:p>
     <w:p>
       <w:pPr>
-        <w:pStyle w:val="ListBullet"/>
+        <w:pStyle w:val="a"/>
         <w:rPr>
           <w:rFonts w:ascii="Times New Roman" w:hAnsi="Times New Roman" w:cs="Times New Roman"/>
           <w:sz w:val="24"/>
@@ -5021,7 +5021,7 @@
     </w:p>
     <w:p>
       <w:pPr>
-        <w:pStyle w:val="ListBullet"/>
+        <w:pStyle w:val="a"/>
         <w:rPr>
           <w:rFonts w:ascii="Times New Roman" w:hAnsi="Times New Roman" w:cs="Times New Roman"/>
           <w:sz w:val="24"/>
@@ -5039,7 +5039,7 @@
     </w:p>
     <w:p>
       <w:pPr>
-        <w:pStyle w:val="ListBullet"/>
+        <w:pStyle w:val="a"/>
         <w:rPr>
           <w:rFonts w:ascii="Times New Roman" w:hAnsi="Times New Roman" w:cs="Times New Roman"/>
           <w:sz w:val="24"/>
@@ -5057,7 +5057,7 @@
     </w:p>
     <w:p>
       <w:pPr>
-        <w:pStyle w:val="ListBullet"/>
+        <w:pStyle w:val="a"/>
         <w:rPr>
           <w:rFonts w:ascii="Times New Roman" w:hAnsi="Times New Roman" w:cs="Times New Roman"/>
           <w:sz w:val="24"/>
@@ -5075,7 +5075,7 @@
     </w:p>
     <w:p>
       <w:pPr>
-        <w:pStyle w:val="ListBullet"/>
+        <w:pStyle w:val="a"/>
         <w:rPr>
           <w:rFonts w:ascii="Times New Roman" w:hAnsi="Times New Roman" w:cs="Times New Roman"/>
           <w:sz w:val="24"/>
@@ -5093,7 +5093,7 @@
     </w:p>
     <w:p>
       <w:pPr>
-        <w:pStyle w:val="ListBullet"/>
+        <w:pStyle w:val="a"/>
         <w:numPr>
           <w:ilvl w:val="0"/>
           <w:numId w:val="0"/>
@@ -5108,7 +5108,7 @@
     </w:p>
     <w:p>
       <w:pPr>
-        <w:pStyle w:val="ListBullet"/>
+        <w:pStyle w:val="a"/>
         <w:numPr>
           <w:ilvl w:val="0"/>
           <w:numId w:val="0"/>
@@ -5123,7 +5123,7 @@
     </w:p>
     <w:p>
       <w:pPr>
-        <w:pStyle w:val="ListBullet"/>
+        <w:pStyle w:val="a"/>
         <w:numPr>
           <w:ilvl w:val="0"/>
           <w:numId w:val="0"/>
@@ -5138,7 +5138,7 @@
     </w:p>
     <w:p>
       <w:pPr>
-        <w:pStyle w:val="ListBullet"/>
+        <w:pStyle w:val="a"/>
         <w:numPr>
           <w:ilvl w:val="0"/>
           <w:numId w:val="0"/>
@@ -5153,7 +5153,7 @@
     </w:p>
     <w:p>
       <w:pPr>
-        <w:pStyle w:val="ListBullet"/>
+        <w:pStyle w:val="a"/>
         <w:numPr>
           <w:ilvl w:val="0"/>
           <w:numId w:val="0"/>
@@ -5168,7 +5168,7 @@
     </w:p>
     <w:p>
       <w:pPr>
-        <w:pStyle w:val="ListBullet"/>
+        <w:pStyle w:val="a"/>
         <w:numPr>
           <w:ilvl w:val="0"/>
           <w:numId w:val="0"/>
@@ -5183,7 +5183,7 @@
     </w:p>
     <w:p>
       <w:pPr>
-        <w:pStyle w:val="ListBullet"/>
+        <w:pStyle w:val="a"/>
         <w:numPr>
           <w:ilvl w:val="0"/>
           <w:numId w:val="0"/>
@@ -5198,7 +5198,7 @@
     </w:p>
     <w:p>
       <w:pPr>
-        <w:pStyle w:val="ListBullet"/>
+        <w:pStyle w:val="a"/>
         <w:numPr>
           <w:ilvl w:val="0"/>
           <w:numId w:val="0"/>
@@ -5213,7 +5213,7 @@
     </w:p>
     <w:p>
       <w:pPr>
-        <w:pStyle w:val="ListBullet"/>
+        <w:pStyle w:val="a"/>
         <w:numPr>
           <w:ilvl w:val="0"/>
           <w:numId w:val="0"/>
@@ -5228,7 +5228,7 @@
     </w:p>
     <w:p>
       <w:pPr>
-        <w:pStyle w:val="ListBullet"/>
+        <w:pStyle w:val="a"/>
         <w:numPr>
           <w:ilvl w:val="0"/>
           <w:numId w:val="0"/>
@@ -5243,7 +5243,7 @@
     </w:p>
     <w:p>
       <w:pPr>
-        <w:pStyle w:val="ListBullet"/>
+        <w:pStyle w:val="a"/>
         <w:numPr>
           <w:ilvl w:val="0"/>
           <w:numId w:val="0"/>
@@ -5258,7 +5258,7 @@
     </w:p>
     <w:p>
       <w:pPr>
-        <w:pStyle w:val="ListBullet"/>
+        <w:pStyle w:val="a"/>
         <w:numPr>
           <w:ilvl w:val="0"/>
           <w:numId w:val="0"/>
@@ -5273,7 +5273,7 @@
     </w:p>
     <w:p>
       <w:pPr>
-        <w:pStyle w:val="ListBullet"/>
+        <w:pStyle w:val="a"/>
         <w:numPr>
           <w:ilvl w:val="0"/>
           <w:numId w:val="0"/>
@@ -5288,7 +5288,7 @@
     </w:p>
     <w:p>
       <w:pPr>
-        <w:pStyle w:val="ListBullet"/>
+        <w:pStyle w:val="a"/>
         <w:numPr>
           <w:ilvl w:val="0"/>
           <w:numId w:val="0"/>
@@ -5303,7 +5303,7 @@
     </w:p>
     <w:p>
       <w:pPr>
-        <w:pStyle w:val="ListBullet"/>
+        <w:pStyle w:val="a"/>
         <w:numPr>
           <w:ilvl w:val="0"/>
           <w:numId w:val="0"/>
@@ -5318,7 +5318,7 @@
     </w:p>
     <w:p>
       <w:pPr>
-        <w:pStyle w:val="ListBullet"/>
+        <w:pStyle w:val="a"/>
         <w:numPr>
           <w:ilvl w:val="0"/>
           <w:numId w:val="0"/>
@@ -5333,7 +5333,7 @@
     </w:p>
     <w:p>
       <w:pPr>
-        <w:pStyle w:val="ListBullet"/>
+        <w:pStyle w:val="a"/>
         <w:numPr>
           <w:ilvl w:val="0"/>
           <w:numId w:val="0"/>
@@ -5348,7 +5348,7 @@
     </w:p>
     <w:p>
       <w:pPr>
-        <w:pStyle w:val="ListBullet"/>
+        <w:pStyle w:val="a"/>
         <w:numPr>
           <w:ilvl w:val="0"/>
           <w:numId w:val="0"/>
@@ -5363,7 +5363,7 @@
     </w:p>
     <w:p>
       <w:pPr>
-        <w:pStyle w:val="ListBullet"/>
+        <w:pStyle w:val="a"/>
         <w:numPr>
           <w:ilvl w:val="0"/>
           <w:numId w:val="0"/>
@@ -5378,7 +5378,7 @@
     </w:p>
     <w:p>
       <w:pPr>
-        <w:pStyle w:val="ListBullet"/>
+        <w:pStyle w:val="a"/>
         <w:numPr>
           <w:ilvl w:val="0"/>
           <w:numId w:val="0"/>
@@ -5393,7 +5393,7 @@
     </w:p>
     <w:p>
       <w:pPr>
-        <w:pStyle w:val="ListBullet"/>
+        <w:pStyle w:val="a"/>
         <w:numPr>
           <w:ilvl w:val="0"/>
           <w:numId w:val="0"/>
@@ -5408,7 +5408,7 @@
     </w:p>
     <w:p>
       <w:pPr>
-        <w:pStyle w:val="ListBullet"/>
+        <w:pStyle w:val="a"/>
         <w:numPr>
           <w:ilvl w:val="0"/>
           <w:numId w:val="0"/>
@@ -5423,7 +5423,7 @@
     </w:p>
     <w:p>
       <w:pPr>
-        <w:pStyle w:val="ListBullet"/>
+        <w:pStyle w:val="a"/>
         <w:numPr>
           <w:ilvl w:val="0"/>
           <w:numId w:val="30"/>
@@ -5452,7 +5452,7 @@
     </w:p>
     <w:p>
       <w:pPr>
-        <w:pStyle w:val="ListBullet"/>
+        <w:pStyle w:val="a"/>
         <w:numPr>
           <w:ilvl w:val="0"/>
           <w:numId w:val="0"/>
@@ -5470,7 +5470,7 @@
     </w:p>
     <w:p>
       <w:pPr>
-        <w:pStyle w:val="ListBullet"/>
+        <w:pStyle w:val="a"/>
         <w:numPr>
           <w:ilvl w:val="0"/>
           <w:numId w:val="28"/>
@@ -5494,7 +5494,7 @@
     </w:p>
     <w:p>
       <w:pPr>
-        <w:pStyle w:val="ListBullet"/>
+        <w:pStyle w:val="a"/>
         <w:numPr>
           <w:ilvl w:val="0"/>
           <w:numId w:val="28"/>
@@ -5518,7 +5518,7 @@
     </w:p>
     <w:p>
       <w:pPr>
-        <w:pStyle w:val="ListBullet"/>
+        <w:pStyle w:val="a"/>
         <w:numPr>
           <w:ilvl w:val="0"/>
           <w:numId w:val="29"/>
@@ -5544,7 +5544,7 @@
     </w:p>
     <w:p>
       <w:pPr>
-        <w:pStyle w:val="ListBullet"/>
+        <w:pStyle w:val="a"/>
         <w:numPr>
           <w:ilvl w:val="0"/>
           <w:numId w:val="29"/>
@@ -5568,7 +5568,7 @@
     </w:p>
     <w:p>
       <w:pPr>
-        <w:pStyle w:val="ListBullet"/>
+        <w:pStyle w:val="a"/>
         <w:numPr>
           <w:ilvl w:val="0"/>
           <w:numId w:val="28"/>
@@ -5592,7 +5592,7 @@
     </w:p>
     <w:p>
       <w:pPr>
-        <w:pStyle w:val="ListBullet"/>
+        <w:pStyle w:val="a"/>
         <w:numPr>
           <w:ilvl w:val="0"/>
           <w:numId w:val="28"/>
@@ -5616,7 +5616,7 @@
     </w:p>
     <w:p>
       <w:pPr>
-        <w:pStyle w:val="ListBullet"/>
+        <w:pStyle w:val="a"/>
         <w:numPr>
           <w:ilvl w:val="0"/>
           <w:numId w:val="28"/>
@@ -5640,7 +5640,7 @@
     </w:p>
     <w:p>
       <w:pPr>
-        <w:pStyle w:val="ListBullet"/>
+        <w:pStyle w:val="a"/>
         <w:numPr>
           <w:ilvl w:val="0"/>
           <w:numId w:val="28"/>
@@ -5664,7 +5664,7 @@
     </w:p>
     <w:p>
       <w:pPr>
-        <w:pStyle w:val="ListBullet"/>
+        <w:pStyle w:val="a"/>
         <w:numPr>
           <w:ilvl w:val="0"/>
           <w:numId w:val="0"/>
@@ -5678,7 +5678,7 @@
     </w:p>
     <w:p>
       <w:pPr>
-        <w:pStyle w:val="ListBullet"/>
+        <w:pStyle w:val="a"/>
         <w:numPr>
           <w:ilvl w:val="0"/>
           <w:numId w:val="30"/>
@@ -5706,7 +5706,7 @@
     </w:p>
     <w:p>
       <w:pPr>
-        <w:pStyle w:val="ListBullet"/>
+        <w:pStyle w:val="a"/>
         <w:numPr>
           <w:ilvl w:val="0"/>
           <w:numId w:val="0"/>
@@ -5722,7 +5722,7 @@
     </w:p>
     <w:p>
       <w:pPr>
-        <w:pStyle w:val="ListBullet"/>
+        <w:pStyle w:val="a"/>
         <w:numPr>
           <w:ilvl w:val="0"/>
           <w:numId w:val="0"/>
@@ -5747,7 +5747,7 @@
     </w:p>
     <w:p>
       <w:pPr>
-        <w:pStyle w:val="ListBullet"/>
+        <w:pStyle w:val="a"/>
         <w:numPr>
           <w:ilvl w:val="0"/>
           <w:numId w:val="28"/>
@@ -5775,7 +5775,7 @@
     </w:p>
     <w:p>
       <w:pPr>
-        <w:pStyle w:val="ListBullet"/>
+        <w:pStyle w:val="a"/>
         <w:numPr>
           <w:ilvl w:val="0"/>
           <w:numId w:val="28"/>
@@ -5799,7 +5799,7 @@
     </w:p>
     <w:p>
       <w:pPr>
-        <w:pStyle w:val="ListBullet"/>
+        <w:pStyle w:val="a"/>
         <w:numPr>
           <w:ilvl w:val="0"/>
           <w:numId w:val="0"/>
@@ -5817,7 +5817,7 @@
     </w:p>
     <w:p>
       <w:pPr>
-        <w:pStyle w:val="ListBullet"/>
+        <w:pStyle w:val="a"/>
         <w:numPr>
           <w:ilvl w:val="0"/>
           <w:numId w:val="30"/>
@@ -5845,7 +5845,7 @@
     </w:p>
     <w:p>
       <w:pPr>
-        <w:pStyle w:val="ListBullet"/>
+        <w:pStyle w:val="a"/>
         <w:numPr>
           <w:ilvl w:val="0"/>
           <w:numId w:val="0"/>
@@ -5862,7 +5862,7 @@
     </w:p>
     <w:tbl>
       <w:tblPr>
-        <w:tblStyle w:val="TableGrid"/>
+        <w:tblStyle w:val="a8"/>
         <w:tblW w:w="0" w:type="auto"/>
         <w:tblInd w:w="288" w:type="dxa"/>
         <w:tblLook w:val="04A0" w:firstRow="1" w:lastRow="0" w:firstColumn="1" w:lastColumn="0" w:noHBand="0" w:noVBand="1"/>
@@ -5882,7 +5882,7 @@
           </w:tcPr>
           <w:p>
             <w:pPr>
-              <w:pStyle w:val="ListBullet"/>
+              <w:pStyle w:val="a"/>
               <w:numPr>
                 <w:ilvl w:val="0"/>
                 <w:numId w:val="0"/>
@@ -5912,7 +5912,7 @@
           </w:tcPr>
           <w:p>
             <w:pPr>
-              <w:pStyle w:val="ListBullet"/>
+              <w:pStyle w:val="a"/>
               <w:numPr>
                 <w:ilvl w:val="0"/>
                 <w:numId w:val="0"/>
@@ -5963,7 +5963,7 @@
           </w:tcPr>
           <w:p>
             <w:pPr>
-              <w:pStyle w:val="ListBullet"/>
+              <w:pStyle w:val="a"/>
               <w:numPr>
                 <w:ilvl w:val="0"/>
                 <w:numId w:val="0"/>
@@ -5990,7 +5990,7 @@
           </w:tcPr>
           <w:p>
             <w:pPr>
-              <w:pStyle w:val="ListBullet"/>
+              <w:pStyle w:val="a"/>
               <w:numPr>
                 <w:ilvl w:val="0"/>
                 <w:numId w:val="0"/>
@@ -6038,7 +6038,7 @@
           </w:tcPr>
           <w:p>
             <w:pPr>
-              <w:pStyle w:val="ListBullet"/>
+              <w:pStyle w:val="a"/>
               <w:numPr>
                 <w:ilvl w:val="0"/>
                 <w:numId w:val="0"/>
@@ -6065,7 +6065,7 @@
           </w:tcPr>
           <w:p>
             <w:pPr>
-              <w:pStyle w:val="ListBullet"/>
+              <w:pStyle w:val="a"/>
               <w:numPr>
                 <w:ilvl w:val="0"/>
                 <w:numId w:val="0"/>
@@ -6122,7 +6122,7 @@
           </w:tcPr>
           <w:p>
             <w:pPr>
-              <w:pStyle w:val="ListBullet"/>
+              <w:pStyle w:val="a"/>
               <w:numPr>
                 <w:ilvl w:val="0"/>
                 <w:numId w:val="0"/>
@@ -6149,7 +6149,7 @@
           </w:tcPr>
           <w:p>
             <w:pPr>
-              <w:pStyle w:val="ListBullet"/>
+              <w:pStyle w:val="a"/>
               <w:numPr>
                 <w:ilvl w:val="0"/>
                 <w:numId w:val="0"/>
@@ -6217,7 +6217,7 @@
           </w:tcPr>
           <w:p>
             <w:pPr>
-              <w:pStyle w:val="ListBullet"/>
+              <w:pStyle w:val="a"/>
               <w:numPr>
                 <w:ilvl w:val="0"/>
                 <w:numId w:val="0"/>
@@ -6246,7 +6246,7 @@
           </w:tcPr>
           <w:p>
             <w:pPr>
-              <w:pStyle w:val="ListBullet"/>
+              <w:pStyle w:val="a"/>
               <w:numPr>
                 <w:ilvl w:val="0"/>
                 <w:numId w:val="0"/>
@@ -6289,7 +6289,7 @@
           </w:tcPr>
           <w:p>
             <w:pPr>
-              <w:pStyle w:val="ListBullet"/>
+              <w:pStyle w:val="a"/>
               <w:numPr>
                 <w:ilvl w:val="0"/>
                 <w:numId w:val="0"/>
@@ -6316,7 +6316,7 @@
           </w:tcPr>
           <w:p>
             <w:pPr>
-              <w:pStyle w:val="ListBullet"/>
+              <w:pStyle w:val="a"/>
               <w:numPr>
                 <w:ilvl w:val="0"/>
                 <w:numId w:val="0"/>
@@ -6364,7 +6364,7 @@
           </w:tcPr>
           <w:p>
             <w:pPr>
-              <w:pStyle w:val="ListBullet"/>
+              <w:pStyle w:val="a"/>
               <w:numPr>
                 <w:ilvl w:val="0"/>
                 <w:numId w:val="0"/>
@@ -6391,7 +6391,7 @@
           </w:tcPr>
           <w:p>
             <w:pPr>
-              <w:pStyle w:val="ListBullet"/>
+              <w:pStyle w:val="a"/>
               <w:numPr>
                 <w:ilvl w:val="0"/>
                 <w:numId w:val="0"/>
@@ -6502,7 +6502,7 @@
           </w:tcPr>
           <w:p>
             <w:pPr>
-              <w:pStyle w:val="ListBullet"/>
+              <w:pStyle w:val="a"/>
               <w:numPr>
                 <w:ilvl w:val="0"/>
                 <w:numId w:val="0"/>
@@ -6529,7 +6529,7 @@
           </w:tcPr>
           <w:p>
             <w:pPr>
-              <w:pStyle w:val="ListBullet"/>
+              <w:pStyle w:val="a"/>
               <w:numPr>
                 <w:ilvl w:val="0"/>
                 <w:numId w:val="0"/>
@@ -6597,7 +6597,7 @@
           </w:tcPr>
           <w:p>
             <w:pPr>
-              <w:pStyle w:val="ListBullet"/>
+              <w:pStyle w:val="a"/>
               <w:numPr>
                 <w:ilvl w:val="0"/>
                 <w:numId w:val="0"/>
@@ -6624,7 +6624,7 @@
           </w:tcPr>
           <w:p>
             <w:pPr>
-              <w:pStyle w:val="ListBullet"/>
+              <w:pStyle w:val="a"/>
               <w:numPr>
                 <w:ilvl w:val="0"/>
                 <w:numId w:val="0"/>
@@ -6710,7 +6710,7 @@
     </w:tbl>
     <w:p>
       <w:pPr>
-        <w:pStyle w:val="ListBullet"/>
+        <w:pStyle w:val="a"/>
         <w:numPr>
           <w:ilvl w:val="0"/>
           <w:numId w:val="0"/>
@@ -6728,7 +6728,7 @@
     </w:p>
     <w:p>
       <w:pPr>
-        <w:pStyle w:val="ListBullet"/>
+        <w:pStyle w:val="a"/>
         <w:numPr>
           <w:ilvl w:val="0"/>
           <w:numId w:val="30"/>
@@ -6768,7 +6768,7 @@
     </w:p>
     <w:p>
       <w:pPr>
-        <w:pStyle w:val="ListBullet"/>
+        <w:pStyle w:val="a"/>
         <w:numPr>
           <w:ilvl w:val="0"/>
           <w:numId w:val="0"/>
@@ -6784,7 +6784,7 @@
     </w:p>
     <w:tbl>
       <w:tblPr>
-        <w:tblStyle w:val="TableGrid"/>
+        <w:tblStyle w:val="a8"/>
         <w:tblW w:w="0" w:type="auto"/>
         <w:jc w:val="center"/>
         <w:tblLook w:val="04A0" w:firstRow="1" w:lastRow="0" w:firstColumn="1" w:lastColumn="0" w:noHBand="0" w:noVBand="1"/>
@@ -6805,7 +6805,7 @@
           </w:tcPr>
           <w:p>
             <w:pPr>
-              <w:pStyle w:val="ListBullet"/>
+              <w:pStyle w:val="a"/>
               <w:numPr>
                 <w:ilvl w:val="0"/>
                 <w:numId w:val="0"/>
@@ -6834,7 +6834,7 @@
           </w:tcPr>
           <w:p>
             <w:pPr>
-              <w:pStyle w:val="ListBullet"/>
+              <w:pStyle w:val="a"/>
               <w:numPr>
                 <w:ilvl w:val="0"/>
                 <w:numId w:val="0"/>
@@ -6863,7 +6863,7 @@
           </w:tcPr>
           <w:p>
             <w:pPr>
-              <w:pStyle w:val="ListBullet"/>
+              <w:pStyle w:val="a"/>
               <w:numPr>
                 <w:ilvl w:val="0"/>
                 <w:numId w:val="0"/>
@@ -6897,7 +6897,7 @@
           </w:tcPr>
           <w:p>
             <w:pPr>
-              <w:pStyle w:val="ListBullet"/>
+              <w:pStyle w:val="a"/>
               <w:numPr>
                 <w:ilvl w:val="0"/>
                 <w:numId w:val="0"/>
@@ -6923,7 +6923,7 @@
           </w:tcPr>
           <w:p>
             <w:pPr>
-              <w:pStyle w:val="ListBullet"/>
+              <w:pStyle w:val="a"/>
               <w:numPr>
                 <w:ilvl w:val="0"/>
                 <w:numId w:val="0"/>
@@ -6949,7 +6949,7 @@
           </w:tcPr>
           <w:p>
             <w:pPr>
-              <w:pStyle w:val="ListBullet"/>
+              <w:pStyle w:val="a"/>
               <w:numPr>
                 <w:ilvl w:val="0"/>
                 <w:numId w:val="0"/>
@@ -6980,7 +6980,7 @@
           </w:tcPr>
           <w:p>
             <w:pPr>
-              <w:pStyle w:val="ListBullet"/>
+              <w:pStyle w:val="a"/>
               <w:numPr>
                 <w:ilvl w:val="0"/>
                 <w:numId w:val="0"/>
@@ -7006,7 +7006,7 @@
           </w:tcPr>
           <w:p>
             <w:pPr>
-              <w:pStyle w:val="ListBullet"/>
+              <w:pStyle w:val="a"/>
               <w:numPr>
                 <w:ilvl w:val="0"/>
                 <w:numId w:val="0"/>
@@ -7032,7 +7032,7 @@
           </w:tcPr>
           <w:p>
             <w:pPr>
-              <w:pStyle w:val="ListBullet"/>
+              <w:pStyle w:val="a"/>
               <w:numPr>
                 <w:ilvl w:val="0"/>
                 <w:numId w:val="0"/>
@@ -7063,7 +7063,7 @@
           </w:tcPr>
           <w:p>
             <w:pPr>
-              <w:pStyle w:val="ListBullet"/>
+              <w:pStyle w:val="a"/>
               <w:numPr>
                 <w:ilvl w:val="0"/>
                 <w:numId w:val="0"/>
@@ -7089,7 +7089,7 @@
           </w:tcPr>
           <w:p>
             <w:pPr>
-              <w:pStyle w:val="ListBullet"/>
+              <w:pStyle w:val="a"/>
               <w:numPr>
                 <w:ilvl w:val="0"/>
                 <w:numId w:val="0"/>
@@ -7115,7 +7115,7 @@
           </w:tcPr>
           <w:p>
             <w:pPr>
-              <w:pStyle w:val="ListBullet"/>
+              <w:pStyle w:val="a"/>
               <w:numPr>
                 <w:ilvl w:val="0"/>
                 <w:numId w:val="0"/>
@@ -7146,7 +7146,7 @@
           </w:tcPr>
           <w:p>
             <w:pPr>
-              <w:pStyle w:val="ListBullet"/>
+              <w:pStyle w:val="a"/>
               <w:numPr>
                 <w:ilvl w:val="0"/>
                 <w:numId w:val="0"/>
@@ -7172,7 +7172,7 @@
           </w:tcPr>
           <w:p>
             <w:pPr>
-              <w:pStyle w:val="ListBullet"/>
+              <w:pStyle w:val="a"/>
               <w:numPr>
                 <w:ilvl w:val="0"/>
                 <w:numId w:val="0"/>
@@ -7198,7 +7198,7 @@
           </w:tcPr>
           <w:p>
             <w:pPr>
-              <w:pStyle w:val="ListBullet"/>
+              <w:pStyle w:val="a"/>
               <w:numPr>
                 <w:ilvl w:val="0"/>
                 <w:numId w:val="0"/>
@@ -7229,7 +7229,7 @@
           </w:tcPr>
           <w:p>
             <w:pPr>
-              <w:pStyle w:val="ListBullet"/>
+              <w:pStyle w:val="a"/>
               <w:numPr>
                 <w:ilvl w:val="0"/>
                 <w:numId w:val="0"/>
@@ -7255,7 +7255,7 @@
           </w:tcPr>
           <w:p>
             <w:pPr>
-              <w:pStyle w:val="ListBullet"/>
+              <w:pStyle w:val="a"/>
               <w:numPr>
                 <w:ilvl w:val="0"/>
                 <w:numId w:val="0"/>
@@ -7281,7 +7281,7 @@
           </w:tcPr>
           <w:p>
             <w:pPr>
-              <w:pStyle w:val="ListBullet"/>
+              <w:pStyle w:val="a"/>
               <w:numPr>
                 <w:ilvl w:val="0"/>
                 <w:numId w:val="0"/>
@@ -7305,7 +7305,7 @@
     </w:tbl>
     <w:p>
       <w:pPr>
-        <w:pStyle w:val="ListBullet"/>
+        <w:pStyle w:val="a"/>
         <w:numPr>
           <w:ilvl w:val="0"/>
           <w:numId w:val="0"/>
@@ -7321,7 +7321,267 @@
     </w:p>
     <w:p>
       <w:pPr>
-        <w:pStyle w:val="ListBullet"/>
+        <w:pStyle w:val="a"/>
+        <w:numPr>
+          <w:ilvl w:val="0"/>
+          <w:numId w:val="30"/>
+        </w:numPr>
+        <w:rPr>
+          <w:rFonts w:ascii="Times New Roman" w:hAnsi="Times New Roman" w:cs="Times New Roman"/>
+          <w:b/>
+          <w:bCs/>
+          <w:color w:val="auto"/>
+          <w:sz w:val="28"/>
+          <w:szCs w:val="28"/>
+        </w:rPr>
+      </w:pPr>
+      <w:r>
+        <w:rPr>
+          <w:rFonts w:ascii="Times New Roman" w:hAnsi="Times New Roman" w:cs="Times New Roman"/>
+          <w:b/>
+          <w:bCs/>
+          <w:color w:val="auto"/>
+          <w:sz w:val="28"/>
+          <w:szCs w:val="28"/>
+        </w:rPr>
+        <w:t>Assumption:</w:t>
+      </w:r>
+    </w:p>
+    <w:p>
+      <w:pPr>
+        <w:pStyle w:val="a"/>
+        <w:numPr>
+          <w:ilvl w:val="0"/>
+          <w:numId w:val="38"/>
+        </w:numPr>
+        <w:tabs>
+          <w:tab w:val="clear" w:pos="720"/>
+          <w:tab w:val="left" w:pos="1440"/>
+        </w:tabs>
+        <w:ind w:left="1440"/>
+        <w:rPr>
+          <w:rFonts w:ascii="Times New Roman" w:hAnsi="Times New Roman" w:cs="Times New Roman"/>
+          <w:color w:val="262626" w:themeColor="accent6" w:themeShade="80"/>
+          <w:sz w:val="24"/>
+          <w:szCs w:val="24"/>
+        </w:rPr>
+      </w:pPr>
+      <w:r>
+        <w:rPr>
+          <w:rFonts w:ascii="Times New Roman" w:hAnsi="Times New Roman" w:cs="Times New Roman"/>
+          <w:color w:val="262626" w:themeColor="accent6" w:themeShade="80"/>
+          <w:sz w:val="24"/>
+          <w:szCs w:val="24"/>
+        </w:rPr>
+        <w:t>Each patient can have multiple appointments.</w:t>
+      </w:r>
+    </w:p>
+    <w:p>
+      <w:pPr>
+        <w:pStyle w:val="a"/>
+        <w:numPr>
+          <w:ilvl w:val="0"/>
+          <w:numId w:val="38"/>
+        </w:numPr>
+        <w:tabs>
+          <w:tab w:val="clear" w:pos="720"/>
+          <w:tab w:val="left" w:pos="1440"/>
+        </w:tabs>
+        <w:ind w:left="1440"/>
+        <w:rPr>
+          <w:rFonts w:ascii="Times New Roman" w:hAnsi="Times New Roman" w:cs="Times New Roman"/>
+          <w:color w:val="262626" w:themeColor="accent6" w:themeShade="80"/>
+          <w:sz w:val="24"/>
+          <w:szCs w:val="24"/>
+        </w:rPr>
+      </w:pPr>
+      <w:r>
+        <w:rPr>
+          <w:rFonts w:ascii="Times New Roman" w:hAnsi="Times New Roman" w:cs="Times New Roman"/>
+          <w:color w:val="262626" w:themeColor="accent6" w:themeShade="80"/>
+          <w:sz w:val="24"/>
+          <w:szCs w:val="24"/>
+        </w:rPr>
+        <w:t>Each appointment is assigned to only one doctor.</w:t>
+      </w:r>
+    </w:p>
+    <w:p>
+      <w:pPr>
+        <w:pStyle w:val="a"/>
+        <w:numPr>
+          <w:ilvl w:val="0"/>
+          <w:numId w:val="38"/>
+        </w:numPr>
+        <w:tabs>
+          <w:tab w:val="clear" w:pos="720"/>
+          <w:tab w:val="left" w:pos="1440"/>
+        </w:tabs>
+        <w:ind w:left="1440"/>
+        <w:rPr>
+          <w:rFonts w:ascii="Times New Roman" w:hAnsi="Times New Roman" w:cs="Times New Roman"/>
+          <w:color w:val="262626" w:themeColor="accent6" w:themeShade="80"/>
+          <w:sz w:val="24"/>
+          <w:szCs w:val="24"/>
+        </w:rPr>
+      </w:pPr>
+      <w:r>
+        <w:rPr>
+          <w:rFonts w:ascii="Times New Roman" w:hAnsi="Times New Roman" w:cs="Times New Roman"/>
+          <w:color w:val="262626" w:themeColor="accent6" w:themeShade="80"/>
+          <w:sz w:val="24"/>
+          <w:szCs w:val="24"/>
+        </w:rPr>
+        <w:t>Each doctor belongs to one department.</w:t>
+      </w:r>
+    </w:p>
+    <w:p>
+      <w:pPr>
+        <w:pStyle w:val="a"/>
+        <w:numPr>
+          <w:ilvl w:val="0"/>
+          <w:numId w:val="38"/>
+        </w:numPr>
+        <w:tabs>
+          <w:tab w:val="clear" w:pos="720"/>
+          <w:tab w:val="left" w:pos="1440"/>
+        </w:tabs>
+        <w:ind w:left="1440"/>
+        <w:rPr>
+          <w:rFonts w:ascii="Times New Roman" w:hAnsi="Times New Roman" w:cs="Times New Roman"/>
+          <w:color w:val="262626" w:themeColor="accent6" w:themeShade="80"/>
+          <w:sz w:val="24"/>
+          <w:szCs w:val="24"/>
+        </w:rPr>
+      </w:pPr>
+      <w:r>
+        <w:rPr>
+          <w:rFonts w:ascii="Times New Roman" w:hAnsi="Times New Roman" w:cs="Times New Roman"/>
+          <w:color w:val="262626" w:themeColor="accent6" w:themeShade="80"/>
+          <w:sz w:val="24"/>
+          <w:szCs w:val="24"/>
+        </w:rPr>
+        <w:t>Each department can have multiple doctors.</w:t>
+      </w:r>
+    </w:p>
+    <w:p>
+      <w:pPr>
+        <w:pStyle w:val="a"/>
+        <w:numPr>
+          <w:ilvl w:val="0"/>
+          <w:numId w:val="38"/>
+        </w:numPr>
+        <w:tabs>
+          <w:tab w:val="clear" w:pos="720"/>
+          <w:tab w:val="left" w:pos="1440"/>
+        </w:tabs>
+        <w:ind w:left="1440"/>
+        <w:rPr>
+          <w:rFonts w:ascii="Times New Roman" w:hAnsi="Times New Roman" w:cs="Times New Roman"/>
+          <w:color w:val="262626" w:themeColor="accent6" w:themeShade="80"/>
+          <w:sz w:val="24"/>
+          <w:szCs w:val="24"/>
+        </w:rPr>
+      </w:pPr>
+      <w:r>
+        <w:rPr>
+          <w:rFonts w:ascii="Times New Roman" w:hAnsi="Times New Roman" w:cs="Times New Roman"/>
+          <w:color w:val="262626" w:themeColor="accent6" w:themeShade="80"/>
+          <w:sz w:val="24"/>
+          <w:szCs w:val="24"/>
+        </w:rPr>
+        <w:t>A doctor is either a General Practitioner or a Specialist.</w:t>
+      </w:r>
+    </w:p>
+    <w:p>
+      <w:pPr>
+        <w:pStyle w:val="a"/>
+        <w:numPr>
+          <w:ilvl w:val="0"/>
+          <w:numId w:val="38"/>
+        </w:numPr>
+        <w:tabs>
+          <w:tab w:val="clear" w:pos="720"/>
+          <w:tab w:val="left" w:pos="1440"/>
+        </w:tabs>
+        <w:ind w:left="1440"/>
+        <w:rPr>
+          <w:rFonts w:ascii="Times New Roman" w:hAnsi="Times New Roman" w:cs="Times New Roman"/>
+          <w:color w:val="262626" w:themeColor="accent6" w:themeShade="80"/>
+          <w:sz w:val="24"/>
+          <w:szCs w:val="24"/>
+        </w:rPr>
+      </w:pPr>
+      <w:r>
+        <w:rPr>
+          <w:rFonts w:ascii="Times New Roman" w:hAnsi="Times New Roman" w:cs="Times New Roman"/>
+          <w:color w:val="262626" w:themeColor="accent6" w:themeShade="80"/>
+          <w:sz w:val="24"/>
+          <w:szCs w:val="24"/>
+        </w:rPr>
+        <w:t>Each appointment has one treatment record.</w:t>
+      </w:r>
+    </w:p>
+    <w:p>
+      <w:pPr>
+        <w:pStyle w:val="a"/>
+        <w:numPr>
+          <w:ilvl w:val="0"/>
+          <w:numId w:val="38"/>
+        </w:numPr>
+        <w:tabs>
+          <w:tab w:val="clear" w:pos="720"/>
+          <w:tab w:val="left" w:pos="1440"/>
+        </w:tabs>
+        <w:ind w:left="1440"/>
+        <w:rPr>
+          <w:rFonts w:ascii="Times New Roman" w:hAnsi="Times New Roman" w:cs="Times New Roman"/>
+          <w:color w:val="262626" w:themeColor="accent6" w:themeShade="80"/>
+          <w:sz w:val="24"/>
+          <w:szCs w:val="24"/>
+        </w:rPr>
+      </w:pPr>
+      <w:r>
+        <w:rPr>
+          <w:rFonts w:ascii="Times New Roman" w:hAnsi="Times New Roman" w:cs="Times New Roman"/>
+          <w:color w:val="262626" w:themeColor="accent6" w:themeShade="80"/>
+          <w:sz w:val="24"/>
+          <w:szCs w:val="24"/>
+        </w:rPr>
+        <w:t>Each appointment has one payment record.</w:t>
+      </w:r>
+    </w:p>
+    <w:p>
+      <w:pPr>
+        <w:pStyle w:val="a"/>
+        <w:numPr>
+          <w:ilvl w:val="0"/>
+          <w:numId w:val="38"/>
+        </w:numPr>
+        <w:tabs>
+          <w:tab w:val="clear" w:pos="720"/>
+          <w:tab w:val="left" w:pos="1440"/>
+        </w:tabs>
+        <w:ind w:left="1440"/>
+        <w:rPr>
+          <w:rFonts w:ascii="Times New Roman" w:hAnsi="Times New Roman" w:cs="Times New Roman"/>
+          <w:color w:val="262626" w:themeColor="accent6" w:themeShade="80"/>
+          <w:sz w:val="24"/>
+          <w:szCs w:val="24"/>
+        </w:rPr>
+      </w:pPr>
+      <w:r>
+        <w:rPr>
+          <w:rFonts w:ascii="Times New Roman" w:hAnsi="Times New Roman" w:cs="Times New Roman"/>
+          <w:color w:val="262626" w:themeColor="accent6" w:themeShade="80"/>
+          <w:sz w:val="24"/>
+          <w:szCs w:val="24"/>
+        </w:rPr>
+        <w:t>Each payment is associated with only one appointment.</w:t>
+      </w:r>
+    </w:p>
+    <w:p>
+      <w:pPr>
+        <w:pStyle w:val="a"/>
         <w:numPr>
           <w:ilvl w:val="0"/>
           <w:numId w:val="0"/>
@@ -7339,7 +7599,7 @@
     </w:p>
     <w:p>
       <w:pPr>
-        <w:pStyle w:val="Heading1"/>
+        <w:pStyle w:val="1"/>
       </w:pPr>
       <w:r>
         <w:lastRenderedPageBreak/>
@@ -7348,7 +7608,7 @@
     </w:p>
     <w:p>
       <w:pPr>
-        <w:pStyle w:val="ListBullet"/>
+        <w:pStyle w:val="a"/>
         <w:numPr>
           <w:ilvl w:val="0"/>
           <w:numId w:val="0"/>
@@ -7372,7 +7632,7 @@
     </w:p>
     <w:p>
       <w:pPr>
-        <w:pStyle w:val="ListBullet"/>
+        <w:pStyle w:val="a"/>
         <w:rPr>
           <w:rFonts w:ascii="Times New Roman" w:hAnsi="Times New Roman" w:cs="Times New Roman"/>
           <w:color w:val="auto"/>
@@ -7392,7 +7652,7 @@
     </w:p>
     <w:p>
       <w:pPr>
-        <w:pStyle w:val="ListBullet"/>
+        <w:pStyle w:val="a"/>
         <w:rPr>
           <w:rFonts w:ascii="Times New Roman" w:hAnsi="Times New Roman" w:cs="Times New Roman"/>
           <w:color w:val="auto"/>
@@ -7412,7 +7672,7 @@
     </w:p>
     <w:p>
       <w:pPr>
-        <w:pStyle w:val="ListBullet"/>
+        <w:pStyle w:val="a"/>
         <w:rPr>
           <w:rFonts w:ascii="Times New Roman" w:hAnsi="Times New Roman" w:cs="Times New Roman"/>
           <w:color w:val="auto"/>
@@ -7432,7 +7692,7 @@
     </w:p>
     <w:p>
       <w:pPr>
-        <w:pStyle w:val="ListBullet"/>
+        <w:pStyle w:val="a"/>
         <w:numPr>
           <w:ilvl w:val="0"/>
           <w:numId w:val="0"/>
@@ -7448,7 +7708,7 @@
     </w:p>
     <w:p>
       <w:pPr>
-        <w:pStyle w:val="Heading1"/>
+        <w:pStyle w:val="1"/>
       </w:pPr>
       <w:r>
         <w:lastRenderedPageBreak/>
@@ -7457,7 +7717,7 @@
     </w:p>
     <w:p>
       <w:pPr>
-        <w:pStyle w:val="ListBullet"/>
+        <w:pStyle w:val="a"/>
         <w:numPr>
           <w:ilvl w:val="0"/>
           <w:numId w:val="0"/>
@@ -7490,7 +7750,7 @@
     </w:p>
     <w:p>
       <w:pPr>
-        <w:pStyle w:val="ListBullet"/>
+        <w:pStyle w:val="a"/>
         <w:rPr>
           <w:rFonts w:ascii="Times New Roman" w:hAnsi="Times New Roman" w:cs="Times New Roman"/>
           <w:color w:val="auto"/>
@@ -7510,7 +7770,7 @@
     </w:p>
     <w:p>
       <w:pPr>
-        <w:pStyle w:val="ListBullet"/>
+        <w:pStyle w:val="a"/>
         <w:rPr>
           <w:rFonts w:ascii="Times New Roman" w:hAnsi="Times New Roman" w:cs="Times New Roman"/>
           <w:color w:val="auto"/>
@@ -7530,7 +7790,7 @@
     </w:p>
     <w:p>
       <w:pPr>
-        <w:pStyle w:val="ListBullet"/>
+        <w:pStyle w:val="a"/>
         <w:rPr>
           <w:rFonts w:ascii="Times New Roman" w:hAnsi="Times New Roman" w:cs="Times New Roman"/>
           <w:color w:val="auto"/>
@@ -7550,7 +7810,7 @@
     </w:p>
     <w:p>
       <w:pPr>
-        <w:pStyle w:val="ListBullet"/>
+        <w:pStyle w:val="a"/>
         <w:rPr>
           <w:rFonts w:ascii="Times New Roman" w:hAnsi="Times New Roman" w:cs="Times New Roman"/>
           <w:color w:val="auto"/>
@@ -7570,7 +7830,7 @@
     </w:p>
     <w:p>
       <w:pPr>
-        <w:pStyle w:val="ListBullet"/>
+        <w:pStyle w:val="a"/>
         <w:rPr>
           <w:rFonts w:ascii="Times New Roman" w:hAnsi="Times New Roman" w:cs="Times New Roman"/>
           <w:color w:val="auto"/>
@@ -7590,7 +7850,7 @@
     </w:p>
     <w:p>
       <w:pPr>
-        <w:pStyle w:val="ListBullet"/>
+        <w:pStyle w:val="a"/>
         <w:rPr>
           <w:rFonts w:ascii="Times New Roman" w:hAnsi="Times New Roman" w:cs="Times New Roman"/>
           <w:color w:val="auto"/>
@@ -7610,7 +7870,7 @@
     </w:p>
     <w:p>
       <w:pPr>
-        <w:pStyle w:val="ListBullet"/>
+        <w:pStyle w:val="a"/>
         <w:rPr>
           <w:rFonts w:ascii="Times New Roman" w:hAnsi="Times New Roman" w:cs="Times New Roman"/>
           <w:color w:val="auto"/>
@@ -7630,7 +7890,7 @@
     </w:p>
     <w:p>
       <w:pPr>
-        <w:pStyle w:val="Heading1"/>
+        <w:pStyle w:val="1"/>
       </w:pPr>
       <w:r>
         <w:lastRenderedPageBreak/>
@@ -7645,7 +7905,7 @@
     </w:p>
     <w:p>
       <w:pPr>
-        <w:pStyle w:val="ListBullet"/>
+        <w:pStyle w:val="a"/>
         <w:numPr>
           <w:ilvl w:val="0"/>
           <w:numId w:val="0"/>
@@ -7687,7 +7947,7 @@
     </w:p>
     <w:p>
       <w:pPr>
-        <w:pStyle w:val="ListBullet"/>
+        <w:pStyle w:val="a"/>
         <w:numPr>
           <w:ilvl w:val="0"/>
           <w:numId w:val="0"/>
@@ -7711,7 +7971,7 @@
     </w:p>
     <w:p>
       <w:pPr>
-        <w:pStyle w:val="ListBullet"/>
+        <w:pStyle w:val="a"/>
         <w:numPr>
           <w:ilvl w:val="0"/>
           <w:numId w:val="0"/>
@@ -7735,7 +7995,7 @@
     </w:p>
     <w:p>
       <w:pPr>
-        <w:pStyle w:val="ListBullet"/>
+        <w:pStyle w:val="a"/>
         <w:numPr>
           <w:ilvl w:val="0"/>
           <w:numId w:val="25"/>
@@ -7758,7 +8018,7 @@
     </w:p>
     <w:p>
       <w:pPr>
-        <w:pStyle w:val="ListBullet"/>
+        <w:pStyle w:val="a"/>
         <w:numPr>
           <w:ilvl w:val="0"/>
           <w:numId w:val="25"/>
@@ -7781,7 +8041,7 @@
     </w:p>
     <w:p>
       <w:pPr>
-        <w:pStyle w:val="ListBullet"/>
+        <w:pStyle w:val="a"/>
         <w:numPr>
           <w:ilvl w:val="0"/>
           <w:numId w:val="25"/>
@@ -7804,7 +8064,7 @@
     </w:p>
     <w:p>
       <w:pPr>
-        <w:pStyle w:val="ListBullet"/>
+        <w:pStyle w:val="a"/>
         <w:numPr>
           <w:ilvl w:val="0"/>
           <w:numId w:val="25"/>
@@ -7827,7 +8087,7 @@
     </w:p>
     <w:p>
       <w:pPr>
-        <w:pStyle w:val="ListBullet"/>
+        <w:pStyle w:val="a"/>
         <w:numPr>
           <w:ilvl w:val="0"/>
           <w:numId w:val="0"/>
@@ -7843,7 +8103,7 @@
     </w:p>
     <w:p>
       <w:pPr>
-        <w:pStyle w:val="Heading1"/>
+        <w:pStyle w:val="1"/>
       </w:pPr>
       <w:r>
         <w:lastRenderedPageBreak/>
@@ -8158,7 +8418,7 @@
 </file>
 
 <file path=word/endnotes.xml><?xml version="1.0" encoding="utf-8"?>
-<w:endnotes xmlns:wpc="http://schemas.microsoft.com/office/word/2010/wordprocessingCanvas" xmlns:cx="http://schemas.microsoft.com/office/drawing/2014/chartex" xmlns:cx1="http://schemas.microsoft.com/office/drawing/2015/9/8/chartex" xmlns:cx2="http://schemas.microsoft.com/office/drawing/2015/10/21/chartex" xmlns:cx3="http://schemas.microsoft.com/office/drawing/2016/5/9/chartex" xmlns:cx4="http://schemas.microsoft.com/office/drawing/2016/5/10/chartex" xmlns:cx5="http://schemas.microsoft.com/office/drawing/2016/5/11/chartex" xmlns:cx6="http://schemas.microsoft.com/office/drawing/2016/5/12/chartex" xmlns:cx7="http://schemas.microsoft.com/office/drawing/2016/5/13/chartex" xmlns:cx8="http://schemas.microsoft.com/office/drawing/2016/5/14/chartex" xmlns:mc="http://schemas.openxmlformats.org/markup-compatibility/2006" xmlns:aink="http://schemas.microsoft.com/office/drawing/2016/ink" xmlns:am3d="http://schemas.microsoft.com/office/drawing/2017/model3d" xmlns:o="urn:schemas-microsoft-com:office:office" xmlns:oel="http://schemas.microsoft.com/office/2019/extlst" xmlns:r="http://schemas.openxmlformats.org/officeDocument/2006/relationships" xmlns:m="http://schemas.openxmlformats.org/officeDocument/2006/math" xmlns:v="urn:schemas-microsoft-com:vml" xmlns:wp14="http://schemas.microsoft.com/office/word/2010/wordprocessingDrawing" xmlns:wp="http://schemas.openxmlformats.org/drawingml/2006/wordprocessingDrawing" xmlns:w10="urn:schemas-microsoft-com:office:word" xmlns:w="http://schemas.openxmlformats.org/wordprocessingml/2006/main" xmlns:w14="http://schemas.microsoft.com/office/word/2010/wordml" xmlns:w15="http://schemas.microsoft.com/office/word/2012/wordml" xmlns:w16cex="http://schemas.microsoft.com/office/word/2018/wordml/cex" xmlns:w16cid="http://schemas.microsoft.com/office/word/2016/wordml/cid" xmlns:w16="http://schemas.microsoft.com/office/word/2018/wordml" xmlns:w16du="http://schemas.microsoft.com/office/word/2023/wordml/word16du" xmlns:w16sdtdh="http://schemas.microsoft.com/office/word/2020/wordml/sdtdatahash" xmlns:w16sdtfl="http://schemas.microsoft.com/office/word/2024/wordml/sdtformatlock" xmlns:w16se="http://schemas.microsoft.com/office/word/2015/wordml/symex" xmlns:wpg="http://schemas.microsoft.com/office/word/2010/wordprocessingGroup" xmlns:wpi="http://schemas.microsoft.com/office/word/2010/wordprocessingInk" xmlns:wne="http://schemas.microsoft.com/office/word/2006/wordml" xmlns:wps="http://schemas.microsoft.com/office/word/2010/wordprocessingShape" mc:Ignorable="w14 w15 w16se w16cid w16 w16cex w16sdtdh w16sdtfl w16du wp14">
+<w:endnotes xmlns:wpc="http://schemas.microsoft.com/office/word/2010/wordprocessingCanvas" xmlns:cx="http://schemas.microsoft.com/office/drawing/2014/chartex" xmlns:cx1="http://schemas.microsoft.com/office/drawing/2015/9/8/chartex" xmlns:cx2="http://schemas.microsoft.com/office/drawing/2015/10/21/chartex" xmlns:cx3="http://schemas.microsoft.com/office/drawing/2016/5/9/chartex" xmlns:cx4="http://schemas.microsoft.com/office/drawing/2016/5/10/chartex" xmlns:cx5="http://schemas.microsoft.com/office/drawing/2016/5/11/chartex" xmlns:cx6="http://schemas.microsoft.com/office/drawing/2016/5/12/chartex" xmlns:cx7="http://schemas.microsoft.com/office/drawing/2016/5/13/chartex" xmlns:cx8="http://schemas.microsoft.com/office/drawing/2016/5/14/chartex" xmlns:mc="http://schemas.openxmlformats.org/markup-compatibility/2006" xmlns:aink="http://schemas.microsoft.com/office/drawing/2016/ink" xmlns:am3d="http://schemas.microsoft.com/office/drawing/2017/model3d" xmlns:o="urn:schemas-microsoft-com:office:office" xmlns:oel="http://schemas.microsoft.com/office/2019/extlst" xmlns:r="http://schemas.openxmlformats.org/officeDocument/2006/relationships" xmlns:m="http://schemas.openxmlformats.org/officeDocument/2006/math" xmlns:v="urn:schemas-microsoft-com:vml" xmlns:wp14="http://schemas.microsoft.com/office/word/2010/wordprocessingDrawing" xmlns:wp="http://schemas.openxmlformats.org/drawingml/2006/wordprocessingDrawing" xmlns:w10="urn:schemas-microsoft-com:office:word" xmlns:w="http://schemas.openxmlformats.org/wordprocessingml/2006/main" xmlns:w14="http://schemas.microsoft.com/office/word/2010/wordml" xmlns:w15="http://schemas.microsoft.com/office/word/2012/wordml" xmlns:w16cei="http://schemas.microsoft.com/office/word/2026/wordml/cei" xmlns:w16cex="http://schemas.microsoft.com/office/word/2018/wordml/cex" xmlns:w16cid="http://schemas.microsoft.com/office/word/2016/wordml/cid" xmlns:w16="http://schemas.microsoft.com/office/word/2018/wordml" xmlns:w16du="http://schemas.microsoft.com/office/word/2023/wordml/word16du" xmlns:w16sdtdh="http://schemas.microsoft.com/office/word/2020/wordml/sdtdatahash" xmlns:w16sdtfl="http://schemas.microsoft.com/office/word/2024/wordml/sdtformatlock" xmlns:w16se="http://schemas.microsoft.com/office/word/2015/wordml/symex" xmlns:wpg="http://schemas.microsoft.com/office/word/2010/wordprocessingGroup" xmlns:wpi="http://schemas.microsoft.com/office/word/2010/wordprocessingInk" xmlns:wne="http://schemas.microsoft.com/office/word/2006/wordml" xmlns:wps="http://schemas.microsoft.com/office/word/2010/wordprocessingShape" mc:Ignorable="w14 w15 w16se w16cid w16 w16cex w16sdtdh w16sdtfl w16du wp14">
   <w:endnote w:type="separator" w:id="-1">
     <w:p>
       <w:pPr>
@@ -8187,10 +8447,10 @@
 </file>
 
 <file path=word/footer1.xml><?xml version="1.0" encoding="utf-8"?>
-<w:ftr xmlns:wpc="http://schemas.microsoft.com/office/word/2010/wordprocessingCanvas" xmlns:cx="http://schemas.microsoft.com/office/drawing/2014/chartex" xmlns:cx1="http://schemas.microsoft.com/office/drawing/2015/9/8/chartex" xmlns:cx2="http://schemas.microsoft.com/office/drawing/2015/10/21/chartex" xmlns:cx3="http://schemas.microsoft.com/office/drawing/2016/5/9/chartex" xmlns:cx4="http://schemas.microsoft.com/office/drawing/2016/5/10/chartex" xmlns:cx5="http://schemas.microsoft.com/office/drawing/2016/5/11/chartex" xmlns:cx6="http://schemas.microsoft.com/office/drawing/2016/5/12/chartex" xmlns:cx7="http://schemas.microsoft.com/office/drawing/2016/5/13/chartex" xmlns:cx8="http://schemas.microsoft.com/office/drawing/2016/5/14/chartex" xmlns:mc="http://schemas.openxmlformats.org/markup-compatibility/2006" xmlns:aink="http://schemas.microsoft.com/office/drawing/2016/ink" xmlns:am3d="http://schemas.microsoft.com/office/drawing/2017/model3d" xmlns:o="urn:schemas-microsoft-com:office:office" xmlns:oel="http://schemas.microsoft.com/office/2019/extlst" xmlns:r="http://schemas.openxmlformats.org/officeDocument/2006/relationships" xmlns:m="http://schemas.openxmlformats.org/officeDocument/2006/math" xmlns:v="urn:schemas-microsoft-com:vml" xmlns:wp14="http://schemas.microsoft.com/office/word/2010/wordprocessingDrawing" xmlns:wp="http://schemas.openxmlformats.org/drawingml/2006/wordprocessingDrawing" xmlns:w10="urn:schemas-microsoft-com:office:word" xmlns:w="http://schemas.openxmlformats.org/wordprocessingml/2006/main" xmlns:w14="http://schemas.microsoft.com/office/word/2010/wordml" xmlns:w15="http://schemas.microsoft.com/office/word/2012/wordml" xmlns:w16cex="http://schemas.microsoft.com/office/word/2018/wordml/cex" xmlns:w16cid="http://schemas.microsoft.com/office/word/2016/wordml/cid" xmlns:w16="http://schemas.microsoft.com/office/word/2018/wordml" xmlns:w16du="http://schemas.microsoft.com/office/word/2023/wordml/word16du" xmlns:w16sdtdh="http://schemas.microsoft.com/office/word/2020/wordml/sdtdatahash" xmlns:w16sdtfl="http://schemas.microsoft.com/office/word/2024/wordml/sdtformatlock" xmlns:w16se="http://schemas.microsoft.com/office/word/2015/wordml/symex" xmlns:wpg="http://schemas.microsoft.com/office/word/2010/wordprocessingGroup" xmlns:wpi="http://schemas.microsoft.com/office/word/2010/wordprocessingInk" xmlns:wne="http://schemas.microsoft.com/office/word/2006/wordml" xmlns:wps="http://schemas.microsoft.com/office/word/2010/wordprocessingShape" mc:Ignorable="w14 w15 w16se w16cid w16 w16cex w16sdtdh w16sdtfl w16du wp14">
+<w:ftr xmlns:wpc="http://schemas.microsoft.com/office/word/2010/wordprocessingCanvas" xmlns:cx="http://schemas.microsoft.com/office/drawing/2014/chartex" xmlns:cx1="http://schemas.microsoft.com/office/drawing/2015/9/8/chartex" xmlns:cx2="http://schemas.microsoft.com/office/drawing/2015/10/21/chartex" xmlns:cx3="http://schemas.microsoft.com/office/drawing/2016/5/9/chartex" xmlns:cx4="http://schemas.microsoft.com/office/drawing/2016/5/10/chartex" xmlns:cx5="http://schemas.microsoft.com/office/drawing/2016/5/11/chartex" xmlns:cx6="http://schemas.microsoft.com/office/drawing/2016/5/12/chartex" xmlns:cx7="http://schemas.microsoft.com/office/drawing/2016/5/13/chartex" xmlns:cx8="http://schemas.microsoft.com/office/drawing/2016/5/14/chartex" xmlns:mc="http://schemas.openxmlformats.org/markup-compatibility/2006" xmlns:aink="http://schemas.microsoft.com/office/drawing/2016/ink" xmlns:am3d="http://schemas.microsoft.com/office/drawing/2017/model3d" xmlns:o="urn:schemas-microsoft-com:office:office" xmlns:oel="http://schemas.microsoft.com/office/2019/extlst" xmlns:r="http://schemas.openxmlformats.org/officeDocument/2006/relationships" xmlns:m="http://schemas.openxmlformats.org/officeDocument/2006/math" xmlns:v="urn:schemas-microsoft-com:vml" xmlns:wp14="http://schemas.microsoft.com/office/word/2010/wordprocessingDrawing" xmlns:wp="http://schemas.openxmlformats.org/drawingml/2006/wordprocessingDrawing" xmlns:w10="urn:schemas-microsoft-com:office:word" xmlns:w="http://schemas.openxmlformats.org/wordprocessingml/2006/main" xmlns:w14="http://schemas.microsoft.com/office/word/2010/wordml" xmlns:w15="http://schemas.microsoft.com/office/word/2012/wordml" xmlns:w16cei="http://schemas.microsoft.com/office/word/2026/wordml/cei" xmlns:w16cex="http://schemas.microsoft.com/office/word/2018/wordml/cex" xmlns:w16cid="http://schemas.microsoft.com/office/word/2016/wordml/cid" xmlns:w16="http://schemas.microsoft.com/office/word/2018/wordml" xmlns:w16du="http://schemas.microsoft.com/office/word/2023/wordml/word16du" xmlns:w16sdtdh="http://schemas.microsoft.com/office/word/2020/wordml/sdtdatahash" xmlns:w16sdtfl="http://schemas.microsoft.com/office/word/2024/wordml/sdtformatlock" xmlns:w16se="http://schemas.microsoft.com/office/word/2015/wordml/symex" xmlns:wpg="http://schemas.microsoft.com/office/word/2010/wordprocessingGroup" xmlns:wpi="http://schemas.microsoft.com/office/word/2010/wordprocessingInk" xmlns:wne="http://schemas.microsoft.com/office/word/2006/wordml" xmlns:wps="http://schemas.microsoft.com/office/word/2010/wordprocessingShape" mc:Ignorable="w14 w15 w16se w16cid w16 w16cex w16sdtdh w16sdtfl w16du wp14">
   <w:p>
     <w:pPr>
-      <w:pStyle w:val="Footer"/>
+      <w:pStyle w:val="a5"/>
     </w:pPr>
     <w:r>
       <w:rPr>
@@ -8344,10 +8604,10 @@
 </file>
 
 <file path=word/footer2.xml><?xml version="1.0" encoding="utf-8"?>
-<w:ftr xmlns:wpc="http://schemas.microsoft.com/office/word/2010/wordprocessingCanvas" xmlns:cx="http://schemas.microsoft.com/office/drawing/2014/chartex" xmlns:cx1="http://schemas.microsoft.com/office/drawing/2015/9/8/chartex" xmlns:cx2="http://schemas.microsoft.com/office/drawing/2015/10/21/chartex" xmlns:cx3="http://schemas.microsoft.com/office/drawing/2016/5/9/chartex" xmlns:cx4="http://schemas.microsoft.com/office/drawing/2016/5/10/chartex" xmlns:cx5="http://schemas.microsoft.com/office/drawing/2016/5/11/chartex" xmlns:cx6="http://schemas.microsoft.com/office/drawing/2016/5/12/chartex" xmlns:cx7="http://schemas.microsoft.com/office/drawing/2016/5/13/chartex" xmlns:cx8="http://schemas.microsoft.com/office/drawing/2016/5/14/chartex" xmlns:mc="http://schemas.openxmlformats.org/markup-compatibility/2006" xmlns:aink="http://schemas.microsoft.com/office/drawing/2016/ink" xmlns:am3d="http://schemas.microsoft.com/office/drawing/2017/model3d" xmlns:o="urn:schemas-microsoft-com:office:office" xmlns:oel="http://schemas.microsoft.com/office/2019/extlst" xmlns:r="http://schemas.openxmlformats.org/officeDocument/2006/relationships" xmlns:m="http://schemas.openxmlformats.org/officeDocument/2006/math" xmlns:v="urn:schemas-microsoft-com:vml" xmlns:wp14="http://schemas.microsoft.com/office/word/2010/wordprocessingDrawing" xmlns:wp="http://schemas.openxmlformats.org/drawingml/2006/wordprocessingDrawing" xmlns:w10="urn:schemas-microsoft-com:office:word" xmlns:w="http://schemas.openxmlformats.org/wordprocessingml/2006/main" xmlns:w14="http://schemas.microsoft.com/office/word/2010/wordml" xmlns:w15="http://schemas.microsoft.com/office/word/2012/wordml" xmlns:w16cex="http://schemas.microsoft.com/office/word/2018/wordml/cex" xmlns:w16cid="http://schemas.microsoft.com/office/word/2016/wordml/cid" xmlns:w16="http://schemas.microsoft.com/office/word/2018/wordml" xmlns:w16du="http://schemas.microsoft.com/office/word/2023/wordml/word16du" xmlns:w16sdtdh="http://schemas.microsoft.com/office/word/2020/wordml/sdtdatahash" xmlns:w16sdtfl="http://schemas.microsoft.com/office/word/2024/wordml/sdtformatlock" xmlns:w16se="http://schemas.microsoft.com/office/word/2015/wordml/symex" xmlns:wpg="http://schemas.microsoft.com/office/word/2010/wordprocessingGroup" xmlns:wpi="http://schemas.microsoft.com/office/word/2010/wordprocessingInk" xmlns:wne="http://schemas.microsoft.com/office/word/2006/wordml" xmlns:wps="http://schemas.microsoft.com/office/word/2010/wordprocessingShape" mc:Ignorable="w14 w15 w16se w16cid w16 w16cex w16sdtdh w16sdtfl w16du wp14">
+<w:ftr xmlns:wpc="http://schemas.microsoft.com/office/word/2010/wordprocessingCanvas" xmlns:cx="http://schemas.microsoft.com/office/drawing/2014/chartex" xmlns:cx1="http://schemas.microsoft.com/office/drawing/2015/9/8/chartex" xmlns:cx2="http://schemas.microsoft.com/office/drawing/2015/10/21/chartex" xmlns:cx3="http://schemas.microsoft.com/office/drawing/2016/5/9/chartex" xmlns:cx4="http://schemas.microsoft.com/office/drawing/2016/5/10/chartex" xmlns:cx5="http://schemas.microsoft.com/office/drawing/2016/5/11/chartex" xmlns:cx6="http://schemas.microsoft.com/office/drawing/2016/5/12/chartex" xmlns:cx7="http://schemas.microsoft.com/office/drawing/2016/5/13/chartex" xmlns:cx8="http://schemas.microsoft.com/office/drawing/2016/5/14/chartex" xmlns:mc="http://schemas.openxmlformats.org/markup-compatibility/2006" xmlns:aink="http://schemas.microsoft.com/office/drawing/2016/ink" xmlns:am3d="http://schemas.microsoft.com/office/drawing/2017/model3d" xmlns:o="urn:schemas-microsoft-com:office:office" xmlns:oel="http://schemas.microsoft.com/office/2019/extlst" xmlns:r="http://schemas.openxmlformats.org/officeDocument/2006/relationships" xmlns:m="http://schemas.openxmlformats.org/officeDocument/2006/math" xmlns:v="urn:schemas-microsoft-com:vml" xmlns:wp14="http://schemas.microsoft.com/office/word/2010/wordprocessingDrawing" xmlns:wp="http://schemas.openxmlformats.org/drawingml/2006/wordprocessingDrawing" xmlns:w10="urn:schemas-microsoft-com:office:word" xmlns:w="http://schemas.openxmlformats.org/wordprocessingml/2006/main" xmlns:w14="http://schemas.microsoft.com/office/word/2010/wordml" xmlns:w15="http://schemas.microsoft.com/office/word/2012/wordml" xmlns:w16cei="http://schemas.microsoft.com/office/word/2026/wordml/cei" xmlns:w16cex="http://schemas.microsoft.com/office/word/2018/wordml/cex" xmlns:w16cid="http://schemas.microsoft.com/office/word/2016/wordml/cid" xmlns:w16="http://schemas.microsoft.com/office/word/2018/wordml" xmlns:w16du="http://schemas.microsoft.com/office/word/2023/wordml/word16du" xmlns:w16sdtdh="http://schemas.microsoft.com/office/word/2020/wordml/sdtdatahash" xmlns:w16sdtfl="http://schemas.microsoft.com/office/word/2024/wordml/sdtformatlock" xmlns:w16se="http://schemas.microsoft.com/office/word/2015/wordml/symex" xmlns:wpg="http://schemas.microsoft.com/office/word/2010/wordprocessingGroup" xmlns:wpi="http://schemas.microsoft.com/office/word/2010/wordprocessingInk" xmlns:wne="http://schemas.microsoft.com/office/word/2006/wordml" xmlns:wps="http://schemas.microsoft.com/office/word/2010/wordprocessingShape" mc:Ignorable="w14 w15 w16se w16cid w16 w16cex w16sdtdh w16sdtfl w16du wp14">
   <w:p>
     <w:pPr>
-      <w:pStyle w:val="Footer"/>
+      <w:pStyle w:val="a5"/>
     </w:pPr>
     <w:r>
       <w:rPr>
@@ -8501,10 +8761,10 @@
 </file>
 
 <file path=word/footer3.xml><?xml version="1.0" encoding="utf-8"?>
-<w:ftr xmlns:wpc="http://schemas.microsoft.com/office/word/2010/wordprocessingCanvas" xmlns:cx="http://schemas.microsoft.com/office/drawing/2014/chartex" xmlns:cx1="http://schemas.microsoft.com/office/drawing/2015/9/8/chartex" xmlns:cx2="http://schemas.microsoft.com/office/drawing/2015/10/21/chartex" xmlns:cx3="http://schemas.microsoft.com/office/drawing/2016/5/9/chartex" xmlns:cx4="http://schemas.microsoft.com/office/drawing/2016/5/10/chartex" xmlns:cx5="http://schemas.microsoft.com/office/drawing/2016/5/11/chartex" xmlns:cx6="http://schemas.microsoft.com/office/drawing/2016/5/12/chartex" xmlns:cx7="http://schemas.microsoft.com/office/drawing/2016/5/13/chartex" xmlns:cx8="http://schemas.microsoft.com/office/drawing/2016/5/14/chartex" xmlns:mc="http://schemas.openxmlformats.org/markup-compatibility/2006" xmlns:aink="http://schemas.microsoft.com/office/drawing/2016/ink" xmlns:am3d="http://schemas.microsoft.com/office/drawing/2017/model3d" xmlns:o="urn:schemas-microsoft-com:office:office" xmlns:oel="http://schemas.microsoft.com/office/2019/extlst" xmlns:r="http://schemas.openxmlformats.org/officeDocument/2006/relationships" xmlns:m="http://schemas.openxmlformats.org/officeDocument/2006/math" xmlns:v="urn:schemas-microsoft-com:vml" xmlns:wp14="http://schemas.microsoft.com/office/word/2010/wordprocessingDrawing" xmlns:wp="http://schemas.openxmlformats.org/drawingml/2006/wordprocessingDrawing" xmlns:w10="urn:schemas-microsoft-com:office:word" xmlns:w="http://schemas.openxmlformats.org/wordprocessingml/2006/main" xmlns:w14="http://schemas.microsoft.com/office/word/2010/wordml" xmlns:w15="http://schemas.microsoft.com/office/word/2012/wordml" xmlns:w16cex="http://schemas.microsoft.com/office/word/2018/wordml/cex" xmlns:w16cid="http://schemas.microsoft.com/office/word/2016/wordml/cid" xmlns:w16="http://schemas.microsoft.com/office/word/2018/wordml" xmlns:w16du="http://schemas.microsoft.com/office/word/2023/wordml/word16du" xmlns:w16sdtdh="http://schemas.microsoft.com/office/word/2020/wordml/sdtdatahash" xmlns:w16sdtfl="http://schemas.microsoft.com/office/word/2024/wordml/sdtformatlock" xmlns:w16se="http://schemas.microsoft.com/office/word/2015/wordml/symex" xmlns:wpg="http://schemas.microsoft.com/office/word/2010/wordprocessingGroup" xmlns:wpi="http://schemas.microsoft.com/office/word/2010/wordprocessingInk" xmlns:wne="http://schemas.microsoft.com/office/word/2006/wordml" xmlns:wps="http://schemas.microsoft.com/office/word/2010/wordprocessingShape" mc:Ignorable="w14 w15 w16se w16cid w16 w16cex w16sdtdh w16sdtfl w16du wp14">
+<w:ftr xmlns:wpc="http://schemas.microsoft.com/office/word/2010/wordprocessingCanvas" xmlns:cx="http://schemas.microsoft.com/office/drawing/2014/chartex" xmlns:cx1="http://schemas.microsoft.com/office/drawing/2015/9/8/chartex" xmlns:cx2="http://schemas.microsoft.com/office/drawing/2015/10/21/chartex" xmlns:cx3="http://schemas.microsoft.com/office/drawing/2016/5/9/chartex" xmlns:cx4="http://schemas.microsoft.com/office/drawing/2016/5/10/chartex" xmlns:cx5="http://schemas.microsoft.com/office/drawing/2016/5/11/chartex" xmlns:cx6="http://schemas.microsoft.com/office/drawing/2016/5/12/chartex" xmlns:cx7="http://schemas.microsoft.com/office/drawing/2016/5/13/chartex" xmlns:cx8="http://schemas.microsoft.com/office/drawing/2016/5/14/chartex" xmlns:mc="http://schemas.openxmlformats.org/markup-compatibility/2006" xmlns:aink="http://schemas.microsoft.com/office/drawing/2016/ink" xmlns:am3d="http://schemas.microsoft.com/office/drawing/2017/model3d" xmlns:o="urn:schemas-microsoft-com:office:office" xmlns:oel="http://schemas.microsoft.com/office/2019/extlst" xmlns:r="http://schemas.openxmlformats.org/officeDocument/2006/relationships" xmlns:m="http://schemas.openxmlformats.org/officeDocument/2006/math" xmlns:v="urn:schemas-microsoft-com:vml" xmlns:wp14="http://schemas.microsoft.com/office/word/2010/wordprocessingDrawing" xmlns:wp="http://schemas.openxmlformats.org/drawingml/2006/wordprocessingDrawing" xmlns:w10="urn:schemas-microsoft-com:office:word" xmlns:w="http://schemas.openxmlformats.org/wordprocessingml/2006/main" xmlns:w14="http://schemas.microsoft.com/office/word/2010/wordml" xmlns:w15="http://schemas.microsoft.com/office/word/2012/wordml" xmlns:w16cei="http://schemas.microsoft.com/office/word/2026/wordml/cei" xmlns:w16cex="http://schemas.microsoft.com/office/word/2018/wordml/cex" xmlns:w16cid="http://schemas.microsoft.com/office/word/2016/wordml/cid" xmlns:w16="http://schemas.microsoft.com/office/word/2018/wordml" xmlns:w16du="http://schemas.microsoft.com/office/word/2023/wordml/word16du" xmlns:w16sdtdh="http://schemas.microsoft.com/office/word/2020/wordml/sdtdatahash" xmlns:w16sdtfl="http://schemas.microsoft.com/office/word/2024/wordml/sdtformatlock" xmlns:w16se="http://schemas.microsoft.com/office/word/2015/wordml/symex" xmlns:wpg="http://schemas.microsoft.com/office/word/2010/wordprocessingGroup" xmlns:wpi="http://schemas.microsoft.com/office/word/2010/wordprocessingInk" xmlns:wne="http://schemas.microsoft.com/office/word/2006/wordml" xmlns:wps="http://schemas.microsoft.com/office/word/2010/wordprocessingShape" mc:Ignorable="w14 w15 w16se w16cid w16 w16cex w16sdtdh w16sdtfl w16du wp14">
   <w:p>
     <w:pPr>
-      <w:pStyle w:val="Footer"/>
+      <w:pStyle w:val="a5"/>
     </w:pPr>
     <w:r>
       <w:rPr>
@@ -8658,7 +8918,7 @@
 </file>
 
 <file path=word/footnotes.xml><?xml version="1.0" encoding="utf-8"?>
-<w:footnotes xmlns:wpc="http://schemas.microsoft.com/office/word/2010/wordprocessingCanvas" xmlns:cx="http://schemas.microsoft.com/office/drawing/2014/chartex" xmlns:cx1="http://schemas.microsoft.com/office/drawing/2015/9/8/chartex" xmlns:cx2="http://schemas.microsoft.com/office/drawing/2015/10/21/chartex" xmlns:cx3="http://schemas.microsoft.com/office/drawing/2016/5/9/chartex" xmlns:cx4="http://schemas.microsoft.com/office/drawing/2016/5/10/chartex" xmlns:cx5="http://schemas.microsoft.com/office/drawing/2016/5/11/chartex" xmlns:cx6="http://schemas.microsoft.com/office/drawing/2016/5/12/chartex" xmlns:cx7="http://schemas.microsoft.com/office/drawing/2016/5/13/chartex" xmlns:cx8="http://schemas.microsoft.com/office/drawing/2016/5/14/chartex" xmlns:mc="http://schemas.openxmlformats.org/markup-compatibility/2006" xmlns:aink="http://schemas.microsoft.com/office/drawing/2016/ink" xmlns:am3d="http://schemas.microsoft.com/office/drawing/2017/model3d" xmlns:o="urn:schemas-microsoft-com:office:office" xmlns:oel="http://schemas.microsoft.com/office/2019/extlst" xmlns:r="http://schemas.openxmlformats.org/officeDocument/2006/relationships" xmlns:m="http://schemas.openxmlformats.org/officeDocument/2006/math" xmlns:v="urn:schemas-microsoft-com:vml" xmlns:wp14="http://schemas.microsoft.com/office/word/2010/wordprocessingDrawing" xmlns:wp="http://schemas.openxmlformats.org/drawingml/2006/wordprocessingDrawing" xmlns:w10="urn:schemas-microsoft-com:office:word" xmlns:w="http://schemas.openxmlformats.org/wordprocessingml/2006/main" xmlns:w14="http://schemas.microsoft.com/office/word/2010/wordml" xmlns:w15="http://schemas.microsoft.com/office/word/2012/wordml" xmlns:w16cex="http://schemas.microsoft.com/office/word/2018/wordml/cex" xmlns:w16cid="http://schemas.microsoft.com/office/word/2016/wordml/cid" xmlns:w16="http://schemas.microsoft.com/office/word/2018/wordml" xmlns:w16du="http://schemas.microsoft.com/office/word/2023/wordml/word16du" xmlns:w16sdtdh="http://schemas.microsoft.com/office/word/2020/wordml/sdtdatahash" xmlns:w16sdtfl="http://schemas.microsoft.com/office/word/2024/wordml/sdtformatlock" xmlns:w16se="http://schemas.microsoft.com/office/word/2015/wordml/symex" xmlns:wpg="http://schemas.microsoft.com/office/word/2010/wordprocessingGroup" xmlns:wpi="http://schemas.microsoft.com/office/word/2010/wordprocessingInk" xmlns:wne="http://schemas.microsoft.com/office/word/2006/wordml" xmlns:wps="http://schemas.microsoft.com/office/word/2010/wordprocessingShape" mc:Ignorable="w14 w15 w16se w16cid w16 w16cex w16sdtdh w16sdtfl w16du wp14">
+<w:footnotes xmlns:wpc="http://schemas.microsoft.com/office/word/2010/wordprocessingCanvas" xmlns:cx="http://schemas.microsoft.com/office/drawing/2014/chartex" xmlns:cx1="http://schemas.microsoft.com/office/drawing/2015/9/8/chartex" xmlns:cx2="http://schemas.microsoft.com/office/drawing/2015/10/21/chartex" xmlns:cx3="http://schemas.microsoft.com/office/drawing/2016/5/9/chartex" xmlns:cx4="http://schemas.microsoft.com/office/drawing/2016/5/10/chartex" xmlns:cx5="http://schemas.microsoft.com/office/drawing/2016/5/11/chartex" xmlns:cx6="http://schemas.microsoft.com/office/drawing/2016/5/12/chartex" xmlns:cx7="http://schemas.microsoft.com/office/drawing/2016/5/13/chartex" xmlns:cx8="http://schemas.microsoft.com/office/drawing/2016/5/14/chartex" xmlns:mc="http://schemas.openxmlformats.org/markup-compatibility/2006" xmlns:aink="http://schemas.microsoft.com/office/drawing/2016/ink" xmlns:am3d="http://schemas.microsoft.com/office/drawing/2017/model3d" xmlns:o="urn:schemas-microsoft-com:office:office" xmlns:oel="http://schemas.microsoft.com/office/2019/extlst" xmlns:r="http://schemas.openxmlformats.org/officeDocument/2006/relationships" xmlns:m="http://schemas.openxmlformats.org/officeDocument/2006/math" xmlns:v="urn:schemas-microsoft-com:vml" xmlns:wp14="http://schemas.microsoft.com/office/word/2010/wordprocessingDrawing" xmlns:wp="http://schemas.openxmlformats.org/drawingml/2006/wordprocessingDrawing" xmlns:w10="urn:schemas-microsoft-com:office:word" xmlns:w="http://schemas.openxmlformats.org/wordprocessingml/2006/main" xmlns:w14="http://schemas.microsoft.com/office/word/2010/wordml" xmlns:w15="http://schemas.microsoft.com/office/word/2012/wordml" xmlns:w16cei="http://schemas.microsoft.com/office/word/2026/wordml/cei" xmlns:w16cex="http://schemas.microsoft.com/office/word/2018/wordml/cex" xmlns:w16cid="http://schemas.microsoft.com/office/word/2016/wordml/cid" xmlns:w16="http://schemas.microsoft.com/office/word/2018/wordml" xmlns:w16du="http://schemas.microsoft.com/office/word/2023/wordml/word16du" xmlns:w16sdtdh="http://schemas.microsoft.com/office/word/2020/wordml/sdtdatahash" xmlns:w16sdtfl="http://schemas.microsoft.com/office/word/2024/wordml/sdtformatlock" xmlns:w16se="http://schemas.microsoft.com/office/word/2015/wordml/symex" xmlns:wpg="http://schemas.microsoft.com/office/word/2010/wordprocessingGroup" xmlns:wpi="http://schemas.microsoft.com/office/word/2010/wordprocessingInk" xmlns:wne="http://schemas.microsoft.com/office/word/2006/wordml" xmlns:wps="http://schemas.microsoft.com/office/word/2010/wordprocessingShape" mc:Ignorable="w14 w15 w16se w16cid w16 w16cex w16sdtdh w16sdtfl w16du wp14">
   <w:footnote w:type="separator" w:id="-1">
     <w:p>
       <w:pPr>
@@ -8687,7 +8947,7 @@
 </file>
 
 <file path=word/header1.xml><?xml version="1.0" encoding="utf-8"?>
-<w:hdr xmlns:wpc="http://schemas.microsoft.com/office/word/2010/wordprocessingCanvas" xmlns:cx="http://schemas.microsoft.com/office/drawing/2014/chartex" xmlns:cx1="http://schemas.microsoft.com/office/drawing/2015/9/8/chartex" xmlns:cx2="http://schemas.microsoft.com/office/drawing/2015/10/21/chartex" xmlns:cx3="http://schemas.microsoft.com/office/drawing/2016/5/9/chartex" xmlns:cx4="http://schemas.microsoft.com/office/drawing/2016/5/10/chartex" xmlns:cx5="http://schemas.microsoft.com/office/drawing/2016/5/11/chartex" xmlns:cx6="http://schemas.microsoft.com/office/drawing/2016/5/12/chartex" xmlns:cx7="http://schemas.microsoft.com/office/drawing/2016/5/13/chartex" xmlns:cx8="http://schemas.microsoft.com/office/drawing/2016/5/14/chartex" xmlns:mc="http://schemas.openxmlformats.org/markup-compatibility/2006" xmlns:aink="http://schemas.microsoft.com/office/drawing/2016/ink" xmlns:am3d="http://schemas.microsoft.com/office/drawing/2017/model3d" xmlns:o="urn:schemas-microsoft-com:office:office" xmlns:oel="http://schemas.microsoft.com/office/2019/extlst" xmlns:r="http://schemas.openxmlformats.org/officeDocument/2006/relationships" xmlns:m="http://schemas.openxmlformats.org/officeDocument/2006/math" xmlns:v="urn:schemas-microsoft-com:vml" xmlns:wp14="http://schemas.microsoft.com/office/word/2010/wordprocessingDrawing" xmlns:wp="http://schemas.openxmlformats.org/drawingml/2006/wordprocessingDrawing" xmlns:w10="urn:schemas-microsoft-com:office:word" xmlns:w="http://schemas.openxmlformats.org/wordprocessingml/2006/main" xmlns:w14="http://schemas.microsoft.com/office/word/2010/wordml" xmlns:w15="http://schemas.microsoft.com/office/word/2012/wordml" xmlns:w16cex="http://schemas.microsoft.com/office/word/2018/wordml/cex" xmlns:w16cid="http://schemas.microsoft.com/office/word/2016/wordml/cid" xmlns:w16="http://schemas.microsoft.com/office/word/2018/wordml" xmlns:w16du="http://schemas.microsoft.com/office/word/2023/wordml/word16du" xmlns:w16sdtdh="http://schemas.microsoft.com/office/word/2020/wordml/sdtdatahash" xmlns:w16sdtfl="http://schemas.microsoft.com/office/word/2024/wordml/sdtformatlock" xmlns:w16se="http://schemas.microsoft.com/office/word/2015/wordml/symex" xmlns:wpg="http://schemas.microsoft.com/office/word/2010/wordprocessingGroup" xmlns:wpi="http://schemas.microsoft.com/office/word/2010/wordprocessingInk" xmlns:wne="http://schemas.microsoft.com/office/word/2006/wordml" xmlns:wps="http://schemas.microsoft.com/office/word/2010/wordprocessingShape" mc:Ignorable="w14 w15 w16se w16cid w16 w16cex w16sdtdh w16sdtfl w16du wp14">
+<w:hdr xmlns:wpc="http://schemas.microsoft.com/office/word/2010/wordprocessingCanvas" xmlns:cx="http://schemas.microsoft.com/office/drawing/2014/chartex" xmlns:cx1="http://schemas.microsoft.com/office/drawing/2015/9/8/chartex" xmlns:cx2="http://schemas.microsoft.com/office/drawing/2015/10/21/chartex" xmlns:cx3="http://schemas.microsoft.com/office/drawing/2016/5/9/chartex" xmlns:cx4="http://schemas.microsoft.com/office/drawing/2016/5/10/chartex" xmlns:cx5="http://schemas.microsoft.com/office/drawing/2016/5/11/chartex" xmlns:cx6="http://schemas.microsoft.com/office/drawing/2016/5/12/chartex" xmlns:cx7="http://schemas.microsoft.com/office/drawing/2016/5/13/chartex" xmlns:cx8="http://schemas.microsoft.com/office/drawing/2016/5/14/chartex" xmlns:mc="http://schemas.openxmlformats.org/markup-compatibility/2006" xmlns:aink="http://schemas.microsoft.com/office/drawing/2016/ink" xmlns:am3d="http://schemas.microsoft.com/office/drawing/2017/model3d" xmlns:o="urn:schemas-microsoft-com:office:office" xmlns:oel="http://schemas.microsoft.com/office/2019/extlst" xmlns:r="http://schemas.openxmlformats.org/officeDocument/2006/relationships" xmlns:m="http://schemas.openxmlformats.org/officeDocument/2006/math" xmlns:v="urn:schemas-microsoft-com:vml" xmlns:wp14="http://schemas.microsoft.com/office/word/2010/wordprocessingDrawing" xmlns:wp="http://schemas.openxmlformats.org/drawingml/2006/wordprocessingDrawing" xmlns:w10="urn:schemas-microsoft-com:office:word" xmlns:w="http://schemas.openxmlformats.org/wordprocessingml/2006/main" xmlns:w14="http://schemas.microsoft.com/office/word/2010/wordml" xmlns:w15="http://schemas.microsoft.com/office/word/2012/wordml" xmlns:w16cei="http://schemas.microsoft.com/office/word/2026/wordml/cei" xmlns:w16cex="http://schemas.microsoft.com/office/word/2018/wordml/cex" xmlns:w16cid="http://schemas.microsoft.com/office/word/2016/wordml/cid" xmlns:w16="http://schemas.microsoft.com/office/word/2018/wordml" xmlns:w16du="http://schemas.microsoft.com/office/word/2023/wordml/word16du" xmlns:w16sdtdh="http://schemas.microsoft.com/office/word/2020/wordml/sdtdatahash" xmlns:w16sdtfl="http://schemas.microsoft.com/office/word/2024/wordml/sdtformatlock" xmlns:w16se="http://schemas.microsoft.com/office/word/2015/wordml/symex" xmlns:wpg="http://schemas.microsoft.com/office/word/2010/wordprocessingGroup" xmlns:wpi="http://schemas.microsoft.com/office/word/2010/wordprocessingInk" xmlns:wne="http://schemas.microsoft.com/office/word/2006/wordml" xmlns:wps="http://schemas.microsoft.com/office/word/2010/wordprocessingShape" mc:Ignorable="w14 w15 w16se w16cid w16 w16cex w16sdtdh w16sdtfl w16du wp14">
   <w:tbl>
     <w:tblPr>
       <w:tblW w:w="6410" w:type="pct"/>
@@ -8751,7 +9011,7 @@
         </w:tcPr>
         <w:p>
           <w:pPr>
-            <w:pStyle w:val="Header"/>
+            <w:pStyle w:val="a7"/>
           </w:pPr>
         </w:p>
       </w:tc>
@@ -8761,7 +9021,7 @@
         </w:tcPr>
         <w:p>
           <w:pPr>
-            <w:pStyle w:val="Header"/>
+            <w:pStyle w:val="a7"/>
           </w:pPr>
         </w:p>
       </w:tc>
@@ -8772,7 +9032,7 @@
         </w:tcPr>
         <w:p>
           <w:pPr>
-            <w:pStyle w:val="Header"/>
+            <w:pStyle w:val="a7"/>
           </w:pPr>
         </w:p>
       </w:tc>
@@ -8780,14 +9040,14 @@
   </w:tbl>
   <w:p>
     <w:pPr>
-      <w:pStyle w:val="Header"/>
+      <w:pStyle w:val="a7"/>
     </w:pPr>
   </w:p>
 </w:hdr>
 </file>
 
 <file path=word/header2.xml><?xml version="1.0" encoding="utf-8"?>
-<w:hdr xmlns:wpc="http://schemas.microsoft.com/office/word/2010/wordprocessingCanvas" xmlns:cx="http://schemas.microsoft.com/office/drawing/2014/chartex" xmlns:cx1="http://schemas.microsoft.com/office/drawing/2015/9/8/chartex" xmlns:cx2="http://schemas.microsoft.com/office/drawing/2015/10/21/chartex" xmlns:cx3="http://schemas.microsoft.com/office/drawing/2016/5/9/chartex" xmlns:cx4="http://schemas.microsoft.com/office/drawing/2016/5/10/chartex" xmlns:cx5="http://schemas.microsoft.com/office/drawing/2016/5/11/chartex" xmlns:cx6="http://schemas.microsoft.com/office/drawing/2016/5/12/chartex" xmlns:cx7="http://schemas.microsoft.com/office/drawing/2016/5/13/chartex" xmlns:cx8="http://schemas.microsoft.com/office/drawing/2016/5/14/chartex" xmlns:mc="http://schemas.openxmlformats.org/markup-compatibility/2006" xmlns:aink="http://schemas.microsoft.com/office/drawing/2016/ink" xmlns:am3d="http://schemas.microsoft.com/office/drawing/2017/model3d" xmlns:o="urn:schemas-microsoft-com:office:office" xmlns:oel="http://schemas.microsoft.com/office/2019/extlst" xmlns:r="http://schemas.openxmlformats.org/officeDocument/2006/relationships" xmlns:m="http://schemas.openxmlformats.org/officeDocument/2006/math" xmlns:v="urn:schemas-microsoft-com:vml" xmlns:wp14="http://schemas.microsoft.com/office/word/2010/wordprocessingDrawing" xmlns:wp="http://schemas.openxmlformats.org/drawingml/2006/wordprocessingDrawing" xmlns:w10="urn:schemas-microsoft-com:office:word" xmlns:w="http://schemas.openxmlformats.org/wordprocessingml/2006/main" xmlns:w14="http://schemas.microsoft.com/office/word/2010/wordml" xmlns:w15="http://schemas.microsoft.com/office/word/2012/wordml" xmlns:w16cex="http://schemas.microsoft.com/office/word/2018/wordml/cex" xmlns:w16cid="http://schemas.microsoft.com/office/word/2016/wordml/cid" xmlns:w16="http://schemas.microsoft.com/office/word/2018/wordml" xmlns:w16du="http://schemas.microsoft.com/office/word/2023/wordml/word16du" xmlns:w16sdtdh="http://schemas.microsoft.com/office/word/2020/wordml/sdtdatahash" xmlns:w16sdtfl="http://schemas.microsoft.com/office/word/2024/wordml/sdtformatlock" xmlns:w16se="http://schemas.microsoft.com/office/word/2015/wordml/symex" xmlns:wpg="http://schemas.microsoft.com/office/word/2010/wordprocessingGroup" xmlns:wpi="http://schemas.microsoft.com/office/word/2010/wordprocessingInk" xmlns:wne="http://schemas.microsoft.com/office/word/2006/wordml" xmlns:wps="http://schemas.microsoft.com/office/word/2010/wordprocessingShape" mc:Ignorable="w14 w15 w16se w16cid w16 w16cex w16sdtdh w16sdtfl w16du wp14">
+<w:hdr xmlns:wpc="http://schemas.microsoft.com/office/word/2010/wordprocessingCanvas" xmlns:cx="http://schemas.microsoft.com/office/drawing/2014/chartex" xmlns:cx1="http://schemas.microsoft.com/office/drawing/2015/9/8/chartex" xmlns:cx2="http://schemas.microsoft.com/office/drawing/2015/10/21/chartex" xmlns:cx3="http://schemas.microsoft.com/office/drawing/2016/5/9/chartex" xmlns:cx4="http://schemas.microsoft.com/office/drawing/2016/5/10/chartex" xmlns:cx5="http://schemas.microsoft.com/office/drawing/2016/5/11/chartex" xmlns:cx6="http://schemas.microsoft.com/office/drawing/2016/5/12/chartex" xmlns:cx7="http://schemas.microsoft.com/office/drawing/2016/5/13/chartex" xmlns:cx8="http://schemas.microsoft.com/office/drawing/2016/5/14/chartex" xmlns:mc="http://schemas.openxmlformats.org/markup-compatibility/2006" xmlns:aink="http://schemas.microsoft.com/office/drawing/2016/ink" xmlns:am3d="http://schemas.microsoft.com/office/drawing/2017/model3d" xmlns:o="urn:schemas-microsoft-com:office:office" xmlns:oel="http://schemas.microsoft.com/office/2019/extlst" xmlns:r="http://schemas.openxmlformats.org/officeDocument/2006/relationships" xmlns:m="http://schemas.openxmlformats.org/officeDocument/2006/math" xmlns:v="urn:schemas-microsoft-com:vml" xmlns:wp14="http://schemas.microsoft.com/office/word/2010/wordprocessingDrawing" xmlns:wp="http://schemas.openxmlformats.org/drawingml/2006/wordprocessingDrawing" xmlns:w10="urn:schemas-microsoft-com:office:word" xmlns:w="http://schemas.openxmlformats.org/wordprocessingml/2006/main" xmlns:w14="http://schemas.microsoft.com/office/word/2010/wordml" xmlns:w15="http://schemas.microsoft.com/office/word/2012/wordml" xmlns:w16cei="http://schemas.microsoft.com/office/word/2026/wordml/cei" xmlns:w16cex="http://schemas.microsoft.com/office/word/2018/wordml/cex" xmlns:w16cid="http://schemas.microsoft.com/office/word/2016/wordml/cid" xmlns:w16="http://schemas.microsoft.com/office/word/2018/wordml" xmlns:w16du="http://schemas.microsoft.com/office/word/2023/wordml/word16du" xmlns:w16sdtdh="http://schemas.microsoft.com/office/word/2020/wordml/sdtdatahash" xmlns:w16sdtfl="http://schemas.microsoft.com/office/word/2024/wordml/sdtformatlock" xmlns:w16se="http://schemas.microsoft.com/office/word/2015/wordml/symex" xmlns:wpg="http://schemas.microsoft.com/office/word/2010/wordprocessingGroup" xmlns:wpi="http://schemas.microsoft.com/office/word/2010/wordprocessingInk" xmlns:wne="http://schemas.microsoft.com/office/word/2006/wordml" xmlns:wps="http://schemas.microsoft.com/office/word/2010/wordprocessingShape" mc:Ignorable="w14 w15 w16se w16cid w16 w16cex w16sdtdh w16sdtfl w16du wp14">
   <w:p>
     <w:pPr>
       <w:ind w:left="-2340"/>
@@ -8972,7 +9232,7 @@
 </file>
 
 <file path=word/header3.xml><?xml version="1.0" encoding="utf-8"?>
-<w:hdr xmlns:wpc="http://schemas.microsoft.com/office/word/2010/wordprocessingCanvas" xmlns:cx="http://schemas.microsoft.com/office/drawing/2014/chartex" xmlns:cx1="http://schemas.microsoft.com/office/drawing/2015/9/8/chartex" xmlns:cx2="http://schemas.microsoft.com/office/drawing/2015/10/21/chartex" xmlns:cx3="http://schemas.microsoft.com/office/drawing/2016/5/9/chartex" xmlns:cx4="http://schemas.microsoft.com/office/drawing/2016/5/10/chartex" xmlns:cx5="http://schemas.microsoft.com/office/drawing/2016/5/11/chartex" xmlns:cx6="http://schemas.microsoft.com/office/drawing/2016/5/12/chartex" xmlns:cx7="http://schemas.microsoft.com/office/drawing/2016/5/13/chartex" xmlns:cx8="http://schemas.microsoft.com/office/drawing/2016/5/14/chartex" xmlns:mc="http://schemas.openxmlformats.org/markup-compatibility/2006" xmlns:aink="http://schemas.microsoft.com/office/drawing/2016/ink" xmlns:am3d="http://schemas.microsoft.com/office/drawing/2017/model3d" xmlns:o="urn:schemas-microsoft-com:office:office" xmlns:oel="http://schemas.microsoft.com/office/2019/extlst" xmlns:r="http://schemas.openxmlformats.org/officeDocument/2006/relationships" xmlns:m="http://schemas.openxmlformats.org/officeDocument/2006/math" xmlns:v="urn:schemas-microsoft-com:vml" xmlns:wp14="http://schemas.microsoft.com/office/word/2010/wordprocessingDrawing" xmlns:wp="http://schemas.openxmlformats.org/drawingml/2006/wordprocessingDrawing" xmlns:w10="urn:schemas-microsoft-com:office:word" xmlns:w="http://schemas.openxmlformats.org/wordprocessingml/2006/main" xmlns:w14="http://schemas.microsoft.com/office/word/2010/wordml" xmlns:w15="http://schemas.microsoft.com/office/word/2012/wordml" xmlns:w16cex="http://schemas.microsoft.com/office/word/2018/wordml/cex" xmlns:w16cid="http://schemas.microsoft.com/office/word/2016/wordml/cid" xmlns:w16="http://schemas.microsoft.com/office/word/2018/wordml" xmlns:w16du="http://schemas.microsoft.com/office/word/2023/wordml/word16du" xmlns:w16sdtdh="http://schemas.microsoft.com/office/word/2020/wordml/sdtdatahash" xmlns:w16sdtfl="http://schemas.microsoft.com/office/word/2024/wordml/sdtformatlock" xmlns:w16se="http://schemas.microsoft.com/office/word/2015/wordml/symex" xmlns:wpg="http://schemas.microsoft.com/office/word/2010/wordprocessingGroup" xmlns:wpi="http://schemas.microsoft.com/office/word/2010/wordprocessingInk" xmlns:wne="http://schemas.microsoft.com/office/word/2006/wordml" xmlns:wps="http://schemas.microsoft.com/office/word/2010/wordprocessingShape" mc:Ignorable="w14 w15 w16se w16cid w16 w16cex w16sdtdh w16sdtfl w16du wp14">
+<w:hdr xmlns:wpc="http://schemas.microsoft.com/office/word/2010/wordprocessingCanvas" xmlns:cx="http://schemas.microsoft.com/office/drawing/2014/chartex" xmlns:cx1="http://schemas.microsoft.com/office/drawing/2015/9/8/chartex" xmlns:cx2="http://schemas.microsoft.com/office/drawing/2015/10/21/chartex" xmlns:cx3="http://schemas.microsoft.com/office/drawing/2016/5/9/chartex" xmlns:cx4="http://schemas.microsoft.com/office/drawing/2016/5/10/chartex" xmlns:cx5="http://schemas.microsoft.com/office/drawing/2016/5/11/chartex" xmlns:cx6="http://schemas.microsoft.com/office/drawing/2016/5/12/chartex" xmlns:cx7="http://schemas.microsoft.com/office/drawing/2016/5/13/chartex" xmlns:cx8="http://schemas.microsoft.com/office/drawing/2016/5/14/chartex" xmlns:mc="http://schemas.openxmlformats.org/markup-compatibility/2006" xmlns:aink="http://schemas.microsoft.com/office/drawing/2016/ink" xmlns:am3d="http://schemas.microsoft.com/office/drawing/2017/model3d" xmlns:o="urn:schemas-microsoft-com:office:office" xmlns:oel="http://schemas.microsoft.com/office/2019/extlst" xmlns:r="http://schemas.openxmlformats.org/officeDocument/2006/relationships" xmlns:m="http://schemas.openxmlformats.org/officeDocument/2006/math" xmlns:v="urn:schemas-microsoft-com:vml" xmlns:wp14="http://schemas.microsoft.com/office/word/2010/wordprocessingDrawing" xmlns:wp="http://schemas.openxmlformats.org/drawingml/2006/wordprocessingDrawing" xmlns:w10="urn:schemas-microsoft-com:office:word" xmlns:w="http://schemas.openxmlformats.org/wordprocessingml/2006/main" xmlns:w14="http://schemas.microsoft.com/office/word/2010/wordml" xmlns:w15="http://schemas.microsoft.com/office/word/2012/wordml" xmlns:w16cei="http://schemas.microsoft.com/office/word/2026/wordml/cei" xmlns:w16cex="http://schemas.microsoft.com/office/word/2018/wordml/cex" xmlns:w16cid="http://schemas.microsoft.com/office/word/2016/wordml/cid" xmlns:w16="http://schemas.microsoft.com/office/word/2018/wordml" xmlns:w16du="http://schemas.microsoft.com/office/word/2023/wordml/word16du" xmlns:w16sdtdh="http://schemas.microsoft.com/office/word/2020/wordml/sdtdatahash" xmlns:w16sdtfl="http://schemas.microsoft.com/office/word/2024/wordml/sdtformatlock" xmlns:w16se="http://schemas.microsoft.com/office/word/2015/wordml/symex" xmlns:wpg="http://schemas.microsoft.com/office/word/2010/wordprocessingGroup" xmlns:wpi="http://schemas.microsoft.com/office/word/2010/wordprocessingInk" xmlns:wne="http://schemas.microsoft.com/office/word/2006/wordml" xmlns:wps="http://schemas.microsoft.com/office/word/2010/wordprocessingShape" mc:Ignorable="w14 w15 w16se w16cid w16 w16cex w16sdtdh w16sdtfl w16du wp14">
   <w:tbl>
     <w:tblPr>
       <w:tblW w:w="6410" w:type="pct"/>
@@ -9066,9 +9326,32 @@
           </w:r>
           <w:r>
             <w:rPr>
+              <w:rFonts w:hint="cs"/>
+              <w:b w:val="0"/>
+              <w:bCs w:val="0"/>
+              <w:noProof/>
+              <w:rtl/>
+            </w:rPr>
+            <w:instrText xml:space="preserve">خطأ! استخدم علامة التبويب "الصفحة الرئيسية" لتطبيق </w:instrText>
+          </w:r>
+          <w:r>
+            <w:rPr>
+              <w:rFonts w:hint="cs"/>
+              <w:b w:val="0"/>
+              <w:bCs w:val="0"/>
               <w:noProof/>
             </w:rPr>
-            <w:instrText>Task 1 – Database Design (6 Marks)</w:instrText>
+            <w:instrText>Heading 1</w:instrText>
+          </w:r>
+          <w:r>
+            <w:rPr>
+              <w:rFonts w:hint="cs"/>
+              <w:b w:val="0"/>
+              <w:bCs w:val="0"/>
+              <w:noProof/>
+              <w:rtl/>
+            </w:rPr>
+            <w:instrText xml:space="preserve"> على النص الذي ترغب في أن يظهر هنا.</w:instrText>
           </w:r>
           <w:r>
             <w:rPr>
@@ -9099,9 +9382,32 @@
           </w:r>
           <w:r>
             <w:rPr>
+              <w:rFonts w:hint="cs"/>
+              <w:b w:val="0"/>
+              <w:bCs w:val="0"/>
+              <w:noProof/>
+              <w:rtl/>
+            </w:rPr>
+            <w:instrText xml:space="preserve">خطأ! استخدم علامة التبويب "الصفحة الرئيسية" لتطبيق </w:instrText>
+          </w:r>
+          <w:r>
+            <w:rPr>
+              <w:rFonts w:hint="cs"/>
+              <w:b w:val="0"/>
+              <w:bCs w:val="0"/>
               <w:noProof/>
             </w:rPr>
-            <w:instrText>Task 1 – Database Design (6 Marks)</w:instrText>
+            <w:instrText>Heading 1</w:instrText>
+          </w:r>
+          <w:r>
+            <w:rPr>
+              <w:rFonts w:hint="cs"/>
+              <w:b w:val="0"/>
+              <w:bCs w:val="0"/>
+              <w:noProof/>
+              <w:rtl/>
+            </w:rPr>
+            <w:instrText xml:space="preserve"> على النص الذي ترغب في أن يظهر هنا.</w:instrText>
           </w:r>
           <w:r>
             <w:rPr>
@@ -9117,9 +9423,38 @@
           </w:r>
           <w:r>
             <w:rPr>
+              <w:rFonts w:hint="cs"/>
+              <w:b w:val="0"/>
+              <w:bCs w:val="0"/>
+              <w:noProof/>
+              <w:rtl/>
+            </w:rPr>
+            <w:t xml:space="preserve">خطأ! استخدم علامة التبويب "الصفحة الرئيسية" لتطبيق </w:t>
+          </w:r>
+          <w:r>
+            <w:rPr>
+              <w:rFonts w:hint="cs"/>
+              <w:b w:val="0"/>
+              <w:bCs w:val="0"/>
               <w:noProof/>
             </w:rPr>
-            <w:t xml:space="preserve">Task 1 – Database Design (6 Marks) </w:t>
+            <w:t>Heading 1</w:t>
+          </w:r>
+          <w:r>
+            <w:rPr>
+              <w:rFonts w:hint="cs"/>
+              <w:b w:val="0"/>
+              <w:bCs w:val="0"/>
+              <w:noProof/>
+              <w:rtl/>
+            </w:rPr>
+            <w:t xml:space="preserve"> على النص الذي ترغب في أن يظهر هنا.</w:t>
+          </w:r>
+          <w:r>
+            <w:rPr>
+              <w:noProof/>
+            </w:rPr>
+            <w:t xml:space="preserve"> </w:t>
           </w:r>
           <w:r>
             <w:fldChar w:fldCharType="end"/>
@@ -9177,7 +9512,7 @@
 </file>
 
 <file path=word/numbering.xml><?xml version="1.0" encoding="utf-8"?>
-<w:numbering xmlns:wpc="http://schemas.microsoft.com/office/word/2010/wordprocessingCanvas" xmlns:cx="http://schemas.microsoft.com/office/drawing/2014/chartex" xmlns:cx1="http://schemas.microsoft.com/office/drawing/2015/9/8/chartex" xmlns:cx2="http://schemas.microsoft.com/office/drawing/2015/10/21/chartex" xmlns:cx3="http://schemas.microsoft.com/office/drawing/2016/5/9/chartex" xmlns:cx4="http://schemas.microsoft.com/office/drawing/2016/5/10/chartex" xmlns:cx5="http://schemas.microsoft.com/office/drawing/2016/5/11/chartex" xmlns:cx6="http://schemas.microsoft.com/office/drawing/2016/5/12/chartex" xmlns:cx7="http://schemas.microsoft.com/office/drawing/2016/5/13/chartex" xmlns:cx8="http://schemas.microsoft.com/office/drawing/2016/5/14/chartex" xmlns:mc="http://schemas.openxmlformats.org/markup-compatibility/2006" xmlns:aink="http://schemas.microsoft.com/office/drawing/2016/ink" xmlns:am3d="http://schemas.microsoft.com/office/drawing/2017/model3d" xmlns:o="urn:schemas-microsoft-com:office:office" xmlns:oel="http://schemas.microsoft.com/office/2019/extlst" xmlns:r="http://schemas.openxmlformats.org/officeDocument/2006/relationships" xmlns:m="http://schemas.openxmlformats.org/officeDocument/2006/math" xmlns:v="urn:schemas-microsoft-com:vml" xmlns:wp14="http://schemas.microsoft.com/office/word/2010/wordprocessingDrawing" xmlns:wp="http://schemas.openxmlformats.org/drawingml/2006/wordprocessingDrawing" xmlns:w10="urn:schemas-microsoft-com:office:word" xmlns:w="http://schemas.openxmlformats.org/wordprocessingml/2006/main" xmlns:w14="http://schemas.microsoft.com/office/word/2010/wordml" xmlns:w15="http://schemas.microsoft.com/office/word/2012/wordml" xmlns:w16cex="http://schemas.microsoft.com/office/word/2018/wordml/cex" xmlns:w16cid="http://schemas.microsoft.com/office/word/2016/wordml/cid" xmlns:w16="http://schemas.microsoft.com/office/word/2018/wordml" xmlns:w16du="http://schemas.microsoft.com/office/word/2023/wordml/word16du" xmlns:w16sdtdh="http://schemas.microsoft.com/office/word/2020/wordml/sdtdatahash" xmlns:w16sdtfl="http://schemas.microsoft.com/office/word/2024/wordml/sdtformatlock" xmlns:w16se="http://schemas.microsoft.com/office/word/2015/wordml/symex" xmlns:wpg="http://schemas.microsoft.com/office/word/2010/wordprocessingGroup" xmlns:wpi="http://schemas.microsoft.com/office/word/2010/wordprocessingInk" xmlns:wne="http://schemas.microsoft.com/office/word/2006/wordml" xmlns:wps="http://schemas.microsoft.com/office/word/2010/wordprocessingShape" mc:Ignorable="w14 w15 w16se w16cid w16 w16cex w16sdtdh w16sdtfl w16du wp14">
+<w:numbering xmlns:wpc="http://schemas.microsoft.com/office/word/2010/wordprocessingCanvas" xmlns:cx="http://schemas.microsoft.com/office/drawing/2014/chartex" xmlns:cx1="http://schemas.microsoft.com/office/drawing/2015/9/8/chartex" xmlns:cx2="http://schemas.microsoft.com/office/drawing/2015/10/21/chartex" xmlns:cx3="http://schemas.microsoft.com/office/drawing/2016/5/9/chartex" xmlns:cx4="http://schemas.microsoft.com/office/drawing/2016/5/10/chartex" xmlns:cx5="http://schemas.microsoft.com/office/drawing/2016/5/11/chartex" xmlns:cx6="http://schemas.microsoft.com/office/drawing/2016/5/12/chartex" xmlns:cx7="http://schemas.microsoft.com/office/drawing/2016/5/13/chartex" xmlns:cx8="http://schemas.microsoft.com/office/drawing/2016/5/14/chartex" xmlns:mc="http://schemas.openxmlformats.org/markup-compatibility/2006" xmlns:aink="http://schemas.microsoft.com/office/drawing/2016/ink" xmlns:am3d="http://schemas.microsoft.com/office/drawing/2017/model3d" xmlns:o="urn:schemas-microsoft-com:office:office" xmlns:oel="http://schemas.microsoft.com/office/2019/extlst" xmlns:r="http://schemas.openxmlformats.org/officeDocument/2006/relationships" xmlns:m="http://schemas.openxmlformats.org/officeDocument/2006/math" xmlns:v="urn:schemas-microsoft-com:vml" xmlns:wp14="http://schemas.microsoft.com/office/word/2010/wordprocessingDrawing" xmlns:wp="http://schemas.openxmlformats.org/drawingml/2006/wordprocessingDrawing" xmlns:w10="urn:schemas-microsoft-com:office:word" xmlns:w="http://schemas.openxmlformats.org/wordprocessingml/2006/main" xmlns:w14="http://schemas.microsoft.com/office/word/2010/wordml" xmlns:w15="http://schemas.microsoft.com/office/word/2012/wordml" xmlns:w16cei="http://schemas.microsoft.com/office/word/2026/wordml/cei" xmlns:w16cex="http://schemas.microsoft.com/office/word/2018/wordml/cex" xmlns:w16cid="http://schemas.microsoft.com/office/word/2016/wordml/cid" xmlns:w16="http://schemas.microsoft.com/office/word/2018/wordml" xmlns:w16du="http://schemas.microsoft.com/office/word/2023/wordml/word16du" xmlns:w16sdtdh="http://schemas.microsoft.com/office/word/2020/wordml/sdtdatahash" xmlns:w16sdtfl="http://schemas.microsoft.com/office/word/2024/wordml/sdtformatlock" xmlns:w16se="http://schemas.microsoft.com/office/word/2015/wordml/symex" xmlns:wpg="http://schemas.microsoft.com/office/word/2010/wordprocessingGroup" xmlns:wpi="http://schemas.microsoft.com/office/word/2010/wordprocessingInk" xmlns:wne="http://schemas.microsoft.com/office/word/2006/wordml" xmlns:wps="http://schemas.microsoft.com/office/word/2010/wordprocessingShape" mc:Ignorable="w14 w15 w16se w16cid w16 w16cex w16sdtdh w16sdtfl w16du wp14">
   <w:abstractNum w:abstractNumId="0" w15:restartNumberingAfterBreak="0">
     <w:nsid w:val="FFFFFF89"/>
     <w:multiLevelType w:val="singleLevel"/>
@@ -9185,7 +9520,7 @@
     <w:lvl w:ilvl="0">
       <w:start w:val="1"/>
       <w:numFmt w:val="bullet"/>
-      <w:pStyle w:val="ListBullet"/>
+      <w:pStyle w:val="a"/>
       <w:lvlText w:val="•"/>
       <w:lvlJc w:val="left"/>
       <w:pPr>
@@ -10250,7 +10585,7 @@
     <w:lvl w:ilvl="0">
       <w:start w:val="1"/>
       <w:numFmt w:val="decimal"/>
-      <w:pStyle w:val="ListNumber"/>
+      <w:pStyle w:val="a0"/>
       <w:lvlText w:val="%1."/>
       <w:lvlJc w:val="left"/>
       <w:pPr>
@@ -10264,7 +10599,7 @@
     <w:lvl w:ilvl="1">
       <w:start w:val="1"/>
       <w:numFmt w:val="decimal"/>
-      <w:pStyle w:val="ListNumber2"/>
+      <w:pStyle w:val="2"/>
       <w:suff w:val="space"/>
       <w:lvlText w:val="%1.%2"/>
       <w:lvlJc w:val="left"/>
@@ -10279,7 +10614,7 @@
     <w:lvl w:ilvl="2">
       <w:start w:val="1"/>
       <w:numFmt w:val="lowerLetter"/>
-      <w:pStyle w:val="ListNumber3"/>
+      <w:pStyle w:val="3"/>
       <w:lvlText w:val="%3."/>
       <w:lvlJc w:val="left"/>
       <w:pPr>
@@ -10293,7 +10628,7 @@
     <w:lvl w:ilvl="3">
       <w:start w:val="1"/>
       <w:numFmt w:val="lowerRoman"/>
-      <w:pStyle w:val="ListNumber4"/>
+      <w:pStyle w:val="4"/>
       <w:lvlText w:val="%4."/>
       <w:lvlJc w:val="left"/>
       <w:pPr>
@@ -10307,7 +10642,7 @@
     <w:lvl w:ilvl="4">
       <w:start w:val="1"/>
       <w:numFmt w:val="lowerLetter"/>
-      <w:pStyle w:val="ListNumber5"/>
+      <w:pStyle w:val="5"/>
       <w:lvlText w:val="(%5)"/>
       <w:lvlJc w:val="left"/>
       <w:pPr>
@@ -11121,6 +11456,155 @@
     </w:lvl>
   </w:abstractNum>
   <w:abstractNum w:abstractNumId="18" w15:restartNumberingAfterBreak="0">
+    <w:nsid w:val="56B224C9"/>
+    <w:multiLevelType w:val="multilevel"/>
+    <w:tmpl w:val="BE58CE00"/>
+    <w:lvl w:ilvl="0">
+      <w:start w:val="1"/>
+      <w:numFmt w:val="bullet"/>
+      <w:lvlText w:val=""/>
+      <w:lvlJc w:val="left"/>
+      <w:pPr>
+        <w:tabs>
+          <w:tab w:val="num" w:pos="720"/>
+        </w:tabs>
+        <w:ind w:left="720" w:hanging="360"/>
+      </w:pPr>
+      <w:rPr>
+        <w:rFonts w:ascii="Symbol" w:hAnsi="Symbol" w:hint="default"/>
+        <w:sz w:val="20"/>
+      </w:rPr>
+    </w:lvl>
+    <w:lvl w:ilvl="1" w:tentative="1">
+      <w:start w:val="1"/>
+      <w:numFmt w:val="bullet"/>
+      <w:lvlText w:val="o"/>
+      <w:lvlJc w:val="left"/>
+      <w:pPr>
+        <w:tabs>
+          <w:tab w:val="num" w:pos="1440"/>
+        </w:tabs>
+        <w:ind w:left="1440" w:hanging="360"/>
+      </w:pPr>
+      <w:rPr>
+        <w:rFonts w:ascii="Courier New" w:hAnsi="Courier New" w:hint="default"/>
+        <w:sz w:val="20"/>
+      </w:rPr>
+    </w:lvl>
+    <w:lvl w:ilvl="2" w:tentative="1">
+      <w:start w:val="1"/>
+      <w:numFmt w:val="bullet"/>
+      <w:lvlText w:val=""/>
+      <w:lvlJc w:val="left"/>
+      <w:pPr>
+        <w:tabs>
+          <w:tab w:val="num" w:pos="2160"/>
+        </w:tabs>
+        <w:ind w:left="2160" w:hanging="360"/>
+      </w:pPr>
+      <w:rPr>
+        <w:rFonts w:ascii="Wingdings" w:hAnsi="Wingdings" w:hint="default"/>
+        <w:sz w:val="20"/>
+      </w:rPr>
+    </w:lvl>
+    <w:lvl w:ilvl="3" w:tentative="1">
+      <w:start w:val="1"/>
+      <w:numFmt w:val="bullet"/>
+      <w:lvlText w:val=""/>
+      <w:lvlJc w:val="left"/>
+      <w:pPr>
+        <w:tabs>
+          <w:tab w:val="num" w:pos="2880"/>
+        </w:tabs>
+        <w:ind w:left="2880" w:hanging="360"/>
+      </w:pPr>
+      <w:rPr>
+        <w:rFonts w:ascii="Wingdings" w:hAnsi="Wingdings" w:hint="default"/>
+        <w:sz w:val="20"/>
+      </w:rPr>
+    </w:lvl>
+    <w:lvl w:ilvl="4" w:tentative="1">
+      <w:start w:val="1"/>
+      <w:numFmt w:val="bullet"/>
+      <w:lvlText w:val=""/>
+      <w:lvlJc w:val="left"/>
+      <w:pPr>
+        <w:tabs>
+          <w:tab w:val="num" w:pos="3600"/>
+        </w:tabs>
+        <w:ind w:left="3600" w:hanging="360"/>
+      </w:pPr>
+      <w:rPr>
+        <w:rFonts w:ascii="Wingdings" w:hAnsi="Wingdings" w:hint="default"/>
+        <w:sz w:val="20"/>
+      </w:rPr>
+    </w:lvl>
+    <w:lvl w:ilvl="5" w:tentative="1">
+      <w:start w:val="1"/>
+      <w:numFmt w:val="bullet"/>
+      <w:lvlText w:val=""/>
+      <w:lvlJc w:val="left"/>
+      <w:pPr>
+        <w:tabs>
+          <w:tab w:val="num" w:pos="4320"/>
+        </w:tabs>
+        <w:ind w:left="4320" w:hanging="360"/>
+      </w:pPr>
+      <w:rPr>
+        <w:rFonts w:ascii="Wingdings" w:hAnsi="Wingdings" w:hint="default"/>
+        <w:sz w:val="20"/>
+      </w:rPr>
+    </w:lvl>
+    <w:lvl w:ilvl="6" w:tentative="1">
+      <w:start w:val="1"/>
+      <w:numFmt w:val="bullet"/>
+      <w:lvlText w:val=""/>
+      <w:lvlJc w:val="left"/>
+      <w:pPr>
+        <w:tabs>
+          <w:tab w:val="num" w:pos="5040"/>
+        </w:tabs>
+        <w:ind w:left="5040" w:hanging="360"/>
+      </w:pPr>
+      <w:rPr>
+        <w:rFonts w:ascii="Wingdings" w:hAnsi="Wingdings" w:hint="default"/>
+        <w:sz w:val="20"/>
+      </w:rPr>
+    </w:lvl>
+    <w:lvl w:ilvl="7" w:tentative="1">
+      <w:start w:val="1"/>
+      <w:numFmt w:val="bullet"/>
+      <w:lvlText w:val=""/>
+      <w:lvlJc w:val="left"/>
+      <w:pPr>
+        <w:tabs>
+          <w:tab w:val="num" w:pos="5760"/>
+        </w:tabs>
+        <w:ind w:left="5760" w:hanging="360"/>
+      </w:pPr>
+      <w:rPr>
+        <w:rFonts w:ascii="Wingdings" w:hAnsi="Wingdings" w:hint="default"/>
+        <w:sz w:val="20"/>
+      </w:rPr>
+    </w:lvl>
+    <w:lvl w:ilvl="8" w:tentative="1">
+      <w:start w:val="1"/>
+      <w:numFmt w:val="bullet"/>
+      <w:lvlText w:val=""/>
+      <w:lvlJc w:val="left"/>
+      <w:pPr>
+        <w:tabs>
+          <w:tab w:val="num" w:pos="6480"/>
+        </w:tabs>
+        <w:ind w:left="6480" w:hanging="360"/>
+      </w:pPr>
+      <w:rPr>
+        <w:rFonts w:ascii="Wingdings" w:hAnsi="Wingdings" w:hint="default"/>
+        <w:sz w:val="20"/>
+      </w:rPr>
+    </w:lvl>
+  </w:abstractNum>
+  <w:abstractNum w:abstractNumId="19" w15:restartNumberingAfterBreak="0">
     <w:nsid w:val="57397E8F"/>
     <w:multiLevelType w:val="multilevel"/>
     <w:tmpl w:val="93162086"/>
@@ -11233,7 +11717,7 @@
       </w:pPr>
     </w:lvl>
   </w:abstractNum>
-  <w:abstractNum w:abstractNumId="19" w15:restartNumberingAfterBreak="0">
+  <w:abstractNum w:abstractNumId="20" w15:restartNumberingAfterBreak="0">
     <w:nsid w:val="5FFB796A"/>
     <w:multiLevelType w:val="multilevel"/>
     <w:tmpl w:val="6388B4E8"/>
@@ -11346,7 +11830,7 @@
       </w:pPr>
     </w:lvl>
   </w:abstractNum>
-  <w:abstractNum w:abstractNumId="20" w15:restartNumberingAfterBreak="0">
+  <w:abstractNum w:abstractNumId="21" w15:restartNumberingAfterBreak="0">
     <w:nsid w:val="64B955EC"/>
     <w:multiLevelType w:val="hybridMultilevel"/>
     <w:tmpl w:val="950A10D8"/>
@@ -11459,7 +11943,7 @@
       </w:rPr>
     </w:lvl>
   </w:abstractNum>
-  <w:abstractNum w:abstractNumId="21" w15:restartNumberingAfterBreak="0">
+  <w:abstractNum w:abstractNumId="22" w15:restartNumberingAfterBreak="0">
     <w:nsid w:val="667677D6"/>
     <w:multiLevelType w:val="hybridMultilevel"/>
     <w:tmpl w:val="D01692D8"/>
@@ -11548,7 +12032,7 @@
       </w:pPr>
     </w:lvl>
   </w:abstractNum>
-  <w:abstractNum w:abstractNumId="22" w15:restartNumberingAfterBreak="0">
+  <w:abstractNum w:abstractNumId="23" w15:restartNumberingAfterBreak="0">
     <w:nsid w:val="688927E2"/>
     <w:multiLevelType w:val="hybridMultilevel"/>
     <w:tmpl w:val="64F8DB74"/>
@@ -11638,7 +12122,7 @@
       </w:pPr>
     </w:lvl>
   </w:abstractNum>
-  <w:abstractNum w:abstractNumId="23" w15:restartNumberingAfterBreak="0">
+  <w:abstractNum w:abstractNumId="24" w15:restartNumberingAfterBreak="0">
     <w:nsid w:val="6FD51D52"/>
     <w:multiLevelType w:val="hybridMultilevel"/>
     <w:tmpl w:val="36305470"/>
@@ -11724,7 +12208,7 @@
       </w:pPr>
     </w:lvl>
   </w:abstractNum>
-  <w:abstractNum w:abstractNumId="24" w15:restartNumberingAfterBreak="0">
+  <w:abstractNum w:abstractNumId="25" w15:restartNumberingAfterBreak="0">
     <w:nsid w:val="704E3E7F"/>
     <w:multiLevelType w:val="hybridMultilevel"/>
     <w:tmpl w:val="E34C7444"/>
@@ -11813,7 +12297,7 @@
       </w:pPr>
     </w:lvl>
   </w:abstractNum>
-  <w:abstractNum w:abstractNumId="25" w15:restartNumberingAfterBreak="0">
+  <w:abstractNum w:abstractNumId="26" w15:restartNumberingAfterBreak="0">
     <w:nsid w:val="72C71C39"/>
     <w:multiLevelType w:val="hybridMultilevel"/>
     <w:tmpl w:val="C960FD86"/>
@@ -11938,7 +12422,156 @@
       </w:rPr>
     </w:lvl>
   </w:abstractNum>
-  <w:abstractNum w:abstractNumId="26" w15:restartNumberingAfterBreak="0">
+  <w:abstractNum w:abstractNumId="27" w15:restartNumberingAfterBreak="0">
+    <w:nsid w:val="746C2223"/>
+    <w:multiLevelType w:val="multilevel"/>
+    <w:tmpl w:val="94A85F9C"/>
+    <w:lvl w:ilvl="0">
+      <w:start w:val="1"/>
+      <w:numFmt w:val="bullet"/>
+      <w:lvlText w:val=""/>
+      <w:lvlJc w:val="left"/>
+      <w:pPr>
+        <w:tabs>
+          <w:tab w:val="num" w:pos="720"/>
+        </w:tabs>
+        <w:ind w:left="720" w:hanging="360"/>
+      </w:pPr>
+      <w:rPr>
+        <w:rFonts w:ascii="Symbol" w:hAnsi="Symbol" w:hint="default"/>
+        <w:sz w:val="20"/>
+      </w:rPr>
+    </w:lvl>
+    <w:lvl w:ilvl="1" w:tentative="1">
+      <w:start w:val="1"/>
+      <w:numFmt w:val="bullet"/>
+      <w:lvlText w:val="o"/>
+      <w:lvlJc w:val="left"/>
+      <w:pPr>
+        <w:tabs>
+          <w:tab w:val="num" w:pos="1440"/>
+        </w:tabs>
+        <w:ind w:left="1440" w:hanging="360"/>
+      </w:pPr>
+      <w:rPr>
+        <w:rFonts w:ascii="Courier New" w:hAnsi="Courier New" w:hint="default"/>
+        <w:sz w:val="20"/>
+      </w:rPr>
+    </w:lvl>
+    <w:lvl w:ilvl="2" w:tentative="1">
+      <w:start w:val="1"/>
+      <w:numFmt w:val="bullet"/>
+      <w:lvlText w:val=""/>
+      <w:lvlJc w:val="left"/>
+      <w:pPr>
+        <w:tabs>
+          <w:tab w:val="num" w:pos="2160"/>
+        </w:tabs>
+        <w:ind w:left="2160" w:hanging="360"/>
+      </w:pPr>
+      <w:rPr>
+        <w:rFonts w:ascii="Wingdings" w:hAnsi="Wingdings" w:hint="default"/>
+        <w:sz w:val="20"/>
+      </w:rPr>
+    </w:lvl>
+    <w:lvl w:ilvl="3" w:tentative="1">
+      <w:start w:val="1"/>
+      <w:numFmt w:val="bullet"/>
+      <w:lvlText w:val=""/>
+      <w:lvlJc w:val="left"/>
+      <w:pPr>
+        <w:tabs>
+          <w:tab w:val="num" w:pos="2880"/>
+        </w:tabs>
+        <w:ind w:left="2880" w:hanging="360"/>
+      </w:pPr>
+      <w:rPr>
+        <w:rFonts w:ascii="Wingdings" w:hAnsi="Wingdings" w:hint="default"/>
+        <w:sz w:val="20"/>
+      </w:rPr>
+    </w:lvl>
+    <w:lvl w:ilvl="4" w:tentative="1">
+      <w:start w:val="1"/>
+      <w:numFmt w:val="bullet"/>
+      <w:lvlText w:val=""/>
+      <w:lvlJc w:val="left"/>
+      <w:pPr>
+        <w:tabs>
+          <w:tab w:val="num" w:pos="3600"/>
+        </w:tabs>
+        <w:ind w:left="3600" w:hanging="360"/>
+      </w:pPr>
+      <w:rPr>
+        <w:rFonts w:ascii="Wingdings" w:hAnsi="Wingdings" w:hint="default"/>
+        <w:sz w:val="20"/>
+      </w:rPr>
+    </w:lvl>
+    <w:lvl w:ilvl="5" w:tentative="1">
+      <w:start w:val="1"/>
+      <w:numFmt w:val="bullet"/>
+      <w:lvlText w:val=""/>
+      <w:lvlJc w:val="left"/>
+      <w:pPr>
+        <w:tabs>
+          <w:tab w:val="num" w:pos="4320"/>
+        </w:tabs>
+        <w:ind w:left="4320" w:hanging="360"/>
+      </w:pPr>
+      <w:rPr>
+        <w:rFonts w:ascii="Wingdings" w:hAnsi="Wingdings" w:hint="default"/>
+        <w:sz w:val="20"/>
+      </w:rPr>
+    </w:lvl>
+    <w:lvl w:ilvl="6" w:tentative="1">
+      <w:start w:val="1"/>
+      <w:numFmt w:val="bullet"/>
+      <w:lvlText w:val=""/>
+      <w:lvlJc w:val="left"/>
+      <w:pPr>
+        <w:tabs>
+          <w:tab w:val="num" w:pos="5040"/>
+        </w:tabs>
+        <w:ind w:left="5040" w:hanging="360"/>
+      </w:pPr>
+      <w:rPr>
+        <w:rFonts w:ascii="Wingdings" w:hAnsi="Wingdings" w:hint="default"/>
+        <w:sz w:val="20"/>
+      </w:rPr>
+    </w:lvl>
+    <w:lvl w:ilvl="7" w:tentative="1">
+      <w:start w:val="1"/>
+      <w:numFmt w:val="bullet"/>
+      <w:lvlText w:val=""/>
+      <w:lvlJc w:val="left"/>
+      <w:pPr>
+        <w:tabs>
+          <w:tab w:val="num" w:pos="5760"/>
+        </w:tabs>
+        <w:ind w:left="5760" w:hanging="360"/>
+      </w:pPr>
+      <w:rPr>
+        <w:rFonts w:ascii="Wingdings" w:hAnsi="Wingdings" w:hint="default"/>
+        <w:sz w:val="20"/>
+      </w:rPr>
+    </w:lvl>
+    <w:lvl w:ilvl="8" w:tentative="1">
+      <w:start w:val="1"/>
+      <w:numFmt w:val="bullet"/>
+      <w:lvlText w:val=""/>
+      <w:lvlJc w:val="left"/>
+      <w:pPr>
+        <w:tabs>
+          <w:tab w:val="num" w:pos="6480"/>
+        </w:tabs>
+        <w:ind w:left="6480" w:hanging="360"/>
+      </w:pPr>
+      <w:rPr>
+        <w:rFonts w:ascii="Wingdings" w:hAnsi="Wingdings" w:hint="default"/>
+        <w:sz w:val="20"/>
+      </w:rPr>
+    </w:lvl>
+  </w:abstractNum>
+  <w:abstractNum w:abstractNumId="28" w15:restartNumberingAfterBreak="0">
     <w:nsid w:val="7823322B"/>
     <w:multiLevelType w:val="hybridMultilevel"/>
     <w:tmpl w:val="A0D81BB6"/>
@@ -12082,13 +12715,13 @@
     <w:abstractNumId w:val="6"/>
   </w:num>
   <w:num w:numId="8" w16cid:durableId="893388596">
-    <w:abstractNumId w:val="24"/>
+    <w:abstractNumId w:val="25"/>
   </w:num>
   <w:num w:numId="9" w16cid:durableId="1862353387">
     <w:abstractNumId w:val="1"/>
   </w:num>
   <w:num w:numId="10" w16cid:durableId="583271442">
-    <w:abstractNumId w:val="25"/>
+    <w:abstractNumId w:val="26"/>
     <w:lvlOverride w:ilvl="0">
       <w:startOverride w:val="1"/>
     </w:lvlOverride>
@@ -12118,19 +12751,19 @@
     <w:lvlOverride w:ilvl="8"/>
   </w:num>
   <w:num w:numId="12" w16cid:durableId="1306158738">
+    <w:abstractNumId w:val="23"/>
+  </w:num>
+  <w:num w:numId="13" w16cid:durableId="1700812942">
     <w:abstractNumId w:val="22"/>
   </w:num>
-  <w:num w:numId="13" w16cid:durableId="1700812942">
-    <w:abstractNumId w:val="21"/>
-  </w:num>
   <w:num w:numId="14" w16cid:durableId="1608192642">
-    <w:abstractNumId w:val="26"/>
+    <w:abstractNumId w:val="28"/>
   </w:num>
   <w:num w:numId="15" w16cid:durableId="114762884">
     <w:abstractNumId w:val="7"/>
   </w:num>
   <w:num w:numId="16" w16cid:durableId="1418284132">
-    <w:abstractNumId w:val="23"/>
+    <w:abstractNumId w:val="24"/>
   </w:num>
   <w:num w:numId="17" w16cid:durableId="70466096">
     <w:abstractNumId w:val="3"/>
@@ -12142,10 +12775,10 @@
     <w:abstractNumId w:val="8"/>
   </w:num>
   <w:num w:numId="20" w16cid:durableId="1865823307">
-    <w:abstractNumId w:val="19"/>
+    <w:abstractNumId w:val="20"/>
   </w:num>
   <w:num w:numId="21" w16cid:durableId="2074043917">
-    <w:abstractNumId w:val="18"/>
+    <w:abstractNumId w:val="19"/>
   </w:num>
   <w:num w:numId="22" w16cid:durableId="1745374221">
     <w:abstractNumId w:val="12"/>
@@ -12172,7 +12805,7 @@
     <w:abstractNumId w:val="10"/>
   </w:num>
   <w:num w:numId="30" w16cid:durableId="1190679152">
-    <w:abstractNumId w:val="20"/>
+    <w:abstractNumId w:val="21"/>
   </w:num>
   <w:num w:numId="31" w16cid:durableId="1496416065">
     <w:abstractNumId w:val="14"/>
@@ -12190,6 +12823,15 @@
     <w:abstractNumId w:val="0"/>
   </w:num>
   <w:num w:numId="36" w16cid:durableId="964850623">
+    <w:abstractNumId w:val="0"/>
+  </w:num>
+  <w:num w:numId="37" w16cid:durableId="1148745932">
+    <w:abstractNumId w:val="18"/>
+  </w:num>
+  <w:num w:numId="38" w16cid:durableId="533734186">
+    <w:abstractNumId w:val="27"/>
+  </w:num>
+  <w:num w:numId="39" w16cid:durableId="1486244316">
     <w:abstractNumId w:val="0"/>
   </w:num>
 </w:numbering>
@@ -12589,16 +13231,16 @@
     <w:lsdException w:name="Unresolved Mention" w:semiHidden="1" w:unhideWhenUsed="1"/>
     <w:lsdException w:name="Smart Link" w:semiHidden="1" w:unhideWhenUsed="1"/>
   </w:latentStyles>
-  <w:style w:type="paragraph" w:default="1" w:styleId="Normal">
+  <w:style w:type="paragraph" w:default="1" w:styleId="a1">
     <w:name w:val="Normal"/>
     <w:qFormat/>
     <w:rsid w:val="00407799"/>
   </w:style>
-  <w:style w:type="paragraph" w:styleId="Heading1">
+  <w:style w:type="paragraph" w:styleId="1">
     <w:name w:val="heading 1"/>
-    <w:basedOn w:val="Normal"/>
-    <w:next w:val="Normal"/>
-    <w:link w:val="Heading1Char"/>
+    <w:basedOn w:val="a1"/>
+    <w:next w:val="a1"/>
+    <w:link w:val="1Char"/>
     <w:uiPriority w:val="1"/>
     <w:qFormat/>
     <w:pPr>
@@ -12617,11 +13259,11 @@
       <w:sz w:val="40"/>
     </w:rPr>
   </w:style>
-  <w:style w:type="paragraph" w:styleId="Heading2">
+  <w:style w:type="paragraph" w:styleId="20">
     <w:name w:val="heading 2"/>
-    <w:basedOn w:val="Normal"/>
-    <w:next w:val="Normal"/>
-    <w:link w:val="Heading2Char"/>
+    <w:basedOn w:val="a1"/>
+    <w:next w:val="a1"/>
+    <w:link w:val="2Char"/>
     <w:uiPriority w:val="1"/>
     <w:unhideWhenUsed/>
     <w:qFormat/>
@@ -12639,13 +13281,12 @@
       <w:sz w:val="28"/>
     </w:rPr>
   </w:style>
-  <w:style w:type="character" w:default="1" w:styleId="DefaultParagraphFont">
+  <w:style w:type="character" w:default="1" w:styleId="a2">
     <w:name w:val="Default Paragraph Font"/>
     <w:uiPriority w:val="1"/>
-    <w:semiHidden/>
     <w:unhideWhenUsed/>
   </w:style>
-  <w:style w:type="table" w:default="1" w:styleId="TableNormal">
+  <w:style w:type="table" w:default="1" w:styleId="a3">
     <w:name w:val="Normal Table"/>
     <w:uiPriority w:val="99"/>
     <w:semiHidden/>
@@ -12660,16 +13301,16 @@
       </w:tblCellMar>
     </w:tblPr>
   </w:style>
-  <w:style w:type="numbering" w:default="1" w:styleId="NoList">
+  <w:style w:type="numbering" w:default="1" w:styleId="a4">
     <w:name w:val="No List"/>
     <w:uiPriority w:val="99"/>
     <w:semiHidden/>
     <w:unhideWhenUsed/>
   </w:style>
-  <w:style w:type="paragraph" w:styleId="Footer">
+  <w:style w:type="paragraph" w:styleId="a5">
     <w:name w:val="footer"/>
-    <w:basedOn w:val="Normal"/>
-    <w:link w:val="FooterChar"/>
+    <w:basedOn w:val="a1"/>
+    <w:link w:val="Char"/>
     <w:uiPriority w:val="99"/>
     <w:unhideWhenUsed/>
     <w:qFormat/>
@@ -12681,20 +13322,20 @@
       <w:color w:val="EF4623" w:themeColor="accent1"/>
     </w:rPr>
   </w:style>
-  <w:style w:type="character" w:customStyle="1" w:styleId="FooterChar">
-    <w:name w:val="Footer Char"/>
-    <w:basedOn w:val="DefaultParagraphFont"/>
-    <w:link w:val="Footer"/>
+  <w:style w:type="character" w:customStyle="1" w:styleId="Char">
+    <w:name w:val="تذييل الصفحة Char"/>
+    <w:basedOn w:val="a2"/>
+    <w:link w:val="a5"/>
     <w:uiPriority w:val="99"/>
     <w:rPr>
       <w:color w:val="EF4623" w:themeColor="accent1"/>
     </w:rPr>
   </w:style>
-  <w:style w:type="paragraph" w:styleId="Subtitle">
+  <w:style w:type="paragraph" w:styleId="a6">
     <w:name w:val="Subtitle"/>
-    <w:basedOn w:val="Normal"/>
-    <w:next w:val="Normal"/>
-    <w:link w:val="SubtitleChar"/>
+    <w:basedOn w:val="a1"/>
+    <w:next w:val="a1"/>
+    <w:link w:val="Char0"/>
     <w:uiPriority w:val="3"/>
     <w:unhideWhenUsed/>
     <w:qFormat/>
@@ -12717,36 +13358,36 @@
   </w:style>
   <w:style w:type="paragraph" w:customStyle="1" w:styleId="Graphic">
     <w:name w:val="Graphic"/>
-    <w:basedOn w:val="Normal"/>
+    <w:basedOn w:val="a1"/>
     <w:uiPriority w:val="99"/>
     <w:pPr>
       <w:spacing w:after="80" w:line="240" w:lineRule="auto"/>
       <w:jc w:val="center"/>
     </w:pPr>
   </w:style>
-  <w:style w:type="paragraph" w:styleId="Header">
+  <w:style w:type="paragraph" w:styleId="a7">
     <w:name w:val="header"/>
-    <w:basedOn w:val="Normal"/>
-    <w:link w:val="HeaderChar"/>
+    <w:basedOn w:val="a1"/>
+    <w:link w:val="Char1"/>
     <w:uiPriority w:val="99"/>
     <w:qFormat/>
     <w:pPr>
       <w:spacing w:after="380" w:line="240" w:lineRule="auto"/>
     </w:pPr>
   </w:style>
-  <w:style w:type="character" w:customStyle="1" w:styleId="HeaderChar">
-    <w:name w:val="Header Char"/>
-    <w:basedOn w:val="DefaultParagraphFont"/>
-    <w:link w:val="Header"/>
+  <w:style w:type="character" w:customStyle="1" w:styleId="Char1">
+    <w:name w:val="رأس الصفحة Char"/>
+    <w:basedOn w:val="a2"/>
+    <w:link w:val="a7"/>
     <w:uiPriority w:val="99"/>
     <w:rPr>
       <w:color w:val="404040" w:themeColor="text1" w:themeTint="BF"/>
       <w:sz w:val="20"/>
     </w:rPr>
   </w:style>
-  <w:style w:type="table" w:styleId="TableGrid">
+  <w:style w:type="table" w:styleId="a8">
     <w:name w:val="Table Grid"/>
-    <w:basedOn w:val="TableNormal"/>
+    <w:basedOn w:val="a3"/>
     <w:uiPriority w:val="39"/>
     <w:pPr>
       <w:spacing w:before="120" w:after="120" w:line="240" w:lineRule="auto"/>
@@ -12803,7 +13444,7 @@
   </w:style>
   <w:style w:type="paragraph" w:customStyle="1" w:styleId="InfoHeading">
     <w:name w:val="Info Heading"/>
-    <w:basedOn w:val="Normal"/>
+    <w:basedOn w:val="a1"/>
     <w:uiPriority w:val="2"/>
     <w:qFormat/>
     <w:pPr>
@@ -12820,8 +13461,8 @@
   </w:style>
   <w:style w:type="paragraph" w:customStyle="1" w:styleId="Page">
     <w:name w:val="Page"/>
-    <w:basedOn w:val="Normal"/>
-    <w:next w:val="Normal"/>
+    <w:basedOn w:val="a1"/>
+    <w:next w:val="a1"/>
     <w:uiPriority w:val="99"/>
     <w:unhideWhenUsed/>
     <w:qFormat/>
@@ -12834,11 +13475,11 @@
       <w:sz w:val="36"/>
     </w:rPr>
   </w:style>
-  <w:style w:type="paragraph" w:styleId="Title">
+  <w:style w:type="paragraph" w:styleId="a9">
     <w:name w:val="Title"/>
-    <w:basedOn w:val="Normal"/>
-    <w:next w:val="Normal"/>
-    <w:link w:val="TitleChar"/>
+    <w:basedOn w:val="a1"/>
+    <w:next w:val="a1"/>
+    <w:link w:val="Char2"/>
     <w:uiPriority w:val="2"/>
     <w:qFormat/>
     <w:pPr>
@@ -12852,10 +13493,10 @@
       <w:sz w:val="200"/>
     </w:rPr>
   </w:style>
-  <w:style w:type="character" w:customStyle="1" w:styleId="TitleChar">
-    <w:name w:val="Title Char"/>
-    <w:basedOn w:val="DefaultParagraphFont"/>
-    <w:link w:val="Title"/>
+  <w:style w:type="character" w:customStyle="1" w:styleId="Char2">
+    <w:name w:val="العنوان Char"/>
+    <w:basedOn w:val="a2"/>
+    <w:link w:val="a9"/>
     <w:uiPriority w:val="2"/>
     <w:rPr>
       <w:rFonts w:asciiTheme="majorHAnsi" w:eastAsiaTheme="majorEastAsia" w:hAnsiTheme="majorHAnsi" w:cstheme="majorBidi"/>
@@ -12865,19 +13506,19 @@
       <w:sz w:val="200"/>
     </w:rPr>
   </w:style>
-  <w:style w:type="character" w:styleId="PlaceholderText">
+  <w:style w:type="character" w:styleId="aa">
     <w:name w:val="Placeholder Text"/>
-    <w:basedOn w:val="DefaultParagraphFont"/>
+    <w:basedOn w:val="a2"/>
     <w:uiPriority w:val="99"/>
     <w:semiHidden/>
     <w:rPr>
       <w:color w:val="808080"/>
     </w:rPr>
   </w:style>
-  <w:style w:type="paragraph" w:styleId="BalloonText">
+  <w:style w:type="paragraph" w:styleId="ab">
     <w:name w:val="Balloon Text"/>
-    <w:basedOn w:val="Normal"/>
-    <w:link w:val="BalloonTextChar"/>
+    <w:basedOn w:val="a1"/>
+    <w:link w:val="Char3"/>
     <w:uiPriority w:val="99"/>
     <w:semiHidden/>
     <w:unhideWhenUsed/>
@@ -12889,10 +13530,10 @@
       <w:sz w:val="16"/>
     </w:rPr>
   </w:style>
-  <w:style w:type="character" w:customStyle="1" w:styleId="BalloonTextChar">
-    <w:name w:val="Balloon Text Char"/>
-    <w:basedOn w:val="DefaultParagraphFont"/>
-    <w:link w:val="BalloonText"/>
+  <w:style w:type="character" w:customStyle="1" w:styleId="Char3">
+    <w:name w:val="نص في بالون Char"/>
+    <w:basedOn w:val="a2"/>
+    <w:link w:val="ab"/>
     <w:uiPriority w:val="99"/>
     <w:semiHidden/>
     <w:rPr>
@@ -12900,9 +13541,9 @@
       <w:sz w:val="16"/>
     </w:rPr>
   </w:style>
-  <w:style w:type="character" w:styleId="Strong">
+  <w:style w:type="character" w:styleId="ac">
     <w:name w:val="Strong"/>
-    <w:basedOn w:val="DefaultParagraphFont"/>
+    <w:basedOn w:val="a2"/>
     <w:uiPriority w:val="10"/>
     <w:qFormat/>
     <w:rPr>
@@ -12910,10 +13551,10 @@
       <w:bCs/>
     </w:rPr>
   </w:style>
-  <w:style w:type="character" w:customStyle="1" w:styleId="SubtitleChar">
-    <w:name w:val="Subtitle Char"/>
-    <w:basedOn w:val="DefaultParagraphFont"/>
-    <w:link w:val="Subtitle"/>
+  <w:style w:type="character" w:customStyle="1" w:styleId="Char0">
+    <w:name w:val="عنوان فرعي Char"/>
+    <w:basedOn w:val="a2"/>
+    <w:link w:val="a6"/>
     <w:uiPriority w:val="3"/>
     <w:rPr>
       <w:rFonts w:asciiTheme="majorHAnsi" w:eastAsiaTheme="majorEastAsia" w:hAnsiTheme="majorHAnsi" w:cstheme="majorBidi"/>
@@ -12927,7 +13568,7 @@
   </w:style>
   <w:style w:type="paragraph" w:customStyle="1" w:styleId="Abstract">
     <w:name w:val="Abstract"/>
-    <w:basedOn w:val="Normal"/>
+    <w:basedOn w:val="a1"/>
     <w:uiPriority w:val="3"/>
     <w:qFormat/>
     <w:pPr>
@@ -12941,9 +13582,9 @@
       <w:sz w:val="28"/>
     </w:rPr>
   </w:style>
-  <w:style w:type="paragraph" w:styleId="NoSpacing">
+  <w:style w:type="paragraph" w:styleId="ad">
     <w:name w:val="No Spacing"/>
-    <w:link w:val="NoSpacingChar"/>
+    <w:link w:val="Char4"/>
     <w:uiPriority w:val="1"/>
     <w:unhideWhenUsed/>
     <w:qFormat/>
@@ -12953,7 +13594,7 @@
   </w:style>
   <w:style w:type="character" w:styleId="Hyperlink">
     <w:name w:val="Hyperlink"/>
-    <w:basedOn w:val="DefaultParagraphFont"/>
+    <w:basedOn w:val="a2"/>
     <w:uiPriority w:val="99"/>
     <w:unhideWhenUsed/>
     <w:rPr>
@@ -12961,10 +13602,10 @@
       <w:u w:val="single"/>
     </w:rPr>
   </w:style>
-  <w:style w:type="paragraph" w:styleId="TOC1">
+  <w:style w:type="paragraph" w:styleId="10">
     <w:name w:val="toc 1"/>
-    <w:basedOn w:val="Normal"/>
-    <w:next w:val="Normal"/>
+    <w:basedOn w:val="a1"/>
+    <w:next w:val="a1"/>
     <w:autoRedefine/>
     <w:uiPriority w:val="39"/>
     <w:unhideWhenUsed/>
@@ -12979,10 +13620,10 @@
       <w:kern w:val="20"/>
     </w:rPr>
   </w:style>
-  <w:style w:type="character" w:customStyle="1" w:styleId="Heading1Char">
-    <w:name w:val="Heading 1 Char"/>
-    <w:basedOn w:val="DefaultParagraphFont"/>
-    <w:link w:val="Heading1"/>
+  <w:style w:type="character" w:customStyle="1" w:styleId="1Char">
+    <w:name w:val="العنوان 1 Char"/>
+    <w:basedOn w:val="a2"/>
+    <w:link w:val="1"/>
     <w:uiPriority w:val="1"/>
     <w:rPr>
       <w:rFonts w:asciiTheme="majorHAnsi" w:eastAsiaTheme="majorEastAsia" w:hAnsiTheme="majorHAnsi" w:cstheme="majorBidi"/>
@@ -12992,10 +13633,10 @@
       <w:sz w:val="40"/>
     </w:rPr>
   </w:style>
-  <w:style w:type="paragraph" w:styleId="TOCHeading">
+  <w:style w:type="paragraph" w:styleId="ae">
     <w:name w:val="TOC Heading"/>
-    <w:basedOn w:val="Heading1"/>
-    <w:next w:val="Normal"/>
+    <w:basedOn w:val="1"/>
+    <w:next w:val="a1"/>
     <w:uiPriority w:val="39"/>
     <w:unhideWhenUsed/>
     <w:qFormat/>
@@ -13012,10 +13653,10 @@
       <w:sz w:val="44"/>
     </w:rPr>
   </w:style>
-  <w:style w:type="character" w:customStyle="1" w:styleId="Heading2Char">
-    <w:name w:val="Heading 2 Char"/>
-    <w:basedOn w:val="DefaultParagraphFont"/>
-    <w:link w:val="Heading2"/>
+  <w:style w:type="character" w:customStyle="1" w:styleId="2Char">
+    <w:name w:val="عنوان 2 Char"/>
+    <w:basedOn w:val="a2"/>
+    <w:link w:val="20"/>
     <w:uiPriority w:val="1"/>
     <w:rPr>
       <w:rFonts w:asciiTheme="majorHAnsi" w:eastAsiaTheme="majorEastAsia" w:hAnsiTheme="majorHAnsi" w:cstheme="majorBidi"/>
@@ -13025,11 +13666,11 @@
       <w:sz w:val="28"/>
     </w:rPr>
   </w:style>
-  <w:style w:type="paragraph" w:styleId="Quote">
+  <w:style w:type="paragraph" w:styleId="af">
     <w:name w:val="Quote"/>
-    <w:basedOn w:val="Normal"/>
-    <w:next w:val="Normal"/>
-    <w:link w:val="QuoteChar"/>
+    <w:basedOn w:val="a1"/>
+    <w:next w:val="a1"/>
+    <w:link w:val="Char5"/>
     <w:uiPriority w:val="1"/>
     <w:unhideWhenUsed/>
     <w:qFormat/>
@@ -13044,10 +13685,10 @@
       <w:sz w:val="24"/>
     </w:rPr>
   </w:style>
-  <w:style w:type="character" w:customStyle="1" w:styleId="QuoteChar">
-    <w:name w:val="Quote Char"/>
-    <w:basedOn w:val="DefaultParagraphFont"/>
-    <w:link w:val="Quote"/>
+  <w:style w:type="character" w:customStyle="1" w:styleId="Char5">
+    <w:name w:val="اقتباس Char"/>
+    <w:basedOn w:val="a2"/>
+    <w:link w:val="af"/>
     <w:uiPriority w:val="1"/>
     <w:rPr>
       <w:i/>
@@ -13057,10 +13698,10 @@
       <w:sz w:val="24"/>
     </w:rPr>
   </w:style>
-  <w:style w:type="paragraph" w:styleId="Signature">
+  <w:style w:type="paragraph" w:styleId="af0">
     <w:name w:val="Signature"/>
-    <w:basedOn w:val="Normal"/>
-    <w:link w:val="SignatureChar"/>
+    <w:basedOn w:val="a1"/>
+    <w:link w:val="Char6"/>
     <w:uiPriority w:val="9"/>
     <w:unhideWhenUsed/>
     <w:qFormat/>
@@ -13073,25 +13714,25 @@
       <w:kern w:val="20"/>
     </w:rPr>
   </w:style>
-  <w:style w:type="character" w:customStyle="1" w:styleId="SignatureChar">
-    <w:name w:val="Signature Char"/>
-    <w:basedOn w:val="DefaultParagraphFont"/>
-    <w:link w:val="Signature"/>
+  <w:style w:type="character" w:customStyle="1" w:styleId="Char6">
+    <w:name w:val="توقيع Char"/>
+    <w:basedOn w:val="a2"/>
+    <w:link w:val="af0"/>
     <w:uiPriority w:val="9"/>
     <w:rPr>
       <w:color w:val="595959" w:themeColor="text1" w:themeTint="A6"/>
       <w:kern w:val="20"/>
     </w:rPr>
   </w:style>
-  <w:style w:type="character" w:customStyle="1" w:styleId="NoSpacingChar">
-    <w:name w:val="No Spacing Char"/>
-    <w:basedOn w:val="DefaultParagraphFont"/>
-    <w:link w:val="NoSpacing"/>
+  <w:style w:type="character" w:customStyle="1" w:styleId="Char4">
+    <w:name w:val="بلا تباعد Char"/>
+    <w:basedOn w:val="a2"/>
+    <w:link w:val="ad"/>
     <w:uiPriority w:val="1"/>
   </w:style>
-  <w:style w:type="paragraph" w:styleId="ListBullet">
+  <w:style w:type="paragraph" w:styleId="a">
     <w:name w:val="List Bullet"/>
-    <w:basedOn w:val="Normal"/>
+    <w:basedOn w:val="a1"/>
     <w:uiPriority w:val="99"/>
     <w:unhideWhenUsed/>
     <w:qFormat/>
@@ -13106,9 +13747,9 @@
       <w:kern w:val="20"/>
     </w:rPr>
   </w:style>
-  <w:style w:type="paragraph" w:styleId="ListNumber">
+  <w:style w:type="paragraph" w:styleId="a0">
     <w:name w:val="List Number"/>
-    <w:basedOn w:val="Normal"/>
+    <w:basedOn w:val="a1"/>
     <w:uiPriority w:val="1"/>
     <w:unhideWhenUsed/>
     <w:qFormat/>
@@ -13124,9 +13765,9 @@
       <w:kern w:val="20"/>
     </w:rPr>
   </w:style>
-  <w:style w:type="paragraph" w:styleId="ListNumber2">
+  <w:style w:type="paragraph" w:styleId="2">
     <w:name w:val="List Number 2"/>
-    <w:basedOn w:val="Normal"/>
+    <w:basedOn w:val="a1"/>
     <w:uiPriority w:val="1"/>
     <w:unhideWhenUsed/>
     <w:qFormat/>
@@ -13143,9 +13784,9 @@
       <w:kern w:val="20"/>
     </w:rPr>
   </w:style>
-  <w:style w:type="paragraph" w:styleId="ListNumber3">
+  <w:style w:type="paragraph" w:styleId="3">
     <w:name w:val="List Number 3"/>
-    <w:basedOn w:val="Normal"/>
+    <w:basedOn w:val="a1"/>
     <w:uiPriority w:val="18"/>
     <w:unhideWhenUsed/>
     <w:pPr>
@@ -13161,9 +13802,9 @@
       <w:kern w:val="20"/>
     </w:rPr>
   </w:style>
-  <w:style w:type="paragraph" w:styleId="ListNumber4">
+  <w:style w:type="paragraph" w:styleId="4">
     <w:name w:val="List Number 4"/>
-    <w:basedOn w:val="Normal"/>
+    <w:basedOn w:val="a1"/>
     <w:uiPriority w:val="18"/>
     <w:unhideWhenUsed/>
     <w:pPr>
@@ -13179,9 +13820,9 @@
       <w:kern w:val="20"/>
     </w:rPr>
   </w:style>
-  <w:style w:type="paragraph" w:styleId="ListNumber5">
+  <w:style w:type="paragraph" w:styleId="5">
     <w:name w:val="List Number 5"/>
-    <w:basedOn w:val="Normal"/>
+    <w:basedOn w:val="a1"/>
     <w:uiPriority w:val="18"/>
     <w:unhideWhenUsed/>
     <w:pPr>
@@ -13199,7 +13840,7 @@
   </w:style>
   <w:style w:type="table" w:customStyle="1" w:styleId="FinancialTable">
     <w:name w:val="Financial Table"/>
-    <w:basedOn w:val="TableNormal"/>
+    <w:basedOn w:val="a3"/>
     <w:uiPriority w:val="99"/>
     <w:pPr>
       <w:spacing w:before="60" w:after="60" w:line="240" w:lineRule="auto"/>
@@ -13241,9 +13882,9 @@
       </w:rPr>
     </w:tblStylePr>
   </w:style>
-  <w:style w:type="character" w:styleId="CommentReference">
+  <w:style w:type="character" w:styleId="af1">
     <w:name w:val="annotation reference"/>
-    <w:basedOn w:val="DefaultParagraphFont"/>
+    <w:basedOn w:val="a2"/>
     <w:uiPriority w:val="99"/>
     <w:semiHidden/>
     <w:unhideWhenUsed/>
@@ -13251,27 +13892,27 @@
       <w:sz w:val="16"/>
     </w:rPr>
   </w:style>
-  <w:style w:type="paragraph" w:styleId="CommentText">
+  <w:style w:type="paragraph" w:styleId="af2">
     <w:name w:val="annotation text"/>
-    <w:basedOn w:val="Normal"/>
-    <w:link w:val="CommentTextChar"/>
+    <w:basedOn w:val="a1"/>
+    <w:link w:val="Char7"/>
     <w:uiPriority w:val="99"/>
     <w:unhideWhenUsed/>
     <w:pPr>
       <w:spacing w:line="240" w:lineRule="auto"/>
     </w:pPr>
   </w:style>
-  <w:style w:type="character" w:customStyle="1" w:styleId="CommentTextChar">
-    <w:name w:val="Comment Text Char"/>
-    <w:basedOn w:val="DefaultParagraphFont"/>
-    <w:link w:val="CommentText"/>
+  <w:style w:type="character" w:customStyle="1" w:styleId="Char7">
+    <w:name w:val="نص تعليق Char"/>
+    <w:basedOn w:val="a2"/>
+    <w:link w:val="af2"/>
     <w:uiPriority w:val="99"/>
   </w:style>
-  <w:style w:type="paragraph" w:styleId="CommentSubject">
+  <w:style w:type="paragraph" w:styleId="af3">
     <w:name w:val="annotation subject"/>
-    <w:basedOn w:val="CommentText"/>
-    <w:next w:val="CommentText"/>
-    <w:link w:val="CommentSubjectChar"/>
+    <w:basedOn w:val="af2"/>
+    <w:next w:val="af2"/>
+    <w:link w:val="Char8"/>
     <w:uiPriority w:val="99"/>
     <w:semiHidden/>
     <w:unhideWhenUsed/>
@@ -13280,10 +13921,10 @@
       <w:bCs/>
     </w:rPr>
   </w:style>
-  <w:style w:type="character" w:customStyle="1" w:styleId="CommentSubjectChar">
-    <w:name w:val="Comment Subject Char"/>
-    <w:basedOn w:val="CommentTextChar"/>
-    <w:link w:val="CommentSubject"/>
+  <w:style w:type="character" w:customStyle="1" w:styleId="Char8">
+    <w:name w:val="موضوع تعليق Char"/>
+    <w:basedOn w:val="Char7"/>
+    <w:link w:val="af3"/>
     <w:uiPriority w:val="99"/>
     <w:semiHidden/>
     <w:rPr>
@@ -13291,9 +13932,9 @@
       <w:bCs/>
     </w:rPr>
   </w:style>
-  <w:style w:type="table" w:styleId="LightShading">
+  <w:style w:type="table" w:styleId="af4">
     <w:name w:val="Light Shading"/>
-    <w:basedOn w:val="TableNormal"/>
+    <w:basedOn w:val="a3"/>
     <w:uiPriority w:val="60"/>
     <w:pPr>
       <w:spacing w:after="0" w:line="240" w:lineRule="auto"/>
@@ -13388,7 +14029,7 @@
   </w:style>
   <w:style w:type="paragraph" w:customStyle="1" w:styleId="TableTextDecimal">
     <w:name w:val="Table Text Decimal"/>
-    <w:basedOn w:val="Normal"/>
+    <w:basedOn w:val="a1"/>
     <w:uiPriority w:val="1"/>
     <w:qFormat/>
     <w:pPr>
@@ -13400,7 +14041,7 @@
   </w:style>
   <w:style w:type="paragraph" w:customStyle="1" w:styleId="TableText">
     <w:name w:val="Table Text"/>
-    <w:basedOn w:val="Normal"/>
+    <w:basedOn w:val="a1"/>
     <w:uiPriority w:val="1"/>
     <w:qFormat/>
     <w:pPr>
@@ -13409,7 +14050,7 @@
   </w:style>
   <w:style w:type="paragraph" w:customStyle="1" w:styleId="Organization">
     <w:name w:val="Organization"/>
-    <w:basedOn w:val="Normal"/>
+    <w:basedOn w:val="a1"/>
     <w:uiPriority w:val="2"/>
     <w:qFormat/>
     <w:pPr>
@@ -13423,9 +14064,9 @@
       <w:sz w:val="36"/>
     </w:rPr>
   </w:style>
-  <w:style w:type="paragraph" w:styleId="ListParagraph">
+  <w:style w:type="paragraph" w:styleId="af5">
     <w:name w:val="List Paragraph"/>
-    <w:basedOn w:val="Normal"/>
+    <w:basedOn w:val="a1"/>
     <w:uiPriority w:val="34"/>
     <w:qFormat/>
     <w:rsid w:val="001B698D"/>
@@ -13434,9 +14075,9 @@
       <w:contextualSpacing/>
     </w:pPr>
   </w:style>
-  <w:style w:type="paragraph" w:styleId="NormalWeb">
+  <w:style w:type="paragraph" w:styleId="af6">
     <w:name w:val="Normal (Web)"/>
-    <w:basedOn w:val="Normal"/>
+    <w:basedOn w:val="a1"/>
     <w:uiPriority w:val="99"/>
     <w:unhideWhenUsed/>
     <w:rsid w:val="00852E5F"/>
@@ -13453,7 +14094,7 @@
   </w:style>
   <w:style w:type="character" w:styleId="HTMLCode">
     <w:name w:val="HTML Code"/>
-    <w:basedOn w:val="DefaultParagraphFont"/>
+    <w:basedOn w:val="a2"/>
     <w:uiPriority w:val="99"/>
     <w:semiHidden/>
     <w:unhideWhenUsed/>
@@ -13466,17 +14107,17 @@
   </w:style>
   <w:style w:type="character" w:customStyle="1" w:styleId="8">
     <w:name w:val="ͼ8"/>
-    <w:basedOn w:val="DefaultParagraphFont"/>
+    <w:basedOn w:val="a2"/>
     <w:rsid w:val="00A442D9"/>
   </w:style>
   <w:style w:type="character" w:customStyle="1" w:styleId="b">
     <w:name w:val="ͼb"/>
-    <w:basedOn w:val="DefaultParagraphFont"/>
+    <w:basedOn w:val="a2"/>
     <w:rsid w:val="00A442D9"/>
   </w:style>
   <w:style w:type="paragraph" w:customStyle="1" w:styleId="font-claude-response-body">
     <w:name w:val="font-claude-response-body"/>
-    <w:basedOn w:val="Normal"/>
+    <w:basedOn w:val="a1"/>
     <w:rsid w:val="00EC2668"/>
     <w:pPr>
       <w:spacing w:before="100" w:beforeAutospacing="1" w:after="100" w:afterAutospacing="1" w:line="240" w:lineRule="auto"/>
@@ -13493,7 +14134,7 @@
 </file>
 
 <file path=word/glossary/document.xml><?xml version="1.0" encoding="utf-8"?>
-<w:glossaryDocument xmlns:wpc="http://schemas.microsoft.com/office/word/2010/wordprocessingCanvas" xmlns:cx="http://schemas.microsoft.com/office/drawing/2014/chartex" xmlns:cx1="http://schemas.microsoft.com/office/drawing/2015/9/8/chartex" xmlns:cx2="http://schemas.microsoft.com/office/drawing/2015/10/21/chartex" xmlns:cx3="http://schemas.microsoft.com/office/drawing/2016/5/9/chartex" xmlns:cx4="http://schemas.microsoft.com/office/drawing/2016/5/10/chartex" xmlns:cx5="http://schemas.microsoft.com/office/drawing/2016/5/11/chartex" xmlns:cx6="http://schemas.microsoft.com/office/drawing/2016/5/12/chartex" xmlns:cx7="http://schemas.microsoft.com/office/drawing/2016/5/13/chartex" xmlns:cx8="http://schemas.microsoft.com/office/drawing/2016/5/14/chartex" xmlns:mc="http://schemas.openxmlformats.org/markup-compatibility/2006" xmlns:aink="http://schemas.microsoft.com/office/drawing/2016/ink" xmlns:am3d="http://schemas.microsoft.com/office/drawing/2017/model3d" xmlns:o="urn:schemas-microsoft-com:office:office" xmlns:oel="http://schemas.microsoft.com/office/2019/extlst" xmlns:r="http://schemas.openxmlformats.org/officeDocument/2006/relationships" xmlns:m="http://schemas.openxmlformats.org/officeDocument/2006/math" xmlns:v="urn:schemas-microsoft-com:vml" xmlns:wp14="http://schemas.microsoft.com/office/word/2010/wordprocessingDrawing" xmlns:wp="http://schemas.openxmlformats.org/drawingml/2006/wordprocessingDrawing" xmlns:w10="urn:schemas-microsoft-com:office:word" xmlns:w="http://schemas.openxmlformats.org/wordprocessingml/2006/main" xmlns:w14="http://schemas.microsoft.com/office/word/2010/wordml" xmlns:w15="http://schemas.microsoft.com/office/word/2012/wordml" xmlns:w16cex="http://schemas.microsoft.com/office/word/2018/wordml/cex" xmlns:w16cid="http://schemas.microsoft.com/office/word/2016/wordml/cid" xmlns:w16="http://schemas.microsoft.com/office/word/2018/wordml" xmlns:w16du="http://schemas.microsoft.com/office/word/2023/wordml/word16du" xmlns:w16sdtdh="http://schemas.microsoft.com/office/word/2020/wordml/sdtdatahash" xmlns:w16sdtfl="http://schemas.microsoft.com/office/word/2024/wordml/sdtformatlock" xmlns:w16se="http://schemas.microsoft.com/office/word/2015/wordml/symex" xmlns:wpg="http://schemas.microsoft.com/office/word/2010/wordprocessingGroup" xmlns:wpi="http://schemas.microsoft.com/office/word/2010/wordprocessingInk" xmlns:wne="http://schemas.microsoft.com/office/word/2006/wordml" xmlns:wps="http://schemas.microsoft.com/office/word/2010/wordprocessingShape" mc:Ignorable="w14 w15 w16se w16cid w16 w16cex w16sdtdh w16sdtfl w16du wp14">
+<w:glossaryDocument xmlns:wpc="http://schemas.microsoft.com/office/word/2010/wordprocessingCanvas" xmlns:cx="http://schemas.microsoft.com/office/drawing/2014/chartex" xmlns:cx1="http://schemas.microsoft.com/office/drawing/2015/9/8/chartex" xmlns:cx2="http://schemas.microsoft.com/office/drawing/2015/10/21/chartex" xmlns:cx3="http://schemas.microsoft.com/office/drawing/2016/5/9/chartex" xmlns:cx4="http://schemas.microsoft.com/office/drawing/2016/5/10/chartex" xmlns:cx5="http://schemas.microsoft.com/office/drawing/2016/5/11/chartex" xmlns:cx6="http://schemas.microsoft.com/office/drawing/2016/5/12/chartex" xmlns:cx7="http://schemas.microsoft.com/office/drawing/2016/5/13/chartex" xmlns:cx8="http://schemas.microsoft.com/office/drawing/2016/5/14/chartex" xmlns:mc="http://schemas.openxmlformats.org/markup-compatibility/2006" xmlns:aink="http://schemas.microsoft.com/office/drawing/2016/ink" xmlns:am3d="http://schemas.microsoft.com/office/drawing/2017/model3d" xmlns:o="urn:schemas-microsoft-com:office:office" xmlns:oel="http://schemas.microsoft.com/office/2019/extlst" xmlns:r="http://schemas.openxmlformats.org/officeDocument/2006/relationships" xmlns:m="http://schemas.openxmlformats.org/officeDocument/2006/math" xmlns:v="urn:schemas-microsoft-com:vml" xmlns:wp14="http://schemas.microsoft.com/office/word/2010/wordprocessingDrawing" xmlns:wp="http://schemas.openxmlformats.org/drawingml/2006/wordprocessingDrawing" xmlns:w10="urn:schemas-microsoft-com:office:word" xmlns:w="http://schemas.openxmlformats.org/wordprocessingml/2006/main" xmlns:w14="http://schemas.microsoft.com/office/word/2010/wordml" xmlns:w15="http://schemas.microsoft.com/office/word/2012/wordml" xmlns:w16cei="http://schemas.microsoft.com/office/word/2026/wordml/cei" xmlns:w16cex="http://schemas.microsoft.com/office/word/2018/wordml/cex" xmlns:w16cid="http://schemas.microsoft.com/office/word/2016/wordml/cid" xmlns:w16="http://schemas.microsoft.com/office/word/2018/wordml" xmlns:w16du="http://schemas.microsoft.com/office/word/2023/wordml/word16du" xmlns:w16sdtdh="http://schemas.microsoft.com/office/word/2020/wordml/sdtdatahash" xmlns:w16sdtfl="http://schemas.microsoft.com/office/word/2024/wordml/sdtformatlock" xmlns:w16se="http://schemas.microsoft.com/office/word/2015/wordml/symex" xmlns:wpg="http://schemas.microsoft.com/office/word/2010/wordprocessingGroup" xmlns:wpi="http://schemas.microsoft.com/office/word/2010/wordprocessingInk" xmlns:wne="http://schemas.microsoft.com/office/word/2006/wordml" xmlns:wps="http://schemas.microsoft.com/office/word/2010/wordprocessingShape" mc:Ignorable="w14 w15 w16se w16cid w16 w16cex w16sdtdh w16sdtfl w16du wp14">
   <w:docParts>
     <w:docPart>
       <w:docPartPr>
@@ -13665,7 +14306,7 @@
 </file>
 
 <file path=word/glossary/numbering.xml><?xml version="1.0" encoding="utf-8"?>
-<w:numbering xmlns:wpc="http://schemas.microsoft.com/office/word/2010/wordprocessingCanvas" xmlns:cx="http://schemas.microsoft.com/office/drawing/2014/chartex" xmlns:cx1="http://schemas.microsoft.com/office/drawing/2015/9/8/chartex" xmlns:cx2="http://schemas.microsoft.com/office/drawing/2015/10/21/chartex" xmlns:cx3="http://schemas.microsoft.com/office/drawing/2016/5/9/chartex" xmlns:cx4="http://schemas.microsoft.com/office/drawing/2016/5/10/chartex" xmlns:cx5="http://schemas.microsoft.com/office/drawing/2016/5/11/chartex" xmlns:cx6="http://schemas.microsoft.com/office/drawing/2016/5/12/chartex" xmlns:cx7="http://schemas.microsoft.com/office/drawing/2016/5/13/chartex" xmlns:cx8="http://schemas.microsoft.com/office/drawing/2016/5/14/chartex" xmlns:mc="http://schemas.openxmlformats.org/markup-compatibility/2006" xmlns:aink="http://schemas.microsoft.com/office/drawing/2016/ink" xmlns:am3d="http://schemas.microsoft.com/office/drawing/2017/model3d" xmlns:o="urn:schemas-microsoft-com:office:office" xmlns:oel="http://schemas.microsoft.com/office/2019/extlst" xmlns:r="http://schemas.openxmlformats.org/officeDocument/2006/relationships" xmlns:m="http://schemas.openxmlformats.org/officeDocument/2006/math" xmlns:v="urn:schemas-microsoft-com:vml" xmlns:wp14="http://schemas.microsoft.com/office/word/2010/wordprocessingDrawing" xmlns:wp="http://schemas.openxmlformats.org/drawingml/2006/wordprocessingDrawing" xmlns:w10="urn:schemas-microsoft-com:office:word" xmlns:w="http://schemas.openxmlformats.org/wordprocessingml/2006/main" xmlns:w14="http://schemas.microsoft.com/office/word/2010/wordml" xmlns:w15="http://schemas.microsoft.com/office/word/2012/wordml" xmlns:w16cex="http://schemas.microsoft.com/office/word/2018/wordml/cex" xmlns:w16cid="http://schemas.microsoft.com/office/word/2016/wordml/cid" xmlns:w16="http://schemas.microsoft.com/office/word/2018/wordml" xmlns:w16du="http://schemas.microsoft.com/office/word/2023/wordml/word16du" xmlns:w16sdtdh="http://schemas.microsoft.com/office/word/2020/wordml/sdtdatahash" xmlns:w16sdtfl="http://schemas.microsoft.com/office/word/2024/wordml/sdtformatlock" xmlns:w16se="http://schemas.microsoft.com/office/word/2015/wordml/symex" xmlns:wpg="http://schemas.microsoft.com/office/word/2010/wordprocessingGroup" xmlns:wpi="http://schemas.microsoft.com/office/word/2010/wordprocessingInk" xmlns:wne="http://schemas.microsoft.com/office/word/2006/wordml" xmlns:wps="http://schemas.microsoft.com/office/word/2010/wordprocessingShape" mc:Ignorable="w14 w15 w16se w16cid w16 w16cex w16sdtdh w16sdtfl w16du wp14">
+<w:numbering xmlns:wpc="http://schemas.microsoft.com/office/word/2010/wordprocessingCanvas" xmlns:cx="http://schemas.microsoft.com/office/drawing/2014/chartex" xmlns:cx1="http://schemas.microsoft.com/office/drawing/2015/9/8/chartex" xmlns:cx2="http://schemas.microsoft.com/office/drawing/2015/10/21/chartex" xmlns:cx3="http://schemas.microsoft.com/office/drawing/2016/5/9/chartex" xmlns:cx4="http://schemas.microsoft.com/office/drawing/2016/5/10/chartex" xmlns:cx5="http://schemas.microsoft.com/office/drawing/2016/5/11/chartex" xmlns:cx6="http://schemas.microsoft.com/office/drawing/2016/5/12/chartex" xmlns:cx7="http://schemas.microsoft.com/office/drawing/2016/5/13/chartex" xmlns:cx8="http://schemas.microsoft.com/office/drawing/2016/5/14/chartex" xmlns:mc="http://schemas.openxmlformats.org/markup-compatibility/2006" xmlns:aink="http://schemas.microsoft.com/office/drawing/2016/ink" xmlns:am3d="http://schemas.microsoft.com/office/drawing/2017/model3d" xmlns:o="urn:schemas-microsoft-com:office:office" xmlns:oel="http://schemas.microsoft.com/office/2019/extlst" xmlns:r="http://schemas.openxmlformats.org/officeDocument/2006/relationships" xmlns:m="http://schemas.openxmlformats.org/officeDocument/2006/math" xmlns:v="urn:schemas-microsoft-com:vml" xmlns:wp14="http://schemas.microsoft.com/office/word/2010/wordprocessingDrawing" xmlns:wp="http://schemas.openxmlformats.org/drawingml/2006/wordprocessingDrawing" xmlns:w10="urn:schemas-microsoft-com:office:word" xmlns:w="http://schemas.openxmlformats.org/wordprocessingml/2006/main" xmlns:w14="http://schemas.microsoft.com/office/word/2010/wordml" xmlns:w15="http://schemas.microsoft.com/office/word/2012/wordml" xmlns:w16cei="http://schemas.microsoft.com/office/word/2026/wordml/cei" xmlns:w16cex="http://schemas.microsoft.com/office/word/2018/wordml/cex" xmlns:w16cid="http://schemas.microsoft.com/office/word/2016/wordml/cid" xmlns:w16="http://schemas.microsoft.com/office/word/2018/wordml" xmlns:w16du="http://schemas.microsoft.com/office/word/2023/wordml/word16du" xmlns:w16sdtdh="http://schemas.microsoft.com/office/word/2020/wordml/sdtdatahash" xmlns:w16sdtfl="http://schemas.microsoft.com/office/word/2024/wordml/sdtformatlock" xmlns:w16se="http://schemas.microsoft.com/office/word/2015/wordml/symex" xmlns:wpg="http://schemas.microsoft.com/office/word/2010/wordprocessingGroup" xmlns:wpi="http://schemas.microsoft.com/office/word/2010/wordprocessingInk" xmlns:wne="http://schemas.microsoft.com/office/word/2006/wordml" xmlns:wps="http://schemas.microsoft.com/office/word/2010/wordprocessingShape" mc:Ignorable="w14 w15 w16se w16cid w16 w16cex w16sdtdh w16sdtfl w16du wp14">
   <w:abstractNum w:abstractNumId="0" w15:restartNumberingAfterBreak="0">
     <w:nsid w:val="FFFFFF89"/>
     <w:multiLevelType w:val="singleLevel"/>
@@ -13673,7 +14314,7 @@
     <w:lvl w:ilvl="0">
       <w:start w:val="1"/>
       <w:numFmt w:val="bullet"/>
-      <w:pStyle w:val="ListBullet"/>
+      <w:pStyle w:val="a"/>
       <w:lvlText w:val="•"/>
       <w:lvlJc w:val="left"/>
       <w:pPr>
@@ -13751,6 +14392,7 @@
     <w:rsid w:val="00A90B6D"/>
     <w:rsid w:val="00AC3A9C"/>
     <w:rsid w:val="00AC55E9"/>
+    <w:rsid w:val="00AD4E19"/>
     <w:rsid w:val="00AD54E3"/>
     <w:rsid w:val="00B023C2"/>
     <w:rsid w:val="00B1289C"/>
@@ -13775,6 +14417,7 @@
     <w:rsid w:val="00E552F8"/>
     <w:rsid w:val="00E70F80"/>
     <w:rsid w:val="00E9596B"/>
+    <w:rsid w:val="00EE1DAE"/>
     <w:rsid w:val="00F17A05"/>
     <w:rsid w:val="00F64854"/>
     <w:rsid w:val="00F8158D"/>
@@ -13797,7 +14440,7 @@
   <w:themeFontLang w:val="en-GB" w:eastAsia="ja-JP" w:bidi="ar-SA"/>
   <w:clrSchemeMapping w:bg1="light1" w:t1="dark1" w:bg2="light2" w:t2="dark2" w:accent1="accent1" w:accent2="accent2" w:accent3="accent3" w:accent4="accent4" w:accent5="accent5" w:accent6="accent6" w:hyperlink="hyperlink" w:followedHyperlink="followedHyperlink"/>
   <w:decimalSymbol w:val="."/>
-  <w:listSeparator w:val=";"/>
+  <w:listSeparator w:val=","/>
   <w15:chartTrackingRefBased/>
 </w:settings>
 </file>
@@ -14197,17 +14840,17 @@
     <w:lsdException w:name="Unresolved Mention" w:semiHidden="1" w:unhideWhenUsed="1"/>
     <w:lsdException w:name="Smart Link" w:semiHidden="1" w:unhideWhenUsed="1"/>
   </w:latentStyles>
-  <w:style w:type="paragraph" w:default="1" w:styleId="Normal">
+  <w:style w:type="paragraph" w:default="1" w:styleId="a0">
     <w:name w:val="Normal"/>
     <w:qFormat/>
   </w:style>
-  <w:style w:type="character" w:default="1" w:styleId="DefaultParagraphFont">
+  <w:style w:type="character" w:default="1" w:styleId="a1">
     <w:name w:val="Default Paragraph Font"/>
     <w:uiPriority w:val="1"/>
     <w:semiHidden/>
     <w:unhideWhenUsed/>
   </w:style>
-  <w:style w:type="table" w:default="1" w:styleId="TableNormal">
+  <w:style w:type="table" w:default="1" w:styleId="a2">
     <w:name w:val="Normal Table"/>
     <w:uiPriority w:val="99"/>
     <w:semiHidden/>
@@ -14222,15 +14865,15 @@
       </w:tblCellMar>
     </w:tblPr>
   </w:style>
-  <w:style w:type="numbering" w:default="1" w:styleId="NoList">
+  <w:style w:type="numbering" w:default="1" w:styleId="a3">
     <w:name w:val="No List"/>
     <w:uiPriority w:val="99"/>
     <w:semiHidden/>
     <w:unhideWhenUsed/>
   </w:style>
-  <w:style w:type="paragraph" w:styleId="ListBullet">
+  <w:style w:type="paragraph" w:styleId="a">
     <w:name w:val="List Bullet"/>
-    <w:basedOn w:val="Normal"/>
+    <w:basedOn w:val="a0"/>
     <w:uiPriority w:val="1"/>
     <w:unhideWhenUsed/>
     <w:qFormat/>
@@ -14247,9 +14890,9 @@
       <w:lang w:val="en-US" w:eastAsia="en-US"/>
     </w:rPr>
   </w:style>
-  <w:style w:type="character" w:styleId="Strong">
+  <w:style w:type="character" w:styleId="a4">
     <w:name w:val="Strong"/>
-    <w:basedOn w:val="DefaultParagraphFont"/>
+    <w:basedOn w:val="a1"/>
     <w:uiPriority w:val="10"/>
     <w:qFormat/>
     <w:rPr>
@@ -14604,16 +15247,16 @@
 </file>
 
 <file path=customXml/item2.xml><?xml version="1.0" encoding="utf-8"?>
-<b:Sources xmlns:b="http://schemas.openxmlformats.org/officeDocument/2006/bibliography" SelectedStyle="\APA.XSL" StyleName="APA"/>
-</file>
-
-<file path=customXml/item3.xml><?xml version="1.0" encoding="utf-8"?>
 <?mso-contentType ?>
 <FormTemplates xmlns="http://schemas.microsoft.com/sharepoint/v3/contenttype/forms">
   <Display>DocumentLibraryForm</Display>
   <Edit>AssetEditForm</Edit>
   <New>DocumentLibraryForm</New>
 </FormTemplates>
+</file>
+
+<file path=customXml/item3.xml><?xml version="1.0" encoding="utf-8"?>
+<b:Sources xmlns:b="http://schemas.openxmlformats.org/officeDocument/2006/bibliography" SelectedStyle="\APA.XSL" StyleName="APA"/>
 </file>
 
 <file path=customXml/itemProps1.xml><?xml version="1.0" encoding="utf-8"?>
@@ -14625,17 +15268,17 @@
 </file>
 
 <file path=customXml/itemProps2.xml><?xml version="1.0" encoding="utf-8"?>
+<ds:datastoreItem xmlns:ds="http://schemas.openxmlformats.org/officeDocument/2006/customXml" ds:itemID="{E34C63B7-A026-4A37-9535-4FBB4C03A11D}">
+  <ds:schemaRefs>
+    <ds:schemaRef ds:uri="http://schemas.microsoft.com/sharepoint/v3/contenttype/forms"/>
+  </ds:schemaRefs>
+</ds:datastoreItem>
+</file>
+
+<file path=customXml/itemProps3.xml><?xml version="1.0" encoding="utf-8"?>
 <ds:datastoreItem xmlns:ds="http://schemas.openxmlformats.org/officeDocument/2006/customXml" ds:itemID="{355C5113-D031-41DB-A6D8-43CE1A0E6695}">
   <ds:schemaRefs>
     <ds:schemaRef ds:uri="http://schemas.openxmlformats.org/officeDocument/2006/bibliography"/>
   </ds:schemaRefs>
 </ds:datastoreItem>
-</file>
-
-<file path=customXml/itemProps3.xml><?xml version="1.0" encoding="utf-8"?>
-<ds:datastoreItem xmlns:ds="http://schemas.openxmlformats.org/officeDocument/2006/customXml" ds:itemID="{E34C63B7-A026-4A37-9535-4FBB4C03A11D}">
-  <ds:schemaRefs>
-    <ds:schemaRef ds:uri="http://schemas.microsoft.com/sharepoint/v3/contenttype/forms"/>
-  </ds:schemaRefs>
-</ds:datastoreItem>
 </file>
</xml_diff>

<commit_message>
EER Diagram has been added
</commit_message>
<xml_diff>
--- a/Introduction to DB-CS350 Project.docx
+++ b/Introduction to DB-CS350 Project.docx
@@ -83,7 +83,7 @@
                             <w:sdtContent>
                               <w:p>
                                 <w:pPr>
-                                  <w:pStyle w:val="a9"/>
+                                  <w:pStyle w:val="Title"/>
                                   <w:jc w:val="center"/>
                                   <w:rPr>
                                     <w:sz w:val="96"/>
@@ -102,7 +102,7 @@
                           </w:sdt>
                           <w:p>
                             <w:pPr>
-                              <w:pStyle w:val="a6"/>
+                              <w:pStyle w:val="Subtitle"/>
                               <w:ind w:left="709" w:right="720"/>
                               <w:jc w:val="center"/>
                               <w:rPr>
@@ -474,7 +474,7 @@
                       <w:sdtContent>
                         <w:p>
                           <w:pPr>
-                            <w:pStyle w:val="a9"/>
+                            <w:pStyle w:val="Title"/>
                             <w:jc w:val="center"/>
                             <w:rPr>
                               <w:sz w:val="96"/>
@@ -493,7 +493,7 @@
                     </w:sdt>
                     <w:p>
                       <w:pPr>
-                        <w:pStyle w:val="a6"/>
+                        <w:pStyle w:val="Subtitle"/>
                         <w:ind w:left="709" w:right="720"/>
                         <w:jc w:val="center"/>
                         <w:rPr>
@@ -1254,7 +1254,7 @@
                               <w:txbxContent>
                                 <w:p>
                                   <w:pPr>
-                                    <w:pStyle w:val="af5"/>
+                                    <w:pStyle w:val="ListParagraph"/>
                                     <w:numPr>
                                       <w:ilvl w:val="0"/>
                                       <w:numId w:val="6"/>
@@ -1323,7 +1323,7 @@
                                 </w:p>
                                 <w:p>
                                   <w:pPr>
-                                    <w:pStyle w:val="af5"/>
+                                    <w:pStyle w:val="ListParagraph"/>
                                     <w:numPr>
                                       <w:ilvl w:val="0"/>
                                       <w:numId w:val="6"/>
@@ -1344,7 +1344,7 @@
                                 </w:p>
                                 <w:p>
                                   <w:pPr>
-                                    <w:pStyle w:val="af5"/>
+                                    <w:pStyle w:val="ListParagraph"/>
                                     <w:numPr>
                                       <w:ilvl w:val="0"/>
                                       <w:numId w:val="6"/>
@@ -1456,7 +1456,7 @@
                                 </w:p>
                                 <w:p>
                                   <w:pPr>
-                                    <w:pStyle w:val="af5"/>
+                                    <w:pStyle w:val="ListParagraph"/>
                                     <w:numPr>
                                       <w:ilvl w:val="0"/>
                                       <w:numId w:val="6"/>
@@ -1478,7 +1478,7 @@
                                 </w:p>
                                 <w:p>
                                   <w:pPr>
-                                    <w:pStyle w:val="af5"/>
+                                    <w:pStyle w:val="ListParagraph"/>
                                     <w:numPr>
                                       <w:ilvl w:val="0"/>
                                       <w:numId w:val="6"/>
@@ -1506,7 +1506,7 @@
                                 </w:p>
                                 <w:p>
                                   <w:pPr>
-                                    <w:pStyle w:val="af5"/>
+                                    <w:pStyle w:val="ListParagraph"/>
                                     <w:numPr>
                                       <w:ilvl w:val="0"/>
                                       <w:numId w:val="6"/>
@@ -1528,7 +1528,7 @@
                                 </w:p>
                                 <w:p>
                                   <w:pPr>
-                                    <w:pStyle w:val="af5"/>
+                                    <w:pStyle w:val="ListParagraph"/>
                                     <w:numPr>
                                       <w:ilvl w:val="0"/>
                                       <w:numId w:val="6"/>
@@ -1575,7 +1575,7 @@
                                 </w:p>
                                 <w:p>
                                   <w:pPr>
-                                    <w:pStyle w:val="af5"/>
+                                    <w:pStyle w:val="ListParagraph"/>
                                     <w:numPr>
                                       <w:ilvl w:val="0"/>
                                       <w:numId w:val="6"/>
@@ -1597,7 +1597,7 @@
                                 </w:p>
                                 <w:p>
                                   <w:pPr>
-                                    <w:pStyle w:val="af5"/>
+                                    <w:pStyle w:val="ListParagraph"/>
                                     <w:numPr>
                                       <w:ilvl w:val="0"/>
                                       <w:numId w:val="6"/>
@@ -1637,7 +1637,7 @@
                                 </w:p>
                                 <w:p>
                                   <w:pPr>
-                                    <w:pStyle w:val="af5"/>
+                                    <w:pStyle w:val="ListParagraph"/>
                                     <w:numPr>
                                       <w:ilvl w:val="0"/>
                                       <w:numId w:val="6"/>
@@ -1734,7 +1734,7 @@
                         <w:txbxContent>
                           <w:p>
                             <w:pPr>
-                              <w:pStyle w:val="af5"/>
+                              <w:pStyle w:val="ListParagraph"/>
                               <w:numPr>
                                 <w:ilvl w:val="0"/>
                                 <w:numId w:val="6"/>
@@ -1803,7 +1803,7 @@
                           </w:p>
                           <w:p>
                             <w:pPr>
-                              <w:pStyle w:val="af5"/>
+                              <w:pStyle w:val="ListParagraph"/>
                               <w:numPr>
                                 <w:ilvl w:val="0"/>
                                 <w:numId w:val="6"/>
@@ -1824,7 +1824,7 @@
                           </w:p>
                           <w:p>
                             <w:pPr>
-                              <w:pStyle w:val="af5"/>
+                              <w:pStyle w:val="ListParagraph"/>
                               <w:numPr>
                                 <w:ilvl w:val="0"/>
                                 <w:numId w:val="6"/>
@@ -1936,7 +1936,7 @@
                           </w:p>
                           <w:p>
                             <w:pPr>
-                              <w:pStyle w:val="af5"/>
+                              <w:pStyle w:val="ListParagraph"/>
                               <w:numPr>
                                 <w:ilvl w:val="0"/>
                                 <w:numId w:val="6"/>
@@ -1958,7 +1958,7 @@
                           </w:p>
                           <w:p>
                             <w:pPr>
-                              <w:pStyle w:val="af5"/>
+                              <w:pStyle w:val="ListParagraph"/>
                               <w:numPr>
                                 <w:ilvl w:val="0"/>
                                 <w:numId w:val="6"/>
@@ -1986,7 +1986,7 @@
                           </w:p>
                           <w:p>
                             <w:pPr>
-                              <w:pStyle w:val="af5"/>
+                              <w:pStyle w:val="ListParagraph"/>
                               <w:numPr>
                                 <w:ilvl w:val="0"/>
                                 <w:numId w:val="6"/>
@@ -2008,7 +2008,7 @@
                           </w:p>
                           <w:p>
                             <w:pPr>
-                              <w:pStyle w:val="af5"/>
+                              <w:pStyle w:val="ListParagraph"/>
                               <w:numPr>
                                 <w:ilvl w:val="0"/>
                                 <w:numId w:val="6"/>
@@ -2055,7 +2055,7 @@
                           </w:p>
                           <w:p>
                             <w:pPr>
-                              <w:pStyle w:val="af5"/>
+                              <w:pStyle w:val="ListParagraph"/>
                               <w:numPr>
                                 <w:ilvl w:val="0"/>
                                 <w:numId w:val="6"/>
@@ -2077,7 +2077,7 @@
                           </w:p>
                           <w:p>
                             <w:pPr>
-                              <w:pStyle w:val="af5"/>
+                              <w:pStyle w:val="ListParagraph"/>
                               <w:numPr>
                                 <w:ilvl w:val="0"/>
                                 <w:numId w:val="6"/>
@@ -2117,7 +2117,7 @@
                           </w:p>
                           <w:p>
                             <w:pPr>
-                              <w:pStyle w:val="af5"/>
+                              <w:pStyle w:val="ListParagraph"/>
                               <w:numPr>
                                 <w:ilvl w:val="0"/>
                                 <w:numId w:val="6"/>
@@ -2298,7 +2298,7 @@
                                     </w:tcPr>
                                     <w:p>
                                       <w:pPr>
-                                        <w:pStyle w:val="a5"/>
+                                        <w:pStyle w:val="Footer"/>
                                         <w:rPr>
                                           <w:b/>
                                           <w:bCs/>
@@ -2336,7 +2336,7 @@
                                     </w:p>
                                     <w:p>
                                       <w:pPr>
-                                        <w:pStyle w:val="a5"/>
+                                        <w:pStyle w:val="Footer"/>
                                         <w:rPr>
                                           <w:b/>
                                           <w:bCs/>
@@ -2360,17 +2360,7 @@
                                           <w:sz w:val="28"/>
                                           <w:szCs w:val="28"/>
                                         </w:rPr>
-                                        <w:t xml:space="preserve">Rakan </w:t>
-                                      </w:r>
-                                      <w:proofErr w:type="spellStart"/>
-                                      <w:r>
-                                        <w:rPr>
-                                          <w:b/>
-                                          <w:bCs/>
-                                          <w:sz w:val="28"/>
-                                          <w:szCs w:val="28"/>
-                                        </w:rPr>
-                                        <w:t>A</w:t>
+                                        <w:t>Rakan A</w:t>
                                       </w:r>
                                       <w:r>
                                         <w:rPr>
@@ -2381,11 +2371,10 @@
                                         </w:rPr>
                                         <w:t>lqu</w:t>
                                       </w:r>
-                                      <w:proofErr w:type="spellEnd"/>
                                     </w:p>
                                     <w:p>
                                       <w:pPr>
-                                        <w:pStyle w:val="a5"/>
+                                        <w:pStyle w:val="Footer"/>
                                         <w:rPr>
                                           <w:b/>
                                           <w:bCs/>
@@ -2423,7 +2412,7 @@
                                     </w:p>
                                     <w:p>
                                       <w:pPr>
-                                        <w:pStyle w:val="a5"/>
+                                        <w:pStyle w:val="Footer"/>
                                         <w:rPr>
                                           <w:b/>
                                           <w:bCs/>
@@ -2461,7 +2450,7 @@
                                     </w:p>
                                     <w:p>
                                       <w:pPr>
-                                        <w:pStyle w:val="a5"/>
+                                        <w:pStyle w:val="Footer"/>
                                         <w:ind w:left="0"/>
                                         <w:rPr>
                                           <w:b/>
@@ -2481,7 +2470,7 @@
                                     </w:tcPr>
                                     <w:p>
                                       <w:pPr>
-                                        <w:pStyle w:val="a5"/>
+                                        <w:pStyle w:val="Footer"/>
                                         <w:ind w:left="0"/>
                                         <w:rPr>
                                           <w:b/>
@@ -2499,7 +2488,7 @@
                                     </w:tcPr>
                                     <w:p>
                                       <w:pPr>
-                                        <w:pStyle w:val="a5"/>
+                                        <w:pStyle w:val="Footer"/>
                                         <w:rPr>
                                           <w:b/>
                                           <w:bCs/>
@@ -2537,7 +2526,7 @@
                                     </w:p>
                                     <w:p>
                                       <w:pPr>
-                                        <w:pStyle w:val="a5"/>
+                                        <w:pStyle w:val="Footer"/>
                                         <w:rPr>
                                           <w:b/>
                                           <w:bCs/>
@@ -2575,7 +2564,7 @@
                                     </w:p>
                                     <w:p>
                                       <w:pPr>
-                                        <w:pStyle w:val="a5"/>
+                                        <w:pStyle w:val="Footer"/>
                                         <w:rPr>
                                           <w:b/>
                                           <w:bCs/>
@@ -2613,7 +2602,7 @@
                                     </w:p>
                                     <w:p>
                                       <w:pPr>
-                                        <w:pStyle w:val="a5"/>
+                                        <w:pStyle w:val="Footer"/>
                                         <w:rPr>
                                           <w:b/>
                                           <w:bCs/>
@@ -2663,7 +2652,7 @@
                                     </w:tcPr>
                                     <w:p>
                                       <w:pPr>
-                                        <w:pStyle w:val="a5"/>
+                                        <w:pStyle w:val="Footer"/>
                                         <w:ind w:left="0"/>
                                       </w:pPr>
                                     </w:p>
@@ -2675,7 +2664,7 @@
                                     </w:tcPr>
                                     <w:p>
                                       <w:pPr>
-                                        <w:pStyle w:val="a5"/>
+                                        <w:pStyle w:val="Footer"/>
                                       </w:pPr>
                                     </w:p>
                                   </w:tc>
@@ -2686,7 +2675,7 @@
                                     </w:tcPr>
                                     <w:p>
                                       <w:pPr>
-                                        <w:pStyle w:val="a5"/>
+                                        <w:pStyle w:val="Footer"/>
                                       </w:pPr>
                                     </w:p>
                                   </w:tc>
@@ -2694,7 +2683,7 @@
                               </w:tbl>
                               <w:p>
                                 <w:pPr>
-                                  <w:pStyle w:val="ad"/>
+                                  <w:pStyle w:val="NoSpacing"/>
                                 </w:pPr>
                               </w:p>
                             </w:txbxContent>
@@ -2797,7 +2786,7 @@
                               </w:tcPr>
                               <w:p>
                                 <w:pPr>
-                                  <w:pStyle w:val="a5"/>
+                                  <w:pStyle w:val="Footer"/>
                                   <w:rPr>
                                     <w:b/>
                                     <w:bCs/>
@@ -2835,7 +2824,7 @@
                               </w:p>
                               <w:p>
                                 <w:pPr>
-                                  <w:pStyle w:val="a5"/>
+                                  <w:pStyle w:val="Footer"/>
                                   <w:rPr>
                                     <w:b/>
                                     <w:bCs/>
@@ -2859,17 +2848,7 @@
                                     <w:sz w:val="28"/>
                                     <w:szCs w:val="28"/>
                                   </w:rPr>
-                                  <w:t xml:space="preserve">Rakan </w:t>
-                                </w:r>
-                                <w:proofErr w:type="spellStart"/>
-                                <w:r>
-                                  <w:rPr>
-                                    <w:b/>
-                                    <w:bCs/>
-                                    <w:sz w:val="28"/>
-                                    <w:szCs w:val="28"/>
-                                  </w:rPr>
-                                  <w:t>A</w:t>
+                                  <w:t>Rakan A</w:t>
                                 </w:r>
                                 <w:r>
                                   <w:rPr>
@@ -2880,11 +2859,10 @@
                                   </w:rPr>
                                   <w:t>lqu</w:t>
                                 </w:r>
-                                <w:proofErr w:type="spellEnd"/>
                               </w:p>
                               <w:p>
                                 <w:pPr>
-                                  <w:pStyle w:val="a5"/>
+                                  <w:pStyle w:val="Footer"/>
                                   <w:rPr>
                                     <w:b/>
                                     <w:bCs/>
@@ -2922,7 +2900,7 @@
                               </w:p>
                               <w:p>
                                 <w:pPr>
-                                  <w:pStyle w:val="a5"/>
+                                  <w:pStyle w:val="Footer"/>
                                   <w:rPr>
                                     <w:b/>
                                     <w:bCs/>
@@ -2960,7 +2938,7 @@
                               </w:p>
                               <w:p>
                                 <w:pPr>
-                                  <w:pStyle w:val="a5"/>
+                                  <w:pStyle w:val="Footer"/>
                                   <w:ind w:left="0"/>
                                   <w:rPr>
                                     <w:b/>
@@ -2980,7 +2958,7 @@
                               </w:tcPr>
                               <w:p>
                                 <w:pPr>
-                                  <w:pStyle w:val="a5"/>
+                                  <w:pStyle w:val="Footer"/>
                                   <w:ind w:left="0"/>
                                   <w:rPr>
                                     <w:b/>
@@ -2998,7 +2976,7 @@
                               </w:tcPr>
                               <w:p>
                                 <w:pPr>
-                                  <w:pStyle w:val="a5"/>
+                                  <w:pStyle w:val="Footer"/>
                                   <w:rPr>
                                     <w:b/>
                                     <w:bCs/>
@@ -3036,7 +3014,7 @@
                               </w:p>
                               <w:p>
                                 <w:pPr>
-                                  <w:pStyle w:val="a5"/>
+                                  <w:pStyle w:val="Footer"/>
                                   <w:rPr>
                                     <w:b/>
                                     <w:bCs/>
@@ -3074,7 +3052,7 @@
                               </w:p>
                               <w:p>
                                 <w:pPr>
-                                  <w:pStyle w:val="a5"/>
+                                  <w:pStyle w:val="Footer"/>
                                   <w:rPr>
                                     <w:b/>
                                     <w:bCs/>
@@ -3112,7 +3090,7 @@
                               </w:p>
                               <w:p>
                                 <w:pPr>
-                                  <w:pStyle w:val="a5"/>
+                                  <w:pStyle w:val="Footer"/>
                                   <w:rPr>
                                     <w:b/>
                                     <w:bCs/>
@@ -3162,7 +3140,7 @@
                               </w:tcPr>
                               <w:p>
                                 <w:pPr>
-                                  <w:pStyle w:val="a5"/>
+                                  <w:pStyle w:val="Footer"/>
                                   <w:ind w:left="0"/>
                                 </w:pPr>
                               </w:p>
@@ -3174,7 +3152,7 @@
                               </w:tcPr>
                               <w:p>
                                 <w:pPr>
-                                  <w:pStyle w:val="a5"/>
+                                  <w:pStyle w:val="Footer"/>
                                 </w:pPr>
                               </w:p>
                             </w:tc>
@@ -3185,7 +3163,7 @@
                               </w:tcPr>
                               <w:p>
                                 <w:pPr>
-                                  <w:pStyle w:val="a5"/>
+                                  <w:pStyle w:val="Footer"/>
                                 </w:pPr>
                               </w:p>
                             </w:tc>
@@ -3193,7 +3171,7 @@
                         </w:tbl>
                         <w:p>
                           <w:pPr>
-                            <w:pStyle w:val="ad"/>
+                            <w:pStyle w:val="NoSpacing"/>
                           </w:pPr>
                         </w:p>
                       </w:txbxContent>
@@ -3235,7 +3213,7 @@
     </w:p>
     <w:p>
       <w:pPr>
-        <w:pStyle w:val="1"/>
+        <w:pStyle w:val="Heading1"/>
         <w:spacing w:before="0" w:after="0"/>
         <w:rPr>
           <w:rFonts w:ascii="Times New Roman" w:hAnsi="Times New Roman" w:cs="Times New Roman"/>
@@ -3376,7 +3354,7 @@
     </w:p>
     <w:p>
       <w:pPr>
-        <w:pStyle w:val="af5"/>
+        <w:pStyle w:val="ListParagraph"/>
         <w:numPr>
           <w:ilvl w:val="1"/>
           <w:numId w:val="6"/>
@@ -3455,7 +3433,7 @@
     </w:p>
     <w:p>
       <w:pPr>
-        <w:pStyle w:val="af5"/>
+        <w:pStyle w:val="ListParagraph"/>
         <w:numPr>
           <w:ilvl w:val="1"/>
           <w:numId w:val="6"/>
@@ -3541,7 +3519,7 @@
     </w:p>
     <w:p>
       <w:pPr>
-        <w:pStyle w:val="af5"/>
+        <w:pStyle w:val="ListParagraph"/>
         <w:numPr>
           <w:ilvl w:val="1"/>
           <w:numId w:val="6"/>
@@ -3627,7 +3605,7 @@
     </w:p>
     <w:p>
       <w:pPr>
-        <w:pStyle w:val="af5"/>
+        <w:pStyle w:val="ListParagraph"/>
         <w:numPr>
           <w:ilvl w:val="1"/>
           <w:numId w:val="6"/>
@@ -3873,7 +3851,7 @@
     </w:p>
     <w:p>
       <w:pPr>
-        <w:pStyle w:val="af5"/>
+        <w:pStyle w:val="ListParagraph"/>
         <w:numPr>
           <w:ilvl w:val="0"/>
           <w:numId w:val="19"/>
@@ -3898,7 +3876,7 @@
     </w:p>
     <w:p>
       <w:pPr>
-        <w:pStyle w:val="af5"/>
+        <w:pStyle w:val="ListParagraph"/>
         <w:numPr>
           <w:ilvl w:val="0"/>
           <w:numId w:val="19"/>
@@ -3923,7 +3901,7 @@
     </w:p>
     <w:p>
       <w:pPr>
-        <w:pStyle w:val="af5"/>
+        <w:pStyle w:val="ListParagraph"/>
         <w:numPr>
           <w:ilvl w:val="0"/>
           <w:numId w:val="19"/>
@@ -4020,7 +3998,7 @@
     </w:p>
     <w:p>
       <w:pPr>
-        <w:pStyle w:val="af5"/>
+        <w:pStyle w:val="ListParagraph"/>
         <w:numPr>
           <w:ilvl w:val="0"/>
           <w:numId w:val="19"/>
@@ -4222,25 +4200,7 @@
           <w:sz w:val="24"/>
           <w:szCs w:val="24"/>
         </w:rPr>
-        <w:t xml:space="preserve"> to the live report document, GitHub/GitLab repository, and Google </w:t>
-      </w:r>
-      <w:proofErr w:type="spellStart"/>
-      <w:r>
-        <w:rPr>
-          <w:rFonts w:ascii="Times New Roman" w:hAnsi="Times New Roman" w:cs="Times New Roman"/>
-          <w:sz w:val="24"/>
-          <w:szCs w:val="24"/>
-        </w:rPr>
-        <w:t>Colab</w:t>
-      </w:r>
-      <w:proofErr w:type="spellEnd"/>
-      <w:r>
-        <w:rPr>
-          <w:rFonts w:ascii="Times New Roman" w:hAnsi="Times New Roman" w:cs="Times New Roman"/>
-          <w:sz w:val="24"/>
-          <w:szCs w:val="24"/>
-        </w:rPr>
-        <w:t xml:space="preserve"> notebook (if applicable) in the </w:t>
+        <w:t xml:space="preserve"> to the live report document, GitHub/GitLab repository, and Google Colab notebook (if applicable) in the </w:t>
       </w:r>
       <w:r>
         <w:rPr>
@@ -4401,7 +4361,7 @@
     </w:p>
     <w:p>
       <w:pPr>
-        <w:pStyle w:val="af5"/>
+        <w:pStyle w:val="ListParagraph"/>
         <w:numPr>
           <w:ilvl w:val="0"/>
           <w:numId w:val="7"/>
@@ -4439,7 +4399,7 @@
     </w:p>
     <w:p>
       <w:pPr>
-        <w:pStyle w:val="af5"/>
+        <w:pStyle w:val="ListParagraph"/>
         <w:numPr>
           <w:ilvl w:val="0"/>
           <w:numId w:val="7"/>
@@ -4555,7 +4515,7 @@
     </w:p>
     <w:p>
       <w:pPr>
-        <w:pStyle w:val="1"/>
+        <w:pStyle w:val="Heading1"/>
         <w:rPr>
           <w:rFonts w:ascii="Times New Roman" w:hAnsi="Times New Roman" w:cs="Times New Roman"/>
           <w:color w:val="auto"/>
@@ -4674,16 +4634,16 @@
                         <w:txbxContent>
                           <w:p>
                             <w:pPr>
-                              <w:pStyle w:val="af"/>
+                              <w:pStyle w:val="Quote"/>
                               <w:rPr>
-                                <w:rStyle w:val="Char5"/>
+                                <w:rStyle w:val="QuoteChar"/>
                                 <w:i/>
                                 <w:iCs/>
                               </w:rPr>
                             </w:pPr>
                             <w:r>
                               <w:rPr>
-                                <w:rStyle w:val="Char5"/>
+                                <w:rStyle w:val="QuoteChar"/>
                                 <w:i/>
                                 <w:iCs/>
                               </w:rPr>
@@ -4701,7 +4661,7 @@
                           </w:p>
                           <w:p>
                             <w:pPr>
-                              <w:pStyle w:val="af6"/>
+                              <w:pStyle w:val="NormalWeb"/>
                               <w:shd w:val="clear" w:color="auto" w:fill="FFFFFF"/>
                               <w:spacing w:before="0" w:beforeAutospacing="0" w:after="0" w:afterAutospacing="0" w:line="360" w:lineRule="auto"/>
                               <w:jc w:val="both"/>
@@ -4729,7 +4689,7 @@
                           </w:p>
                           <w:p>
                             <w:pPr>
-                              <w:pStyle w:val="af6"/>
+                              <w:pStyle w:val="NormalWeb"/>
                               <w:shd w:val="clear" w:color="auto" w:fill="FFFFFF"/>
                               <w:spacing w:before="0" w:beforeAutospacing="0" w:after="0" w:afterAutospacing="0"/>
                               <w:rPr>
@@ -4797,16 +4757,16 @@
                   <w:txbxContent>
                     <w:p>
                       <w:pPr>
-                        <w:pStyle w:val="af"/>
+                        <w:pStyle w:val="Quote"/>
                         <w:rPr>
-                          <w:rStyle w:val="Char5"/>
+                          <w:rStyle w:val="QuoteChar"/>
                           <w:i/>
                           <w:iCs/>
                         </w:rPr>
                       </w:pPr>
                       <w:r>
                         <w:rPr>
-                          <w:rStyle w:val="Char5"/>
+                          <w:rStyle w:val="QuoteChar"/>
                           <w:i/>
                           <w:iCs/>
                         </w:rPr>
@@ -4824,7 +4784,7 @@
                     </w:p>
                     <w:p>
                       <w:pPr>
-                        <w:pStyle w:val="af6"/>
+                        <w:pStyle w:val="NormalWeb"/>
                         <w:shd w:val="clear" w:color="auto" w:fill="FFFFFF"/>
                         <w:spacing w:before="0" w:beforeAutospacing="0" w:after="0" w:afterAutospacing="0" w:line="360" w:lineRule="auto"/>
                         <w:jc w:val="both"/>
@@ -4852,7 +4812,7 @@
                     </w:p>
                     <w:p>
                       <w:pPr>
-                        <w:pStyle w:val="af6"/>
+                        <w:pStyle w:val="NormalWeb"/>
                         <w:shd w:val="clear" w:color="auto" w:fill="FFFFFF"/>
                         <w:spacing w:before="0" w:beforeAutospacing="0" w:after="0" w:afterAutospacing="0"/>
                         <w:rPr>
@@ -4954,7 +4914,7 @@
     </w:p>
     <w:p>
       <w:pPr>
-        <w:pStyle w:val="1"/>
+        <w:pStyle w:val="Heading1"/>
       </w:pPr>
       <w:r>
         <w:lastRenderedPageBreak/>
@@ -4963,7 +4923,7 @@
     </w:p>
     <w:p>
       <w:pPr>
-        <w:pStyle w:val="a"/>
+        <w:pStyle w:val="ListBullet"/>
         <w:rPr>
           <w:rFonts w:ascii="Times New Roman" w:hAnsi="Times New Roman" w:cs="Times New Roman"/>
           <w:sz w:val="24"/>
@@ -4981,7 +4941,7 @@
     </w:p>
     <w:p>
       <w:pPr>
-        <w:pStyle w:val="a"/>
+        <w:pStyle w:val="ListBullet"/>
         <w:rPr>
           <w:rFonts w:ascii="Times New Roman" w:hAnsi="Times New Roman" w:cs="Times New Roman"/>
           <w:sz w:val="24"/>
@@ -4996,32 +4956,12 @@
           <w:szCs w:val="24"/>
           <w:lang w:val="es-ES"/>
         </w:rPr>
-        <w:t xml:space="preserve">A complete ER/EER </w:t>
-      </w:r>
-      <w:proofErr w:type="spellStart"/>
-      <w:r>
-        <w:rPr>
-          <w:rFonts w:ascii="Times New Roman" w:hAnsi="Times New Roman" w:cs="Times New Roman"/>
-          <w:sz w:val="24"/>
-          <w:szCs w:val="24"/>
-          <w:lang w:val="es-ES"/>
-        </w:rPr>
-        <w:t>diagram</w:t>
-      </w:r>
-      <w:proofErr w:type="spellEnd"/>
-      <w:r>
-        <w:rPr>
-          <w:rFonts w:ascii="Times New Roman" w:hAnsi="Times New Roman" w:cs="Times New Roman"/>
-          <w:sz w:val="24"/>
-          <w:szCs w:val="24"/>
-          <w:lang w:val="es-ES"/>
-        </w:rPr>
-        <w:t>.</w:t>
+        <w:t>A complete ER/EER diagram.</w:t>
       </w:r>
     </w:p>
     <w:p>
       <w:pPr>
-        <w:pStyle w:val="a"/>
+        <w:pStyle w:val="ListBullet"/>
         <w:rPr>
           <w:rFonts w:ascii="Times New Roman" w:hAnsi="Times New Roman" w:cs="Times New Roman"/>
           <w:sz w:val="24"/>
@@ -5039,7 +4979,7 @@
     </w:p>
     <w:p>
       <w:pPr>
-        <w:pStyle w:val="a"/>
+        <w:pStyle w:val="ListBullet"/>
         <w:rPr>
           <w:rFonts w:ascii="Times New Roman" w:hAnsi="Times New Roman" w:cs="Times New Roman"/>
           <w:sz w:val="24"/>
@@ -5057,7 +4997,7 @@
     </w:p>
     <w:p>
       <w:pPr>
-        <w:pStyle w:val="a"/>
+        <w:pStyle w:val="ListBullet"/>
         <w:rPr>
           <w:rFonts w:ascii="Times New Roman" w:hAnsi="Times New Roman" w:cs="Times New Roman"/>
           <w:sz w:val="24"/>
@@ -5075,7 +5015,7 @@
     </w:p>
     <w:p>
       <w:pPr>
-        <w:pStyle w:val="a"/>
+        <w:pStyle w:val="ListBullet"/>
         <w:rPr>
           <w:rFonts w:ascii="Times New Roman" w:hAnsi="Times New Roman" w:cs="Times New Roman"/>
           <w:sz w:val="24"/>
@@ -5093,7 +5033,7 @@
     </w:p>
     <w:p>
       <w:pPr>
-        <w:pStyle w:val="a"/>
+        <w:pStyle w:val="ListBullet"/>
         <w:numPr>
           <w:ilvl w:val="0"/>
           <w:numId w:val="0"/>
@@ -5108,7 +5048,7 @@
     </w:p>
     <w:p>
       <w:pPr>
-        <w:pStyle w:val="a"/>
+        <w:pStyle w:val="ListBullet"/>
         <w:numPr>
           <w:ilvl w:val="0"/>
           <w:numId w:val="0"/>
@@ -5123,7 +5063,7 @@
     </w:p>
     <w:p>
       <w:pPr>
-        <w:pStyle w:val="a"/>
+        <w:pStyle w:val="ListBullet"/>
         <w:numPr>
           <w:ilvl w:val="0"/>
           <w:numId w:val="0"/>
@@ -5138,7 +5078,7 @@
     </w:p>
     <w:p>
       <w:pPr>
-        <w:pStyle w:val="a"/>
+        <w:pStyle w:val="ListBullet"/>
         <w:numPr>
           <w:ilvl w:val="0"/>
           <w:numId w:val="0"/>
@@ -5153,7 +5093,7 @@
     </w:p>
     <w:p>
       <w:pPr>
-        <w:pStyle w:val="a"/>
+        <w:pStyle w:val="ListBullet"/>
         <w:numPr>
           <w:ilvl w:val="0"/>
           <w:numId w:val="0"/>
@@ -5168,7 +5108,7 @@
     </w:p>
     <w:p>
       <w:pPr>
-        <w:pStyle w:val="a"/>
+        <w:pStyle w:val="ListBullet"/>
         <w:numPr>
           <w:ilvl w:val="0"/>
           <w:numId w:val="0"/>
@@ -5183,7 +5123,7 @@
     </w:p>
     <w:p>
       <w:pPr>
-        <w:pStyle w:val="a"/>
+        <w:pStyle w:val="ListBullet"/>
         <w:numPr>
           <w:ilvl w:val="0"/>
           <w:numId w:val="0"/>
@@ -5198,7 +5138,7 @@
     </w:p>
     <w:p>
       <w:pPr>
-        <w:pStyle w:val="a"/>
+        <w:pStyle w:val="ListBullet"/>
         <w:numPr>
           <w:ilvl w:val="0"/>
           <w:numId w:val="0"/>
@@ -5213,7 +5153,7 @@
     </w:p>
     <w:p>
       <w:pPr>
-        <w:pStyle w:val="a"/>
+        <w:pStyle w:val="ListBullet"/>
         <w:numPr>
           <w:ilvl w:val="0"/>
           <w:numId w:val="0"/>
@@ -5228,7 +5168,7 @@
     </w:p>
     <w:p>
       <w:pPr>
-        <w:pStyle w:val="a"/>
+        <w:pStyle w:val="ListBullet"/>
         <w:numPr>
           <w:ilvl w:val="0"/>
           <w:numId w:val="0"/>
@@ -5243,7 +5183,7 @@
     </w:p>
     <w:p>
       <w:pPr>
-        <w:pStyle w:val="a"/>
+        <w:pStyle w:val="ListBullet"/>
         <w:numPr>
           <w:ilvl w:val="0"/>
           <w:numId w:val="0"/>
@@ -5258,7 +5198,7 @@
     </w:p>
     <w:p>
       <w:pPr>
-        <w:pStyle w:val="a"/>
+        <w:pStyle w:val="ListBullet"/>
         <w:numPr>
           <w:ilvl w:val="0"/>
           <w:numId w:val="0"/>
@@ -5273,7 +5213,7 @@
     </w:p>
     <w:p>
       <w:pPr>
-        <w:pStyle w:val="a"/>
+        <w:pStyle w:val="ListBullet"/>
         <w:numPr>
           <w:ilvl w:val="0"/>
           <w:numId w:val="0"/>
@@ -5288,7 +5228,7 @@
     </w:p>
     <w:p>
       <w:pPr>
-        <w:pStyle w:val="a"/>
+        <w:pStyle w:val="ListBullet"/>
         <w:numPr>
           <w:ilvl w:val="0"/>
           <w:numId w:val="0"/>
@@ -5303,7 +5243,7 @@
     </w:p>
     <w:p>
       <w:pPr>
-        <w:pStyle w:val="a"/>
+        <w:pStyle w:val="ListBullet"/>
         <w:numPr>
           <w:ilvl w:val="0"/>
           <w:numId w:val="0"/>
@@ -5318,7 +5258,7 @@
     </w:p>
     <w:p>
       <w:pPr>
-        <w:pStyle w:val="a"/>
+        <w:pStyle w:val="ListBullet"/>
         <w:numPr>
           <w:ilvl w:val="0"/>
           <w:numId w:val="0"/>
@@ -5333,7 +5273,7 @@
     </w:p>
     <w:p>
       <w:pPr>
-        <w:pStyle w:val="a"/>
+        <w:pStyle w:val="ListBullet"/>
         <w:numPr>
           <w:ilvl w:val="0"/>
           <w:numId w:val="0"/>
@@ -5348,7 +5288,7 @@
     </w:p>
     <w:p>
       <w:pPr>
-        <w:pStyle w:val="a"/>
+        <w:pStyle w:val="ListBullet"/>
         <w:numPr>
           <w:ilvl w:val="0"/>
           <w:numId w:val="0"/>
@@ -5363,7 +5303,7 @@
     </w:p>
     <w:p>
       <w:pPr>
-        <w:pStyle w:val="a"/>
+        <w:pStyle w:val="ListBullet"/>
         <w:numPr>
           <w:ilvl w:val="0"/>
           <w:numId w:val="0"/>
@@ -5378,7 +5318,7 @@
     </w:p>
     <w:p>
       <w:pPr>
-        <w:pStyle w:val="a"/>
+        <w:pStyle w:val="ListBullet"/>
         <w:numPr>
           <w:ilvl w:val="0"/>
           <w:numId w:val="0"/>
@@ -5393,7 +5333,7 @@
     </w:p>
     <w:p>
       <w:pPr>
-        <w:pStyle w:val="a"/>
+        <w:pStyle w:val="ListBullet"/>
         <w:numPr>
           <w:ilvl w:val="0"/>
           <w:numId w:val="0"/>
@@ -5408,7 +5348,7 @@
     </w:p>
     <w:p>
       <w:pPr>
-        <w:pStyle w:val="a"/>
+        <w:pStyle w:val="ListBullet"/>
         <w:numPr>
           <w:ilvl w:val="0"/>
           <w:numId w:val="0"/>
@@ -5423,7 +5363,7 @@
     </w:p>
     <w:p>
       <w:pPr>
-        <w:pStyle w:val="a"/>
+        <w:pStyle w:val="ListBullet"/>
         <w:numPr>
           <w:ilvl w:val="0"/>
           <w:numId w:val="30"/>
@@ -5452,7 +5392,7 @@
     </w:p>
     <w:p>
       <w:pPr>
-        <w:pStyle w:val="a"/>
+        <w:pStyle w:val="ListBullet"/>
         <w:numPr>
           <w:ilvl w:val="0"/>
           <w:numId w:val="0"/>
@@ -5470,7 +5410,7 @@
     </w:p>
     <w:p>
       <w:pPr>
-        <w:pStyle w:val="a"/>
+        <w:pStyle w:val="ListBullet"/>
         <w:numPr>
           <w:ilvl w:val="0"/>
           <w:numId w:val="28"/>
@@ -5494,7 +5434,7 @@
     </w:p>
     <w:p>
       <w:pPr>
-        <w:pStyle w:val="a"/>
+        <w:pStyle w:val="ListBullet"/>
         <w:numPr>
           <w:ilvl w:val="0"/>
           <w:numId w:val="28"/>
@@ -5518,7 +5458,7 @@
     </w:p>
     <w:p>
       <w:pPr>
-        <w:pStyle w:val="a"/>
+        <w:pStyle w:val="ListBullet"/>
         <w:numPr>
           <w:ilvl w:val="0"/>
           <w:numId w:val="29"/>
@@ -5530,7 +5470,6 @@
           <w:szCs w:val="24"/>
         </w:rPr>
       </w:pPr>
-      <w:proofErr w:type="spellStart"/>
       <w:r>
         <w:rPr>
           <w:rFonts w:ascii="Times New Roman" w:hAnsi="Times New Roman" w:cs="Times New Roman"/>
@@ -5540,11 +5479,10 @@
         </w:rPr>
         <w:t>GeneralPractitioner</w:t>
       </w:r>
-      <w:proofErr w:type="spellEnd"/>
     </w:p>
     <w:p>
       <w:pPr>
-        <w:pStyle w:val="a"/>
+        <w:pStyle w:val="ListBullet"/>
         <w:numPr>
           <w:ilvl w:val="0"/>
           <w:numId w:val="29"/>
@@ -5568,7 +5506,7 @@
     </w:p>
     <w:p>
       <w:pPr>
-        <w:pStyle w:val="a"/>
+        <w:pStyle w:val="ListBullet"/>
         <w:numPr>
           <w:ilvl w:val="0"/>
           <w:numId w:val="28"/>
@@ -5592,7 +5530,7 @@
     </w:p>
     <w:p>
       <w:pPr>
-        <w:pStyle w:val="a"/>
+        <w:pStyle w:val="ListBullet"/>
         <w:numPr>
           <w:ilvl w:val="0"/>
           <w:numId w:val="28"/>
@@ -5616,7 +5554,7 @@
     </w:p>
     <w:p>
       <w:pPr>
-        <w:pStyle w:val="a"/>
+        <w:pStyle w:val="ListBullet"/>
         <w:numPr>
           <w:ilvl w:val="0"/>
           <w:numId w:val="28"/>
@@ -5640,7 +5578,7 @@
     </w:p>
     <w:p>
       <w:pPr>
-        <w:pStyle w:val="a"/>
+        <w:pStyle w:val="ListBullet"/>
         <w:numPr>
           <w:ilvl w:val="0"/>
           <w:numId w:val="28"/>
@@ -5664,7 +5602,7 @@
     </w:p>
     <w:p>
       <w:pPr>
-        <w:pStyle w:val="a"/>
+        <w:pStyle w:val="ListBullet"/>
         <w:numPr>
           <w:ilvl w:val="0"/>
           <w:numId w:val="0"/>
@@ -5678,7 +5616,7 @@
     </w:p>
     <w:p>
       <w:pPr>
-        <w:pStyle w:val="a"/>
+        <w:pStyle w:val="ListBullet"/>
         <w:numPr>
           <w:ilvl w:val="0"/>
           <w:numId w:val="30"/>
@@ -5706,7 +5644,7 @@
     </w:p>
     <w:p>
       <w:pPr>
-        <w:pStyle w:val="a"/>
+        <w:pStyle w:val="ListBullet"/>
         <w:numPr>
           <w:ilvl w:val="0"/>
           <w:numId w:val="0"/>
@@ -5722,7 +5660,7 @@
     </w:p>
     <w:p>
       <w:pPr>
-        <w:pStyle w:val="a"/>
+        <w:pStyle w:val="ListBullet"/>
         <w:numPr>
           <w:ilvl w:val="0"/>
           <w:numId w:val="0"/>
@@ -5747,7 +5685,7 @@
     </w:p>
     <w:p>
       <w:pPr>
-        <w:pStyle w:val="a"/>
+        <w:pStyle w:val="ListBullet"/>
         <w:numPr>
           <w:ilvl w:val="0"/>
           <w:numId w:val="28"/>
@@ -5759,8 +5697,6 @@
           <w:szCs w:val="24"/>
         </w:rPr>
       </w:pPr>
-      <w:proofErr w:type="spellStart"/>
-      <w:proofErr w:type="gramStart"/>
       <w:r>
         <w:rPr>
           <w:rFonts w:ascii="Times New Roman" w:hAnsi="Times New Roman" w:cs="Times New Roman"/>
@@ -5770,12 +5706,10 @@
         </w:rPr>
         <w:t>GeneralPractitioner</w:t>
       </w:r>
-      <w:proofErr w:type="spellEnd"/>
-      <w:proofErr w:type="gramEnd"/>
     </w:p>
     <w:p>
       <w:pPr>
-        <w:pStyle w:val="a"/>
+        <w:pStyle w:val="ListBullet"/>
         <w:numPr>
           <w:ilvl w:val="0"/>
           <w:numId w:val="28"/>
@@ -5799,7 +5733,7 @@
     </w:p>
     <w:p>
       <w:pPr>
-        <w:pStyle w:val="a"/>
+        <w:pStyle w:val="ListBullet"/>
         <w:numPr>
           <w:ilvl w:val="0"/>
           <w:numId w:val="0"/>
@@ -5817,7 +5751,7 @@
     </w:p>
     <w:p>
       <w:pPr>
-        <w:pStyle w:val="a"/>
+        <w:pStyle w:val="ListBullet"/>
         <w:numPr>
           <w:ilvl w:val="0"/>
           <w:numId w:val="30"/>
@@ -5845,7 +5779,7 @@
     </w:p>
     <w:p>
       <w:pPr>
-        <w:pStyle w:val="a"/>
+        <w:pStyle w:val="ListBullet"/>
         <w:numPr>
           <w:ilvl w:val="0"/>
           <w:numId w:val="0"/>
@@ -5862,7 +5796,7 @@
     </w:p>
     <w:tbl>
       <w:tblPr>
-        <w:tblStyle w:val="a8"/>
+        <w:tblStyle w:val="TableGrid"/>
         <w:tblW w:w="0" w:type="auto"/>
         <w:tblInd w:w="288" w:type="dxa"/>
         <w:tblLook w:val="04A0" w:firstRow="1" w:lastRow="0" w:firstColumn="1" w:lastColumn="0" w:noHBand="0" w:noVBand="1"/>
@@ -5882,7 +5816,7 @@
           </w:tcPr>
           <w:p>
             <w:pPr>
-              <w:pStyle w:val="a"/>
+              <w:pStyle w:val="ListBullet"/>
               <w:numPr>
                 <w:ilvl w:val="0"/>
                 <w:numId w:val="0"/>
@@ -5912,7 +5846,7 @@
           </w:tcPr>
           <w:p>
             <w:pPr>
-              <w:pStyle w:val="a"/>
+              <w:pStyle w:val="ListBullet"/>
               <w:numPr>
                 <w:ilvl w:val="0"/>
                 <w:numId w:val="0"/>
@@ -5963,7 +5897,7 @@
           </w:tcPr>
           <w:p>
             <w:pPr>
-              <w:pStyle w:val="a"/>
+              <w:pStyle w:val="ListBullet"/>
               <w:numPr>
                 <w:ilvl w:val="0"/>
                 <w:numId w:val="0"/>
@@ -5990,7 +5924,7 @@
           </w:tcPr>
           <w:p>
             <w:pPr>
-              <w:pStyle w:val="a"/>
+              <w:pStyle w:val="ListBullet"/>
               <w:numPr>
                 <w:ilvl w:val="0"/>
                 <w:numId w:val="0"/>
@@ -6000,7 +5934,6 @@
                 <w:color w:val="auto"/>
               </w:rPr>
             </w:pPr>
-            <w:proofErr w:type="spellStart"/>
             <w:r>
               <w:rPr>
                 <w:rFonts w:ascii="Times New Roman" w:hAnsi="Times New Roman" w:cs="Times New Roman"/>
@@ -6008,17 +5941,7 @@
                 <w:bCs/>
                 <w:color w:val="auto"/>
               </w:rPr>
-              <w:t>PatientID</w:t>
-            </w:r>
-            <w:proofErr w:type="spellEnd"/>
-            <w:r>
-              <w:rPr>
-                <w:rFonts w:ascii="Times New Roman" w:hAnsi="Times New Roman" w:cs="Times New Roman"/>
-                <w:b/>
-                <w:bCs/>
-                <w:color w:val="auto"/>
-              </w:rPr>
-              <w:t xml:space="preserve"> (PK)</w:t>
+              <w:t>PatientID (PK)</w:t>
             </w:r>
             <w:r>
               <w:rPr>
@@ -6038,7 +5961,7 @@
           </w:tcPr>
           <w:p>
             <w:pPr>
-              <w:pStyle w:val="a"/>
+              <w:pStyle w:val="ListBullet"/>
               <w:numPr>
                 <w:ilvl w:val="0"/>
                 <w:numId w:val="0"/>
@@ -6065,7 +5988,7 @@
           </w:tcPr>
           <w:p>
             <w:pPr>
-              <w:pStyle w:val="a"/>
+              <w:pStyle w:val="ListBullet"/>
               <w:numPr>
                 <w:ilvl w:val="0"/>
                 <w:numId w:val="0"/>
@@ -6075,7 +5998,6 @@
                 <w:color w:val="auto"/>
               </w:rPr>
             </w:pPr>
-            <w:proofErr w:type="spellStart"/>
             <w:r>
               <w:rPr>
                 <w:rFonts w:ascii="Times New Roman" w:hAnsi="Times New Roman" w:cs="Times New Roman"/>
@@ -6083,34 +6005,15 @@
                 <w:bCs/>
                 <w:color w:val="auto"/>
               </w:rPr>
-              <w:t>DepartmentID</w:t>
-            </w:r>
-            <w:proofErr w:type="spellEnd"/>
-            <w:r>
-              <w:rPr>
-                <w:rFonts w:ascii="Times New Roman" w:hAnsi="Times New Roman" w:cs="Times New Roman"/>
-                <w:b/>
-                <w:bCs/>
-                <w:color w:val="auto"/>
-              </w:rPr>
-              <w:t xml:space="preserve"> (PK)</w:t>
+              <w:t>DepartmentID (PK)</w:t>
             </w:r>
             <w:r>
               <w:rPr>
                 <w:rFonts w:ascii="Times New Roman" w:hAnsi="Times New Roman" w:cs="Times New Roman"/>
                 <w:color w:val="auto"/>
               </w:rPr>
-              <w:t xml:space="preserve">, </w:t>
+              <w:t>, DepartmentName</w:t>
             </w:r>
-            <w:proofErr w:type="spellStart"/>
-            <w:r>
-              <w:rPr>
-                <w:rFonts w:ascii="Times New Roman" w:hAnsi="Times New Roman" w:cs="Times New Roman"/>
-                <w:color w:val="auto"/>
-              </w:rPr>
-              <w:t>DepartmentName</w:t>
-            </w:r>
-            <w:proofErr w:type="spellEnd"/>
           </w:p>
         </w:tc>
       </w:tr>
@@ -6122,7 +6025,7 @@
           </w:tcPr>
           <w:p>
             <w:pPr>
-              <w:pStyle w:val="a"/>
+              <w:pStyle w:val="ListBullet"/>
               <w:numPr>
                 <w:ilvl w:val="0"/>
                 <w:numId w:val="0"/>
@@ -6149,7 +6052,7 @@
           </w:tcPr>
           <w:p>
             <w:pPr>
-              <w:pStyle w:val="a"/>
+              <w:pStyle w:val="ListBullet"/>
               <w:numPr>
                 <w:ilvl w:val="0"/>
                 <w:numId w:val="0"/>
@@ -6159,7 +6062,6 @@
                 <w:color w:val="auto"/>
               </w:rPr>
             </w:pPr>
-            <w:proofErr w:type="spellStart"/>
             <w:r>
               <w:rPr>
                 <w:rFonts w:ascii="Times New Roman" w:hAnsi="Times New Roman" w:cs="Times New Roman"/>
@@ -6167,17 +6069,7 @@
                 <w:bCs/>
                 <w:color w:val="auto"/>
               </w:rPr>
-              <w:t>DoctorID</w:t>
-            </w:r>
-            <w:proofErr w:type="spellEnd"/>
-            <w:r>
-              <w:rPr>
-                <w:rFonts w:ascii="Times New Roman" w:hAnsi="Times New Roman" w:cs="Times New Roman"/>
-                <w:b/>
-                <w:bCs/>
-                <w:color w:val="auto"/>
-              </w:rPr>
-              <w:t xml:space="preserve"> (PK)</w:t>
+              <w:t>DoctorID (PK)</w:t>
             </w:r>
             <w:r>
               <w:rPr>
@@ -6186,7 +6078,6 @@
               </w:rPr>
               <w:t xml:space="preserve">, FirstName, LastName, Phone, </w:t>
             </w:r>
-            <w:proofErr w:type="spellStart"/>
             <w:r>
               <w:rPr>
                 <w:rFonts w:ascii="Times New Roman" w:hAnsi="Times New Roman" w:cs="Times New Roman"/>
@@ -6194,17 +6085,7 @@
                 <w:bCs/>
                 <w:color w:val="auto"/>
               </w:rPr>
-              <w:t>DepartmentID</w:t>
-            </w:r>
-            <w:proofErr w:type="spellEnd"/>
-            <w:r>
-              <w:rPr>
-                <w:rFonts w:ascii="Times New Roman" w:hAnsi="Times New Roman" w:cs="Times New Roman"/>
-                <w:b/>
-                <w:bCs/>
-                <w:color w:val="auto"/>
-              </w:rPr>
-              <w:t xml:space="preserve"> (FK)</w:t>
+              <w:t>DepartmentID (FK)</w:t>
             </w:r>
           </w:p>
         </w:tc>
@@ -6217,7 +6098,7 @@
           </w:tcPr>
           <w:p>
             <w:pPr>
-              <w:pStyle w:val="a"/>
+              <w:pStyle w:val="ListBullet"/>
               <w:numPr>
                 <w:ilvl w:val="0"/>
                 <w:numId w:val="0"/>
@@ -6228,7 +6109,6 @@
                 <w:color w:val="auto"/>
               </w:rPr>
             </w:pPr>
-            <w:proofErr w:type="spellStart"/>
             <w:r>
               <w:rPr>
                 <w:rFonts w:ascii="Times New Roman" w:hAnsi="Times New Roman" w:cs="Times New Roman"/>
@@ -6236,7 +6116,6 @@
               </w:rPr>
               <w:t>GeneralPractitioner</w:t>
             </w:r>
-            <w:proofErr w:type="spellEnd"/>
           </w:p>
         </w:tc>
         <w:tc>
@@ -6246,7 +6125,7 @@
           </w:tcPr>
           <w:p>
             <w:pPr>
-              <w:pStyle w:val="a"/>
+              <w:pStyle w:val="ListBullet"/>
               <w:numPr>
                 <w:ilvl w:val="0"/>
                 <w:numId w:val="0"/>
@@ -6258,7 +6137,6 @@
                 <w:color w:val="auto"/>
               </w:rPr>
             </w:pPr>
-            <w:proofErr w:type="spellStart"/>
             <w:r>
               <w:rPr>
                 <w:rFonts w:ascii="Times New Roman" w:hAnsi="Times New Roman" w:cs="Times New Roman"/>
@@ -6266,17 +6144,7 @@
                 <w:bCs/>
                 <w:color w:val="auto"/>
               </w:rPr>
-              <w:t>DoctorID</w:t>
-            </w:r>
-            <w:proofErr w:type="spellEnd"/>
-            <w:r>
-              <w:rPr>
-                <w:rFonts w:ascii="Times New Roman" w:hAnsi="Times New Roman" w:cs="Times New Roman"/>
-                <w:b/>
-                <w:bCs/>
-                <w:color w:val="auto"/>
-              </w:rPr>
-              <w:t xml:space="preserve"> (PK, FK)</w:t>
+              <w:t>DoctorID (PK, FK)</w:t>
             </w:r>
           </w:p>
         </w:tc>
@@ -6289,7 +6157,7 @@
           </w:tcPr>
           <w:p>
             <w:pPr>
-              <w:pStyle w:val="a"/>
+              <w:pStyle w:val="ListBullet"/>
               <w:numPr>
                 <w:ilvl w:val="0"/>
                 <w:numId w:val="0"/>
@@ -6316,7 +6184,7 @@
           </w:tcPr>
           <w:p>
             <w:pPr>
-              <w:pStyle w:val="a"/>
+              <w:pStyle w:val="ListBullet"/>
               <w:numPr>
                 <w:ilvl w:val="0"/>
                 <w:numId w:val="0"/>
@@ -6326,7 +6194,6 @@
                 <w:color w:val="auto"/>
               </w:rPr>
             </w:pPr>
-            <w:proofErr w:type="spellStart"/>
             <w:r>
               <w:rPr>
                 <w:rFonts w:ascii="Times New Roman" w:hAnsi="Times New Roman" w:cs="Times New Roman"/>
@@ -6334,17 +6201,7 @@
                 <w:bCs/>
                 <w:color w:val="auto"/>
               </w:rPr>
-              <w:t>DoctorID</w:t>
-            </w:r>
-            <w:proofErr w:type="spellEnd"/>
-            <w:r>
-              <w:rPr>
-                <w:rFonts w:ascii="Times New Roman" w:hAnsi="Times New Roman" w:cs="Times New Roman"/>
-                <w:b/>
-                <w:bCs/>
-                <w:color w:val="auto"/>
-              </w:rPr>
-              <w:t xml:space="preserve"> (PK, FK)</w:t>
+              <w:t>DoctorID (PK, FK)</w:t>
             </w:r>
             <w:r>
               <w:rPr>
@@ -6364,7 +6221,7 @@
           </w:tcPr>
           <w:p>
             <w:pPr>
-              <w:pStyle w:val="a"/>
+              <w:pStyle w:val="ListBullet"/>
               <w:numPr>
                 <w:ilvl w:val="0"/>
                 <w:numId w:val="0"/>
@@ -6391,7 +6248,7 @@
           </w:tcPr>
           <w:p>
             <w:pPr>
-              <w:pStyle w:val="a"/>
+              <w:pStyle w:val="ListBullet"/>
               <w:numPr>
                 <w:ilvl w:val="0"/>
                 <w:numId w:val="0"/>
@@ -6401,7 +6258,6 @@
                 <w:color w:val="auto"/>
               </w:rPr>
             </w:pPr>
-            <w:proofErr w:type="spellStart"/>
             <w:r>
               <w:rPr>
                 <w:rFonts w:ascii="Times New Roman" w:hAnsi="Times New Roman" w:cs="Times New Roman"/>
@@ -6409,9 +6265,15 @@
                 <w:bCs/>
                 <w:color w:val="auto"/>
               </w:rPr>
-              <w:t>AppointmentID</w:t>
+              <w:t>AppointmentID (PK)</w:t>
             </w:r>
-            <w:proofErr w:type="spellEnd"/>
+            <w:r>
+              <w:rPr>
+                <w:rFonts w:ascii="Times New Roman" w:hAnsi="Times New Roman" w:cs="Times New Roman"/>
+                <w:color w:val="auto"/>
+              </w:rPr>
+              <w:t xml:space="preserve">, AppointmentDate, Status, </w:t>
+            </w:r>
             <w:r>
               <w:rPr>
                 <w:rFonts w:ascii="Times New Roman" w:hAnsi="Times New Roman" w:cs="Times New Roman"/>
@@ -6419,7 +6281,7 @@
                 <w:bCs/>
                 <w:color w:val="auto"/>
               </w:rPr>
-              <w:t xml:space="preserve"> (PK)</w:t>
+              <w:t>PatientID (FK)</w:t>
             </w:r>
             <w:r>
               <w:rPr>
@@ -6428,23 +6290,6 @@
               </w:rPr>
               <w:t xml:space="preserve">, </w:t>
             </w:r>
-            <w:proofErr w:type="spellStart"/>
-            <w:r>
-              <w:rPr>
-                <w:rFonts w:ascii="Times New Roman" w:hAnsi="Times New Roman" w:cs="Times New Roman"/>
-                <w:color w:val="auto"/>
-              </w:rPr>
-              <w:t>AppointmentDate</w:t>
-            </w:r>
-            <w:proofErr w:type="spellEnd"/>
-            <w:r>
-              <w:rPr>
-                <w:rFonts w:ascii="Times New Roman" w:hAnsi="Times New Roman" w:cs="Times New Roman"/>
-                <w:color w:val="auto"/>
-              </w:rPr>
-              <w:t xml:space="preserve">, Status, </w:t>
-            </w:r>
-            <w:proofErr w:type="spellStart"/>
             <w:r>
               <w:rPr>
                 <w:rFonts w:ascii="Times New Roman" w:hAnsi="Times New Roman" w:cs="Times New Roman"/>
@@ -6452,44 +6297,7 @@
                 <w:bCs/>
                 <w:color w:val="auto"/>
               </w:rPr>
-              <w:t>PatientID</w:t>
-            </w:r>
-            <w:proofErr w:type="spellEnd"/>
-            <w:r>
-              <w:rPr>
-                <w:rFonts w:ascii="Times New Roman" w:hAnsi="Times New Roman" w:cs="Times New Roman"/>
-                <w:b/>
-                <w:bCs/>
-                <w:color w:val="auto"/>
-              </w:rPr>
-              <w:t xml:space="preserve"> (FK)</w:t>
-            </w:r>
-            <w:r>
-              <w:rPr>
-                <w:rFonts w:ascii="Times New Roman" w:hAnsi="Times New Roman" w:cs="Times New Roman"/>
-                <w:color w:val="auto"/>
-              </w:rPr>
-              <w:t xml:space="preserve">, </w:t>
-            </w:r>
-            <w:proofErr w:type="spellStart"/>
-            <w:r>
-              <w:rPr>
-                <w:rFonts w:ascii="Times New Roman" w:hAnsi="Times New Roman" w:cs="Times New Roman"/>
-                <w:b/>
-                <w:bCs/>
-                <w:color w:val="auto"/>
-              </w:rPr>
-              <w:t>DoctorID</w:t>
-            </w:r>
-            <w:proofErr w:type="spellEnd"/>
-            <w:r>
-              <w:rPr>
-                <w:rFonts w:ascii="Times New Roman" w:hAnsi="Times New Roman" w:cs="Times New Roman"/>
-                <w:b/>
-                <w:bCs/>
-                <w:color w:val="auto"/>
-              </w:rPr>
-              <w:t xml:space="preserve"> (FK)</w:t>
+              <w:t>DoctorID (FK)</w:t>
             </w:r>
           </w:p>
         </w:tc>
@@ -6502,7 +6310,7 @@
           </w:tcPr>
           <w:p>
             <w:pPr>
-              <w:pStyle w:val="a"/>
+              <w:pStyle w:val="ListBullet"/>
               <w:numPr>
                 <w:ilvl w:val="0"/>
                 <w:numId w:val="0"/>
@@ -6529,7 +6337,7 @@
           </w:tcPr>
           <w:p>
             <w:pPr>
-              <w:pStyle w:val="a"/>
+              <w:pStyle w:val="ListBullet"/>
               <w:numPr>
                 <w:ilvl w:val="0"/>
                 <w:numId w:val="0"/>
@@ -6539,7 +6347,6 @@
                 <w:color w:val="auto"/>
               </w:rPr>
             </w:pPr>
-            <w:proofErr w:type="spellStart"/>
             <w:r>
               <w:rPr>
                 <w:rFonts w:ascii="Times New Roman" w:hAnsi="Times New Roman" w:cs="Times New Roman"/>
@@ -6547,17 +6354,7 @@
                 <w:bCs/>
                 <w:color w:val="auto"/>
               </w:rPr>
-              <w:t>TreatmentID</w:t>
-            </w:r>
-            <w:proofErr w:type="spellEnd"/>
-            <w:r>
-              <w:rPr>
-                <w:rFonts w:ascii="Times New Roman" w:hAnsi="Times New Roman" w:cs="Times New Roman"/>
-                <w:b/>
-                <w:bCs/>
-                <w:color w:val="auto"/>
-              </w:rPr>
-              <w:t xml:space="preserve"> (PK)</w:t>
+              <w:t>TreatmentID (PK)</w:t>
             </w:r>
             <w:r>
               <w:rPr>
@@ -6566,7 +6363,6 @@
               </w:rPr>
               <w:t xml:space="preserve">, Diagnosis, </w:t>
             </w:r>
-            <w:proofErr w:type="spellStart"/>
             <w:r>
               <w:rPr>
                 <w:rFonts w:ascii="Times New Roman" w:hAnsi="Times New Roman" w:cs="Times New Roman"/>
@@ -6574,17 +6370,7 @@
                 <w:bCs/>
                 <w:color w:val="auto"/>
               </w:rPr>
-              <w:t>AppointmentID</w:t>
-            </w:r>
-            <w:proofErr w:type="spellEnd"/>
-            <w:r>
-              <w:rPr>
-                <w:rFonts w:ascii="Times New Roman" w:hAnsi="Times New Roman" w:cs="Times New Roman"/>
-                <w:b/>
-                <w:bCs/>
-                <w:color w:val="auto"/>
-              </w:rPr>
-              <w:t xml:space="preserve"> (FK)</w:t>
+              <w:t>AppointmentID (FK)</w:t>
             </w:r>
           </w:p>
         </w:tc>
@@ -6597,7 +6383,7 @@
           </w:tcPr>
           <w:p>
             <w:pPr>
-              <w:pStyle w:val="a"/>
+              <w:pStyle w:val="ListBullet"/>
               <w:numPr>
                 <w:ilvl w:val="0"/>
                 <w:numId w:val="0"/>
@@ -6624,7 +6410,7 @@
           </w:tcPr>
           <w:p>
             <w:pPr>
-              <w:pStyle w:val="a"/>
+              <w:pStyle w:val="ListBullet"/>
               <w:numPr>
                 <w:ilvl w:val="0"/>
                 <w:numId w:val="0"/>
@@ -6634,7 +6420,6 @@
                 <w:color w:val="auto"/>
               </w:rPr>
             </w:pPr>
-            <w:proofErr w:type="spellStart"/>
             <w:r>
               <w:rPr>
                 <w:rFonts w:ascii="Times New Roman" w:hAnsi="Times New Roman" w:cs="Times New Roman"/>
@@ -6642,9 +6427,15 @@
                 <w:bCs/>
                 <w:color w:val="auto"/>
               </w:rPr>
-              <w:t>PaymentID</w:t>
+              <w:t>PaymentID (PK)</w:t>
             </w:r>
-            <w:proofErr w:type="spellEnd"/>
+            <w:r>
+              <w:rPr>
+                <w:rFonts w:ascii="Times New Roman" w:hAnsi="Times New Roman" w:cs="Times New Roman"/>
+                <w:color w:val="auto"/>
+              </w:rPr>
+              <w:t xml:space="preserve">, Amount, PaymentMethod, </w:t>
+            </w:r>
             <w:r>
               <w:rPr>
                 <w:rFonts w:ascii="Times New Roman" w:hAnsi="Times New Roman" w:cs="Times New Roman"/>
@@ -6652,50 +6443,7 @@
                 <w:bCs/>
                 <w:color w:val="auto"/>
               </w:rPr>
-              <w:t xml:space="preserve"> (PK)</w:t>
-            </w:r>
-            <w:r>
-              <w:rPr>
-                <w:rFonts w:ascii="Times New Roman" w:hAnsi="Times New Roman" w:cs="Times New Roman"/>
-                <w:color w:val="auto"/>
-              </w:rPr>
-              <w:t xml:space="preserve">, Amount, </w:t>
-            </w:r>
-            <w:proofErr w:type="spellStart"/>
-            <w:r>
-              <w:rPr>
-                <w:rFonts w:ascii="Times New Roman" w:hAnsi="Times New Roman" w:cs="Times New Roman"/>
-                <w:color w:val="auto"/>
-              </w:rPr>
-              <w:t>PaymentMethod</w:t>
-            </w:r>
-            <w:proofErr w:type="spellEnd"/>
-            <w:r>
-              <w:rPr>
-                <w:rFonts w:ascii="Times New Roman" w:hAnsi="Times New Roman" w:cs="Times New Roman"/>
-                <w:color w:val="auto"/>
-              </w:rPr>
-              <w:t xml:space="preserve">, </w:t>
-            </w:r>
-            <w:proofErr w:type="spellStart"/>
-            <w:r>
-              <w:rPr>
-                <w:rFonts w:ascii="Times New Roman" w:hAnsi="Times New Roman" w:cs="Times New Roman"/>
-                <w:b/>
-                <w:bCs/>
-                <w:color w:val="auto"/>
-              </w:rPr>
-              <w:t>AppointmentID</w:t>
-            </w:r>
-            <w:proofErr w:type="spellEnd"/>
-            <w:r>
-              <w:rPr>
-                <w:rFonts w:ascii="Times New Roman" w:hAnsi="Times New Roman" w:cs="Times New Roman"/>
-                <w:b/>
-                <w:bCs/>
-                <w:color w:val="auto"/>
-              </w:rPr>
-              <w:t xml:space="preserve"> (FK</w:t>
+              <w:t>AppointmentID (FK</w:t>
             </w:r>
             <w:r>
               <w:rPr>
@@ -6710,7 +6458,7 @@
     </w:tbl>
     <w:p>
       <w:pPr>
-        <w:pStyle w:val="a"/>
+        <w:pStyle w:val="ListBullet"/>
         <w:numPr>
           <w:ilvl w:val="0"/>
           <w:numId w:val="0"/>
@@ -6728,7 +6476,7 @@
     </w:p>
     <w:p>
       <w:pPr>
-        <w:pStyle w:val="a"/>
+        <w:pStyle w:val="ListBullet"/>
         <w:numPr>
           <w:ilvl w:val="0"/>
           <w:numId w:val="30"/>
@@ -6768,7 +6516,7 @@
     </w:p>
     <w:p>
       <w:pPr>
-        <w:pStyle w:val="a"/>
+        <w:pStyle w:val="ListBullet"/>
         <w:numPr>
           <w:ilvl w:val="0"/>
           <w:numId w:val="0"/>
@@ -6784,7 +6532,7 @@
     </w:p>
     <w:tbl>
       <w:tblPr>
-        <w:tblStyle w:val="a8"/>
+        <w:tblStyle w:val="TableGrid"/>
         <w:tblW w:w="0" w:type="auto"/>
         <w:jc w:val="center"/>
         <w:tblLook w:val="04A0" w:firstRow="1" w:lastRow="0" w:firstColumn="1" w:lastColumn="0" w:noHBand="0" w:noVBand="1"/>
@@ -6805,7 +6553,7 @@
           </w:tcPr>
           <w:p>
             <w:pPr>
-              <w:pStyle w:val="a"/>
+              <w:pStyle w:val="ListBullet"/>
               <w:numPr>
                 <w:ilvl w:val="0"/>
                 <w:numId w:val="0"/>
@@ -6834,7 +6582,7 @@
           </w:tcPr>
           <w:p>
             <w:pPr>
-              <w:pStyle w:val="a"/>
+              <w:pStyle w:val="ListBullet"/>
               <w:numPr>
                 <w:ilvl w:val="0"/>
                 <w:numId w:val="0"/>
@@ -6863,7 +6611,7 @@
           </w:tcPr>
           <w:p>
             <w:pPr>
-              <w:pStyle w:val="a"/>
+              <w:pStyle w:val="ListBullet"/>
               <w:numPr>
                 <w:ilvl w:val="0"/>
                 <w:numId w:val="0"/>
@@ -6897,7 +6645,7 @@
           </w:tcPr>
           <w:p>
             <w:pPr>
-              <w:pStyle w:val="a"/>
+              <w:pStyle w:val="ListBullet"/>
               <w:numPr>
                 <w:ilvl w:val="0"/>
                 <w:numId w:val="0"/>
@@ -6923,7 +6671,7 @@
           </w:tcPr>
           <w:p>
             <w:pPr>
-              <w:pStyle w:val="a"/>
+              <w:pStyle w:val="ListBullet"/>
               <w:numPr>
                 <w:ilvl w:val="0"/>
                 <w:numId w:val="0"/>
@@ -6949,7 +6697,7 @@
           </w:tcPr>
           <w:p>
             <w:pPr>
-              <w:pStyle w:val="a"/>
+              <w:pStyle w:val="ListBullet"/>
               <w:numPr>
                 <w:ilvl w:val="0"/>
                 <w:numId w:val="0"/>
@@ -6980,7 +6728,7 @@
           </w:tcPr>
           <w:p>
             <w:pPr>
-              <w:pStyle w:val="a"/>
+              <w:pStyle w:val="ListBullet"/>
               <w:numPr>
                 <w:ilvl w:val="0"/>
                 <w:numId w:val="0"/>
@@ -7006,7 +6754,7 @@
           </w:tcPr>
           <w:p>
             <w:pPr>
-              <w:pStyle w:val="a"/>
+              <w:pStyle w:val="ListBullet"/>
               <w:numPr>
                 <w:ilvl w:val="0"/>
                 <w:numId w:val="0"/>
@@ -7032,7 +6780,7 @@
           </w:tcPr>
           <w:p>
             <w:pPr>
-              <w:pStyle w:val="a"/>
+              <w:pStyle w:val="ListBullet"/>
               <w:numPr>
                 <w:ilvl w:val="0"/>
                 <w:numId w:val="0"/>
@@ -7063,7 +6811,7 @@
           </w:tcPr>
           <w:p>
             <w:pPr>
-              <w:pStyle w:val="a"/>
+              <w:pStyle w:val="ListBullet"/>
               <w:numPr>
                 <w:ilvl w:val="0"/>
                 <w:numId w:val="0"/>
@@ -7089,7 +6837,7 @@
           </w:tcPr>
           <w:p>
             <w:pPr>
-              <w:pStyle w:val="a"/>
+              <w:pStyle w:val="ListBullet"/>
               <w:numPr>
                 <w:ilvl w:val="0"/>
                 <w:numId w:val="0"/>
@@ -7115,7 +6863,7 @@
           </w:tcPr>
           <w:p>
             <w:pPr>
-              <w:pStyle w:val="a"/>
+              <w:pStyle w:val="ListBullet"/>
               <w:numPr>
                 <w:ilvl w:val="0"/>
                 <w:numId w:val="0"/>
@@ -7146,7 +6894,7 @@
           </w:tcPr>
           <w:p>
             <w:pPr>
-              <w:pStyle w:val="a"/>
+              <w:pStyle w:val="ListBullet"/>
               <w:numPr>
                 <w:ilvl w:val="0"/>
                 <w:numId w:val="0"/>
@@ -7172,7 +6920,7 @@
           </w:tcPr>
           <w:p>
             <w:pPr>
-              <w:pStyle w:val="a"/>
+              <w:pStyle w:val="ListBullet"/>
               <w:numPr>
                 <w:ilvl w:val="0"/>
                 <w:numId w:val="0"/>
@@ -7198,7 +6946,7 @@
           </w:tcPr>
           <w:p>
             <w:pPr>
-              <w:pStyle w:val="a"/>
+              <w:pStyle w:val="ListBullet"/>
               <w:numPr>
                 <w:ilvl w:val="0"/>
                 <w:numId w:val="0"/>
@@ -7229,7 +6977,7 @@
           </w:tcPr>
           <w:p>
             <w:pPr>
-              <w:pStyle w:val="a"/>
+              <w:pStyle w:val="ListBullet"/>
               <w:numPr>
                 <w:ilvl w:val="0"/>
                 <w:numId w:val="0"/>
@@ -7255,7 +7003,7 @@
           </w:tcPr>
           <w:p>
             <w:pPr>
-              <w:pStyle w:val="a"/>
+              <w:pStyle w:val="ListBullet"/>
               <w:numPr>
                 <w:ilvl w:val="0"/>
                 <w:numId w:val="0"/>
@@ -7281,7 +7029,7 @@
           </w:tcPr>
           <w:p>
             <w:pPr>
-              <w:pStyle w:val="a"/>
+              <w:pStyle w:val="ListBullet"/>
               <w:numPr>
                 <w:ilvl w:val="0"/>
                 <w:numId w:val="0"/>
@@ -7305,7 +7053,7 @@
     </w:tbl>
     <w:p>
       <w:pPr>
-        <w:pStyle w:val="a"/>
+        <w:pStyle w:val="ListBullet"/>
         <w:numPr>
           <w:ilvl w:val="0"/>
           <w:numId w:val="0"/>
@@ -7321,7 +7069,7 @@
     </w:p>
     <w:p>
       <w:pPr>
-        <w:pStyle w:val="a"/>
+        <w:pStyle w:val="ListBullet"/>
         <w:numPr>
           <w:ilvl w:val="0"/>
           <w:numId w:val="30"/>
@@ -7349,7 +7097,7 @@
     </w:p>
     <w:p>
       <w:pPr>
-        <w:pStyle w:val="a"/>
+        <w:pStyle w:val="ListBullet"/>
         <w:numPr>
           <w:ilvl w:val="0"/>
           <w:numId w:val="38"/>
@@ -7378,7 +7126,7 @@
     </w:p>
     <w:p>
       <w:pPr>
-        <w:pStyle w:val="a"/>
+        <w:pStyle w:val="ListBullet"/>
         <w:numPr>
           <w:ilvl w:val="0"/>
           <w:numId w:val="38"/>
@@ -7407,7 +7155,7 @@
     </w:p>
     <w:p>
       <w:pPr>
-        <w:pStyle w:val="a"/>
+        <w:pStyle w:val="ListBullet"/>
         <w:numPr>
           <w:ilvl w:val="0"/>
           <w:numId w:val="38"/>
@@ -7436,7 +7184,7 @@
     </w:p>
     <w:p>
       <w:pPr>
-        <w:pStyle w:val="a"/>
+        <w:pStyle w:val="ListBullet"/>
         <w:numPr>
           <w:ilvl w:val="0"/>
           <w:numId w:val="38"/>
@@ -7465,7 +7213,7 @@
     </w:p>
     <w:p>
       <w:pPr>
-        <w:pStyle w:val="a"/>
+        <w:pStyle w:val="ListBullet"/>
         <w:numPr>
           <w:ilvl w:val="0"/>
           <w:numId w:val="38"/>
@@ -7494,7 +7242,7 @@
     </w:p>
     <w:p>
       <w:pPr>
-        <w:pStyle w:val="a"/>
+        <w:pStyle w:val="ListBullet"/>
         <w:numPr>
           <w:ilvl w:val="0"/>
           <w:numId w:val="38"/>
@@ -7523,7 +7271,7 @@
     </w:p>
     <w:p>
       <w:pPr>
-        <w:pStyle w:val="a"/>
+        <w:pStyle w:val="ListBullet"/>
         <w:numPr>
           <w:ilvl w:val="0"/>
           <w:numId w:val="38"/>
@@ -7552,7 +7300,7 @@
     </w:p>
     <w:p>
       <w:pPr>
-        <w:pStyle w:val="a"/>
+        <w:pStyle w:val="ListBullet"/>
         <w:numPr>
           <w:ilvl w:val="0"/>
           <w:numId w:val="38"/>
@@ -7581,7 +7329,7 @@
     </w:p>
     <w:p>
       <w:pPr>
-        <w:pStyle w:val="a"/>
+        <w:pStyle w:val="ListBullet"/>
         <w:numPr>
           <w:ilvl w:val="0"/>
           <w:numId w:val="0"/>
@@ -7599,100 +7347,420 @@
     </w:p>
     <w:p>
       <w:pPr>
-        <w:pStyle w:val="1"/>
-      </w:pPr>
-      <w:r>
-        <w:lastRenderedPageBreak/>
-        <w:t>Task 2 – Database Implementation (6 Marks)</w:t>
-      </w:r>
-    </w:p>
-    <w:p>
-      <w:pPr>
-        <w:pStyle w:val="a"/>
+        <w:pStyle w:val="ListBullet"/>
         <w:numPr>
           <w:ilvl w:val="0"/>
           <w:numId w:val="0"/>
         </w:numPr>
-        <w:rPr>
-          <w:rFonts w:ascii="Times New Roman" w:hAnsi="Times New Roman" w:cs="Times New Roman"/>
-          <w:color w:val="auto"/>
-          <w:sz w:val="24"/>
-          <w:szCs w:val="24"/>
-        </w:rPr>
-      </w:pPr>
-      <w:r>
-        <w:rPr>
-          <w:rFonts w:ascii="Times New Roman" w:hAnsi="Times New Roman" w:cs="Times New Roman"/>
-          <w:color w:val="auto"/>
-          <w:sz w:val="24"/>
-          <w:szCs w:val="24"/>
-        </w:rPr>
-        <w:t>Complete the following tasks using MySQL. Include screenshots of both your SQL code and the corresponding output (results) for each task:</w:t>
-      </w:r>
+        <w:ind w:left="720"/>
+        <w:rPr>
+          <w:rFonts w:ascii="Times New Roman" w:hAnsi="Times New Roman" w:cs="Times New Roman"/>
+          <w:b/>
+          <w:bCs/>
+          <w:color w:val="262626" w:themeColor="accent6" w:themeShade="80"/>
+          <w:sz w:val="24"/>
+          <w:szCs w:val="24"/>
+        </w:rPr>
+      </w:pPr>
     </w:p>
     <w:p>
       <w:pPr>
-        <w:pStyle w:val="a"/>
-        <w:rPr>
-          <w:rFonts w:ascii="Times New Roman" w:hAnsi="Times New Roman" w:cs="Times New Roman"/>
-          <w:color w:val="auto"/>
-          <w:sz w:val="24"/>
-          <w:szCs w:val="24"/>
-        </w:rPr>
-      </w:pPr>
-      <w:r>
-        <w:rPr>
-          <w:rFonts w:ascii="Times New Roman" w:hAnsi="Times New Roman" w:cs="Times New Roman"/>
-          <w:color w:val="auto"/>
-          <w:sz w:val="24"/>
-          <w:szCs w:val="24"/>
-        </w:rPr>
-        <w:t>Create the database and all required tables.</w:t>
-      </w:r>
+        <w:pStyle w:val="ListBullet"/>
+        <w:numPr>
+          <w:ilvl w:val="0"/>
+          <w:numId w:val="0"/>
+        </w:numPr>
+        <w:ind w:left="720"/>
+        <w:rPr>
+          <w:rFonts w:ascii="Times New Roman" w:hAnsi="Times New Roman" w:cs="Times New Roman"/>
+          <w:b/>
+          <w:bCs/>
+          <w:color w:val="262626" w:themeColor="accent6" w:themeShade="80"/>
+          <w:sz w:val="24"/>
+          <w:szCs w:val="24"/>
+        </w:rPr>
+      </w:pPr>
     </w:p>
     <w:p>
       <w:pPr>
-        <w:pStyle w:val="a"/>
-        <w:rPr>
-          <w:rFonts w:ascii="Times New Roman" w:hAnsi="Times New Roman" w:cs="Times New Roman"/>
-          <w:color w:val="auto"/>
-          <w:sz w:val="24"/>
-          <w:szCs w:val="24"/>
-        </w:rPr>
-      </w:pPr>
-      <w:r>
-        <w:rPr>
-          <w:rFonts w:ascii="Times New Roman" w:hAnsi="Times New Roman" w:cs="Times New Roman"/>
-          <w:color w:val="auto"/>
-          <w:sz w:val="24"/>
-          <w:szCs w:val="24"/>
-        </w:rPr>
-        <w:t>Use appropriate data types and constraints (PRIMARY KEY, FOREIGN KEY, NOT NULL, UNIQUE, etc.).</w:t>
-      </w:r>
+        <w:pStyle w:val="ListBullet"/>
+        <w:numPr>
+          <w:ilvl w:val="0"/>
+          <w:numId w:val="0"/>
+        </w:numPr>
+        <w:ind w:left="720"/>
+        <w:rPr>
+          <w:rFonts w:ascii="Times New Roman" w:hAnsi="Times New Roman" w:cs="Times New Roman"/>
+          <w:b/>
+          <w:bCs/>
+          <w:color w:val="262626" w:themeColor="accent6" w:themeShade="80"/>
+          <w:sz w:val="24"/>
+          <w:szCs w:val="24"/>
+        </w:rPr>
+      </w:pPr>
     </w:p>
     <w:p>
       <w:pPr>
-        <w:pStyle w:val="a"/>
-        <w:rPr>
-          <w:rFonts w:ascii="Times New Roman" w:hAnsi="Times New Roman" w:cs="Times New Roman"/>
-          <w:color w:val="auto"/>
-          <w:sz w:val="24"/>
-          <w:szCs w:val="24"/>
-        </w:rPr>
-      </w:pPr>
-      <w:r>
-        <w:rPr>
-          <w:rFonts w:ascii="Times New Roman" w:hAnsi="Times New Roman" w:cs="Times New Roman"/>
-          <w:color w:val="auto"/>
-          <w:sz w:val="24"/>
-          <w:szCs w:val="24"/>
-        </w:rPr>
-        <w:t>Insert at least 5 records into each main table.</w:t>
-      </w:r>
+        <w:pStyle w:val="ListBullet"/>
+        <w:numPr>
+          <w:ilvl w:val="0"/>
+          <w:numId w:val="0"/>
+        </w:numPr>
+        <w:ind w:left="720"/>
+        <w:rPr>
+          <w:rFonts w:ascii="Times New Roman" w:hAnsi="Times New Roman" w:cs="Times New Roman"/>
+          <w:b/>
+          <w:bCs/>
+          <w:color w:val="262626" w:themeColor="accent6" w:themeShade="80"/>
+          <w:sz w:val="24"/>
+          <w:szCs w:val="24"/>
+        </w:rPr>
+      </w:pPr>
     </w:p>
     <w:p>
       <w:pPr>
-        <w:pStyle w:val="a"/>
+        <w:pStyle w:val="ListBullet"/>
+        <w:numPr>
+          <w:ilvl w:val="0"/>
+          <w:numId w:val="0"/>
+        </w:numPr>
+        <w:ind w:left="720"/>
+        <w:rPr>
+          <w:rFonts w:ascii="Times New Roman" w:hAnsi="Times New Roman" w:cs="Times New Roman"/>
+          <w:b/>
+          <w:bCs/>
+          <w:color w:val="262626" w:themeColor="accent6" w:themeShade="80"/>
+          <w:sz w:val="24"/>
+          <w:szCs w:val="24"/>
+        </w:rPr>
+      </w:pPr>
+    </w:p>
+    <w:p>
+      <w:pPr>
+        <w:pStyle w:val="ListBullet"/>
+        <w:numPr>
+          <w:ilvl w:val="0"/>
+          <w:numId w:val="0"/>
+        </w:numPr>
+        <w:ind w:left="720"/>
+        <w:rPr>
+          <w:rFonts w:ascii="Times New Roman" w:hAnsi="Times New Roman" w:cs="Times New Roman"/>
+          <w:b/>
+          <w:bCs/>
+          <w:color w:val="262626" w:themeColor="accent6" w:themeShade="80"/>
+          <w:sz w:val="24"/>
+          <w:szCs w:val="24"/>
+        </w:rPr>
+      </w:pPr>
+    </w:p>
+    <w:p>
+      <w:pPr>
+        <w:pStyle w:val="ListBullet"/>
+        <w:numPr>
+          <w:ilvl w:val="0"/>
+          <w:numId w:val="0"/>
+        </w:numPr>
+        <w:ind w:left="720"/>
+        <w:rPr>
+          <w:rFonts w:ascii="Times New Roman" w:hAnsi="Times New Roman" w:cs="Times New Roman"/>
+          <w:b/>
+          <w:bCs/>
+          <w:color w:val="262626" w:themeColor="accent6" w:themeShade="80"/>
+          <w:sz w:val="24"/>
+          <w:szCs w:val="24"/>
+        </w:rPr>
+      </w:pPr>
+    </w:p>
+    <w:p>
+      <w:pPr>
+        <w:pStyle w:val="ListBullet"/>
+        <w:numPr>
+          <w:ilvl w:val="0"/>
+          <w:numId w:val="0"/>
+        </w:numPr>
+        <w:ind w:left="720"/>
+        <w:rPr>
+          <w:rFonts w:ascii="Times New Roman" w:hAnsi="Times New Roman" w:cs="Times New Roman"/>
+          <w:b/>
+          <w:bCs/>
+          <w:color w:val="262626" w:themeColor="accent6" w:themeShade="80"/>
+          <w:sz w:val="24"/>
+          <w:szCs w:val="24"/>
+        </w:rPr>
+      </w:pPr>
+    </w:p>
+    <w:p>
+      <w:pPr>
+        <w:pStyle w:val="ListBullet"/>
+        <w:numPr>
+          <w:ilvl w:val="0"/>
+          <w:numId w:val="0"/>
+        </w:numPr>
+        <w:ind w:left="720"/>
+        <w:rPr>
+          <w:rFonts w:ascii="Times New Roman" w:hAnsi="Times New Roman" w:cs="Times New Roman"/>
+          <w:b/>
+          <w:bCs/>
+          <w:color w:val="262626" w:themeColor="accent6" w:themeShade="80"/>
+          <w:sz w:val="24"/>
+          <w:szCs w:val="24"/>
+        </w:rPr>
+      </w:pPr>
+    </w:p>
+    <w:p>
+      <w:pPr>
+        <w:pStyle w:val="ListBullet"/>
+        <w:numPr>
+          <w:ilvl w:val="0"/>
+          <w:numId w:val="0"/>
+        </w:numPr>
+        <w:ind w:left="720"/>
+        <w:rPr>
+          <w:rFonts w:ascii="Times New Roman" w:hAnsi="Times New Roman" w:cs="Times New Roman"/>
+          <w:b/>
+          <w:bCs/>
+          <w:color w:val="262626" w:themeColor="accent6" w:themeShade="80"/>
+          <w:sz w:val="24"/>
+          <w:szCs w:val="24"/>
+        </w:rPr>
+      </w:pPr>
+    </w:p>
+    <w:p>
+      <w:pPr>
+        <w:pStyle w:val="ListBullet"/>
+        <w:numPr>
+          <w:ilvl w:val="0"/>
+          <w:numId w:val="0"/>
+        </w:numPr>
+        <w:ind w:left="720"/>
+        <w:rPr>
+          <w:rFonts w:ascii="Times New Roman" w:hAnsi="Times New Roman" w:cs="Times New Roman"/>
+          <w:b/>
+          <w:bCs/>
+          <w:color w:val="262626" w:themeColor="accent6" w:themeShade="80"/>
+          <w:sz w:val="24"/>
+          <w:szCs w:val="24"/>
+        </w:rPr>
+      </w:pPr>
+    </w:p>
+    <w:p>
+      <w:pPr>
+        <w:pStyle w:val="ListBullet"/>
+        <w:numPr>
+          <w:ilvl w:val="0"/>
+          <w:numId w:val="0"/>
+        </w:numPr>
+        <w:ind w:left="720"/>
+        <w:rPr>
+          <w:rFonts w:ascii="Times New Roman" w:hAnsi="Times New Roman" w:cs="Times New Roman"/>
+          <w:b/>
+          <w:bCs/>
+          <w:color w:val="262626" w:themeColor="accent6" w:themeShade="80"/>
+          <w:sz w:val="24"/>
+          <w:szCs w:val="24"/>
+        </w:rPr>
+      </w:pPr>
+    </w:p>
+    <w:p>
+      <w:pPr>
+        <w:pStyle w:val="ListBullet"/>
+        <w:numPr>
+          <w:ilvl w:val="0"/>
+          <w:numId w:val="30"/>
+        </w:numPr>
+        <w:rPr>
+          <w:rFonts w:ascii="Times New Roman" w:hAnsi="Times New Roman" w:cs="Times New Roman"/>
+          <w:b/>
+          <w:bCs/>
+          <w:color w:val="auto"/>
+          <w:sz w:val="28"/>
+          <w:szCs w:val="28"/>
+        </w:rPr>
+      </w:pPr>
+      <w:r>
+        <w:rPr>
+          <w:rFonts w:ascii="Times New Roman" w:hAnsi="Times New Roman" w:cs="Times New Roman"/>
+          <w:b/>
+          <w:bCs/>
+          <w:color w:val="auto"/>
+          <w:sz w:val="28"/>
+          <w:szCs w:val="28"/>
+        </w:rPr>
+        <w:lastRenderedPageBreak/>
+        <w:t>EER Diagram</w:t>
+      </w:r>
+      <w:r>
+        <w:rPr>
+          <w:rFonts w:ascii="Times New Roman" w:hAnsi="Times New Roman" w:cs="Times New Roman"/>
+          <w:b/>
+          <w:bCs/>
+          <w:color w:val="auto"/>
+          <w:sz w:val="28"/>
+          <w:szCs w:val="28"/>
+        </w:rPr>
+        <w:t>:</w:t>
+      </w:r>
+    </w:p>
+    <w:p>
+      <w:pPr>
+        <w:pStyle w:val="ListBullet"/>
+        <w:numPr>
+          <w:ilvl w:val="0"/>
+          <w:numId w:val="0"/>
+        </w:numPr>
+        <w:ind w:left="720"/>
+        <w:rPr>
+          <w:rFonts w:ascii="Times New Roman" w:hAnsi="Times New Roman" w:cs="Times New Roman"/>
+          <w:b/>
+          <w:bCs/>
+          <w:color w:val="262626" w:themeColor="accent6" w:themeShade="80"/>
+          <w:sz w:val="24"/>
+          <w:szCs w:val="24"/>
+        </w:rPr>
+      </w:pPr>
+      <w:r>
+        <w:rPr>
+          <w:rFonts w:ascii="Times New Roman" w:hAnsi="Times New Roman" w:cs="Times New Roman"/>
+          <w:noProof/>
+          <w:color w:val="auto"/>
+          <w:sz w:val="24"/>
+          <w:szCs w:val="24"/>
+          <w:rtl/>
+          <w:lang w:val="ar-SA"/>
+        </w:rPr>
+        <w:drawing>
+          <wp:inline distT="0" distB="0" distL="0" distR="0" wp14:anchorId="5432A1E3" wp14:editId="3579730F">
+            <wp:extent cx="5061857" cy="6834836"/>
+            <wp:effectExtent l="0" t="0" r="5715" b="4445"/>
+            <wp:docPr id="2075301865" name="Picture 11"/>
+            <wp:cNvGraphicFramePr>
+              <a:graphicFrameLocks xmlns:a="http://schemas.openxmlformats.org/drawingml/2006/main" noChangeAspect="1"/>
+            </wp:cNvGraphicFramePr>
+            <a:graphic xmlns:a="http://schemas.openxmlformats.org/drawingml/2006/main">
+              <a:graphicData uri="http://schemas.openxmlformats.org/drawingml/2006/picture">
+                <pic:pic xmlns:pic="http://schemas.openxmlformats.org/drawingml/2006/picture">
+                  <pic:nvPicPr>
+                    <pic:cNvPr id="2075301865" name="Picture 11"/>
+                    <pic:cNvPicPr/>
+                  </pic:nvPicPr>
+                  <pic:blipFill>
+                    <a:blip r:embed="rId15"/>
+                    <a:stretch>
+                      <a:fillRect/>
+                    </a:stretch>
+                  </pic:blipFill>
+                  <pic:spPr>
+                    <a:xfrm>
+                      <a:off x="0" y="0"/>
+                      <a:ext cx="5062675" cy="6835941"/>
+                    </a:xfrm>
+                    <a:prstGeom prst="rect">
+                      <a:avLst/>
+                    </a:prstGeom>
+                  </pic:spPr>
+                </pic:pic>
+              </a:graphicData>
+            </a:graphic>
+          </wp:inline>
+        </w:drawing>
+      </w:r>
+    </w:p>
+    <w:p>
+      <w:pPr>
+        <w:pStyle w:val="Heading1"/>
+      </w:pPr>
+      <w:r>
+        <w:lastRenderedPageBreak/>
+        <w:t>Task 2 – Database Implementation (6 Marks)</w:t>
+      </w:r>
+    </w:p>
+    <w:p>
+      <w:pPr>
+        <w:pStyle w:val="ListBullet"/>
+        <w:numPr>
+          <w:ilvl w:val="0"/>
+          <w:numId w:val="0"/>
+        </w:numPr>
+        <w:rPr>
+          <w:rFonts w:ascii="Times New Roman" w:hAnsi="Times New Roman" w:cs="Times New Roman"/>
+          <w:color w:val="auto"/>
+          <w:sz w:val="24"/>
+          <w:szCs w:val="24"/>
+        </w:rPr>
+      </w:pPr>
+      <w:r>
+        <w:rPr>
+          <w:rFonts w:ascii="Times New Roman" w:hAnsi="Times New Roman" w:cs="Times New Roman"/>
+          <w:color w:val="auto"/>
+          <w:sz w:val="24"/>
+          <w:szCs w:val="24"/>
+        </w:rPr>
+        <w:t>Complete the following tasks using MySQL. Include screenshots of both your SQL code and the corresponding output (results) for each task:</w:t>
+      </w:r>
+    </w:p>
+    <w:p>
+      <w:pPr>
+        <w:pStyle w:val="ListBullet"/>
+        <w:rPr>
+          <w:rFonts w:ascii="Times New Roman" w:hAnsi="Times New Roman" w:cs="Times New Roman"/>
+          <w:color w:val="auto"/>
+          <w:sz w:val="24"/>
+          <w:szCs w:val="24"/>
+        </w:rPr>
+      </w:pPr>
+      <w:r>
+        <w:rPr>
+          <w:rFonts w:ascii="Times New Roman" w:hAnsi="Times New Roman" w:cs="Times New Roman"/>
+          <w:color w:val="auto"/>
+          <w:sz w:val="24"/>
+          <w:szCs w:val="24"/>
+        </w:rPr>
+        <w:t>Create the database and all required tables.</w:t>
+      </w:r>
+    </w:p>
+    <w:p>
+      <w:pPr>
+        <w:pStyle w:val="ListBullet"/>
+        <w:rPr>
+          <w:rFonts w:ascii="Times New Roman" w:hAnsi="Times New Roman" w:cs="Times New Roman"/>
+          <w:color w:val="auto"/>
+          <w:sz w:val="24"/>
+          <w:szCs w:val="24"/>
+        </w:rPr>
+      </w:pPr>
+      <w:r>
+        <w:rPr>
+          <w:rFonts w:ascii="Times New Roman" w:hAnsi="Times New Roman" w:cs="Times New Roman"/>
+          <w:color w:val="auto"/>
+          <w:sz w:val="24"/>
+          <w:szCs w:val="24"/>
+        </w:rPr>
+        <w:t>Use appropriate data types and constraints (PRIMARY KEY, FOREIGN KEY, NOT NULL, UNIQUE, etc.).</w:t>
+      </w:r>
+    </w:p>
+    <w:p>
+      <w:pPr>
+        <w:pStyle w:val="ListBullet"/>
+        <w:rPr>
+          <w:rFonts w:ascii="Times New Roman" w:hAnsi="Times New Roman" w:cs="Times New Roman"/>
+          <w:color w:val="auto"/>
+          <w:sz w:val="24"/>
+          <w:szCs w:val="24"/>
+        </w:rPr>
+      </w:pPr>
+      <w:r>
+        <w:rPr>
+          <w:rFonts w:ascii="Times New Roman" w:hAnsi="Times New Roman" w:cs="Times New Roman"/>
+          <w:color w:val="auto"/>
+          <w:sz w:val="24"/>
+          <w:szCs w:val="24"/>
+        </w:rPr>
+        <w:t>Insert at least 5 records into each main table.</w:t>
+      </w:r>
+    </w:p>
+    <w:p>
+      <w:pPr>
+        <w:pStyle w:val="ListBullet"/>
         <w:numPr>
           <w:ilvl w:val="0"/>
           <w:numId w:val="0"/>
@@ -7708,7 +7776,7 @@
     </w:p>
     <w:p>
       <w:pPr>
-        <w:pStyle w:val="1"/>
+        <w:pStyle w:val="Heading1"/>
       </w:pPr>
       <w:r>
         <w:lastRenderedPageBreak/>
@@ -7717,7 +7785,7 @@
     </w:p>
     <w:p>
       <w:pPr>
-        <w:pStyle w:val="a"/>
+        <w:pStyle w:val="ListBullet"/>
         <w:numPr>
           <w:ilvl w:val="0"/>
           <w:numId w:val="0"/>
@@ -7750,7 +7818,7 @@
     </w:p>
     <w:p>
       <w:pPr>
-        <w:pStyle w:val="a"/>
+        <w:pStyle w:val="ListBullet"/>
         <w:rPr>
           <w:rFonts w:ascii="Times New Roman" w:hAnsi="Times New Roman" w:cs="Times New Roman"/>
           <w:color w:val="auto"/>
@@ -7770,7 +7838,7 @@
     </w:p>
     <w:p>
       <w:pPr>
-        <w:pStyle w:val="a"/>
+        <w:pStyle w:val="ListBullet"/>
         <w:rPr>
           <w:rFonts w:ascii="Times New Roman" w:hAnsi="Times New Roman" w:cs="Times New Roman"/>
           <w:color w:val="auto"/>
@@ -7790,7 +7858,7 @@
     </w:p>
     <w:p>
       <w:pPr>
-        <w:pStyle w:val="a"/>
+        <w:pStyle w:val="ListBullet"/>
         <w:rPr>
           <w:rFonts w:ascii="Times New Roman" w:hAnsi="Times New Roman" w:cs="Times New Roman"/>
           <w:color w:val="auto"/>
@@ -7810,7 +7878,7 @@
     </w:p>
     <w:p>
       <w:pPr>
-        <w:pStyle w:val="a"/>
+        <w:pStyle w:val="ListBullet"/>
         <w:rPr>
           <w:rFonts w:ascii="Times New Roman" w:hAnsi="Times New Roman" w:cs="Times New Roman"/>
           <w:color w:val="auto"/>
@@ -7830,7 +7898,7 @@
     </w:p>
     <w:p>
       <w:pPr>
-        <w:pStyle w:val="a"/>
+        <w:pStyle w:val="ListBullet"/>
         <w:rPr>
           <w:rFonts w:ascii="Times New Roman" w:hAnsi="Times New Roman" w:cs="Times New Roman"/>
           <w:color w:val="auto"/>
@@ -7850,7 +7918,7 @@
     </w:p>
     <w:p>
       <w:pPr>
-        <w:pStyle w:val="a"/>
+        <w:pStyle w:val="ListBullet"/>
         <w:rPr>
           <w:rFonts w:ascii="Times New Roman" w:hAnsi="Times New Roman" w:cs="Times New Roman"/>
           <w:color w:val="auto"/>
@@ -7870,7 +7938,7 @@
     </w:p>
     <w:p>
       <w:pPr>
-        <w:pStyle w:val="a"/>
+        <w:pStyle w:val="ListBullet"/>
         <w:rPr>
           <w:rFonts w:ascii="Times New Roman" w:hAnsi="Times New Roman" w:cs="Times New Roman"/>
           <w:color w:val="auto"/>
@@ -7890,7 +7958,7 @@
     </w:p>
     <w:p>
       <w:pPr>
-        <w:pStyle w:val="1"/>
+        <w:pStyle w:val="Heading1"/>
       </w:pPr>
       <w:r>
         <w:lastRenderedPageBreak/>
@@ -7905,7 +7973,7 @@
     </w:p>
     <w:p>
       <w:pPr>
-        <w:pStyle w:val="a"/>
+        <w:pStyle w:val="ListBullet"/>
         <w:numPr>
           <w:ilvl w:val="0"/>
           <w:numId w:val="0"/>
@@ -7947,7 +8015,7 @@
     </w:p>
     <w:p>
       <w:pPr>
-        <w:pStyle w:val="a"/>
+        <w:pStyle w:val="ListBullet"/>
         <w:numPr>
           <w:ilvl w:val="0"/>
           <w:numId w:val="0"/>
@@ -7971,7 +8039,7 @@
     </w:p>
     <w:p>
       <w:pPr>
-        <w:pStyle w:val="a"/>
+        <w:pStyle w:val="ListBullet"/>
         <w:numPr>
           <w:ilvl w:val="0"/>
           <w:numId w:val="0"/>
@@ -7995,7 +8063,7 @@
     </w:p>
     <w:p>
       <w:pPr>
-        <w:pStyle w:val="a"/>
+        <w:pStyle w:val="ListBullet"/>
         <w:numPr>
           <w:ilvl w:val="0"/>
           <w:numId w:val="25"/>
@@ -8018,7 +8086,7 @@
     </w:p>
     <w:p>
       <w:pPr>
-        <w:pStyle w:val="a"/>
+        <w:pStyle w:val="ListBullet"/>
         <w:numPr>
           <w:ilvl w:val="0"/>
           <w:numId w:val="25"/>
@@ -8041,7 +8109,7 @@
     </w:p>
     <w:p>
       <w:pPr>
-        <w:pStyle w:val="a"/>
+        <w:pStyle w:val="ListBullet"/>
         <w:numPr>
           <w:ilvl w:val="0"/>
           <w:numId w:val="25"/>
@@ -8064,7 +8132,7 @@
     </w:p>
     <w:p>
       <w:pPr>
-        <w:pStyle w:val="a"/>
+        <w:pStyle w:val="ListBullet"/>
         <w:numPr>
           <w:ilvl w:val="0"/>
           <w:numId w:val="25"/>
@@ -8087,7 +8155,7 @@
     </w:p>
     <w:p>
       <w:pPr>
-        <w:pStyle w:val="a"/>
+        <w:pStyle w:val="ListBullet"/>
         <w:numPr>
           <w:ilvl w:val="0"/>
           <w:numId w:val="0"/>
@@ -8103,7 +8171,7 @@
     </w:p>
     <w:p>
       <w:pPr>
-        <w:pStyle w:val="1"/>
+        <w:pStyle w:val="Heading1"/>
       </w:pPr>
       <w:r>
         <w:lastRenderedPageBreak/>
@@ -8163,29 +8231,7 @@
           <w:sz w:val="24"/>
           <w:szCs w:val="24"/>
         </w:rPr>
-        <w:t>SQL Script (.</w:t>
-      </w:r>
-      <w:proofErr w:type="spellStart"/>
-      <w:r>
-        <w:rPr>
-          <w:rFonts w:ascii="Times New Roman" w:hAnsi="Times New Roman" w:cs="Times New Roman"/>
-          <w:b/>
-          <w:bCs/>
-          <w:sz w:val="24"/>
-          <w:szCs w:val="24"/>
-        </w:rPr>
-        <w:t>sql</w:t>
-      </w:r>
-      <w:proofErr w:type="spellEnd"/>
-      <w:r>
-        <w:rPr>
-          <w:rFonts w:ascii="Times New Roman" w:hAnsi="Times New Roman" w:cs="Times New Roman"/>
-          <w:b/>
-          <w:bCs/>
-          <w:sz w:val="24"/>
-          <w:szCs w:val="24"/>
-        </w:rPr>
-        <w:t>)</w:t>
+        <w:t>SQL Script (.sql)</w:t>
       </w:r>
       <w:r>
         <w:rPr>
@@ -8355,25 +8401,7 @@
           <w:sz w:val="24"/>
           <w:szCs w:val="24"/>
         </w:rPr>
-        <w:t xml:space="preserve">Google </w:t>
-      </w:r>
-      <w:proofErr w:type="spellStart"/>
-      <w:r>
-        <w:rPr>
-          <w:rFonts w:ascii="Times New Roman" w:hAnsi="Times New Roman" w:cs="Times New Roman"/>
-          <w:sz w:val="24"/>
-          <w:szCs w:val="24"/>
-        </w:rPr>
-        <w:t>Colab</w:t>
-      </w:r>
-      <w:proofErr w:type="spellEnd"/>
-      <w:r>
-        <w:rPr>
-          <w:rFonts w:ascii="Times New Roman" w:hAnsi="Times New Roman" w:cs="Times New Roman"/>
-          <w:sz w:val="24"/>
-          <w:szCs w:val="24"/>
-        </w:rPr>
-        <w:t xml:space="preserve"> notebook (if applicable): [link]</w:t>
+        <w:t>Google Colab notebook (if applicable): [link]</w:t>
       </w:r>
     </w:p>
     <w:p>
@@ -8406,7 +8434,7 @@
       </w:pPr>
     </w:p>
     <w:sectPr>
-      <w:headerReference w:type="default" r:id="rId15"/>
+      <w:headerReference w:type="default" r:id="rId16"/>
       <w:pgSz w:w="12240" w:h="15840" w:code="1"/>
       <w:pgMar w:top="1080" w:right="720" w:bottom="1800" w:left="3096" w:header="1080" w:footer="720" w:gutter="0"/>
       <w:pgNumType w:start="1"/>
@@ -8450,7 +8478,7 @@
 <w:ftr xmlns:wpc="http://schemas.microsoft.com/office/word/2010/wordprocessingCanvas" xmlns:cx="http://schemas.microsoft.com/office/drawing/2014/chartex" xmlns:cx1="http://schemas.microsoft.com/office/drawing/2015/9/8/chartex" xmlns:cx2="http://schemas.microsoft.com/office/drawing/2015/10/21/chartex" xmlns:cx3="http://schemas.microsoft.com/office/drawing/2016/5/9/chartex" xmlns:cx4="http://schemas.microsoft.com/office/drawing/2016/5/10/chartex" xmlns:cx5="http://schemas.microsoft.com/office/drawing/2016/5/11/chartex" xmlns:cx6="http://schemas.microsoft.com/office/drawing/2016/5/12/chartex" xmlns:cx7="http://schemas.microsoft.com/office/drawing/2016/5/13/chartex" xmlns:cx8="http://schemas.microsoft.com/office/drawing/2016/5/14/chartex" xmlns:mc="http://schemas.openxmlformats.org/markup-compatibility/2006" xmlns:aink="http://schemas.microsoft.com/office/drawing/2016/ink" xmlns:am3d="http://schemas.microsoft.com/office/drawing/2017/model3d" xmlns:o="urn:schemas-microsoft-com:office:office" xmlns:oel="http://schemas.microsoft.com/office/2019/extlst" xmlns:r="http://schemas.openxmlformats.org/officeDocument/2006/relationships" xmlns:m="http://schemas.openxmlformats.org/officeDocument/2006/math" xmlns:v="urn:schemas-microsoft-com:vml" xmlns:wp14="http://schemas.microsoft.com/office/word/2010/wordprocessingDrawing" xmlns:wp="http://schemas.openxmlformats.org/drawingml/2006/wordprocessingDrawing" xmlns:w10="urn:schemas-microsoft-com:office:word" xmlns:w="http://schemas.openxmlformats.org/wordprocessingml/2006/main" xmlns:w14="http://schemas.microsoft.com/office/word/2010/wordml" xmlns:w15="http://schemas.microsoft.com/office/word/2012/wordml" xmlns:w16cei="http://schemas.microsoft.com/office/word/2026/wordml/cei" xmlns:w16cex="http://schemas.microsoft.com/office/word/2018/wordml/cex" xmlns:w16cid="http://schemas.microsoft.com/office/word/2016/wordml/cid" xmlns:w16="http://schemas.microsoft.com/office/word/2018/wordml" xmlns:w16du="http://schemas.microsoft.com/office/word/2023/wordml/word16du" xmlns:w16sdtdh="http://schemas.microsoft.com/office/word/2020/wordml/sdtdatahash" xmlns:w16sdtfl="http://schemas.microsoft.com/office/word/2024/wordml/sdtformatlock" xmlns:w16se="http://schemas.microsoft.com/office/word/2015/wordml/symex" xmlns:wpg="http://schemas.microsoft.com/office/word/2010/wordprocessingGroup" xmlns:wpi="http://schemas.microsoft.com/office/word/2010/wordprocessingInk" xmlns:wne="http://schemas.microsoft.com/office/word/2006/wordml" xmlns:wps="http://schemas.microsoft.com/office/word/2010/wordprocessingShape" mc:Ignorable="w14 w15 w16se w16cid w16 w16cex w16sdtdh w16sdtfl w16du wp14">
   <w:p>
     <w:pPr>
-      <w:pStyle w:val="a5"/>
+      <w:pStyle w:val="Footer"/>
     </w:pPr>
     <w:r>
       <w:rPr>
@@ -8607,7 +8635,7 @@
 <w:ftr xmlns:wpc="http://schemas.microsoft.com/office/word/2010/wordprocessingCanvas" xmlns:cx="http://schemas.microsoft.com/office/drawing/2014/chartex" xmlns:cx1="http://schemas.microsoft.com/office/drawing/2015/9/8/chartex" xmlns:cx2="http://schemas.microsoft.com/office/drawing/2015/10/21/chartex" xmlns:cx3="http://schemas.microsoft.com/office/drawing/2016/5/9/chartex" xmlns:cx4="http://schemas.microsoft.com/office/drawing/2016/5/10/chartex" xmlns:cx5="http://schemas.microsoft.com/office/drawing/2016/5/11/chartex" xmlns:cx6="http://schemas.microsoft.com/office/drawing/2016/5/12/chartex" xmlns:cx7="http://schemas.microsoft.com/office/drawing/2016/5/13/chartex" xmlns:cx8="http://schemas.microsoft.com/office/drawing/2016/5/14/chartex" xmlns:mc="http://schemas.openxmlformats.org/markup-compatibility/2006" xmlns:aink="http://schemas.microsoft.com/office/drawing/2016/ink" xmlns:am3d="http://schemas.microsoft.com/office/drawing/2017/model3d" xmlns:o="urn:schemas-microsoft-com:office:office" xmlns:oel="http://schemas.microsoft.com/office/2019/extlst" xmlns:r="http://schemas.openxmlformats.org/officeDocument/2006/relationships" xmlns:m="http://schemas.openxmlformats.org/officeDocument/2006/math" xmlns:v="urn:schemas-microsoft-com:vml" xmlns:wp14="http://schemas.microsoft.com/office/word/2010/wordprocessingDrawing" xmlns:wp="http://schemas.openxmlformats.org/drawingml/2006/wordprocessingDrawing" xmlns:w10="urn:schemas-microsoft-com:office:word" xmlns:w="http://schemas.openxmlformats.org/wordprocessingml/2006/main" xmlns:w14="http://schemas.microsoft.com/office/word/2010/wordml" xmlns:w15="http://schemas.microsoft.com/office/word/2012/wordml" xmlns:w16cei="http://schemas.microsoft.com/office/word/2026/wordml/cei" xmlns:w16cex="http://schemas.microsoft.com/office/word/2018/wordml/cex" xmlns:w16cid="http://schemas.microsoft.com/office/word/2016/wordml/cid" xmlns:w16="http://schemas.microsoft.com/office/word/2018/wordml" xmlns:w16du="http://schemas.microsoft.com/office/word/2023/wordml/word16du" xmlns:w16sdtdh="http://schemas.microsoft.com/office/word/2020/wordml/sdtdatahash" xmlns:w16sdtfl="http://schemas.microsoft.com/office/word/2024/wordml/sdtformatlock" xmlns:w16se="http://schemas.microsoft.com/office/word/2015/wordml/symex" xmlns:wpg="http://schemas.microsoft.com/office/word/2010/wordprocessingGroup" xmlns:wpi="http://schemas.microsoft.com/office/word/2010/wordprocessingInk" xmlns:wne="http://schemas.microsoft.com/office/word/2006/wordml" xmlns:wps="http://schemas.microsoft.com/office/word/2010/wordprocessingShape" mc:Ignorable="w14 w15 w16se w16cid w16 w16cex w16sdtdh w16sdtfl w16du wp14">
   <w:p>
     <w:pPr>
-      <w:pStyle w:val="a5"/>
+      <w:pStyle w:val="Footer"/>
     </w:pPr>
     <w:r>
       <w:rPr>
@@ -8764,7 +8792,7 @@
 <w:ftr xmlns:wpc="http://schemas.microsoft.com/office/word/2010/wordprocessingCanvas" xmlns:cx="http://schemas.microsoft.com/office/drawing/2014/chartex" xmlns:cx1="http://schemas.microsoft.com/office/drawing/2015/9/8/chartex" xmlns:cx2="http://schemas.microsoft.com/office/drawing/2015/10/21/chartex" xmlns:cx3="http://schemas.microsoft.com/office/drawing/2016/5/9/chartex" xmlns:cx4="http://schemas.microsoft.com/office/drawing/2016/5/10/chartex" xmlns:cx5="http://schemas.microsoft.com/office/drawing/2016/5/11/chartex" xmlns:cx6="http://schemas.microsoft.com/office/drawing/2016/5/12/chartex" xmlns:cx7="http://schemas.microsoft.com/office/drawing/2016/5/13/chartex" xmlns:cx8="http://schemas.microsoft.com/office/drawing/2016/5/14/chartex" xmlns:mc="http://schemas.openxmlformats.org/markup-compatibility/2006" xmlns:aink="http://schemas.microsoft.com/office/drawing/2016/ink" xmlns:am3d="http://schemas.microsoft.com/office/drawing/2017/model3d" xmlns:o="urn:schemas-microsoft-com:office:office" xmlns:oel="http://schemas.microsoft.com/office/2019/extlst" xmlns:r="http://schemas.openxmlformats.org/officeDocument/2006/relationships" xmlns:m="http://schemas.openxmlformats.org/officeDocument/2006/math" xmlns:v="urn:schemas-microsoft-com:vml" xmlns:wp14="http://schemas.microsoft.com/office/word/2010/wordprocessingDrawing" xmlns:wp="http://schemas.openxmlformats.org/drawingml/2006/wordprocessingDrawing" xmlns:w10="urn:schemas-microsoft-com:office:word" xmlns:w="http://schemas.openxmlformats.org/wordprocessingml/2006/main" xmlns:w14="http://schemas.microsoft.com/office/word/2010/wordml" xmlns:w15="http://schemas.microsoft.com/office/word/2012/wordml" xmlns:w16cei="http://schemas.microsoft.com/office/word/2026/wordml/cei" xmlns:w16cex="http://schemas.microsoft.com/office/word/2018/wordml/cex" xmlns:w16cid="http://schemas.microsoft.com/office/word/2016/wordml/cid" xmlns:w16="http://schemas.microsoft.com/office/word/2018/wordml" xmlns:w16du="http://schemas.microsoft.com/office/word/2023/wordml/word16du" xmlns:w16sdtdh="http://schemas.microsoft.com/office/word/2020/wordml/sdtdatahash" xmlns:w16sdtfl="http://schemas.microsoft.com/office/word/2024/wordml/sdtformatlock" xmlns:w16se="http://schemas.microsoft.com/office/word/2015/wordml/symex" xmlns:wpg="http://schemas.microsoft.com/office/word/2010/wordprocessingGroup" xmlns:wpi="http://schemas.microsoft.com/office/word/2010/wordprocessingInk" xmlns:wne="http://schemas.microsoft.com/office/word/2006/wordml" xmlns:wps="http://schemas.microsoft.com/office/word/2010/wordprocessingShape" mc:Ignorable="w14 w15 w16se w16cid w16 w16cex w16sdtdh w16sdtfl w16du wp14">
   <w:p>
     <w:pPr>
-      <w:pStyle w:val="a5"/>
+      <w:pStyle w:val="Footer"/>
     </w:pPr>
     <w:r>
       <w:rPr>
@@ -9011,7 +9039,7 @@
         </w:tcPr>
         <w:p>
           <w:pPr>
-            <w:pStyle w:val="a7"/>
+            <w:pStyle w:val="Header"/>
           </w:pPr>
         </w:p>
       </w:tc>
@@ -9021,7 +9049,7 @@
         </w:tcPr>
         <w:p>
           <w:pPr>
-            <w:pStyle w:val="a7"/>
+            <w:pStyle w:val="Header"/>
           </w:pPr>
         </w:p>
       </w:tc>
@@ -9032,7 +9060,7 @@
         </w:tcPr>
         <w:p>
           <w:pPr>
-            <w:pStyle w:val="a7"/>
+            <w:pStyle w:val="Header"/>
           </w:pPr>
         </w:p>
       </w:tc>
@@ -9040,7 +9068,7 @@
   </w:tbl>
   <w:p>
     <w:pPr>
-      <w:pStyle w:val="a7"/>
+      <w:pStyle w:val="Header"/>
     </w:pPr>
   </w:p>
 </w:hdr>
@@ -9326,32 +9354,9 @@
           </w:r>
           <w:r>
             <w:rPr>
-              <w:rFonts w:hint="cs"/>
-              <w:b w:val="0"/>
-              <w:bCs w:val="0"/>
-              <w:noProof/>
-              <w:rtl/>
-            </w:rPr>
-            <w:instrText xml:space="preserve">خطأ! استخدم علامة التبويب "الصفحة الرئيسية" لتطبيق </w:instrText>
-          </w:r>
-          <w:r>
-            <w:rPr>
-              <w:rFonts w:hint="cs"/>
-              <w:b w:val="0"/>
-              <w:bCs w:val="0"/>
               <w:noProof/>
             </w:rPr>
-            <w:instrText>Heading 1</w:instrText>
-          </w:r>
-          <w:r>
-            <w:rPr>
-              <w:rFonts w:hint="cs"/>
-              <w:b w:val="0"/>
-              <w:bCs w:val="0"/>
-              <w:noProof/>
-              <w:rtl/>
-            </w:rPr>
-            <w:instrText xml:space="preserve"> على النص الذي ترغب في أن يظهر هنا.</w:instrText>
+            <w:instrText>Task 1 – Database Design (6 Marks)</w:instrText>
           </w:r>
           <w:r>
             <w:rPr>
@@ -9382,32 +9387,9 @@
           </w:r>
           <w:r>
             <w:rPr>
-              <w:rFonts w:hint="cs"/>
-              <w:b w:val="0"/>
-              <w:bCs w:val="0"/>
-              <w:noProof/>
-              <w:rtl/>
-            </w:rPr>
-            <w:instrText xml:space="preserve">خطأ! استخدم علامة التبويب "الصفحة الرئيسية" لتطبيق </w:instrText>
-          </w:r>
-          <w:r>
-            <w:rPr>
-              <w:rFonts w:hint="cs"/>
-              <w:b w:val="0"/>
-              <w:bCs w:val="0"/>
               <w:noProof/>
             </w:rPr>
-            <w:instrText>Heading 1</w:instrText>
-          </w:r>
-          <w:r>
-            <w:rPr>
-              <w:rFonts w:hint="cs"/>
-              <w:b w:val="0"/>
-              <w:bCs w:val="0"/>
-              <w:noProof/>
-              <w:rtl/>
-            </w:rPr>
-            <w:instrText xml:space="preserve"> على النص الذي ترغب في أن يظهر هنا.</w:instrText>
+            <w:instrText>Task 1 – Database Design (6 Marks)</w:instrText>
           </w:r>
           <w:r>
             <w:rPr>
@@ -9423,38 +9405,9 @@
           </w:r>
           <w:r>
             <w:rPr>
-              <w:rFonts w:hint="cs"/>
-              <w:b w:val="0"/>
-              <w:bCs w:val="0"/>
-              <w:noProof/>
-              <w:rtl/>
-            </w:rPr>
-            <w:t xml:space="preserve">خطأ! استخدم علامة التبويب "الصفحة الرئيسية" لتطبيق </w:t>
-          </w:r>
-          <w:r>
-            <w:rPr>
-              <w:rFonts w:hint="cs"/>
-              <w:b w:val="0"/>
-              <w:bCs w:val="0"/>
               <w:noProof/>
             </w:rPr>
-            <w:t>Heading 1</w:t>
-          </w:r>
-          <w:r>
-            <w:rPr>
-              <w:rFonts w:hint="cs"/>
-              <w:b w:val="0"/>
-              <w:bCs w:val="0"/>
-              <w:noProof/>
-              <w:rtl/>
-            </w:rPr>
-            <w:t xml:space="preserve"> على النص الذي ترغب في أن يظهر هنا.</w:t>
-          </w:r>
-          <w:r>
-            <w:rPr>
-              <w:noProof/>
-            </w:rPr>
-            <w:t xml:space="preserve"> </w:t>
+            <w:t xml:space="preserve">Task 1 – Database Design (6 Marks) </w:t>
           </w:r>
           <w:r>
             <w:fldChar w:fldCharType="end"/>
@@ -9520,7 +9473,7 @@
     <w:lvl w:ilvl="0">
       <w:start w:val="1"/>
       <w:numFmt w:val="bullet"/>
-      <w:pStyle w:val="a"/>
+      <w:pStyle w:val="ListBullet"/>
       <w:lvlText w:val="•"/>
       <w:lvlJc w:val="left"/>
       <w:pPr>
@@ -10585,7 +10538,7 @@
     <w:lvl w:ilvl="0">
       <w:start w:val="1"/>
       <w:numFmt w:val="decimal"/>
-      <w:pStyle w:val="a0"/>
+      <w:pStyle w:val="ListNumber"/>
       <w:lvlText w:val="%1."/>
       <w:lvlJc w:val="left"/>
       <w:pPr>
@@ -10599,7 +10552,7 @@
     <w:lvl w:ilvl="1">
       <w:start w:val="1"/>
       <w:numFmt w:val="decimal"/>
-      <w:pStyle w:val="2"/>
+      <w:pStyle w:val="ListNumber2"/>
       <w:suff w:val="space"/>
       <w:lvlText w:val="%1.%2"/>
       <w:lvlJc w:val="left"/>
@@ -10614,7 +10567,7 @@
     <w:lvl w:ilvl="2">
       <w:start w:val="1"/>
       <w:numFmt w:val="lowerLetter"/>
-      <w:pStyle w:val="3"/>
+      <w:pStyle w:val="ListNumber3"/>
       <w:lvlText w:val="%3."/>
       <w:lvlJc w:val="left"/>
       <w:pPr>
@@ -10628,7 +10581,7 @@
     <w:lvl w:ilvl="3">
       <w:start w:val="1"/>
       <w:numFmt w:val="lowerRoman"/>
-      <w:pStyle w:val="4"/>
+      <w:pStyle w:val="ListNumber4"/>
       <w:lvlText w:val="%4."/>
       <w:lvlJc w:val="left"/>
       <w:pPr>
@@ -10642,7 +10595,7 @@
     <w:lvl w:ilvl="4">
       <w:start w:val="1"/>
       <w:numFmt w:val="lowerLetter"/>
-      <w:pStyle w:val="5"/>
+      <w:pStyle w:val="ListNumber5"/>
       <w:lvlText w:val="(%5)"/>
       <w:lvlJc w:val="left"/>
       <w:pPr>
@@ -13231,16 +13184,16 @@
     <w:lsdException w:name="Unresolved Mention" w:semiHidden="1" w:unhideWhenUsed="1"/>
     <w:lsdException w:name="Smart Link" w:semiHidden="1" w:unhideWhenUsed="1"/>
   </w:latentStyles>
-  <w:style w:type="paragraph" w:default="1" w:styleId="a1">
+  <w:style w:type="paragraph" w:default="1" w:styleId="Normal">
     <w:name w:val="Normal"/>
     <w:qFormat/>
     <w:rsid w:val="00407799"/>
   </w:style>
-  <w:style w:type="paragraph" w:styleId="1">
+  <w:style w:type="paragraph" w:styleId="Heading1">
     <w:name w:val="heading 1"/>
-    <w:basedOn w:val="a1"/>
-    <w:next w:val="a1"/>
-    <w:link w:val="1Char"/>
+    <w:basedOn w:val="Normal"/>
+    <w:next w:val="Normal"/>
+    <w:link w:val="Heading1Char"/>
     <w:uiPriority w:val="1"/>
     <w:qFormat/>
     <w:pPr>
@@ -13259,11 +13212,11 @@
       <w:sz w:val="40"/>
     </w:rPr>
   </w:style>
-  <w:style w:type="paragraph" w:styleId="20">
+  <w:style w:type="paragraph" w:styleId="Heading2">
     <w:name w:val="heading 2"/>
-    <w:basedOn w:val="a1"/>
-    <w:next w:val="a1"/>
-    <w:link w:val="2Char"/>
+    <w:basedOn w:val="Normal"/>
+    <w:next w:val="Normal"/>
+    <w:link w:val="Heading2Char"/>
     <w:uiPriority w:val="1"/>
     <w:unhideWhenUsed/>
     <w:qFormat/>
@@ -13281,12 +13234,13 @@
       <w:sz w:val="28"/>
     </w:rPr>
   </w:style>
-  <w:style w:type="character" w:default="1" w:styleId="a2">
+  <w:style w:type="character" w:default="1" w:styleId="DefaultParagraphFont">
     <w:name w:val="Default Paragraph Font"/>
     <w:uiPriority w:val="1"/>
+    <w:semiHidden/>
     <w:unhideWhenUsed/>
   </w:style>
-  <w:style w:type="table" w:default="1" w:styleId="a3">
+  <w:style w:type="table" w:default="1" w:styleId="TableNormal">
     <w:name w:val="Normal Table"/>
     <w:uiPriority w:val="99"/>
     <w:semiHidden/>
@@ -13301,16 +13255,16 @@
       </w:tblCellMar>
     </w:tblPr>
   </w:style>
-  <w:style w:type="numbering" w:default="1" w:styleId="a4">
+  <w:style w:type="numbering" w:default="1" w:styleId="NoList">
     <w:name w:val="No List"/>
     <w:uiPriority w:val="99"/>
     <w:semiHidden/>
     <w:unhideWhenUsed/>
   </w:style>
-  <w:style w:type="paragraph" w:styleId="a5">
+  <w:style w:type="paragraph" w:styleId="Footer">
     <w:name w:val="footer"/>
-    <w:basedOn w:val="a1"/>
-    <w:link w:val="Char"/>
+    <w:basedOn w:val="Normal"/>
+    <w:link w:val="FooterChar"/>
     <w:uiPriority w:val="99"/>
     <w:unhideWhenUsed/>
     <w:qFormat/>
@@ -13322,20 +13276,20 @@
       <w:color w:val="EF4623" w:themeColor="accent1"/>
     </w:rPr>
   </w:style>
-  <w:style w:type="character" w:customStyle="1" w:styleId="Char">
-    <w:name w:val="تذييل الصفحة Char"/>
-    <w:basedOn w:val="a2"/>
-    <w:link w:val="a5"/>
+  <w:style w:type="character" w:customStyle="1" w:styleId="FooterChar">
+    <w:name w:val="Footer Char"/>
+    <w:basedOn w:val="DefaultParagraphFont"/>
+    <w:link w:val="Footer"/>
     <w:uiPriority w:val="99"/>
     <w:rPr>
       <w:color w:val="EF4623" w:themeColor="accent1"/>
     </w:rPr>
   </w:style>
-  <w:style w:type="paragraph" w:styleId="a6">
+  <w:style w:type="paragraph" w:styleId="Subtitle">
     <w:name w:val="Subtitle"/>
-    <w:basedOn w:val="a1"/>
-    <w:next w:val="a1"/>
-    <w:link w:val="Char0"/>
+    <w:basedOn w:val="Normal"/>
+    <w:next w:val="Normal"/>
+    <w:link w:val="SubtitleChar"/>
     <w:uiPriority w:val="3"/>
     <w:unhideWhenUsed/>
     <w:qFormat/>
@@ -13358,36 +13312,36 @@
   </w:style>
   <w:style w:type="paragraph" w:customStyle="1" w:styleId="Graphic">
     <w:name w:val="Graphic"/>
-    <w:basedOn w:val="a1"/>
+    <w:basedOn w:val="Normal"/>
     <w:uiPriority w:val="99"/>
     <w:pPr>
       <w:spacing w:after="80" w:line="240" w:lineRule="auto"/>
       <w:jc w:val="center"/>
     </w:pPr>
   </w:style>
-  <w:style w:type="paragraph" w:styleId="a7">
+  <w:style w:type="paragraph" w:styleId="Header">
     <w:name w:val="header"/>
-    <w:basedOn w:val="a1"/>
-    <w:link w:val="Char1"/>
+    <w:basedOn w:val="Normal"/>
+    <w:link w:val="HeaderChar"/>
     <w:uiPriority w:val="99"/>
     <w:qFormat/>
     <w:pPr>
       <w:spacing w:after="380" w:line="240" w:lineRule="auto"/>
     </w:pPr>
   </w:style>
-  <w:style w:type="character" w:customStyle="1" w:styleId="Char1">
-    <w:name w:val="رأس الصفحة Char"/>
-    <w:basedOn w:val="a2"/>
-    <w:link w:val="a7"/>
+  <w:style w:type="character" w:customStyle="1" w:styleId="HeaderChar">
+    <w:name w:val="Header Char"/>
+    <w:basedOn w:val="DefaultParagraphFont"/>
+    <w:link w:val="Header"/>
     <w:uiPriority w:val="99"/>
     <w:rPr>
       <w:color w:val="404040" w:themeColor="text1" w:themeTint="BF"/>
       <w:sz w:val="20"/>
     </w:rPr>
   </w:style>
-  <w:style w:type="table" w:styleId="a8">
+  <w:style w:type="table" w:styleId="TableGrid">
     <w:name w:val="Table Grid"/>
-    <w:basedOn w:val="a3"/>
+    <w:basedOn w:val="TableNormal"/>
     <w:uiPriority w:val="39"/>
     <w:pPr>
       <w:spacing w:before="120" w:after="120" w:line="240" w:lineRule="auto"/>
@@ -13444,7 +13398,7 @@
   </w:style>
   <w:style w:type="paragraph" w:customStyle="1" w:styleId="InfoHeading">
     <w:name w:val="Info Heading"/>
-    <w:basedOn w:val="a1"/>
+    <w:basedOn w:val="Normal"/>
     <w:uiPriority w:val="2"/>
     <w:qFormat/>
     <w:pPr>
@@ -13461,8 +13415,8 @@
   </w:style>
   <w:style w:type="paragraph" w:customStyle="1" w:styleId="Page">
     <w:name w:val="Page"/>
-    <w:basedOn w:val="a1"/>
-    <w:next w:val="a1"/>
+    <w:basedOn w:val="Normal"/>
+    <w:next w:val="Normal"/>
     <w:uiPriority w:val="99"/>
     <w:unhideWhenUsed/>
     <w:qFormat/>
@@ -13475,11 +13429,11 @@
       <w:sz w:val="36"/>
     </w:rPr>
   </w:style>
-  <w:style w:type="paragraph" w:styleId="a9">
+  <w:style w:type="paragraph" w:styleId="Title">
     <w:name w:val="Title"/>
-    <w:basedOn w:val="a1"/>
-    <w:next w:val="a1"/>
-    <w:link w:val="Char2"/>
+    <w:basedOn w:val="Normal"/>
+    <w:next w:val="Normal"/>
+    <w:link w:val="TitleChar"/>
     <w:uiPriority w:val="2"/>
     <w:qFormat/>
     <w:pPr>
@@ -13493,10 +13447,10 @@
       <w:sz w:val="200"/>
     </w:rPr>
   </w:style>
-  <w:style w:type="character" w:customStyle="1" w:styleId="Char2">
-    <w:name w:val="العنوان Char"/>
-    <w:basedOn w:val="a2"/>
-    <w:link w:val="a9"/>
+  <w:style w:type="character" w:customStyle="1" w:styleId="TitleChar">
+    <w:name w:val="Title Char"/>
+    <w:basedOn w:val="DefaultParagraphFont"/>
+    <w:link w:val="Title"/>
     <w:uiPriority w:val="2"/>
     <w:rPr>
       <w:rFonts w:asciiTheme="majorHAnsi" w:eastAsiaTheme="majorEastAsia" w:hAnsiTheme="majorHAnsi" w:cstheme="majorBidi"/>
@@ -13506,19 +13460,19 @@
       <w:sz w:val="200"/>
     </w:rPr>
   </w:style>
-  <w:style w:type="character" w:styleId="aa">
+  <w:style w:type="character" w:styleId="PlaceholderText">
     <w:name w:val="Placeholder Text"/>
-    <w:basedOn w:val="a2"/>
+    <w:basedOn w:val="DefaultParagraphFont"/>
     <w:uiPriority w:val="99"/>
     <w:semiHidden/>
     <w:rPr>
       <w:color w:val="808080"/>
     </w:rPr>
   </w:style>
-  <w:style w:type="paragraph" w:styleId="ab">
+  <w:style w:type="paragraph" w:styleId="BalloonText">
     <w:name w:val="Balloon Text"/>
-    <w:basedOn w:val="a1"/>
-    <w:link w:val="Char3"/>
+    <w:basedOn w:val="Normal"/>
+    <w:link w:val="BalloonTextChar"/>
     <w:uiPriority w:val="99"/>
     <w:semiHidden/>
     <w:unhideWhenUsed/>
@@ -13530,10 +13484,10 @@
       <w:sz w:val="16"/>
     </w:rPr>
   </w:style>
-  <w:style w:type="character" w:customStyle="1" w:styleId="Char3">
-    <w:name w:val="نص في بالون Char"/>
-    <w:basedOn w:val="a2"/>
-    <w:link w:val="ab"/>
+  <w:style w:type="character" w:customStyle="1" w:styleId="BalloonTextChar">
+    <w:name w:val="Balloon Text Char"/>
+    <w:basedOn w:val="DefaultParagraphFont"/>
+    <w:link w:val="BalloonText"/>
     <w:uiPriority w:val="99"/>
     <w:semiHidden/>
     <w:rPr>
@@ -13541,9 +13495,9 @@
       <w:sz w:val="16"/>
     </w:rPr>
   </w:style>
-  <w:style w:type="character" w:styleId="ac">
+  <w:style w:type="character" w:styleId="Strong">
     <w:name w:val="Strong"/>
-    <w:basedOn w:val="a2"/>
+    <w:basedOn w:val="DefaultParagraphFont"/>
     <w:uiPriority w:val="10"/>
     <w:qFormat/>
     <w:rPr>
@@ -13551,10 +13505,10 @@
       <w:bCs/>
     </w:rPr>
   </w:style>
-  <w:style w:type="character" w:customStyle="1" w:styleId="Char0">
-    <w:name w:val="عنوان فرعي Char"/>
-    <w:basedOn w:val="a2"/>
-    <w:link w:val="a6"/>
+  <w:style w:type="character" w:customStyle="1" w:styleId="SubtitleChar">
+    <w:name w:val="Subtitle Char"/>
+    <w:basedOn w:val="DefaultParagraphFont"/>
+    <w:link w:val="Subtitle"/>
     <w:uiPriority w:val="3"/>
     <w:rPr>
       <w:rFonts w:asciiTheme="majorHAnsi" w:eastAsiaTheme="majorEastAsia" w:hAnsiTheme="majorHAnsi" w:cstheme="majorBidi"/>
@@ -13568,7 +13522,7 @@
   </w:style>
   <w:style w:type="paragraph" w:customStyle="1" w:styleId="Abstract">
     <w:name w:val="Abstract"/>
-    <w:basedOn w:val="a1"/>
+    <w:basedOn w:val="Normal"/>
     <w:uiPriority w:val="3"/>
     <w:qFormat/>
     <w:pPr>
@@ -13582,9 +13536,9 @@
       <w:sz w:val="28"/>
     </w:rPr>
   </w:style>
-  <w:style w:type="paragraph" w:styleId="ad">
+  <w:style w:type="paragraph" w:styleId="NoSpacing">
     <w:name w:val="No Spacing"/>
-    <w:link w:val="Char4"/>
+    <w:link w:val="NoSpacingChar"/>
     <w:uiPriority w:val="1"/>
     <w:unhideWhenUsed/>
     <w:qFormat/>
@@ -13594,7 +13548,7 @@
   </w:style>
   <w:style w:type="character" w:styleId="Hyperlink">
     <w:name w:val="Hyperlink"/>
-    <w:basedOn w:val="a2"/>
+    <w:basedOn w:val="DefaultParagraphFont"/>
     <w:uiPriority w:val="99"/>
     <w:unhideWhenUsed/>
     <w:rPr>
@@ -13602,10 +13556,10 @@
       <w:u w:val="single"/>
     </w:rPr>
   </w:style>
-  <w:style w:type="paragraph" w:styleId="10">
+  <w:style w:type="paragraph" w:styleId="TOC1">
     <w:name w:val="toc 1"/>
-    <w:basedOn w:val="a1"/>
-    <w:next w:val="a1"/>
+    <w:basedOn w:val="Normal"/>
+    <w:next w:val="Normal"/>
     <w:autoRedefine/>
     <w:uiPriority w:val="39"/>
     <w:unhideWhenUsed/>
@@ -13620,10 +13574,10 @@
       <w:kern w:val="20"/>
     </w:rPr>
   </w:style>
-  <w:style w:type="character" w:customStyle="1" w:styleId="1Char">
-    <w:name w:val="العنوان 1 Char"/>
-    <w:basedOn w:val="a2"/>
-    <w:link w:val="1"/>
+  <w:style w:type="character" w:customStyle="1" w:styleId="Heading1Char">
+    <w:name w:val="Heading 1 Char"/>
+    <w:basedOn w:val="DefaultParagraphFont"/>
+    <w:link w:val="Heading1"/>
     <w:uiPriority w:val="1"/>
     <w:rPr>
       <w:rFonts w:asciiTheme="majorHAnsi" w:eastAsiaTheme="majorEastAsia" w:hAnsiTheme="majorHAnsi" w:cstheme="majorBidi"/>
@@ -13633,10 +13587,10 @@
       <w:sz w:val="40"/>
     </w:rPr>
   </w:style>
-  <w:style w:type="paragraph" w:styleId="ae">
+  <w:style w:type="paragraph" w:styleId="TOCHeading">
     <w:name w:val="TOC Heading"/>
-    <w:basedOn w:val="1"/>
-    <w:next w:val="a1"/>
+    <w:basedOn w:val="Heading1"/>
+    <w:next w:val="Normal"/>
     <w:uiPriority w:val="39"/>
     <w:unhideWhenUsed/>
     <w:qFormat/>
@@ -13653,10 +13607,10 @@
       <w:sz w:val="44"/>
     </w:rPr>
   </w:style>
-  <w:style w:type="character" w:customStyle="1" w:styleId="2Char">
-    <w:name w:val="عنوان 2 Char"/>
-    <w:basedOn w:val="a2"/>
-    <w:link w:val="20"/>
+  <w:style w:type="character" w:customStyle="1" w:styleId="Heading2Char">
+    <w:name w:val="Heading 2 Char"/>
+    <w:basedOn w:val="DefaultParagraphFont"/>
+    <w:link w:val="Heading2"/>
     <w:uiPriority w:val="1"/>
     <w:rPr>
       <w:rFonts w:asciiTheme="majorHAnsi" w:eastAsiaTheme="majorEastAsia" w:hAnsiTheme="majorHAnsi" w:cstheme="majorBidi"/>
@@ -13666,11 +13620,11 @@
       <w:sz w:val="28"/>
     </w:rPr>
   </w:style>
-  <w:style w:type="paragraph" w:styleId="af">
+  <w:style w:type="paragraph" w:styleId="Quote">
     <w:name w:val="Quote"/>
-    <w:basedOn w:val="a1"/>
-    <w:next w:val="a1"/>
-    <w:link w:val="Char5"/>
+    <w:basedOn w:val="Normal"/>
+    <w:next w:val="Normal"/>
+    <w:link w:val="QuoteChar"/>
     <w:uiPriority w:val="1"/>
     <w:unhideWhenUsed/>
     <w:qFormat/>
@@ -13685,10 +13639,10 @@
       <w:sz w:val="24"/>
     </w:rPr>
   </w:style>
-  <w:style w:type="character" w:customStyle="1" w:styleId="Char5">
-    <w:name w:val="اقتباس Char"/>
-    <w:basedOn w:val="a2"/>
-    <w:link w:val="af"/>
+  <w:style w:type="character" w:customStyle="1" w:styleId="QuoteChar">
+    <w:name w:val="Quote Char"/>
+    <w:basedOn w:val="DefaultParagraphFont"/>
+    <w:link w:val="Quote"/>
     <w:uiPriority w:val="1"/>
     <w:rPr>
       <w:i/>
@@ -13698,10 +13652,10 @@
       <w:sz w:val="24"/>
     </w:rPr>
   </w:style>
-  <w:style w:type="paragraph" w:styleId="af0">
+  <w:style w:type="paragraph" w:styleId="Signature">
     <w:name w:val="Signature"/>
-    <w:basedOn w:val="a1"/>
-    <w:link w:val="Char6"/>
+    <w:basedOn w:val="Normal"/>
+    <w:link w:val="SignatureChar"/>
     <w:uiPriority w:val="9"/>
     <w:unhideWhenUsed/>
     <w:qFormat/>
@@ -13714,25 +13668,25 @@
       <w:kern w:val="20"/>
     </w:rPr>
   </w:style>
-  <w:style w:type="character" w:customStyle="1" w:styleId="Char6">
-    <w:name w:val="توقيع Char"/>
-    <w:basedOn w:val="a2"/>
-    <w:link w:val="af0"/>
+  <w:style w:type="character" w:customStyle="1" w:styleId="SignatureChar">
+    <w:name w:val="Signature Char"/>
+    <w:basedOn w:val="DefaultParagraphFont"/>
+    <w:link w:val="Signature"/>
     <w:uiPriority w:val="9"/>
     <w:rPr>
       <w:color w:val="595959" w:themeColor="text1" w:themeTint="A6"/>
       <w:kern w:val="20"/>
     </w:rPr>
   </w:style>
-  <w:style w:type="character" w:customStyle="1" w:styleId="Char4">
-    <w:name w:val="بلا تباعد Char"/>
-    <w:basedOn w:val="a2"/>
-    <w:link w:val="ad"/>
+  <w:style w:type="character" w:customStyle="1" w:styleId="NoSpacingChar">
+    <w:name w:val="No Spacing Char"/>
+    <w:basedOn w:val="DefaultParagraphFont"/>
+    <w:link w:val="NoSpacing"/>
     <w:uiPriority w:val="1"/>
   </w:style>
-  <w:style w:type="paragraph" w:styleId="a">
+  <w:style w:type="paragraph" w:styleId="ListBullet">
     <w:name w:val="List Bullet"/>
-    <w:basedOn w:val="a1"/>
+    <w:basedOn w:val="Normal"/>
     <w:uiPriority w:val="99"/>
     <w:unhideWhenUsed/>
     <w:qFormat/>
@@ -13747,9 +13701,9 @@
       <w:kern w:val="20"/>
     </w:rPr>
   </w:style>
-  <w:style w:type="paragraph" w:styleId="a0">
+  <w:style w:type="paragraph" w:styleId="ListNumber">
     <w:name w:val="List Number"/>
-    <w:basedOn w:val="a1"/>
+    <w:basedOn w:val="Normal"/>
     <w:uiPriority w:val="1"/>
     <w:unhideWhenUsed/>
     <w:qFormat/>
@@ -13765,9 +13719,9 @@
       <w:kern w:val="20"/>
     </w:rPr>
   </w:style>
-  <w:style w:type="paragraph" w:styleId="2">
+  <w:style w:type="paragraph" w:styleId="ListNumber2">
     <w:name w:val="List Number 2"/>
-    <w:basedOn w:val="a1"/>
+    <w:basedOn w:val="Normal"/>
     <w:uiPriority w:val="1"/>
     <w:unhideWhenUsed/>
     <w:qFormat/>
@@ -13784,9 +13738,9 @@
       <w:kern w:val="20"/>
     </w:rPr>
   </w:style>
-  <w:style w:type="paragraph" w:styleId="3">
+  <w:style w:type="paragraph" w:styleId="ListNumber3">
     <w:name w:val="List Number 3"/>
-    <w:basedOn w:val="a1"/>
+    <w:basedOn w:val="Normal"/>
     <w:uiPriority w:val="18"/>
     <w:unhideWhenUsed/>
     <w:pPr>
@@ -13802,9 +13756,9 @@
       <w:kern w:val="20"/>
     </w:rPr>
   </w:style>
-  <w:style w:type="paragraph" w:styleId="4">
+  <w:style w:type="paragraph" w:styleId="ListNumber4">
     <w:name w:val="List Number 4"/>
-    <w:basedOn w:val="a1"/>
+    <w:basedOn w:val="Normal"/>
     <w:uiPriority w:val="18"/>
     <w:unhideWhenUsed/>
     <w:pPr>
@@ -13820,9 +13774,9 @@
       <w:kern w:val="20"/>
     </w:rPr>
   </w:style>
-  <w:style w:type="paragraph" w:styleId="5">
+  <w:style w:type="paragraph" w:styleId="ListNumber5">
     <w:name w:val="List Number 5"/>
-    <w:basedOn w:val="a1"/>
+    <w:basedOn w:val="Normal"/>
     <w:uiPriority w:val="18"/>
     <w:unhideWhenUsed/>
     <w:pPr>
@@ -13840,7 +13794,7 @@
   </w:style>
   <w:style w:type="table" w:customStyle="1" w:styleId="FinancialTable">
     <w:name w:val="Financial Table"/>
-    <w:basedOn w:val="a3"/>
+    <w:basedOn w:val="TableNormal"/>
     <w:uiPriority w:val="99"/>
     <w:pPr>
       <w:spacing w:before="60" w:after="60" w:line="240" w:lineRule="auto"/>
@@ -13882,9 +13836,9 @@
       </w:rPr>
     </w:tblStylePr>
   </w:style>
-  <w:style w:type="character" w:styleId="af1">
+  <w:style w:type="character" w:styleId="CommentReference">
     <w:name w:val="annotation reference"/>
-    <w:basedOn w:val="a2"/>
+    <w:basedOn w:val="DefaultParagraphFont"/>
     <w:uiPriority w:val="99"/>
     <w:semiHidden/>
     <w:unhideWhenUsed/>
@@ -13892,27 +13846,27 @@
       <w:sz w:val="16"/>
     </w:rPr>
   </w:style>
-  <w:style w:type="paragraph" w:styleId="af2">
+  <w:style w:type="paragraph" w:styleId="CommentText">
     <w:name w:val="annotation text"/>
-    <w:basedOn w:val="a1"/>
-    <w:link w:val="Char7"/>
+    <w:basedOn w:val="Normal"/>
+    <w:link w:val="CommentTextChar"/>
     <w:uiPriority w:val="99"/>
     <w:unhideWhenUsed/>
     <w:pPr>
       <w:spacing w:line="240" w:lineRule="auto"/>
     </w:pPr>
   </w:style>
-  <w:style w:type="character" w:customStyle="1" w:styleId="Char7">
-    <w:name w:val="نص تعليق Char"/>
-    <w:basedOn w:val="a2"/>
-    <w:link w:val="af2"/>
+  <w:style w:type="character" w:customStyle="1" w:styleId="CommentTextChar">
+    <w:name w:val="Comment Text Char"/>
+    <w:basedOn w:val="DefaultParagraphFont"/>
+    <w:link w:val="CommentText"/>
     <w:uiPriority w:val="99"/>
   </w:style>
-  <w:style w:type="paragraph" w:styleId="af3">
+  <w:style w:type="paragraph" w:styleId="CommentSubject">
     <w:name w:val="annotation subject"/>
-    <w:basedOn w:val="af2"/>
-    <w:next w:val="af2"/>
-    <w:link w:val="Char8"/>
+    <w:basedOn w:val="CommentText"/>
+    <w:next w:val="CommentText"/>
+    <w:link w:val="CommentSubjectChar"/>
     <w:uiPriority w:val="99"/>
     <w:semiHidden/>
     <w:unhideWhenUsed/>
@@ -13921,10 +13875,10 @@
       <w:bCs/>
     </w:rPr>
   </w:style>
-  <w:style w:type="character" w:customStyle="1" w:styleId="Char8">
-    <w:name w:val="موضوع تعليق Char"/>
-    <w:basedOn w:val="Char7"/>
-    <w:link w:val="af3"/>
+  <w:style w:type="character" w:customStyle="1" w:styleId="CommentSubjectChar">
+    <w:name w:val="Comment Subject Char"/>
+    <w:basedOn w:val="CommentTextChar"/>
+    <w:link w:val="CommentSubject"/>
     <w:uiPriority w:val="99"/>
     <w:semiHidden/>
     <w:rPr>
@@ -13932,9 +13886,9 @@
       <w:bCs/>
     </w:rPr>
   </w:style>
-  <w:style w:type="table" w:styleId="af4">
+  <w:style w:type="table" w:styleId="LightShading">
     <w:name w:val="Light Shading"/>
-    <w:basedOn w:val="a3"/>
+    <w:basedOn w:val="TableNormal"/>
     <w:uiPriority w:val="60"/>
     <w:pPr>
       <w:spacing w:after="0" w:line="240" w:lineRule="auto"/>
@@ -14029,7 +13983,7 @@
   </w:style>
   <w:style w:type="paragraph" w:customStyle="1" w:styleId="TableTextDecimal">
     <w:name w:val="Table Text Decimal"/>
-    <w:basedOn w:val="a1"/>
+    <w:basedOn w:val="Normal"/>
     <w:uiPriority w:val="1"/>
     <w:qFormat/>
     <w:pPr>
@@ -14041,7 +13995,7 @@
   </w:style>
   <w:style w:type="paragraph" w:customStyle="1" w:styleId="TableText">
     <w:name w:val="Table Text"/>
-    <w:basedOn w:val="a1"/>
+    <w:basedOn w:val="Normal"/>
     <w:uiPriority w:val="1"/>
     <w:qFormat/>
     <w:pPr>
@@ -14050,7 +14004,7 @@
   </w:style>
   <w:style w:type="paragraph" w:customStyle="1" w:styleId="Organization">
     <w:name w:val="Organization"/>
-    <w:basedOn w:val="a1"/>
+    <w:basedOn w:val="Normal"/>
     <w:uiPriority w:val="2"/>
     <w:qFormat/>
     <w:pPr>
@@ -14064,9 +14018,9 @@
       <w:sz w:val="36"/>
     </w:rPr>
   </w:style>
-  <w:style w:type="paragraph" w:styleId="af5">
+  <w:style w:type="paragraph" w:styleId="ListParagraph">
     <w:name w:val="List Paragraph"/>
-    <w:basedOn w:val="a1"/>
+    <w:basedOn w:val="Normal"/>
     <w:uiPriority w:val="34"/>
     <w:qFormat/>
     <w:rsid w:val="001B698D"/>
@@ -14075,9 +14029,9 @@
       <w:contextualSpacing/>
     </w:pPr>
   </w:style>
-  <w:style w:type="paragraph" w:styleId="af6">
+  <w:style w:type="paragraph" w:styleId="NormalWeb">
     <w:name w:val="Normal (Web)"/>
-    <w:basedOn w:val="a1"/>
+    <w:basedOn w:val="Normal"/>
     <w:uiPriority w:val="99"/>
     <w:unhideWhenUsed/>
     <w:rsid w:val="00852E5F"/>
@@ -14094,7 +14048,7 @@
   </w:style>
   <w:style w:type="character" w:styleId="HTMLCode">
     <w:name w:val="HTML Code"/>
-    <w:basedOn w:val="a2"/>
+    <w:basedOn w:val="DefaultParagraphFont"/>
     <w:uiPriority w:val="99"/>
     <w:semiHidden/>
     <w:unhideWhenUsed/>
@@ -14107,17 +14061,17 @@
   </w:style>
   <w:style w:type="character" w:customStyle="1" w:styleId="8">
     <w:name w:val="ͼ8"/>
-    <w:basedOn w:val="a2"/>
+    <w:basedOn w:val="DefaultParagraphFont"/>
     <w:rsid w:val="00A442D9"/>
   </w:style>
   <w:style w:type="character" w:customStyle="1" w:styleId="b">
     <w:name w:val="ͼb"/>
-    <w:basedOn w:val="a2"/>
+    <w:basedOn w:val="DefaultParagraphFont"/>
     <w:rsid w:val="00A442D9"/>
   </w:style>
   <w:style w:type="paragraph" w:customStyle="1" w:styleId="font-claude-response-body">
     <w:name w:val="font-claude-response-body"/>
-    <w:basedOn w:val="a1"/>
+    <w:basedOn w:val="Normal"/>
     <w:rsid w:val="00EC2668"/>
     <w:pPr>
       <w:spacing w:before="100" w:beforeAutospacing="1" w:after="100" w:afterAutospacing="1" w:line="240" w:lineRule="auto"/>
@@ -14314,7 +14268,7 @@
     <w:lvl w:ilvl="0">
       <w:start w:val="1"/>
       <w:numFmt w:val="bullet"/>
-      <w:pStyle w:val="a"/>
+      <w:pStyle w:val="ListBullet"/>
       <w:lvlText w:val="•"/>
       <w:lvlJc w:val="left"/>
       <w:pPr>
@@ -14364,6 +14318,7 @@
     <w:rsid w:val="00351A43"/>
     <w:rsid w:val="00366F01"/>
     <w:rsid w:val="003B34DF"/>
+    <w:rsid w:val="00415C82"/>
     <w:rsid w:val="004A7EE6"/>
     <w:rsid w:val="004E5C8C"/>
     <w:rsid w:val="005443A0"/>
@@ -14380,6 +14335,7 @@
     <w:rsid w:val="006D7F43"/>
     <w:rsid w:val="006E2B58"/>
     <w:rsid w:val="006E767C"/>
+    <w:rsid w:val="007A14E3"/>
     <w:rsid w:val="008A4AE7"/>
     <w:rsid w:val="008C7F6D"/>
     <w:rsid w:val="00900C2A"/>
@@ -14440,7 +14396,7 @@
   <w:themeFontLang w:val="en-GB" w:eastAsia="ja-JP" w:bidi="ar-SA"/>
   <w:clrSchemeMapping w:bg1="light1" w:t1="dark1" w:bg2="light2" w:t2="dark2" w:accent1="accent1" w:accent2="accent2" w:accent3="accent3" w:accent4="accent4" w:accent5="accent5" w:accent6="accent6" w:hyperlink="hyperlink" w:followedHyperlink="followedHyperlink"/>
   <w:decimalSymbol w:val="."/>
-  <w:listSeparator w:val=","/>
+  <w:listSeparator w:val=";"/>
   <w15:chartTrackingRefBased/>
 </w:settings>
 </file>
@@ -14840,17 +14796,17 @@
     <w:lsdException w:name="Unresolved Mention" w:semiHidden="1" w:unhideWhenUsed="1"/>
     <w:lsdException w:name="Smart Link" w:semiHidden="1" w:unhideWhenUsed="1"/>
   </w:latentStyles>
-  <w:style w:type="paragraph" w:default="1" w:styleId="a0">
+  <w:style w:type="paragraph" w:default="1" w:styleId="Normal">
     <w:name w:val="Normal"/>
     <w:qFormat/>
   </w:style>
-  <w:style w:type="character" w:default="1" w:styleId="a1">
+  <w:style w:type="character" w:default="1" w:styleId="DefaultParagraphFont">
     <w:name w:val="Default Paragraph Font"/>
     <w:uiPriority w:val="1"/>
     <w:semiHidden/>
     <w:unhideWhenUsed/>
   </w:style>
-  <w:style w:type="table" w:default="1" w:styleId="a2">
+  <w:style w:type="table" w:default="1" w:styleId="TableNormal">
     <w:name w:val="Normal Table"/>
     <w:uiPriority w:val="99"/>
     <w:semiHidden/>
@@ -14865,15 +14821,15 @@
       </w:tblCellMar>
     </w:tblPr>
   </w:style>
-  <w:style w:type="numbering" w:default="1" w:styleId="a3">
+  <w:style w:type="numbering" w:default="1" w:styleId="NoList">
     <w:name w:val="No List"/>
     <w:uiPriority w:val="99"/>
     <w:semiHidden/>
     <w:unhideWhenUsed/>
   </w:style>
-  <w:style w:type="paragraph" w:styleId="a">
+  <w:style w:type="paragraph" w:styleId="ListBullet">
     <w:name w:val="List Bullet"/>
-    <w:basedOn w:val="a0"/>
+    <w:basedOn w:val="Normal"/>
     <w:uiPriority w:val="1"/>
     <w:unhideWhenUsed/>
     <w:qFormat/>
@@ -14890,9 +14846,9 @@
       <w:lang w:val="en-US" w:eastAsia="en-US"/>
     </w:rPr>
   </w:style>
-  <w:style w:type="character" w:styleId="a4">
+  <w:style w:type="character" w:styleId="Strong">
     <w:name w:val="Strong"/>
-    <w:basedOn w:val="a1"/>
+    <w:basedOn w:val="DefaultParagraphFont"/>
     <w:uiPriority w:val="10"/>
     <w:qFormat/>
     <w:rPr>
@@ -15247,16 +15203,16 @@
 </file>
 
 <file path=customXml/item2.xml><?xml version="1.0" encoding="utf-8"?>
+<b:Sources xmlns:b="http://schemas.openxmlformats.org/officeDocument/2006/bibliography" SelectedStyle="\APA.XSL" StyleName="APA"/>
+</file>
+
+<file path=customXml/item3.xml><?xml version="1.0" encoding="utf-8"?>
 <?mso-contentType ?>
 <FormTemplates xmlns="http://schemas.microsoft.com/sharepoint/v3/contenttype/forms">
   <Display>DocumentLibraryForm</Display>
   <Edit>AssetEditForm</Edit>
   <New>DocumentLibraryForm</New>
 </FormTemplates>
-</file>
-
-<file path=customXml/item3.xml><?xml version="1.0" encoding="utf-8"?>
-<b:Sources xmlns:b="http://schemas.openxmlformats.org/officeDocument/2006/bibliography" SelectedStyle="\APA.XSL" StyleName="APA"/>
 </file>
 
 <file path=customXml/itemProps1.xml><?xml version="1.0" encoding="utf-8"?>
@@ -15268,17 +15224,17 @@
 </file>
 
 <file path=customXml/itemProps2.xml><?xml version="1.0" encoding="utf-8"?>
+<ds:datastoreItem xmlns:ds="http://schemas.openxmlformats.org/officeDocument/2006/customXml" ds:itemID="{355C5113-D031-41DB-A6D8-43CE1A0E6695}">
+  <ds:schemaRefs>
+    <ds:schemaRef ds:uri="http://schemas.openxmlformats.org/officeDocument/2006/bibliography"/>
+  </ds:schemaRefs>
+</ds:datastoreItem>
+</file>
+
+<file path=customXml/itemProps3.xml><?xml version="1.0" encoding="utf-8"?>
 <ds:datastoreItem xmlns:ds="http://schemas.openxmlformats.org/officeDocument/2006/customXml" ds:itemID="{E34C63B7-A026-4A37-9535-4FBB4C03A11D}">
   <ds:schemaRefs>
     <ds:schemaRef ds:uri="http://schemas.microsoft.com/sharepoint/v3/contenttype/forms"/>
   </ds:schemaRefs>
 </ds:datastoreItem>
-</file>
-
-<file path=customXml/itemProps3.xml><?xml version="1.0" encoding="utf-8"?>
-<ds:datastoreItem xmlns:ds="http://schemas.openxmlformats.org/officeDocument/2006/customXml" ds:itemID="{355C5113-D031-41DB-A6D8-43CE1A0E6695}">
-  <ds:schemaRefs>
-    <ds:schemaRef ds:uri="http://schemas.openxmlformats.org/officeDocument/2006/bibliography"/>
-  </ds:schemaRefs>
-</ds:datastoreItem>
 </file>
</xml_diff>

<commit_message>
Relational Schema has been added
</commit_message>
<xml_diff>
--- a/Introduction to DB-CS350 Project.docx
+++ b/Introduction to DB-CS350 Project.docx
@@ -7667,6 +7667,730 @@
     </w:p>
     <w:p>
       <w:pPr>
+        <w:pStyle w:val="ListBullet"/>
+        <w:numPr>
+          <w:ilvl w:val="0"/>
+          <w:numId w:val="0"/>
+        </w:numPr>
+        <w:ind w:left="720"/>
+        <w:rPr>
+          <w:rFonts w:ascii="Times New Roman" w:hAnsi="Times New Roman" w:cs="Times New Roman"/>
+          <w:b/>
+          <w:bCs/>
+          <w:color w:val="262626" w:themeColor="accent6" w:themeShade="80"/>
+          <w:sz w:val="24"/>
+          <w:szCs w:val="24"/>
+        </w:rPr>
+      </w:pPr>
+    </w:p>
+    <w:p>
+      <w:pPr>
+        <w:pStyle w:val="ListBullet"/>
+        <w:numPr>
+          <w:ilvl w:val="0"/>
+          <w:numId w:val="30"/>
+        </w:numPr>
+        <w:rPr>
+          <w:rFonts w:ascii="Times New Roman" w:hAnsi="Times New Roman" w:cs="Times New Roman"/>
+          <w:b/>
+          <w:bCs/>
+          <w:color w:val="auto"/>
+          <w:sz w:val="28"/>
+          <w:szCs w:val="28"/>
+        </w:rPr>
+      </w:pPr>
+      <w:r>
+        <w:rPr>
+          <w:rFonts w:ascii="Times New Roman" w:hAnsi="Times New Roman" w:cs="Times New Roman"/>
+          <w:b/>
+          <w:bCs/>
+          <w:color w:val="auto"/>
+          <w:sz w:val="28"/>
+          <w:szCs w:val="28"/>
+        </w:rPr>
+        <w:lastRenderedPageBreak/>
+        <w:t>Relational Schem</w:t>
+      </w:r>
+      <w:r>
+        <w:rPr>
+          <w:rFonts w:ascii="Times New Roman" w:hAnsi="Times New Roman" w:cs="Times New Roman"/>
+          <w:b/>
+          <w:bCs/>
+          <w:color w:val="auto"/>
+          <w:sz w:val="28"/>
+          <w:szCs w:val="28"/>
+        </w:rPr>
+        <w:t>a:</w:t>
+      </w:r>
+    </w:p>
+    <w:p>
+      <w:pPr>
+        <w:pStyle w:val="ListBullet"/>
+        <w:numPr>
+          <w:ilvl w:val="0"/>
+          <w:numId w:val="0"/>
+        </w:numPr>
+        <w:ind w:left="576" w:hanging="288"/>
+        <w:rPr>
+          <w:rFonts w:ascii="Times New Roman" w:hAnsi="Times New Roman" w:cs="Times New Roman"/>
+          <w:color w:val="auto"/>
+          <w:sz w:val="24"/>
+          <w:szCs w:val="24"/>
+        </w:rPr>
+      </w:pPr>
+    </w:p>
+    <w:p>
+      <w:pPr>
+        <w:pStyle w:val="ListBullet"/>
+        <w:numPr>
+          <w:ilvl w:val="0"/>
+          <w:numId w:val="40"/>
+        </w:numPr>
+        <w:rPr>
+          <w:rFonts w:ascii="Times New Roman" w:hAnsi="Times New Roman" w:cs="Times New Roman"/>
+          <w:color w:val="auto"/>
+          <w:sz w:val="24"/>
+          <w:szCs w:val="24"/>
+        </w:rPr>
+      </w:pPr>
+      <w:r>
+        <w:rPr>
+          <w:rFonts w:ascii="Times New Roman" w:hAnsi="Times New Roman" w:cs="Times New Roman"/>
+          <w:b/>
+          <w:bCs/>
+          <w:color w:val="auto"/>
+          <w:sz w:val="24"/>
+          <w:szCs w:val="24"/>
+        </w:rPr>
+        <w:t xml:space="preserve">Department </w:t>
+      </w:r>
+      <w:r>
+        <w:rPr>
+          <w:rFonts w:ascii="Times New Roman" w:hAnsi="Times New Roman" w:cs="Times New Roman"/>
+          <w:color w:val="auto"/>
+          <w:sz w:val="24"/>
+          <w:szCs w:val="24"/>
+        </w:rPr>
+        <w:t xml:space="preserve">(DepartmentID </w:t>
+      </w:r>
+      <w:r>
+        <w:rPr>
+          <w:rFonts w:ascii="Times New Roman" w:hAnsi="Times New Roman" w:cs="Times New Roman"/>
+          <w:i/>
+          <w:iCs/>
+          <w:color w:val="auto"/>
+          <w:sz w:val="24"/>
+          <w:szCs w:val="24"/>
+        </w:rPr>
+        <w:t>PK</w:t>
+      </w:r>
+      <w:r>
+        <w:rPr>
+          <w:rFonts w:ascii="Times New Roman" w:hAnsi="Times New Roman" w:cs="Times New Roman"/>
+          <w:color w:val="auto"/>
+          <w:sz w:val="24"/>
+          <w:szCs w:val="24"/>
+        </w:rPr>
+        <w:t>, DepartmentName)</w:t>
+      </w:r>
+    </w:p>
+    <w:p>
+      <w:pPr>
+        <w:pStyle w:val="ListBullet"/>
+        <w:numPr>
+          <w:ilvl w:val="0"/>
+          <w:numId w:val="0"/>
+        </w:numPr>
+        <w:ind w:left="288"/>
+        <w:rPr>
+          <w:rFonts w:ascii="Times New Roman" w:hAnsi="Times New Roman" w:cs="Times New Roman"/>
+          <w:color w:val="auto"/>
+          <w:sz w:val="24"/>
+          <w:szCs w:val="24"/>
+        </w:rPr>
+      </w:pPr>
+    </w:p>
+    <w:p>
+      <w:pPr>
+        <w:pStyle w:val="ListBullet"/>
+        <w:numPr>
+          <w:ilvl w:val="0"/>
+          <w:numId w:val="40"/>
+        </w:numPr>
+        <w:rPr>
+          <w:rFonts w:ascii="Times New Roman" w:hAnsi="Times New Roman" w:cs="Times New Roman"/>
+          <w:color w:val="auto"/>
+          <w:sz w:val="24"/>
+          <w:szCs w:val="24"/>
+        </w:rPr>
+      </w:pPr>
+      <w:r>
+        <w:rPr>
+          <w:rFonts w:ascii="Times New Roman" w:hAnsi="Times New Roman" w:cs="Times New Roman"/>
+          <w:b/>
+          <w:bCs/>
+          <w:color w:val="auto"/>
+          <w:sz w:val="24"/>
+          <w:szCs w:val="24"/>
+        </w:rPr>
+        <w:t>Patient</w:t>
+      </w:r>
+      <w:r>
+        <w:rPr>
+          <w:rFonts w:ascii="Times New Roman" w:hAnsi="Times New Roman" w:cs="Times New Roman"/>
+          <w:color w:val="auto"/>
+          <w:sz w:val="24"/>
+          <w:szCs w:val="24"/>
+        </w:rPr>
+        <w:t xml:space="preserve"> (PatientID </w:t>
+      </w:r>
+      <w:r>
+        <w:rPr>
+          <w:rFonts w:ascii="Times New Roman" w:hAnsi="Times New Roman" w:cs="Times New Roman"/>
+          <w:i/>
+          <w:iCs/>
+          <w:color w:val="auto"/>
+          <w:sz w:val="24"/>
+          <w:szCs w:val="24"/>
+        </w:rPr>
+        <w:t>PK</w:t>
+      </w:r>
+      <w:r>
+        <w:rPr>
+          <w:rFonts w:ascii="Times New Roman" w:hAnsi="Times New Roman" w:cs="Times New Roman"/>
+          <w:color w:val="auto"/>
+          <w:sz w:val="24"/>
+          <w:szCs w:val="24"/>
+        </w:rPr>
+        <w:t>, FirstName, LastName, Gender, Phone)</w:t>
+      </w:r>
+    </w:p>
+    <w:p>
+      <w:pPr>
+        <w:pStyle w:val="ListBullet"/>
+        <w:numPr>
+          <w:ilvl w:val="0"/>
+          <w:numId w:val="0"/>
+        </w:numPr>
+        <w:ind w:left="288"/>
+        <w:rPr>
+          <w:rFonts w:ascii="Times New Roman" w:hAnsi="Times New Roman" w:cs="Times New Roman"/>
+          <w:color w:val="auto"/>
+          <w:sz w:val="24"/>
+          <w:szCs w:val="24"/>
+        </w:rPr>
+      </w:pPr>
+    </w:p>
+    <w:p>
+      <w:pPr>
+        <w:pStyle w:val="ListBullet"/>
+        <w:numPr>
+          <w:ilvl w:val="0"/>
+          <w:numId w:val="40"/>
+        </w:numPr>
+        <w:rPr>
+          <w:rFonts w:ascii="Times New Roman" w:hAnsi="Times New Roman" w:cs="Times New Roman"/>
+          <w:color w:val="auto"/>
+          <w:sz w:val="24"/>
+          <w:szCs w:val="24"/>
+        </w:rPr>
+      </w:pPr>
+      <w:r>
+        <w:rPr>
+          <w:rFonts w:ascii="Times New Roman" w:hAnsi="Times New Roman" w:cs="Times New Roman"/>
+          <w:b/>
+          <w:bCs/>
+          <w:color w:val="auto"/>
+          <w:sz w:val="24"/>
+          <w:szCs w:val="24"/>
+        </w:rPr>
+        <w:t>Doctor</w:t>
+      </w:r>
+      <w:r>
+        <w:rPr>
+          <w:rFonts w:ascii="Times New Roman" w:hAnsi="Times New Roman" w:cs="Times New Roman"/>
+          <w:color w:val="auto"/>
+          <w:sz w:val="24"/>
+          <w:szCs w:val="24"/>
+        </w:rPr>
+        <w:t xml:space="preserve"> (DoctorID </w:t>
+      </w:r>
+      <w:r>
+        <w:rPr>
+          <w:rFonts w:ascii="Times New Roman" w:hAnsi="Times New Roman" w:cs="Times New Roman"/>
+          <w:i/>
+          <w:iCs/>
+          <w:color w:val="auto"/>
+          <w:sz w:val="24"/>
+          <w:szCs w:val="24"/>
+        </w:rPr>
+        <w:t>PK</w:t>
+      </w:r>
+      <w:r>
+        <w:rPr>
+          <w:rFonts w:ascii="Times New Roman" w:hAnsi="Times New Roman" w:cs="Times New Roman"/>
+          <w:color w:val="auto"/>
+          <w:sz w:val="24"/>
+          <w:szCs w:val="24"/>
+        </w:rPr>
+        <w:t xml:space="preserve">, FirstName, LastName, Phone, DepartmentID </w:t>
+      </w:r>
+      <w:r>
+        <w:rPr>
+          <w:rFonts w:ascii="Times New Roman" w:hAnsi="Times New Roman" w:cs="Times New Roman"/>
+          <w:i/>
+          <w:iCs/>
+          <w:color w:val="auto"/>
+          <w:sz w:val="24"/>
+          <w:szCs w:val="24"/>
+        </w:rPr>
+        <w:t>FK</w:t>
+      </w:r>
+      <w:r>
+        <w:rPr>
+          <w:rFonts w:ascii="Times New Roman" w:hAnsi="Times New Roman" w:cs="Times New Roman"/>
+          <w:color w:val="auto"/>
+          <w:sz w:val="24"/>
+          <w:szCs w:val="24"/>
+        </w:rPr>
+        <w:t>)</w:t>
+      </w:r>
+    </w:p>
+    <w:p>
+      <w:pPr>
+        <w:pStyle w:val="ListBullet"/>
+        <w:numPr>
+          <w:ilvl w:val="0"/>
+          <w:numId w:val="0"/>
+        </w:numPr>
+        <w:ind w:left="288"/>
+        <w:rPr>
+          <w:rFonts w:ascii="Times New Roman" w:hAnsi="Times New Roman" w:cs="Times New Roman"/>
+          <w:color w:val="auto"/>
+          <w:sz w:val="24"/>
+          <w:szCs w:val="24"/>
+        </w:rPr>
+      </w:pPr>
+    </w:p>
+    <w:p>
+      <w:pPr>
+        <w:pStyle w:val="ListBullet"/>
+        <w:numPr>
+          <w:ilvl w:val="0"/>
+          <w:numId w:val="40"/>
+        </w:numPr>
+        <w:rPr>
+          <w:rFonts w:ascii="Times New Roman" w:hAnsi="Times New Roman" w:cs="Times New Roman"/>
+          <w:color w:val="auto"/>
+          <w:sz w:val="24"/>
+          <w:szCs w:val="24"/>
+        </w:rPr>
+      </w:pPr>
+      <w:r>
+        <w:rPr>
+          <w:rFonts w:ascii="Times New Roman" w:hAnsi="Times New Roman" w:cs="Times New Roman"/>
+          <w:b/>
+          <w:bCs/>
+          <w:color w:val="auto"/>
+          <w:sz w:val="24"/>
+          <w:szCs w:val="24"/>
+        </w:rPr>
+        <w:t>GeneralPractitioner</w:t>
+      </w:r>
+      <w:r>
+        <w:rPr>
+          <w:rFonts w:ascii="Times New Roman" w:hAnsi="Times New Roman" w:cs="Times New Roman"/>
+          <w:color w:val="auto"/>
+          <w:sz w:val="24"/>
+          <w:szCs w:val="24"/>
+        </w:rPr>
+        <w:t xml:space="preserve"> (DoctorID </w:t>
+      </w:r>
+      <w:r>
+        <w:rPr>
+          <w:rFonts w:ascii="Times New Roman" w:hAnsi="Times New Roman" w:cs="Times New Roman"/>
+          <w:i/>
+          <w:iCs/>
+          <w:color w:val="auto"/>
+          <w:sz w:val="24"/>
+          <w:szCs w:val="24"/>
+        </w:rPr>
+        <w:t>PK FK</w:t>
+      </w:r>
+      <w:r>
+        <w:rPr>
+          <w:rFonts w:ascii="Times New Roman" w:hAnsi="Times New Roman" w:cs="Times New Roman"/>
+          <w:color w:val="auto"/>
+          <w:sz w:val="24"/>
+          <w:szCs w:val="24"/>
+        </w:rPr>
+        <w:t>)</w:t>
+      </w:r>
+    </w:p>
+    <w:p>
+      <w:pPr>
+        <w:pStyle w:val="ListBullet"/>
+        <w:numPr>
+          <w:ilvl w:val="0"/>
+          <w:numId w:val="0"/>
+        </w:numPr>
+        <w:ind w:left="288"/>
+        <w:rPr>
+          <w:rFonts w:ascii="Times New Roman" w:hAnsi="Times New Roman" w:cs="Times New Roman"/>
+          <w:color w:val="auto"/>
+          <w:sz w:val="24"/>
+          <w:szCs w:val="24"/>
+        </w:rPr>
+      </w:pPr>
+    </w:p>
+    <w:p>
+      <w:pPr>
+        <w:pStyle w:val="ListBullet"/>
+        <w:numPr>
+          <w:ilvl w:val="0"/>
+          <w:numId w:val="40"/>
+        </w:numPr>
+        <w:rPr>
+          <w:rFonts w:ascii="Times New Roman" w:hAnsi="Times New Roman" w:cs="Times New Roman"/>
+          <w:color w:val="auto"/>
+          <w:sz w:val="24"/>
+          <w:szCs w:val="24"/>
+        </w:rPr>
+      </w:pPr>
+      <w:r>
+        <w:rPr>
+          <w:rFonts w:ascii="Times New Roman" w:hAnsi="Times New Roman" w:cs="Times New Roman"/>
+          <w:b/>
+          <w:bCs/>
+          <w:color w:val="auto"/>
+          <w:sz w:val="24"/>
+          <w:szCs w:val="24"/>
+        </w:rPr>
+        <w:t>Specialist</w:t>
+      </w:r>
+      <w:r>
+        <w:rPr>
+          <w:rFonts w:ascii="Times New Roman" w:hAnsi="Times New Roman" w:cs="Times New Roman"/>
+          <w:color w:val="auto"/>
+          <w:sz w:val="24"/>
+          <w:szCs w:val="24"/>
+        </w:rPr>
+        <w:t xml:space="preserve"> (DoctorID </w:t>
+      </w:r>
+      <w:r>
+        <w:rPr>
+          <w:rFonts w:ascii="Times New Roman" w:hAnsi="Times New Roman" w:cs="Times New Roman"/>
+          <w:i/>
+          <w:iCs/>
+          <w:color w:val="auto"/>
+          <w:sz w:val="24"/>
+          <w:szCs w:val="24"/>
+        </w:rPr>
+        <w:t>PK FK</w:t>
+      </w:r>
+      <w:r>
+        <w:rPr>
+          <w:rFonts w:ascii="Times New Roman" w:hAnsi="Times New Roman" w:cs="Times New Roman"/>
+          <w:color w:val="auto"/>
+          <w:sz w:val="24"/>
+          <w:szCs w:val="24"/>
+        </w:rPr>
+        <w:t>, Specialty)</w:t>
+      </w:r>
+    </w:p>
+    <w:p>
+      <w:pPr>
+        <w:pStyle w:val="ListBullet"/>
+        <w:numPr>
+          <w:ilvl w:val="0"/>
+          <w:numId w:val="0"/>
+        </w:numPr>
+        <w:ind w:left="288"/>
+        <w:rPr>
+          <w:rFonts w:ascii="Times New Roman" w:hAnsi="Times New Roman" w:cs="Times New Roman"/>
+          <w:color w:val="auto"/>
+          <w:sz w:val="24"/>
+          <w:szCs w:val="24"/>
+        </w:rPr>
+      </w:pPr>
+    </w:p>
+    <w:p>
+      <w:pPr>
+        <w:pStyle w:val="ListBullet"/>
+        <w:numPr>
+          <w:ilvl w:val="0"/>
+          <w:numId w:val="40"/>
+        </w:numPr>
+        <w:rPr>
+          <w:rFonts w:ascii="Times New Roman" w:hAnsi="Times New Roman" w:cs="Times New Roman"/>
+          <w:color w:val="auto"/>
+          <w:sz w:val="24"/>
+          <w:szCs w:val="24"/>
+        </w:rPr>
+      </w:pPr>
+      <w:r>
+        <w:rPr>
+          <w:rFonts w:ascii="Times New Roman" w:hAnsi="Times New Roman" w:cs="Times New Roman"/>
+          <w:b/>
+          <w:bCs/>
+          <w:color w:val="auto"/>
+          <w:sz w:val="24"/>
+          <w:szCs w:val="24"/>
+        </w:rPr>
+        <w:t>Appointment</w:t>
+      </w:r>
+      <w:r>
+        <w:rPr>
+          <w:rFonts w:ascii="Times New Roman" w:hAnsi="Times New Roman" w:cs="Times New Roman"/>
+          <w:color w:val="auto"/>
+          <w:sz w:val="24"/>
+          <w:szCs w:val="24"/>
+        </w:rPr>
+        <w:t xml:space="preserve"> (AppointmentID </w:t>
+      </w:r>
+      <w:r>
+        <w:rPr>
+          <w:rFonts w:ascii="Times New Roman" w:hAnsi="Times New Roman" w:cs="Times New Roman"/>
+          <w:i/>
+          <w:iCs/>
+          <w:color w:val="auto"/>
+          <w:sz w:val="24"/>
+          <w:szCs w:val="24"/>
+        </w:rPr>
+        <w:t>PK</w:t>
+      </w:r>
+      <w:r>
+        <w:rPr>
+          <w:rFonts w:ascii="Times New Roman" w:hAnsi="Times New Roman" w:cs="Times New Roman"/>
+          <w:color w:val="auto"/>
+          <w:sz w:val="24"/>
+          <w:szCs w:val="24"/>
+        </w:rPr>
+        <w:t xml:space="preserve">, AppointmentDate, Status, PatientID </w:t>
+      </w:r>
+      <w:r>
+        <w:rPr>
+          <w:rFonts w:ascii="Times New Roman" w:hAnsi="Times New Roman" w:cs="Times New Roman"/>
+          <w:i/>
+          <w:iCs/>
+          <w:color w:val="auto"/>
+          <w:sz w:val="24"/>
+          <w:szCs w:val="24"/>
+        </w:rPr>
+        <w:t>FK</w:t>
+      </w:r>
+      <w:r>
+        <w:rPr>
+          <w:rFonts w:ascii="Times New Roman" w:hAnsi="Times New Roman" w:cs="Times New Roman"/>
+          <w:color w:val="auto"/>
+          <w:sz w:val="24"/>
+          <w:szCs w:val="24"/>
+        </w:rPr>
+        <w:t>, DoctorID FK)</w:t>
+      </w:r>
+    </w:p>
+    <w:p>
+      <w:pPr>
+        <w:pStyle w:val="ListBullet"/>
+        <w:numPr>
+          <w:ilvl w:val="0"/>
+          <w:numId w:val="0"/>
+        </w:numPr>
+        <w:ind w:left="288"/>
+        <w:rPr>
+          <w:rFonts w:ascii="Times New Roman" w:hAnsi="Times New Roman" w:cs="Times New Roman"/>
+          <w:color w:val="auto"/>
+          <w:sz w:val="24"/>
+          <w:szCs w:val="24"/>
+        </w:rPr>
+      </w:pPr>
+    </w:p>
+    <w:p>
+      <w:pPr>
+        <w:pStyle w:val="ListBullet"/>
+        <w:numPr>
+          <w:ilvl w:val="0"/>
+          <w:numId w:val="40"/>
+        </w:numPr>
+        <w:rPr>
+          <w:rFonts w:ascii="Times New Roman" w:hAnsi="Times New Roman" w:cs="Times New Roman"/>
+          <w:color w:val="auto"/>
+          <w:sz w:val="24"/>
+          <w:szCs w:val="24"/>
+        </w:rPr>
+      </w:pPr>
+      <w:r>
+        <w:rPr>
+          <w:rFonts w:ascii="Times New Roman" w:hAnsi="Times New Roman" w:cs="Times New Roman"/>
+          <w:b/>
+          <w:bCs/>
+          <w:color w:val="auto"/>
+          <w:sz w:val="24"/>
+          <w:szCs w:val="24"/>
+        </w:rPr>
+        <w:t>Treatment</w:t>
+      </w:r>
+      <w:r>
+        <w:rPr>
+          <w:rFonts w:ascii="Times New Roman" w:hAnsi="Times New Roman" w:cs="Times New Roman"/>
+          <w:color w:val="auto"/>
+          <w:sz w:val="24"/>
+          <w:szCs w:val="24"/>
+        </w:rPr>
+        <w:t xml:space="preserve"> (TreatmentID </w:t>
+      </w:r>
+      <w:r>
+        <w:rPr>
+          <w:rFonts w:ascii="Times New Roman" w:hAnsi="Times New Roman" w:cs="Times New Roman"/>
+          <w:i/>
+          <w:iCs/>
+          <w:color w:val="auto"/>
+          <w:sz w:val="24"/>
+          <w:szCs w:val="24"/>
+        </w:rPr>
+        <w:t>PK</w:t>
+      </w:r>
+      <w:r>
+        <w:rPr>
+          <w:rFonts w:ascii="Times New Roman" w:hAnsi="Times New Roman" w:cs="Times New Roman"/>
+          <w:color w:val="auto"/>
+          <w:sz w:val="24"/>
+          <w:szCs w:val="24"/>
+        </w:rPr>
+        <w:t xml:space="preserve">, Diagnosis, AppointmentID </w:t>
+      </w:r>
+      <w:r>
+        <w:rPr>
+          <w:rFonts w:ascii="Times New Roman" w:hAnsi="Times New Roman" w:cs="Times New Roman"/>
+          <w:i/>
+          <w:iCs/>
+          <w:color w:val="auto"/>
+          <w:sz w:val="24"/>
+          <w:szCs w:val="24"/>
+        </w:rPr>
+        <w:t>FK</w:t>
+      </w:r>
+      <w:r>
+        <w:rPr>
+          <w:rFonts w:ascii="Times New Roman" w:hAnsi="Times New Roman" w:cs="Times New Roman"/>
+          <w:color w:val="auto"/>
+          <w:sz w:val="24"/>
+          <w:szCs w:val="24"/>
+        </w:rPr>
+        <w:t xml:space="preserve"> UNIQUE)</w:t>
+      </w:r>
+    </w:p>
+    <w:p>
+      <w:pPr>
+        <w:pStyle w:val="ListBullet"/>
+        <w:numPr>
+          <w:ilvl w:val="0"/>
+          <w:numId w:val="0"/>
+        </w:numPr>
+        <w:ind w:left="288"/>
+        <w:rPr>
+          <w:rFonts w:ascii="Times New Roman" w:hAnsi="Times New Roman" w:cs="Times New Roman"/>
+          <w:color w:val="auto"/>
+          <w:sz w:val="24"/>
+          <w:szCs w:val="24"/>
+        </w:rPr>
+      </w:pPr>
+    </w:p>
+    <w:p>
+      <w:pPr>
+        <w:pStyle w:val="ListBullet"/>
+        <w:numPr>
+          <w:ilvl w:val="0"/>
+          <w:numId w:val="40"/>
+        </w:numPr>
+        <w:rPr>
+          <w:rFonts w:ascii="Times New Roman" w:hAnsi="Times New Roman" w:cs="Times New Roman"/>
+          <w:color w:val="auto"/>
+          <w:sz w:val="24"/>
+          <w:szCs w:val="24"/>
+        </w:rPr>
+      </w:pPr>
+      <w:r>
+        <w:rPr>
+          <w:rFonts w:ascii="Times New Roman" w:hAnsi="Times New Roman" w:cs="Times New Roman"/>
+          <w:b/>
+          <w:bCs/>
+          <w:color w:val="auto"/>
+          <w:sz w:val="24"/>
+          <w:szCs w:val="24"/>
+        </w:rPr>
+        <w:t>Payment</w:t>
+      </w:r>
+      <w:r>
+        <w:rPr>
+          <w:rFonts w:ascii="Times New Roman" w:hAnsi="Times New Roman" w:cs="Times New Roman"/>
+          <w:color w:val="auto"/>
+          <w:sz w:val="24"/>
+          <w:szCs w:val="24"/>
+        </w:rPr>
+        <w:t xml:space="preserve"> (PaymentID </w:t>
+      </w:r>
+      <w:r>
+        <w:rPr>
+          <w:rFonts w:ascii="Times New Roman" w:hAnsi="Times New Roman" w:cs="Times New Roman"/>
+          <w:i/>
+          <w:iCs/>
+          <w:color w:val="auto"/>
+          <w:sz w:val="24"/>
+          <w:szCs w:val="24"/>
+        </w:rPr>
+        <w:t>PK</w:t>
+      </w:r>
+      <w:r>
+        <w:rPr>
+          <w:rFonts w:ascii="Times New Roman" w:hAnsi="Times New Roman" w:cs="Times New Roman"/>
+          <w:color w:val="auto"/>
+          <w:sz w:val="24"/>
+          <w:szCs w:val="24"/>
+        </w:rPr>
+        <w:t xml:space="preserve">, Amount, PaymentMethod, AppointmentID </w:t>
+      </w:r>
+      <w:r>
+        <w:rPr>
+          <w:rFonts w:ascii="Times New Roman" w:hAnsi="Times New Roman" w:cs="Times New Roman"/>
+          <w:i/>
+          <w:iCs/>
+          <w:color w:val="auto"/>
+          <w:sz w:val="24"/>
+          <w:szCs w:val="24"/>
+        </w:rPr>
+        <w:t>FK</w:t>
+      </w:r>
+      <w:r>
+        <w:rPr>
+          <w:rFonts w:ascii="Times New Roman" w:hAnsi="Times New Roman" w:cs="Times New Roman"/>
+          <w:color w:val="auto"/>
+          <w:sz w:val="24"/>
+          <w:szCs w:val="24"/>
+        </w:rPr>
+        <w:t xml:space="preserve"> UNIQUE)</w:t>
+      </w:r>
+    </w:p>
+    <w:p>
+      <w:pPr>
+        <w:pStyle w:val="ListBullet"/>
+        <w:numPr>
+          <w:ilvl w:val="0"/>
+          <w:numId w:val="0"/>
+        </w:numPr>
+        <w:ind w:left="720"/>
+        <w:rPr>
+          <w:rFonts w:ascii="Times New Roman" w:hAnsi="Times New Roman" w:cs="Times New Roman"/>
+          <w:b/>
+          <w:bCs/>
+          <w:color w:val="262626" w:themeColor="accent6" w:themeShade="80"/>
+          <w:sz w:val="24"/>
+          <w:szCs w:val="24"/>
+        </w:rPr>
+      </w:pPr>
+    </w:p>
+    <w:p>
+      <w:pPr>
         <w:pStyle w:val="Heading1"/>
       </w:pPr>
       <w:r>
@@ -9949,6 +10673,119 @@
     </w:lvl>
   </w:abstractNum>
   <w:abstractNum w:abstractNumId="6" w15:restartNumberingAfterBreak="0">
+    <w:nsid w:val="1EA73568"/>
+    <w:multiLevelType w:val="hybridMultilevel"/>
+    <w:tmpl w:val="26BC85C4"/>
+    <w:lvl w:ilvl="0" w:tplc="B9D00D30">
+      <w:start w:val="1"/>
+      <w:numFmt w:val="bullet"/>
+      <w:lvlText w:val="-"/>
+      <w:lvlJc w:val="left"/>
+      <w:pPr>
+        <w:ind w:left="1008" w:hanging="360"/>
+      </w:pPr>
+      <w:rPr>
+        <w:rFonts w:ascii="Times New Roman" w:eastAsiaTheme="minorHAnsi" w:hAnsi="Times New Roman" w:cs="Times New Roman" w:hint="default"/>
+      </w:rPr>
+    </w:lvl>
+    <w:lvl w:ilvl="1" w:tplc="04090003" w:tentative="1">
+      <w:start w:val="1"/>
+      <w:numFmt w:val="bullet"/>
+      <w:lvlText w:val="o"/>
+      <w:lvlJc w:val="left"/>
+      <w:pPr>
+        <w:ind w:left="1728" w:hanging="360"/>
+      </w:pPr>
+      <w:rPr>
+        <w:rFonts w:ascii="Courier New" w:hAnsi="Courier New" w:cs="Courier New" w:hint="default"/>
+      </w:rPr>
+    </w:lvl>
+    <w:lvl w:ilvl="2" w:tplc="04090005" w:tentative="1">
+      <w:start w:val="1"/>
+      <w:numFmt w:val="bullet"/>
+      <w:lvlText w:val=""/>
+      <w:lvlJc w:val="left"/>
+      <w:pPr>
+        <w:ind w:left="2448" w:hanging="360"/>
+      </w:pPr>
+      <w:rPr>
+        <w:rFonts w:ascii="Wingdings" w:hAnsi="Wingdings" w:hint="default"/>
+      </w:rPr>
+    </w:lvl>
+    <w:lvl w:ilvl="3" w:tplc="04090001" w:tentative="1">
+      <w:start w:val="1"/>
+      <w:numFmt w:val="bullet"/>
+      <w:lvlText w:val=""/>
+      <w:lvlJc w:val="left"/>
+      <w:pPr>
+        <w:ind w:left="3168" w:hanging="360"/>
+      </w:pPr>
+      <w:rPr>
+        <w:rFonts w:ascii="Symbol" w:hAnsi="Symbol" w:hint="default"/>
+      </w:rPr>
+    </w:lvl>
+    <w:lvl w:ilvl="4" w:tplc="04090003" w:tentative="1">
+      <w:start w:val="1"/>
+      <w:numFmt w:val="bullet"/>
+      <w:lvlText w:val="o"/>
+      <w:lvlJc w:val="left"/>
+      <w:pPr>
+        <w:ind w:left="3888" w:hanging="360"/>
+      </w:pPr>
+      <w:rPr>
+        <w:rFonts w:ascii="Courier New" w:hAnsi="Courier New" w:cs="Courier New" w:hint="default"/>
+      </w:rPr>
+    </w:lvl>
+    <w:lvl w:ilvl="5" w:tplc="04090005" w:tentative="1">
+      <w:start w:val="1"/>
+      <w:numFmt w:val="bullet"/>
+      <w:lvlText w:val=""/>
+      <w:lvlJc w:val="left"/>
+      <w:pPr>
+        <w:ind w:left="4608" w:hanging="360"/>
+      </w:pPr>
+      <w:rPr>
+        <w:rFonts w:ascii="Wingdings" w:hAnsi="Wingdings" w:hint="default"/>
+      </w:rPr>
+    </w:lvl>
+    <w:lvl w:ilvl="6" w:tplc="04090001" w:tentative="1">
+      <w:start w:val="1"/>
+      <w:numFmt w:val="bullet"/>
+      <w:lvlText w:val=""/>
+      <w:lvlJc w:val="left"/>
+      <w:pPr>
+        <w:ind w:left="5328" w:hanging="360"/>
+      </w:pPr>
+      <w:rPr>
+        <w:rFonts w:ascii="Symbol" w:hAnsi="Symbol" w:hint="default"/>
+      </w:rPr>
+    </w:lvl>
+    <w:lvl w:ilvl="7" w:tplc="04090003" w:tentative="1">
+      <w:start w:val="1"/>
+      <w:numFmt w:val="bullet"/>
+      <w:lvlText w:val="o"/>
+      <w:lvlJc w:val="left"/>
+      <w:pPr>
+        <w:ind w:left="6048" w:hanging="360"/>
+      </w:pPr>
+      <w:rPr>
+        <w:rFonts w:ascii="Courier New" w:hAnsi="Courier New" w:cs="Courier New" w:hint="default"/>
+      </w:rPr>
+    </w:lvl>
+    <w:lvl w:ilvl="8" w:tplc="04090005" w:tentative="1">
+      <w:start w:val="1"/>
+      <w:numFmt w:val="bullet"/>
+      <w:lvlText w:val=""/>
+      <w:lvlJc w:val="left"/>
+      <w:pPr>
+        <w:ind w:left="6768" w:hanging="360"/>
+      </w:pPr>
+      <w:rPr>
+        <w:rFonts w:ascii="Wingdings" w:hAnsi="Wingdings" w:hint="default"/>
+      </w:rPr>
+    </w:lvl>
+  </w:abstractNum>
+  <w:abstractNum w:abstractNumId="7" w15:restartNumberingAfterBreak="0">
     <w:nsid w:val="24796DF9"/>
     <w:multiLevelType w:val="hybridMultilevel"/>
     <w:tmpl w:val="864EC002"/>
@@ -10073,7 +10910,7 @@
       </w:rPr>
     </w:lvl>
   </w:abstractNum>
-  <w:abstractNum w:abstractNumId="7" w15:restartNumberingAfterBreak="0">
+  <w:abstractNum w:abstractNumId="8" w15:restartNumberingAfterBreak="0">
     <w:nsid w:val="25710957"/>
     <w:multiLevelType w:val="hybridMultilevel"/>
     <w:tmpl w:val="433CB9C4"/>
@@ -10183,7 +11020,7 @@
       </w:rPr>
     </w:lvl>
   </w:abstractNum>
-  <w:abstractNum w:abstractNumId="8" w15:restartNumberingAfterBreak="0">
+  <w:abstractNum w:abstractNumId="9" w15:restartNumberingAfterBreak="0">
     <w:nsid w:val="28044A04"/>
     <w:multiLevelType w:val="hybridMultilevel"/>
     <w:tmpl w:val="2BA819A2"/>
@@ -10269,7 +11106,7 @@
       </w:pPr>
     </w:lvl>
   </w:abstractNum>
-  <w:abstractNum w:abstractNumId="9" w15:restartNumberingAfterBreak="0">
+  <w:abstractNum w:abstractNumId="10" w15:restartNumberingAfterBreak="0">
     <w:nsid w:val="2B9958AB"/>
     <w:multiLevelType w:val="multilevel"/>
     <w:tmpl w:val="2ADCA5B4"/>
@@ -10418,7 +11255,7 @@
       </w:rPr>
     </w:lvl>
   </w:abstractNum>
-  <w:abstractNum w:abstractNumId="10" w15:restartNumberingAfterBreak="0">
+  <w:abstractNum w:abstractNumId="11" w15:restartNumberingAfterBreak="0">
     <w:nsid w:val="349B5FCE"/>
     <w:multiLevelType w:val="hybridMultilevel"/>
     <w:tmpl w:val="2A80DB70"/>
@@ -10531,7 +11368,7 @@
       </w:rPr>
     </w:lvl>
   </w:abstractNum>
-  <w:abstractNum w:abstractNumId="11" w15:restartNumberingAfterBreak="0">
+  <w:abstractNum w:abstractNumId="12" w15:restartNumberingAfterBreak="0">
     <w:nsid w:val="367F6A45"/>
     <w:multiLevelType w:val="multilevel"/>
     <w:tmpl w:val="0436C7FE"/>
@@ -10654,7 +11491,7 @@
       </w:rPr>
     </w:lvl>
   </w:abstractNum>
-  <w:abstractNum w:abstractNumId="12" w15:restartNumberingAfterBreak="0">
+  <w:abstractNum w:abstractNumId="13" w15:restartNumberingAfterBreak="0">
     <w:nsid w:val="39DB541F"/>
     <w:multiLevelType w:val="multilevel"/>
     <w:tmpl w:val="CAACC624"/>
@@ -10767,7 +11604,7 @@
       </w:pPr>
     </w:lvl>
   </w:abstractNum>
-  <w:abstractNum w:abstractNumId="13" w15:restartNumberingAfterBreak="0">
+  <w:abstractNum w:abstractNumId="14" w15:restartNumberingAfterBreak="0">
     <w:nsid w:val="3D423FD0"/>
     <w:multiLevelType w:val="multilevel"/>
     <w:tmpl w:val="B502C206"/>
@@ -10917,7 +11754,7 @@
       </w:rPr>
     </w:lvl>
   </w:abstractNum>
-  <w:abstractNum w:abstractNumId="14" w15:restartNumberingAfterBreak="0">
+  <w:abstractNum w:abstractNumId="15" w15:restartNumberingAfterBreak="0">
     <w:nsid w:val="3FDD4EA2"/>
     <w:multiLevelType w:val="multilevel"/>
     <w:tmpl w:val="D1AC6F7E"/>
@@ -11066,7 +11903,7 @@
       </w:rPr>
     </w:lvl>
   </w:abstractNum>
-  <w:abstractNum w:abstractNumId="15" w15:restartNumberingAfterBreak="0">
+  <w:abstractNum w:abstractNumId="16" w15:restartNumberingAfterBreak="0">
     <w:nsid w:val="44EE13B5"/>
     <w:multiLevelType w:val="hybridMultilevel"/>
     <w:tmpl w:val="038E9900"/>
@@ -11182,7 +12019,7 @@
       </w:rPr>
     </w:lvl>
   </w:abstractNum>
-  <w:abstractNum w:abstractNumId="16" w15:restartNumberingAfterBreak="0">
+  <w:abstractNum w:abstractNumId="17" w15:restartNumberingAfterBreak="0">
     <w:nsid w:val="55DA4CC9"/>
     <w:multiLevelType w:val="hybridMultilevel"/>
     <w:tmpl w:val="068EDCB2"/>
@@ -11295,7 +12132,7 @@
       </w:rPr>
     </w:lvl>
   </w:abstractNum>
-  <w:abstractNum w:abstractNumId="17" w15:restartNumberingAfterBreak="0">
+  <w:abstractNum w:abstractNumId="18" w15:restartNumberingAfterBreak="0">
     <w:nsid w:val="55F84D01"/>
     <w:multiLevelType w:val="multilevel"/>
     <w:tmpl w:val="A9E06390"/>
@@ -11408,7 +12245,7 @@
       </w:pPr>
     </w:lvl>
   </w:abstractNum>
-  <w:abstractNum w:abstractNumId="18" w15:restartNumberingAfterBreak="0">
+  <w:abstractNum w:abstractNumId="19" w15:restartNumberingAfterBreak="0">
     <w:nsid w:val="56B224C9"/>
     <w:multiLevelType w:val="multilevel"/>
     <w:tmpl w:val="BE58CE00"/>
@@ -11557,7 +12394,7 @@
       </w:rPr>
     </w:lvl>
   </w:abstractNum>
-  <w:abstractNum w:abstractNumId="19" w15:restartNumberingAfterBreak="0">
+  <w:abstractNum w:abstractNumId="20" w15:restartNumberingAfterBreak="0">
     <w:nsid w:val="57397E8F"/>
     <w:multiLevelType w:val="multilevel"/>
     <w:tmpl w:val="93162086"/>
@@ -11670,7 +12507,7 @@
       </w:pPr>
     </w:lvl>
   </w:abstractNum>
-  <w:abstractNum w:abstractNumId="20" w15:restartNumberingAfterBreak="0">
+  <w:abstractNum w:abstractNumId="21" w15:restartNumberingAfterBreak="0">
     <w:nsid w:val="5FFB796A"/>
     <w:multiLevelType w:val="multilevel"/>
     <w:tmpl w:val="6388B4E8"/>
@@ -11783,7 +12620,7 @@
       </w:pPr>
     </w:lvl>
   </w:abstractNum>
-  <w:abstractNum w:abstractNumId="21" w15:restartNumberingAfterBreak="0">
+  <w:abstractNum w:abstractNumId="22" w15:restartNumberingAfterBreak="0">
     <w:nsid w:val="64B955EC"/>
     <w:multiLevelType w:val="hybridMultilevel"/>
     <w:tmpl w:val="950A10D8"/>
@@ -11896,7 +12733,7 @@
       </w:rPr>
     </w:lvl>
   </w:abstractNum>
-  <w:abstractNum w:abstractNumId="22" w15:restartNumberingAfterBreak="0">
+  <w:abstractNum w:abstractNumId="23" w15:restartNumberingAfterBreak="0">
     <w:nsid w:val="667677D6"/>
     <w:multiLevelType w:val="hybridMultilevel"/>
     <w:tmpl w:val="D01692D8"/>
@@ -11985,7 +12822,7 @@
       </w:pPr>
     </w:lvl>
   </w:abstractNum>
-  <w:abstractNum w:abstractNumId="23" w15:restartNumberingAfterBreak="0">
+  <w:abstractNum w:abstractNumId="24" w15:restartNumberingAfterBreak="0">
     <w:nsid w:val="688927E2"/>
     <w:multiLevelType w:val="hybridMultilevel"/>
     <w:tmpl w:val="64F8DB74"/>
@@ -12075,7 +12912,7 @@
       </w:pPr>
     </w:lvl>
   </w:abstractNum>
-  <w:abstractNum w:abstractNumId="24" w15:restartNumberingAfterBreak="0">
+  <w:abstractNum w:abstractNumId="25" w15:restartNumberingAfterBreak="0">
     <w:nsid w:val="6FD51D52"/>
     <w:multiLevelType w:val="hybridMultilevel"/>
     <w:tmpl w:val="36305470"/>
@@ -12161,7 +12998,7 @@
       </w:pPr>
     </w:lvl>
   </w:abstractNum>
-  <w:abstractNum w:abstractNumId="25" w15:restartNumberingAfterBreak="0">
+  <w:abstractNum w:abstractNumId="26" w15:restartNumberingAfterBreak="0">
     <w:nsid w:val="704E3E7F"/>
     <w:multiLevelType w:val="hybridMultilevel"/>
     <w:tmpl w:val="E34C7444"/>
@@ -12250,7 +13087,7 @@
       </w:pPr>
     </w:lvl>
   </w:abstractNum>
-  <w:abstractNum w:abstractNumId="26" w15:restartNumberingAfterBreak="0">
+  <w:abstractNum w:abstractNumId="27" w15:restartNumberingAfterBreak="0">
     <w:nsid w:val="72C71C39"/>
     <w:multiLevelType w:val="hybridMultilevel"/>
     <w:tmpl w:val="C960FD86"/>
@@ -12375,7 +13212,7 @@
       </w:rPr>
     </w:lvl>
   </w:abstractNum>
-  <w:abstractNum w:abstractNumId="27" w15:restartNumberingAfterBreak="0">
+  <w:abstractNum w:abstractNumId="28" w15:restartNumberingAfterBreak="0">
     <w:nsid w:val="746C2223"/>
     <w:multiLevelType w:val="multilevel"/>
     <w:tmpl w:val="94A85F9C"/>
@@ -12524,7 +13361,7 @@
       </w:rPr>
     </w:lvl>
   </w:abstractNum>
-  <w:abstractNum w:abstractNumId="28" w15:restartNumberingAfterBreak="0">
+  <w:abstractNum w:abstractNumId="29" w15:restartNumberingAfterBreak="0">
     <w:nsid w:val="7823322B"/>
     <w:multiLevelType w:val="hybridMultilevel"/>
     <w:tmpl w:val="A0D81BB6"/>
@@ -12647,7 +13484,7 @@
     </w:lvlOverride>
   </w:num>
   <w:num w:numId="3" w16cid:durableId="1517813912">
-    <w:abstractNumId w:val="11"/>
+    <w:abstractNumId w:val="12"/>
   </w:num>
   <w:num w:numId="4" w16cid:durableId="798186098">
     <w:abstractNumId w:val="0"/>
@@ -12662,19 +13499,19 @@
     </w:lvlOverride>
   </w:num>
   <w:num w:numId="6" w16cid:durableId="2115830839">
-    <w:abstractNumId w:val="15"/>
+    <w:abstractNumId w:val="16"/>
   </w:num>
   <w:num w:numId="7" w16cid:durableId="471407680">
-    <w:abstractNumId w:val="6"/>
+    <w:abstractNumId w:val="7"/>
   </w:num>
   <w:num w:numId="8" w16cid:durableId="893388596">
-    <w:abstractNumId w:val="25"/>
+    <w:abstractNumId w:val="26"/>
   </w:num>
   <w:num w:numId="9" w16cid:durableId="1862353387">
     <w:abstractNumId w:val="1"/>
   </w:num>
   <w:num w:numId="10" w16cid:durableId="583271442">
-    <w:abstractNumId w:val="26"/>
+    <w:abstractNumId w:val="27"/>
     <w:lvlOverride w:ilvl="0">
       <w:startOverride w:val="1"/>
     </w:lvlOverride>
@@ -12690,7 +13527,7 @@
     <w:lvlOverride w:ilvl="8"/>
   </w:num>
   <w:num w:numId="11" w16cid:durableId="783697976">
-    <w:abstractNumId w:val="15"/>
+    <w:abstractNumId w:val="16"/>
     <w:lvlOverride w:ilvl="0"/>
     <w:lvlOverride w:ilvl="1">
       <w:startOverride w:val="1"/>
@@ -12704,19 +13541,19 @@
     <w:lvlOverride w:ilvl="8"/>
   </w:num>
   <w:num w:numId="12" w16cid:durableId="1306158738">
+    <w:abstractNumId w:val="24"/>
+  </w:num>
+  <w:num w:numId="13" w16cid:durableId="1700812942">
     <w:abstractNumId w:val="23"/>
   </w:num>
-  <w:num w:numId="13" w16cid:durableId="1700812942">
-    <w:abstractNumId w:val="22"/>
-  </w:num>
   <w:num w:numId="14" w16cid:durableId="1608192642">
-    <w:abstractNumId w:val="28"/>
+    <w:abstractNumId w:val="29"/>
   </w:num>
   <w:num w:numId="15" w16cid:durableId="114762884">
-    <w:abstractNumId w:val="7"/>
+    <w:abstractNumId w:val="8"/>
   </w:num>
   <w:num w:numId="16" w16cid:durableId="1418284132">
-    <w:abstractNumId w:val="24"/>
+    <w:abstractNumId w:val="25"/>
   </w:num>
   <w:num w:numId="17" w16cid:durableId="70466096">
     <w:abstractNumId w:val="3"/>
@@ -12725,19 +13562,19 @@
     <w:abstractNumId w:val="4"/>
   </w:num>
   <w:num w:numId="19" w16cid:durableId="1183976187">
-    <w:abstractNumId w:val="8"/>
+    <w:abstractNumId w:val="9"/>
   </w:num>
   <w:num w:numId="20" w16cid:durableId="1865823307">
+    <w:abstractNumId w:val="21"/>
+  </w:num>
+  <w:num w:numId="21" w16cid:durableId="2074043917">
     <w:abstractNumId w:val="20"/>
   </w:num>
-  <w:num w:numId="21" w16cid:durableId="2074043917">
-    <w:abstractNumId w:val="19"/>
-  </w:num>
   <w:num w:numId="22" w16cid:durableId="1745374221">
-    <w:abstractNumId w:val="12"/>
+    <w:abstractNumId w:val="13"/>
   </w:num>
   <w:num w:numId="23" w16cid:durableId="112403004">
-    <w:abstractNumId w:val="17"/>
+    <w:abstractNumId w:val="18"/>
   </w:num>
   <w:num w:numId="24" w16cid:durableId="207844976">
     <w:abstractNumId w:val="0"/>
@@ -12746,25 +13583,25 @@
     <w:abstractNumId w:val="5"/>
   </w:num>
   <w:num w:numId="26" w16cid:durableId="1307121231">
-    <w:abstractNumId w:val="9"/>
+    <w:abstractNumId w:val="10"/>
   </w:num>
   <w:num w:numId="27" w16cid:durableId="2097969410">
     <w:abstractNumId w:val="2"/>
   </w:num>
   <w:num w:numId="28" w16cid:durableId="802769626">
-    <w:abstractNumId w:val="16"/>
+    <w:abstractNumId w:val="17"/>
   </w:num>
   <w:num w:numId="29" w16cid:durableId="1773864708">
-    <w:abstractNumId w:val="10"/>
+    <w:abstractNumId w:val="11"/>
   </w:num>
   <w:num w:numId="30" w16cid:durableId="1190679152">
-    <w:abstractNumId w:val="21"/>
+    <w:abstractNumId w:val="22"/>
   </w:num>
   <w:num w:numId="31" w16cid:durableId="1496416065">
-    <w:abstractNumId w:val="14"/>
+    <w:abstractNumId w:val="15"/>
   </w:num>
   <w:num w:numId="32" w16cid:durableId="1261530086">
-    <w:abstractNumId w:val="13"/>
+    <w:abstractNumId w:val="14"/>
   </w:num>
   <w:num w:numId="33" w16cid:durableId="1046442775">
     <w:abstractNumId w:val="0"/>
@@ -12779,13 +13616,16 @@
     <w:abstractNumId w:val="0"/>
   </w:num>
   <w:num w:numId="37" w16cid:durableId="1148745932">
-    <w:abstractNumId w:val="18"/>
+    <w:abstractNumId w:val="19"/>
   </w:num>
   <w:num w:numId="38" w16cid:durableId="533734186">
-    <w:abstractNumId w:val="27"/>
+    <w:abstractNumId w:val="28"/>
   </w:num>
   <w:num w:numId="39" w16cid:durableId="1486244316">
     <w:abstractNumId w:val="0"/>
+  </w:num>
+  <w:num w:numId="40" w16cid:durableId="1275210848">
+    <w:abstractNumId w:val="6"/>
   </w:num>
 </w:numbering>
 </file>
@@ -14195,12 +15035,12 @@
     <w:pitch w:val="variable"/>
     <w:sig w:usb0="00000000" w:usb1="10000000" w:usb2="00000000" w:usb3="00000000" w:csb0="80000000" w:csb1="00000000"/>
   </w:font>
-  <w:font w:name="Wingdings">
-    <w:panose1 w:val="05000000000000000000"/>
-    <w:charset w:val="02"/>
-    <w:family w:val="auto"/>
+  <w:font w:name="Arial">
+    <w:panose1 w:val="020B0604020202020204"/>
+    <w:charset w:val="00"/>
+    <w:family w:val="swiss"/>
     <w:pitch w:val="variable"/>
-    <w:sig w:usb0="00000000" w:usb1="10000000" w:usb2="00000000" w:usb3="00000000" w:csb0="80000000" w:csb1="00000000"/>
+    <w:sig w:usb0="E0002EFF" w:usb1="C000785B" w:usb2="00000009" w:usb3="00000000" w:csb0="000001FF" w:csb1="00000000"/>
   </w:font>
   <w:font w:name="Courier New">
     <w:panose1 w:val="02070309020205020404"/>
@@ -14209,12 +15049,12 @@
     <w:pitch w:val="fixed"/>
     <w:sig w:usb0="E0002EFF" w:usb1="C0007843" w:usb2="00000009" w:usb3="00000000" w:csb0="000001FF" w:csb1="00000000"/>
   </w:font>
-  <w:font w:name="Arial">
-    <w:panose1 w:val="020B0604020202020204"/>
-    <w:charset w:val="00"/>
-    <w:family w:val="swiss"/>
+  <w:font w:name="Wingdings">
+    <w:panose1 w:val="05000000000000000000"/>
+    <w:charset w:val="02"/>
+    <w:family w:val="auto"/>
     <w:pitch w:val="variable"/>
-    <w:sig w:usb0="E0002EFF" w:usb1="C000785B" w:usb2="00000009" w:usb3="00000000" w:csb0="000001FF" w:csb1="00000000"/>
+    <w:sig w:usb0="00000000" w:usb1="10000000" w:usb2="00000000" w:usb3="00000000" w:csb0="80000000" w:csb1="00000000"/>
   </w:font>
   <w:font w:name="MS PGothic">
     <w:panose1 w:val="020B0600070205080204"/>
@@ -14318,6 +15158,7 @@
     <w:rsid w:val="00351A43"/>
     <w:rsid w:val="00366F01"/>
     <w:rsid w:val="003B34DF"/>
+    <w:rsid w:val="003E5691"/>
     <w:rsid w:val="00415C82"/>
     <w:rsid w:val="004A7EE6"/>
     <w:rsid w:val="004E5C8C"/>
@@ -14345,6 +15186,7 @@
     <w:rsid w:val="009A2761"/>
     <w:rsid w:val="00A53609"/>
     <w:rsid w:val="00A65CD8"/>
+    <w:rsid w:val="00A855A0"/>
     <w:rsid w:val="00A90B6D"/>
     <w:rsid w:val="00AC3A9C"/>
     <w:rsid w:val="00AC55E9"/>
@@ -15203,16 +16045,16 @@
 </file>
 
 <file path=customXml/item2.xml><?xml version="1.0" encoding="utf-8"?>
-<b:Sources xmlns:b="http://schemas.openxmlformats.org/officeDocument/2006/bibliography" SelectedStyle="\APA.XSL" StyleName="APA"/>
-</file>
-
-<file path=customXml/item3.xml><?xml version="1.0" encoding="utf-8"?>
 <?mso-contentType ?>
 <FormTemplates xmlns="http://schemas.microsoft.com/sharepoint/v3/contenttype/forms">
   <Display>DocumentLibraryForm</Display>
   <Edit>AssetEditForm</Edit>
   <New>DocumentLibraryForm</New>
 </FormTemplates>
+</file>
+
+<file path=customXml/item3.xml><?xml version="1.0" encoding="utf-8"?>
+<b:Sources xmlns:b="http://schemas.openxmlformats.org/officeDocument/2006/bibliography" SelectedStyle="\APA.XSL" StyleName="APA"/>
 </file>
 
 <file path=customXml/itemProps1.xml><?xml version="1.0" encoding="utf-8"?>
@@ -15224,17 +16066,17 @@
 </file>
 
 <file path=customXml/itemProps2.xml><?xml version="1.0" encoding="utf-8"?>
+<ds:datastoreItem xmlns:ds="http://schemas.openxmlformats.org/officeDocument/2006/customXml" ds:itemID="{E34C63B7-A026-4A37-9535-4FBB4C03A11D}">
+  <ds:schemaRefs>
+    <ds:schemaRef ds:uri="http://schemas.microsoft.com/sharepoint/v3/contenttype/forms"/>
+  </ds:schemaRefs>
+</ds:datastoreItem>
+</file>
+
+<file path=customXml/itemProps3.xml><?xml version="1.0" encoding="utf-8"?>
 <ds:datastoreItem xmlns:ds="http://schemas.openxmlformats.org/officeDocument/2006/customXml" ds:itemID="{355C5113-D031-41DB-A6D8-43CE1A0E6695}">
   <ds:schemaRefs>
     <ds:schemaRef ds:uri="http://schemas.openxmlformats.org/officeDocument/2006/bibliography"/>
   </ds:schemaRefs>
 </ds:datastoreItem>
-</file>
-
-<file path=customXml/itemProps3.xml><?xml version="1.0" encoding="utf-8"?>
-<ds:datastoreItem xmlns:ds="http://schemas.openxmlformats.org/officeDocument/2006/customXml" ds:itemID="{E34C63B7-A026-4A37-9535-4FBB4C03A11D}">
-  <ds:schemaRefs>
-    <ds:schemaRef ds:uri="http://schemas.microsoft.com/sharepoint/v3/contenttype/forms"/>
-  </ds:schemaRefs>
-</ds:datastoreItem>
 </file>
</xml_diff>

<commit_message>
Database table has been created
</commit_message>
<xml_diff>
--- a/Introduction to DB-CS350 Project.docx
+++ b/Introduction to DB-CS350 Project.docx
@@ -1501,7 +1501,21 @@
                                     <w:rPr>
                                       <w:color w:val="auto"/>
                                     </w:rPr>
-                                    <w:t xml:space="preserve"> This includes filling your information on the cover page.</w:t>
+                                    <w:t xml:space="preserve"> This includes </w:t>
+                                  </w:r>
+                                  <w:proofErr w:type="gramStart"/>
+                                  <w:r>
+                                    <w:rPr>
+                                      <w:color w:val="auto"/>
+                                    </w:rPr>
+                                    <w:t>filling</w:t>
+                                  </w:r>
+                                  <w:proofErr w:type="gramEnd"/>
+                                  <w:r>
+                                    <w:rPr>
+                                      <w:color w:val="auto"/>
+                                    </w:rPr>
+                                    <w:t xml:space="preserve"> your information on the cover page.</w:t>
                                   </w:r>
                                 </w:p>
                                 <w:p>
@@ -1523,7 +1537,21 @@
                                     <w:rPr>
                                       <w:color w:val="auto"/>
                                     </w:rPr>
-                                    <w:t>You must use this template, failing which will result in zero mark.</w:t>
+                                    <w:t xml:space="preserve">You must use this template, failing which will result in zero </w:t>
+                                  </w:r>
+                                  <w:proofErr w:type="gramStart"/>
+                                  <w:r>
+                                    <w:rPr>
+                                      <w:color w:val="auto"/>
+                                    </w:rPr>
+                                    <w:t>mark</w:t>
+                                  </w:r>
+                                  <w:proofErr w:type="gramEnd"/>
+                                  <w:r>
+                                    <w:rPr>
+                                      <w:color w:val="auto"/>
+                                    </w:rPr>
+                                    <w:t>.</w:t>
                                   </w:r>
                                 </w:p>
                                 <w:p>
@@ -1981,7 +2009,21 @@
                               <w:rPr>
                                 <w:color w:val="auto"/>
                               </w:rPr>
-                              <w:t xml:space="preserve"> This includes filling your information on the cover page.</w:t>
+                              <w:t xml:space="preserve"> This includes </w:t>
+                            </w:r>
+                            <w:proofErr w:type="gramStart"/>
+                            <w:r>
+                              <w:rPr>
+                                <w:color w:val="auto"/>
+                              </w:rPr>
+                              <w:t>filling</w:t>
+                            </w:r>
+                            <w:proofErr w:type="gramEnd"/>
+                            <w:r>
+                              <w:rPr>
+                                <w:color w:val="auto"/>
+                              </w:rPr>
+                              <w:t xml:space="preserve"> your information on the cover page.</w:t>
                             </w:r>
                           </w:p>
                           <w:p>
@@ -2003,7 +2045,21 @@
                               <w:rPr>
                                 <w:color w:val="auto"/>
                               </w:rPr>
-                              <w:t>You must use this template, failing which will result in zero mark.</w:t>
+                              <w:t xml:space="preserve">You must use this template, failing which will result in zero </w:t>
+                            </w:r>
+                            <w:proofErr w:type="gramStart"/>
+                            <w:r>
+                              <w:rPr>
+                                <w:color w:val="auto"/>
+                              </w:rPr>
+                              <w:t>mark</w:t>
+                            </w:r>
+                            <w:proofErr w:type="gramEnd"/>
+                            <w:r>
+                              <w:rPr>
+                                <w:color w:val="auto"/>
+                              </w:rPr>
+                              <w:t>.</w:t>
                             </w:r>
                           </w:p>
                           <w:p>
@@ -2331,7 +2387,27 @@
                                           <w:sz w:val="28"/>
                                           <w:szCs w:val="28"/>
                                         </w:rPr>
-                                        <w:t>Ramadan Moraya Hakami</w:t>
+                                        <w:t xml:space="preserve">Ramadan </w:t>
+                                      </w:r>
+                                      <w:proofErr w:type="spellStart"/>
+                                      <w:r>
+                                        <w:rPr>
+                                          <w:b/>
+                                          <w:bCs/>
+                                          <w:sz w:val="28"/>
+                                          <w:szCs w:val="28"/>
+                                        </w:rPr>
+                                        <w:t>Moraya</w:t>
+                                      </w:r>
+                                      <w:proofErr w:type="spellEnd"/>
+                                      <w:r>
+                                        <w:rPr>
+                                          <w:b/>
+                                          <w:bCs/>
+                                          <w:sz w:val="28"/>
+                                          <w:szCs w:val="28"/>
+                                        </w:rPr>
+                                        <w:t xml:space="preserve"> Hakami</w:t>
                                       </w:r>
                                     </w:p>
                                     <w:p>
@@ -2360,7 +2436,17 @@
                                           <w:sz w:val="28"/>
                                           <w:szCs w:val="28"/>
                                         </w:rPr>
-                                        <w:t>Rakan A</w:t>
+                                        <w:t xml:space="preserve">Rakan </w:t>
+                                      </w:r>
+                                      <w:proofErr w:type="spellStart"/>
+                                      <w:r>
+                                        <w:rPr>
+                                          <w:b/>
+                                          <w:bCs/>
+                                          <w:sz w:val="28"/>
+                                          <w:szCs w:val="28"/>
+                                        </w:rPr>
+                                        <w:t>A</w:t>
                                       </w:r>
                                       <w:r>
                                         <w:rPr>
@@ -2371,6 +2457,7 @@
                                         </w:rPr>
                                         <w:t>lqu</w:t>
                                       </w:r>
+                                      <w:proofErr w:type="spellEnd"/>
                                     </w:p>
                                     <w:p>
                                       <w:pPr>
@@ -2819,7 +2906,27 @@
                                     <w:sz w:val="28"/>
                                     <w:szCs w:val="28"/>
                                   </w:rPr>
-                                  <w:t>Ramadan Moraya Hakami</w:t>
+                                  <w:t xml:space="preserve">Ramadan </w:t>
+                                </w:r>
+                                <w:proofErr w:type="spellStart"/>
+                                <w:r>
+                                  <w:rPr>
+                                    <w:b/>
+                                    <w:bCs/>
+                                    <w:sz w:val="28"/>
+                                    <w:szCs w:val="28"/>
+                                  </w:rPr>
+                                  <w:t>Moraya</w:t>
+                                </w:r>
+                                <w:proofErr w:type="spellEnd"/>
+                                <w:r>
+                                  <w:rPr>
+                                    <w:b/>
+                                    <w:bCs/>
+                                    <w:sz w:val="28"/>
+                                    <w:szCs w:val="28"/>
+                                  </w:rPr>
+                                  <w:t xml:space="preserve"> Hakami</w:t>
                                 </w:r>
                               </w:p>
                               <w:p>
@@ -2848,7 +2955,17 @@
                                     <w:sz w:val="28"/>
                                     <w:szCs w:val="28"/>
                                   </w:rPr>
-                                  <w:t>Rakan A</w:t>
+                                  <w:t xml:space="preserve">Rakan </w:t>
+                                </w:r>
+                                <w:proofErr w:type="spellStart"/>
+                                <w:r>
+                                  <w:rPr>
+                                    <w:b/>
+                                    <w:bCs/>
+                                    <w:sz w:val="28"/>
+                                    <w:szCs w:val="28"/>
+                                  </w:rPr>
+                                  <w:t>A</w:t>
                                 </w:r>
                                 <w:r>
                                   <w:rPr>
@@ -2859,6 +2976,7 @@
                                   </w:rPr>
                                   <w:t>lqu</w:t>
                                 </w:r>
+                                <w:proofErr w:type="spellEnd"/>
                               </w:p>
                               <w:p>
                                 <w:pPr>
@@ -3309,6 +3427,7 @@
         </w:rPr>
         <w:t xml:space="preserve">This project </w:t>
       </w:r>
+      <w:proofErr w:type="gramStart"/>
       <w:r>
         <w:rPr>
           <w:rFonts w:ascii="Times New Roman" w:hAnsi="Times New Roman" w:cs="Times New Roman"/>
@@ -3318,7 +3437,19 @@
           <w:sz w:val="24"/>
           <w:szCs w:val="24"/>
         </w:rPr>
-        <w:t xml:space="preserve">worth </w:t>
+        <w:t>worth</w:t>
+      </w:r>
+      <w:proofErr w:type="gramEnd"/>
+      <w:r>
+        <w:rPr>
+          <w:rFonts w:ascii="Times New Roman" w:hAnsi="Times New Roman" w:cs="Times New Roman"/>
+          <w:b/>
+          <w:bCs/>
+          <w:color w:val="auto"/>
+          <w:sz w:val="24"/>
+          <w:szCs w:val="24"/>
+        </w:rPr>
+        <w:t xml:space="preserve"> </w:t>
       </w:r>
       <w:r>
         <w:rPr>
@@ -4157,7 +4288,25 @@
           <w:sz w:val="24"/>
           <w:szCs w:val="24"/>
         </w:rPr>
-        <w:t xml:space="preserve"> describing the completed work, key decisions, challenges, future plan, and contribution of each group member.</w:t>
+        <w:t xml:space="preserve"> describing the completed work, key decisions, challenges, </w:t>
+      </w:r>
+      <w:proofErr w:type="gramStart"/>
+      <w:r>
+        <w:rPr>
+          <w:rFonts w:ascii="Times New Roman" w:hAnsi="Times New Roman" w:cs="Times New Roman"/>
+          <w:sz w:val="24"/>
+          <w:szCs w:val="24"/>
+        </w:rPr>
+        <w:t>future plan</w:t>
+      </w:r>
+      <w:proofErr w:type="gramEnd"/>
+      <w:r>
+        <w:rPr>
+          <w:rFonts w:ascii="Times New Roman" w:hAnsi="Times New Roman" w:cs="Times New Roman"/>
+          <w:sz w:val="24"/>
+          <w:szCs w:val="24"/>
+        </w:rPr>
+        <w:t>, and contribution of each group member.</w:t>
       </w:r>
     </w:p>
     <w:p>
@@ -4200,7 +4349,25 @@
           <w:sz w:val="24"/>
           <w:szCs w:val="24"/>
         </w:rPr>
-        <w:t xml:space="preserve"> to the live report document, GitHub/GitLab repository, and Google Colab notebook (if applicable) in the </w:t>
+        <w:t xml:space="preserve"> to the live report document, GitHub/GitLab repository, and Google </w:t>
+      </w:r>
+      <w:proofErr w:type="spellStart"/>
+      <w:r>
+        <w:rPr>
+          <w:rFonts w:ascii="Times New Roman" w:hAnsi="Times New Roman" w:cs="Times New Roman"/>
+          <w:sz w:val="24"/>
+          <w:szCs w:val="24"/>
+        </w:rPr>
+        <w:t>Colab</w:t>
+      </w:r>
+      <w:proofErr w:type="spellEnd"/>
+      <w:r>
+        <w:rPr>
+          <w:rFonts w:ascii="Times New Roman" w:hAnsi="Times New Roman" w:cs="Times New Roman"/>
+          <w:sz w:val="24"/>
+          <w:szCs w:val="24"/>
+        </w:rPr>
+        <w:t xml:space="preserve"> notebook (if applicable) in the </w:t>
       </w:r>
       <w:r>
         <w:rPr>
@@ -4890,7 +5057,25 @@
           <w:sz w:val="24"/>
           <w:szCs w:val="24"/>
         </w:rPr>
-        <w:t>A private clinic currently manages its patient information manually, making it difficult to organize appointments, treatments, and payments. The clinic has decided to develop a database system to improve data organization and retrieval.</w:t>
+        <w:t xml:space="preserve">A private clinic currently manages </w:t>
+      </w:r>
+      <w:proofErr w:type="gramStart"/>
+      <w:r>
+        <w:rPr>
+          <w:rFonts w:ascii="Times New Roman" w:hAnsi="Times New Roman" w:cs="Times New Roman"/>
+          <w:sz w:val="24"/>
+          <w:szCs w:val="24"/>
+        </w:rPr>
+        <w:t>its patient</w:t>
+      </w:r>
+      <w:proofErr w:type="gramEnd"/>
+      <w:r>
+        <w:rPr>
+          <w:rFonts w:ascii="Times New Roman" w:hAnsi="Times New Roman" w:cs="Times New Roman"/>
+          <w:sz w:val="24"/>
+          <w:szCs w:val="24"/>
+        </w:rPr>
+        <w:t xml:space="preserve"> information manually, making it difficult to organize appointments, treatments, and payments. The clinic has decided to develop a database system to improve data organization and retrieval.</w:t>
       </w:r>
     </w:p>
     <w:p>
@@ -4956,7 +5141,27 @@
           <w:szCs w:val="24"/>
           <w:lang w:val="es-ES"/>
         </w:rPr>
-        <w:t>A complete ER/EER diagram.</w:t>
+        <w:t xml:space="preserve">A complete ER/EER </w:t>
+      </w:r>
+      <w:proofErr w:type="spellStart"/>
+      <w:r>
+        <w:rPr>
+          <w:rFonts w:ascii="Times New Roman" w:hAnsi="Times New Roman" w:cs="Times New Roman"/>
+          <w:sz w:val="24"/>
+          <w:szCs w:val="24"/>
+          <w:lang w:val="es-ES"/>
+        </w:rPr>
+        <w:t>diagram</w:t>
+      </w:r>
+      <w:proofErr w:type="spellEnd"/>
+      <w:r>
+        <w:rPr>
+          <w:rFonts w:ascii="Times New Roman" w:hAnsi="Times New Roman" w:cs="Times New Roman"/>
+          <w:sz w:val="24"/>
+          <w:szCs w:val="24"/>
+          <w:lang w:val="es-ES"/>
+        </w:rPr>
+        <w:t>.</w:t>
       </w:r>
     </w:p>
     <w:p>
@@ -5470,6 +5675,8 @@
           <w:szCs w:val="24"/>
         </w:rPr>
       </w:pPr>
+      <w:proofErr w:type="spellStart"/>
+      <w:proofErr w:type="gramStart"/>
       <w:r>
         <w:rPr>
           <w:rFonts w:ascii="Times New Roman" w:hAnsi="Times New Roman" w:cs="Times New Roman"/>
@@ -5479,6 +5686,8 @@
         </w:rPr>
         <w:t>GeneralPractitioner</w:t>
       </w:r>
+      <w:proofErr w:type="spellEnd"/>
+      <w:proofErr w:type="gramEnd"/>
     </w:p>
     <w:p>
       <w:pPr>
@@ -5680,7 +5889,47 @@
           <w:sz w:val="24"/>
           <w:szCs w:val="24"/>
         </w:rPr>
-        <w:t>The Doctor entity is specialized into two subtypes:</w:t>
+        <w:t xml:space="preserve">The Doctor entity </w:t>
+      </w:r>
+      <w:proofErr w:type="gramStart"/>
+      <w:r>
+        <w:rPr>
+          <w:rFonts w:ascii="Times New Roman" w:hAnsi="Times New Roman" w:cs="Times New Roman"/>
+          <w:color w:val="262626" w:themeColor="accent6" w:themeShade="80"/>
+          <w:sz w:val="24"/>
+          <w:szCs w:val="24"/>
+        </w:rPr>
+        <w:t>is specialized</w:t>
+      </w:r>
+      <w:proofErr w:type="gramEnd"/>
+      <w:r>
+        <w:rPr>
+          <w:rFonts w:ascii="Times New Roman" w:hAnsi="Times New Roman" w:cs="Times New Roman"/>
+          <w:color w:val="262626" w:themeColor="accent6" w:themeShade="80"/>
+          <w:sz w:val="24"/>
+          <w:szCs w:val="24"/>
+        </w:rPr>
+        <w:t xml:space="preserve"> </w:t>
+      </w:r>
+      <w:proofErr w:type="gramStart"/>
+      <w:r>
+        <w:rPr>
+          <w:rFonts w:ascii="Times New Roman" w:hAnsi="Times New Roman" w:cs="Times New Roman"/>
+          <w:color w:val="262626" w:themeColor="accent6" w:themeShade="80"/>
+          <w:sz w:val="24"/>
+          <w:szCs w:val="24"/>
+        </w:rPr>
+        <w:t>into</w:t>
+      </w:r>
+      <w:proofErr w:type="gramEnd"/>
+      <w:r>
+        <w:rPr>
+          <w:rFonts w:ascii="Times New Roman" w:hAnsi="Times New Roman" w:cs="Times New Roman"/>
+          <w:color w:val="262626" w:themeColor="accent6" w:themeShade="80"/>
+          <w:sz w:val="24"/>
+          <w:szCs w:val="24"/>
+        </w:rPr>
+        <w:t xml:space="preserve"> two subtypes:</w:t>
       </w:r>
     </w:p>
     <w:p>
@@ -5697,6 +5946,8 @@
           <w:szCs w:val="24"/>
         </w:rPr>
       </w:pPr>
+      <w:proofErr w:type="spellStart"/>
+      <w:proofErr w:type="gramStart"/>
       <w:r>
         <w:rPr>
           <w:rFonts w:ascii="Times New Roman" w:hAnsi="Times New Roman" w:cs="Times New Roman"/>
@@ -5706,6 +5957,8 @@
         </w:rPr>
         <w:t>GeneralPractitioner</w:t>
       </w:r>
+      <w:proofErr w:type="spellEnd"/>
+      <w:proofErr w:type="gramEnd"/>
     </w:p>
     <w:p>
       <w:pPr>
@@ -5934,6 +6187,7 @@
                 <w:color w:val="auto"/>
               </w:rPr>
             </w:pPr>
+            <w:proofErr w:type="spellStart"/>
             <w:r>
               <w:rPr>
                 <w:rFonts w:ascii="Times New Roman" w:hAnsi="Times New Roman" w:cs="Times New Roman"/>
@@ -5941,7 +6195,17 @@
                 <w:bCs/>
                 <w:color w:val="auto"/>
               </w:rPr>
-              <w:t>PatientID (PK)</w:t>
+              <w:t>PatientID</w:t>
+            </w:r>
+            <w:proofErr w:type="spellEnd"/>
+            <w:r>
+              <w:rPr>
+                <w:rFonts w:ascii="Times New Roman" w:hAnsi="Times New Roman" w:cs="Times New Roman"/>
+                <w:b/>
+                <w:bCs/>
+                <w:color w:val="auto"/>
+              </w:rPr>
+              <w:t xml:space="preserve"> (PK)</w:t>
             </w:r>
             <w:r>
               <w:rPr>
@@ -5998,6 +6262,7 @@
                 <w:color w:val="auto"/>
               </w:rPr>
             </w:pPr>
+            <w:proofErr w:type="spellStart"/>
             <w:r>
               <w:rPr>
                 <w:rFonts w:ascii="Times New Roman" w:hAnsi="Times New Roman" w:cs="Times New Roman"/>
@@ -6005,15 +6270,34 @@
                 <w:bCs/>
                 <w:color w:val="auto"/>
               </w:rPr>
-              <w:t>DepartmentID (PK)</w:t>
+              <w:t>DepartmentID</w:t>
+            </w:r>
+            <w:proofErr w:type="spellEnd"/>
+            <w:r>
+              <w:rPr>
+                <w:rFonts w:ascii="Times New Roman" w:hAnsi="Times New Roman" w:cs="Times New Roman"/>
+                <w:b/>
+                <w:bCs/>
+                <w:color w:val="auto"/>
+              </w:rPr>
+              <w:t xml:space="preserve"> (PK)</w:t>
             </w:r>
             <w:r>
               <w:rPr>
                 <w:rFonts w:ascii="Times New Roman" w:hAnsi="Times New Roman" w:cs="Times New Roman"/>
                 <w:color w:val="auto"/>
               </w:rPr>
-              <w:t>, DepartmentName</w:t>
+              <w:t xml:space="preserve">, </w:t>
             </w:r>
+            <w:proofErr w:type="spellStart"/>
+            <w:r>
+              <w:rPr>
+                <w:rFonts w:ascii="Times New Roman" w:hAnsi="Times New Roman" w:cs="Times New Roman"/>
+                <w:color w:val="auto"/>
+              </w:rPr>
+              <w:t>DepartmentName</w:t>
+            </w:r>
+            <w:proofErr w:type="spellEnd"/>
           </w:p>
         </w:tc>
       </w:tr>
@@ -6062,6 +6346,7 @@
                 <w:color w:val="auto"/>
               </w:rPr>
             </w:pPr>
+            <w:proofErr w:type="spellStart"/>
             <w:r>
               <w:rPr>
                 <w:rFonts w:ascii="Times New Roman" w:hAnsi="Times New Roman" w:cs="Times New Roman"/>
@@ -6069,7 +6354,17 @@
                 <w:bCs/>
                 <w:color w:val="auto"/>
               </w:rPr>
-              <w:t>DoctorID (PK)</w:t>
+              <w:t>DoctorID</w:t>
+            </w:r>
+            <w:proofErr w:type="spellEnd"/>
+            <w:r>
+              <w:rPr>
+                <w:rFonts w:ascii="Times New Roman" w:hAnsi="Times New Roman" w:cs="Times New Roman"/>
+                <w:b/>
+                <w:bCs/>
+                <w:color w:val="auto"/>
+              </w:rPr>
+              <w:t xml:space="preserve"> (PK)</w:t>
             </w:r>
             <w:r>
               <w:rPr>
@@ -6078,6 +6373,7 @@
               </w:rPr>
               <w:t xml:space="preserve">, FirstName, LastName, Phone, </w:t>
             </w:r>
+            <w:proofErr w:type="spellStart"/>
             <w:r>
               <w:rPr>
                 <w:rFonts w:ascii="Times New Roman" w:hAnsi="Times New Roman" w:cs="Times New Roman"/>
@@ -6085,7 +6381,17 @@
                 <w:bCs/>
                 <w:color w:val="auto"/>
               </w:rPr>
-              <w:t>DepartmentID (FK)</w:t>
+              <w:t>DepartmentID</w:t>
+            </w:r>
+            <w:proofErr w:type="spellEnd"/>
+            <w:r>
+              <w:rPr>
+                <w:rFonts w:ascii="Times New Roman" w:hAnsi="Times New Roman" w:cs="Times New Roman"/>
+                <w:b/>
+                <w:bCs/>
+                <w:color w:val="auto"/>
+              </w:rPr>
+              <w:t xml:space="preserve"> (FK)</w:t>
             </w:r>
           </w:p>
         </w:tc>
@@ -6109,6 +6415,7 @@
                 <w:color w:val="auto"/>
               </w:rPr>
             </w:pPr>
+            <w:proofErr w:type="spellStart"/>
             <w:r>
               <w:rPr>
                 <w:rFonts w:ascii="Times New Roman" w:hAnsi="Times New Roman" w:cs="Times New Roman"/>
@@ -6116,6 +6423,7 @@
               </w:rPr>
               <w:t>GeneralPractitioner</w:t>
             </w:r>
+            <w:proofErr w:type="spellEnd"/>
           </w:p>
         </w:tc>
         <w:tc>
@@ -6137,6 +6445,7 @@
                 <w:color w:val="auto"/>
               </w:rPr>
             </w:pPr>
+            <w:proofErr w:type="spellStart"/>
             <w:r>
               <w:rPr>
                 <w:rFonts w:ascii="Times New Roman" w:hAnsi="Times New Roman" w:cs="Times New Roman"/>
@@ -6144,7 +6453,17 @@
                 <w:bCs/>
                 <w:color w:val="auto"/>
               </w:rPr>
-              <w:t>DoctorID (PK, FK)</w:t>
+              <w:t>DoctorID</w:t>
+            </w:r>
+            <w:proofErr w:type="spellEnd"/>
+            <w:r>
+              <w:rPr>
+                <w:rFonts w:ascii="Times New Roman" w:hAnsi="Times New Roman" w:cs="Times New Roman"/>
+                <w:b/>
+                <w:bCs/>
+                <w:color w:val="auto"/>
+              </w:rPr>
+              <w:t xml:space="preserve"> (PK, FK)</w:t>
             </w:r>
           </w:p>
         </w:tc>
@@ -6194,6 +6513,7 @@
                 <w:color w:val="auto"/>
               </w:rPr>
             </w:pPr>
+            <w:proofErr w:type="spellStart"/>
             <w:r>
               <w:rPr>
                 <w:rFonts w:ascii="Times New Roman" w:hAnsi="Times New Roman" w:cs="Times New Roman"/>
@@ -6201,7 +6521,17 @@
                 <w:bCs/>
                 <w:color w:val="auto"/>
               </w:rPr>
-              <w:t>DoctorID (PK, FK)</w:t>
+              <w:t>DoctorID</w:t>
+            </w:r>
+            <w:proofErr w:type="spellEnd"/>
+            <w:r>
+              <w:rPr>
+                <w:rFonts w:ascii="Times New Roman" w:hAnsi="Times New Roman" w:cs="Times New Roman"/>
+                <w:b/>
+                <w:bCs/>
+                <w:color w:val="auto"/>
+              </w:rPr>
+              <w:t xml:space="preserve"> (PK, FK)</w:t>
             </w:r>
             <w:r>
               <w:rPr>
@@ -6258,6 +6588,7 @@
                 <w:color w:val="auto"/>
               </w:rPr>
             </w:pPr>
+            <w:proofErr w:type="spellStart"/>
             <w:r>
               <w:rPr>
                 <w:rFonts w:ascii="Times New Roman" w:hAnsi="Times New Roman" w:cs="Times New Roman"/>
@@ -6265,15 +6596,9 @@
                 <w:bCs/>
                 <w:color w:val="auto"/>
               </w:rPr>
-              <w:t>AppointmentID (PK)</w:t>
+              <w:t>AppointmentID</w:t>
             </w:r>
-            <w:r>
-              <w:rPr>
-                <w:rFonts w:ascii="Times New Roman" w:hAnsi="Times New Roman" w:cs="Times New Roman"/>
-                <w:color w:val="auto"/>
-              </w:rPr>
-              <w:t xml:space="preserve">, AppointmentDate, Status, </w:t>
-            </w:r>
+            <w:proofErr w:type="spellEnd"/>
             <w:r>
               <w:rPr>
                 <w:rFonts w:ascii="Times New Roman" w:hAnsi="Times New Roman" w:cs="Times New Roman"/>
@@ -6281,7 +6606,7 @@
                 <w:bCs/>
                 <w:color w:val="auto"/>
               </w:rPr>
-              <w:t>PatientID (FK)</w:t>
+              <w:t xml:space="preserve"> (PK)</w:t>
             </w:r>
             <w:r>
               <w:rPr>
@@ -6290,6 +6615,23 @@
               </w:rPr>
               <w:t xml:space="preserve">, </w:t>
             </w:r>
+            <w:proofErr w:type="spellStart"/>
+            <w:r>
+              <w:rPr>
+                <w:rFonts w:ascii="Times New Roman" w:hAnsi="Times New Roman" w:cs="Times New Roman"/>
+                <w:color w:val="auto"/>
+              </w:rPr>
+              <w:t>AppointmentDate</w:t>
+            </w:r>
+            <w:proofErr w:type="spellEnd"/>
+            <w:r>
+              <w:rPr>
+                <w:rFonts w:ascii="Times New Roman" w:hAnsi="Times New Roman" w:cs="Times New Roman"/>
+                <w:color w:val="auto"/>
+              </w:rPr>
+              <w:t xml:space="preserve">, Status, </w:t>
+            </w:r>
+            <w:proofErr w:type="spellStart"/>
             <w:r>
               <w:rPr>
                 <w:rFonts w:ascii="Times New Roman" w:hAnsi="Times New Roman" w:cs="Times New Roman"/>
@@ -6297,7 +6639,44 @@
                 <w:bCs/>
                 <w:color w:val="auto"/>
               </w:rPr>
-              <w:t>DoctorID (FK)</w:t>
+              <w:t>PatientID</w:t>
+            </w:r>
+            <w:proofErr w:type="spellEnd"/>
+            <w:r>
+              <w:rPr>
+                <w:rFonts w:ascii="Times New Roman" w:hAnsi="Times New Roman" w:cs="Times New Roman"/>
+                <w:b/>
+                <w:bCs/>
+                <w:color w:val="auto"/>
+              </w:rPr>
+              <w:t xml:space="preserve"> (FK)</w:t>
+            </w:r>
+            <w:r>
+              <w:rPr>
+                <w:rFonts w:ascii="Times New Roman" w:hAnsi="Times New Roman" w:cs="Times New Roman"/>
+                <w:color w:val="auto"/>
+              </w:rPr>
+              <w:t xml:space="preserve">, </w:t>
+            </w:r>
+            <w:proofErr w:type="spellStart"/>
+            <w:r>
+              <w:rPr>
+                <w:rFonts w:ascii="Times New Roman" w:hAnsi="Times New Roman" w:cs="Times New Roman"/>
+                <w:b/>
+                <w:bCs/>
+                <w:color w:val="auto"/>
+              </w:rPr>
+              <w:t>DoctorID</w:t>
+            </w:r>
+            <w:proofErr w:type="spellEnd"/>
+            <w:r>
+              <w:rPr>
+                <w:rFonts w:ascii="Times New Roman" w:hAnsi="Times New Roman" w:cs="Times New Roman"/>
+                <w:b/>
+                <w:bCs/>
+                <w:color w:val="auto"/>
+              </w:rPr>
+              <w:t xml:space="preserve"> (FK)</w:t>
             </w:r>
           </w:p>
         </w:tc>
@@ -6347,6 +6726,7 @@
                 <w:color w:val="auto"/>
               </w:rPr>
             </w:pPr>
+            <w:proofErr w:type="spellStart"/>
             <w:r>
               <w:rPr>
                 <w:rFonts w:ascii="Times New Roman" w:hAnsi="Times New Roman" w:cs="Times New Roman"/>
@@ -6354,7 +6734,17 @@
                 <w:bCs/>
                 <w:color w:val="auto"/>
               </w:rPr>
-              <w:t>TreatmentID (PK)</w:t>
+              <w:t>TreatmentID</w:t>
+            </w:r>
+            <w:proofErr w:type="spellEnd"/>
+            <w:r>
+              <w:rPr>
+                <w:rFonts w:ascii="Times New Roman" w:hAnsi="Times New Roman" w:cs="Times New Roman"/>
+                <w:b/>
+                <w:bCs/>
+                <w:color w:val="auto"/>
+              </w:rPr>
+              <w:t xml:space="preserve"> (PK)</w:t>
             </w:r>
             <w:r>
               <w:rPr>
@@ -6363,6 +6753,7 @@
               </w:rPr>
               <w:t xml:space="preserve">, Diagnosis, </w:t>
             </w:r>
+            <w:proofErr w:type="spellStart"/>
             <w:r>
               <w:rPr>
                 <w:rFonts w:ascii="Times New Roman" w:hAnsi="Times New Roman" w:cs="Times New Roman"/>
@@ -6370,7 +6761,17 @@
                 <w:bCs/>
                 <w:color w:val="auto"/>
               </w:rPr>
-              <w:t>AppointmentID (FK)</w:t>
+              <w:t>AppointmentID</w:t>
+            </w:r>
+            <w:proofErr w:type="spellEnd"/>
+            <w:r>
+              <w:rPr>
+                <w:rFonts w:ascii="Times New Roman" w:hAnsi="Times New Roman" w:cs="Times New Roman"/>
+                <w:b/>
+                <w:bCs/>
+                <w:color w:val="auto"/>
+              </w:rPr>
+              <w:t xml:space="preserve"> (FK)</w:t>
             </w:r>
           </w:p>
         </w:tc>
@@ -6420,6 +6821,7 @@
                 <w:color w:val="auto"/>
               </w:rPr>
             </w:pPr>
+            <w:proofErr w:type="spellStart"/>
             <w:r>
               <w:rPr>
                 <w:rFonts w:ascii="Times New Roman" w:hAnsi="Times New Roman" w:cs="Times New Roman"/>
@@ -6427,15 +6829,9 @@
                 <w:bCs/>
                 <w:color w:val="auto"/>
               </w:rPr>
-              <w:t>PaymentID (PK)</w:t>
+              <w:t>PaymentID</w:t>
             </w:r>
-            <w:r>
-              <w:rPr>
-                <w:rFonts w:ascii="Times New Roman" w:hAnsi="Times New Roman" w:cs="Times New Roman"/>
-                <w:color w:val="auto"/>
-              </w:rPr>
-              <w:t xml:space="preserve">, Amount, PaymentMethod, </w:t>
-            </w:r>
+            <w:proofErr w:type="spellEnd"/>
             <w:r>
               <w:rPr>
                 <w:rFonts w:ascii="Times New Roman" w:hAnsi="Times New Roman" w:cs="Times New Roman"/>
@@ -6443,7 +6839,50 @@
                 <w:bCs/>
                 <w:color w:val="auto"/>
               </w:rPr>
-              <w:t>AppointmentID (FK</w:t>
+              <w:t xml:space="preserve"> (PK)</w:t>
+            </w:r>
+            <w:r>
+              <w:rPr>
+                <w:rFonts w:ascii="Times New Roman" w:hAnsi="Times New Roman" w:cs="Times New Roman"/>
+                <w:color w:val="auto"/>
+              </w:rPr>
+              <w:t xml:space="preserve">, Amount, </w:t>
+            </w:r>
+            <w:proofErr w:type="spellStart"/>
+            <w:r>
+              <w:rPr>
+                <w:rFonts w:ascii="Times New Roman" w:hAnsi="Times New Roman" w:cs="Times New Roman"/>
+                <w:color w:val="auto"/>
+              </w:rPr>
+              <w:t>PaymentMethod</w:t>
+            </w:r>
+            <w:proofErr w:type="spellEnd"/>
+            <w:r>
+              <w:rPr>
+                <w:rFonts w:ascii="Times New Roman" w:hAnsi="Times New Roman" w:cs="Times New Roman"/>
+                <w:color w:val="auto"/>
+              </w:rPr>
+              <w:t xml:space="preserve">, </w:t>
+            </w:r>
+            <w:proofErr w:type="spellStart"/>
+            <w:r>
+              <w:rPr>
+                <w:rFonts w:ascii="Times New Roman" w:hAnsi="Times New Roman" w:cs="Times New Roman"/>
+                <w:b/>
+                <w:bCs/>
+                <w:color w:val="auto"/>
+              </w:rPr>
+              <w:t>AppointmentID</w:t>
+            </w:r>
+            <w:proofErr w:type="spellEnd"/>
+            <w:r>
+              <w:rPr>
+                <w:rFonts w:ascii="Times New Roman" w:hAnsi="Times New Roman" w:cs="Times New Roman"/>
+                <w:b/>
+                <w:bCs/>
+                <w:color w:val="auto"/>
+              </w:rPr>
+              <w:t xml:space="preserve"> (FK</w:t>
             </w:r>
             <w:r>
               <w:rPr>
@@ -7771,7 +8210,27 @@
           <w:sz w:val="24"/>
           <w:szCs w:val="24"/>
         </w:rPr>
-        <w:t xml:space="preserve">(DepartmentID </w:t>
+        <w:t>(</w:t>
+      </w:r>
+      <w:proofErr w:type="spellStart"/>
+      <w:r>
+        <w:rPr>
+          <w:rFonts w:ascii="Times New Roman" w:hAnsi="Times New Roman" w:cs="Times New Roman"/>
+          <w:color w:val="auto"/>
+          <w:sz w:val="24"/>
+          <w:szCs w:val="24"/>
+        </w:rPr>
+        <w:t>DepartmentID</w:t>
+      </w:r>
+      <w:proofErr w:type="spellEnd"/>
+      <w:r>
+        <w:rPr>
+          <w:rFonts w:ascii="Times New Roman" w:hAnsi="Times New Roman" w:cs="Times New Roman"/>
+          <w:color w:val="auto"/>
+          <w:sz w:val="24"/>
+          <w:szCs w:val="24"/>
+        </w:rPr>
+        <w:t xml:space="preserve"> </w:t>
       </w:r>
       <w:r>
         <w:rPr>
@@ -7791,7 +8250,27 @@
           <w:sz w:val="24"/>
           <w:szCs w:val="24"/>
         </w:rPr>
-        <w:t>, DepartmentName)</w:t>
+        <w:t xml:space="preserve">, </w:t>
+      </w:r>
+      <w:proofErr w:type="spellStart"/>
+      <w:r>
+        <w:rPr>
+          <w:rFonts w:ascii="Times New Roman" w:hAnsi="Times New Roman" w:cs="Times New Roman"/>
+          <w:color w:val="auto"/>
+          <w:sz w:val="24"/>
+          <w:szCs w:val="24"/>
+        </w:rPr>
+        <w:t>DepartmentName</w:t>
+      </w:r>
+      <w:proofErr w:type="spellEnd"/>
+      <w:r>
+        <w:rPr>
+          <w:rFonts w:ascii="Times New Roman" w:hAnsi="Times New Roman" w:cs="Times New Roman"/>
+          <w:color w:val="auto"/>
+          <w:sz w:val="24"/>
+          <w:szCs w:val="24"/>
+        </w:rPr>
+        <w:t>)</w:t>
       </w:r>
     </w:p>
     <w:p>
@@ -7842,7 +8321,27 @@
           <w:sz w:val="24"/>
           <w:szCs w:val="24"/>
         </w:rPr>
-        <w:t xml:space="preserve"> (PatientID </w:t>
+        <w:t xml:space="preserve"> (</w:t>
+      </w:r>
+      <w:proofErr w:type="spellStart"/>
+      <w:r>
+        <w:rPr>
+          <w:rFonts w:ascii="Times New Roman" w:hAnsi="Times New Roman" w:cs="Times New Roman"/>
+          <w:color w:val="auto"/>
+          <w:sz w:val="24"/>
+          <w:szCs w:val="24"/>
+        </w:rPr>
+        <w:t>PatientID</w:t>
+      </w:r>
+      <w:proofErr w:type="spellEnd"/>
+      <w:r>
+        <w:rPr>
+          <w:rFonts w:ascii="Times New Roman" w:hAnsi="Times New Roman" w:cs="Times New Roman"/>
+          <w:color w:val="auto"/>
+          <w:sz w:val="24"/>
+          <w:szCs w:val="24"/>
+        </w:rPr>
+        <w:t xml:space="preserve"> </w:t>
       </w:r>
       <w:r>
         <w:rPr>
@@ -7913,7 +8412,27 @@
           <w:sz w:val="24"/>
           <w:szCs w:val="24"/>
         </w:rPr>
-        <w:t xml:space="preserve"> (DoctorID </w:t>
+        <w:t xml:space="preserve"> (</w:t>
+      </w:r>
+      <w:proofErr w:type="spellStart"/>
+      <w:r>
+        <w:rPr>
+          <w:rFonts w:ascii="Times New Roman" w:hAnsi="Times New Roman" w:cs="Times New Roman"/>
+          <w:color w:val="auto"/>
+          <w:sz w:val="24"/>
+          <w:szCs w:val="24"/>
+        </w:rPr>
+        <w:t>DoctorID</w:t>
+      </w:r>
+      <w:proofErr w:type="spellEnd"/>
+      <w:r>
+        <w:rPr>
+          <w:rFonts w:ascii="Times New Roman" w:hAnsi="Times New Roman" w:cs="Times New Roman"/>
+          <w:color w:val="auto"/>
+          <w:sz w:val="24"/>
+          <w:szCs w:val="24"/>
+        </w:rPr>
+        <w:t xml:space="preserve"> </w:t>
       </w:r>
       <w:r>
         <w:rPr>
@@ -7933,7 +8452,27 @@
           <w:sz w:val="24"/>
           <w:szCs w:val="24"/>
         </w:rPr>
-        <w:t xml:space="preserve">, FirstName, LastName, Phone, DepartmentID </w:t>
+        <w:t xml:space="preserve">, FirstName, LastName, Phone, </w:t>
+      </w:r>
+      <w:proofErr w:type="spellStart"/>
+      <w:r>
+        <w:rPr>
+          <w:rFonts w:ascii="Times New Roman" w:hAnsi="Times New Roman" w:cs="Times New Roman"/>
+          <w:color w:val="auto"/>
+          <w:sz w:val="24"/>
+          <w:szCs w:val="24"/>
+        </w:rPr>
+        <w:t>DepartmentID</w:t>
+      </w:r>
+      <w:proofErr w:type="spellEnd"/>
+      <w:r>
+        <w:rPr>
+          <w:rFonts w:ascii="Times New Roman" w:hAnsi="Times New Roman" w:cs="Times New Roman"/>
+          <w:color w:val="auto"/>
+          <w:sz w:val="24"/>
+          <w:szCs w:val="24"/>
+        </w:rPr>
+        <w:t xml:space="preserve"> </w:t>
       </w:r>
       <w:r>
         <w:rPr>
@@ -7986,6 +8525,7 @@
           <w:szCs w:val="24"/>
         </w:rPr>
       </w:pPr>
+      <w:proofErr w:type="spellStart"/>
       <w:r>
         <w:rPr>
           <w:rFonts w:ascii="Times New Roman" w:hAnsi="Times New Roman" w:cs="Times New Roman"/>
@@ -7997,14 +8537,35 @@
         </w:rPr>
         <w:t>GeneralPractitioner</w:t>
       </w:r>
-      <w:r>
-        <w:rPr>
-          <w:rFonts w:ascii="Times New Roman" w:hAnsi="Times New Roman" w:cs="Times New Roman"/>
-          <w:color w:val="auto"/>
-          <w:sz w:val="24"/>
-          <w:szCs w:val="24"/>
-        </w:rPr>
-        <w:t xml:space="preserve"> (DoctorID </w:t>
+      <w:proofErr w:type="spellEnd"/>
+      <w:r>
+        <w:rPr>
+          <w:rFonts w:ascii="Times New Roman" w:hAnsi="Times New Roman" w:cs="Times New Roman"/>
+          <w:color w:val="auto"/>
+          <w:sz w:val="24"/>
+          <w:szCs w:val="24"/>
+        </w:rPr>
+        <w:t xml:space="preserve"> (</w:t>
+      </w:r>
+      <w:proofErr w:type="spellStart"/>
+      <w:r>
+        <w:rPr>
+          <w:rFonts w:ascii="Times New Roman" w:hAnsi="Times New Roman" w:cs="Times New Roman"/>
+          <w:color w:val="auto"/>
+          <w:sz w:val="24"/>
+          <w:szCs w:val="24"/>
+        </w:rPr>
+        <w:t>DoctorID</w:t>
+      </w:r>
+      <w:proofErr w:type="spellEnd"/>
+      <w:r>
+        <w:rPr>
+          <w:rFonts w:ascii="Times New Roman" w:hAnsi="Times New Roman" w:cs="Times New Roman"/>
+          <w:color w:val="auto"/>
+          <w:sz w:val="24"/>
+          <w:szCs w:val="24"/>
+        </w:rPr>
+        <w:t xml:space="preserve"> </w:t>
       </w:r>
       <w:r>
         <w:rPr>
@@ -8075,7 +8636,27 @@
           <w:sz w:val="24"/>
           <w:szCs w:val="24"/>
         </w:rPr>
-        <w:t xml:space="preserve"> (DoctorID </w:t>
+        <w:t xml:space="preserve"> (</w:t>
+      </w:r>
+      <w:proofErr w:type="spellStart"/>
+      <w:r>
+        <w:rPr>
+          <w:rFonts w:ascii="Times New Roman" w:hAnsi="Times New Roman" w:cs="Times New Roman"/>
+          <w:color w:val="auto"/>
+          <w:sz w:val="24"/>
+          <w:szCs w:val="24"/>
+        </w:rPr>
+        <w:t>DoctorID</w:t>
+      </w:r>
+      <w:proofErr w:type="spellEnd"/>
+      <w:r>
+        <w:rPr>
+          <w:rFonts w:ascii="Times New Roman" w:hAnsi="Times New Roman" w:cs="Times New Roman"/>
+          <w:color w:val="auto"/>
+          <w:sz w:val="24"/>
+          <w:szCs w:val="24"/>
+        </w:rPr>
+        <w:t xml:space="preserve"> </w:t>
       </w:r>
       <w:r>
         <w:rPr>
@@ -8146,7 +8727,27 @@
           <w:sz w:val="24"/>
           <w:szCs w:val="24"/>
         </w:rPr>
-        <w:t xml:space="preserve"> (AppointmentID </w:t>
+        <w:t xml:space="preserve"> (</w:t>
+      </w:r>
+      <w:proofErr w:type="spellStart"/>
+      <w:r>
+        <w:rPr>
+          <w:rFonts w:ascii="Times New Roman" w:hAnsi="Times New Roman" w:cs="Times New Roman"/>
+          <w:color w:val="auto"/>
+          <w:sz w:val="24"/>
+          <w:szCs w:val="24"/>
+        </w:rPr>
+        <w:t>AppointmentID</w:t>
+      </w:r>
+      <w:proofErr w:type="spellEnd"/>
+      <w:r>
+        <w:rPr>
+          <w:rFonts w:ascii="Times New Roman" w:hAnsi="Times New Roman" w:cs="Times New Roman"/>
+          <w:color w:val="auto"/>
+          <w:sz w:val="24"/>
+          <w:szCs w:val="24"/>
+        </w:rPr>
+        <w:t xml:space="preserve"> </w:t>
       </w:r>
       <w:r>
         <w:rPr>
@@ -8166,7 +8767,47 @@
           <w:sz w:val="24"/>
           <w:szCs w:val="24"/>
         </w:rPr>
-        <w:t xml:space="preserve">, AppointmentDate, Status, PatientID </w:t>
+        <w:t xml:space="preserve">, </w:t>
+      </w:r>
+      <w:proofErr w:type="spellStart"/>
+      <w:r>
+        <w:rPr>
+          <w:rFonts w:ascii="Times New Roman" w:hAnsi="Times New Roman" w:cs="Times New Roman"/>
+          <w:color w:val="auto"/>
+          <w:sz w:val="24"/>
+          <w:szCs w:val="24"/>
+        </w:rPr>
+        <w:t>AppointmentDate</w:t>
+      </w:r>
+      <w:proofErr w:type="spellEnd"/>
+      <w:r>
+        <w:rPr>
+          <w:rFonts w:ascii="Times New Roman" w:hAnsi="Times New Roman" w:cs="Times New Roman"/>
+          <w:color w:val="auto"/>
+          <w:sz w:val="24"/>
+          <w:szCs w:val="24"/>
+        </w:rPr>
+        <w:t xml:space="preserve">, Status, </w:t>
+      </w:r>
+      <w:proofErr w:type="spellStart"/>
+      <w:r>
+        <w:rPr>
+          <w:rFonts w:ascii="Times New Roman" w:hAnsi="Times New Roman" w:cs="Times New Roman"/>
+          <w:color w:val="auto"/>
+          <w:sz w:val="24"/>
+          <w:szCs w:val="24"/>
+        </w:rPr>
+        <w:t>PatientID</w:t>
+      </w:r>
+      <w:proofErr w:type="spellEnd"/>
+      <w:r>
+        <w:rPr>
+          <w:rFonts w:ascii="Times New Roman" w:hAnsi="Times New Roman" w:cs="Times New Roman"/>
+          <w:color w:val="auto"/>
+          <w:sz w:val="24"/>
+          <w:szCs w:val="24"/>
+        </w:rPr>
+        <w:t xml:space="preserve"> </w:t>
       </w:r>
       <w:r>
         <w:rPr>
@@ -8186,7 +8827,27 @@
           <w:sz w:val="24"/>
           <w:szCs w:val="24"/>
         </w:rPr>
-        <w:t>, DoctorID FK)</w:t>
+        <w:t xml:space="preserve">, </w:t>
+      </w:r>
+      <w:proofErr w:type="spellStart"/>
+      <w:r>
+        <w:rPr>
+          <w:rFonts w:ascii="Times New Roman" w:hAnsi="Times New Roman" w:cs="Times New Roman"/>
+          <w:color w:val="auto"/>
+          <w:sz w:val="24"/>
+          <w:szCs w:val="24"/>
+        </w:rPr>
+        <w:t>DoctorID</w:t>
+      </w:r>
+      <w:proofErr w:type="spellEnd"/>
+      <w:r>
+        <w:rPr>
+          <w:rFonts w:ascii="Times New Roman" w:hAnsi="Times New Roman" w:cs="Times New Roman"/>
+          <w:color w:val="auto"/>
+          <w:sz w:val="24"/>
+          <w:szCs w:val="24"/>
+        </w:rPr>
+        <w:t xml:space="preserve"> FK)</w:t>
       </w:r>
     </w:p>
     <w:p>
@@ -8237,7 +8898,27 @@
           <w:sz w:val="24"/>
           <w:szCs w:val="24"/>
         </w:rPr>
-        <w:t xml:space="preserve"> (TreatmentID </w:t>
+        <w:t xml:space="preserve"> (</w:t>
+      </w:r>
+      <w:proofErr w:type="spellStart"/>
+      <w:r>
+        <w:rPr>
+          <w:rFonts w:ascii="Times New Roman" w:hAnsi="Times New Roman" w:cs="Times New Roman"/>
+          <w:color w:val="auto"/>
+          <w:sz w:val="24"/>
+          <w:szCs w:val="24"/>
+        </w:rPr>
+        <w:t>TreatmentID</w:t>
+      </w:r>
+      <w:proofErr w:type="spellEnd"/>
+      <w:r>
+        <w:rPr>
+          <w:rFonts w:ascii="Times New Roman" w:hAnsi="Times New Roman" w:cs="Times New Roman"/>
+          <w:color w:val="auto"/>
+          <w:sz w:val="24"/>
+          <w:szCs w:val="24"/>
+        </w:rPr>
+        <w:t xml:space="preserve"> </w:t>
       </w:r>
       <w:r>
         <w:rPr>
@@ -8257,7 +8938,27 @@
           <w:sz w:val="24"/>
           <w:szCs w:val="24"/>
         </w:rPr>
-        <w:t xml:space="preserve">, Diagnosis, AppointmentID </w:t>
+        <w:t xml:space="preserve">, Diagnosis, </w:t>
+      </w:r>
+      <w:proofErr w:type="spellStart"/>
+      <w:r>
+        <w:rPr>
+          <w:rFonts w:ascii="Times New Roman" w:hAnsi="Times New Roman" w:cs="Times New Roman"/>
+          <w:color w:val="auto"/>
+          <w:sz w:val="24"/>
+          <w:szCs w:val="24"/>
+        </w:rPr>
+        <w:t>AppointmentID</w:t>
+      </w:r>
+      <w:proofErr w:type="spellEnd"/>
+      <w:r>
+        <w:rPr>
+          <w:rFonts w:ascii="Times New Roman" w:hAnsi="Times New Roman" w:cs="Times New Roman"/>
+          <w:color w:val="auto"/>
+          <w:sz w:val="24"/>
+          <w:szCs w:val="24"/>
+        </w:rPr>
+        <w:t xml:space="preserve"> </w:t>
       </w:r>
       <w:r>
         <w:rPr>
@@ -8328,7 +9029,27 @@
           <w:sz w:val="24"/>
           <w:szCs w:val="24"/>
         </w:rPr>
-        <w:t xml:space="preserve"> (PaymentID </w:t>
+        <w:t xml:space="preserve"> (</w:t>
+      </w:r>
+      <w:proofErr w:type="spellStart"/>
+      <w:r>
+        <w:rPr>
+          <w:rFonts w:ascii="Times New Roman" w:hAnsi="Times New Roman" w:cs="Times New Roman"/>
+          <w:color w:val="auto"/>
+          <w:sz w:val="24"/>
+          <w:szCs w:val="24"/>
+        </w:rPr>
+        <w:t>PaymentID</w:t>
+      </w:r>
+      <w:proofErr w:type="spellEnd"/>
+      <w:r>
+        <w:rPr>
+          <w:rFonts w:ascii="Times New Roman" w:hAnsi="Times New Roman" w:cs="Times New Roman"/>
+          <w:color w:val="auto"/>
+          <w:sz w:val="24"/>
+          <w:szCs w:val="24"/>
+        </w:rPr>
+        <w:t xml:space="preserve"> </w:t>
       </w:r>
       <w:r>
         <w:rPr>
@@ -8348,7 +9069,47 @@
           <w:sz w:val="24"/>
           <w:szCs w:val="24"/>
         </w:rPr>
-        <w:t xml:space="preserve">, Amount, PaymentMethod, AppointmentID </w:t>
+        <w:t xml:space="preserve">, Amount, </w:t>
+      </w:r>
+      <w:proofErr w:type="spellStart"/>
+      <w:r>
+        <w:rPr>
+          <w:rFonts w:ascii="Times New Roman" w:hAnsi="Times New Roman" w:cs="Times New Roman"/>
+          <w:color w:val="auto"/>
+          <w:sz w:val="24"/>
+          <w:szCs w:val="24"/>
+        </w:rPr>
+        <w:t>PaymentMethod</w:t>
+      </w:r>
+      <w:proofErr w:type="spellEnd"/>
+      <w:r>
+        <w:rPr>
+          <w:rFonts w:ascii="Times New Roman" w:hAnsi="Times New Roman" w:cs="Times New Roman"/>
+          <w:color w:val="auto"/>
+          <w:sz w:val="24"/>
+          <w:szCs w:val="24"/>
+        </w:rPr>
+        <w:t xml:space="preserve">, </w:t>
+      </w:r>
+      <w:proofErr w:type="spellStart"/>
+      <w:r>
+        <w:rPr>
+          <w:rFonts w:ascii="Times New Roman" w:hAnsi="Times New Roman" w:cs="Times New Roman"/>
+          <w:color w:val="auto"/>
+          <w:sz w:val="24"/>
+          <w:szCs w:val="24"/>
+        </w:rPr>
+        <w:t>AppointmentID</w:t>
+      </w:r>
+      <w:proofErr w:type="spellEnd"/>
+      <w:r>
+        <w:rPr>
+          <w:rFonts w:ascii="Times New Roman" w:hAnsi="Times New Roman" w:cs="Times New Roman"/>
+          <w:color w:val="auto"/>
+          <w:sz w:val="24"/>
+          <w:szCs w:val="24"/>
+        </w:rPr>
+        <w:t xml:space="preserve"> </w:t>
       </w:r>
       <w:r>
         <w:rPr>
@@ -8481,6 +9242,408 @@
         </w:rPr>
         <w:t>Insert at least 5 records into each main table.</w:t>
       </w:r>
+    </w:p>
+    <w:p>
+      <w:pPr>
+        <w:pStyle w:val="ListBullet"/>
+        <w:numPr>
+          <w:ilvl w:val="0"/>
+          <w:numId w:val="0"/>
+        </w:numPr>
+        <w:ind w:left="576"/>
+        <w:rPr>
+          <w:rFonts w:ascii="Times New Roman" w:hAnsi="Times New Roman" w:cs="Times New Roman"/>
+          <w:color w:val="auto"/>
+          <w:sz w:val="24"/>
+          <w:szCs w:val="24"/>
+        </w:rPr>
+      </w:pPr>
+    </w:p>
+    <w:p>
+      <w:pPr>
+        <w:pStyle w:val="ListBullet"/>
+        <w:numPr>
+          <w:ilvl w:val="0"/>
+          <w:numId w:val="0"/>
+        </w:numPr>
+        <w:ind w:left="576"/>
+        <w:rPr>
+          <w:rFonts w:ascii="Times New Roman" w:hAnsi="Times New Roman" w:cs="Times New Roman"/>
+          <w:color w:val="auto"/>
+          <w:sz w:val="24"/>
+          <w:szCs w:val="24"/>
+        </w:rPr>
+      </w:pPr>
+    </w:p>
+    <w:p>
+      <w:pPr>
+        <w:pStyle w:val="ListBullet"/>
+        <w:numPr>
+          <w:ilvl w:val="0"/>
+          <w:numId w:val="41"/>
+        </w:numPr>
+        <w:rPr>
+          <w:rFonts w:ascii="Times New Roman" w:hAnsi="Times New Roman" w:cs="Times New Roman"/>
+          <w:b/>
+          <w:bCs/>
+          <w:color w:val="auto"/>
+          <w:sz w:val="28"/>
+          <w:szCs w:val="28"/>
+        </w:rPr>
+      </w:pPr>
+      <w:r>
+        <w:rPr>
+          <w:rFonts w:ascii="Times New Roman" w:hAnsi="Times New Roman" w:cs="Times New Roman"/>
+          <w:b/>
+          <w:bCs/>
+          <w:color w:val="auto"/>
+          <w:sz w:val="28"/>
+          <w:szCs w:val="28"/>
+        </w:rPr>
+        <w:t>Create the Tables with Appropriate Data Types and Constraints</w:t>
+      </w:r>
+      <w:r>
+        <w:rPr>
+          <w:rFonts w:ascii="Times New Roman" w:hAnsi="Times New Roman" w:cs="Times New Roman"/>
+          <w:b/>
+          <w:bCs/>
+          <w:color w:val="auto"/>
+          <w:sz w:val="28"/>
+          <w:szCs w:val="28"/>
+        </w:rPr>
+        <w:t>:</w:t>
+      </w:r>
+    </w:p>
+    <w:p>
+      <w:pPr>
+        <w:pStyle w:val="ListBullet"/>
+        <w:numPr>
+          <w:ilvl w:val="0"/>
+          <w:numId w:val="0"/>
+        </w:numPr>
+        <w:rPr>
+          <w:rFonts w:ascii="Times New Roman" w:hAnsi="Times New Roman" w:cs="Times New Roman"/>
+          <w:color w:val="auto"/>
+          <w:sz w:val="24"/>
+          <w:szCs w:val="24"/>
+        </w:rPr>
+      </w:pPr>
+    </w:p>
+    <w:p>
+      <w:pPr>
+        <w:pStyle w:val="ListBullet"/>
+        <w:numPr>
+          <w:ilvl w:val="0"/>
+          <w:numId w:val="0"/>
+        </w:numPr>
+        <w:rPr>
+          <w:rFonts w:ascii="Times New Roman" w:hAnsi="Times New Roman" w:cs="Times New Roman"/>
+          <w:color w:val="auto"/>
+          <w:sz w:val="24"/>
+          <w:szCs w:val="24"/>
+        </w:rPr>
+      </w:pPr>
+    </w:p>
+    <w:p>
+      <w:pPr>
+        <w:pStyle w:val="ListBullet"/>
+        <w:numPr>
+          <w:ilvl w:val="0"/>
+          <w:numId w:val="0"/>
+        </w:numPr>
+        <w:rPr>
+          <w:rFonts w:ascii="Times New Roman" w:hAnsi="Times New Roman" w:cs="Times New Roman"/>
+          <w:color w:val="auto"/>
+          <w:sz w:val="24"/>
+          <w:szCs w:val="24"/>
+        </w:rPr>
+      </w:pPr>
+    </w:p>
+    <w:p>
+      <w:pPr>
+        <w:pStyle w:val="ListBullet"/>
+        <w:numPr>
+          <w:ilvl w:val="0"/>
+          <w:numId w:val="42"/>
+        </w:numPr>
+        <w:rPr>
+          <w:rFonts w:ascii="Times New Roman" w:hAnsi="Times New Roman" w:cs="Times New Roman"/>
+          <w:color w:val="auto"/>
+          <w:sz w:val="28"/>
+          <w:szCs w:val="28"/>
+        </w:rPr>
+      </w:pPr>
+      <w:r>
+        <w:rPr>
+          <w:rFonts w:ascii="Times New Roman" w:hAnsi="Times New Roman" w:cs="Times New Roman"/>
+          <w:color w:val="auto"/>
+          <w:sz w:val="28"/>
+          <w:szCs w:val="28"/>
+        </w:rPr>
+        <w:t>Create Database</w:t>
+      </w:r>
+    </w:p>
+    <w:p>
+      <w:pPr>
+        <w:pStyle w:val="ListBullet"/>
+        <w:numPr>
+          <w:ilvl w:val="0"/>
+          <w:numId w:val="0"/>
+        </w:numPr>
+        <w:ind w:left="288"/>
+        <w:rPr>
+          <w:rFonts w:ascii="Times New Roman" w:hAnsi="Times New Roman" w:cs="Times New Roman"/>
+          <w:color w:val="auto"/>
+          <w:sz w:val="24"/>
+          <w:szCs w:val="24"/>
+        </w:rPr>
+      </w:pPr>
+    </w:p>
+    <w:p>
+      <w:pPr>
+        <w:pStyle w:val="ListBullet"/>
+        <w:numPr>
+          <w:ilvl w:val="0"/>
+          <w:numId w:val="0"/>
+        </w:numPr>
+        <w:ind w:left="288"/>
+        <w:rPr>
+          <w:rFonts w:ascii="Times New Roman" w:hAnsi="Times New Roman" w:cs="Times New Roman"/>
+          <w:color w:val="auto"/>
+          <w:sz w:val="24"/>
+          <w:szCs w:val="24"/>
+        </w:rPr>
+      </w:pPr>
+      <w:r>
+        <w:rPr>
+          <w:rFonts w:ascii="Times New Roman" w:hAnsi="Times New Roman" w:cs="Times New Roman"/>
+          <w:color w:val="auto"/>
+          <w:sz w:val="24"/>
+          <w:szCs w:val="24"/>
+        </w:rPr>
+        <w:t xml:space="preserve">CREATE DATABASE </w:t>
+      </w:r>
+      <w:proofErr w:type="spellStart"/>
+      <w:r>
+        <w:rPr>
+          <w:rFonts w:ascii="Times New Roman" w:hAnsi="Times New Roman" w:cs="Times New Roman"/>
+          <w:color w:val="auto"/>
+          <w:sz w:val="24"/>
+          <w:szCs w:val="24"/>
+        </w:rPr>
+        <w:t>SmartClinic</w:t>
+      </w:r>
+      <w:proofErr w:type="spellEnd"/>
+      <w:r>
+        <w:rPr>
+          <w:rFonts w:ascii="Times New Roman" w:hAnsi="Times New Roman" w:cs="Times New Roman"/>
+          <w:color w:val="auto"/>
+          <w:sz w:val="24"/>
+          <w:szCs w:val="24"/>
+        </w:rPr>
+        <w:t>;</w:t>
+      </w:r>
+    </w:p>
+    <w:p>
+      <w:pPr>
+        <w:pStyle w:val="ListBullet"/>
+        <w:numPr>
+          <w:ilvl w:val="0"/>
+          <w:numId w:val="0"/>
+        </w:numPr>
+        <w:ind w:left="288"/>
+        <w:rPr>
+          <w:rFonts w:ascii="Times New Roman" w:hAnsi="Times New Roman" w:cs="Times New Roman"/>
+          <w:color w:val="auto"/>
+          <w:sz w:val="24"/>
+          <w:szCs w:val="24"/>
+        </w:rPr>
+      </w:pPr>
+      <w:r>
+        <w:rPr>
+          <w:rFonts w:ascii="Times New Roman" w:hAnsi="Times New Roman" w:cs="Times New Roman"/>
+          <w:color w:val="auto"/>
+          <w:sz w:val="24"/>
+          <w:szCs w:val="24"/>
+        </w:rPr>
+        <w:t xml:space="preserve">USE </w:t>
+      </w:r>
+      <w:proofErr w:type="spellStart"/>
+      <w:r>
+        <w:rPr>
+          <w:rFonts w:ascii="Times New Roman" w:hAnsi="Times New Roman" w:cs="Times New Roman"/>
+          <w:color w:val="auto"/>
+          <w:sz w:val="24"/>
+          <w:szCs w:val="24"/>
+        </w:rPr>
+        <w:t>SmartClinic</w:t>
+      </w:r>
+      <w:proofErr w:type="spellEnd"/>
+      <w:r>
+        <w:rPr>
+          <w:rFonts w:ascii="Times New Roman" w:hAnsi="Times New Roman" w:cs="Times New Roman"/>
+          <w:color w:val="auto"/>
+          <w:sz w:val="24"/>
+          <w:szCs w:val="24"/>
+        </w:rPr>
+        <w:t>;</w:t>
+      </w:r>
+    </w:p>
+    <w:p>
+      <w:pPr>
+        <w:pStyle w:val="ListBullet"/>
+        <w:numPr>
+          <w:ilvl w:val="0"/>
+          <w:numId w:val="0"/>
+        </w:numPr>
+        <w:ind w:left="288"/>
+        <w:rPr>
+          <w:rFonts w:ascii="Times New Roman" w:hAnsi="Times New Roman" w:cs="Times New Roman"/>
+          <w:color w:val="auto"/>
+          <w:sz w:val="24"/>
+          <w:szCs w:val="24"/>
+        </w:rPr>
+      </w:pPr>
+    </w:p>
+    <w:p>
+      <w:pPr>
+        <w:pStyle w:val="ListBullet"/>
+        <w:numPr>
+          <w:ilvl w:val="0"/>
+          <w:numId w:val="0"/>
+        </w:numPr>
+        <w:ind w:left="288"/>
+        <w:rPr>
+          <w:rFonts w:ascii="Times New Roman" w:hAnsi="Times New Roman" w:cs="Times New Roman"/>
+          <w:color w:val="auto"/>
+          <w:sz w:val="24"/>
+          <w:szCs w:val="24"/>
+        </w:rPr>
+      </w:pPr>
+      <w:r>
+        <w:rPr>
+          <w:rFonts w:ascii="Times New Roman" w:hAnsi="Times New Roman" w:cs="Times New Roman"/>
+          <w:noProof/>
+          <w:color w:val="auto"/>
+          <w:sz w:val="24"/>
+          <w:szCs w:val="24"/>
+        </w:rPr>
+        <w:drawing>
+          <wp:inline distT="0" distB="0" distL="0" distR="0" wp14:anchorId="5098D348" wp14:editId="11EE5DE1">
+            <wp:extent cx="5349240" cy="1428750"/>
+            <wp:effectExtent l="0" t="0" r="3810" b="0"/>
+            <wp:docPr id="353026751" name="Picture 1"/>
+            <wp:cNvGraphicFramePr>
+              <a:graphicFrameLocks xmlns:a="http://schemas.openxmlformats.org/drawingml/2006/main" noChangeAspect="1"/>
+            </wp:cNvGraphicFramePr>
+            <a:graphic xmlns:a="http://schemas.openxmlformats.org/drawingml/2006/main">
+              <a:graphicData uri="http://schemas.openxmlformats.org/drawingml/2006/picture">
+                <pic:pic xmlns:pic="http://schemas.openxmlformats.org/drawingml/2006/picture">
+                  <pic:nvPicPr>
+                    <pic:cNvPr id="353026751" name=""/>
+                    <pic:cNvPicPr/>
+                  </pic:nvPicPr>
+                  <pic:blipFill>
+                    <a:blip r:embed="rId16"/>
+                    <a:stretch>
+                      <a:fillRect/>
+                    </a:stretch>
+                  </pic:blipFill>
+                  <pic:spPr>
+                    <a:xfrm>
+                      <a:off x="0" y="0"/>
+                      <a:ext cx="5349240" cy="1428750"/>
+                    </a:xfrm>
+                    <a:prstGeom prst="rect">
+                      <a:avLst/>
+                    </a:prstGeom>
+                  </pic:spPr>
+                </pic:pic>
+              </a:graphicData>
+            </a:graphic>
+          </wp:inline>
+        </w:drawing>
+      </w:r>
+    </w:p>
+    <w:p>
+      <w:pPr>
+        <w:pStyle w:val="ListBullet"/>
+        <w:numPr>
+          <w:ilvl w:val="0"/>
+          <w:numId w:val="0"/>
+        </w:numPr>
+        <w:ind w:left="288"/>
+        <w:rPr>
+          <w:rFonts w:ascii="Times New Roman" w:hAnsi="Times New Roman" w:cs="Times New Roman"/>
+          <w:color w:val="auto"/>
+          <w:sz w:val="24"/>
+          <w:szCs w:val="24"/>
+        </w:rPr>
+      </w:pPr>
+    </w:p>
+    <w:p>
+      <w:pPr>
+        <w:pStyle w:val="ListBullet"/>
+        <w:numPr>
+          <w:ilvl w:val="0"/>
+          <w:numId w:val="0"/>
+        </w:numPr>
+        <w:ind w:left="288"/>
+        <w:rPr>
+          <w:rFonts w:ascii="Times New Roman" w:hAnsi="Times New Roman" w:cs="Times New Roman"/>
+          <w:color w:val="auto"/>
+          <w:sz w:val="24"/>
+          <w:szCs w:val="24"/>
+        </w:rPr>
+      </w:pPr>
+    </w:p>
+    <w:p>
+      <w:pPr>
+        <w:pStyle w:val="ListBullet"/>
+        <w:numPr>
+          <w:ilvl w:val="0"/>
+          <w:numId w:val="0"/>
+        </w:numPr>
+        <w:ind w:left="288"/>
+        <w:rPr>
+          <w:rFonts w:ascii="Times New Roman" w:hAnsi="Times New Roman" w:cs="Times New Roman"/>
+          <w:color w:val="auto"/>
+          <w:sz w:val="24"/>
+          <w:szCs w:val="24"/>
+        </w:rPr>
+      </w:pPr>
+    </w:p>
+    <w:p>
+      <w:pPr>
+        <w:pStyle w:val="ListBullet"/>
+        <w:numPr>
+          <w:ilvl w:val="0"/>
+          <w:numId w:val="0"/>
+        </w:numPr>
+        <w:ind w:left="288"/>
+        <w:rPr>
+          <w:rFonts w:ascii="Times New Roman" w:hAnsi="Times New Roman" w:cs="Times New Roman"/>
+          <w:color w:val="auto"/>
+          <w:sz w:val="24"/>
+          <w:szCs w:val="24"/>
+        </w:rPr>
+      </w:pPr>
+    </w:p>
+    <w:p>
+      <w:pPr>
+        <w:pStyle w:val="ListBullet"/>
+        <w:numPr>
+          <w:ilvl w:val="0"/>
+          <w:numId w:val="0"/>
+        </w:numPr>
+        <w:ind w:left="288"/>
+        <w:rPr>
+          <w:rFonts w:ascii="Times New Roman" w:hAnsi="Times New Roman" w:cs="Times New Roman"/>
+          <w:color w:val="auto"/>
+          <w:sz w:val="24"/>
+          <w:szCs w:val="24"/>
+        </w:rPr>
+      </w:pPr>
     </w:p>
     <w:p>
       <w:pPr>
@@ -8955,7 +10118,29 @@
           <w:sz w:val="24"/>
           <w:szCs w:val="24"/>
         </w:rPr>
-        <w:t>SQL Script (.sql)</w:t>
+        <w:t>SQL Script (.</w:t>
+      </w:r>
+      <w:proofErr w:type="spellStart"/>
+      <w:r>
+        <w:rPr>
+          <w:rFonts w:ascii="Times New Roman" w:hAnsi="Times New Roman" w:cs="Times New Roman"/>
+          <w:b/>
+          <w:bCs/>
+          <w:sz w:val="24"/>
+          <w:szCs w:val="24"/>
+        </w:rPr>
+        <w:t>sql</w:t>
+      </w:r>
+      <w:proofErr w:type="spellEnd"/>
+      <w:r>
+        <w:rPr>
+          <w:rFonts w:ascii="Times New Roman" w:hAnsi="Times New Roman" w:cs="Times New Roman"/>
+          <w:b/>
+          <w:bCs/>
+          <w:sz w:val="24"/>
+          <w:szCs w:val="24"/>
+        </w:rPr>
+        <w:t>)</w:t>
       </w:r>
       <w:r>
         <w:rPr>
@@ -9125,7 +10310,25 @@
           <w:sz w:val="24"/>
           <w:szCs w:val="24"/>
         </w:rPr>
-        <w:t>Google Colab notebook (if applicable): [link]</w:t>
+        <w:t xml:space="preserve">Google </w:t>
+      </w:r>
+      <w:proofErr w:type="spellStart"/>
+      <w:r>
+        <w:rPr>
+          <w:rFonts w:ascii="Times New Roman" w:hAnsi="Times New Roman" w:cs="Times New Roman"/>
+          <w:sz w:val="24"/>
+          <w:szCs w:val="24"/>
+        </w:rPr>
+        <w:t>Colab</w:t>
+      </w:r>
+      <w:proofErr w:type="spellEnd"/>
+      <w:r>
+        <w:rPr>
+          <w:rFonts w:ascii="Times New Roman" w:hAnsi="Times New Roman" w:cs="Times New Roman"/>
+          <w:sz w:val="24"/>
+          <w:szCs w:val="24"/>
+        </w:rPr>
+        <w:t xml:space="preserve"> notebook (if applicable): [link]</w:t>
       </w:r>
     </w:p>
     <w:p>
@@ -9158,7 +10361,7 @@
       </w:pPr>
     </w:p>
     <w:sectPr>
-      <w:headerReference w:type="default" r:id="rId16"/>
+      <w:headerReference w:type="default" r:id="rId17"/>
       <w:pgSz w:w="12240" w:h="15840" w:code="1"/>
       <w:pgMar w:top="1080" w:right="720" w:bottom="1800" w:left="3096" w:header="1080" w:footer="720" w:gutter="0"/>
       <w:pgNumType w:start="1"/>
@@ -10080,7 +11283,7 @@
             <w:rPr>
               <w:noProof/>
             </w:rPr>
-            <w:instrText>Task 1 – Database Design (6 Marks)</w:instrText>
+            <w:instrText>Task 2 – Database Implementation (6 Marks)</w:instrText>
           </w:r>
           <w:r>
             <w:rPr>
@@ -10113,7 +11316,7 @@
             <w:rPr>
               <w:noProof/>
             </w:rPr>
-            <w:instrText>Task 1 – Database Design (6 Marks)</w:instrText>
+            <w:instrText>Task 2 – Database Implementation (6 Marks)</w:instrText>
           </w:r>
           <w:r>
             <w:rPr>
@@ -10131,7 +11334,7 @@
             <w:rPr>
               <w:noProof/>
             </w:rPr>
-            <w:t xml:space="preserve">Task 1 – Database Design (6 Marks) </w:t>
+            <w:t xml:space="preserve">Task 2 – Database Implementation (6 Marks) </w:t>
           </w:r>
           <w:r>
             <w:fldChar w:fldCharType="end"/>
@@ -10498,6 +11701,119 @@
     </w:lvl>
   </w:abstractNum>
   <w:abstractNum w:abstractNumId="4" w15:restartNumberingAfterBreak="0">
+    <w:nsid w:val="0F0F68A4"/>
+    <w:multiLevelType w:val="hybridMultilevel"/>
+    <w:tmpl w:val="741CC0D0"/>
+    <w:lvl w:ilvl="0" w:tplc="04090001">
+      <w:start w:val="1"/>
+      <w:numFmt w:val="bullet"/>
+      <w:lvlText w:val=""/>
+      <w:lvlJc w:val="left"/>
+      <w:pPr>
+        <w:ind w:left="720" w:hanging="360"/>
+      </w:pPr>
+      <w:rPr>
+        <w:rFonts w:ascii="Symbol" w:hAnsi="Symbol" w:hint="default"/>
+      </w:rPr>
+    </w:lvl>
+    <w:lvl w:ilvl="1" w:tplc="04090003" w:tentative="1">
+      <w:start w:val="1"/>
+      <w:numFmt w:val="bullet"/>
+      <w:lvlText w:val="o"/>
+      <w:lvlJc w:val="left"/>
+      <w:pPr>
+        <w:ind w:left="1440" w:hanging="360"/>
+      </w:pPr>
+      <w:rPr>
+        <w:rFonts w:ascii="Courier New" w:hAnsi="Courier New" w:cs="Courier New" w:hint="default"/>
+      </w:rPr>
+    </w:lvl>
+    <w:lvl w:ilvl="2" w:tplc="04090005" w:tentative="1">
+      <w:start w:val="1"/>
+      <w:numFmt w:val="bullet"/>
+      <w:lvlText w:val=""/>
+      <w:lvlJc w:val="left"/>
+      <w:pPr>
+        <w:ind w:left="2160" w:hanging="360"/>
+      </w:pPr>
+      <w:rPr>
+        <w:rFonts w:ascii="Wingdings" w:hAnsi="Wingdings" w:hint="default"/>
+      </w:rPr>
+    </w:lvl>
+    <w:lvl w:ilvl="3" w:tplc="04090001" w:tentative="1">
+      <w:start w:val="1"/>
+      <w:numFmt w:val="bullet"/>
+      <w:lvlText w:val=""/>
+      <w:lvlJc w:val="left"/>
+      <w:pPr>
+        <w:ind w:left="2880" w:hanging="360"/>
+      </w:pPr>
+      <w:rPr>
+        <w:rFonts w:ascii="Symbol" w:hAnsi="Symbol" w:hint="default"/>
+      </w:rPr>
+    </w:lvl>
+    <w:lvl w:ilvl="4" w:tplc="04090003" w:tentative="1">
+      <w:start w:val="1"/>
+      <w:numFmt w:val="bullet"/>
+      <w:lvlText w:val="o"/>
+      <w:lvlJc w:val="left"/>
+      <w:pPr>
+        <w:ind w:left="3600" w:hanging="360"/>
+      </w:pPr>
+      <w:rPr>
+        <w:rFonts w:ascii="Courier New" w:hAnsi="Courier New" w:cs="Courier New" w:hint="default"/>
+      </w:rPr>
+    </w:lvl>
+    <w:lvl w:ilvl="5" w:tplc="04090005" w:tentative="1">
+      <w:start w:val="1"/>
+      <w:numFmt w:val="bullet"/>
+      <w:lvlText w:val=""/>
+      <w:lvlJc w:val="left"/>
+      <w:pPr>
+        <w:ind w:left="4320" w:hanging="360"/>
+      </w:pPr>
+      <w:rPr>
+        <w:rFonts w:ascii="Wingdings" w:hAnsi="Wingdings" w:hint="default"/>
+      </w:rPr>
+    </w:lvl>
+    <w:lvl w:ilvl="6" w:tplc="04090001" w:tentative="1">
+      <w:start w:val="1"/>
+      <w:numFmt w:val="bullet"/>
+      <w:lvlText w:val=""/>
+      <w:lvlJc w:val="left"/>
+      <w:pPr>
+        <w:ind w:left="5040" w:hanging="360"/>
+      </w:pPr>
+      <w:rPr>
+        <w:rFonts w:ascii="Symbol" w:hAnsi="Symbol" w:hint="default"/>
+      </w:rPr>
+    </w:lvl>
+    <w:lvl w:ilvl="7" w:tplc="04090003" w:tentative="1">
+      <w:start w:val="1"/>
+      <w:numFmt w:val="bullet"/>
+      <w:lvlText w:val="o"/>
+      <w:lvlJc w:val="left"/>
+      <w:pPr>
+        <w:ind w:left="5760" w:hanging="360"/>
+      </w:pPr>
+      <w:rPr>
+        <w:rFonts w:ascii="Courier New" w:hAnsi="Courier New" w:cs="Courier New" w:hint="default"/>
+      </w:rPr>
+    </w:lvl>
+    <w:lvl w:ilvl="8" w:tplc="04090005" w:tentative="1">
+      <w:start w:val="1"/>
+      <w:numFmt w:val="bullet"/>
+      <w:lvlText w:val=""/>
+      <w:lvlJc w:val="left"/>
+      <w:pPr>
+        <w:ind w:left="6480" w:hanging="360"/>
+      </w:pPr>
+      <w:rPr>
+        <w:rFonts w:ascii="Wingdings" w:hAnsi="Wingdings" w:hint="default"/>
+      </w:rPr>
+    </w:lvl>
+  </w:abstractNum>
+  <w:abstractNum w:abstractNumId="5" w15:restartNumberingAfterBreak="0">
     <w:nsid w:val="1647511F"/>
     <w:multiLevelType w:val="hybridMultilevel"/>
     <w:tmpl w:val="644E780A"/>
@@ -10583,7 +11899,7 @@
       </w:pPr>
     </w:lvl>
   </w:abstractNum>
-  <w:abstractNum w:abstractNumId="5" w15:restartNumberingAfterBreak="0">
+  <w:abstractNum w:abstractNumId="6" w15:restartNumberingAfterBreak="0">
     <w:nsid w:val="1CAD4C51"/>
     <w:multiLevelType w:val="hybridMultilevel"/>
     <w:tmpl w:val="1360C652"/>
@@ -10672,7 +11988,120 @@
       </w:pPr>
     </w:lvl>
   </w:abstractNum>
-  <w:abstractNum w:abstractNumId="6" w15:restartNumberingAfterBreak="0">
+  <w:abstractNum w:abstractNumId="7" w15:restartNumberingAfterBreak="0">
+    <w:nsid w:val="1D515615"/>
+    <w:multiLevelType w:val="hybridMultilevel"/>
+    <w:tmpl w:val="65DE6676"/>
+    <w:lvl w:ilvl="0" w:tplc="04090009">
+      <w:start w:val="1"/>
+      <w:numFmt w:val="bullet"/>
+      <w:lvlText w:val=""/>
+      <w:lvlJc w:val="left"/>
+      <w:pPr>
+        <w:ind w:left="1008" w:hanging="360"/>
+      </w:pPr>
+      <w:rPr>
+        <w:rFonts w:ascii="Wingdings" w:hAnsi="Wingdings" w:hint="default"/>
+      </w:rPr>
+    </w:lvl>
+    <w:lvl w:ilvl="1" w:tplc="04090003" w:tentative="1">
+      <w:start w:val="1"/>
+      <w:numFmt w:val="bullet"/>
+      <w:lvlText w:val="o"/>
+      <w:lvlJc w:val="left"/>
+      <w:pPr>
+        <w:ind w:left="1728" w:hanging="360"/>
+      </w:pPr>
+      <w:rPr>
+        <w:rFonts w:ascii="Courier New" w:hAnsi="Courier New" w:cs="Courier New" w:hint="default"/>
+      </w:rPr>
+    </w:lvl>
+    <w:lvl w:ilvl="2" w:tplc="04090005" w:tentative="1">
+      <w:start w:val="1"/>
+      <w:numFmt w:val="bullet"/>
+      <w:lvlText w:val=""/>
+      <w:lvlJc w:val="left"/>
+      <w:pPr>
+        <w:ind w:left="2448" w:hanging="360"/>
+      </w:pPr>
+      <w:rPr>
+        <w:rFonts w:ascii="Wingdings" w:hAnsi="Wingdings" w:hint="default"/>
+      </w:rPr>
+    </w:lvl>
+    <w:lvl w:ilvl="3" w:tplc="04090001" w:tentative="1">
+      <w:start w:val="1"/>
+      <w:numFmt w:val="bullet"/>
+      <w:lvlText w:val=""/>
+      <w:lvlJc w:val="left"/>
+      <w:pPr>
+        <w:ind w:left="3168" w:hanging="360"/>
+      </w:pPr>
+      <w:rPr>
+        <w:rFonts w:ascii="Symbol" w:hAnsi="Symbol" w:hint="default"/>
+      </w:rPr>
+    </w:lvl>
+    <w:lvl w:ilvl="4" w:tplc="04090003" w:tentative="1">
+      <w:start w:val="1"/>
+      <w:numFmt w:val="bullet"/>
+      <w:lvlText w:val="o"/>
+      <w:lvlJc w:val="left"/>
+      <w:pPr>
+        <w:ind w:left="3888" w:hanging="360"/>
+      </w:pPr>
+      <w:rPr>
+        <w:rFonts w:ascii="Courier New" w:hAnsi="Courier New" w:cs="Courier New" w:hint="default"/>
+      </w:rPr>
+    </w:lvl>
+    <w:lvl w:ilvl="5" w:tplc="04090005" w:tentative="1">
+      <w:start w:val="1"/>
+      <w:numFmt w:val="bullet"/>
+      <w:lvlText w:val=""/>
+      <w:lvlJc w:val="left"/>
+      <w:pPr>
+        <w:ind w:left="4608" w:hanging="360"/>
+      </w:pPr>
+      <w:rPr>
+        <w:rFonts w:ascii="Wingdings" w:hAnsi="Wingdings" w:hint="default"/>
+      </w:rPr>
+    </w:lvl>
+    <w:lvl w:ilvl="6" w:tplc="04090001" w:tentative="1">
+      <w:start w:val="1"/>
+      <w:numFmt w:val="bullet"/>
+      <w:lvlText w:val=""/>
+      <w:lvlJc w:val="left"/>
+      <w:pPr>
+        <w:ind w:left="5328" w:hanging="360"/>
+      </w:pPr>
+      <w:rPr>
+        <w:rFonts w:ascii="Symbol" w:hAnsi="Symbol" w:hint="default"/>
+      </w:rPr>
+    </w:lvl>
+    <w:lvl w:ilvl="7" w:tplc="04090003" w:tentative="1">
+      <w:start w:val="1"/>
+      <w:numFmt w:val="bullet"/>
+      <w:lvlText w:val="o"/>
+      <w:lvlJc w:val="left"/>
+      <w:pPr>
+        <w:ind w:left="6048" w:hanging="360"/>
+      </w:pPr>
+      <w:rPr>
+        <w:rFonts w:ascii="Courier New" w:hAnsi="Courier New" w:cs="Courier New" w:hint="default"/>
+      </w:rPr>
+    </w:lvl>
+    <w:lvl w:ilvl="8" w:tplc="04090005" w:tentative="1">
+      <w:start w:val="1"/>
+      <w:numFmt w:val="bullet"/>
+      <w:lvlText w:val=""/>
+      <w:lvlJc w:val="left"/>
+      <w:pPr>
+        <w:ind w:left="6768" w:hanging="360"/>
+      </w:pPr>
+      <w:rPr>
+        <w:rFonts w:ascii="Wingdings" w:hAnsi="Wingdings" w:hint="default"/>
+      </w:rPr>
+    </w:lvl>
+  </w:abstractNum>
+  <w:abstractNum w:abstractNumId="8" w15:restartNumberingAfterBreak="0">
     <w:nsid w:val="1EA73568"/>
     <w:multiLevelType w:val="hybridMultilevel"/>
     <w:tmpl w:val="26BC85C4"/>
@@ -10785,7 +12214,7 @@
       </w:rPr>
     </w:lvl>
   </w:abstractNum>
-  <w:abstractNum w:abstractNumId="7" w15:restartNumberingAfterBreak="0">
+  <w:abstractNum w:abstractNumId="9" w15:restartNumberingAfterBreak="0">
     <w:nsid w:val="24796DF9"/>
     <w:multiLevelType w:val="hybridMultilevel"/>
     <w:tmpl w:val="864EC002"/>
@@ -10910,7 +12339,7 @@
       </w:rPr>
     </w:lvl>
   </w:abstractNum>
-  <w:abstractNum w:abstractNumId="8" w15:restartNumberingAfterBreak="0">
+  <w:abstractNum w:abstractNumId="10" w15:restartNumberingAfterBreak="0">
     <w:nsid w:val="25710957"/>
     <w:multiLevelType w:val="hybridMultilevel"/>
     <w:tmpl w:val="433CB9C4"/>
@@ -11020,7 +12449,7 @@
       </w:rPr>
     </w:lvl>
   </w:abstractNum>
-  <w:abstractNum w:abstractNumId="9" w15:restartNumberingAfterBreak="0">
+  <w:abstractNum w:abstractNumId="11" w15:restartNumberingAfterBreak="0">
     <w:nsid w:val="28044A04"/>
     <w:multiLevelType w:val="hybridMultilevel"/>
     <w:tmpl w:val="2BA819A2"/>
@@ -11106,7 +12535,7 @@
       </w:pPr>
     </w:lvl>
   </w:abstractNum>
-  <w:abstractNum w:abstractNumId="10" w15:restartNumberingAfterBreak="0">
+  <w:abstractNum w:abstractNumId="12" w15:restartNumberingAfterBreak="0">
     <w:nsid w:val="2B9958AB"/>
     <w:multiLevelType w:val="multilevel"/>
     <w:tmpl w:val="2ADCA5B4"/>
@@ -11255,7 +12684,7 @@
       </w:rPr>
     </w:lvl>
   </w:abstractNum>
-  <w:abstractNum w:abstractNumId="11" w15:restartNumberingAfterBreak="0">
+  <w:abstractNum w:abstractNumId="13" w15:restartNumberingAfterBreak="0">
     <w:nsid w:val="349B5FCE"/>
     <w:multiLevelType w:val="hybridMultilevel"/>
     <w:tmpl w:val="2A80DB70"/>
@@ -11368,7 +12797,7 @@
       </w:rPr>
     </w:lvl>
   </w:abstractNum>
-  <w:abstractNum w:abstractNumId="12" w15:restartNumberingAfterBreak="0">
+  <w:abstractNum w:abstractNumId="14" w15:restartNumberingAfterBreak="0">
     <w:nsid w:val="367F6A45"/>
     <w:multiLevelType w:val="multilevel"/>
     <w:tmpl w:val="0436C7FE"/>
@@ -11491,7 +12920,7 @@
       </w:rPr>
     </w:lvl>
   </w:abstractNum>
-  <w:abstractNum w:abstractNumId="13" w15:restartNumberingAfterBreak="0">
+  <w:abstractNum w:abstractNumId="15" w15:restartNumberingAfterBreak="0">
     <w:nsid w:val="39DB541F"/>
     <w:multiLevelType w:val="multilevel"/>
     <w:tmpl w:val="CAACC624"/>
@@ -11604,7 +13033,7 @@
       </w:pPr>
     </w:lvl>
   </w:abstractNum>
-  <w:abstractNum w:abstractNumId="14" w15:restartNumberingAfterBreak="0">
+  <w:abstractNum w:abstractNumId="16" w15:restartNumberingAfterBreak="0">
     <w:nsid w:val="3D423FD0"/>
     <w:multiLevelType w:val="multilevel"/>
     <w:tmpl w:val="B502C206"/>
@@ -11754,7 +13183,7 @@
       </w:rPr>
     </w:lvl>
   </w:abstractNum>
-  <w:abstractNum w:abstractNumId="15" w15:restartNumberingAfterBreak="0">
+  <w:abstractNum w:abstractNumId="17" w15:restartNumberingAfterBreak="0">
     <w:nsid w:val="3FDD4EA2"/>
     <w:multiLevelType w:val="multilevel"/>
     <w:tmpl w:val="D1AC6F7E"/>
@@ -11903,7 +13332,7 @@
       </w:rPr>
     </w:lvl>
   </w:abstractNum>
-  <w:abstractNum w:abstractNumId="16" w15:restartNumberingAfterBreak="0">
+  <w:abstractNum w:abstractNumId="18" w15:restartNumberingAfterBreak="0">
     <w:nsid w:val="44EE13B5"/>
     <w:multiLevelType w:val="hybridMultilevel"/>
     <w:tmpl w:val="038E9900"/>
@@ -12019,7 +13448,7 @@
       </w:rPr>
     </w:lvl>
   </w:abstractNum>
-  <w:abstractNum w:abstractNumId="17" w15:restartNumberingAfterBreak="0">
+  <w:abstractNum w:abstractNumId="19" w15:restartNumberingAfterBreak="0">
     <w:nsid w:val="55DA4CC9"/>
     <w:multiLevelType w:val="hybridMultilevel"/>
     <w:tmpl w:val="068EDCB2"/>
@@ -12132,7 +13561,7 @@
       </w:rPr>
     </w:lvl>
   </w:abstractNum>
-  <w:abstractNum w:abstractNumId="18" w15:restartNumberingAfterBreak="0">
+  <w:abstractNum w:abstractNumId="20" w15:restartNumberingAfterBreak="0">
     <w:nsid w:val="55F84D01"/>
     <w:multiLevelType w:val="multilevel"/>
     <w:tmpl w:val="A9E06390"/>
@@ -12245,7 +13674,7 @@
       </w:pPr>
     </w:lvl>
   </w:abstractNum>
-  <w:abstractNum w:abstractNumId="19" w15:restartNumberingAfterBreak="0">
+  <w:abstractNum w:abstractNumId="21" w15:restartNumberingAfterBreak="0">
     <w:nsid w:val="56B224C9"/>
     <w:multiLevelType w:val="multilevel"/>
     <w:tmpl w:val="BE58CE00"/>
@@ -12394,7 +13823,7 @@
       </w:rPr>
     </w:lvl>
   </w:abstractNum>
-  <w:abstractNum w:abstractNumId="20" w15:restartNumberingAfterBreak="0">
+  <w:abstractNum w:abstractNumId="22" w15:restartNumberingAfterBreak="0">
     <w:nsid w:val="57397E8F"/>
     <w:multiLevelType w:val="multilevel"/>
     <w:tmpl w:val="93162086"/>
@@ -12507,7 +13936,7 @@
       </w:pPr>
     </w:lvl>
   </w:abstractNum>
-  <w:abstractNum w:abstractNumId="21" w15:restartNumberingAfterBreak="0">
+  <w:abstractNum w:abstractNumId="23" w15:restartNumberingAfterBreak="0">
     <w:nsid w:val="5FFB796A"/>
     <w:multiLevelType w:val="multilevel"/>
     <w:tmpl w:val="6388B4E8"/>
@@ -12620,7 +14049,7 @@
       </w:pPr>
     </w:lvl>
   </w:abstractNum>
-  <w:abstractNum w:abstractNumId="22" w15:restartNumberingAfterBreak="0">
+  <w:abstractNum w:abstractNumId="24" w15:restartNumberingAfterBreak="0">
     <w:nsid w:val="64B955EC"/>
     <w:multiLevelType w:val="hybridMultilevel"/>
     <w:tmpl w:val="950A10D8"/>
@@ -12733,7 +14162,7 @@
       </w:rPr>
     </w:lvl>
   </w:abstractNum>
-  <w:abstractNum w:abstractNumId="23" w15:restartNumberingAfterBreak="0">
+  <w:abstractNum w:abstractNumId="25" w15:restartNumberingAfterBreak="0">
     <w:nsid w:val="667677D6"/>
     <w:multiLevelType w:val="hybridMultilevel"/>
     <w:tmpl w:val="D01692D8"/>
@@ -12822,7 +14251,7 @@
       </w:pPr>
     </w:lvl>
   </w:abstractNum>
-  <w:abstractNum w:abstractNumId="24" w15:restartNumberingAfterBreak="0">
+  <w:abstractNum w:abstractNumId="26" w15:restartNumberingAfterBreak="0">
     <w:nsid w:val="688927E2"/>
     <w:multiLevelType w:val="hybridMultilevel"/>
     <w:tmpl w:val="64F8DB74"/>
@@ -12912,7 +14341,7 @@
       </w:pPr>
     </w:lvl>
   </w:abstractNum>
-  <w:abstractNum w:abstractNumId="25" w15:restartNumberingAfterBreak="0">
+  <w:abstractNum w:abstractNumId="27" w15:restartNumberingAfterBreak="0">
     <w:nsid w:val="6FD51D52"/>
     <w:multiLevelType w:val="hybridMultilevel"/>
     <w:tmpl w:val="36305470"/>
@@ -12998,7 +14427,7 @@
       </w:pPr>
     </w:lvl>
   </w:abstractNum>
-  <w:abstractNum w:abstractNumId="26" w15:restartNumberingAfterBreak="0">
+  <w:abstractNum w:abstractNumId="28" w15:restartNumberingAfterBreak="0">
     <w:nsid w:val="704E3E7F"/>
     <w:multiLevelType w:val="hybridMultilevel"/>
     <w:tmpl w:val="E34C7444"/>
@@ -13087,7 +14516,7 @@
       </w:pPr>
     </w:lvl>
   </w:abstractNum>
-  <w:abstractNum w:abstractNumId="27" w15:restartNumberingAfterBreak="0">
+  <w:abstractNum w:abstractNumId="29" w15:restartNumberingAfterBreak="0">
     <w:nsid w:val="72C71C39"/>
     <w:multiLevelType w:val="hybridMultilevel"/>
     <w:tmpl w:val="C960FD86"/>
@@ -13212,7 +14641,7 @@
       </w:rPr>
     </w:lvl>
   </w:abstractNum>
-  <w:abstractNum w:abstractNumId="28" w15:restartNumberingAfterBreak="0">
+  <w:abstractNum w:abstractNumId="30" w15:restartNumberingAfterBreak="0">
     <w:nsid w:val="746C2223"/>
     <w:multiLevelType w:val="multilevel"/>
     <w:tmpl w:val="94A85F9C"/>
@@ -13361,7 +14790,7 @@
       </w:rPr>
     </w:lvl>
   </w:abstractNum>
-  <w:abstractNum w:abstractNumId="29" w15:restartNumberingAfterBreak="0">
+  <w:abstractNum w:abstractNumId="31" w15:restartNumberingAfterBreak="0">
     <w:nsid w:val="7823322B"/>
     <w:multiLevelType w:val="hybridMultilevel"/>
     <w:tmpl w:val="A0D81BB6"/>
@@ -13484,7 +14913,7 @@
     </w:lvlOverride>
   </w:num>
   <w:num w:numId="3" w16cid:durableId="1517813912">
-    <w:abstractNumId w:val="12"/>
+    <w:abstractNumId w:val="14"/>
   </w:num>
   <w:num w:numId="4" w16cid:durableId="798186098">
     <w:abstractNumId w:val="0"/>
@@ -13499,19 +14928,19 @@
     </w:lvlOverride>
   </w:num>
   <w:num w:numId="6" w16cid:durableId="2115830839">
-    <w:abstractNumId w:val="16"/>
+    <w:abstractNumId w:val="18"/>
   </w:num>
   <w:num w:numId="7" w16cid:durableId="471407680">
-    <w:abstractNumId w:val="7"/>
+    <w:abstractNumId w:val="9"/>
   </w:num>
   <w:num w:numId="8" w16cid:durableId="893388596">
-    <w:abstractNumId w:val="26"/>
+    <w:abstractNumId w:val="28"/>
   </w:num>
   <w:num w:numId="9" w16cid:durableId="1862353387">
     <w:abstractNumId w:val="1"/>
   </w:num>
   <w:num w:numId="10" w16cid:durableId="583271442">
-    <w:abstractNumId w:val="27"/>
+    <w:abstractNumId w:val="29"/>
     <w:lvlOverride w:ilvl="0">
       <w:startOverride w:val="1"/>
     </w:lvlOverride>
@@ -13527,7 +14956,7 @@
     <w:lvlOverride w:ilvl="8"/>
   </w:num>
   <w:num w:numId="11" w16cid:durableId="783697976">
-    <w:abstractNumId w:val="16"/>
+    <w:abstractNumId w:val="18"/>
     <w:lvlOverride w:ilvl="0"/>
     <w:lvlOverride w:ilvl="1">
       <w:startOverride w:val="1"/>
@@ -13541,67 +14970,67 @@
     <w:lvlOverride w:ilvl="8"/>
   </w:num>
   <w:num w:numId="12" w16cid:durableId="1306158738">
-    <w:abstractNumId w:val="24"/>
+    <w:abstractNumId w:val="26"/>
   </w:num>
   <w:num w:numId="13" w16cid:durableId="1700812942">
-    <w:abstractNumId w:val="23"/>
+    <w:abstractNumId w:val="25"/>
   </w:num>
   <w:num w:numId="14" w16cid:durableId="1608192642">
-    <w:abstractNumId w:val="29"/>
+    <w:abstractNumId w:val="31"/>
   </w:num>
   <w:num w:numId="15" w16cid:durableId="114762884">
-    <w:abstractNumId w:val="8"/>
+    <w:abstractNumId w:val="10"/>
   </w:num>
   <w:num w:numId="16" w16cid:durableId="1418284132">
-    <w:abstractNumId w:val="25"/>
+    <w:abstractNumId w:val="27"/>
   </w:num>
   <w:num w:numId="17" w16cid:durableId="70466096">
     <w:abstractNumId w:val="3"/>
   </w:num>
   <w:num w:numId="18" w16cid:durableId="1220020782">
-    <w:abstractNumId w:val="4"/>
+    <w:abstractNumId w:val="5"/>
   </w:num>
   <w:num w:numId="19" w16cid:durableId="1183976187">
-    <w:abstractNumId w:val="9"/>
+    <w:abstractNumId w:val="11"/>
   </w:num>
   <w:num w:numId="20" w16cid:durableId="1865823307">
-    <w:abstractNumId w:val="21"/>
+    <w:abstractNumId w:val="23"/>
   </w:num>
   <w:num w:numId="21" w16cid:durableId="2074043917">
-    <w:abstractNumId w:val="20"/>
+    <w:abstractNumId w:val="22"/>
   </w:num>
   <w:num w:numId="22" w16cid:durableId="1745374221">
-    <w:abstractNumId w:val="13"/>
+    <w:abstractNumId w:val="15"/>
   </w:num>
   <w:num w:numId="23" w16cid:durableId="112403004">
-    <w:abstractNumId w:val="18"/>
+    <w:abstractNumId w:val="20"/>
   </w:num>
   <w:num w:numId="24" w16cid:durableId="207844976">
     <w:abstractNumId w:val="0"/>
   </w:num>
   <w:num w:numId="25" w16cid:durableId="856623875">
-    <w:abstractNumId w:val="5"/>
+    <w:abstractNumId w:val="6"/>
   </w:num>
   <w:num w:numId="26" w16cid:durableId="1307121231">
-    <w:abstractNumId w:val="10"/>
+    <w:abstractNumId w:val="12"/>
   </w:num>
   <w:num w:numId="27" w16cid:durableId="2097969410">
     <w:abstractNumId w:val="2"/>
   </w:num>
   <w:num w:numId="28" w16cid:durableId="802769626">
+    <w:abstractNumId w:val="19"/>
+  </w:num>
+  <w:num w:numId="29" w16cid:durableId="1773864708">
+    <w:abstractNumId w:val="13"/>
+  </w:num>
+  <w:num w:numId="30" w16cid:durableId="1190679152">
+    <w:abstractNumId w:val="24"/>
+  </w:num>
+  <w:num w:numId="31" w16cid:durableId="1496416065">
     <w:abstractNumId w:val="17"/>
   </w:num>
-  <w:num w:numId="29" w16cid:durableId="1773864708">
-    <w:abstractNumId w:val="11"/>
-  </w:num>
-  <w:num w:numId="30" w16cid:durableId="1190679152">
-    <w:abstractNumId w:val="22"/>
-  </w:num>
-  <w:num w:numId="31" w16cid:durableId="1496416065">
-    <w:abstractNumId w:val="15"/>
-  </w:num>
   <w:num w:numId="32" w16cid:durableId="1261530086">
-    <w:abstractNumId w:val="14"/>
+    <w:abstractNumId w:val="16"/>
   </w:num>
   <w:num w:numId="33" w16cid:durableId="1046442775">
     <w:abstractNumId w:val="0"/>
@@ -13616,16 +15045,22 @@
     <w:abstractNumId w:val="0"/>
   </w:num>
   <w:num w:numId="37" w16cid:durableId="1148745932">
-    <w:abstractNumId w:val="19"/>
+    <w:abstractNumId w:val="21"/>
   </w:num>
   <w:num w:numId="38" w16cid:durableId="533734186">
-    <w:abstractNumId w:val="28"/>
+    <w:abstractNumId w:val="30"/>
   </w:num>
   <w:num w:numId="39" w16cid:durableId="1486244316">
     <w:abstractNumId w:val="0"/>
   </w:num>
   <w:num w:numId="40" w16cid:durableId="1275210848">
-    <w:abstractNumId w:val="6"/>
+    <w:abstractNumId w:val="8"/>
+  </w:num>
+  <w:num w:numId="41" w16cid:durableId="1407070004">
+    <w:abstractNumId w:val="7"/>
+  </w:num>
+  <w:num w:numId="42" w16cid:durableId="1222522062">
+    <w:abstractNumId w:val="4"/>
   </w:num>
 </w:numbering>
 </file>
@@ -15035,13 +16470,6 @@
     <w:pitch w:val="variable"/>
     <w:sig w:usb0="00000000" w:usb1="10000000" w:usb2="00000000" w:usb3="00000000" w:csb0="80000000" w:csb1="00000000"/>
   </w:font>
-  <w:font w:name="Arial">
-    <w:panose1 w:val="020B0604020202020204"/>
-    <w:charset w:val="00"/>
-    <w:family w:val="swiss"/>
-    <w:pitch w:val="variable"/>
-    <w:sig w:usb0="E0002EFF" w:usb1="C000785B" w:usb2="00000009" w:usb3="00000000" w:csb0="000001FF" w:csb1="00000000"/>
-  </w:font>
   <w:font w:name="Courier New">
     <w:panose1 w:val="02070309020205020404"/>
     <w:charset w:val="00"/>
@@ -15055,6 +16483,13 @@
     <w:family w:val="auto"/>
     <w:pitch w:val="variable"/>
     <w:sig w:usb0="00000000" w:usb1="10000000" w:usb2="00000000" w:usb3="00000000" w:csb0="80000000" w:csb1="00000000"/>
+  </w:font>
+  <w:font w:name="Arial">
+    <w:panose1 w:val="020B0604020202020204"/>
+    <w:charset w:val="00"/>
+    <w:family w:val="swiss"/>
+    <w:pitch w:val="variable"/>
+    <w:sig w:usb0="E0002EFF" w:usb1="C000785B" w:usb2="00000009" w:usb3="00000000" w:csb0="000001FF" w:csb1="00000000"/>
   </w:font>
   <w:font w:name="MS PGothic">
     <w:panose1 w:val="020B0600070205080204"/>
@@ -15159,6 +16594,7 @@
     <w:rsid w:val="00366F01"/>
     <w:rsid w:val="003B34DF"/>
     <w:rsid w:val="003E5691"/>
+    <w:rsid w:val="0040517B"/>
     <w:rsid w:val="00415C82"/>
     <w:rsid w:val="004A7EE6"/>
     <w:rsid w:val="004E5C8C"/>
@@ -16045,16 +17481,16 @@
 </file>
 
 <file path=customXml/item2.xml><?xml version="1.0" encoding="utf-8"?>
+<b:Sources xmlns:b="http://schemas.openxmlformats.org/officeDocument/2006/bibliography" SelectedStyle="\APA.XSL" StyleName="APA"/>
+</file>
+
+<file path=customXml/item3.xml><?xml version="1.0" encoding="utf-8"?>
 <?mso-contentType ?>
 <FormTemplates xmlns="http://schemas.microsoft.com/sharepoint/v3/contenttype/forms">
   <Display>DocumentLibraryForm</Display>
   <Edit>AssetEditForm</Edit>
   <New>DocumentLibraryForm</New>
 </FormTemplates>
-</file>
-
-<file path=customXml/item3.xml><?xml version="1.0" encoding="utf-8"?>
-<b:Sources xmlns:b="http://schemas.openxmlformats.org/officeDocument/2006/bibliography" SelectedStyle="\APA.XSL" StyleName="APA"/>
 </file>
 
 <file path=customXml/itemProps1.xml><?xml version="1.0" encoding="utf-8"?>
@@ -16066,17 +17502,17 @@
 </file>
 
 <file path=customXml/itemProps2.xml><?xml version="1.0" encoding="utf-8"?>
+<ds:datastoreItem xmlns:ds="http://schemas.openxmlformats.org/officeDocument/2006/customXml" ds:itemID="{355C5113-D031-41DB-A6D8-43CE1A0E6695}">
+  <ds:schemaRefs>
+    <ds:schemaRef ds:uri="http://schemas.openxmlformats.org/officeDocument/2006/bibliography"/>
+  </ds:schemaRefs>
+</ds:datastoreItem>
+</file>
+
+<file path=customXml/itemProps3.xml><?xml version="1.0" encoding="utf-8"?>
 <ds:datastoreItem xmlns:ds="http://schemas.openxmlformats.org/officeDocument/2006/customXml" ds:itemID="{E34C63B7-A026-4A37-9535-4FBB4C03A11D}">
   <ds:schemaRefs>
     <ds:schemaRef ds:uri="http://schemas.microsoft.com/sharepoint/v3/contenttype/forms"/>
   </ds:schemaRefs>
 </ds:datastoreItem>
-</file>
-
-<file path=customXml/itemProps3.xml><?xml version="1.0" encoding="utf-8"?>
-<ds:datastoreItem xmlns:ds="http://schemas.openxmlformats.org/officeDocument/2006/customXml" ds:itemID="{355C5113-D031-41DB-A6D8-43CE1A0E6695}">
-  <ds:schemaRefs>
-    <ds:schemaRef ds:uri="http://schemas.openxmlformats.org/officeDocument/2006/bibliography"/>
-  </ds:schemaRefs>
-</ds:datastoreItem>
 </file>
</xml_diff>

<commit_message>
Create Doctor Table has been added
</commit_message>
<xml_diff>
--- a/Introduction to DB-CS350 Project.docx
+++ b/Introduction to DB-CS350 Project.docx
@@ -9247,6 +9247,561 @@
     </w:p>
     <w:p>
       <w:pPr>
+        <w:pStyle w:val="a"/>
+        <w:numPr>
+          <w:ilvl w:val="0"/>
+          <w:numId w:val="0"/>
+        </w:numPr>
+        <w:ind w:left="576"/>
+        <w:rPr>
+          <w:rFonts w:ascii="Times New Roman" w:hAnsi="Times New Roman" w:cs="Times New Roman"/>
+          <w:color w:val="auto"/>
+          <w:sz w:val="24"/>
+          <w:szCs w:val="24"/>
+        </w:rPr>
+      </w:pPr>
+    </w:p>
+    <w:p>
+      <w:pPr>
+        <w:pStyle w:val="a"/>
+        <w:numPr>
+          <w:ilvl w:val="0"/>
+          <w:numId w:val="0"/>
+        </w:numPr>
+        <w:ind w:left="576"/>
+        <w:rPr>
+          <w:rFonts w:ascii="Times New Roman" w:hAnsi="Times New Roman" w:cs="Times New Roman"/>
+          <w:color w:val="auto"/>
+          <w:sz w:val="24"/>
+          <w:szCs w:val="24"/>
+        </w:rPr>
+      </w:pPr>
+    </w:p>
+    <w:p>
+      <w:pPr>
+        <w:pStyle w:val="a"/>
+        <w:numPr>
+          <w:ilvl w:val="0"/>
+          <w:numId w:val="0"/>
+        </w:numPr>
+        <w:ind w:left="576"/>
+        <w:rPr>
+          <w:rFonts w:ascii="Times New Roman" w:hAnsi="Times New Roman" w:cs="Times New Roman"/>
+          <w:color w:val="auto"/>
+          <w:sz w:val="24"/>
+          <w:szCs w:val="24"/>
+        </w:rPr>
+      </w:pPr>
+    </w:p>
+    <w:p>
+      <w:pPr>
+        <w:pStyle w:val="a"/>
+        <w:numPr>
+          <w:ilvl w:val="0"/>
+          <w:numId w:val="0"/>
+        </w:numPr>
+        <w:ind w:left="576"/>
+        <w:rPr>
+          <w:rFonts w:ascii="Times New Roman" w:hAnsi="Times New Roman" w:cs="Times New Roman"/>
+          <w:color w:val="auto"/>
+          <w:sz w:val="24"/>
+          <w:szCs w:val="24"/>
+        </w:rPr>
+      </w:pPr>
+    </w:p>
+    <w:p>
+      <w:pPr>
+        <w:pStyle w:val="a"/>
+        <w:numPr>
+          <w:ilvl w:val="0"/>
+          <w:numId w:val="0"/>
+        </w:numPr>
+        <w:ind w:left="576"/>
+        <w:rPr>
+          <w:rFonts w:ascii="Times New Roman" w:hAnsi="Times New Roman" w:cs="Times New Roman"/>
+          <w:color w:val="auto"/>
+          <w:sz w:val="24"/>
+          <w:szCs w:val="24"/>
+        </w:rPr>
+      </w:pPr>
+    </w:p>
+    <w:p>
+      <w:pPr>
+        <w:pStyle w:val="a"/>
+        <w:numPr>
+          <w:ilvl w:val="0"/>
+          <w:numId w:val="42"/>
+        </w:numPr>
+        <w:rPr>
+          <w:rFonts w:ascii="Times New Roman" w:hAnsi="Times New Roman" w:cs="Times New Roman"/>
+          <w:b/>
+          <w:bCs/>
+          <w:color w:val="auto"/>
+          <w:sz w:val="24"/>
+          <w:szCs w:val="24"/>
+        </w:rPr>
+      </w:pPr>
+      <w:r>
+        <w:rPr>
+          <w:rFonts w:ascii="Times New Roman" w:hAnsi="Times New Roman" w:cs="Times New Roman"/>
+          <w:b/>
+          <w:bCs/>
+          <w:color w:val="auto"/>
+          <w:sz w:val="24"/>
+          <w:szCs w:val="24"/>
+        </w:rPr>
+        <w:lastRenderedPageBreak/>
+        <w:t>Create Doctor Table</w:t>
+      </w:r>
+    </w:p>
+    <w:p>
+      <w:pPr>
+        <w:pStyle w:val="a"/>
+        <w:numPr>
+          <w:ilvl w:val="0"/>
+          <w:numId w:val="0"/>
+        </w:numPr>
+        <w:ind w:left="288"/>
+        <w:rPr>
+          <w:rFonts w:ascii="Times New Roman" w:hAnsi="Times New Roman" w:cs="Times New Roman"/>
+          <w:color w:val="auto"/>
+          <w:sz w:val="22"/>
+          <w:szCs w:val="22"/>
+        </w:rPr>
+      </w:pPr>
+    </w:p>
+    <w:p>
+      <w:pPr>
+        <w:pStyle w:val="a"/>
+        <w:numPr>
+          <w:ilvl w:val="0"/>
+          <w:numId w:val="0"/>
+        </w:numPr>
+        <w:ind w:left="288"/>
+        <w:rPr>
+          <w:rFonts w:ascii="Times New Roman" w:hAnsi="Times New Roman" w:cs="Times New Roman"/>
+          <w:color w:val="auto"/>
+        </w:rPr>
+      </w:pPr>
+      <w:r>
+        <w:rPr>
+          <w:rFonts w:ascii="Times New Roman" w:hAnsi="Times New Roman" w:cs="Times New Roman"/>
+          <w:color w:val="auto"/>
+        </w:rPr>
+        <w:t>CREATE TABLE Doctor (</w:t>
+      </w:r>
+    </w:p>
+    <w:p>
+      <w:pPr>
+        <w:pStyle w:val="a"/>
+        <w:numPr>
+          <w:ilvl w:val="0"/>
+          <w:numId w:val="0"/>
+        </w:numPr>
+        <w:ind w:left="288"/>
+        <w:rPr>
+          <w:rFonts w:ascii="Times New Roman" w:hAnsi="Times New Roman" w:cs="Times New Roman"/>
+          <w:color w:val="auto"/>
+        </w:rPr>
+      </w:pPr>
+      <w:r>
+        <w:rPr>
+          <w:rFonts w:ascii="Times New Roman" w:hAnsi="Times New Roman" w:cs="Times New Roman"/>
+          <w:color w:val="auto"/>
+        </w:rPr>
+        <w:t xml:space="preserve">    DoctorID INT PRIMARY KEY,</w:t>
+      </w:r>
+    </w:p>
+    <w:p>
+      <w:pPr>
+        <w:pStyle w:val="a"/>
+        <w:numPr>
+          <w:ilvl w:val="0"/>
+          <w:numId w:val="0"/>
+        </w:numPr>
+        <w:ind w:left="288"/>
+        <w:rPr>
+          <w:rFonts w:ascii="Times New Roman" w:hAnsi="Times New Roman" w:cs="Times New Roman"/>
+          <w:color w:val="auto"/>
+        </w:rPr>
+      </w:pPr>
+      <w:r>
+        <w:rPr>
+          <w:rFonts w:ascii="Times New Roman" w:hAnsi="Times New Roman" w:cs="Times New Roman"/>
+          <w:color w:val="auto"/>
+        </w:rPr>
+        <w:t xml:space="preserve">    FirstName VARCHAR(30) NOT NULL,</w:t>
+      </w:r>
+    </w:p>
+    <w:p>
+      <w:pPr>
+        <w:pStyle w:val="a"/>
+        <w:numPr>
+          <w:ilvl w:val="0"/>
+          <w:numId w:val="0"/>
+        </w:numPr>
+        <w:ind w:left="288"/>
+        <w:rPr>
+          <w:rFonts w:ascii="Times New Roman" w:hAnsi="Times New Roman" w:cs="Times New Roman"/>
+          <w:color w:val="auto"/>
+        </w:rPr>
+      </w:pPr>
+      <w:r>
+        <w:rPr>
+          <w:rFonts w:ascii="Times New Roman" w:hAnsi="Times New Roman" w:cs="Times New Roman"/>
+          <w:color w:val="auto"/>
+        </w:rPr>
+        <w:t xml:space="preserve">    LastName VARCHAR(30) NOT NULL,</w:t>
+      </w:r>
+    </w:p>
+    <w:p>
+      <w:pPr>
+        <w:pStyle w:val="a"/>
+        <w:numPr>
+          <w:ilvl w:val="0"/>
+          <w:numId w:val="0"/>
+        </w:numPr>
+        <w:ind w:left="288"/>
+        <w:rPr>
+          <w:rFonts w:ascii="Times New Roman" w:hAnsi="Times New Roman" w:cs="Times New Roman"/>
+          <w:color w:val="auto"/>
+        </w:rPr>
+      </w:pPr>
+      <w:r>
+        <w:rPr>
+          <w:rFonts w:ascii="Times New Roman" w:hAnsi="Times New Roman" w:cs="Times New Roman"/>
+          <w:color w:val="auto"/>
+        </w:rPr>
+        <w:t xml:space="preserve">    Phone VARCHAR(15) NOT NULL UNIQUE,</w:t>
+      </w:r>
+    </w:p>
+    <w:p>
+      <w:pPr>
+        <w:pStyle w:val="a"/>
+        <w:numPr>
+          <w:ilvl w:val="0"/>
+          <w:numId w:val="0"/>
+        </w:numPr>
+        <w:ind w:left="288"/>
+        <w:rPr>
+          <w:rFonts w:ascii="Times New Roman" w:hAnsi="Times New Roman" w:cs="Times New Roman"/>
+          <w:color w:val="auto"/>
+        </w:rPr>
+      </w:pPr>
+      <w:r>
+        <w:rPr>
+          <w:rFonts w:ascii="Times New Roman" w:hAnsi="Times New Roman" w:cs="Times New Roman"/>
+          <w:color w:val="auto"/>
+        </w:rPr>
+        <w:t xml:space="preserve">    DepartmentID INT NOT NULL,</w:t>
+      </w:r>
+    </w:p>
+    <w:p>
+      <w:pPr>
+        <w:pStyle w:val="a"/>
+        <w:numPr>
+          <w:ilvl w:val="0"/>
+          <w:numId w:val="0"/>
+        </w:numPr>
+        <w:ind w:left="288"/>
+        <w:rPr>
+          <w:rFonts w:ascii="Times New Roman" w:hAnsi="Times New Roman" w:cs="Times New Roman"/>
+          <w:color w:val="auto"/>
+        </w:rPr>
+      </w:pPr>
+      <w:r>
+        <w:rPr>
+          <w:rFonts w:ascii="Times New Roman" w:hAnsi="Times New Roman" w:cs="Times New Roman"/>
+          <w:color w:val="auto"/>
+        </w:rPr>
+        <w:t xml:space="preserve">    FOREIGN KEY (DepartmentID)</w:t>
+      </w:r>
+    </w:p>
+    <w:p>
+      <w:pPr>
+        <w:pStyle w:val="a"/>
+        <w:numPr>
+          <w:ilvl w:val="0"/>
+          <w:numId w:val="0"/>
+        </w:numPr>
+        <w:ind w:left="288"/>
+        <w:rPr>
+          <w:rFonts w:ascii="Times New Roman" w:hAnsi="Times New Roman" w:cs="Times New Roman"/>
+          <w:color w:val="auto"/>
+        </w:rPr>
+      </w:pPr>
+      <w:r>
+        <w:rPr>
+          <w:rFonts w:ascii="Times New Roman" w:hAnsi="Times New Roman" w:cs="Times New Roman"/>
+          <w:color w:val="auto"/>
+        </w:rPr>
+        <w:t xml:space="preserve">        REFERENCES Department(DepartmentID)</w:t>
+      </w:r>
+    </w:p>
+    <w:p>
+      <w:pPr>
+        <w:pStyle w:val="a"/>
+        <w:numPr>
+          <w:ilvl w:val="0"/>
+          <w:numId w:val="0"/>
+        </w:numPr>
+        <w:ind w:left="288"/>
+        <w:rPr>
+          <w:rFonts w:ascii="Times New Roman" w:hAnsi="Times New Roman" w:cs="Times New Roman"/>
+          <w:color w:val="auto"/>
+        </w:rPr>
+      </w:pPr>
+      <w:r>
+        <w:rPr>
+          <w:rFonts w:ascii="Times New Roman" w:hAnsi="Times New Roman" w:cs="Times New Roman"/>
+          <w:color w:val="auto"/>
+        </w:rPr>
+        <w:t>);</w:t>
+      </w:r>
+    </w:p>
+    <w:p>
+      <w:pPr>
+        <w:pStyle w:val="a"/>
+        <w:numPr>
+          <w:ilvl w:val="0"/>
+          <w:numId w:val="0"/>
+        </w:numPr>
+        <w:ind w:left="288"/>
+        <w:rPr>
+          <w:rFonts w:ascii="Times New Roman" w:hAnsi="Times New Roman" w:cs="Times New Roman"/>
+          <w:color w:val="auto"/>
+          <w:sz w:val="22"/>
+          <w:szCs w:val="22"/>
+        </w:rPr>
+      </w:pPr>
+    </w:p>
+    <w:p>
+      <w:pPr>
+        <w:pStyle w:val="a"/>
+        <w:numPr>
+          <w:ilvl w:val="0"/>
+          <w:numId w:val="42"/>
+        </w:numPr>
+        <w:rPr>
+          <w:rFonts w:ascii="Times New Roman" w:hAnsi="Times New Roman" w:cs="Times New Roman"/>
+          <w:b/>
+          <w:bCs/>
+          <w:color w:val="auto"/>
+          <w:sz w:val="24"/>
+          <w:szCs w:val="24"/>
+        </w:rPr>
+      </w:pPr>
+      <w:r>
+        <w:rPr>
+          <w:rFonts w:ascii="Times New Roman" w:hAnsi="Times New Roman" w:cs="Times New Roman"/>
+          <w:b/>
+          <w:bCs/>
+          <w:color w:val="auto"/>
+          <w:sz w:val="24"/>
+          <w:szCs w:val="24"/>
+        </w:rPr>
+        <w:t>Create GeneralPractitioner Table</w:t>
+      </w:r>
+    </w:p>
+    <w:p>
+      <w:pPr>
+        <w:pStyle w:val="a"/>
+        <w:numPr>
+          <w:ilvl w:val="0"/>
+          <w:numId w:val="0"/>
+        </w:numPr>
+        <w:ind w:left="288"/>
+        <w:rPr>
+          <w:rFonts w:ascii="Times New Roman" w:hAnsi="Times New Roman" w:cs="Times New Roman"/>
+          <w:color w:val="auto"/>
+          <w:sz w:val="22"/>
+          <w:szCs w:val="22"/>
+        </w:rPr>
+      </w:pPr>
+    </w:p>
+    <w:p>
+      <w:pPr>
+        <w:pStyle w:val="a"/>
+        <w:numPr>
+          <w:ilvl w:val="0"/>
+          <w:numId w:val="0"/>
+        </w:numPr>
+        <w:ind w:left="288"/>
+        <w:rPr>
+          <w:rFonts w:ascii="Times New Roman" w:hAnsi="Times New Roman" w:cs="Times New Roman"/>
+          <w:color w:val="auto"/>
+        </w:rPr>
+      </w:pPr>
+      <w:r>
+        <w:rPr>
+          <w:rFonts w:ascii="Times New Roman" w:hAnsi="Times New Roman" w:cs="Times New Roman"/>
+          <w:color w:val="auto"/>
+        </w:rPr>
+        <w:t>CREATE TABLE GeneralPractitioner (</w:t>
+      </w:r>
+    </w:p>
+    <w:p>
+      <w:pPr>
+        <w:pStyle w:val="a"/>
+        <w:numPr>
+          <w:ilvl w:val="0"/>
+          <w:numId w:val="0"/>
+        </w:numPr>
+        <w:ind w:left="288"/>
+        <w:rPr>
+          <w:rFonts w:ascii="Times New Roman" w:hAnsi="Times New Roman" w:cs="Times New Roman"/>
+          <w:color w:val="auto"/>
+        </w:rPr>
+      </w:pPr>
+      <w:r>
+        <w:rPr>
+          <w:rFonts w:ascii="Times New Roman" w:hAnsi="Times New Roman" w:cs="Times New Roman"/>
+          <w:color w:val="auto"/>
+        </w:rPr>
+        <w:t xml:space="preserve">    DoctorID INT PRIMARY KEY,</w:t>
+      </w:r>
+    </w:p>
+    <w:p>
+      <w:pPr>
+        <w:pStyle w:val="a"/>
+        <w:numPr>
+          <w:ilvl w:val="0"/>
+          <w:numId w:val="0"/>
+        </w:numPr>
+        <w:ind w:left="288"/>
+        <w:rPr>
+          <w:rFonts w:ascii="Times New Roman" w:hAnsi="Times New Roman" w:cs="Times New Roman"/>
+          <w:color w:val="auto"/>
+        </w:rPr>
+      </w:pPr>
+      <w:r>
+        <w:rPr>
+          <w:rFonts w:ascii="Times New Roman" w:hAnsi="Times New Roman" w:cs="Times New Roman"/>
+          <w:color w:val="auto"/>
+        </w:rPr>
+        <w:t xml:space="preserve">    FOREIGN KEY (DoctorID)</w:t>
+      </w:r>
+    </w:p>
+    <w:p>
+      <w:pPr>
+        <w:pStyle w:val="a"/>
+        <w:numPr>
+          <w:ilvl w:val="0"/>
+          <w:numId w:val="0"/>
+        </w:numPr>
+        <w:ind w:left="288"/>
+        <w:rPr>
+          <w:rFonts w:ascii="Times New Roman" w:hAnsi="Times New Roman" w:cs="Times New Roman"/>
+          <w:color w:val="auto"/>
+        </w:rPr>
+      </w:pPr>
+      <w:r>
+        <w:rPr>
+          <w:rFonts w:ascii="Times New Roman" w:hAnsi="Times New Roman" w:cs="Times New Roman"/>
+          <w:color w:val="auto"/>
+        </w:rPr>
+        <w:t xml:space="preserve">        REFERENCES Doctor(DoctorID)</w:t>
+      </w:r>
+    </w:p>
+    <w:p>
+      <w:pPr>
+        <w:pStyle w:val="a"/>
+        <w:numPr>
+          <w:ilvl w:val="0"/>
+          <w:numId w:val="0"/>
+        </w:numPr>
+        <w:ind w:left="288"/>
+        <w:rPr>
+          <w:rFonts w:ascii="Times New Roman" w:hAnsi="Times New Roman" w:cs="Times New Roman"/>
+          <w:color w:val="auto"/>
+        </w:rPr>
+      </w:pPr>
+      <w:r>
+        <w:rPr>
+          <w:rFonts w:ascii="Times New Roman" w:hAnsi="Times New Roman" w:cs="Times New Roman"/>
+          <w:color w:val="auto"/>
+        </w:rPr>
+        <w:t>);</w:t>
+      </w:r>
+    </w:p>
+    <w:p>
+      <w:pPr>
+        <w:pStyle w:val="a"/>
+        <w:numPr>
+          <w:ilvl w:val="0"/>
+          <w:numId w:val="0"/>
+        </w:numPr>
+        <w:ind w:left="576"/>
+        <w:rPr>
+          <w:rFonts w:ascii="Times New Roman" w:hAnsi="Times New Roman" w:cs="Times New Roman"/>
+          <w:color w:val="auto"/>
+          <w:sz w:val="24"/>
+          <w:szCs w:val="24"/>
+        </w:rPr>
+      </w:pPr>
+    </w:p>
+    <w:p>
+      <w:pPr>
+        <w:pStyle w:val="a"/>
+        <w:numPr>
+          <w:ilvl w:val="0"/>
+          <w:numId w:val="0"/>
+        </w:numPr>
+        <w:ind w:left="576"/>
+        <w:rPr>
+          <w:rFonts w:ascii="Times New Roman" w:hAnsi="Times New Roman" w:cs="Times New Roman"/>
+          <w:color w:val="auto"/>
+          <w:sz w:val="24"/>
+          <w:szCs w:val="24"/>
+        </w:rPr>
+      </w:pPr>
+      <w:r>
+        <w:rPr>
+          <w:rFonts w:ascii="Times New Roman" w:hAnsi="Times New Roman" w:cs="Times New Roman"/>
+          <w:noProof/>
+          <w:color w:val="auto"/>
+          <w:sz w:val="22"/>
+          <w:szCs w:val="22"/>
+        </w:rPr>
+        <w:drawing>
+          <wp:inline distT="0" distB="0" distL="0" distR="0" wp14:anchorId="5A89DCCE" wp14:editId="5C901963">
+            <wp:extent cx="5349240" cy="2649855"/>
+            <wp:effectExtent l="0" t="0" r="3810" b="0"/>
+            <wp:docPr id="629363545" name="Picture 1"/>
+            <wp:cNvGraphicFramePr>
+              <a:graphicFrameLocks xmlns:a="http://schemas.openxmlformats.org/drawingml/2006/main" noChangeAspect="1"/>
+            </wp:cNvGraphicFramePr>
+            <a:graphic xmlns:a="http://schemas.openxmlformats.org/drawingml/2006/main">
+              <a:graphicData uri="http://schemas.openxmlformats.org/drawingml/2006/picture">
+                <pic:pic xmlns:pic="http://schemas.openxmlformats.org/drawingml/2006/picture">
+                  <pic:nvPicPr>
+                    <pic:cNvPr id="629363545" name=""/>
+                    <pic:cNvPicPr/>
+                  </pic:nvPicPr>
+                  <pic:blipFill>
+                    <a:blip r:embed="rId18"/>
+                    <a:stretch>
+                      <a:fillRect/>
+                    </a:stretch>
+                  </pic:blipFill>
+                  <pic:spPr>
+                    <a:xfrm>
+                      <a:off x="0" y="0"/>
+                      <a:ext cx="5349240" cy="2649855"/>
+                    </a:xfrm>
+                    <a:prstGeom prst="rect">
+                      <a:avLst/>
+                    </a:prstGeom>
+                  </pic:spPr>
+                </pic:pic>
+              </a:graphicData>
+            </a:graphic>
+          </wp:inline>
+        </w:drawing>
+      </w:r>
+    </w:p>
+    <w:p>
+      <w:pPr>
         <w:pStyle w:val="1"/>
       </w:pPr>
       <w:r>
@@ -9905,7 +10460,7 @@
       </w:pPr>
     </w:p>
     <w:sectPr>
-      <w:headerReference w:type="default" r:id="rId18"/>
+      <w:headerReference w:type="default" r:id="rId19"/>
       <w:pgSz w:w="12240" w:h="15840" w:code="1"/>
       <w:pgMar w:top="1080" w:right="720" w:bottom="1800" w:left="3096" w:header="1080" w:footer="720" w:gutter="0"/>
       <w:pgNumType w:start="1"/>
@@ -16205,6 +16760,7 @@
     <w:rsid w:val="0011571B"/>
     <w:rsid w:val="00125B68"/>
     <w:rsid w:val="001876E6"/>
+    <w:rsid w:val="0019723D"/>
     <w:rsid w:val="001A632E"/>
     <w:rsid w:val="0022537A"/>
     <w:rsid w:val="002A69BE"/>
@@ -16229,6 +16785,7 @@
     <w:rsid w:val="0060379F"/>
     <w:rsid w:val="006400C0"/>
     <w:rsid w:val="00660EF5"/>
+    <w:rsid w:val="00684051"/>
     <w:rsid w:val="00695677"/>
     <w:rsid w:val="006D7F43"/>
     <w:rsid w:val="006E2B58"/>
@@ -17102,16 +17659,16 @@
 </file>
 
 <file path=customXml/item2.xml><?xml version="1.0" encoding="utf-8"?>
+<b:Sources xmlns:b="http://schemas.openxmlformats.org/officeDocument/2006/bibliography" SelectedStyle="\APA.XSL" StyleName="APA"/>
+</file>
+
+<file path=customXml/item3.xml><?xml version="1.0" encoding="utf-8"?>
 <?mso-contentType ?>
 <FormTemplates xmlns="http://schemas.microsoft.com/sharepoint/v3/contenttype/forms">
   <Display>DocumentLibraryForm</Display>
   <Edit>AssetEditForm</Edit>
   <New>DocumentLibraryForm</New>
 </FormTemplates>
-</file>
-
-<file path=customXml/item3.xml><?xml version="1.0" encoding="utf-8"?>
-<b:Sources xmlns:b="http://schemas.openxmlformats.org/officeDocument/2006/bibliography" SelectedStyle="\APA.XSL" StyleName="APA"/>
 </file>
 
 <file path=customXml/itemProps1.xml><?xml version="1.0" encoding="utf-8"?>
@@ -17123,17 +17680,17 @@
 </file>
 
 <file path=customXml/itemProps2.xml><?xml version="1.0" encoding="utf-8"?>
+<ds:datastoreItem xmlns:ds="http://schemas.openxmlformats.org/officeDocument/2006/customXml" ds:itemID="{355C5113-D031-41DB-A6D8-43CE1A0E6695}">
+  <ds:schemaRefs>
+    <ds:schemaRef ds:uri="http://schemas.openxmlformats.org/officeDocument/2006/bibliography"/>
+  </ds:schemaRefs>
+</ds:datastoreItem>
+</file>
+
+<file path=customXml/itemProps3.xml><?xml version="1.0" encoding="utf-8"?>
 <ds:datastoreItem xmlns:ds="http://schemas.openxmlformats.org/officeDocument/2006/customXml" ds:itemID="{E34C63B7-A026-4A37-9535-4FBB4C03A11D}">
   <ds:schemaRefs>
     <ds:schemaRef ds:uri="http://schemas.microsoft.com/sharepoint/v3/contenttype/forms"/>
   </ds:schemaRefs>
 </ds:datastoreItem>
-</file>
-
-<file path=customXml/itemProps3.xml><?xml version="1.0" encoding="utf-8"?>
-<ds:datastoreItem xmlns:ds="http://schemas.openxmlformats.org/officeDocument/2006/customXml" ds:itemID="{355C5113-D031-41DB-A6D8-43CE1A0E6695}">
-  <ds:schemaRefs>
-    <ds:schemaRef ds:uri="http://schemas.openxmlformats.org/officeDocument/2006/bibliography"/>
-  </ds:schemaRefs>
-</ds:datastoreItem>
 </file>
</xml_diff>

<commit_message>
Specialist and Appointment Tables have been added
</commit_message>
<xml_diff>
--- a/Introduction to DB-CS350 Project.docx
+++ b/Introduction to DB-CS350 Project.docx
@@ -1501,7 +1501,21 @@
                                     <w:rPr>
                                       <w:color w:val="auto"/>
                                     </w:rPr>
-                                    <w:t xml:space="preserve"> This includes filling your information on the cover page.</w:t>
+                                    <w:t xml:space="preserve"> This includes </w:t>
+                                  </w:r>
+                                  <w:proofErr w:type="gramStart"/>
+                                  <w:r>
+                                    <w:rPr>
+                                      <w:color w:val="auto"/>
+                                    </w:rPr>
+                                    <w:t>filling</w:t>
+                                  </w:r>
+                                  <w:proofErr w:type="gramEnd"/>
+                                  <w:r>
+                                    <w:rPr>
+                                      <w:color w:val="auto"/>
+                                    </w:rPr>
+                                    <w:t xml:space="preserve"> your information on the cover page.</w:t>
                                   </w:r>
                                 </w:p>
                                 <w:p>
@@ -1523,7 +1537,21 @@
                                     <w:rPr>
                                       <w:color w:val="auto"/>
                                     </w:rPr>
-                                    <w:t>You must use this template, failing which will result in zero mark.</w:t>
+                                    <w:t xml:space="preserve">You must use this template, failing which will result in zero </w:t>
+                                  </w:r>
+                                  <w:proofErr w:type="gramStart"/>
+                                  <w:r>
+                                    <w:rPr>
+                                      <w:color w:val="auto"/>
+                                    </w:rPr>
+                                    <w:t>mark</w:t>
+                                  </w:r>
+                                  <w:proofErr w:type="gramEnd"/>
+                                  <w:r>
+                                    <w:rPr>
+                                      <w:color w:val="auto"/>
+                                    </w:rPr>
+                                    <w:t>.</w:t>
                                   </w:r>
                                 </w:p>
                                 <w:p>
@@ -2360,7 +2388,17 @@
                                           <w:sz w:val="28"/>
                                           <w:szCs w:val="28"/>
                                         </w:rPr>
-                                        <w:t>Rakan A</w:t>
+                                        <w:t xml:space="preserve">Rakan </w:t>
+                                      </w:r>
+                                      <w:proofErr w:type="spellStart"/>
+                                      <w:r>
+                                        <w:rPr>
+                                          <w:b/>
+                                          <w:bCs/>
+                                          <w:sz w:val="28"/>
+                                          <w:szCs w:val="28"/>
+                                        </w:rPr>
+                                        <w:t>A</w:t>
                                       </w:r>
                                       <w:r>
                                         <w:rPr>
@@ -2371,6 +2409,7 @@
                                         </w:rPr>
                                         <w:t>lqu</w:t>
                                       </w:r>
+                                      <w:proofErr w:type="spellEnd"/>
                                     </w:p>
                                     <w:p>
                                       <w:pPr>
@@ -2708,7 +2747,11 @@
               </mc:Choice>
               <mc:Fallback>
                 <w:pict>
-                  <v:shape w14:anchorId="7CBAAF0B" id="Text Box 15" o:spid="_x0000_s1031" type="#_x0000_t202" alt="contact info" style="position:absolute;margin-left:36pt;margin-top:228.75pt;width:540pt;height:99.75pt;z-index:251675648;visibility:visible;mso-wrap-style:square;mso-width-percent:1282;mso-height-percent:0;mso-wrap-distance-left:9pt;mso-wrap-distance-top:0;mso-wrap-distance-right:9pt;mso-wrap-distance-bottom:0;mso-position-horizontal:absolute;mso-position-horizontal-relative:page;mso-position-vertical:absolute;mso-position-vertical-relative:margin;mso-width-percent:1282;mso-height-percent:0;mso-width-relative:margin;mso-height-relative:margin;v-text-anchor:bottom" o:gfxdata="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" o:allowoverlap="f" filled="f" stroked="f" strokeweight=".5pt">
+                  <v:shapetype w14:anchorId="7CBAAF0B" id="_x0000_t202" coordsize="21600,21600" o:spt="202" path="m,l,21600r21600,l21600,xe">
+                    <v:stroke joinstyle="miter"/>
+                    <v:path gradientshapeok="t" o:connecttype="rect"/>
+                  </v:shapetype>
+                  <v:shape id="Text Box 15" o:spid="_x0000_s1031" type="#_x0000_t202" alt="contact info" style="position:absolute;margin-left:36pt;margin-top:228.75pt;width:540pt;height:99.75pt;z-index:251675648;visibility:visible;mso-wrap-style:square;mso-width-percent:1282;mso-height-percent:0;mso-wrap-distance-left:9pt;mso-wrap-distance-top:0;mso-wrap-distance-right:9pt;mso-wrap-distance-bottom:0;mso-position-horizontal:absolute;mso-position-horizontal-relative:page;mso-position-vertical:absolute;mso-position-vertical-relative:margin;mso-width-percent:1282;mso-height-percent:0;mso-width-relative:margin;mso-height-relative:margin;v-text-anchor:bottom" o:gfxdata="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" o:allowoverlap="f" filled="f" stroked="f" strokeweight=".5pt">
                     <v:textbox inset="0,0,0,0">
                       <w:txbxContent>
                         <w:p>
@@ -2848,7 +2891,17 @@
                                     <w:sz w:val="28"/>
                                     <w:szCs w:val="28"/>
                                   </w:rPr>
-                                  <w:t>Rakan A</w:t>
+                                  <w:t xml:space="preserve">Rakan </w:t>
+                                </w:r>
+                                <w:proofErr w:type="spellStart"/>
+                                <w:r>
+                                  <w:rPr>
+                                    <w:b/>
+                                    <w:bCs/>
+                                    <w:sz w:val="28"/>
+                                    <w:szCs w:val="28"/>
+                                  </w:rPr>
+                                  <w:t>A</w:t>
                                 </w:r>
                                 <w:r>
                                   <w:rPr>
@@ -2859,6 +2912,7 @@
                                   </w:rPr>
                                   <w:t>lqu</w:t>
                                 </w:r>
+                                <w:proofErr w:type="spellEnd"/>
                               </w:p>
                               <w:p>
                                 <w:pPr>
@@ -3309,6 +3363,7 @@
         </w:rPr>
         <w:t xml:space="preserve">This project </w:t>
       </w:r>
+      <w:proofErr w:type="gramStart"/>
       <w:r>
         <w:rPr>
           <w:rFonts w:ascii="Times New Roman" w:hAnsi="Times New Roman" w:cs="Times New Roman"/>
@@ -3318,7 +3373,19 @@
           <w:sz w:val="24"/>
           <w:szCs w:val="24"/>
         </w:rPr>
-        <w:t xml:space="preserve">worth </w:t>
+        <w:t>worth</w:t>
+      </w:r>
+      <w:proofErr w:type="gramEnd"/>
+      <w:r>
+        <w:rPr>
+          <w:rFonts w:ascii="Times New Roman" w:hAnsi="Times New Roman" w:cs="Times New Roman"/>
+          <w:b/>
+          <w:bCs/>
+          <w:color w:val="auto"/>
+          <w:sz w:val="24"/>
+          <w:szCs w:val="24"/>
+        </w:rPr>
+        <w:t xml:space="preserve"> </w:t>
       </w:r>
       <w:r>
         <w:rPr>
@@ -3871,7 +3938,25 @@
           <w:sz w:val="24"/>
           <w:szCs w:val="24"/>
         </w:rPr>
-        <w:t>Task 1 : database design</w:t>
+        <w:t xml:space="preserve">Task </w:t>
+      </w:r>
+      <w:proofErr w:type="gramStart"/>
+      <w:r>
+        <w:rPr>
+          <w:rFonts w:ascii="Times New Roman" w:hAnsi="Times New Roman" w:cs="Times New Roman"/>
+          <w:sz w:val="24"/>
+          <w:szCs w:val="24"/>
+        </w:rPr>
+        <w:t>1 :</w:t>
+      </w:r>
+      <w:proofErr w:type="gramEnd"/>
+      <w:r>
+        <w:rPr>
+          <w:rFonts w:ascii="Times New Roman" w:hAnsi="Times New Roman" w:cs="Times New Roman"/>
+          <w:sz w:val="24"/>
+          <w:szCs w:val="24"/>
+        </w:rPr>
+        <w:t xml:space="preserve"> database design</w:t>
       </w:r>
     </w:p>
     <w:p>
@@ -4157,7 +4242,25 @@
           <w:sz w:val="24"/>
           <w:szCs w:val="24"/>
         </w:rPr>
-        <w:t xml:space="preserve"> describing the completed work, key decisions, challenges, future plan, and contribution of each group member.</w:t>
+        <w:t xml:space="preserve"> describing the completed work, key decisions, challenges, </w:t>
+      </w:r>
+      <w:proofErr w:type="gramStart"/>
+      <w:r>
+        <w:rPr>
+          <w:rFonts w:ascii="Times New Roman" w:hAnsi="Times New Roman" w:cs="Times New Roman"/>
+          <w:sz w:val="24"/>
+          <w:szCs w:val="24"/>
+        </w:rPr>
+        <w:t>future plan</w:t>
+      </w:r>
+      <w:proofErr w:type="gramEnd"/>
+      <w:r>
+        <w:rPr>
+          <w:rFonts w:ascii="Times New Roman" w:hAnsi="Times New Roman" w:cs="Times New Roman"/>
+          <w:sz w:val="24"/>
+          <w:szCs w:val="24"/>
+        </w:rPr>
+        <w:t>, and contribution of each group member.</w:t>
       </w:r>
     </w:p>
     <w:p>
@@ -4200,7 +4303,25 @@
           <w:sz w:val="24"/>
           <w:szCs w:val="24"/>
         </w:rPr>
-        <w:t xml:space="preserve"> to the live report document, GitHub/GitLab repository, and Google Colab notebook (if applicable) in the </w:t>
+        <w:t xml:space="preserve"> to the live report document, GitHub/GitLab repository, and Google </w:t>
+      </w:r>
+      <w:proofErr w:type="spellStart"/>
+      <w:r>
+        <w:rPr>
+          <w:rFonts w:ascii="Times New Roman" w:hAnsi="Times New Roman" w:cs="Times New Roman"/>
+          <w:sz w:val="24"/>
+          <w:szCs w:val="24"/>
+        </w:rPr>
+        <w:t>Colab</w:t>
+      </w:r>
+      <w:proofErr w:type="spellEnd"/>
+      <w:r>
+        <w:rPr>
+          <w:rFonts w:ascii="Times New Roman" w:hAnsi="Times New Roman" w:cs="Times New Roman"/>
+          <w:sz w:val="24"/>
+          <w:szCs w:val="24"/>
+        </w:rPr>
+        <w:t xml:space="preserve"> notebook (if applicable) in the </w:t>
       </w:r>
       <w:r>
         <w:rPr>
@@ -4890,7 +5011,25 @@
           <w:sz w:val="24"/>
           <w:szCs w:val="24"/>
         </w:rPr>
-        <w:t>A private clinic currently manages its patient information manually, making it difficult to organize appointments, treatments, and payments. The clinic has decided to develop a database system to improve data organization and retrieval.</w:t>
+        <w:t xml:space="preserve">A private clinic currently manages </w:t>
+      </w:r>
+      <w:proofErr w:type="gramStart"/>
+      <w:r>
+        <w:rPr>
+          <w:rFonts w:ascii="Times New Roman" w:hAnsi="Times New Roman" w:cs="Times New Roman"/>
+          <w:sz w:val="24"/>
+          <w:szCs w:val="24"/>
+        </w:rPr>
+        <w:t>its patient</w:t>
+      </w:r>
+      <w:proofErr w:type="gramEnd"/>
+      <w:r>
+        <w:rPr>
+          <w:rFonts w:ascii="Times New Roman" w:hAnsi="Times New Roman" w:cs="Times New Roman"/>
+          <w:sz w:val="24"/>
+          <w:szCs w:val="24"/>
+        </w:rPr>
+        <w:t xml:space="preserve"> information manually, making it difficult to organize appointments, treatments, and payments. The clinic has decided to develop a database system to improve data organization and retrieval.</w:t>
       </w:r>
     </w:p>
     <w:p>
@@ -4956,7 +5095,27 @@
           <w:szCs w:val="24"/>
           <w:lang w:val="es-ES"/>
         </w:rPr>
-        <w:t>A complete ER/EER diagram.</w:t>
+        <w:t xml:space="preserve">A complete ER/EER </w:t>
+      </w:r>
+      <w:proofErr w:type="spellStart"/>
+      <w:r>
+        <w:rPr>
+          <w:rFonts w:ascii="Times New Roman" w:hAnsi="Times New Roman" w:cs="Times New Roman"/>
+          <w:sz w:val="24"/>
+          <w:szCs w:val="24"/>
+          <w:lang w:val="es-ES"/>
+        </w:rPr>
+        <w:t>diagram</w:t>
+      </w:r>
+      <w:proofErr w:type="spellEnd"/>
+      <w:r>
+        <w:rPr>
+          <w:rFonts w:ascii="Times New Roman" w:hAnsi="Times New Roman" w:cs="Times New Roman"/>
+          <w:sz w:val="24"/>
+          <w:szCs w:val="24"/>
+          <w:lang w:val="es-ES"/>
+        </w:rPr>
+        <w:t>.</w:t>
       </w:r>
     </w:p>
     <w:p>
@@ -5470,6 +5629,8 @@
           <w:szCs w:val="24"/>
         </w:rPr>
       </w:pPr>
+      <w:proofErr w:type="spellStart"/>
+      <w:proofErr w:type="gramStart"/>
       <w:r>
         <w:rPr>
           <w:rFonts w:ascii="Times New Roman" w:hAnsi="Times New Roman" w:cs="Times New Roman"/>
@@ -5479,6 +5640,8 @@
         </w:rPr>
         <w:t>GeneralPractitioner</w:t>
       </w:r>
+      <w:proofErr w:type="spellEnd"/>
+      <w:proofErr w:type="gramEnd"/>
     </w:p>
     <w:p>
       <w:pPr>
@@ -5680,7 +5843,47 @@
           <w:sz w:val="24"/>
           <w:szCs w:val="24"/>
         </w:rPr>
-        <w:t>The Doctor entity is specialized into two subtypes:</w:t>
+        <w:t xml:space="preserve">The Doctor entity </w:t>
+      </w:r>
+      <w:proofErr w:type="gramStart"/>
+      <w:r>
+        <w:rPr>
+          <w:rFonts w:ascii="Times New Roman" w:hAnsi="Times New Roman" w:cs="Times New Roman"/>
+          <w:color w:val="262626" w:themeColor="accent6" w:themeShade="80"/>
+          <w:sz w:val="24"/>
+          <w:szCs w:val="24"/>
+        </w:rPr>
+        <w:t>is specialized</w:t>
+      </w:r>
+      <w:proofErr w:type="gramEnd"/>
+      <w:r>
+        <w:rPr>
+          <w:rFonts w:ascii="Times New Roman" w:hAnsi="Times New Roman" w:cs="Times New Roman"/>
+          <w:color w:val="262626" w:themeColor="accent6" w:themeShade="80"/>
+          <w:sz w:val="24"/>
+          <w:szCs w:val="24"/>
+        </w:rPr>
+        <w:t xml:space="preserve"> </w:t>
+      </w:r>
+      <w:proofErr w:type="gramStart"/>
+      <w:r>
+        <w:rPr>
+          <w:rFonts w:ascii="Times New Roman" w:hAnsi="Times New Roman" w:cs="Times New Roman"/>
+          <w:color w:val="262626" w:themeColor="accent6" w:themeShade="80"/>
+          <w:sz w:val="24"/>
+          <w:szCs w:val="24"/>
+        </w:rPr>
+        <w:t>into</w:t>
+      </w:r>
+      <w:proofErr w:type="gramEnd"/>
+      <w:r>
+        <w:rPr>
+          <w:rFonts w:ascii="Times New Roman" w:hAnsi="Times New Roman" w:cs="Times New Roman"/>
+          <w:color w:val="262626" w:themeColor="accent6" w:themeShade="80"/>
+          <w:sz w:val="24"/>
+          <w:szCs w:val="24"/>
+        </w:rPr>
+        <w:t xml:space="preserve"> two subtypes:</w:t>
       </w:r>
     </w:p>
     <w:p>
@@ -5697,6 +5900,8 @@
           <w:szCs w:val="24"/>
         </w:rPr>
       </w:pPr>
+      <w:proofErr w:type="spellStart"/>
+      <w:proofErr w:type="gramStart"/>
       <w:r>
         <w:rPr>
           <w:rFonts w:ascii="Times New Roman" w:hAnsi="Times New Roman" w:cs="Times New Roman"/>
@@ -5706,6 +5911,8 @@
         </w:rPr>
         <w:t>GeneralPractitioner</w:t>
       </w:r>
+      <w:proofErr w:type="spellEnd"/>
+      <w:proofErr w:type="gramEnd"/>
     </w:p>
     <w:p>
       <w:pPr>
@@ -5934,6 +6141,7 @@
                 <w:color w:val="auto"/>
               </w:rPr>
             </w:pPr>
+            <w:proofErr w:type="spellStart"/>
             <w:r>
               <w:rPr>
                 <w:rFonts w:ascii="Times New Roman" w:hAnsi="Times New Roman" w:cs="Times New Roman"/>
@@ -5941,7 +6149,17 @@
                 <w:bCs/>
                 <w:color w:val="auto"/>
               </w:rPr>
-              <w:t>PatientID (PK)</w:t>
+              <w:t>PatientID</w:t>
+            </w:r>
+            <w:proofErr w:type="spellEnd"/>
+            <w:r>
+              <w:rPr>
+                <w:rFonts w:ascii="Times New Roman" w:hAnsi="Times New Roman" w:cs="Times New Roman"/>
+                <w:b/>
+                <w:bCs/>
+                <w:color w:val="auto"/>
+              </w:rPr>
+              <w:t xml:space="preserve"> (PK)</w:t>
             </w:r>
             <w:r>
               <w:rPr>
@@ -5998,6 +6216,7 @@
                 <w:color w:val="auto"/>
               </w:rPr>
             </w:pPr>
+            <w:proofErr w:type="spellStart"/>
             <w:r>
               <w:rPr>
                 <w:rFonts w:ascii="Times New Roman" w:hAnsi="Times New Roman" w:cs="Times New Roman"/>
@@ -6005,15 +6224,34 @@
                 <w:bCs/>
                 <w:color w:val="auto"/>
               </w:rPr>
-              <w:t>DepartmentID (PK)</w:t>
+              <w:t>DepartmentID</w:t>
+            </w:r>
+            <w:proofErr w:type="spellEnd"/>
+            <w:r>
+              <w:rPr>
+                <w:rFonts w:ascii="Times New Roman" w:hAnsi="Times New Roman" w:cs="Times New Roman"/>
+                <w:b/>
+                <w:bCs/>
+                <w:color w:val="auto"/>
+              </w:rPr>
+              <w:t xml:space="preserve"> (PK)</w:t>
             </w:r>
             <w:r>
               <w:rPr>
                 <w:rFonts w:ascii="Times New Roman" w:hAnsi="Times New Roman" w:cs="Times New Roman"/>
                 <w:color w:val="auto"/>
               </w:rPr>
-              <w:t>, DepartmentName</w:t>
+              <w:t xml:space="preserve">, </w:t>
             </w:r>
+            <w:proofErr w:type="spellStart"/>
+            <w:r>
+              <w:rPr>
+                <w:rFonts w:ascii="Times New Roman" w:hAnsi="Times New Roman" w:cs="Times New Roman"/>
+                <w:color w:val="auto"/>
+              </w:rPr>
+              <w:t>DepartmentName</w:t>
+            </w:r>
+            <w:proofErr w:type="spellEnd"/>
           </w:p>
         </w:tc>
       </w:tr>
@@ -6062,6 +6300,7 @@
                 <w:color w:val="auto"/>
               </w:rPr>
             </w:pPr>
+            <w:proofErr w:type="spellStart"/>
             <w:r>
               <w:rPr>
                 <w:rFonts w:ascii="Times New Roman" w:hAnsi="Times New Roman" w:cs="Times New Roman"/>
@@ -6069,7 +6308,17 @@
                 <w:bCs/>
                 <w:color w:val="auto"/>
               </w:rPr>
-              <w:t>DoctorID (PK)</w:t>
+              <w:t>DoctorID</w:t>
+            </w:r>
+            <w:proofErr w:type="spellEnd"/>
+            <w:r>
+              <w:rPr>
+                <w:rFonts w:ascii="Times New Roman" w:hAnsi="Times New Roman" w:cs="Times New Roman"/>
+                <w:b/>
+                <w:bCs/>
+                <w:color w:val="auto"/>
+              </w:rPr>
+              <w:t xml:space="preserve"> (PK)</w:t>
             </w:r>
             <w:r>
               <w:rPr>
@@ -6078,6 +6327,7 @@
               </w:rPr>
               <w:t xml:space="preserve">, FirstName, LastName, Phone, </w:t>
             </w:r>
+            <w:proofErr w:type="spellStart"/>
             <w:r>
               <w:rPr>
                 <w:rFonts w:ascii="Times New Roman" w:hAnsi="Times New Roman" w:cs="Times New Roman"/>
@@ -6085,7 +6335,17 @@
                 <w:bCs/>
                 <w:color w:val="auto"/>
               </w:rPr>
-              <w:t>DepartmentID (FK)</w:t>
+              <w:t>DepartmentID</w:t>
+            </w:r>
+            <w:proofErr w:type="spellEnd"/>
+            <w:r>
+              <w:rPr>
+                <w:rFonts w:ascii="Times New Roman" w:hAnsi="Times New Roman" w:cs="Times New Roman"/>
+                <w:b/>
+                <w:bCs/>
+                <w:color w:val="auto"/>
+              </w:rPr>
+              <w:t xml:space="preserve"> (FK)</w:t>
             </w:r>
           </w:p>
         </w:tc>
@@ -6109,6 +6369,7 @@
                 <w:color w:val="auto"/>
               </w:rPr>
             </w:pPr>
+            <w:proofErr w:type="spellStart"/>
             <w:r>
               <w:rPr>
                 <w:rFonts w:ascii="Times New Roman" w:hAnsi="Times New Roman" w:cs="Times New Roman"/>
@@ -6116,6 +6377,7 @@
               </w:rPr>
               <w:t>GeneralPractitioner</w:t>
             </w:r>
+            <w:proofErr w:type="spellEnd"/>
           </w:p>
         </w:tc>
         <w:tc>
@@ -6137,6 +6399,7 @@
                 <w:color w:val="auto"/>
               </w:rPr>
             </w:pPr>
+            <w:proofErr w:type="spellStart"/>
             <w:r>
               <w:rPr>
                 <w:rFonts w:ascii="Times New Roman" w:hAnsi="Times New Roman" w:cs="Times New Roman"/>
@@ -6144,7 +6407,17 @@
                 <w:bCs/>
                 <w:color w:val="auto"/>
               </w:rPr>
-              <w:t>DoctorID (PK, FK)</w:t>
+              <w:t>DoctorID</w:t>
+            </w:r>
+            <w:proofErr w:type="spellEnd"/>
+            <w:r>
+              <w:rPr>
+                <w:rFonts w:ascii="Times New Roman" w:hAnsi="Times New Roman" w:cs="Times New Roman"/>
+                <w:b/>
+                <w:bCs/>
+                <w:color w:val="auto"/>
+              </w:rPr>
+              <w:t xml:space="preserve"> (PK, FK)</w:t>
             </w:r>
           </w:p>
         </w:tc>
@@ -6194,6 +6467,7 @@
                 <w:color w:val="auto"/>
               </w:rPr>
             </w:pPr>
+            <w:proofErr w:type="spellStart"/>
             <w:r>
               <w:rPr>
                 <w:rFonts w:ascii="Times New Roman" w:hAnsi="Times New Roman" w:cs="Times New Roman"/>
@@ -6201,7 +6475,17 @@
                 <w:bCs/>
                 <w:color w:val="auto"/>
               </w:rPr>
-              <w:t>DoctorID (PK, FK)</w:t>
+              <w:t>DoctorID</w:t>
+            </w:r>
+            <w:proofErr w:type="spellEnd"/>
+            <w:r>
+              <w:rPr>
+                <w:rFonts w:ascii="Times New Roman" w:hAnsi="Times New Roman" w:cs="Times New Roman"/>
+                <w:b/>
+                <w:bCs/>
+                <w:color w:val="auto"/>
+              </w:rPr>
+              <w:t xml:space="preserve"> (PK, FK)</w:t>
             </w:r>
             <w:r>
               <w:rPr>
@@ -6258,6 +6542,7 @@
                 <w:color w:val="auto"/>
               </w:rPr>
             </w:pPr>
+            <w:proofErr w:type="spellStart"/>
             <w:r>
               <w:rPr>
                 <w:rFonts w:ascii="Times New Roman" w:hAnsi="Times New Roman" w:cs="Times New Roman"/>
@@ -6265,15 +6550,9 @@
                 <w:bCs/>
                 <w:color w:val="auto"/>
               </w:rPr>
-              <w:t>AppointmentID (PK)</w:t>
+              <w:t>AppointmentID</w:t>
             </w:r>
-            <w:r>
-              <w:rPr>
-                <w:rFonts w:ascii="Times New Roman" w:hAnsi="Times New Roman" w:cs="Times New Roman"/>
-                <w:color w:val="auto"/>
-              </w:rPr>
-              <w:t xml:space="preserve">, AppointmentDate, Status, </w:t>
-            </w:r>
+            <w:proofErr w:type="spellEnd"/>
             <w:r>
               <w:rPr>
                 <w:rFonts w:ascii="Times New Roman" w:hAnsi="Times New Roman" w:cs="Times New Roman"/>
@@ -6281,7 +6560,7 @@
                 <w:bCs/>
                 <w:color w:val="auto"/>
               </w:rPr>
-              <w:t>PatientID (FK)</w:t>
+              <w:t xml:space="preserve"> (PK)</w:t>
             </w:r>
             <w:r>
               <w:rPr>
@@ -6290,6 +6569,23 @@
               </w:rPr>
               <w:t xml:space="preserve">, </w:t>
             </w:r>
+            <w:proofErr w:type="spellStart"/>
+            <w:r>
+              <w:rPr>
+                <w:rFonts w:ascii="Times New Roman" w:hAnsi="Times New Roman" w:cs="Times New Roman"/>
+                <w:color w:val="auto"/>
+              </w:rPr>
+              <w:t>AppointmentDate</w:t>
+            </w:r>
+            <w:proofErr w:type="spellEnd"/>
+            <w:r>
+              <w:rPr>
+                <w:rFonts w:ascii="Times New Roman" w:hAnsi="Times New Roman" w:cs="Times New Roman"/>
+                <w:color w:val="auto"/>
+              </w:rPr>
+              <w:t xml:space="preserve">, Status, </w:t>
+            </w:r>
+            <w:proofErr w:type="spellStart"/>
             <w:r>
               <w:rPr>
                 <w:rFonts w:ascii="Times New Roman" w:hAnsi="Times New Roman" w:cs="Times New Roman"/>
@@ -6297,7 +6593,44 @@
                 <w:bCs/>
                 <w:color w:val="auto"/>
               </w:rPr>
-              <w:t>DoctorID (FK)</w:t>
+              <w:t>PatientID</w:t>
+            </w:r>
+            <w:proofErr w:type="spellEnd"/>
+            <w:r>
+              <w:rPr>
+                <w:rFonts w:ascii="Times New Roman" w:hAnsi="Times New Roman" w:cs="Times New Roman"/>
+                <w:b/>
+                <w:bCs/>
+                <w:color w:val="auto"/>
+              </w:rPr>
+              <w:t xml:space="preserve"> (FK)</w:t>
+            </w:r>
+            <w:r>
+              <w:rPr>
+                <w:rFonts w:ascii="Times New Roman" w:hAnsi="Times New Roman" w:cs="Times New Roman"/>
+                <w:color w:val="auto"/>
+              </w:rPr>
+              <w:t xml:space="preserve">, </w:t>
+            </w:r>
+            <w:proofErr w:type="spellStart"/>
+            <w:r>
+              <w:rPr>
+                <w:rFonts w:ascii="Times New Roman" w:hAnsi="Times New Roman" w:cs="Times New Roman"/>
+                <w:b/>
+                <w:bCs/>
+                <w:color w:val="auto"/>
+              </w:rPr>
+              <w:t>DoctorID</w:t>
+            </w:r>
+            <w:proofErr w:type="spellEnd"/>
+            <w:r>
+              <w:rPr>
+                <w:rFonts w:ascii="Times New Roman" w:hAnsi="Times New Roman" w:cs="Times New Roman"/>
+                <w:b/>
+                <w:bCs/>
+                <w:color w:val="auto"/>
+              </w:rPr>
+              <w:t xml:space="preserve"> (FK)</w:t>
             </w:r>
           </w:p>
         </w:tc>
@@ -6347,6 +6680,7 @@
                 <w:color w:val="auto"/>
               </w:rPr>
             </w:pPr>
+            <w:proofErr w:type="spellStart"/>
             <w:r>
               <w:rPr>
                 <w:rFonts w:ascii="Times New Roman" w:hAnsi="Times New Roman" w:cs="Times New Roman"/>
@@ -6354,7 +6688,17 @@
                 <w:bCs/>
                 <w:color w:val="auto"/>
               </w:rPr>
-              <w:t>TreatmentID (PK)</w:t>
+              <w:t>TreatmentID</w:t>
+            </w:r>
+            <w:proofErr w:type="spellEnd"/>
+            <w:r>
+              <w:rPr>
+                <w:rFonts w:ascii="Times New Roman" w:hAnsi="Times New Roman" w:cs="Times New Roman"/>
+                <w:b/>
+                <w:bCs/>
+                <w:color w:val="auto"/>
+              </w:rPr>
+              <w:t xml:space="preserve"> (PK)</w:t>
             </w:r>
             <w:r>
               <w:rPr>
@@ -6363,6 +6707,7 @@
               </w:rPr>
               <w:t xml:space="preserve">, Diagnosis, </w:t>
             </w:r>
+            <w:proofErr w:type="spellStart"/>
             <w:r>
               <w:rPr>
                 <w:rFonts w:ascii="Times New Roman" w:hAnsi="Times New Roman" w:cs="Times New Roman"/>
@@ -6370,7 +6715,17 @@
                 <w:bCs/>
                 <w:color w:val="auto"/>
               </w:rPr>
-              <w:t>AppointmentID (FK)</w:t>
+              <w:t>AppointmentID</w:t>
+            </w:r>
+            <w:proofErr w:type="spellEnd"/>
+            <w:r>
+              <w:rPr>
+                <w:rFonts w:ascii="Times New Roman" w:hAnsi="Times New Roman" w:cs="Times New Roman"/>
+                <w:b/>
+                <w:bCs/>
+                <w:color w:val="auto"/>
+              </w:rPr>
+              <w:t xml:space="preserve"> (FK)</w:t>
             </w:r>
           </w:p>
         </w:tc>
@@ -6420,6 +6775,7 @@
                 <w:color w:val="auto"/>
               </w:rPr>
             </w:pPr>
+            <w:proofErr w:type="spellStart"/>
             <w:r>
               <w:rPr>
                 <w:rFonts w:ascii="Times New Roman" w:hAnsi="Times New Roman" w:cs="Times New Roman"/>
@@ -6427,15 +6783,9 @@
                 <w:bCs/>
                 <w:color w:val="auto"/>
               </w:rPr>
-              <w:t>PaymentID (PK)</w:t>
+              <w:t>PaymentID</w:t>
             </w:r>
-            <w:r>
-              <w:rPr>
-                <w:rFonts w:ascii="Times New Roman" w:hAnsi="Times New Roman" w:cs="Times New Roman"/>
-                <w:color w:val="auto"/>
-              </w:rPr>
-              <w:t xml:space="preserve">, Amount, PaymentMethod, </w:t>
-            </w:r>
+            <w:proofErr w:type="spellEnd"/>
             <w:r>
               <w:rPr>
                 <w:rFonts w:ascii="Times New Roman" w:hAnsi="Times New Roman" w:cs="Times New Roman"/>
@@ -6443,7 +6793,50 @@
                 <w:bCs/>
                 <w:color w:val="auto"/>
               </w:rPr>
-              <w:t>AppointmentID (FK</w:t>
+              <w:t xml:space="preserve"> (PK)</w:t>
+            </w:r>
+            <w:r>
+              <w:rPr>
+                <w:rFonts w:ascii="Times New Roman" w:hAnsi="Times New Roman" w:cs="Times New Roman"/>
+                <w:color w:val="auto"/>
+              </w:rPr>
+              <w:t xml:space="preserve">, Amount, </w:t>
+            </w:r>
+            <w:proofErr w:type="spellStart"/>
+            <w:r>
+              <w:rPr>
+                <w:rFonts w:ascii="Times New Roman" w:hAnsi="Times New Roman" w:cs="Times New Roman"/>
+                <w:color w:val="auto"/>
+              </w:rPr>
+              <w:t>PaymentMethod</w:t>
+            </w:r>
+            <w:proofErr w:type="spellEnd"/>
+            <w:r>
+              <w:rPr>
+                <w:rFonts w:ascii="Times New Roman" w:hAnsi="Times New Roman" w:cs="Times New Roman"/>
+                <w:color w:val="auto"/>
+              </w:rPr>
+              <w:t xml:space="preserve">, </w:t>
+            </w:r>
+            <w:proofErr w:type="spellStart"/>
+            <w:r>
+              <w:rPr>
+                <w:rFonts w:ascii="Times New Roman" w:hAnsi="Times New Roman" w:cs="Times New Roman"/>
+                <w:b/>
+                <w:bCs/>
+                <w:color w:val="auto"/>
+              </w:rPr>
+              <w:t>AppointmentID</w:t>
+            </w:r>
+            <w:proofErr w:type="spellEnd"/>
+            <w:r>
+              <w:rPr>
+                <w:rFonts w:ascii="Times New Roman" w:hAnsi="Times New Roman" w:cs="Times New Roman"/>
+                <w:b/>
+                <w:bCs/>
+                <w:color w:val="auto"/>
+              </w:rPr>
+              <w:t xml:space="preserve"> (FK</w:t>
             </w:r>
             <w:r>
               <w:rPr>
@@ -7771,7 +8164,27 @@
           <w:sz w:val="24"/>
           <w:szCs w:val="24"/>
         </w:rPr>
-        <w:t xml:space="preserve">(DepartmentID </w:t>
+        <w:t>(</w:t>
+      </w:r>
+      <w:proofErr w:type="spellStart"/>
+      <w:r>
+        <w:rPr>
+          <w:rFonts w:ascii="Times New Roman" w:hAnsi="Times New Roman" w:cs="Times New Roman"/>
+          <w:color w:val="auto"/>
+          <w:sz w:val="24"/>
+          <w:szCs w:val="24"/>
+        </w:rPr>
+        <w:t>DepartmentID</w:t>
+      </w:r>
+      <w:proofErr w:type="spellEnd"/>
+      <w:r>
+        <w:rPr>
+          <w:rFonts w:ascii="Times New Roman" w:hAnsi="Times New Roman" w:cs="Times New Roman"/>
+          <w:color w:val="auto"/>
+          <w:sz w:val="24"/>
+          <w:szCs w:val="24"/>
+        </w:rPr>
+        <w:t xml:space="preserve"> </w:t>
       </w:r>
       <w:r>
         <w:rPr>
@@ -7791,7 +8204,27 @@
           <w:sz w:val="24"/>
           <w:szCs w:val="24"/>
         </w:rPr>
-        <w:t>, DepartmentName)</w:t>
+        <w:t xml:space="preserve">, </w:t>
+      </w:r>
+      <w:proofErr w:type="spellStart"/>
+      <w:r>
+        <w:rPr>
+          <w:rFonts w:ascii="Times New Roman" w:hAnsi="Times New Roman" w:cs="Times New Roman"/>
+          <w:color w:val="auto"/>
+          <w:sz w:val="24"/>
+          <w:szCs w:val="24"/>
+        </w:rPr>
+        <w:t>DepartmentName</w:t>
+      </w:r>
+      <w:proofErr w:type="spellEnd"/>
+      <w:r>
+        <w:rPr>
+          <w:rFonts w:ascii="Times New Roman" w:hAnsi="Times New Roman" w:cs="Times New Roman"/>
+          <w:color w:val="auto"/>
+          <w:sz w:val="24"/>
+          <w:szCs w:val="24"/>
+        </w:rPr>
+        <w:t>)</w:t>
       </w:r>
     </w:p>
     <w:p>
@@ -7842,7 +8275,27 @@
           <w:sz w:val="24"/>
           <w:szCs w:val="24"/>
         </w:rPr>
-        <w:t xml:space="preserve"> (PatientID </w:t>
+        <w:t xml:space="preserve"> (</w:t>
+      </w:r>
+      <w:proofErr w:type="spellStart"/>
+      <w:r>
+        <w:rPr>
+          <w:rFonts w:ascii="Times New Roman" w:hAnsi="Times New Roman" w:cs="Times New Roman"/>
+          <w:color w:val="auto"/>
+          <w:sz w:val="24"/>
+          <w:szCs w:val="24"/>
+        </w:rPr>
+        <w:t>PatientID</w:t>
+      </w:r>
+      <w:proofErr w:type="spellEnd"/>
+      <w:r>
+        <w:rPr>
+          <w:rFonts w:ascii="Times New Roman" w:hAnsi="Times New Roman" w:cs="Times New Roman"/>
+          <w:color w:val="auto"/>
+          <w:sz w:val="24"/>
+          <w:szCs w:val="24"/>
+        </w:rPr>
+        <w:t xml:space="preserve"> </w:t>
       </w:r>
       <w:r>
         <w:rPr>
@@ -7913,7 +8366,27 @@
           <w:sz w:val="24"/>
           <w:szCs w:val="24"/>
         </w:rPr>
-        <w:t xml:space="preserve"> (DoctorID </w:t>
+        <w:t xml:space="preserve"> (</w:t>
+      </w:r>
+      <w:proofErr w:type="spellStart"/>
+      <w:r>
+        <w:rPr>
+          <w:rFonts w:ascii="Times New Roman" w:hAnsi="Times New Roman" w:cs="Times New Roman"/>
+          <w:color w:val="auto"/>
+          <w:sz w:val="24"/>
+          <w:szCs w:val="24"/>
+        </w:rPr>
+        <w:t>DoctorID</w:t>
+      </w:r>
+      <w:proofErr w:type="spellEnd"/>
+      <w:r>
+        <w:rPr>
+          <w:rFonts w:ascii="Times New Roman" w:hAnsi="Times New Roman" w:cs="Times New Roman"/>
+          <w:color w:val="auto"/>
+          <w:sz w:val="24"/>
+          <w:szCs w:val="24"/>
+        </w:rPr>
+        <w:t xml:space="preserve"> </w:t>
       </w:r>
       <w:r>
         <w:rPr>
@@ -7933,7 +8406,27 @@
           <w:sz w:val="24"/>
           <w:szCs w:val="24"/>
         </w:rPr>
-        <w:t xml:space="preserve">, FirstName, LastName, Phone, DepartmentID </w:t>
+        <w:t xml:space="preserve">, FirstName, LastName, Phone, </w:t>
+      </w:r>
+      <w:proofErr w:type="spellStart"/>
+      <w:r>
+        <w:rPr>
+          <w:rFonts w:ascii="Times New Roman" w:hAnsi="Times New Roman" w:cs="Times New Roman"/>
+          <w:color w:val="auto"/>
+          <w:sz w:val="24"/>
+          <w:szCs w:val="24"/>
+        </w:rPr>
+        <w:t>DepartmentID</w:t>
+      </w:r>
+      <w:proofErr w:type="spellEnd"/>
+      <w:r>
+        <w:rPr>
+          <w:rFonts w:ascii="Times New Roman" w:hAnsi="Times New Roman" w:cs="Times New Roman"/>
+          <w:color w:val="auto"/>
+          <w:sz w:val="24"/>
+          <w:szCs w:val="24"/>
+        </w:rPr>
+        <w:t xml:space="preserve"> </w:t>
       </w:r>
       <w:r>
         <w:rPr>
@@ -7986,6 +8479,7 @@
           <w:szCs w:val="24"/>
         </w:rPr>
       </w:pPr>
+      <w:proofErr w:type="spellStart"/>
       <w:r>
         <w:rPr>
           <w:rFonts w:ascii="Times New Roman" w:hAnsi="Times New Roman" w:cs="Times New Roman"/>
@@ -7997,14 +8491,35 @@
         </w:rPr>
         <w:t>GeneralPractitioner</w:t>
       </w:r>
-      <w:r>
-        <w:rPr>
-          <w:rFonts w:ascii="Times New Roman" w:hAnsi="Times New Roman" w:cs="Times New Roman"/>
-          <w:color w:val="auto"/>
-          <w:sz w:val="24"/>
-          <w:szCs w:val="24"/>
-        </w:rPr>
-        <w:t xml:space="preserve"> (DoctorID </w:t>
+      <w:proofErr w:type="spellEnd"/>
+      <w:r>
+        <w:rPr>
+          <w:rFonts w:ascii="Times New Roman" w:hAnsi="Times New Roman" w:cs="Times New Roman"/>
+          <w:color w:val="auto"/>
+          <w:sz w:val="24"/>
+          <w:szCs w:val="24"/>
+        </w:rPr>
+        <w:t xml:space="preserve"> (</w:t>
+      </w:r>
+      <w:proofErr w:type="spellStart"/>
+      <w:r>
+        <w:rPr>
+          <w:rFonts w:ascii="Times New Roman" w:hAnsi="Times New Roman" w:cs="Times New Roman"/>
+          <w:color w:val="auto"/>
+          <w:sz w:val="24"/>
+          <w:szCs w:val="24"/>
+        </w:rPr>
+        <w:t>DoctorID</w:t>
+      </w:r>
+      <w:proofErr w:type="spellEnd"/>
+      <w:r>
+        <w:rPr>
+          <w:rFonts w:ascii="Times New Roman" w:hAnsi="Times New Roman" w:cs="Times New Roman"/>
+          <w:color w:val="auto"/>
+          <w:sz w:val="24"/>
+          <w:szCs w:val="24"/>
+        </w:rPr>
+        <w:t xml:space="preserve"> </w:t>
       </w:r>
       <w:r>
         <w:rPr>
@@ -8075,7 +8590,27 @@
           <w:sz w:val="24"/>
           <w:szCs w:val="24"/>
         </w:rPr>
-        <w:t xml:space="preserve"> (DoctorID </w:t>
+        <w:t xml:space="preserve"> (</w:t>
+      </w:r>
+      <w:proofErr w:type="spellStart"/>
+      <w:r>
+        <w:rPr>
+          <w:rFonts w:ascii="Times New Roman" w:hAnsi="Times New Roman" w:cs="Times New Roman"/>
+          <w:color w:val="auto"/>
+          <w:sz w:val="24"/>
+          <w:szCs w:val="24"/>
+        </w:rPr>
+        <w:t>DoctorID</w:t>
+      </w:r>
+      <w:proofErr w:type="spellEnd"/>
+      <w:r>
+        <w:rPr>
+          <w:rFonts w:ascii="Times New Roman" w:hAnsi="Times New Roman" w:cs="Times New Roman"/>
+          <w:color w:val="auto"/>
+          <w:sz w:val="24"/>
+          <w:szCs w:val="24"/>
+        </w:rPr>
+        <w:t xml:space="preserve"> </w:t>
       </w:r>
       <w:r>
         <w:rPr>
@@ -8146,7 +8681,27 @@
           <w:sz w:val="24"/>
           <w:szCs w:val="24"/>
         </w:rPr>
-        <w:t xml:space="preserve"> (AppointmentID </w:t>
+        <w:t xml:space="preserve"> (</w:t>
+      </w:r>
+      <w:proofErr w:type="spellStart"/>
+      <w:r>
+        <w:rPr>
+          <w:rFonts w:ascii="Times New Roman" w:hAnsi="Times New Roman" w:cs="Times New Roman"/>
+          <w:color w:val="auto"/>
+          <w:sz w:val="24"/>
+          <w:szCs w:val="24"/>
+        </w:rPr>
+        <w:t>AppointmentID</w:t>
+      </w:r>
+      <w:proofErr w:type="spellEnd"/>
+      <w:r>
+        <w:rPr>
+          <w:rFonts w:ascii="Times New Roman" w:hAnsi="Times New Roman" w:cs="Times New Roman"/>
+          <w:color w:val="auto"/>
+          <w:sz w:val="24"/>
+          <w:szCs w:val="24"/>
+        </w:rPr>
+        <w:t xml:space="preserve"> </w:t>
       </w:r>
       <w:r>
         <w:rPr>
@@ -8166,7 +8721,47 @@
           <w:sz w:val="24"/>
           <w:szCs w:val="24"/>
         </w:rPr>
-        <w:t xml:space="preserve">, AppointmentDate, Status, PatientID </w:t>
+        <w:t xml:space="preserve">, </w:t>
+      </w:r>
+      <w:proofErr w:type="spellStart"/>
+      <w:r>
+        <w:rPr>
+          <w:rFonts w:ascii="Times New Roman" w:hAnsi="Times New Roman" w:cs="Times New Roman"/>
+          <w:color w:val="auto"/>
+          <w:sz w:val="24"/>
+          <w:szCs w:val="24"/>
+        </w:rPr>
+        <w:t>AppointmentDate</w:t>
+      </w:r>
+      <w:proofErr w:type="spellEnd"/>
+      <w:r>
+        <w:rPr>
+          <w:rFonts w:ascii="Times New Roman" w:hAnsi="Times New Roman" w:cs="Times New Roman"/>
+          <w:color w:val="auto"/>
+          <w:sz w:val="24"/>
+          <w:szCs w:val="24"/>
+        </w:rPr>
+        <w:t xml:space="preserve">, Status, </w:t>
+      </w:r>
+      <w:proofErr w:type="spellStart"/>
+      <w:r>
+        <w:rPr>
+          <w:rFonts w:ascii="Times New Roman" w:hAnsi="Times New Roman" w:cs="Times New Roman"/>
+          <w:color w:val="auto"/>
+          <w:sz w:val="24"/>
+          <w:szCs w:val="24"/>
+        </w:rPr>
+        <w:t>PatientID</w:t>
+      </w:r>
+      <w:proofErr w:type="spellEnd"/>
+      <w:r>
+        <w:rPr>
+          <w:rFonts w:ascii="Times New Roman" w:hAnsi="Times New Roman" w:cs="Times New Roman"/>
+          <w:color w:val="auto"/>
+          <w:sz w:val="24"/>
+          <w:szCs w:val="24"/>
+        </w:rPr>
+        <w:t xml:space="preserve"> </w:t>
       </w:r>
       <w:r>
         <w:rPr>
@@ -8186,7 +8781,27 @@
           <w:sz w:val="24"/>
           <w:szCs w:val="24"/>
         </w:rPr>
-        <w:t>, DoctorID FK)</w:t>
+        <w:t xml:space="preserve">, </w:t>
+      </w:r>
+      <w:proofErr w:type="spellStart"/>
+      <w:r>
+        <w:rPr>
+          <w:rFonts w:ascii="Times New Roman" w:hAnsi="Times New Roman" w:cs="Times New Roman"/>
+          <w:color w:val="auto"/>
+          <w:sz w:val="24"/>
+          <w:szCs w:val="24"/>
+        </w:rPr>
+        <w:t>DoctorID</w:t>
+      </w:r>
+      <w:proofErr w:type="spellEnd"/>
+      <w:r>
+        <w:rPr>
+          <w:rFonts w:ascii="Times New Roman" w:hAnsi="Times New Roman" w:cs="Times New Roman"/>
+          <w:color w:val="auto"/>
+          <w:sz w:val="24"/>
+          <w:szCs w:val="24"/>
+        </w:rPr>
+        <w:t xml:space="preserve"> FK)</w:t>
       </w:r>
     </w:p>
     <w:p>
@@ -8237,7 +8852,27 @@
           <w:sz w:val="24"/>
           <w:szCs w:val="24"/>
         </w:rPr>
-        <w:t xml:space="preserve"> (TreatmentID </w:t>
+        <w:t xml:space="preserve"> (</w:t>
+      </w:r>
+      <w:proofErr w:type="spellStart"/>
+      <w:r>
+        <w:rPr>
+          <w:rFonts w:ascii="Times New Roman" w:hAnsi="Times New Roman" w:cs="Times New Roman"/>
+          <w:color w:val="auto"/>
+          <w:sz w:val="24"/>
+          <w:szCs w:val="24"/>
+        </w:rPr>
+        <w:t>TreatmentID</w:t>
+      </w:r>
+      <w:proofErr w:type="spellEnd"/>
+      <w:r>
+        <w:rPr>
+          <w:rFonts w:ascii="Times New Roman" w:hAnsi="Times New Roman" w:cs="Times New Roman"/>
+          <w:color w:val="auto"/>
+          <w:sz w:val="24"/>
+          <w:szCs w:val="24"/>
+        </w:rPr>
+        <w:t xml:space="preserve"> </w:t>
       </w:r>
       <w:r>
         <w:rPr>
@@ -8257,7 +8892,27 @@
           <w:sz w:val="24"/>
           <w:szCs w:val="24"/>
         </w:rPr>
-        <w:t xml:space="preserve">, Diagnosis, AppointmentID </w:t>
+        <w:t xml:space="preserve">, Diagnosis, </w:t>
+      </w:r>
+      <w:proofErr w:type="spellStart"/>
+      <w:r>
+        <w:rPr>
+          <w:rFonts w:ascii="Times New Roman" w:hAnsi="Times New Roman" w:cs="Times New Roman"/>
+          <w:color w:val="auto"/>
+          <w:sz w:val="24"/>
+          <w:szCs w:val="24"/>
+        </w:rPr>
+        <w:t>AppointmentID</w:t>
+      </w:r>
+      <w:proofErr w:type="spellEnd"/>
+      <w:r>
+        <w:rPr>
+          <w:rFonts w:ascii="Times New Roman" w:hAnsi="Times New Roman" w:cs="Times New Roman"/>
+          <w:color w:val="auto"/>
+          <w:sz w:val="24"/>
+          <w:szCs w:val="24"/>
+        </w:rPr>
+        <w:t xml:space="preserve"> </w:t>
       </w:r>
       <w:r>
         <w:rPr>
@@ -8328,7 +8983,27 @@
           <w:sz w:val="24"/>
           <w:szCs w:val="24"/>
         </w:rPr>
-        <w:t xml:space="preserve"> (PaymentID </w:t>
+        <w:t xml:space="preserve"> (</w:t>
+      </w:r>
+      <w:proofErr w:type="spellStart"/>
+      <w:r>
+        <w:rPr>
+          <w:rFonts w:ascii="Times New Roman" w:hAnsi="Times New Roman" w:cs="Times New Roman"/>
+          <w:color w:val="auto"/>
+          <w:sz w:val="24"/>
+          <w:szCs w:val="24"/>
+        </w:rPr>
+        <w:t>PaymentID</w:t>
+      </w:r>
+      <w:proofErr w:type="spellEnd"/>
+      <w:r>
+        <w:rPr>
+          <w:rFonts w:ascii="Times New Roman" w:hAnsi="Times New Roman" w:cs="Times New Roman"/>
+          <w:color w:val="auto"/>
+          <w:sz w:val="24"/>
+          <w:szCs w:val="24"/>
+        </w:rPr>
+        <w:t xml:space="preserve"> </w:t>
       </w:r>
       <w:r>
         <w:rPr>
@@ -8348,7 +9023,47 @@
           <w:sz w:val="24"/>
           <w:szCs w:val="24"/>
         </w:rPr>
-        <w:t xml:space="preserve">, Amount, PaymentMethod, AppointmentID </w:t>
+        <w:t xml:space="preserve">, Amount, </w:t>
+      </w:r>
+      <w:proofErr w:type="spellStart"/>
+      <w:r>
+        <w:rPr>
+          <w:rFonts w:ascii="Times New Roman" w:hAnsi="Times New Roman" w:cs="Times New Roman"/>
+          <w:color w:val="auto"/>
+          <w:sz w:val="24"/>
+          <w:szCs w:val="24"/>
+        </w:rPr>
+        <w:t>PaymentMethod</w:t>
+      </w:r>
+      <w:proofErr w:type="spellEnd"/>
+      <w:r>
+        <w:rPr>
+          <w:rFonts w:ascii="Times New Roman" w:hAnsi="Times New Roman" w:cs="Times New Roman"/>
+          <w:color w:val="auto"/>
+          <w:sz w:val="24"/>
+          <w:szCs w:val="24"/>
+        </w:rPr>
+        <w:t xml:space="preserve">, </w:t>
+      </w:r>
+      <w:proofErr w:type="spellStart"/>
+      <w:r>
+        <w:rPr>
+          <w:rFonts w:ascii="Times New Roman" w:hAnsi="Times New Roman" w:cs="Times New Roman"/>
+          <w:color w:val="auto"/>
+          <w:sz w:val="24"/>
+          <w:szCs w:val="24"/>
+        </w:rPr>
+        <w:t>AppointmentID</w:t>
+      </w:r>
+      <w:proofErr w:type="spellEnd"/>
+      <w:r>
+        <w:rPr>
+          <w:rFonts w:ascii="Times New Roman" w:hAnsi="Times New Roman" w:cs="Times New Roman"/>
+          <w:color w:val="auto"/>
+          <w:sz w:val="24"/>
+          <w:szCs w:val="24"/>
+        </w:rPr>
+        <w:t xml:space="preserve"> </w:t>
       </w:r>
       <w:r>
         <w:rPr>
@@ -8660,7 +9375,27 @@
           <w:sz w:val="24"/>
           <w:szCs w:val="24"/>
         </w:rPr>
-        <w:t>CREATE DATABASE SmartClinic;</w:t>
+        <w:t xml:space="preserve">CREATE DATABASE </w:t>
+      </w:r>
+      <w:proofErr w:type="spellStart"/>
+      <w:r>
+        <w:rPr>
+          <w:rFonts w:ascii="Times New Roman" w:hAnsi="Times New Roman" w:cs="Times New Roman"/>
+          <w:color w:val="auto"/>
+          <w:sz w:val="24"/>
+          <w:szCs w:val="24"/>
+        </w:rPr>
+        <w:t>SmartClinic</w:t>
+      </w:r>
+      <w:proofErr w:type="spellEnd"/>
+      <w:r>
+        <w:rPr>
+          <w:rFonts w:ascii="Times New Roman" w:hAnsi="Times New Roman" w:cs="Times New Roman"/>
+          <w:color w:val="auto"/>
+          <w:sz w:val="24"/>
+          <w:szCs w:val="24"/>
+        </w:rPr>
+        <w:t>;</w:t>
       </w:r>
     </w:p>
     <w:p>
@@ -8685,7 +9420,27 @@
           <w:sz w:val="24"/>
           <w:szCs w:val="24"/>
         </w:rPr>
-        <w:t>USE SmartClinic;</w:t>
+        <w:t xml:space="preserve">USE </w:t>
+      </w:r>
+      <w:proofErr w:type="spellStart"/>
+      <w:r>
+        <w:rPr>
+          <w:rFonts w:ascii="Times New Roman" w:hAnsi="Times New Roman" w:cs="Times New Roman"/>
+          <w:color w:val="auto"/>
+          <w:sz w:val="24"/>
+          <w:szCs w:val="24"/>
+        </w:rPr>
+        <w:t>SmartClinic</w:t>
+      </w:r>
+      <w:proofErr w:type="spellEnd"/>
+      <w:r>
+        <w:rPr>
+          <w:rFonts w:ascii="Times New Roman" w:hAnsi="Times New Roman" w:cs="Times New Roman"/>
+          <w:color w:val="auto"/>
+          <w:sz w:val="24"/>
+          <w:szCs w:val="24"/>
+        </w:rPr>
+        <w:t>;</w:t>
       </w:r>
     </w:p>
     <w:p>
@@ -8923,7 +9678,25 @@
           <w:color w:val="auto"/>
           <w:kern w:val="20"/>
         </w:rPr>
-        <w:t xml:space="preserve">    DepartmentID INT PRIMARY KEY,</w:t>
+        <w:t xml:space="preserve">    </w:t>
+      </w:r>
+      <w:proofErr w:type="spellStart"/>
+      <w:r>
+        <w:rPr>
+          <w:rFonts w:ascii="Times New Roman" w:hAnsi="Times New Roman" w:cs="Times New Roman"/>
+          <w:color w:val="auto"/>
+          <w:kern w:val="20"/>
+        </w:rPr>
+        <w:t>DepartmentID</w:t>
+      </w:r>
+      <w:proofErr w:type="spellEnd"/>
+      <w:r>
+        <w:rPr>
+          <w:rFonts w:ascii="Times New Roman" w:hAnsi="Times New Roman" w:cs="Times New Roman"/>
+          <w:color w:val="auto"/>
+          <w:kern w:val="20"/>
+        </w:rPr>
+        <w:t xml:space="preserve"> INT PRIMARY KEY,</w:t>
       </w:r>
     </w:p>
     <w:p>
@@ -8942,7 +9715,43 @@
           <w:color w:val="auto"/>
           <w:kern w:val="20"/>
         </w:rPr>
-        <w:t xml:space="preserve">    DepartmentName VARCHAR(50) NOT NULL UNIQUE</w:t>
+        <w:t xml:space="preserve">    </w:t>
+      </w:r>
+      <w:proofErr w:type="spellStart"/>
+      <w:r>
+        <w:rPr>
+          <w:rFonts w:ascii="Times New Roman" w:hAnsi="Times New Roman" w:cs="Times New Roman"/>
+          <w:color w:val="auto"/>
+          <w:kern w:val="20"/>
+        </w:rPr>
+        <w:t>DepartmentName</w:t>
+      </w:r>
+      <w:proofErr w:type="spellEnd"/>
+      <w:r>
+        <w:rPr>
+          <w:rFonts w:ascii="Times New Roman" w:hAnsi="Times New Roman" w:cs="Times New Roman"/>
+          <w:color w:val="auto"/>
+          <w:kern w:val="20"/>
+        </w:rPr>
+        <w:t xml:space="preserve"> </w:t>
+      </w:r>
+      <w:proofErr w:type="gramStart"/>
+      <w:r>
+        <w:rPr>
+          <w:rFonts w:ascii="Times New Roman" w:hAnsi="Times New Roman" w:cs="Times New Roman"/>
+          <w:color w:val="auto"/>
+          <w:kern w:val="20"/>
+        </w:rPr>
+        <w:t>VARCHAR(</w:t>
+      </w:r>
+      <w:proofErr w:type="gramEnd"/>
+      <w:r>
+        <w:rPr>
+          <w:rFonts w:ascii="Times New Roman" w:hAnsi="Times New Roman" w:cs="Times New Roman"/>
+          <w:color w:val="auto"/>
+          <w:kern w:val="20"/>
+        </w:rPr>
+        <w:t>50) NOT NULL UNIQUE</w:t>
       </w:r>
     </w:p>
     <w:p>
@@ -9055,7 +9864,25 @@
           <w:color w:val="auto"/>
           <w:kern w:val="20"/>
         </w:rPr>
-        <w:t xml:space="preserve">    PatientID INT PRIMARY KEY,</w:t>
+        <w:t xml:space="preserve">    </w:t>
+      </w:r>
+      <w:proofErr w:type="spellStart"/>
+      <w:r>
+        <w:rPr>
+          <w:rFonts w:ascii="Times New Roman" w:hAnsi="Times New Roman" w:cs="Times New Roman"/>
+          <w:color w:val="auto"/>
+          <w:kern w:val="20"/>
+        </w:rPr>
+        <w:t>PatientID</w:t>
+      </w:r>
+      <w:proofErr w:type="spellEnd"/>
+      <w:r>
+        <w:rPr>
+          <w:rFonts w:ascii="Times New Roman" w:hAnsi="Times New Roman" w:cs="Times New Roman"/>
+          <w:color w:val="auto"/>
+          <w:kern w:val="20"/>
+        </w:rPr>
+        <w:t xml:space="preserve"> INT PRIMARY KEY,</w:t>
       </w:r>
     </w:p>
     <w:p>
@@ -9074,7 +9901,25 @@
           <w:color w:val="auto"/>
           <w:kern w:val="20"/>
         </w:rPr>
-        <w:t xml:space="preserve">    FirstName VARCHAR(30) NOT NULL,</w:t>
+        <w:t xml:space="preserve">    FirstName </w:t>
+      </w:r>
+      <w:proofErr w:type="gramStart"/>
+      <w:r>
+        <w:rPr>
+          <w:rFonts w:ascii="Times New Roman" w:hAnsi="Times New Roman" w:cs="Times New Roman"/>
+          <w:color w:val="auto"/>
+          <w:kern w:val="20"/>
+        </w:rPr>
+        <w:t>VARCHAR(</w:t>
+      </w:r>
+      <w:proofErr w:type="gramEnd"/>
+      <w:r>
+        <w:rPr>
+          <w:rFonts w:ascii="Times New Roman" w:hAnsi="Times New Roman" w:cs="Times New Roman"/>
+          <w:color w:val="auto"/>
+          <w:kern w:val="20"/>
+        </w:rPr>
+        <w:t>30) NOT NULL,</w:t>
       </w:r>
     </w:p>
     <w:p>
@@ -9093,7 +9938,25 @@
           <w:color w:val="auto"/>
           <w:kern w:val="20"/>
         </w:rPr>
-        <w:t xml:space="preserve">    LastName VARCHAR(30) NOT NULL,</w:t>
+        <w:t xml:space="preserve">    LastName </w:t>
+      </w:r>
+      <w:proofErr w:type="gramStart"/>
+      <w:r>
+        <w:rPr>
+          <w:rFonts w:ascii="Times New Roman" w:hAnsi="Times New Roman" w:cs="Times New Roman"/>
+          <w:color w:val="auto"/>
+          <w:kern w:val="20"/>
+        </w:rPr>
+        <w:t>VARCHAR(</w:t>
+      </w:r>
+      <w:proofErr w:type="gramEnd"/>
+      <w:r>
+        <w:rPr>
+          <w:rFonts w:ascii="Times New Roman" w:hAnsi="Times New Roman" w:cs="Times New Roman"/>
+          <w:color w:val="auto"/>
+          <w:kern w:val="20"/>
+        </w:rPr>
+        <w:t>30) NOT NULL,</w:t>
       </w:r>
     </w:p>
     <w:p>
@@ -9112,7 +9975,25 @@
           <w:color w:val="auto"/>
           <w:kern w:val="20"/>
         </w:rPr>
-        <w:t xml:space="preserve">    Gender VARCHAR(10) NOT NULL,</w:t>
+        <w:t xml:space="preserve">    Gender </w:t>
+      </w:r>
+      <w:proofErr w:type="gramStart"/>
+      <w:r>
+        <w:rPr>
+          <w:rFonts w:ascii="Times New Roman" w:hAnsi="Times New Roman" w:cs="Times New Roman"/>
+          <w:color w:val="auto"/>
+          <w:kern w:val="20"/>
+        </w:rPr>
+        <w:t>VARCHAR(</w:t>
+      </w:r>
+      <w:proofErr w:type="gramEnd"/>
+      <w:r>
+        <w:rPr>
+          <w:rFonts w:ascii="Times New Roman" w:hAnsi="Times New Roman" w:cs="Times New Roman"/>
+          <w:color w:val="auto"/>
+          <w:kern w:val="20"/>
+        </w:rPr>
+        <w:t>10) NOT NULL,</w:t>
       </w:r>
     </w:p>
     <w:p>
@@ -9131,7 +10012,25 @@
           <w:color w:val="auto"/>
           <w:kern w:val="20"/>
         </w:rPr>
-        <w:t xml:space="preserve">    Phone VARCHAR(15) NOT NULL UNIQUE</w:t>
+        <w:t xml:space="preserve">    Phone </w:t>
+      </w:r>
+      <w:proofErr w:type="gramStart"/>
+      <w:r>
+        <w:rPr>
+          <w:rFonts w:ascii="Times New Roman" w:hAnsi="Times New Roman" w:cs="Times New Roman"/>
+          <w:color w:val="auto"/>
+          <w:kern w:val="20"/>
+        </w:rPr>
+        <w:t>VARCHAR(</w:t>
+      </w:r>
+      <w:proofErr w:type="gramEnd"/>
+      <w:r>
+        <w:rPr>
+          <w:rFonts w:ascii="Times New Roman" w:hAnsi="Times New Roman" w:cs="Times New Roman"/>
+          <w:color w:val="auto"/>
+          <w:kern w:val="20"/>
+        </w:rPr>
+        <w:t>15) NOT NULL UNIQUE</w:t>
       </w:r>
     </w:p>
     <w:p>
@@ -9409,7 +10308,23 @@
           <w:rFonts w:ascii="Times New Roman" w:hAnsi="Times New Roman" w:cs="Times New Roman"/>
           <w:color w:val="auto"/>
         </w:rPr>
-        <w:t xml:space="preserve">    DoctorID INT PRIMARY KEY,</w:t>
+        <w:t xml:space="preserve">    </w:t>
+      </w:r>
+      <w:proofErr w:type="spellStart"/>
+      <w:r>
+        <w:rPr>
+          <w:rFonts w:ascii="Times New Roman" w:hAnsi="Times New Roman" w:cs="Times New Roman"/>
+          <w:color w:val="auto"/>
+        </w:rPr>
+        <w:t>DoctorID</w:t>
+      </w:r>
+      <w:proofErr w:type="spellEnd"/>
+      <w:r>
+        <w:rPr>
+          <w:rFonts w:ascii="Times New Roman" w:hAnsi="Times New Roman" w:cs="Times New Roman"/>
+          <w:color w:val="auto"/>
+        </w:rPr>
+        <w:t xml:space="preserve"> INT PRIMARY KEY,</w:t>
       </w:r>
     </w:p>
     <w:p>
@@ -9430,7 +10345,23 @@
           <w:rFonts w:ascii="Times New Roman" w:hAnsi="Times New Roman" w:cs="Times New Roman"/>
           <w:color w:val="auto"/>
         </w:rPr>
-        <w:t xml:space="preserve">    FirstName VARCHAR(30) NOT NULL,</w:t>
+        <w:t xml:space="preserve">    FirstName </w:t>
+      </w:r>
+      <w:proofErr w:type="gramStart"/>
+      <w:r>
+        <w:rPr>
+          <w:rFonts w:ascii="Times New Roman" w:hAnsi="Times New Roman" w:cs="Times New Roman"/>
+          <w:color w:val="auto"/>
+        </w:rPr>
+        <w:t>VARCHAR(</w:t>
+      </w:r>
+      <w:proofErr w:type="gramEnd"/>
+      <w:r>
+        <w:rPr>
+          <w:rFonts w:ascii="Times New Roman" w:hAnsi="Times New Roman" w:cs="Times New Roman"/>
+          <w:color w:val="auto"/>
+        </w:rPr>
+        <w:t>30) NOT NULL,</w:t>
       </w:r>
     </w:p>
     <w:p>
@@ -9451,7 +10382,23 @@
           <w:rFonts w:ascii="Times New Roman" w:hAnsi="Times New Roman" w:cs="Times New Roman"/>
           <w:color w:val="auto"/>
         </w:rPr>
-        <w:t xml:space="preserve">    LastName VARCHAR(30) NOT NULL,</w:t>
+        <w:t xml:space="preserve">    LastName </w:t>
+      </w:r>
+      <w:proofErr w:type="gramStart"/>
+      <w:r>
+        <w:rPr>
+          <w:rFonts w:ascii="Times New Roman" w:hAnsi="Times New Roman" w:cs="Times New Roman"/>
+          <w:color w:val="auto"/>
+        </w:rPr>
+        <w:t>VARCHAR(</w:t>
+      </w:r>
+      <w:proofErr w:type="gramEnd"/>
+      <w:r>
+        <w:rPr>
+          <w:rFonts w:ascii="Times New Roman" w:hAnsi="Times New Roman" w:cs="Times New Roman"/>
+          <w:color w:val="auto"/>
+        </w:rPr>
+        <w:t>30) NOT NULL,</w:t>
       </w:r>
     </w:p>
     <w:p>
@@ -9472,7 +10419,23 @@
           <w:rFonts w:ascii="Times New Roman" w:hAnsi="Times New Roman" w:cs="Times New Roman"/>
           <w:color w:val="auto"/>
         </w:rPr>
-        <w:t xml:space="preserve">    Phone VARCHAR(15) NOT NULL UNIQUE,</w:t>
+        <w:t xml:space="preserve">    Phone </w:t>
+      </w:r>
+      <w:proofErr w:type="gramStart"/>
+      <w:r>
+        <w:rPr>
+          <w:rFonts w:ascii="Times New Roman" w:hAnsi="Times New Roman" w:cs="Times New Roman"/>
+          <w:color w:val="auto"/>
+        </w:rPr>
+        <w:t>VARCHAR(</w:t>
+      </w:r>
+      <w:proofErr w:type="gramEnd"/>
+      <w:r>
+        <w:rPr>
+          <w:rFonts w:ascii="Times New Roman" w:hAnsi="Times New Roman" w:cs="Times New Roman"/>
+          <w:color w:val="auto"/>
+        </w:rPr>
+        <w:t>15) NOT NULL UNIQUE,</w:t>
       </w:r>
     </w:p>
     <w:p>
@@ -9493,7 +10456,23 @@
           <w:rFonts w:ascii="Times New Roman" w:hAnsi="Times New Roman" w:cs="Times New Roman"/>
           <w:color w:val="auto"/>
         </w:rPr>
-        <w:t xml:space="preserve">    DepartmentID INT NOT NULL,</w:t>
+        <w:t xml:space="preserve">    </w:t>
+      </w:r>
+      <w:proofErr w:type="spellStart"/>
+      <w:r>
+        <w:rPr>
+          <w:rFonts w:ascii="Times New Roman" w:hAnsi="Times New Roman" w:cs="Times New Roman"/>
+          <w:color w:val="auto"/>
+        </w:rPr>
+        <w:t>DepartmentID</w:t>
+      </w:r>
+      <w:proofErr w:type="spellEnd"/>
+      <w:r>
+        <w:rPr>
+          <w:rFonts w:ascii="Times New Roman" w:hAnsi="Times New Roman" w:cs="Times New Roman"/>
+          <w:color w:val="auto"/>
+        </w:rPr>
+        <w:t xml:space="preserve"> INT NOT NULL,</w:t>
       </w:r>
     </w:p>
     <w:p>
@@ -9514,7 +10493,23 @@
           <w:rFonts w:ascii="Times New Roman" w:hAnsi="Times New Roman" w:cs="Times New Roman"/>
           <w:color w:val="auto"/>
         </w:rPr>
-        <w:t xml:space="preserve">    FOREIGN KEY (DepartmentID)</w:t>
+        <w:t xml:space="preserve">    FOREIGN KEY (</w:t>
+      </w:r>
+      <w:proofErr w:type="spellStart"/>
+      <w:r>
+        <w:rPr>
+          <w:rFonts w:ascii="Times New Roman" w:hAnsi="Times New Roman" w:cs="Times New Roman"/>
+          <w:color w:val="auto"/>
+        </w:rPr>
+        <w:t>DepartmentID</w:t>
+      </w:r>
+      <w:proofErr w:type="spellEnd"/>
+      <w:r>
+        <w:rPr>
+          <w:rFonts w:ascii="Times New Roman" w:hAnsi="Times New Roman" w:cs="Times New Roman"/>
+          <w:color w:val="auto"/>
+        </w:rPr>
+        <w:t>)</w:t>
       </w:r>
     </w:p>
     <w:p>
@@ -9535,7 +10530,32 @@
           <w:rFonts w:ascii="Times New Roman" w:hAnsi="Times New Roman" w:cs="Times New Roman"/>
           <w:color w:val="auto"/>
         </w:rPr>
-        <w:t xml:space="preserve">        REFERENCES Department(DepartmentID)</w:t>
+        <w:t xml:space="preserve">        REFERENCES </w:t>
+      </w:r>
+      <w:proofErr w:type="gramStart"/>
+      <w:r>
+        <w:rPr>
+          <w:rFonts w:ascii="Times New Roman" w:hAnsi="Times New Roman" w:cs="Times New Roman"/>
+          <w:color w:val="auto"/>
+        </w:rPr>
+        <w:t>Department(</w:t>
+      </w:r>
+      <w:proofErr w:type="spellStart"/>
+      <w:proofErr w:type="gramEnd"/>
+      <w:r>
+        <w:rPr>
+          <w:rFonts w:ascii="Times New Roman" w:hAnsi="Times New Roman" w:cs="Times New Roman"/>
+          <w:color w:val="auto"/>
+        </w:rPr>
+        <w:t>DepartmentID</w:t>
+      </w:r>
+      <w:proofErr w:type="spellEnd"/>
+      <w:r>
+        <w:rPr>
+          <w:rFonts w:ascii="Times New Roman" w:hAnsi="Times New Roman" w:cs="Times New Roman"/>
+          <w:color w:val="auto"/>
+        </w:rPr>
+        <w:t>)</w:t>
       </w:r>
     </w:p>
     <w:p>
@@ -9600,7 +10620,31 @@
           <w:sz w:val="24"/>
           <w:szCs w:val="24"/>
         </w:rPr>
-        <w:t>Create GeneralPractitioner Table</w:t>
+        <w:t xml:space="preserve">Create </w:t>
+      </w:r>
+      <w:proofErr w:type="spellStart"/>
+      <w:r>
+        <w:rPr>
+          <w:rFonts w:ascii="Times New Roman" w:hAnsi="Times New Roman" w:cs="Times New Roman"/>
+          <w:b/>
+          <w:bCs/>
+          <w:color w:val="auto"/>
+          <w:sz w:val="24"/>
+          <w:szCs w:val="24"/>
+        </w:rPr>
+        <w:t>GeneralPractitioner</w:t>
+      </w:r>
+      <w:proofErr w:type="spellEnd"/>
+      <w:r>
+        <w:rPr>
+          <w:rFonts w:ascii="Times New Roman" w:hAnsi="Times New Roman" w:cs="Times New Roman"/>
+          <w:b/>
+          <w:bCs/>
+          <w:color w:val="auto"/>
+          <w:sz w:val="24"/>
+          <w:szCs w:val="24"/>
+        </w:rPr>
+        <w:t xml:space="preserve"> Table</w:t>
       </w:r>
     </w:p>
     <w:p>
@@ -9637,7 +10681,23 @@
           <w:rFonts w:ascii="Times New Roman" w:hAnsi="Times New Roman" w:cs="Times New Roman"/>
           <w:color w:val="auto"/>
         </w:rPr>
-        <w:t>CREATE TABLE GeneralPractitioner (</w:t>
+        <w:t xml:space="preserve">CREATE TABLE </w:t>
+      </w:r>
+      <w:proofErr w:type="spellStart"/>
+      <w:r>
+        <w:rPr>
+          <w:rFonts w:ascii="Times New Roman" w:hAnsi="Times New Roman" w:cs="Times New Roman"/>
+          <w:color w:val="auto"/>
+        </w:rPr>
+        <w:t>GeneralPractitioner</w:t>
+      </w:r>
+      <w:proofErr w:type="spellEnd"/>
+      <w:r>
+        <w:rPr>
+          <w:rFonts w:ascii="Times New Roman" w:hAnsi="Times New Roman" w:cs="Times New Roman"/>
+          <w:color w:val="auto"/>
+        </w:rPr>
+        <w:t xml:space="preserve"> (</w:t>
       </w:r>
     </w:p>
     <w:p>
@@ -9658,7 +10718,23 @@
           <w:rFonts w:ascii="Times New Roman" w:hAnsi="Times New Roman" w:cs="Times New Roman"/>
           <w:color w:val="auto"/>
         </w:rPr>
-        <w:t xml:space="preserve">    DoctorID INT PRIMARY KEY,</w:t>
+        <w:t xml:space="preserve">    </w:t>
+      </w:r>
+      <w:proofErr w:type="spellStart"/>
+      <w:r>
+        <w:rPr>
+          <w:rFonts w:ascii="Times New Roman" w:hAnsi="Times New Roman" w:cs="Times New Roman"/>
+          <w:color w:val="auto"/>
+        </w:rPr>
+        <w:t>DoctorID</w:t>
+      </w:r>
+      <w:proofErr w:type="spellEnd"/>
+      <w:r>
+        <w:rPr>
+          <w:rFonts w:ascii="Times New Roman" w:hAnsi="Times New Roman" w:cs="Times New Roman"/>
+          <w:color w:val="auto"/>
+        </w:rPr>
+        <w:t xml:space="preserve"> INT PRIMARY KEY,</w:t>
       </w:r>
     </w:p>
     <w:p>
@@ -9679,7 +10755,23 @@
           <w:rFonts w:ascii="Times New Roman" w:hAnsi="Times New Roman" w:cs="Times New Roman"/>
           <w:color w:val="auto"/>
         </w:rPr>
-        <w:t xml:space="preserve">    FOREIGN KEY (DoctorID)</w:t>
+        <w:t xml:space="preserve">    FOREIGN KEY (</w:t>
+      </w:r>
+      <w:proofErr w:type="spellStart"/>
+      <w:r>
+        <w:rPr>
+          <w:rFonts w:ascii="Times New Roman" w:hAnsi="Times New Roman" w:cs="Times New Roman"/>
+          <w:color w:val="auto"/>
+        </w:rPr>
+        <w:t>DoctorID</w:t>
+      </w:r>
+      <w:proofErr w:type="spellEnd"/>
+      <w:r>
+        <w:rPr>
+          <w:rFonts w:ascii="Times New Roman" w:hAnsi="Times New Roman" w:cs="Times New Roman"/>
+          <w:color w:val="auto"/>
+        </w:rPr>
+        <w:t>)</w:t>
       </w:r>
     </w:p>
     <w:p>
@@ -9700,7 +10792,32 @@
           <w:rFonts w:ascii="Times New Roman" w:hAnsi="Times New Roman" w:cs="Times New Roman"/>
           <w:color w:val="auto"/>
         </w:rPr>
-        <w:t xml:space="preserve">        REFERENCES Doctor(DoctorID)</w:t>
+        <w:t xml:space="preserve">        REFERENCES </w:t>
+      </w:r>
+      <w:proofErr w:type="gramStart"/>
+      <w:r>
+        <w:rPr>
+          <w:rFonts w:ascii="Times New Roman" w:hAnsi="Times New Roman" w:cs="Times New Roman"/>
+          <w:color w:val="auto"/>
+        </w:rPr>
+        <w:t>Doctor(</w:t>
+      </w:r>
+      <w:proofErr w:type="spellStart"/>
+      <w:proofErr w:type="gramEnd"/>
+      <w:r>
+        <w:rPr>
+          <w:rFonts w:ascii="Times New Roman" w:hAnsi="Times New Roman" w:cs="Times New Roman"/>
+          <w:color w:val="auto"/>
+        </w:rPr>
+        <w:t>DoctorID</w:t>
+      </w:r>
+      <w:proofErr w:type="spellEnd"/>
+      <w:r>
+        <w:rPr>
+          <w:rFonts w:ascii="Times New Roman" w:hAnsi="Times New Roman" w:cs="Times New Roman"/>
+          <w:color w:val="auto"/>
+        </w:rPr>
+        <w:t>)</w:t>
       </w:r>
     </w:p>
     <w:p>
@@ -9802,6 +10919,793 @@
     </w:p>
     <w:p>
       <w:pPr>
+        <w:pStyle w:val="a"/>
+        <w:numPr>
+          <w:ilvl w:val="0"/>
+          <w:numId w:val="0"/>
+        </w:numPr>
+        <w:ind w:left="576"/>
+        <w:rPr>
+          <w:rFonts w:ascii="Times New Roman" w:hAnsi="Times New Roman" w:cs="Times New Roman"/>
+          <w:color w:val="auto"/>
+          <w:sz w:val="24"/>
+          <w:szCs w:val="24"/>
+        </w:rPr>
+      </w:pPr>
+    </w:p>
+    <w:p>
+      <w:pPr>
+        <w:pStyle w:val="a"/>
+        <w:numPr>
+          <w:ilvl w:val="0"/>
+          <w:numId w:val="0"/>
+        </w:numPr>
+        <w:ind w:left="576"/>
+        <w:rPr>
+          <w:rFonts w:ascii="Times New Roman" w:hAnsi="Times New Roman" w:cs="Times New Roman"/>
+          <w:color w:val="auto"/>
+          <w:sz w:val="24"/>
+          <w:szCs w:val="24"/>
+        </w:rPr>
+      </w:pPr>
+    </w:p>
+    <w:p>
+      <w:pPr>
+        <w:pStyle w:val="a"/>
+        <w:numPr>
+          <w:ilvl w:val="0"/>
+          <w:numId w:val="42"/>
+        </w:numPr>
+        <w:rPr>
+          <w:rFonts w:ascii="Times New Roman" w:hAnsi="Times New Roman" w:cs="Times New Roman"/>
+          <w:b/>
+          <w:bCs/>
+          <w:color w:val="auto"/>
+          <w:sz w:val="24"/>
+          <w:szCs w:val="24"/>
+        </w:rPr>
+      </w:pPr>
+      <w:r>
+        <w:rPr>
+          <w:rFonts w:ascii="Times New Roman" w:hAnsi="Times New Roman" w:cs="Times New Roman"/>
+          <w:b/>
+          <w:bCs/>
+          <w:color w:val="auto"/>
+          <w:sz w:val="24"/>
+          <w:szCs w:val="24"/>
+        </w:rPr>
+        <w:lastRenderedPageBreak/>
+        <w:t>Create Specialist Table</w:t>
+      </w:r>
+    </w:p>
+    <w:p>
+      <w:pPr>
+        <w:pStyle w:val="a"/>
+        <w:numPr>
+          <w:ilvl w:val="0"/>
+          <w:numId w:val="0"/>
+        </w:numPr>
+        <w:rPr>
+          <w:rFonts w:ascii="Times New Roman" w:hAnsi="Times New Roman" w:cs="Times New Roman"/>
+          <w:color w:val="auto"/>
+          <w:sz w:val="22"/>
+          <w:szCs w:val="22"/>
+        </w:rPr>
+      </w:pPr>
+    </w:p>
+    <w:p>
+      <w:pPr>
+        <w:pStyle w:val="a"/>
+        <w:numPr>
+          <w:ilvl w:val="0"/>
+          <w:numId w:val="0"/>
+        </w:numPr>
+        <w:ind w:left="288"/>
+        <w:rPr>
+          <w:rFonts w:ascii="Times New Roman" w:hAnsi="Times New Roman" w:cs="Times New Roman"/>
+          <w:color w:val="auto"/>
+        </w:rPr>
+      </w:pPr>
+      <w:r>
+        <w:rPr>
+          <w:rFonts w:ascii="Times New Roman" w:hAnsi="Times New Roman" w:cs="Times New Roman"/>
+          <w:color w:val="auto"/>
+        </w:rPr>
+        <w:t>CREATE TABLE Specialist (</w:t>
+      </w:r>
+    </w:p>
+    <w:p>
+      <w:pPr>
+        <w:pStyle w:val="a"/>
+        <w:numPr>
+          <w:ilvl w:val="0"/>
+          <w:numId w:val="0"/>
+        </w:numPr>
+        <w:ind w:left="288"/>
+        <w:rPr>
+          <w:rFonts w:ascii="Times New Roman" w:hAnsi="Times New Roman" w:cs="Times New Roman"/>
+          <w:color w:val="auto"/>
+        </w:rPr>
+      </w:pPr>
+      <w:r>
+        <w:rPr>
+          <w:rFonts w:ascii="Times New Roman" w:hAnsi="Times New Roman" w:cs="Times New Roman"/>
+          <w:color w:val="auto"/>
+        </w:rPr>
+        <w:t xml:space="preserve">    </w:t>
+      </w:r>
+      <w:proofErr w:type="spellStart"/>
+      <w:r>
+        <w:rPr>
+          <w:rFonts w:ascii="Times New Roman" w:hAnsi="Times New Roman" w:cs="Times New Roman"/>
+          <w:color w:val="auto"/>
+        </w:rPr>
+        <w:t>DoctorID</w:t>
+      </w:r>
+      <w:proofErr w:type="spellEnd"/>
+      <w:r>
+        <w:rPr>
+          <w:rFonts w:ascii="Times New Roman" w:hAnsi="Times New Roman" w:cs="Times New Roman"/>
+          <w:color w:val="auto"/>
+        </w:rPr>
+        <w:t xml:space="preserve"> INT PRIMARY KEY,</w:t>
+      </w:r>
+    </w:p>
+    <w:p>
+      <w:pPr>
+        <w:pStyle w:val="a"/>
+        <w:numPr>
+          <w:ilvl w:val="0"/>
+          <w:numId w:val="0"/>
+        </w:numPr>
+        <w:ind w:left="288"/>
+        <w:rPr>
+          <w:rFonts w:ascii="Times New Roman" w:hAnsi="Times New Roman" w:cs="Times New Roman"/>
+          <w:color w:val="auto"/>
+        </w:rPr>
+      </w:pPr>
+      <w:r>
+        <w:rPr>
+          <w:rFonts w:ascii="Times New Roman" w:hAnsi="Times New Roman" w:cs="Times New Roman"/>
+          <w:color w:val="auto"/>
+        </w:rPr>
+        <w:t xml:space="preserve">    Specialty </w:t>
+      </w:r>
+      <w:proofErr w:type="gramStart"/>
+      <w:r>
+        <w:rPr>
+          <w:rFonts w:ascii="Times New Roman" w:hAnsi="Times New Roman" w:cs="Times New Roman"/>
+          <w:color w:val="auto"/>
+        </w:rPr>
+        <w:t>VARCHAR(</w:t>
+      </w:r>
+      <w:proofErr w:type="gramEnd"/>
+      <w:r>
+        <w:rPr>
+          <w:rFonts w:ascii="Times New Roman" w:hAnsi="Times New Roman" w:cs="Times New Roman"/>
+          <w:color w:val="auto"/>
+        </w:rPr>
+        <w:t>50) NOT NULL,</w:t>
+      </w:r>
+    </w:p>
+    <w:p>
+      <w:pPr>
+        <w:pStyle w:val="a"/>
+        <w:numPr>
+          <w:ilvl w:val="0"/>
+          <w:numId w:val="0"/>
+        </w:numPr>
+        <w:ind w:left="288"/>
+        <w:rPr>
+          <w:rFonts w:ascii="Times New Roman" w:hAnsi="Times New Roman" w:cs="Times New Roman"/>
+          <w:color w:val="auto"/>
+        </w:rPr>
+      </w:pPr>
+      <w:r>
+        <w:rPr>
+          <w:rFonts w:ascii="Times New Roman" w:hAnsi="Times New Roman" w:cs="Times New Roman"/>
+          <w:color w:val="auto"/>
+        </w:rPr>
+        <w:t xml:space="preserve">    FOREIGN KEY (</w:t>
+      </w:r>
+      <w:proofErr w:type="spellStart"/>
+      <w:r>
+        <w:rPr>
+          <w:rFonts w:ascii="Times New Roman" w:hAnsi="Times New Roman" w:cs="Times New Roman"/>
+          <w:color w:val="auto"/>
+        </w:rPr>
+        <w:t>DoctorID</w:t>
+      </w:r>
+      <w:proofErr w:type="spellEnd"/>
+      <w:r>
+        <w:rPr>
+          <w:rFonts w:ascii="Times New Roman" w:hAnsi="Times New Roman" w:cs="Times New Roman"/>
+          <w:color w:val="auto"/>
+        </w:rPr>
+        <w:t>)</w:t>
+      </w:r>
+    </w:p>
+    <w:p>
+      <w:pPr>
+        <w:pStyle w:val="a"/>
+        <w:numPr>
+          <w:ilvl w:val="0"/>
+          <w:numId w:val="0"/>
+        </w:numPr>
+        <w:ind w:left="288"/>
+        <w:rPr>
+          <w:rFonts w:ascii="Times New Roman" w:hAnsi="Times New Roman" w:cs="Times New Roman"/>
+          <w:color w:val="auto"/>
+        </w:rPr>
+      </w:pPr>
+      <w:r>
+        <w:rPr>
+          <w:rFonts w:ascii="Times New Roman" w:hAnsi="Times New Roman" w:cs="Times New Roman"/>
+          <w:color w:val="auto"/>
+        </w:rPr>
+        <w:t xml:space="preserve">        REFERENCES </w:t>
+      </w:r>
+      <w:proofErr w:type="gramStart"/>
+      <w:r>
+        <w:rPr>
+          <w:rFonts w:ascii="Times New Roman" w:hAnsi="Times New Roman" w:cs="Times New Roman"/>
+          <w:color w:val="auto"/>
+        </w:rPr>
+        <w:t>Doctor(</w:t>
+      </w:r>
+      <w:proofErr w:type="spellStart"/>
+      <w:proofErr w:type="gramEnd"/>
+      <w:r>
+        <w:rPr>
+          <w:rFonts w:ascii="Times New Roman" w:hAnsi="Times New Roman" w:cs="Times New Roman"/>
+          <w:color w:val="auto"/>
+        </w:rPr>
+        <w:t>DoctorID</w:t>
+      </w:r>
+      <w:proofErr w:type="spellEnd"/>
+      <w:r>
+        <w:rPr>
+          <w:rFonts w:ascii="Times New Roman" w:hAnsi="Times New Roman" w:cs="Times New Roman"/>
+          <w:color w:val="auto"/>
+        </w:rPr>
+        <w:t>)</w:t>
+      </w:r>
+    </w:p>
+    <w:p>
+      <w:pPr>
+        <w:pStyle w:val="a"/>
+        <w:numPr>
+          <w:ilvl w:val="0"/>
+          <w:numId w:val="0"/>
+        </w:numPr>
+        <w:ind w:left="288"/>
+        <w:rPr>
+          <w:rFonts w:ascii="Times New Roman" w:hAnsi="Times New Roman" w:cs="Times New Roman"/>
+          <w:color w:val="auto"/>
+        </w:rPr>
+      </w:pPr>
+      <w:r>
+        <w:rPr>
+          <w:rFonts w:ascii="Times New Roman" w:hAnsi="Times New Roman" w:cs="Times New Roman"/>
+          <w:color w:val="auto"/>
+        </w:rPr>
+        <w:t>);</w:t>
+      </w:r>
+    </w:p>
+    <w:p>
+      <w:pPr>
+        <w:pStyle w:val="a"/>
+        <w:numPr>
+          <w:ilvl w:val="0"/>
+          <w:numId w:val="0"/>
+        </w:numPr>
+        <w:ind w:left="288"/>
+        <w:rPr>
+          <w:rFonts w:ascii="Times New Roman" w:hAnsi="Times New Roman" w:cs="Times New Roman"/>
+          <w:color w:val="auto"/>
+          <w:sz w:val="22"/>
+          <w:szCs w:val="22"/>
+        </w:rPr>
+      </w:pPr>
+    </w:p>
+    <w:p>
+      <w:pPr>
+        <w:pStyle w:val="a"/>
+        <w:numPr>
+          <w:ilvl w:val="0"/>
+          <w:numId w:val="42"/>
+        </w:numPr>
+        <w:rPr>
+          <w:rFonts w:ascii="Times New Roman" w:hAnsi="Times New Roman" w:cs="Times New Roman"/>
+          <w:b/>
+          <w:bCs/>
+          <w:color w:val="auto"/>
+          <w:sz w:val="24"/>
+          <w:szCs w:val="24"/>
+        </w:rPr>
+      </w:pPr>
+      <w:r>
+        <w:rPr>
+          <w:rFonts w:ascii="Times New Roman" w:hAnsi="Times New Roman" w:cs="Times New Roman"/>
+          <w:b/>
+          <w:bCs/>
+          <w:color w:val="auto"/>
+          <w:sz w:val="24"/>
+          <w:szCs w:val="24"/>
+        </w:rPr>
+        <w:t>Create Appointment Table</w:t>
+      </w:r>
+    </w:p>
+    <w:p>
+      <w:pPr>
+        <w:pStyle w:val="a"/>
+        <w:numPr>
+          <w:ilvl w:val="0"/>
+          <w:numId w:val="0"/>
+        </w:numPr>
+        <w:rPr>
+          <w:rFonts w:ascii="Times New Roman" w:hAnsi="Times New Roman" w:cs="Times New Roman"/>
+          <w:color w:val="auto"/>
+          <w:sz w:val="22"/>
+          <w:szCs w:val="22"/>
+        </w:rPr>
+      </w:pPr>
+    </w:p>
+    <w:p>
+      <w:pPr>
+        <w:pStyle w:val="a"/>
+        <w:numPr>
+          <w:ilvl w:val="0"/>
+          <w:numId w:val="0"/>
+        </w:numPr>
+        <w:ind w:left="288"/>
+        <w:rPr>
+          <w:rFonts w:ascii="Times New Roman" w:hAnsi="Times New Roman" w:cs="Times New Roman"/>
+          <w:color w:val="auto"/>
+        </w:rPr>
+      </w:pPr>
+      <w:r>
+        <w:rPr>
+          <w:rFonts w:ascii="Times New Roman" w:hAnsi="Times New Roman" w:cs="Times New Roman"/>
+          <w:color w:val="auto"/>
+        </w:rPr>
+        <w:t>CREATE TABLE Appointment (</w:t>
+      </w:r>
+    </w:p>
+    <w:p>
+      <w:pPr>
+        <w:pStyle w:val="a"/>
+        <w:numPr>
+          <w:ilvl w:val="0"/>
+          <w:numId w:val="0"/>
+        </w:numPr>
+        <w:ind w:left="288"/>
+        <w:rPr>
+          <w:rFonts w:ascii="Times New Roman" w:hAnsi="Times New Roman" w:cs="Times New Roman"/>
+          <w:color w:val="auto"/>
+        </w:rPr>
+      </w:pPr>
+      <w:r>
+        <w:rPr>
+          <w:rFonts w:ascii="Times New Roman" w:hAnsi="Times New Roman" w:cs="Times New Roman"/>
+          <w:color w:val="auto"/>
+        </w:rPr>
+        <w:t xml:space="preserve">    </w:t>
+      </w:r>
+      <w:proofErr w:type="spellStart"/>
+      <w:r>
+        <w:rPr>
+          <w:rFonts w:ascii="Times New Roman" w:hAnsi="Times New Roman" w:cs="Times New Roman"/>
+          <w:color w:val="auto"/>
+        </w:rPr>
+        <w:t>AppointmentID</w:t>
+      </w:r>
+      <w:proofErr w:type="spellEnd"/>
+      <w:r>
+        <w:rPr>
+          <w:rFonts w:ascii="Times New Roman" w:hAnsi="Times New Roman" w:cs="Times New Roman"/>
+          <w:color w:val="auto"/>
+        </w:rPr>
+        <w:t xml:space="preserve"> INT PRIMARY KEY,</w:t>
+      </w:r>
+    </w:p>
+    <w:p>
+      <w:pPr>
+        <w:pStyle w:val="a"/>
+        <w:numPr>
+          <w:ilvl w:val="0"/>
+          <w:numId w:val="0"/>
+        </w:numPr>
+        <w:ind w:left="288"/>
+        <w:rPr>
+          <w:rFonts w:ascii="Times New Roman" w:hAnsi="Times New Roman" w:cs="Times New Roman"/>
+          <w:color w:val="auto"/>
+        </w:rPr>
+      </w:pPr>
+      <w:r>
+        <w:rPr>
+          <w:rFonts w:ascii="Times New Roman" w:hAnsi="Times New Roman" w:cs="Times New Roman"/>
+          <w:color w:val="auto"/>
+        </w:rPr>
+        <w:t xml:space="preserve">    </w:t>
+      </w:r>
+      <w:proofErr w:type="spellStart"/>
+      <w:r>
+        <w:rPr>
+          <w:rFonts w:ascii="Times New Roman" w:hAnsi="Times New Roman" w:cs="Times New Roman"/>
+          <w:color w:val="auto"/>
+        </w:rPr>
+        <w:t>AppointmentDate</w:t>
+      </w:r>
+      <w:proofErr w:type="spellEnd"/>
+      <w:r>
+        <w:rPr>
+          <w:rFonts w:ascii="Times New Roman" w:hAnsi="Times New Roman" w:cs="Times New Roman"/>
+          <w:color w:val="auto"/>
+        </w:rPr>
+        <w:t xml:space="preserve"> DATE NOT NULL,</w:t>
+      </w:r>
+    </w:p>
+    <w:p>
+      <w:pPr>
+        <w:pStyle w:val="a"/>
+        <w:numPr>
+          <w:ilvl w:val="0"/>
+          <w:numId w:val="0"/>
+        </w:numPr>
+        <w:ind w:left="288"/>
+        <w:rPr>
+          <w:rFonts w:ascii="Times New Roman" w:hAnsi="Times New Roman" w:cs="Times New Roman"/>
+          <w:color w:val="auto"/>
+        </w:rPr>
+      </w:pPr>
+      <w:r>
+        <w:rPr>
+          <w:rFonts w:ascii="Times New Roman" w:hAnsi="Times New Roman" w:cs="Times New Roman"/>
+          <w:color w:val="auto"/>
+        </w:rPr>
+        <w:t xml:space="preserve">    Status </w:t>
+      </w:r>
+      <w:proofErr w:type="gramStart"/>
+      <w:r>
+        <w:rPr>
+          <w:rFonts w:ascii="Times New Roman" w:hAnsi="Times New Roman" w:cs="Times New Roman"/>
+          <w:color w:val="auto"/>
+        </w:rPr>
+        <w:t>VARCHAR(</w:t>
+      </w:r>
+      <w:proofErr w:type="gramEnd"/>
+      <w:r>
+        <w:rPr>
+          <w:rFonts w:ascii="Times New Roman" w:hAnsi="Times New Roman" w:cs="Times New Roman"/>
+          <w:color w:val="auto"/>
+        </w:rPr>
+        <w:t>20) NOT NULL,</w:t>
+      </w:r>
+    </w:p>
+    <w:p>
+      <w:pPr>
+        <w:pStyle w:val="a"/>
+        <w:numPr>
+          <w:ilvl w:val="0"/>
+          <w:numId w:val="0"/>
+        </w:numPr>
+        <w:ind w:left="288"/>
+        <w:rPr>
+          <w:rFonts w:ascii="Times New Roman" w:hAnsi="Times New Roman" w:cs="Times New Roman"/>
+          <w:color w:val="auto"/>
+        </w:rPr>
+      </w:pPr>
+      <w:r>
+        <w:rPr>
+          <w:rFonts w:ascii="Times New Roman" w:hAnsi="Times New Roman" w:cs="Times New Roman"/>
+          <w:color w:val="auto"/>
+        </w:rPr>
+        <w:t xml:space="preserve">    </w:t>
+      </w:r>
+      <w:proofErr w:type="spellStart"/>
+      <w:r>
+        <w:rPr>
+          <w:rFonts w:ascii="Times New Roman" w:hAnsi="Times New Roman" w:cs="Times New Roman"/>
+          <w:color w:val="auto"/>
+        </w:rPr>
+        <w:t>PatientID</w:t>
+      </w:r>
+      <w:proofErr w:type="spellEnd"/>
+      <w:r>
+        <w:rPr>
+          <w:rFonts w:ascii="Times New Roman" w:hAnsi="Times New Roman" w:cs="Times New Roman"/>
+          <w:color w:val="auto"/>
+        </w:rPr>
+        <w:t xml:space="preserve"> INT NOT NULL,</w:t>
+      </w:r>
+    </w:p>
+    <w:p>
+      <w:pPr>
+        <w:pStyle w:val="a"/>
+        <w:numPr>
+          <w:ilvl w:val="0"/>
+          <w:numId w:val="0"/>
+        </w:numPr>
+        <w:ind w:left="288"/>
+        <w:rPr>
+          <w:rFonts w:ascii="Times New Roman" w:hAnsi="Times New Roman" w:cs="Times New Roman"/>
+          <w:color w:val="auto"/>
+        </w:rPr>
+      </w:pPr>
+      <w:r>
+        <w:rPr>
+          <w:rFonts w:ascii="Times New Roman" w:hAnsi="Times New Roman" w:cs="Times New Roman"/>
+          <w:color w:val="auto"/>
+        </w:rPr>
+        <w:t xml:space="preserve">    </w:t>
+      </w:r>
+      <w:proofErr w:type="spellStart"/>
+      <w:r>
+        <w:rPr>
+          <w:rFonts w:ascii="Times New Roman" w:hAnsi="Times New Roman" w:cs="Times New Roman"/>
+          <w:color w:val="auto"/>
+        </w:rPr>
+        <w:t>DoctorID</w:t>
+      </w:r>
+      <w:proofErr w:type="spellEnd"/>
+      <w:r>
+        <w:rPr>
+          <w:rFonts w:ascii="Times New Roman" w:hAnsi="Times New Roman" w:cs="Times New Roman"/>
+          <w:color w:val="auto"/>
+        </w:rPr>
+        <w:t xml:space="preserve"> INT NOT NULL,</w:t>
+      </w:r>
+    </w:p>
+    <w:p>
+      <w:pPr>
+        <w:pStyle w:val="a"/>
+        <w:numPr>
+          <w:ilvl w:val="0"/>
+          <w:numId w:val="0"/>
+        </w:numPr>
+        <w:ind w:left="288"/>
+        <w:rPr>
+          <w:rFonts w:ascii="Times New Roman" w:hAnsi="Times New Roman" w:cs="Times New Roman"/>
+          <w:color w:val="auto"/>
+        </w:rPr>
+      </w:pPr>
+      <w:r>
+        <w:rPr>
+          <w:rFonts w:ascii="Times New Roman" w:hAnsi="Times New Roman" w:cs="Times New Roman"/>
+          <w:color w:val="auto"/>
+        </w:rPr>
+        <w:t xml:space="preserve">    FOREIGN KEY (</w:t>
+      </w:r>
+      <w:proofErr w:type="spellStart"/>
+      <w:r>
+        <w:rPr>
+          <w:rFonts w:ascii="Times New Roman" w:hAnsi="Times New Roman" w:cs="Times New Roman"/>
+          <w:color w:val="auto"/>
+        </w:rPr>
+        <w:t>PatientID</w:t>
+      </w:r>
+      <w:proofErr w:type="spellEnd"/>
+      <w:r>
+        <w:rPr>
+          <w:rFonts w:ascii="Times New Roman" w:hAnsi="Times New Roman" w:cs="Times New Roman"/>
+          <w:color w:val="auto"/>
+        </w:rPr>
+        <w:t>)</w:t>
+      </w:r>
+    </w:p>
+    <w:p>
+      <w:pPr>
+        <w:pStyle w:val="a"/>
+        <w:numPr>
+          <w:ilvl w:val="0"/>
+          <w:numId w:val="0"/>
+        </w:numPr>
+        <w:ind w:left="288"/>
+        <w:rPr>
+          <w:rFonts w:ascii="Times New Roman" w:hAnsi="Times New Roman" w:cs="Times New Roman"/>
+          <w:color w:val="auto"/>
+        </w:rPr>
+      </w:pPr>
+      <w:r>
+        <w:rPr>
+          <w:rFonts w:ascii="Times New Roman" w:hAnsi="Times New Roman" w:cs="Times New Roman"/>
+          <w:color w:val="auto"/>
+        </w:rPr>
+        <w:t xml:space="preserve">        REFERENCES </w:t>
+      </w:r>
+      <w:proofErr w:type="gramStart"/>
+      <w:r>
+        <w:rPr>
+          <w:rFonts w:ascii="Times New Roman" w:hAnsi="Times New Roman" w:cs="Times New Roman"/>
+          <w:color w:val="auto"/>
+        </w:rPr>
+        <w:t>Patient(</w:t>
+      </w:r>
+      <w:proofErr w:type="spellStart"/>
+      <w:proofErr w:type="gramEnd"/>
+      <w:r>
+        <w:rPr>
+          <w:rFonts w:ascii="Times New Roman" w:hAnsi="Times New Roman" w:cs="Times New Roman"/>
+          <w:color w:val="auto"/>
+        </w:rPr>
+        <w:t>PatientID</w:t>
+      </w:r>
+      <w:proofErr w:type="spellEnd"/>
+      <w:r>
+        <w:rPr>
+          <w:rFonts w:ascii="Times New Roman" w:hAnsi="Times New Roman" w:cs="Times New Roman"/>
+          <w:color w:val="auto"/>
+        </w:rPr>
+        <w:t>),</w:t>
+      </w:r>
+    </w:p>
+    <w:p>
+      <w:pPr>
+        <w:pStyle w:val="a"/>
+        <w:numPr>
+          <w:ilvl w:val="0"/>
+          <w:numId w:val="0"/>
+        </w:numPr>
+        <w:ind w:left="288"/>
+        <w:rPr>
+          <w:rFonts w:ascii="Times New Roman" w:hAnsi="Times New Roman" w:cs="Times New Roman"/>
+          <w:color w:val="auto"/>
+        </w:rPr>
+      </w:pPr>
+      <w:r>
+        <w:rPr>
+          <w:rFonts w:ascii="Times New Roman" w:hAnsi="Times New Roman" w:cs="Times New Roman"/>
+          <w:color w:val="auto"/>
+        </w:rPr>
+        <w:t xml:space="preserve">    FOREIGN KEY (</w:t>
+      </w:r>
+      <w:proofErr w:type="spellStart"/>
+      <w:r>
+        <w:rPr>
+          <w:rFonts w:ascii="Times New Roman" w:hAnsi="Times New Roman" w:cs="Times New Roman"/>
+          <w:color w:val="auto"/>
+        </w:rPr>
+        <w:t>DoctorID</w:t>
+      </w:r>
+      <w:proofErr w:type="spellEnd"/>
+      <w:r>
+        <w:rPr>
+          <w:rFonts w:ascii="Times New Roman" w:hAnsi="Times New Roman" w:cs="Times New Roman"/>
+          <w:color w:val="auto"/>
+        </w:rPr>
+        <w:t>)</w:t>
+      </w:r>
+    </w:p>
+    <w:p>
+      <w:pPr>
+        <w:pStyle w:val="a"/>
+        <w:numPr>
+          <w:ilvl w:val="0"/>
+          <w:numId w:val="0"/>
+        </w:numPr>
+        <w:ind w:left="288"/>
+        <w:rPr>
+          <w:rFonts w:ascii="Times New Roman" w:hAnsi="Times New Roman" w:cs="Times New Roman"/>
+          <w:color w:val="auto"/>
+        </w:rPr>
+      </w:pPr>
+      <w:r>
+        <w:rPr>
+          <w:rFonts w:ascii="Times New Roman" w:hAnsi="Times New Roman" w:cs="Times New Roman"/>
+          <w:color w:val="auto"/>
+        </w:rPr>
+        <w:t xml:space="preserve">        REFERENCES </w:t>
+      </w:r>
+      <w:proofErr w:type="gramStart"/>
+      <w:r>
+        <w:rPr>
+          <w:rFonts w:ascii="Times New Roman" w:hAnsi="Times New Roman" w:cs="Times New Roman"/>
+          <w:color w:val="auto"/>
+        </w:rPr>
+        <w:t>Doctor(</w:t>
+      </w:r>
+      <w:proofErr w:type="spellStart"/>
+      <w:proofErr w:type="gramEnd"/>
+      <w:r>
+        <w:rPr>
+          <w:rFonts w:ascii="Times New Roman" w:hAnsi="Times New Roman" w:cs="Times New Roman"/>
+          <w:color w:val="auto"/>
+        </w:rPr>
+        <w:t>DoctorID</w:t>
+      </w:r>
+      <w:proofErr w:type="spellEnd"/>
+      <w:r>
+        <w:rPr>
+          <w:rFonts w:ascii="Times New Roman" w:hAnsi="Times New Roman" w:cs="Times New Roman"/>
+          <w:color w:val="auto"/>
+        </w:rPr>
+        <w:t>)</w:t>
+      </w:r>
+    </w:p>
+    <w:p>
+      <w:pPr>
+        <w:pStyle w:val="a"/>
+        <w:numPr>
+          <w:ilvl w:val="0"/>
+          <w:numId w:val="0"/>
+        </w:numPr>
+        <w:ind w:left="288"/>
+        <w:rPr>
+          <w:rFonts w:ascii="Times New Roman" w:hAnsi="Times New Roman" w:cs="Times New Roman"/>
+          <w:color w:val="auto"/>
+        </w:rPr>
+      </w:pPr>
+      <w:r>
+        <w:rPr>
+          <w:rFonts w:ascii="Times New Roman" w:hAnsi="Times New Roman" w:cs="Times New Roman"/>
+          <w:color w:val="auto"/>
+        </w:rPr>
+        <w:t>);</w:t>
+      </w:r>
+    </w:p>
+    <w:p>
+      <w:pPr>
+        <w:pStyle w:val="a"/>
+        <w:numPr>
+          <w:ilvl w:val="0"/>
+          <w:numId w:val="0"/>
+        </w:numPr>
+        <w:ind w:left="576"/>
+        <w:rPr>
+          <w:rFonts w:ascii="Times New Roman" w:hAnsi="Times New Roman" w:cs="Times New Roman"/>
+          <w:color w:val="auto"/>
+          <w:sz w:val="24"/>
+          <w:szCs w:val="24"/>
+        </w:rPr>
+      </w:pPr>
+      <w:r>
+        <w:rPr>
+          <w:rFonts w:ascii="Times New Roman" w:hAnsi="Times New Roman" w:cs="Times New Roman"/>
+          <w:noProof/>
+          <w:color w:val="auto"/>
+          <w:sz w:val="22"/>
+          <w:szCs w:val="22"/>
+        </w:rPr>
+        <w:drawing>
+          <wp:inline distT="0" distB="0" distL="0" distR="0" wp14:anchorId="35310348" wp14:editId="3457BA52">
+            <wp:extent cx="4918653" cy="2828925"/>
+            <wp:effectExtent l="0" t="0" r="0" b="0"/>
+            <wp:docPr id="17520789" name="Picture 1"/>
+            <wp:cNvGraphicFramePr>
+              <a:graphicFrameLocks xmlns:a="http://schemas.openxmlformats.org/drawingml/2006/main" noChangeAspect="1"/>
+            </wp:cNvGraphicFramePr>
+            <a:graphic xmlns:a="http://schemas.openxmlformats.org/drawingml/2006/main">
+              <a:graphicData uri="http://schemas.openxmlformats.org/drawingml/2006/picture">
+                <pic:pic xmlns:pic="http://schemas.openxmlformats.org/drawingml/2006/picture">
+                  <pic:nvPicPr>
+                    <pic:cNvPr id="17520789" name=""/>
+                    <pic:cNvPicPr/>
+                  </pic:nvPicPr>
+                  <pic:blipFill>
+                    <a:blip r:embed="rId19"/>
+                    <a:stretch>
+                      <a:fillRect/>
+                    </a:stretch>
+                  </pic:blipFill>
+                  <pic:spPr>
+                    <a:xfrm>
+                      <a:off x="0" y="0"/>
+                      <a:ext cx="4935159" cy="2838418"/>
+                    </a:xfrm>
+                    <a:prstGeom prst="rect">
+                      <a:avLst/>
+                    </a:prstGeom>
+                  </pic:spPr>
+                </pic:pic>
+              </a:graphicData>
+            </a:graphic>
+          </wp:inline>
+        </w:drawing>
+      </w:r>
+    </w:p>
+    <w:p>
+      <w:pPr>
         <w:pStyle w:val="1"/>
       </w:pPr>
       <w:r>
@@ -10257,7 +12161,29 @@
           <w:sz w:val="24"/>
           <w:szCs w:val="24"/>
         </w:rPr>
-        <w:t>SQL Script (.sql)</w:t>
+        <w:t>SQL Script (.</w:t>
+      </w:r>
+      <w:proofErr w:type="spellStart"/>
+      <w:r>
+        <w:rPr>
+          <w:rFonts w:ascii="Times New Roman" w:hAnsi="Times New Roman" w:cs="Times New Roman"/>
+          <w:b/>
+          <w:bCs/>
+          <w:sz w:val="24"/>
+          <w:szCs w:val="24"/>
+        </w:rPr>
+        <w:t>sql</w:t>
+      </w:r>
+      <w:proofErr w:type="spellEnd"/>
+      <w:r>
+        <w:rPr>
+          <w:rFonts w:ascii="Times New Roman" w:hAnsi="Times New Roman" w:cs="Times New Roman"/>
+          <w:b/>
+          <w:bCs/>
+          <w:sz w:val="24"/>
+          <w:szCs w:val="24"/>
+        </w:rPr>
+        <w:t>)</w:t>
       </w:r>
       <w:r>
         <w:rPr>
@@ -10427,7 +12353,25 @@
           <w:sz w:val="24"/>
           <w:szCs w:val="24"/>
         </w:rPr>
-        <w:t>Google Colab notebook (if applicable): [link]</w:t>
+        <w:t xml:space="preserve">Google </w:t>
+      </w:r>
+      <w:proofErr w:type="spellStart"/>
+      <w:r>
+        <w:rPr>
+          <w:rFonts w:ascii="Times New Roman" w:hAnsi="Times New Roman" w:cs="Times New Roman"/>
+          <w:sz w:val="24"/>
+          <w:szCs w:val="24"/>
+        </w:rPr>
+        <w:t>Colab</w:t>
+      </w:r>
+      <w:proofErr w:type="spellEnd"/>
+      <w:r>
+        <w:rPr>
+          <w:rFonts w:ascii="Times New Roman" w:hAnsi="Times New Roman" w:cs="Times New Roman"/>
+          <w:sz w:val="24"/>
+          <w:szCs w:val="24"/>
+        </w:rPr>
+        <w:t xml:space="preserve"> notebook (if applicable): [link]</w:t>
       </w:r>
     </w:p>
     <w:p>
@@ -10460,7 +12404,7 @@
       </w:pPr>
     </w:p>
     <w:sectPr>
-      <w:headerReference w:type="default" r:id="rId19"/>
+      <w:headerReference w:type="default" r:id="rId20"/>
       <w:pgSz w:w="12240" w:h="15840" w:code="1"/>
       <w:pgMar w:top="1080" w:right="720" w:bottom="1800" w:left="3096" w:header="1080" w:footer="720" w:gutter="0"/>
       <w:pgNumType w:start="1"/>
@@ -16791,6 +18735,7 @@
     <w:rsid w:val="006E2B58"/>
     <w:rsid w:val="006E767C"/>
     <w:rsid w:val="007A14E3"/>
+    <w:rsid w:val="008478C4"/>
     <w:rsid w:val="008A4AE7"/>
     <w:rsid w:val="008C7F6D"/>
     <w:rsid w:val="00900C2A"/>
@@ -16817,6 +18762,7 @@
     <w:rsid w:val="00C40158"/>
     <w:rsid w:val="00C77297"/>
     <w:rsid w:val="00CC6F9F"/>
+    <w:rsid w:val="00CD337A"/>
     <w:rsid w:val="00CE38B6"/>
     <w:rsid w:val="00D20A87"/>
     <w:rsid w:val="00D248BA"/>
@@ -16852,7 +18798,7 @@
   <w:themeFontLang w:val="en-GB" w:eastAsia="ja-JP" w:bidi="ar-SA"/>
   <w:clrSchemeMapping w:bg1="light1" w:t1="dark1" w:bg2="light2" w:t2="dark2" w:accent1="accent1" w:accent2="accent2" w:accent3="accent3" w:accent4="accent4" w:accent5="accent5" w:accent6="accent6" w:hyperlink="hyperlink" w:followedHyperlink="followedHyperlink"/>
   <w:decimalSymbol w:val="."/>
-  <w:listSeparator w:val=";"/>
+  <w:listSeparator w:val=","/>
   <w15:chartTrackingRefBased/>
 </w:settings>
 </file>

</xml_diff>

<commit_message>
Treatment and Payment Tables have been added
</commit_message>
<xml_diff>
--- a/Introduction to DB-CS350 Project.docx
+++ b/Introduction to DB-CS350 Project.docx
@@ -11657,6 +11657,7 @@
           <w:color w:val="auto"/>
           <w:sz w:val="24"/>
           <w:szCs w:val="24"/>
+          <w:rtl/>
         </w:rPr>
       </w:pPr>
       <w:r>
@@ -11706,6 +11707,690 @@
     </w:p>
     <w:p>
       <w:pPr>
+        <w:pStyle w:val="a"/>
+        <w:numPr>
+          <w:ilvl w:val="0"/>
+          <w:numId w:val="42"/>
+        </w:numPr>
+        <w:rPr>
+          <w:rFonts w:ascii="Times New Roman" w:hAnsi="Times New Roman" w:cs="Times New Roman"/>
+          <w:b/>
+          <w:bCs/>
+          <w:color w:val="auto"/>
+          <w:sz w:val="24"/>
+          <w:szCs w:val="24"/>
+        </w:rPr>
+      </w:pPr>
+      <w:r>
+        <w:rPr>
+          <w:rFonts w:ascii="Times New Roman" w:hAnsi="Times New Roman" w:cs="Times New Roman"/>
+          <w:b/>
+          <w:bCs/>
+          <w:color w:val="auto"/>
+          <w:sz w:val="24"/>
+          <w:szCs w:val="24"/>
+        </w:rPr>
+        <w:lastRenderedPageBreak/>
+        <w:t>Create Treatment Table</w:t>
+      </w:r>
+    </w:p>
+    <w:p>
+      <w:pPr>
+        <w:pStyle w:val="a"/>
+        <w:numPr>
+          <w:ilvl w:val="0"/>
+          <w:numId w:val="0"/>
+        </w:numPr>
+        <w:ind w:left="288"/>
+        <w:rPr>
+          <w:rFonts w:ascii="Times New Roman" w:hAnsi="Times New Roman" w:cs="Times New Roman"/>
+          <w:color w:val="auto"/>
+          <w:sz w:val="22"/>
+          <w:szCs w:val="22"/>
+        </w:rPr>
+      </w:pPr>
+    </w:p>
+    <w:p>
+      <w:pPr>
+        <w:pStyle w:val="a"/>
+        <w:numPr>
+          <w:ilvl w:val="0"/>
+          <w:numId w:val="0"/>
+        </w:numPr>
+        <w:ind w:left="288"/>
+        <w:rPr>
+          <w:rFonts w:ascii="Times New Roman" w:hAnsi="Times New Roman" w:cs="Times New Roman"/>
+          <w:color w:val="auto"/>
+        </w:rPr>
+      </w:pPr>
+      <w:r>
+        <w:rPr>
+          <w:rFonts w:ascii="Times New Roman" w:hAnsi="Times New Roman" w:cs="Times New Roman"/>
+          <w:color w:val="auto"/>
+        </w:rPr>
+        <w:t>CREATE TABLE Treatment (</w:t>
+      </w:r>
+    </w:p>
+    <w:p>
+      <w:pPr>
+        <w:pStyle w:val="a"/>
+        <w:numPr>
+          <w:ilvl w:val="0"/>
+          <w:numId w:val="0"/>
+        </w:numPr>
+        <w:ind w:left="288"/>
+        <w:rPr>
+          <w:rFonts w:ascii="Times New Roman" w:hAnsi="Times New Roman" w:cs="Times New Roman"/>
+          <w:color w:val="auto"/>
+        </w:rPr>
+      </w:pPr>
+      <w:r>
+        <w:rPr>
+          <w:rFonts w:ascii="Times New Roman" w:hAnsi="Times New Roman" w:cs="Times New Roman"/>
+          <w:color w:val="auto"/>
+        </w:rPr>
+        <w:t xml:space="preserve">    </w:t>
+      </w:r>
+      <w:proofErr w:type="spellStart"/>
+      <w:r>
+        <w:rPr>
+          <w:rFonts w:ascii="Times New Roman" w:hAnsi="Times New Roman" w:cs="Times New Roman"/>
+          <w:color w:val="auto"/>
+        </w:rPr>
+        <w:t>TreatmentID</w:t>
+      </w:r>
+      <w:proofErr w:type="spellEnd"/>
+      <w:r>
+        <w:rPr>
+          <w:rFonts w:ascii="Times New Roman" w:hAnsi="Times New Roman" w:cs="Times New Roman"/>
+          <w:color w:val="auto"/>
+        </w:rPr>
+        <w:t xml:space="preserve"> INT PRIMARY KEY,</w:t>
+      </w:r>
+    </w:p>
+    <w:p>
+      <w:pPr>
+        <w:pStyle w:val="a"/>
+        <w:numPr>
+          <w:ilvl w:val="0"/>
+          <w:numId w:val="0"/>
+        </w:numPr>
+        <w:ind w:left="288"/>
+        <w:rPr>
+          <w:rFonts w:ascii="Times New Roman" w:hAnsi="Times New Roman" w:cs="Times New Roman"/>
+          <w:color w:val="auto"/>
+        </w:rPr>
+      </w:pPr>
+      <w:r>
+        <w:rPr>
+          <w:rFonts w:ascii="Times New Roman" w:hAnsi="Times New Roman" w:cs="Times New Roman"/>
+          <w:color w:val="auto"/>
+        </w:rPr>
+        <w:t xml:space="preserve">    Diagnosis </w:t>
+      </w:r>
+      <w:proofErr w:type="gramStart"/>
+      <w:r>
+        <w:rPr>
+          <w:rFonts w:ascii="Times New Roman" w:hAnsi="Times New Roman" w:cs="Times New Roman"/>
+          <w:color w:val="auto"/>
+        </w:rPr>
+        <w:t>VARCHAR(</w:t>
+      </w:r>
+      <w:proofErr w:type="gramEnd"/>
+      <w:r>
+        <w:rPr>
+          <w:rFonts w:ascii="Times New Roman" w:hAnsi="Times New Roman" w:cs="Times New Roman"/>
+          <w:color w:val="auto"/>
+        </w:rPr>
+        <w:t>100) NOT NULL,</w:t>
+      </w:r>
+    </w:p>
+    <w:p>
+      <w:pPr>
+        <w:pStyle w:val="a"/>
+        <w:numPr>
+          <w:ilvl w:val="0"/>
+          <w:numId w:val="0"/>
+        </w:numPr>
+        <w:ind w:left="288"/>
+        <w:rPr>
+          <w:rFonts w:ascii="Times New Roman" w:hAnsi="Times New Roman" w:cs="Times New Roman"/>
+          <w:color w:val="auto"/>
+        </w:rPr>
+      </w:pPr>
+      <w:r>
+        <w:rPr>
+          <w:rFonts w:ascii="Times New Roman" w:hAnsi="Times New Roman" w:cs="Times New Roman"/>
+          <w:color w:val="auto"/>
+        </w:rPr>
+        <w:t xml:space="preserve">    </w:t>
+      </w:r>
+      <w:proofErr w:type="spellStart"/>
+      <w:r>
+        <w:rPr>
+          <w:rFonts w:ascii="Times New Roman" w:hAnsi="Times New Roman" w:cs="Times New Roman"/>
+          <w:color w:val="auto"/>
+        </w:rPr>
+        <w:t>AppointmentID</w:t>
+      </w:r>
+      <w:proofErr w:type="spellEnd"/>
+      <w:r>
+        <w:rPr>
+          <w:rFonts w:ascii="Times New Roman" w:hAnsi="Times New Roman" w:cs="Times New Roman"/>
+          <w:color w:val="auto"/>
+        </w:rPr>
+        <w:t xml:space="preserve"> INT UNIQUE,</w:t>
+      </w:r>
+    </w:p>
+    <w:p>
+      <w:pPr>
+        <w:pStyle w:val="a"/>
+        <w:numPr>
+          <w:ilvl w:val="0"/>
+          <w:numId w:val="0"/>
+        </w:numPr>
+        <w:ind w:left="288"/>
+        <w:rPr>
+          <w:rFonts w:ascii="Times New Roman" w:hAnsi="Times New Roman" w:cs="Times New Roman"/>
+          <w:color w:val="auto"/>
+        </w:rPr>
+      </w:pPr>
+      <w:r>
+        <w:rPr>
+          <w:rFonts w:ascii="Times New Roman" w:hAnsi="Times New Roman" w:cs="Times New Roman"/>
+          <w:color w:val="auto"/>
+        </w:rPr>
+        <w:t xml:space="preserve">    FOREIGN KEY (</w:t>
+      </w:r>
+      <w:proofErr w:type="spellStart"/>
+      <w:r>
+        <w:rPr>
+          <w:rFonts w:ascii="Times New Roman" w:hAnsi="Times New Roman" w:cs="Times New Roman"/>
+          <w:color w:val="auto"/>
+        </w:rPr>
+        <w:t>AppointmentID</w:t>
+      </w:r>
+      <w:proofErr w:type="spellEnd"/>
+      <w:r>
+        <w:rPr>
+          <w:rFonts w:ascii="Times New Roman" w:hAnsi="Times New Roman" w:cs="Times New Roman"/>
+          <w:color w:val="auto"/>
+        </w:rPr>
+        <w:t>)</w:t>
+      </w:r>
+    </w:p>
+    <w:p>
+      <w:pPr>
+        <w:pStyle w:val="a"/>
+        <w:numPr>
+          <w:ilvl w:val="0"/>
+          <w:numId w:val="0"/>
+        </w:numPr>
+        <w:ind w:left="288"/>
+        <w:rPr>
+          <w:rFonts w:ascii="Times New Roman" w:hAnsi="Times New Roman" w:cs="Times New Roman"/>
+          <w:color w:val="auto"/>
+        </w:rPr>
+      </w:pPr>
+      <w:r>
+        <w:rPr>
+          <w:rFonts w:ascii="Times New Roman" w:hAnsi="Times New Roman" w:cs="Times New Roman"/>
+          <w:color w:val="auto"/>
+        </w:rPr>
+        <w:t xml:space="preserve">        REFERENCES </w:t>
+      </w:r>
+      <w:proofErr w:type="gramStart"/>
+      <w:r>
+        <w:rPr>
+          <w:rFonts w:ascii="Times New Roman" w:hAnsi="Times New Roman" w:cs="Times New Roman"/>
+          <w:color w:val="auto"/>
+        </w:rPr>
+        <w:t>Appointment(</w:t>
+      </w:r>
+      <w:proofErr w:type="spellStart"/>
+      <w:proofErr w:type="gramEnd"/>
+      <w:r>
+        <w:rPr>
+          <w:rFonts w:ascii="Times New Roman" w:hAnsi="Times New Roman" w:cs="Times New Roman"/>
+          <w:color w:val="auto"/>
+        </w:rPr>
+        <w:t>AppointmentID</w:t>
+      </w:r>
+      <w:proofErr w:type="spellEnd"/>
+      <w:r>
+        <w:rPr>
+          <w:rFonts w:ascii="Times New Roman" w:hAnsi="Times New Roman" w:cs="Times New Roman"/>
+          <w:color w:val="auto"/>
+        </w:rPr>
+        <w:t>)</w:t>
+      </w:r>
+    </w:p>
+    <w:p>
+      <w:pPr>
+        <w:pStyle w:val="a"/>
+        <w:numPr>
+          <w:ilvl w:val="0"/>
+          <w:numId w:val="0"/>
+        </w:numPr>
+        <w:ind w:left="288"/>
+        <w:rPr>
+          <w:rFonts w:ascii="Times New Roman" w:hAnsi="Times New Roman" w:cs="Times New Roman"/>
+          <w:color w:val="auto"/>
+        </w:rPr>
+      </w:pPr>
+      <w:r>
+        <w:rPr>
+          <w:rFonts w:ascii="Times New Roman" w:hAnsi="Times New Roman" w:cs="Times New Roman"/>
+          <w:color w:val="auto"/>
+        </w:rPr>
+        <w:t>);</w:t>
+      </w:r>
+    </w:p>
+    <w:p>
+      <w:pPr>
+        <w:pStyle w:val="a"/>
+        <w:numPr>
+          <w:ilvl w:val="0"/>
+          <w:numId w:val="0"/>
+        </w:numPr>
+        <w:ind w:left="288"/>
+        <w:rPr>
+          <w:rFonts w:ascii="Times New Roman" w:hAnsi="Times New Roman" w:cs="Times New Roman"/>
+          <w:color w:val="auto"/>
+        </w:rPr>
+      </w:pPr>
+    </w:p>
+    <w:p>
+      <w:pPr>
+        <w:pStyle w:val="a"/>
+        <w:numPr>
+          <w:ilvl w:val="0"/>
+          <w:numId w:val="42"/>
+        </w:numPr>
+        <w:rPr>
+          <w:rFonts w:ascii="Times New Roman" w:hAnsi="Times New Roman" w:cs="Times New Roman"/>
+          <w:b/>
+          <w:bCs/>
+          <w:color w:val="auto"/>
+          <w:sz w:val="24"/>
+          <w:szCs w:val="24"/>
+        </w:rPr>
+      </w:pPr>
+      <w:r>
+        <w:rPr>
+          <w:rFonts w:ascii="Times New Roman" w:hAnsi="Times New Roman" w:cs="Times New Roman"/>
+          <w:b/>
+          <w:bCs/>
+          <w:color w:val="auto"/>
+          <w:sz w:val="24"/>
+          <w:szCs w:val="24"/>
+        </w:rPr>
+        <w:t>Create Payment Table</w:t>
+      </w:r>
+    </w:p>
+    <w:p>
+      <w:pPr>
+        <w:pStyle w:val="a"/>
+        <w:numPr>
+          <w:ilvl w:val="0"/>
+          <w:numId w:val="0"/>
+        </w:numPr>
+        <w:ind w:left="288"/>
+        <w:rPr>
+          <w:rFonts w:ascii="Times New Roman" w:hAnsi="Times New Roman" w:cs="Times New Roman"/>
+          <w:color w:val="auto"/>
+        </w:rPr>
+      </w:pPr>
+    </w:p>
+    <w:p>
+      <w:pPr>
+        <w:pStyle w:val="a"/>
+        <w:numPr>
+          <w:ilvl w:val="0"/>
+          <w:numId w:val="0"/>
+        </w:numPr>
+        <w:ind w:left="288"/>
+        <w:rPr>
+          <w:rFonts w:ascii="Times New Roman" w:hAnsi="Times New Roman" w:cs="Times New Roman"/>
+          <w:color w:val="auto"/>
+        </w:rPr>
+      </w:pPr>
+      <w:r>
+        <w:rPr>
+          <w:rFonts w:ascii="Times New Roman" w:hAnsi="Times New Roman" w:cs="Times New Roman"/>
+          <w:color w:val="auto"/>
+        </w:rPr>
+        <w:t>CREATE TABLE Payment (</w:t>
+      </w:r>
+    </w:p>
+    <w:p>
+      <w:pPr>
+        <w:pStyle w:val="a"/>
+        <w:numPr>
+          <w:ilvl w:val="0"/>
+          <w:numId w:val="0"/>
+        </w:numPr>
+        <w:ind w:left="288"/>
+        <w:rPr>
+          <w:rFonts w:ascii="Times New Roman" w:hAnsi="Times New Roman" w:cs="Times New Roman"/>
+          <w:color w:val="auto"/>
+        </w:rPr>
+      </w:pPr>
+      <w:r>
+        <w:rPr>
+          <w:rFonts w:ascii="Times New Roman" w:hAnsi="Times New Roman" w:cs="Times New Roman"/>
+          <w:color w:val="auto"/>
+        </w:rPr>
+        <w:t xml:space="preserve">    </w:t>
+      </w:r>
+      <w:proofErr w:type="spellStart"/>
+      <w:r>
+        <w:rPr>
+          <w:rFonts w:ascii="Times New Roman" w:hAnsi="Times New Roman" w:cs="Times New Roman"/>
+          <w:color w:val="auto"/>
+        </w:rPr>
+        <w:t>PaymentID</w:t>
+      </w:r>
+      <w:proofErr w:type="spellEnd"/>
+      <w:r>
+        <w:rPr>
+          <w:rFonts w:ascii="Times New Roman" w:hAnsi="Times New Roman" w:cs="Times New Roman"/>
+          <w:color w:val="auto"/>
+        </w:rPr>
+        <w:t xml:space="preserve"> INT PRIMARY KEY,</w:t>
+      </w:r>
+    </w:p>
+    <w:p>
+      <w:pPr>
+        <w:pStyle w:val="a"/>
+        <w:numPr>
+          <w:ilvl w:val="0"/>
+          <w:numId w:val="0"/>
+        </w:numPr>
+        <w:ind w:left="288"/>
+        <w:rPr>
+          <w:rFonts w:ascii="Times New Roman" w:hAnsi="Times New Roman" w:cs="Times New Roman"/>
+          <w:color w:val="auto"/>
+        </w:rPr>
+      </w:pPr>
+      <w:r>
+        <w:rPr>
+          <w:rFonts w:ascii="Times New Roman" w:hAnsi="Times New Roman" w:cs="Times New Roman"/>
+          <w:color w:val="auto"/>
+        </w:rPr>
+        <w:t xml:space="preserve">    Amount </w:t>
+      </w:r>
+      <w:proofErr w:type="gramStart"/>
+      <w:r>
+        <w:rPr>
+          <w:rFonts w:ascii="Times New Roman" w:hAnsi="Times New Roman" w:cs="Times New Roman"/>
+          <w:color w:val="auto"/>
+        </w:rPr>
+        <w:t>DECIMAL(</w:t>
+      </w:r>
+      <w:proofErr w:type="gramEnd"/>
+      <w:r>
+        <w:rPr>
+          <w:rFonts w:ascii="Times New Roman" w:hAnsi="Times New Roman" w:cs="Times New Roman"/>
+          <w:color w:val="auto"/>
+        </w:rPr>
+        <w:t>8,2) NOT NULL,</w:t>
+      </w:r>
+    </w:p>
+    <w:p>
+      <w:pPr>
+        <w:pStyle w:val="a"/>
+        <w:numPr>
+          <w:ilvl w:val="0"/>
+          <w:numId w:val="0"/>
+        </w:numPr>
+        <w:ind w:left="288"/>
+        <w:rPr>
+          <w:rFonts w:ascii="Times New Roman" w:hAnsi="Times New Roman" w:cs="Times New Roman"/>
+          <w:color w:val="auto"/>
+        </w:rPr>
+      </w:pPr>
+      <w:r>
+        <w:rPr>
+          <w:rFonts w:ascii="Times New Roman" w:hAnsi="Times New Roman" w:cs="Times New Roman"/>
+          <w:color w:val="auto"/>
+        </w:rPr>
+        <w:t xml:space="preserve">    </w:t>
+      </w:r>
+      <w:proofErr w:type="spellStart"/>
+      <w:r>
+        <w:rPr>
+          <w:rFonts w:ascii="Times New Roman" w:hAnsi="Times New Roman" w:cs="Times New Roman"/>
+          <w:color w:val="auto"/>
+        </w:rPr>
+        <w:t>PaymentMethod</w:t>
+      </w:r>
+      <w:proofErr w:type="spellEnd"/>
+      <w:r>
+        <w:rPr>
+          <w:rFonts w:ascii="Times New Roman" w:hAnsi="Times New Roman" w:cs="Times New Roman"/>
+          <w:color w:val="auto"/>
+        </w:rPr>
+        <w:t xml:space="preserve"> </w:t>
+      </w:r>
+      <w:proofErr w:type="gramStart"/>
+      <w:r>
+        <w:rPr>
+          <w:rFonts w:ascii="Times New Roman" w:hAnsi="Times New Roman" w:cs="Times New Roman"/>
+          <w:color w:val="auto"/>
+        </w:rPr>
+        <w:t>VARCHAR(</w:t>
+      </w:r>
+      <w:proofErr w:type="gramEnd"/>
+      <w:r>
+        <w:rPr>
+          <w:rFonts w:ascii="Times New Roman" w:hAnsi="Times New Roman" w:cs="Times New Roman"/>
+          <w:color w:val="auto"/>
+        </w:rPr>
+        <w:t>20) NOT NULL,</w:t>
+      </w:r>
+    </w:p>
+    <w:p>
+      <w:pPr>
+        <w:pStyle w:val="a"/>
+        <w:numPr>
+          <w:ilvl w:val="0"/>
+          <w:numId w:val="0"/>
+        </w:numPr>
+        <w:ind w:left="288"/>
+        <w:rPr>
+          <w:rFonts w:ascii="Times New Roman" w:hAnsi="Times New Roman" w:cs="Times New Roman"/>
+          <w:color w:val="auto"/>
+        </w:rPr>
+      </w:pPr>
+      <w:r>
+        <w:rPr>
+          <w:rFonts w:ascii="Times New Roman" w:hAnsi="Times New Roman" w:cs="Times New Roman"/>
+          <w:color w:val="auto"/>
+        </w:rPr>
+        <w:t xml:space="preserve">    </w:t>
+      </w:r>
+      <w:proofErr w:type="spellStart"/>
+      <w:r>
+        <w:rPr>
+          <w:rFonts w:ascii="Times New Roman" w:hAnsi="Times New Roman" w:cs="Times New Roman"/>
+          <w:color w:val="auto"/>
+        </w:rPr>
+        <w:t>AppointmentID</w:t>
+      </w:r>
+      <w:proofErr w:type="spellEnd"/>
+      <w:r>
+        <w:rPr>
+          <w:rFonts w:ascii="Times New Roman" w:hAnsi="Times New Roman" w:cs="Times New Roman"/>
+          <w:color w:val="auto"/>
+        </w:rPr>
+        <w:t xml:space="preserve"> INT UNIQUE,</w:t>
+      </w:r>
+    </w:p>
+    <w:p>
+      <w:pPr>
+        <w:pStyle w:val="a"/>
+        <w:numPr>
+          <w:ilvl w:val="0"/>
+          <w:numId w:val="0"/>
+        </w:numPr>
+        <w:ind w:left="288"/>
+        <w:rPr>
+          <w:rFonts w:ascii="Times New Roman" w:hAnsi="Times New Roman" w:cs="Times New Roman"/>
+          <w:color w:val="auto"/>
+        </w:rPr>
+      </w:pPr>
+      <w:r>
+        <w:rPr>
+          <w:rFonts w:ascii="Times New Roman" w:hAnsi="Times New Roman" w:cs="Times New Roman"/>
+          <w:color w:val="auto"/>
+        </w:rPr>
+        <w:t xml:space="preserve">    FOREIGN KEY (</w:t>
+      </w:r>
+      <w:proofErr w:type="spellStart"/>
+      <w:r>
+        <w:rPr>
+          <w:rFonts w:ascii="Times New Roman" w:hAnsi="Times New Roman" w:cs="Times New Roman"/>
+          <w:color w:val="auto"/>
+        </w:rPr>
+        <w:t>AppointmentID</w:t>
+      </w:r>
+      <w:proofErr w:type="spellEnd"/>
+      <w:r>
+        <w:rPr>
+          <w:rFonts w:ascii="Times New Roman" w:hAnsi="Times New Roman" w:cs="Times New Roman"/>
+          <w:color w:val="auto"/>
+        </w:rPr>
+        <w:t>)</w:t>
+      </w:r>
+    </w:p>
+    <w:p>
+      <w:pPr>
+        <w:pStyle w:val="a"/>
+        <w:numPr>
+          <w:ilvl w:val="0"/>
+          <w:numId w:val="0"/>
+        </w:numPr>
+        <w:ind w:left="288"/>
+        <w:rPr>
+          <w:rFonts w:ascii="Times New Roman" w:hAnsi="Times New Roman" w:cs="Times New Roman"/>
+          <w:color w:val="auto"/>
+        </w:rPr>
+      </w:pPr>
+      <w:r>
+        <w:rPr>
+          <w:rFonts w:ascii="Times New Roman" w:hAnsi="Times New Roman" w:cs="Times New Roman"/>
+          <w:color w:val="auto"/>
+        </w:rPr>
+        <w:t xml:space="preserve">        REFERENCES </w:t>
+      </w:r>
+      <w:proofErr w:type="gramStart"/>
+      <w:r>
+        <w:rPr>
+          <w:rFonts w:ascii="Times New Roman" w:hAnsi="Times New Roman" w:cs="Times New Roman"/>
+          <w:color w:val="auto"/>
+        </w:rPr>
+        <w:t>Appointment(</w:t>
+      </w:r>
+      <w:proofErr w:type="spellStart"/>
+      <w:proofErr w:type="gramEnd"/>
+      <w:r>
+        <w:rPr>
+          <w:rFonts w:ascii="Times New Roman" w:hAnsi="Times New Roman" w:cs="Times New Roman"/>
+          <w:color w:val="auto"/>
+        </w:rPr>
+        <w:t>AppointmentID</w:t>
+      </w:r>
+      <w:proofErr w:type="spellEnd"/>
+      <w:r>
+        <w:rPr>
+          <w:rFonts w:ascii="Times New Roman" w:hAnsi="Times New Roman" w:cs="Times New Roman"/>
+          <w:color w:val="auto"/>
+        </w:rPr>
+        <w:t>)</w:t>
+      </w:r>
+    </w:p>
+    <w:p>
+      <w:pPr>
+        <w:pStyle w:val="a"/>
+        <w:numPr>
+          <w:ilvl w:val="0"/>
+          <w:numId w:val="0"/>
+        </w:numPr>
+        <w:ind w:left="288"/>
+        <w:rPr>
+          <w:rFonts w:ascii="Times New Roman" w:hAnsi="Times New Roman" w:cs="Times New Roman"/>
+          <w:color w:val="auto"/>
+        </w:rPr>
+      </w:pPr>
+      <w:r>
+        <w:rPr>
+          <w:rFonts w:ascii="Times New Roman" w:hAnsi="Times New Roman" w:cs="Times New Roman"/>
+          <w:color w:val="auto"/>
+        </w:rPr>
+        <w:t>);</w:t>
+      </w:r>
+    </w:p>
+    <w:p>
+      <w:pPr>
+        <w:pStyle w:val="a"/>
+        <w:numPr>
+          <w:ilvl w:val="0"/>
+          <w:numId w:val="0"/>
+        </w:numPr>
+        <w:ind w:left="576"/>
+        <w:rPr>
+          <w:rFonts w:ascii="Times New Roman" w:hAnsi="Times New Roman" w:cs="Times New Roman"/>
+          <w:color w:val="auto"/>
+          <w:sz w:val="24"/>
+          <w:szCs w:val="24"/>
+        </w:rPr>
+      </w:pPr>
+      <w:r>
+        <w:rPr>
+          <w:rFonts w:ascii="Times New Roman" w:hAnsi="Times New Roman" w:cs="Times New Roman"/>
+          <w:noProof/>
+          <w:color w:val="auto"/>
+        </w:rPr>
+        <w:drawing>
+          <wp:inline distT="0" distB="0" distL="0" distR="0" wp14:anchorId="06BE6393" wp14:editId="50FEBF5D">
+            <wp:extent cx="5349240" cy="3199765"/>
+            <wp:effectExtent l="0" t="0" r="3810" b="635"/>
+            <wp:docPr id="423789325" name="Picture 1"/>
+            <wp:cNvGraphicFramePr>
+              <a:graphicFrameLocks xmlns:a="http://schemas.openxmlformats.org/drawingml/2006/main" noChangeAspect="1"/>
+            </wp:cNvGraphicFramePr>
+            <a:graphic xmlns:a="http://schemas.openxmlformats.org/drawingml/2006/main">
+              <a:graphicData uri="http://schemas.openxmlformats.org/drawingml/2006/picture">
+                <pic:pic xmlns:pic="http://schemas.openxmlformats.org/drawingml/2006/picture">
+                  <pic:nvPicPr>
+                    <pic:cNvPr id="423789325" name=""/>
+                    <pic:cNvPicPr/>
+                  </pic:nvPicPr>
+                  <pic:blipFill>
+                    <a:blip r:embed="rId20"/>
+                    <a:stretch>
+                      <a:fillRect/>
+                    </a:stretch>
+                  </pic:blipFill>
+                  <pic:spPr>
+                    <a:xfrm>
+                      <a:off x="0" y="0"/>
+                      <a:ext cx="5349240" cy="3199765"/>
+                    </a:xfrm>
+                    <a:prstGeom prst="rect">
+                      <a:avLst/>
+                    </a:prstGeom>
+                  </pic:spPr>
+                </pic:pic>
+              </a:graphicData>
+            </a:graphic>
+          </wp:inline>
+        </w:drawing>
+      </w:r>
+    </w:p>
+    <w:p>
+      <w:pPr>
         <w:pStyle w:val="1"/>
       </w:pPr>
       <w:r>
@@ -12404,7 +13089,7 @@
       </w:pPr>
     </w:p>
     <w:sectPr>
-      <w:headerReference w:type="default" r:id="rId20"/>
+      <w:headerReference w:type="default" r:id="rId21"/>
       <w:pgSz w:w="12240" w:h="15840" w:code="1"/>
       <w:pgMar w:top="1080" w:right="720" w:bottom="1800" w:left="3096" w:header="1080" w:footer="720" w:gutter="0"/>
       <w:pgNumType w:start="1"/>
@@ -18709,6 +19394,7 @@
     <w:rsid w:val="0022537A"/>
     <w:rsid w:val="002A69BE"/>
     <w:rsid w:val="00324ACF"/>
+    <w:rsid w:val="00341804"/>
     <w:rsid w:val="00351A43"/>
     <w:rsid w:val="00366F01"/>
     <w:rsid w:val="003B34DF"/>
@@ -18772,6 +19458,7 @@
     <w:rsid w:val="00D7353A"/>
     <w:rsid w:val="00D93E49"/>
     <w:rsid w:val="00DC401B"/>
+    <w:rsid w:val="00DD112A"/>
     <w:rsid w:val="00E552F8"/>
     <w:rsid w:val="00E70F80"/>
     <w:rsid w:val="00E9596B"/>
@@ -19605,16 +20292,16 @@
 </file>
 
 <file path=customXml/item2.xml><?xml version="1.0" encoding="utf-8"?>
-<b:Sources xmlns:b="http://schemas.openxmlformats.org/officeDocument/2006/bibliography" SelectedStyle="\APA.XSL" StyleName="APA"/>
-</file>
-
-<file path=customXml/item3.xml><?xml version="1.0" encoding="utf-8"?>
 <?mso-contentType ?>
 <FormTemplates xmlns="http://schemas.microsoft.com/sharepoint/v3/contenttype/forms">
   <Display>DocumentLibraryForm</Display>
   <Edit>AssetEditForm</Edit>
   <New>DocumentLibraryForm</New>
 </FormTemplates>
+</file>
+
+<file path=customXml/item3.xml><?xml version="1.0" encoding="utf-8"?>
+<b:Sources xmlns:b="http://schemas.openxmlformats.org/officeDocument/2006/bibliography" SelectedStyle="\APA.XSL" StyleName="APA"/>
 </file>
 
 <file path=customXml/itemProps1.xml><?xml version="1.0" encoding="utf-8"?>
@@ -19626,17 +20313,17 @@
 </file>
 
 <file path=customXml/itemProps2.xml><?xml version="1.0" encoding="utf-8"?>
+<ds:datastoreItem xmlns:ds="http://schemas.openxmlformats.org/officeDocument/2006/customXml" ds:itemID="{E34C63B7-A026-4A37-9535-4FBB4C03A11D}">
+  <ds:schemaRefs>
+    <ds:schemaRef ds:uri="http://schemas.microsoft.com/sharepoint/v3/contenttype/forms"/>
+  </ds:schemaRefs>
+</ds:datastoreItem>
+</file>
+
+<file path=customXml/itemProps3.xml><?xml version="1.0" encoding="utf-8"?>
 <ds:datastoreItem xmlns:ds="http://schemas.openxmlformats.org/officeDocument/2006/customXml" ds:itemID="{355C5113-D031-41DB-A6D8-43CE1A0E6695}">
   <ds:schemaRefs>
     <ds:schemaRef ds:uri="http://schemas.openxmlformats.org/officeDocument/2006/bibliography"/>
   </ds:schemaRefs>
 </ds:datastoreItem>
-</file>
-
-<file path=customXml/itemProps3.xml><?xml version="1.0" encoding="utf-8"?>
-<ds:datastoreItem xmlns:ds="http://schemas.openxmlformats.org/officeDocument/2006/customXml" ds:itemID="{E34C63B7-A026-4A37-9535-4FBB4C03A11D}">
-  <ds:schemaRefs>
-    <ds:schemaRef ds:uri="http://schemas.microsoft.com/sharepoint/v3/contenttype/forms"/>
-  </ds:schemaRefs>
-</ds:datastoreItem>
 </file>
</xml_diff>

<commit_message>
5 records into Doctor and General Practitioner
</commit_message>
<xml_diff>
--- a/Introduction to DB-CS350 Project.docx
+++ b/Introduction to DB-CS350 Project.docx
@@ -3871,7 +3871,25 @@
           <w:sz w:val="24"/>
           <w:szCs w:val="24"/>
         </w:rPr>
-        <w:t>Task 1 : database design</w:t>
+        <w:t xml:space="preserve">Task </w:t>
+      </w:r>
+      <w:proofErr w:type="gramStart"/>
+      <w:r>
+        <w:rPr>
+          <w:rFonts w:ascii="Times New Roman" w:hAnsi="Times New Roman" w:cs="Times New Roman"/>
+          <w:sz w:val="24"/>
+          <w:szCs w:val="24"/>
+        </w:rPr>
+        <w:t>1 :</w:t>
+      </w:r>
+      <w:proofErr w:type="gramEnd"/>
+      <w:r>
+        <w:rPr>
+          <w:rFonts w:ascii="Times New Roman" w:hAnsi="Times New Roman" w:cs="Times New Roman"/>
+          <w:sz w:val="24"/>
+          <w:szCs w:val="24"/>
+        </w:rPr>
+        <w:t xml:space="preserve"> database design</w:t>
       </w:r>
     </w:p>
     <w:p>
@@ -4200,7 +4218,25 @@
           <w:sz w:val="24"/>
           <w:szCs w:val="24"/>
         </w:rPr>
-        <w:t xml:space="preserve"> to the live report document, GitHub/GitLab repository, and Google Colab notebook (if applicable) in the </w:t>
+        <w:t xml:space="preserve"> to the live report document, GitHub/GitLab repository, and Google </w:t>
+      </w:r>
+      <w:proofErr w:type="spellStart"/>
+      <w:r>
+        <w:rPr>
+          <w:rFonts w:ascii="Times New Roman" w:hAnsi="Times New Roman" w:cs="Times New Roman"/>
+          <w:sz w:val="24"/>
+          <w:szCs w:val="24"/>
+        </w:rPr>
+        <w:t>Colab</w:t>
+      </w:r>
+      <w:proofErr w:type="spellEnd"/>
+      <w:r>
+        <w:rPr>
+          <w:rFonts w:ascii="Times New Roman" w:hAnsi="Times New Roman" w:cs="Times New Roman"/>
+          <w:sz w:val="24"/>
+          <w:szCs w:val="24"/>
+        </w:rPr>
+        <w:t xml:space="preserve"> notebook (if applicable) in the </w:t>
       </w:r>
       <w:r>
         <w:rPr>
@@ -4956,7 +4992,27 @@
           <w:szCs w:val="24"/>
           <w:lang w:val="es-ES"/>
         </w:rPr>
-        <w:t>A complete ER/EER diagram.</w:t>
+        <w:t xml:space="preserve">A complete ER/EER </w:t>
+      </w:r>
+      <w:proofErr w:type="spellStart"/>
+      <w:r>
+        <w:rPr>
+          <w:rFonts w:ascii="Times New Roman" w:hAnsi="Times New Roman" w:cs="Times New Roman"/>
+          <w:sz w:val="24"/>
+          <w:szCs w:val="24"/>
+          <w:lang w:val="es-ES"/>
+        </w:rPr>
+        <w:t>diagram</w:t>
+      </w:r>
+      <w:proofErr w:type="spellEnd"/>
+      <w:r>
+        <w:rPr>
+          <w:rFonts w:ascii="Times New Roman" w:hAnsi="Times New Roman" w:cs="Times New Roman"/>
+          <w:sz w:val="24"/>
+          <w:szCs w:val="24"/>
+          <w:lang w:val="es-ES"/>
+        </w:rPr>
+        <w:t>.</w:t>
       </w:r>
     </w:p>
     <w:p>
@@ -5470,6 +5526,7 @@
           <w:szCs w:val="24"/>
         </w:rPr>
       </w:pPr>
+      <w:proofErr w:type="spellStart"/>
       <w:r>
         <w:rPr>
           <w:rFonts w:ascii="Times New Roman" w:hAnsi="Times New Roman" w:cs="Times New Roman"/>
@@ -5479,6 +5536,7 @@
         </w:rPr>
         <w:t>GeneralPractitioner</w:t>
       </w:r>
+      <w:proofErr w:type="spellEnd"/>
     </w:p>
     <w:p>
       <w:pPr>
@@ -5697,6 +5755,7 @@
           <w:szCs w:val="24"/>
         </w:rPr>
       </w:pPr>
+      <w:proofErr w:type="spellStart"/>
       <w:r>
         <w:rPr>
           <w:rFonts w:ascii="Times New Roman" w:hAnsi="Times New Roman" w:cs="Times New Roman"/>
@@ -5706,6 +5765,7 @@
         </w:rPr>
         <w:t>GeneralPractitioner</w:t>
       </w:r>
+      <w:proofErr w:type="spellEnd"/>
     </w:p>
     <w:p>
       <w:pPr>
@@ -5934,6 +5994,7 @@
                 <w:color w:val="auto"/>
               </w:rPr>
             </w:pPr>
+            <w:proofErr w:type="spellStart"/>
             <w:r>
               <w:rPr>
                 <w:rFonts w:ascii="Times New Roman" w:hAnsi="Times New Roman" w:cs="Times New Roman"/>
@@ -5941,7 +6002,17 @@
                 <w:bCs/>
                 <w:color w:val="auto"/>
               </w:rPr>
-              <w:t>PatientID (PK)</w:t>
+              <w:t>PatientID</w:t>
+            </w:r>
+            <w:proofErr w:type="spellEnd"/>
+            <w:r>
+              <w:rPr>
+                <w:rFonts w:ascii="Times New Roman" w:hAnsi="Times New Roman" w:cs="Times New Roman"/>
+                <w:b/>
+                <w:bCs/>
+                <w:color w:val="auto"/>
+              </w:rPr>
+              <w:t xml:space="preserve"> (PK)</w:t>
             </w:r>
             <w:r>
               <w:rPr>
@@ -5998,6 +6069,7 @@
                 <w:color w:val="auto"/>
               </w:rPr>
             </w:pPr>
+            <w:proofErr w:type="spellStart"/>
             <w:r>
               <w:rPr>
                 <w:rFonts w:ascii="Times New Roman" w:hAnsi="Times New Roman" w:cs="Times New Roman"/>
@@ -6005,15 +6077,34 @@
                 <w:bCs/>
                 <w:color w:val="auto"/>
               </w:rPr>
-              <w:t>DepartmentID (PK)</w:t>
+              <w:t>DepartmentID</w:t>
+            </w:r>
+            <w:proofErr w:type="spellEnd"/>
+            <w:r>
+              <w:rPr>
+                <w:rFonts w:ascii="Times New Roman" w:hAnsi="Times New Roman" w:cs="Times New Roman"/>
+                <w:b/>
+                <w:bCs/>
+                <w:color w:val="auto"/>
+              </w:rPr>
+              <w:t xml:space="preserve"> (PK)</w:t>
             </w:r>
             <w:r>
               <w:rPr>
                 <w:rFonts w:ascii="Times New Roman" w:hAnsi="Times New Roman" w:cs="Times New Roman"/>
                 <w:color w:val="auto"/>
               </w:rPr>
-              <w:t>, DepartmentName</w:t>
+              <w:t xml:space="preserve">, </w:t>
             </w:r>
+            <w:proofErr w:type="spellStart"/>
+            <w:r>
+              <w:rPr>
+                <w:rFonts w:ascii="Times New Roman" w:hAnsi="Times New Roman" w:cs="Times New Roman"/>
+                <w:color w:val="auto"/>
+              </w:rPr>
+              <w:t>DepartmentName</w:t>
+            </w:r>
+            <w:proofErr w:type="spellEnd"/>
           </w:p>
         </w:tc>
       </w:tr>
@@ -6062,6 +6153,7 @@
                 <w:color w:val="auto"/>
               </w:rPr>
             </w:pPr>
+            <w:proofErr w:type="spellStart"/>
             <w:r>
               <w:rPr>
                 <w:rFonts w:ascii="Times New Roman" w:hAnsi="Times New Roman" w:cs="Times New Roman"/>
@@ -6069,7 +6161,17 @@
                 <w:bCs/>
                 <w:color w:val="auto"/>
               </w:rPr>
-              <w:t>DoctorID (PK)</w:t>
+              <w:t>DoctorID</w:t>
+            </w:r>
+            <w:proofErr w:type="spellEnd"/>
+            <w:r>
+              <w:rPr>
+                <w:rFonts w:ascii="Times New Roman" w:hAnsi="Times New Roman" w:cs="Times New Roman"/>
+                <w:b/>
+                <w:bCs/>
+                <w:color w:val="auto"/>
+              </w:rPr>
+              <w:t xml:space="preserve"> (PK)</w:t>
             </w:r>
             <w:r>
               <w:rPr>
@@ -6078,6 +6180,7 @@
               </w:rPr>
               <w:t xml:space="preserve">, FirstName, LastName, Phone, </w:t>
             </w:r>
+            <w:proofErr w:type="spellStart"/>
             <w:r>
               <w:rPr>
                 <w:rFonts w:ascii="Times New Roman" w:hAnsi="Times New Roman" w:cs="Times New Roman"/>
@@ -6085,7 +6188,17 @@
                 <w:bCs/>
                 <w:color w:val="auto"/>
               </w:rPr>
-              <w:t>DepartmentID (FK)</w:t>
+              <w:t>DepartmentID</w:t>
+            </w:r>
+            <w:proofErr w:type="spellEnd"/>
+            <w:r>
+              <w:rPr>
+                <w:rFonts w:ascii="Times New Roman" w:hAnsi="Times New Roman" w:cs="Times New Roman"/>
+                <w:b/>
+                <w:bCs/>
+                <w:color w:val="auto"/>
+              </w:rPr>
+              <w:t xml:space="preserve"> (FK)</w:t>
             </w:r>
           </w:p>
         </w:tc>
@@ -6109,6 +6222,7 @@
                 <w:color w:val="auto"/>
               </w:rPr>
             </w:pPr>
+            <w:proofErr w:type="spellStart"/>
             <w:r>
               <w:rPr>
                 <w:rFonts w:ascii="Times New Roman" w:hAnsi="Times New Roman" w:cs="Times New Roman"/>
@@ -6116,6 +6230,7 @@
               </w:rPr>
               <w:t>GeneralPractitioner</w:t>
             </w:r>
+            <w:proofErr w:type="spellEnd"/>
           </w:p>
         </w:tc>
         <w:tc>
@@ -6137,6 +6252,7 @@
                 <w:color w:val="auto"/>
               </w:rPr>
             </w:pPr>
+            <w:proofErr w:type="spellStart"/>
             <w:r>
               <w:rPr>
                 <w:rFonts w:ascii="Times New Roman" w:hAnsi="Times New Roman" w:cs="Times New Roman"/>
@@ -6144,7 +6260,17 @@
                 <w:bCs/>
                 <w:color w:val="auto"/>
               </w:rPr>
-              <w:t>DoctorID (PK, FK)</w:t>
+              <w:t>DoctorID</w:t>
+            </w:r>
+            <w:proofErr w:type="spellEnd"/>
+            <w:r>
+              <w:rPr>
+                <w:rFonts w:ascii="Times New Roman" w:hAnsi="Times New Roman" w:cs="Times New Roman"/>
+                <w:b/>
+                <w:bCs/>
+                <w:color w:val="auto"/>
+              </w:rPr>
+              <w:t xml:space="preserve"> (PK, FK)</w:t>
             </w:r>
           </w:p>
         </w:tc>
@@ -6194,6 +6320,7 @@
                 <w:color w:val="auto"/>
               </w:rPr>
             </w:pPr>
+            <w:proofErr w:type="spellStart"/>
             <w:r>
               <w:rPr>
                 <w:rFonts w:ascii="Times New Roman" w:hAnsi="Times New Roman" w:cs="Times New Roman"/>
@@ -6201,7 +6328,17 @@
                 <w:bCs/>
                 <w:color w:val="auto"/>
               </w:rPr>
-              <w:t>DoctorID (PK, FK)</w:t>
+              <w:t>DoctorID</w:t>
+            </w:r>
+            <w:proofErr w:type="spellEnd"/>
+            <w:r>
+              <w:rPr>
+                <w:rFonts w:ascii="Times New Roman" w:hAnsi="Times New Roman" w:cs="Times New Roman"/>
+                <w:b/>
+                <w:bCs/>
+                <w:color w:val="auto"/>
+              </w:rPr>
+              <w:t xml:space="preserve"> (PK, FK)</w:t>
             </w:r>
             <w:r>
               <w:rPr>
@@ -6258,6 +6395,7 @@
                 <w:color w:val="auto"/>
               </w:rPr>
             </w:pPr>
+            <w:proofErr w:type="spellStart"/>
             <w:r>
               <w:rPr>
                 <w:rFonts w:ascii="Times New Roman" w:hAnsi="Times New Roman" w:cs="Times New Roman"/>
@@ -6265,15 +6403,9 @@
                 <w:bCs/>
                 <w:color w:val="auto"/>
               </w:rPr>
-              <w:t>AppointmentID (PK)</w:t>
+              <w:t>AppointmentID</w:t>
             </w:r>
-            <w:r>
-              <w:rPr>
-                <w:rFonts w:ascii="Times New Roman" w:hAnsi="Times New Roman" w:cs="Times New Roman"/>
-                <w:color w:val="auto"/>
-              </w:rPr>
-              <w:t xml:space="preserve">, AppointmentDate, Status, </w:t>
-            </w:r>
+            <w:proofErr w:type="spellEnd"/>
             <w:r>
               <w:rPr>
                 <w:rFonts w:ascii="Times New Roman" w:hAnsi="Times New Roman" w:cs="Times New Roman"/>
@@ -6281,7 +6413,7 @@
                 <w:bCs/>
                 <w:color w:val="auto"/>
               </w:rPr>
-              <w:t>PatientID (FK)</w:t>
+              <w:t xml:space="preserve"> (PK)</w:t>
             </w:r>
             <w:r>
               <w:rPr>
@@ -6290,6 +6422,23 @@
               </w:rPr>
               <w:t xml:space="preserve">, </w:t>
             </w:r>
+            <w:proofErr w:type="spellStart"/>
+            <w:r>
+              <w:rPr>
+                <w:rFonts w:ascii="Times New Roman" w:hAnsi="Times New Roman" w:cs="Times New Roman"/>
+                <w:color w:val="auto"/>
+              </w:rPr>
+              <w:t>AppointmentDate</w:t>
+            </w:r>
+            <w:proofErr w:type="spellEnd"/>
+            <w:r>
+              <w:rPr>
+                <w:rFonts w:ascii="Times New Roman" w:hAnsi="Times New Roman" w:cs="Times New Roman"/>
+                <w:color w:val="auto"/>
+              </w:rPr>
+              <w:t xml:space="preserve">, Status, </w:t>
+            </w:r>
+            <w:proofErr w:type="spellStart"/>
             <w:r>
               <w:rPr>
                 <w:rFonts w:ascii="Times New Roman" w:hAnsi="Times New Roman" w:cs="Times New Roman"/>
@@ -6297,7 +6446,44 @@
                 <w:bCs/>
                 <w:color w:val="auto"/>
               </w:rPr>
-              <w:t>DoctorID (FK)</w:t>
+              <w:t>PatientID</w:t>
+            </w:r>
+            <w:proofErr w:type="spellEnd"/>
+            <w:r>
+              <w:rPr>
+                <w:rFonts w:ascii="Times New Roman" w:hAnsi="Times New Roman" w:cs="Times New Roman"/>
+                <w:b/>
+                <w:bCs/>
+                <w:color w:val="auto"/>
+              </w:rPr>
+              <w:t xml:space="preserve"> (FK)</w:t>
+            </w:r>
+            <w:r>
+              <w:rPr>
+                <w:rFonts w:ascii="Times New Roman" w:hAnsi="Times New Roman" w:cs="Times New Roman"/>
+                <w:color w:val="auto"/>
+              </w:rPr>
+              <w:t xml:space="preserve">, </w:t>
+            </w:r>
+            <w:proofErr w:type="spellStart"/>
+            <w:r>
+              <w:rPr>
+                <w:rFonts w:ascii="Times New Roman" w:hAnsi="Times New Roman" w:cs="Times New Roman"/>
+                <w:b/>
+                <w:bCs/>
+                <w:color w:val="auto"/>
+              </w:rPr>
+              <w:t>DoctorID</w:t>
+            </w:r>
+            <w:proofErr w:type="spellEnd"/>
+            <w:r>
+              <w:rPr>
+                <w:rFonts w:ascii="Times New Roman" w:hAnsi="Times New Roman" w:cs="Times New Roman"/>
+                <w:b/>
+                <w:bCs/>
+                <w:color w:val="auto"/>
+              </w:rPr>
+              <w:t xml:space="preserve"> (FK)</w:t>
             </w:r>
           </w:p>
         </w:tc>
@@ -6347,6 +6533,7 @@
                 <w:color w:val="auto"/>
               </w:rPr>
             </w:pPr>
+            <w:proofErr w:type="spellStart"/>
             <w:r>
               <w:rPr>
                 <w:rFonts w:ascii="Times New Roman" w:hAnsi="Times New Roman" w:cs="Times New Roman"/>
@@ -6354,7 +6541,17 @@
                 <w:bCs/>
                 <w:color w:val="auto"/>
               </w:rPr>
-              <w:t>TreatmentID (PK)</w:t>
+              <w:t>TreatmentID</w:t>
+            </w:r>
+            <w:proofErr w:type="spellEnd"/>
+            <w:r>
+              <w:rPr>
+                <w:rFonts w:ascii="Times New Roman" w:hAnsi="Times New Roman" w:cs="Times New Roman"/>
+                <w:b/>
+                <w:bCs/>
+                <w:color w:val="auto"/>
+              </w:rPr>
+              <w:t xml:space="preserve"> (PK)</w:t>
             </w:r>
             <w:r>
               <w:rPr>
@@ -6363,6 +6560,7 @@
               </w:rPr>
               <w:t xml:space="preserve">, Diagnosis, </w:t>
             </w:r>
+            <w:proofErr w:type="spellStart"/>
             <w:r>
               <w:rPr>
                 <w:rFonts w:ascii="Times New Roman" w:hAnsi="Times New Roman" w:cs="Times New Roman"/>
@@ -6370,7 +6568,17 @@
                 <w:bCs/>
                 <w:color w:val="auto"/>
               </w:rPr>
-              <w:t>AppointmentID (FK)</w:t>
+              <w:t>AppointmentID</w:t>
+            </w:r>
+            <w:proofErr w:type="spellEnd"/>
+            <w:r>
+              <w:rPr>
+                <w:rFonts w:ascii="Times New Roman" w:hAnsi="Times New Roman" w:cs="Times New Roman"/>
+                <w:b/>
+                <w:bCs/>
+                <w:color w:val="auto"/>
+              </w:rPr>
+              <w:t xml:space="preserve"> (FK)</w:t>
             </w:r>
           </w:p>
         </w:tc>
@@ -6420,6 +6628,7 @@
                 <w:color w:val="auto"/>
               </w:rPr>
             </w:pPr>
+            <w:proofErr w:type="spellStart"/>
             <w:r>
               <w:rPr>
                 <w:rFonts w:ascii="Times New Roman" w:hAnsi="Times New Roman" w:cs="Times New Roman"/>
@@ -6427,15 +6636,9 @@
                 <w:bCs/>
                 <w:color w:val="auto"/>
               </w:rPr>
-              <w:t>PaymentID (PK)</w:t>
+              <w:t>PaymentID</w:t>
             </w:r>
-            <w:r>
-              <w:rPr>
-                <w:rFonts w:ascii="Times New Roman" w:hAnsi="Times New Roman" w:cs="Times New Roman"/>
-                <w:color w:val="auto"/>
-              </w:rPr>
-              <w:t xml:space="preserve">, Amount, PaymentMethod, </w:t>
-            </w:r>
+            <w:proofErr w:type="spellEnd"/>
             <w:r>
               <w:rPr>
                 <w:rFonts w:ascii="Times New Roman" w:hAnsi="Times New Roman" w:cs="Times New Roman"/>
@@ -6443,7 +6646,50 @@
                 <w:bCs/>
                 <w:color w:val="auto"/>
               </w:rPr>
-              <w:t>AppointmentID (FK</w:t>
+              <w:t xml:space="preserve"> (PK)</w:t>
+            </w:r>
+            <w:r>
+              <w:rPr>
+                <w:rFonts w:ascii="Times New Roman" w:hAnsi="Times New Roman" w:cs="Times New Roman"/>
+                <w:color w:val="auto"/>
+              </w:rPr>
+              <w:t xml:space="preserve">, Amount, </w:t>
+            </w:r>
+            <w:proofErr w:type="spellStart"/>
+            <w:r>
+              <w:rPr>
+                <w:rFonts w:ascii="Times New Roman" w:hAnsi="Times New Roman" w:cs="Times New Roman"/>
+                <w:color w:val="auto"/>
+              </w:rPr>
+              <w:t>PaymentMethod</w:t>
+            </w:r>
+            <w:proofErr w:type="spellEnd"/>
+            <w:r>
+              <w:rPr>
+                <w:rFonts w:ascii="Times New Roman" w:hAnsi="Times New Roman" w:cs="Times New Roman"/>
+                <w:color w:val="auto"/>
+              </w:rPr>
+              <w:t xml:space="preserve">, </w:t>
+            </w:r>
+            <w:proofErr w:type="spellStart"/>
+            <w:r>
+              <w:rPr>
+                <w:rFonts w:ascii="Times New Roman" w:hAnsi="Times New Roman" w:cs="Times New Roman"/>
+                <w:b/>
+                <w:bCs/>
+                <w:color w:val="auto"/>
+              </w:rPr>
+              <w:t>AppointmentID</w:t>
+            </w:r>
+            <w:proofErr w:type="spellEnd"/>
+            <w:r>
+              <w:rPr>
+                <w:rFonts w:ascii="Times New Roman" w:hAnsi="Times New Roman" w:cs="Times New Roman"/>
+                <w:b/>
+                <w:bCs/>
+                <w:color w:val="auto"/>
+              </w:rPr>
+              <w:t xml:space="preserve"> (FK</w:t>
             </w:r>
             <w:r>
               <w:rPr>
@@ -7771,7 +8017,27 @@
           <w:sz w:val="24"/>
           <w:szCs w:val="24"/>
         </w:rPr>
-        <w:t xml:space="preserve">(DepartmentID </w:t>
+        <w:t>(</w:t>
+      </w:r>
+      <w:proofErr w:type="spellStart"/>
+      <w:r>
+        <w:rPr>
+          <w:rFonts w:ascii="Times New Roman" w:hAnsi="Times New Roman" w:cs="Times New Roman"/>
+          <w:color w:val="auto"/>
+          <w:sz w:val="24"/>
+          <w:szCs w:val="24"/>
+        </w:rPr>
+        <w:t>DepartmentID</w:t>
+      </w:r>
+      <w:proofErr w:type="spellEnd"/>
+      <w:r>
+        <w:rPr>
+          <w:rFonts w:ascii="Times New Roman" w:hAnsi="Times New Roman" w:cs="Times New Roman"/>
+          <w:color w:val="auto"/>
+          <w:sz w:val="24"/>
+          <w:szCs w:val="24"/>
+        </w:rPr>
+        <w:t xml:space="preserve"> </w:t>
       </w:r>
       <w:r>
         <w:rPr>
@@ -7791,7 +8057,27 @@
           <w:sz w:val="24"/>
           <w:szCs w:val="24"/>
         </w:rPr>
-        <w:t>, DepartmentName)</w:t>
+        <w:t xml:space="preserve">, </w:t>
+      </w:r>
+      <w:proofErr w:type="spellStart"/>
+      <w:r>
+        <w:rPr>
+          <w:rFonts w:ascii="Times New Roman" w:hAnsi="Times New Roman" w:cs="Times New Roman"/>
+          <w:color w:val="auto"/>
+          <w:sz w:val="24"/>
+          <w:szCs w:val="24"/>
+        </w:rPr>
+        <w:t>DepartmentName</w:t>
+      </w:r>
+      <w:proofErr w:type="spellEnd"/>
+      <w:r>
+        <w:rPr>
+          <w:rFonts w:ascii="Times New Roman" w:hAnsi="Times New Roman" w:cs="Times New Roman"/>
+          <w:color w:val="auto"/>
+          <w:sz w:val="24"/>
+          <w:szCs w:val="24"/>
+        </w:rPr>
+        <w:t>)</w:t>
       </w:r>
     </w:p>
     <w:p>
@@ -7842,7 +8128,27 @@
           <w:sz w:val="24"/>
           <w:szCs w:val="24"/>
         </w:rPr>
-        <w:t xml:space="preserve"> (PatientID </w:t>
+        <w:t xml:space="preserve"> (</w:t>
+      </w:r>
+      <w:proofErr w:type="spellStart"/>
+      <w:r>
+        <w:rPr>
+          <w:rFonts w:ascii="Times New Roman" w:hAnsi="Times New Roman" w:cs="Times New Roman"/>
+          <w:color w:val="auto"/>
+          <w:sz w:val="24"/>
+          <w:szCs w:val="24"/>
+        </w:rPr>
+        <w:t>PatientID</w:t>
+      </w:r>
+      <w:proofErr w:type="spellEnd"/>
+      <w:r>
+        <w:rPr>
+          <w:rFonts w:ascii="Times New Roman" w:hAnsi="Times New Roman" w:cs="Times New Roman"/>
+          <w:color w:val="auto"/>
+          <w:sz w:val="24"/>
+          <w:szCs w:val="24"/>
+        </w:rPr>
+        <w:t xml:space="preserve"> </w:t>
       </w:r>
       <w:r>
         <w:rPr>
@@ -7913,7 +8219,27 @@
           <w:sz w:val="24"/>
           <w:szCs w:val="24"/>
         </w:rPr>
-        <w:t xml:space="preserve"> (DoctorID </w:t>
+        <w:t xml:space="preserve"> (</w:t>
+      </w:r>
+      <w:proofErr w:type="spellStart"/>
+      <w:r>
+        <w:rPr>
+          <w:rFonts w:ascii="Times New Roman" w:hAnsi="Times New Roman" w:cs="Times New Roman"/>
+          <w:color w:val="auto"/>
+          <w:sz w:val="24"/>
+          <w:szCs w:val="24"/>
+        </w:rPr>
+        <w:t>DoctorID</w:t>
+      </w:r>
+      <w:proofErr w:type="spellEnd"/>
+      <w:r>
+        <w:rPr>
+          <w:rFonts w:ascii="Times New Roman" w:hAnsi="Times New Roman" w:cs="Times New Roman"/>
+          <w:color w:val="auto"/>
+          <w:sz w:val="24"/>
+          <w:szCs w:val="24"/>
+        </w:rPr>
+        <w:t xml:space="preserve"> </w:t>
       </w:r>
       <w:r>
         <w:rPr>
@@ -7933,7 +8259,27 @@
           <w:sz w:val="24"/>
           <w:szCs w:val="24"/>
         </w:rPr>
-        <w:t xml:space="preserve">, FirstName, LastName, Phone, DepartmentID </w:t>
+        <w:t xml:space="preserve">, FirstName, LastName, Phone, </w:t>
+      </w:r>
+      <w:proofErr w:type="spellStart"/>
+      <w:r>
+        <w:rPr>
+          <w:rFonts w:ascii="Times New Roman" w:hAnsi="Times New Roman" w:cs="Times New Roman"/>
+          <w:color w:val="auto"/>
+          <w:sz w:val="24"/>
+          <w:szCs w:val="24"/>
+        </w:rPr>
+        <w:t>DepartmentID</w:t>
+      </w:r>
+      <w:proofErr w:type="spellEnd"/>
+      <w:r>
+        <w:rPr>
+          <w:rFonts w:ascii="Times New Roman" w:hAnsi="Times New Roman" w:cs="Times New Roman"/>
+          <w:color w:val="auto"/>
+          <w:sz w:val="24"/>
+          <w:szCs w:val="24"/>
+        </w:rPr>
+        <w:t xml:space="preserve"> </w:t>
       </w:r>
       <w:r>
         <w:rPr>
@@ -7986,6 +8332,7 @@
           <w:szCs w:val="24"/>
         </w:rPr>
       </w:pPr>
+      <w:proofErr w:type="spellStart"/>
       <w:r>
         <w:rPr>
           <w:rFonts w:ascii="Times New Roman" w:hAnsi="Times New Roman" w:cs="Times New Roman"/>
@@ -7997,14 +8344,35 @@
         </w:rPr>
         <w:t>GeneralPractitioner</w:t>
       </w:r>
-      <w:r>
-        <w:rPr>
-          <w:rFonts w:ascii="Times New Roman" w:hAnsi="Times New Roman" w:cs="Times New Roman"/>
-          <w:color w:val="auto"/>
-          <w:sz w:val="24"/>
-          <w:szCs w:val="24"/>
-        </w:rPr>
-        <w:t xml:space="preserve"> (DoctorID </w:t>
+      <w:proofErr w:type="spellEnd"/>
+      <w:r>
+        <w:rPr>
+          <w:rFonts w:ascii="Times New Roman" w:hAnsi="Times New Roman" w:cs="Times New Roman"/>
+          <w:color w:val="auto"/>
+          <w:sz w:val="24"/>
+          <w:szCs w:val="24"/>
+        </w:rPr>
+        <w:t xml:space="preserve"> (</w:t>
+      </w:r>
+      <w:proofErr w:type="spellStart"/>
+      <w:r>
+        <w:rPr>
+          <w:rFonts w:ascii="Times New Roman" w:hAnsi="Times New Roman" w:cs="Times New Roman"/>
+          <w:color w:val="auto"/>
+          <w:sz w:val="24"/>
+          <w:szCs w:val="24"/>
+        </w:rPr>
+        <w:t>DoctorID</w:t>
+      </w:r>
+      <w:proofErr w:type="spellEnd"/>
+      <w:r>
+        <w:rPr>
+          <w:rFonts w:ascii="Times New Roman" w:hAnsi="Times New Roman" w:cs="Times New Roman"/>
+          <w:color w:val="auto"/>
+          <w:sz w:val="24"/>
+          <w:szCs w:val="24"/>
+        </w:rPr>
+        <w:t xml:space="preserve"> </w:t>
       </w:r>
       <w:r>
         <w:rPr>
@@ -8075,7 +8443,27 @@
           <w:sz w:val="24"/>
           <w:szCs w:val="24"/>
         </w:rPr>
-        <w:t xml:space="preserve"> (DoctorID </w:t>
+        <w:t xml:space="preserve"> (</w:t>
+      </w:r>
+      <w:proofErr w:type="spellStart"/>
+      <w:r>
+        <w:rPr>
+          <w:rFonts w:ascii="Times New Roman" w:hAnsi="Times New Roman" w:cs="Times New Roman"/>
+          <w:color w:val="auto"/>
+          <w:sz w:val="24"/>
+          <w:szCs w:val="24"/>
+        </w:rPr>
+        <w:t>DoctorID</w:t>
+      </w:r>
+      <w:proofErr w:type="spellEnd"/>
+      <w:r>
+        <w:rPr>
+          <w:rFonts w:ascii="Times New Roman" w:hAnsi="Times New Roman" w:cs="Times New Roman"/>
+          <w:color w:val="auto"/>
+          <w:sz w:val="24"/>
+          <w:szCs w:val="24"/>
+        </w:rPr>
+        <w:t xml:space="preserve"> </w:t>
       </w:r>
       <w:r>
         <w:rPr>
@@ -8146,7 +8534,27 @@
           <w:sz w:val="24"/>
           <w:szCs w:val="24"/>
         </w:rPr>
-        <w:t xml:space="preserve"> (AppointmentID </w:t>
+        <w:t xml:space="preserve"> (</w:t>
+      </w:r>
+      <w:proofErr w:type="spellStart"/>
+      <w:r>
+        <w:rPr>
+          <w:rFonts w:ascii="Times New Roman" w:hAnsi="Times New Roman" w:cs="Times New Roman"/>
+          <w:color w:val="auto"/>
+          <w:sz w:val="24"/>
+          <w:szCs w:val="24"/>
+        </w:rPr>
+        <w:t>AppointmentID</w:t>
+      </w:r>
+      <w:proofErr w:type="spellEnd"/>
+      <w:r>
+        <w:rPr>
+          <w:rFonts w:ascii="Times New Roman" w:hAnsi="Times New Roman" w:cs="Times New Roman"/>
+          <w:color w:val="auto"/>
+          <w:sz w:val="24"/>
+          <w:szCs w:val="24"/>
+        </w:rPr>
+        <w:t xml:space="preserve"> </w:t>
       </w:r>
       <w:r>
         <w:rPr>
@@ -8166,7 +8574,47 @@
           <w:sz w:val="24"/>
           <w:szCs w:val="24"/>
         </w:rPr>
-        <w:t xml:space="preserve">, AppointmentDate, Status, PatientID </w:t>
+        <w:t xml:space="preserve">, </w:t>
+      </w:r>
+      <w:proofErr w:type="spellStart"/>
+      <w:r>
+        <w:rPr>
+          <w:rFonts w:ascii="Times New Roman" w:hAnsi="Times New Roman" w:cs="Times New Roman"/>
+          <w:color w:val="auto"/>
+          <w:sz w:val="24"/>
+          <w:szCs w:val="24"/>
+        </w:rPr>
+        <w:t>AppointmentDate</w:t>
+      </w:r>
+      <w:proofErr w:type="spellEnd"/>
+      <w:r>
+        <w:rPr>
+          <w:rFonts w:ascii="Times New Roman" w:hAnsi="Times New Roman" w:cs="Times New Roman"/>
+          <w:color w:val="auto"/>
+          <w:sz w:val="24"/>
+          <w:szCs w:val="24"/>
+        </w:rPr>
+        <w:t xml:space="preserve">, Status, </w:t>
+      </w:r>
+      <w:proofErr w:type="spellStart"/>
+      <w:r>
+        <w:rPr>
+          <w:rFonts w:ascii="Times New Roman" w:hAnsi="Times New Roman" w:cs="Times New Roman"/>
+          <w:color w:val="auto"/>
+          <w:sz w:val="24"/>
+          <w:szCs w:val="24"/>
+        </w:rPr>
+        <w:t>PatientID</w:t>
+      </w:r>
+      <w:proofErr w:type="spellEnd"/>
+      <w:r>
+        <w:rPr>
+          <w:rFonts w:ascii="Times New Roman" w:hAnsi="Times New Roman" w:cs="Times New Roman"/>
+          <w:color w:val="auto"/>
+          <w:sz w:val="24"/>
+          <w:szCs w:val="24"/>
+        </w:rPr>
+        <w:t xml:space="preserve"> </w:t>
       </w:r>
       <w:r>
         <w:rPr>
@@ -8186,7 +8634,27 @@
           <w:sz w:val="24"/>
           <w:szCs w:val="24"/>
         </w:rPr>
-        <w:t>, DoctorID FK)</w:t>
+        <w:t xml:space="preserve">, </w:t>
+      </w:r>
+      <w:proofErr w:type="spellStart"/>
+      <w:r>
+        <w:rPr>
+          <w:rFonts w:ascii="Times New Roman" w:hAnsi="Times New Roman" w:cs="Times New Roman"/>
+          <w:color w:val="auto"/>
+          <w:sz w:val="24"/>
+          <w:szCs w:val="24"/>
+        </w:rPr>
+        <w:t>DoctorID</w:t>
+      </w:r>
+      <w:proofErr w:type="spellEnd"/>
+      <w:r>
+        <w:rPr>
+          <w:rFonts w:ascii="Times New Roman" w:hAnsi="Times New Roman" w:cs="Times New Roman"/>
+          <w:color w:val="auto"/>
+          <w:sz w:val="24"/>
+          <w:szCs w:val="24"/>
+        </w:rPr>
+        <w:t xml:space="preserve"> FK)</w:t>
       </w:r>
     </w:p>
     <w:p>
@@ -8237,7 +8705,27 @@
           <w:sz w:val="24"/>
           <w:szCs w:val="24"/>
         </w:rPr>
-        <w:t xml:space="preserve"> (TreatmentID </w:t>
+        <w:t xml:space="preserve"> (</w:t>
+      </w:r>
+      <w:proofErr w:type="spellStart"/>
+      <w:r>
+        <w:rPr>
+          <w:rFonts w:ascii="Times New Roman" w:hAnsi="Times New Roman" w:cs="Times New Roman"/>
+          <w:color w:val="auto"/>
+          <w:sz w:val="24"/>
+          <w:szCs w:val="24"/>
+        </w:rPr>
+        <w:t>TreatmentID</w:t>
+      </w:r>
+      <w:proofErr w:type="spellEnd"/>
+      <w:r>
+        <w:rPr>
+          <w:rFonts w:ascii="Times New Roman" w:hAnsi="Times New Roman" w:cs="Times New Roman"/>
+          <w:color w:val="auto"/>
+          <w:sz w:val="24"/>
+          <w:szCs w:val="24"/>
+        </w:rPr>
+        <w:t xml:space="preserve"> </w:t>
       </w:r>
       <w:r>
         <w:rPr>
@@ -8257,7 +8745,27 @@
           <w:sz w:val="24"/>
           <w:szCs w:val="24"/>
         </w:rPr>
-        <w:t xml:space="preserve">, Diagnosis, AppointmentID </w:t>
+        <w:t xml:space="preserve">, Diagnosis, </w:t>
+      </w:r>
+      <w:proofErr w:type="spellStart"/>
+      <w:r>
+        <w:rPr>
+          <w:rFonts w:ascii="Times New Roman" w:hAnsi="Times New Roman" w:cs="Times New Roman"/>
+          <w:color w:val="auto"/>
+          <w:sz w:val="24"/>
+          <w:szCs w:val="24"/>
+        </w:rPr>
+        <w:t>AppointmentID</w:t>
+      </w:r>
+      <w:proofErr w:type="spellEnd"/>
+      <w:r>
+        <w:rPr>
+          <w:rFonts w:ascii="Times New Roman" w:hAnsi="Times New Roman" w:cs="Times New Roman"/>
+          <w:color w:val="auto"/>
+          <w:sz w:val="24"/>
+          <w:szCs w:val="24"/>
+        </w:rPr>
+        <w:t xml:space="preserve"> </w:t>
       </w:r>
       <w:r>
         <w:rPr>
@@ -8328,7 +8836,27 @@
           <w:sz w:val="24"/>
           <w:szCs w:val="24"/>
         </w:rPr>
-        <w:t xml:space="preserve"> (PaymentID </w:t>
+        <w:t xml:space="preserve"> (</w:t>
+      </w:r>
+      <w:proofErr w:type="spellStart"/>
+      <w:r>
+        <w:rPr>
+          <w:rFonts w:ascii="Times New Roman" w:hAnsi="Times New Roman" w:cs="Times New Roman"/>
+          <w:color w:val="auto"/>
+          <w:sz w:val="24"/>
+          <w:szCs w:val="24"/>
+        </w:rPr>
+        <w:t>PaymentID</w:t>
+      </w:r>
+      <w:proofErr w:type="spellEnd"/>
+      <w:r>
+        <w:rPr>
+          <w:rFonts w:ascii="Times New Roman" w:hAnsi="Times New Roman" w:cs="Times New Roman"/>
+          <w:color w:val="auto"/>
+          <w:sz w:val="24"/>
+          <w:szCs w:val="24"/>
+        </w:rPr>
+        <w:t xml:space="preserve"> </w:t>
       </w:r>
       <w:r>
         <w:rPr>
@@ -8348,7 +8876,47 @@
           <w:sz w:val="24"/>
           <w:szCs w:val="24"/>
         </w:rPr>
-        <w:t xml:space="preserve">, Amount, PaymentMethod, AppointmentID </w:t>
+        <w:t xml:space="preserve">, Amount, </w:t>
+      </w:r>
+      <w:proofErr w:type="spellStart"/>
+      <w:r>
+        <w:rPr>
+          <w:rFonts w:ascii="Times New Roman" w:hAnsi="Times New Roman" w:cs="Times New Roman"/>
+          <w:color w:val="auto"/>
+          <w:sz w:val="24"/>
+          <w:szCs w:val="24"/>
+        </w:rPr>
+        <w:t>PaymentMethod</w:t>
+      </w:r>
+      <w:proofErr w:type="spellEnd"/>
+      <w:r>
+        <w:rPr>
+          <w:rFonts w:ascii="Times New Roman" w:hAnsi="Times New Roman" w:cs="Times New Roman"/>
+          <w:color w:val="auto"/>
+          <w:sz w:val="24"/>
+          <w:szCs w:val="24"/>
+        </w:rPr>
+        <w:t xml:space="preserve">, </w:t>
+      </w:r>
+      <w:proofErr w:type="spellStart"/>
+      <w:r>
+        <w:rPr>
+          <w:rFonts w:ascii="Times New Roman" w:hAnsi="Times New Roman" w:cs="Times New Roman"/>
+          <w:color w:val="auto"/>
+          <w:sz w:val="24"/>
+          <w:szCs w:val="24"/>
+        </w:rPr>
+        <w:t>AppointmentID</w:t>
+      </w:r>
+      <w:proofErr w:type="spellEnd"/>
+      <w:r>
+        <w:rPr>
+          <w:rFonts w:ascii="Times New Roman" w:hAnsi="Times New Roman" w:cs="Times New Roman"/>
+          <w:color w:val="auto"/>
+          <w:sz w:val="24"/>
+          <w:szCs w:val="24"/>
+        </w:rPr>
+        <w:t xml:space="preserve"> </w:t>
       </w:r>
       <w:r>
         <w:rPr>
@@ -8660,7 +9228,27 @@
           <w:sz w:val="24"/>
           <w:szCs w:val="24"/>
         </w:rPr>
-        <w:t>CREATE DATABASE SmartClinic;</w:t>
+        <w:t xml:space="preserve">CREATE DATABASE </w:t>
+      </w:r>
+      <w:proofErr w:type="spellStart"/>
+      <w:r>
+        <w:rPr>
+          <w:rFonts w:ascii="Times New Roman" w:hAnsi="Times New Roman" w:cs="Times New Roman"/>
+          <w:color w:val="auto"/>
+          <w:sz w:val="24"/>
+          <w:szCs w:val="24"/>
+        </w:rPr>
+        <w:t>SmartClinic</w:t>
+      </w:r>
+      <w:proofErr w:type="spellEnd"/>
+      <w:r>
+        <w:rPr>
+          <w:rFonts w:ascii="Times New Roman" w:hAnsi="Times New Roman" w:cs="Times New Roman"/>
+          <w:color w:val="auto"/>
+          <w:sz w:val="24"/>
+          <w:szCs w:val="24"/>
+        </w:rPr>
+        <w:t>;</w:t>
       </w:r>
     </w:p>
     <w:p>
@@ -8685,7 +9273,27 @@
           <w:sz w:val="24"/>
           <w:szCs w:val="24"/>
         </w:rPr>
-        <w:t>USE SmartClinic;</w:t>
+        <w:t xml:space="preserve">USE </w:t>
+      </w:r>
+      <w:proofErr w:type="spellStart"/>
+      <w:r>
+        <w:rPr>
+          <w:rFonts w:ascii="Times New Roman" w:hAnsi="Times New Roman" w:cs="Times New Roman"/>
+          <w:color w:val="auto"/>
+          <w:sz w:val="24"/>
+          <w:szCs w:val="24"/>
+        </w:rPr>
+        <w:t>SmartClinic</w:t>
+      </w:r>
+      <w:proofErr w:type="spellEnd"/>
+      <w:r>
+        <w:rPr>
+          <w:rFonts w:ascii="Times New Roman" w:hAnsi="Times New Roman" w:cs="Times New Roman"/>
+          <w:color w:val="auto"/>
+          <w:sz w:val="24"/>
+          <w:szCs w:val="24"/>
+        </w:rPr>
+        <w:t>;</w:t>
       </w:r>
     </w:p>
     <w:p>
@@ -8923,7 +9531,25 @@
           <w:color w:val="auto"/>
           <w:kern w:val="20"/>
         </w:rPr>
-        <w:t xml:space="preserve">    DepartmentID INT PRIMARY KEY,</w:t>
+        <w:t xml:space="preserve">    </w:t>
+      </w:r>
+      <w:proofErr w:type="spellStart"/>
+      <w:r>
+        <w:rPr>
+          <w:rFonts w:ascii="Times New Roman" w:hAnsi="Times New Roman" w:cs="Times New Roman"/>
+          <w:color w:val="auto"/>
+          <w:kern w:val="20"/>
+        </w:rPr>
+        <w:t>DepartmentID</w:t>
+      </w:r>
+      <w:proofErr w:type="spellEnd"/>
+      <w:r>
+        <w:rPr>
+          <w:rFonts w:ascii="Times New Roman" w:hAnsi="Times New Roman" w:cs="Times New Roman"/>
+          <w:color w:val="auto"/>
+          <w:kern w:val="20"/>
+        </w:rPr>
+        <w:t xml:space="preserve"> INT PRIMARY KEY,</w:t>
       </w:r>
     </w:p>
     <w:p>
@@ -8942,7 +9568,43 @@
           <w:color w:val="auto"/>
           <w:kern w:val="20"/>
         </w:rPr>
-        <w:t xml:space="preserve">    DepartmentName VARCHAR(50) NOT NULL UNIQUE</w:t>
+        <w:t xml:space="preserve">    </w:t>
+      </w:r>
+      <w:proofErr w:type="spellStart"/>
+      <w:r>
+        <w:rPr>
+          <w:rFonts w:ascii="Times New Roman" w:hAnsi="Times New Roman" w:cs="Times New Roman"/>
+          <w:color w:val="auto"/>
+          <w:kern w:val="20"/>
+        </w:rPr>
+        <w:t>DepartmentName</w:t>
+      </w:r>
+      <w:proofErr w:type="spellEnd"/>
+      <w:r>
+        <w:rPr>
+          <w:rFonts w:ascii="Times New Roman" w:hAnsi="Times New Roman" w:cs="Times New Roman"/>
+          <w:color w:val="auto"/>
+          <w:kern w:val="20"/>
+        </w:rPr>
+        <w:t xml:space="preserve"> </w:t>
+      </w:r>
+      <w:proofErr w:type="gramStart"/>
+      <w:r>
+        <w:rPr>
+          <w:rFonts w:ascii="Times New Roman" w:hAnsi="Times New Roman" w:cs="Times New Roman"/>
+          <w:color w:val="auto"/>
+          <w:kern w:val="20"/>
+        </w:rPr>
+        <w:t>VARCHAR(</w:t>
+      </w:r>
+      <w:proofErr w:type="gramEnd"/>
+      <w:r>
+        <w:rPr>
+          <w:rFonts w:ascii="Times New Roman" w:hAnsi="Times New Roman" w:cs="Times New Roman"/>
+          <w:color w:val="auto"/>
+          <w:kern w:val="20"/>
+        </w:rPr>
+        <w:t>50) NOT NULL UNIQUE</w:t>
       </w:r>
     </w:p>
     <w:p>
@@ -9055,7 +9717,25 @@
           <w:color w:val="auto"/>
           <w:kern w:val="20"/>
         </w:rPr>
-        <w:t xml:space="preserve">    PatientID INT PRIMARY KEY,</w:t>
+        <w:t xml:space="preserve">    </w:t>
+      </w:r>
+      <w:proofErr w:type="spellStart"/>
+      <w:r>
+        <w:rPr>
+          <w:rFonts w:ascii="Times New Roman" w:hAnsi="Times New Roman" w:cs="Times New Roman"/>
+          <w:color w:val="auto"/>
+          <w:kern w:val="20"/>
+        </w:rPr>
+        <w:t>PatientID</w:t>
+      </w:r>
+      <w:proofErr w:type="spellEnd"/>
+      <w:r>
+        <w:rPr>
+          <w:rFonts w:ascii="Times New Roman" w:hAnsi="Times New Roman" w:cs="Times New Roman"/>
+          <w:color w:val="auto"/>
+          <w:kern w:val="20"/>
+        </w:rPr>
+        <w:t xml:space="preserve"> INT PRIMARY KEY,</w:t>
       </w:r>
     </w:p>
     <w:p>
@@ -9074,7 +9754,25 @@
           <w:color w:val="auto"/>
           <w:kern w:val="20"/>
         </w:rPr>
-        <w:t xml:space="preserve">    FirstName VARCHAR(30) NOT NULL,</w:t>
+        <w:t xml:space="preserve">    FirstName </w:t>
+      </w:r>
+      <w:proofErr w:type="gramStart"/>
+      <w:r>
+        <w:rPr>
+          <w:rFonts w:ascii="Times New Roman" w:hAnsi="Times New Roman" w:cs="Times New Roman"/>
+          <w:color w:val="auto"/>
+          <w:kern w:val="20"/>
+        </w:rPr>
+        <w:t>VARCHAR(</w:t>
+      </w:r>
+      <w:proofErr w:type="gramEnd"/>
+      <w:r>
+        <w:rPr>
+          <w:rFonts w:ascii="Times New Roman" w:hAnsi="Times New Roman" w:cs="Times New Roman"/>
+          <w:color w:val="auto"/>
+          <w:kern w:val="20"/>
+        </w:rPr>
+        <w:t>30) NOT NULL,</w:t>
       </w:r>
     </w:p>
     <w:p>
@@ -9093,7 +9791,25 @@
           <w:color w:val="auto"/>
           <w:kern w:val="20"/>
         </w:rPr>
-        <w:t xml:space="preserve">    LastName VARCHAR(30) NOT NULL,</w:t>
+        <w:t xml:space="preserve">    LastName </w:t>
+      </w:r>
+      <w:proofErr w:type="gramStart"/>
+      <w:r>
+        <w:rPr>
+          <w:rFonts w:ascii="Times New Roman" w:hAnsi="Times New Roman" w:cs="Times New Roman"/>
+          <w:color w:val="auto"/>
+          <w:kern w:val="20"/>
+        </w:rPr>
+        <w:t>VARCHAR(</w:t>
+      </w:r>
+      <w:proofErr w:type="gramEnd"/>
+      <w:r>
+        <w:rPr>
+          <w:rFonts w:ascii="Times New Roman" w:hAnsi="Times New Roman" w:cs="Times New Roman"/>
+          <w:color w:val="auto"/>
+          <w:kern w:val="20"/>
+        </w:rPr>
+        <w:t>30) NOT NULL,</w:t>
       </w:r>
     </w:p>
     <w:p>
@@ -9112,7 +9828,25 @@
           <w:color w:val="auto"/>
           <w:kern w:val="20"/>
         </w:rPr>
-        <w:t xml:space="preserve">    Gender VARCHAR(10) NOT NULL,</w:t>
+        <w:t xml:space="preserve">    Gender </w:t>
+      </w:r>
+      <w:proofErr w:type="gramStart"/>
+      <w:r>
+        <w:rPr>
+          <w:rFonts w:ascii="Times New Roman" w:hAnsi="Times New Roman" w:cs="Times New Roman"/>
+          <w:color w:val="auto"/>
+          <w:kern w:val="20"/>
+        </w:rPr>
+        <w:t>VARCHAR(</w:t>
+      </w:r>
+      <w:proofErr w:type="gramEnd"/>
+      <w:r>
+        <w:rPr>
+          <w:rFonts w:ascii="Times New Roman" w:hAnsi="Times New Roman" w:cs="Times New Roman"/>
+          <w:color w:val="auto"/>
+          <w:kern w:val="20"/>
+        </w:rPr>
+        <w:t>10) NOT NULL,</w:t>
       </w:r>
     </w:p>
     <w:p>
@@ -9131,7 +9865,25 @@
           <w:color w:val="auto"/>
           <w:kern w:val="20"/>
         </w:rPr>
-        <w:t xml:space="preserve">    Phone VARCHAR(15) NOT NULL UNIQUE</w:t>
+        <w:t xml:space="preserve">    Phone </w:t>
+      </w:r>
+      <w:proofErr w:type="gramStart"/>
+      <w:r>
+        <w:rPr>
+          <w:rFonts w:ascii="Times New Roman" w:hAnsi="Times New Roman" w:cs="Times New Roman"/>
+          <w:color w:val="auto"/>
+          <w:kern w:val="20"/>
+        </w:rPr>
+        <w:t>VARCHAR(</w:t>
+      </w:r>
+      <w:proofErr w:type="gramEnd"/>
+      <w:r>
+        <w:rPr>
+          <w:rFonts w:ascii="Times New Roman" w:hAnsi="Times New Roman" w:cs="Times New Roman"/>
+          <w:color w:val="auto"/>
+          <w:kern w:val="20"/>
+        </w:rPr>
+        <w:t>15) NOT NULL UNIQUE</w:t>
       </w:r>
     </w:p>
     <w:p>
@@ -9409,7 +10161,23 @@
           <w:rFonts w:ascii="Times New Roman" w:hAnsi="Times New Roman" w:cs="Times New Roman"/>
           <w:color w:val="auto"/>
         </w:rPr>
-        <w:t xml:space="preserve">    DoctorID INT PRIMARY KEY,</w:t>
+        <w:t xml:space="preserve">    </w:t>
+      </w:r>
+      <w:proofErr w:type="spellStart"/>
+      <w:r>
+        <w:rPr>
+          <w:rFonts w:ascii="Times New Roman" w:hAnsi="Times New Roman" w:cs="Times New Roman"/>
+          <w:color w:val="auto"/>
+        </w:rPr>
+        <w:t>DoctorID</w:t>
+      </w:r>
+      <w:proofErr w:type="spellEnd"/>
+      <w:r>
+        <w:rPr>
+          <w:rFonts w:ascii="Times New Roman" w:hAnsi="Times New Roman" w:cs="Times New Roman"/>
+          <w:color w:val="auto"/>
+        </w:rPr>
+        <w:t xml:space="preserve"> INT PRIMARY KEY,</w:t>
       </w:r>
     </w:p>
     <w:p>
@@ -9430,7 +10198,23 @@
           <w:rFonts w:ascii="Times New Roman" w:hAnsi="Times New Roman" w:cs="Times New Roman"/>
           <w:color w:val="auto"/>
         </w:rPr>
-        <w:t xml:space="preserve">    FirstName VARCHAR(30) NOT NULL,</w:t>
+        <w:t xml:space="preserve">    FirstName </w:t>
+      </w:r>
+      <w:proofErr w:type="gramStart"/>
+      <w:r>
+        <w:rPr>
+          <w:rFonts w:ascii="Times New Roman" w:hAnsi="Times New Roman" w:cs="Times New Roman"/>
+          <w:color w:val="auto"/>
+        </w:rPr>
+        <w:t>VARCHAR(</w:t>
+      </w:r>
+      <w:proofErr w:type="gramEnd"/>
+      <w:r>
+        <w:rPr>
+          <w:rFonts w:ascii="Times New Roman" w:hAnsi="Times New Roman" w:cs="Times New Roman"/>
+          <w:color w:val="auto"/>
+        </w:rPr>
+        <w:t>30) NOT NULL,</w:t>
       </w:r>
     </w:p>
     <w:p>
@@ -9451,7 +10235,23 @@
           <w:rFonts w:ascii="Times New Roman" w:hAnsi="Times New Roman" w:cs="Times New Roman"/>
           <w:color w:val="auto"/>
         </w:rPr>
-        <w:t xml:space="preserve">    LastName VARCHAR(30) NOT NULL,</w:t>
+        <w:t xml:space="preserve">    LastName </w:t>
+      </w:r>
+      <w:proofErr w:type="gramStart"/>
+      <w:r>
+        <w:rPr>
+          <w:rFonts w:ascii="Times New Roman" w:hAnsi="Times New Roman" w:cs="Times New Roman"/>
+          <w:color w:val="auto"/>
+        </w:rPr>
+        <w:t>VARCHAR(</w:t>
+      </w:r>
+      <w:proofErr w:type="gramEnd"/>
+      <w:r>
+        <w:rPr>
+          <w:rFonts w:ascii="Times New Roman" w:hAnsi="Times New Roman" w:cs="Times New Roman"/>
+          <w:color w:val="auto"/>
+        </w:rPr>
+        <w:t>30) NOT NULL,</w:t>
       </w:r>
     </w:p>
     <w:p>
@@ -9472,7 +10272,23 @@
           <w:rFonts w:ascii="Times New Roman" w:hAnsi="Times New Roman" w:cs="Times New Roman"/>
           <w:color w:val="auto"/>
         </w:rPr>
-        <w:t xml:space="preserve">    Phone VARCHAR(15) NOT NULL UNIQUE,</w:t>
+        <w:t xml:space="preserve">    Phone </w:t>
+      </w:r>
+      <w:proofErr w:type="gramStart"/>
+      <w:r>
+        <w:rPr>
+          <w:rFonts w:ascii="Times New Roman" w:hAnsi="Times New Roman" w:cs="Times New Roman"/>
+          <w:color w:val="auto"/>
+        </w:rPr>
+        <w:t>VARCHAR(</w:t>
+      </w:r>
+      <w:proofErr w:type="gramEnd"/>
+      <w:r>
+        <w:rPr>
+          <w:rFonts w:ascii="Times New Roman" w:hAnsi="Times New Roman" w:cs="Times New Roman"/>
+          <w:color w:val="auto"/>
+        </w:rPr>
+        <w:t>15) NOT NULL UNIQUE,</w:t>
       </w:r>
     </w:p>
     <w:p>
@@ -9493,7 +10309,23 @@
           <w:rFonts w:ascii="Times New Roman" w:hAnsi="Times New Roman" w:cs="Times New Roman"/>
           <w:color w:val="auto"/>
         </w:rPr>
-        <w:t xml:space="preserve">    DepartmentID INT NOT NULL,</w:t>
+        <w:t xml:space="preserve">    </w:t>
+      </w:r>
+      <w:proofErr w:type="spellStart"/>
+      <w:r>
+        <w:rPr>
+          <w:rFonts w:ascii="Times New Roman" w:hAnsi="Times New Roman" w:cs="Times New Roman"/>
+          <w:color w:val="auto"/>
+        </w:rPr>
+        <w:t>DepartmentID</w:t>
+      </w:r>
+      <w:proofErr w:type="spellEnd"/>
+      <w:r>
+        <w:rPr>
+          <w:rFonts w:ascii="Times New Roman" w:hAnsi="Times New Roman" w:cs="Times New Roman"/>
+          <w:color w:val="auto"/>
+        </w:rPr>
+        <w:t xml:space="preserve"> INT NOT NULL,</w:t>
       </w:r>
     </w:p>
     <w:p>
@@ -9514,7 +10346,23 @@
           <w:rFonts w:ascii="Times New Roman" w:hAnsi="Times New Roman" w:cs="Times New Roman"/>
           <w:color w:val="auto"/>
         </w:rPr>
-        <w:t xml:space="preserve">    FOREIGN KEY (DepartmentID)</w:t>
+        <w:t xml:space="preserve">    FOREIGN KEY (</w:t>
+      </w:r>
+      <w:proofErr w:type="spellStart"/>
+      <w:r>
+        <w:rPr>
+          <w:rFonts w:ascii="Times New Roman" w:hAnsi="Times New Roman" w:cs="Times New Roman"/>
+          <w:color w:val="auto"/>
+        </w:rPr>
+        <w:t>DepartmentID</w:t>
+      </w:r>
+      <w:proofErr w:type="spellEnd"/>
+      <w:r>
+        <w:rPr>
+          <w:rFonts w:ascii="Times New Roman" w:hAnsi="Times New Roman" w:cs="Times New Roman"/>
+          <w:color w:val="auto"/>
+        </w:rPr>
+        <w:t>)</w:t>
       </w:r>
     </w:p>
     <w:p>
@@ -9535,7 +10383,32 @@
           <w:rFonts w:ascii="Times New Roman" w:hAnsi="Times New Roman" w:cs="Times New Roman"/>
           <w:color w:val="auto"/>
         </w:rPr>
-        <w:t xml:space="preserve">        REFERENCES Department(DepartmentID)</w:t>
+        <w:t xml:space="preserve">        REFERENCES </w:t>
+      </w:r>
+      <w:proofErr w:type="gramStart"/>
+      <w:r>
+        <w:rPr>
+          <w:rFonts w:ascii="Times New Roman" w:hAnsi="Times New Roman" w:cs="Times New Roman"/>
+          <w:color w:val="auto"/>
+        </w:rPr>
+        <w:t>Department(</w:t>
+      </w:r>
+      <w:proofErr w:type="spellStart"/>
+      <w:proofErr w:type="gramEnd"/>
+      <w:r>
+        <w:rPr>
+          <w:rFonts w:ascii="Times New Roman" w:hAnsi="Times New Roman" w:cs="Times New Roman"/>
+          <w:color w:val="auto"/>
+        </w:rPr>
+        <w:t>DepartmentID</w:t>
+      </w:r>
+      <w:proofErr w:type="spellEnd"/>
+      <w:r>
+        <w:rPr>
+          <w:rFonts w:ascii="Times New Roman" w:hAnsi="Times New Roman" w:cs="Times New Roman"/>
+          <w:color w:val="auto"/>
+        </w:rPr>
+        <w:t>)</w:t>
       </w:r>
     </w:p>
     <w:p>
@@ -9600,7 +10473,31 @@
           <w:sz w:val="24"/>
           <w:szCs w:val="24"/>
         </w:rPr>
-        <w:t>Create GeneralPractitioner Table</w:t>
+        <w:t xml:space="preserve">Create </w:t>
+      </w:r>
+      <w:proofErr w:type="spellStart"/>
+      <w:r>
+        <w:rPr>
+          <w:rFonts w:ascii="Times New Roman" w:hAnsi="Times New Roman" w:cs="Times New Roman"/>
+          <w:b/>
+          <w:bCs/>
+          <w:color w:val="auto"/>
+          <w:sz w:val="24"/>
+          <w:szCs w:val="24"/>
+        </w:rPr>
+        <w:t>GeneralPractitioner</w:t>
+      </w:r>
+      <w:proofErr w:type="spellEnd"/>
+      <w:r>
+        <w:rPr>
+          <w:rFonts w:ascii="Times New Roman" w:hAnsi="Times New Roman" w:cs="Times New Roman"/>
+          <w:b/>
+          <w:bCs/>
+          <w:color w:val="auto"/>
+          <w:sz w:val="24"/>
+          <w:szCs w:val="24"/>
+        </w:rPr>
+        <w:t xml:space="preserve"> Table</w:t>
       </w:r>
     </w:p>
     <w:p>
@@ -9637,7 +10534,23 @@
           <w:rFonts w:ascii="Times New Roman" w:hAnsi="Times New Roman" w:cs="Times New Roman"/>
           <w:color w:val="auto"/>
         </w:rPr>
-        <w:t>CREATE TABLE GeneralPractitioner (</w:t>
+        <w:t xml:space="preserve">CREATE TABLE </w:t>
+      </w:r>
+      <w:proofErr w:type="spellStart"/>
+      <w:r>
+        <w:rPr>
+          <w:rFonts w:ascii="Times New Roman" w:hAnsi="Times New Roman" w:cs="Times New Roman"/>
+          <w:color w:val="auto"/>
+        </w:rPr>
+        <w:t>GeneralPractitioner</w:t>
+      </w:r>
+      <w:proofErr w:type="spellEnd"/>
+      <w:r>
+        <w:rPr>
+          <w:rFonts w:ascii="Times New Roman" w:hAnsi="Times New Roman" w:cs="Times New Roman"/>
+          <w:color w:val="auto"/>
+        </w:rPr>
+        <w:t xml:space="preserve"> (</w:t>
       </w:r>
     </w:p>
     <w:p>
@@ -9658,7 +10571,23 @@
           <w:rFonts w:ascii="Times New Roman" w:hAnsi="Times New Roman" w:cs="Times New Roman"/>
           <w:color w:val="auto"/>
         </w:rPr>
-        <w:t xml:space="preserve">    DoctorID INT PRIMARY KEY,</w:t>
+        <w:t xml:space="preserve">    </w:t>
+      </w:r>
+      <w:proofErr w:type="spellStart"/>
+      <w:r>
+        <w:rPr>
+          <w:rFonts w:ascii="Times New Roman" w:hAnsi="Times New Roman" w:cs="Times New Roman"/>
+          <w:color w:val="auto"/>
+        </w:rPr>
+        <w:t>DoctorID</w:t>
+      </w:r>
+      <w:proofErr w:type="spellEnd"/>
+      <w:r>
+        <w:rPr>
+          <w:rFonts w:ascii="Times New Roman" w:hAnsi="Times New Roman" w:cs="Times New Roman"/>
+          <w:color w:val="auto"/>
+        </w:rPr>
+        <w:t xml:space="preserve"> INT PRIMARY KEY,</w:t>
       </w:r>
     </w:p>
     <w:p>
@@ -9679,7 +10608,23 @@
           <w:rFonts w:ascii="Times New Roman" w:hAnsi="Times New Roman" w:cs="Times New Roman"/>
           <w:color w:val="auto"/>
         </w:rPr>
-        <w:t xml:space="preserve">    FOREIGN KEY (DoctorID)</w:t>
+        <w:t xml:space="preserve">    FOREIGN KEY (</w:t>
+      </w:r>
+      <w:proofErr w:type="spellStart"/>
+      <w:r>
+        <w:rPr>
+          <w:rFonts w:ascii="Times New Roman" w:hAnsi="Times New Roman" w:cs="Times New Roman"/>
+          <w:color w:val="auto"/>
+        </w:rPr>
+        <w:t>DoctorID</w:t>
+      </w:r>
+      <w:proofErr w:type="spellEnd"/>
+      <w:r>
+        <w:rPr>
+          <w:rFonts w:ascii="Times New Roman" w:hAnsi="Times New Roman" w:cs="Times New Roman"/>
+          <w:color w:val="auto"/>
+        </w:rPr>
+        <w:t>)</w:t>
       </w:r>
     </w:p>
     <w:p>
@@ -9700,7 +10645,32 @@
           <w:rFonts w:ascii="Times New Roman" w:hAnsi="Times New Roman" w:cs="Times New Roman"/>
           <w:color w:val="auto"/>
         </w:rPr>
-        <w:t xml:space="preserve">        REFERENCES Doctor(DoctorID)</w:t>
+        <w:t xml:space="preserve">        REFERENCES </w:t>
+      </w:r>
+      <w:proofErr w:type="gramStart"/>
+      <w:r>
+        <w:rPr>
+          <w:rFonts w:ascii="Times New Roman" w:hAnsi="Times New Roman" w:cs="Times New Roman"/>
+          <w:color w:val="auto"/>
+        </w:rPr>
+        <w:t>Doctor(</w:t>
+      </w:r>
+      <w:proofErr w:type="spellStart"/>
+      <w:proofErr w:type="gramEnd"/>
+      <w:r>
+        <w:rPr>
+          <w:rFonts w:ascii="Times New Roman" w:hAnsi="Times New Roman" w:cs="Times New Roman"/>
+          <w:color w:val="auto"/>
+        </w:rPr>
+        <w:t>DoctorID</w:t>
+      </w:r>
+      <w:proofErr w:type="spellEnd"/>
+      <w:r>
+        <w:rPr>
+          <w:rFonts w:ascii="Times New Roman" w:hAnsi="Times New Roman" w:cs="Times New Roman"/>
+          <w:color w:val="auto"/>
+        </w:rPr>
+        <w:t>)</w:t>
       </w:r>
     </w:p>
     <w:p>
@@ -9915,7 +10885,23 @@
           <w:rFonts w:ascii="Times New Roman" w:hAnsi="Times New Roman" w:cs="Times New Roman"/>
           <w:color w:val="auto"/>
         </w:rPr>
-        <w:t xml:space="preserve">    DoctorID INT PRIMARY KEY,</w:t>
+        <w:t xml:space="preserve">    </w:t>
+      </w:r>
+      <w:proofErr w:type="spellStart"/>
+      <w:r>
+        <w:rPr>
+          <w:rFonts w:ascii="Times New Roman" w:hAnsi="Times New Roman" w:cs="Times New Roman"/>
+          <w:color w:val="auto"/>
+        </w:rPr>
+        <w:t>DoctorID</w:t>
+      </w:r>
+      <w:proofErr w:type="spellEnd"/>
+      <w:r>
+        <w:rPr>
+          <w:rFonts w:ascii="Times New Roman" w:hAnsi="Times New Roman" w:cs="Times New Roman"/>
+          <w:color w:val="auto"/>
+        </w:rPr>
+        <w:t xml:space="preserve"> INT PRIMARY KEY,</w:t>
       </w:r>
     </w:p>
     <w:p>
@@ -9936,7 +10922,23 @@
           <w:rFonts w:ascii="Times New Roman" w:hAnsi="Times New Roman" w:cs="Times New Roman"/>
           <w:color w:val="auto"/>
         </w:rPr>
-        <w:t xml:space="preserve">    Specialty VARCHAR(50) NOT NULL,</w:t>
+        <w:t xml:space="preserve">    Specialty </w:t>
+      </w:r>
+      <w:proofErr w:type="gramStart"/>
+      <w:r>
+        <w:rPr>
+          <w:rFonts w:ascii="Times New Roman" w:hAnsi="Times New Roman" w:cs="Times New Roman"/>
+          <w:color w:val="auto"/>
+        </w:rPr>
+        <w:t>VARCHAR(</w:t>
+      </w:r>
+      <w:proofErr w:type="gramEnd"/>
+      <w:r>
+        <w:rPr>
+          <w:rFonts w:ascii="Times New Roman" w:hAnsi="Times New Roman" w:cs="Times New Roman"/>
+          <w:color w:val="auto"/>
+        </w:rPr>
+        <w:t>50) NOT NULL,</w:t>
       </w:r>
     </w:p>
     <w:p>
@@ -9957,7 +10959,23 @@
           <w:rFonts w:ascii="Times New Roman" w:hAnsi="Times New Roman" w:cs="Times New Roman"/>
           <w:color w:val="auto"/>
         </w:rPr>
-        <w:t xml:space="preserve">    FOREIGN KEY (DoctorID)</w:t>
+        <w:t xml:space="preserve">    FOREIGN KEY (</w:t>
+      </w:r>
+      <w:proofErr w:type="spellStart"/>
+      <w:r>
+        <w:rPr>
+          <w:rFonts w:ascii="Times New Roman" w:hAnsi="Times New Roman" w:cs="Times New Roman"/>
+          <w:color w:val="auto"/>
+        </w:rPr>
+        <w:t>DoctorID</w:t>
+      </w:r>
+      <w:proofErr w:type="spellEnd"/>
+      <w:r>
+        <w:rPr>
+          <w:rFonts w:ascii="Times New Roman" w:hAnsi="Times New Roman" w:cs="Times New Roman"/>
+          <w:color w:val="auto"/>
+        </w:rPr>
+        <w:t>)</w:t>
       </w:r>
     </w:p>
     <w:p>
@@ -9978,7 +10996,32 @@
           <w:rFonts w:ascii="Times New Roman" w:hAnsi="Times New Roman" w:cs="Times New Roman"/>
           <w:color w:val="auto"/>
         </w:rPr>
-        <w:t xml:space="preserve">        REFERENCES Doctor(DoctorID)</w:t>
+        <w:t xml:space="preserve">        REFERENCES </w:t>
+      </w:r>
+      <w:proofErr w:type="gramStart"/>
+      <w:r>
+        <w:rPr>
+          <w:rFonts w:ascii="Times New Roman" w:hAnsi="Times New Roman" w:cs="Times New Roman"/>
+          <w:color w:val="auto"/>
+        </w:rPr>
+        <w:t>Doctor(</w:t>
+      </w:r>
+      <w:proofErr w:type="spellStart"/>
+      <w:proofErr w:type="gramEnd"/>
+      <w:r>
+        <w:rPr>
+          <w:rFonts w:ascii="Times New Roman" w:hAnsi="Times New Roman" w:cs="Times New Roman"/>
+          <w:color w:val="auto"/>
+        </w:rPr>
+        <w:t>DoctorID</w:t>
+      </w:r>
+      <w:proofErr w:type="spellEnd"/>
+      <w:r>
+        <w:rPr>
+          <w:rFonts w:ascii="Times New Roman" w:hAnsi="Times New Roman" w:cs="Times New Roman"/>
+          <w:color w:val="auto"/>
+        </w:rPr>
+        <w:t>)</w:t>
       </w:r>
     </w:p>
     <w:p>
@@ -10100,7 +11143,23 @@
           <w:rFonts w:ascii="Times New Roman" w:hAnsi="Times New Roman" w:cs="Times New Roman"/>
           <w:color w:val="auto"/>
         </w:rPr>
-        <w:t xml:space="preserve">    AppointmentID INT PRIMARY KEY,</w:t>
+        <w:t xml:space="preserve">    </w:t>
+      </w:r>
+      <w:proofErr w:type="spellStart"/>
+      <w:r>
+        <w:rPr>
+          <w:rFonts w:ascii="Times New Roman" w:hAnsi="Times New Roman" w:cs="Times New Roman"/>
+          <w:color w:val="auto"/>
+        </w:rPr>
+        <w:t>AppointmentID</w:t>
+      </w:r>
+      <w:proofErr w:type="spellEnd"/>
+      <w:r>
+        <w:rPr>
+          <w:rFonts w:ascii="Times New Roman" w:hAnsi="Times New Roman" w:cs="Times New Roman"/>
+          <w:color w:val="auto"/>
+        </w:rPr>
+        <w:t xml:space="preserve"> INT PRIMARY KEY,</w:t>
       </w:r>
     </w:p>
     <w:p>
@@ -10121,7 +11180,23 @@
           <w:rFonts w:ascii="Times New Roman" w:hAnsi="Times New Roman" w:cs="Times New Roman"/>
           <w:color w:val="auto"/>
         </w:rPr>
-        <w:t xml:space="preserve">    AppointmentDate DATE NOT NULL,</w:t>
+        <w:t xml:space="preserve">    </w:t>
+      </w:r>
+      <w:proofErr w:type="spellStart"/>
+      <w:r>
+        <w:rPr>
+          <w:rFonts w:ascii="Times New Roman" w:hAnsi="Times New Roman" w:cs="Times New Roman"/>
+          <w:color w:val="auto"/>
+        </w:rPr>
+        <w:t>AppointmentDate</w:t>
+      </w:r>
+      <w:proofErr w:type="spellEnd"/>
+      <w:r>
+        <w:rPr>
+          <w:rFonts w:ascii="Times New Roman" w:hAnsi="Times New Roman" w:cs="Times New Roman"/>
+          <w:color w:val="auto"/>
+        </w:rPr>
+        <w:t xml:space="preserve"> DATE NOT NULL,</w:t>
       </w:r>
     </w:p>
     <w:p>
@@ -10142,7 +11217,23 @@
           <w:rFonts w:ascii="Times New Roman" w:hAnsi="Times New Roman" w:cs="Times New Roman"/>
           <w:color w:val="auto"/>
         </w:rPr>
-        <w:t xml:space="preserve">    Status VARCHAR(20) NOT NULL,</w:t>
+        <w:t xml:space="preserve">    Status </w:t>
+      </w:r>
+      <w:proofErr w:type="gramStart"/>
+      <w:r>
+        <w:rPr>
+          <w:rFonts w:ascii="Times New Roman" w:hAnsi="Times New Roman" w:cs="Times New Roman"/>
+          <w:color w:val="auto"/>
+        </w:rPr>
+        <w:t>VARCHAR(</w:t>
+      </w:r>
+      <w:proofErr w:type="gramEnd"/>
+      <w:r>
+        <w:rPr>
+          <w:rFonts w:ascii="Times New Roman" w:hAnsi="Times New Roman" w:cs="Times New Roman"/>
+          <w:color w:val="auto"/>
+        </w:rPr>
+        <w:t>20) NOT NULL,</w:t>
       </w:r>
     </w:p>
     <w:p>
@@ -10163,7 +11254,23 @@
           <w:rFonts w:ascii="Times New Roman" w:hAnsi="Times New Roman" w:cs="Times New Roman"/>
           <w:color w:val="auto"/>
         </w:rPr>
-        <w:t xml:space="preserve">    PatientID INT NOT NULL,</w:t>
+        <w:t xml:space="preserve">    </w:t>
+      </w:r>
+      <w:proofErr w:type="spellStart"/>
+      <w:r>
+        <w:rPr>
+          <w:rFonts w:ascii="Times New Roman" w:hAnsi="Times New Roman" w:cs="Times New Roman"/>
+          <w:color w:val="auto"/>
+        </w:rPr>
+        <w:t>PatientID</w:t>
+      </w:r>
+      <w:proofErr w:type="spellEnd"/>
+      <w:r>
+        <w:rPr>
+          <w:rFonts w:ascii="Times New Roman" w:hAnsi="Times New Roman" w:cs="Times New Roman"/>
+          <w:color w:val="auto"/>
+        </w:rPr>
+        <w:t xml:space="preserve"> INT NOT NULL,</w:t>
       </w:r>
     </w:p>
     <w:p>
@@ -10184,7 +11291,23 @@
           <w:rFonts w:ascii="Times New Roman" w:hAnsi="Times New Roman" w:cs="Times New Roman"/>
           <w:color w:val="auto"/>
         </w:rPr>
-        <w:t xml:space="preserve">    DoctorID INT NOT NULL,</w:t>
+        <w:t xml:space="preserve">    </w:t>
+      </w:r>
+      <w:proofErr w:type="spellStart"/>
+      <w:r>
+        <w:rPr>
+          <w:rFonts w:ascii="Times New Roman" w:hAnsi="Times New Roman" w:cs="Times New Roman"/>
+          <w:color w:val="auto"/>
+        </w:rPr>
+        <w:t>DoctorID</w:t>
+      </w:r>
+      <w:proofErr w:type="spellEnd"/>
+      <w:r>
+        <w:rPr>
+          <w:rFonts w:ascii="Times New Roman" w:hAnsi="Times New Roman" w:cs="Times New Roman"/>
+          <w:color w:val="auto"/>
+        </w:rPr>
+        <w:t xml:space="preserve"> INT NOT NULL,</w:t>
       </w:r>
     </w:p>
     <w:p>
@@ -10205,7 +11328,23 @@
           <w:rFonts w:ascii="Times New Roman" w:hAnsi="Times New Roman" w:cs="Times New Roman"/>
           <w:color w:val="auto"/>
         </w:rPr>
-        <w:t xml:space="preserve">    FOREIGN KEY (PatientID)</w:t>
+        <w:t xml:space="preserve">    FOREIGN KEY (</w:t>
+      </w:r>
+      <w:proofErr w:type="spellStart"/>
+      <w:r>
+        <w:rPr>
+          <w:rFonts w:ascii="Times New Roman" w:hAnsi="Times New Roman" w:cs="Times New Roman"/>
+          <w:color w:val="auto"/>
+        </w:rPr>
+        <w:t>PatientID</w:t>
+      </w:r>
+      <w:proofErr w:type="spellEnd"/>
+      <w:r>
+        <w:rPr>
+          <w:rFonts w:ascii="Times New Roman" w:hAnsi="Times New Roman" w:cs="Times New Roman"/>
+          <w:color w:val="auto"/>
+        </w:rPr>
+        <w:t>)</w:t>
       </w:r>
     </w:p>
     <w:p>
@@ -10226,7 +11365,32 @@
           <w:rFonts w:ascii="Times New Roman" w:hAnsi="Times New Roman" w:cs="Times New Roman"/>
           <w:color w:val="auto"/>
         </w:rPr>
-        <w:t xml:space="preserve">        REFERENCES Patient(PatientID),</w:t>
+        <w:t xml:space="preserve">        REFERENCES </w:t>
+      </w:r>
+      <w:proofErr w:type="gramStart"/>
+      <w:r>
+        <w:rPr>
+          <w:rFonts w:ascii="Times New Roman" w:hAnsi="Times New Roman" w:cs="Times New Roman"/>
+          <w:color w:val="auto"/>
+        </w:rPr>
+        <w:t>Patient(</w:t>
+      </w:r>
+      <w:proofErr w:type="spellStart"/>
+      <w:proofErr w:type="gramEnd"/>
+      <w:r>
+        <w:rPr>
+          <w:rFonts w:ascii="Times New Roman" w:hAnsi="Times New Roman" w:cs="Times New Roman"/>
+          <w:color w:val="auto"/>
+        </w:rPr>
+        <w:t>PatientID</w:t>
+      </w:r>
+      <w:proofErr w:type="spellEnd"/>
+      <w:r>
+        <w:rPr>
+          <w:rFonts w:ascii="Times New Roman" w:hAnsi="Times New Roman" w:cs="Times New Roman"/>
+          <w:color w:val="auto"/>
+        </w:rPr>
+        <w:t>),</w:t>
       </w:r>
     </w:p>
     <w:p>
@@ -10247,7 +11411,23 @@
           <w:rFonts w:ascii="Times New Roman" w:hAnsi="Times New Roman" w:cs="Times New Roman"/>
           <w:color w:val="auto"/>
         </w:rPr>
-        <w:t xml:space="preserve">    FOREIGN KEY (DoctorID)</w:t>
+        <w:t xml:space="preserve">    FOREIGN KEY (</w:t>
+      </w:r>
+      <w:proofErr w:type="spellStart"/>
+      <w:r>
+        <w:rPr>
+          <w:rFonts w:ascii="Times New Roman" w:hAnsi="Times New Roman" w:cs="Times New Roman"/>
+          <w:color w:val="auto"/>
+        </w:rPr>
+        <w:t>DoctorID</w:t>
+      </w:r>
+      <w:proofErr w:type="spellEnd"/>
+      <w:r>
+        <w:rPr>
+          <w:rFonts w:ascii="Times New Roman" w:hAnsi="Times New Roman" w:cs="Times New Roman"/>
+          <w:color w:val="auto"/>
+        </w:rPr>
+        <w:t>)</w:t>
       </w:r>
     </w:p>
     <w:p>
@@ -10268,7 +11448,32 @@
           <w:rFonts w:ascii="Times New Roman" w:hAnsi="Times New Roman" w:cs="Times New Roman"/>
           <w:color w:val="auto"/>
         </w:rPr>
-        <w:t xml:space="preserve">        REFERENCES Doctor(DoctorID)</w:t>
+        <w:t xml:space="preserve">        REFERENCES </w:t>
+      </w:r>
+      <w:proofErr w:type="gramStart"/>
+      <w:r>
+        <w:rPr>
+          <w:rFonts w:ascii="Times New Roman" w:hAnsi="Times New Roman" w:cs="Times New Roman"/>
+          <w:color w:val="auto"/>
+        </w:rPr>
+        <w:t>Doctor(</w:t>
+      </w:r>
+      <w:proofErr w:type="spellStart"/>
+      <w:proofErr w:type="gramEnd"/>
+      <w:r>
+        <w:rPr>
+          <w:rFonts w:ascii="Times New Roman" w:hAnsi="Times New Roman" w:cs="Times New Roman"/>
+          <w:color w:val="auto"/>
+        </w:rPr>
+        <w:t>DoctorID</w:t>
+      </w:r>
+      <w:proofErr w:type="spellEnd"/>
+      <w:r>
+        <w:rPr>
+          <w:rFonts w:ascii="Times New Roman" w:hAnsi="Times New Roman" w:cs="Times New Roman"/>
+          <w:color w:val="auto"/>
+        </w:rPr>
+        <w:t>)</w:t>
       </w:r>
     </w:p>
     <w:p>
@@ -10437,7 +11642,23 @@
           <w:rFonts w:ascii="Times New Roman" w:hAnsi="Times New Roman" w:cs="Times New Roman"/>
           <w:color w:val="auto"/>
         </w:rPr>
-        <w:t xml:space="preserve">    TreatmentID INT PRIMARY KEY,</w:t>
+        <w:t xml:space="preserve">    </w:t>
+      </w:r>
+      <w:proofErr w:type="spellStart"/>
+      <w:r>
+        <w:rPr>
+          <w:rFonts w:ascii="Times New Roman" w:hAnsi="Times New Roman" w:cs="Times New Roman"/>
+          <w:color w:val="auto"/>
+        </w:rPr>
+        <w:t>TreatmentID</w:t>
+      </w:r>
+      <w:proofErr w:type="spellEnd"/>
+      <w:r>
+        <w:rPr>
+          <w:rFonts w:ascii="Times New Roman" w:hAnsi="Times New Roman" w:cs="Times New Roman"/>
+          <w:color w:val="auto"/>
+        </w:rPr>
+        <w:t xml:space="preserve"> INT PRIMARY KEY,</w:t>
       </w:r>
     </w:p>
     <w:p>
@@ -10458,7 +11679,23 @@
           <w:rFonts w:ascii="Times New Roman" w:hAnsi="Times New Roman" w:cs="Times New Roman"/>
           <w:color w:val="auto"/>
         </w:rPr>
-        <w:t xml:space="preserve">    Diagnosis VARCHAR(100) NOT NULL,</w:t>
+        <w:t xml:space="preserve">    Diagnosis </w:t>
+      </w:r>
+      <w:proofErr w:type="gramStart"/>
+      <w:r>
+        <w:rPr>
+          <w:rFonts w:ascii="Times New Roman" w:hAnsi="Times New Roman" w:cs="Times New Roman"/>
+          <w:color w:val="auto"/>
+        </w:rPr>
+        <w:t>VARCHAR(</w:t>
+      </w:r>
+      <w:proofErr w:type="gramEnd"/>
+      <w:r>
+        <w:rPr>
+          <w:rFonts w:ascii="Times New Roman" w:hAnsi="Times New Roman" w:cs="Times New Roman"/>
+          <w:color w:val="auto"/>
+        </w:rPr>
+        <w:t>100) NOT NULL,</w:t>
       </w:r>
     </w:p>
     <w:p>
@@ -10479,7 +11716,23 @@
           <w:rFonts w:ascii="Times New Roman" w:hAnsi="Times New Roman" w:cs="Times New Roman"/>
           <w:color w:val="auto"/>
         </w:rPr>
-        <w:t xml:space="preserve">    AppointmentID INT UNIQUE,</w:t>
+        <w:t xml:space="preserve">    </w:t>
+      </w:r>
+      <w:proofErr w:type="spellStart"/>
+      <w:r>
+        <w:rPr>
+          <w:rFonts w:ascii="Times New Roman" w:hAnsi="Times New Roman" w:cs="Times New Roman"/>
+          <w:color w:val="auto"/>
+        </w:rPr>
+        <w:t>AppointmentID</w:t>
+      </w:r>
+      <w:proofErr w:type="spellEnd"/>
+      <w:r>
+        <w:rPr>
+          <w:rFonts w:ascii="Times New Roman" w:hAnsi="Times New Roman" w:cs="Times New Roman"/>
+          <w:color w:val="auto"/>
+        </w:rPr>
+        <w:t xml:space="preserve"> INT UNIQUE,</w:t>
       </w:r>
     </w:p>
     <w:p>
@@ -10500,7 +11753,23 @@
           <w:rFonts w:ascii="Times New Roman" w:hAnsi="Times New Roman" w:cs="Times New Roman"/>
           <w:color w:val="auto"/>
         </w:rPr>
-        <w:t xml:space="preserve">    FOREIGN KEY (AppointmentID)</w:t>
+        <w:t xml:space="preserve">    FOREIGN KEY (</w:t>
+      </w:r>
+      <w:proofErr w:type="spellStart"/>
+      <w:r>
+        <w:rPr>
+          <w:rFonts w:ascii="Times New Roman" w:hAnsi="Times New Roman" w:cs="Times New Roman"/>
+          <w:color w:val="auto"/>
+        </w:rPr>
+        <w:t>AppointmentID</w:t>
+      </w:r>
+      <w:proofErr w:type="spellEnd"/>
+      <w:r>
+        <w:rPr>
+          <w:rFonts w:ascii="Times New Roman" w:hAnsi="Times New Roman" w:cs="Times New Roman"/>
+          <w:color w:val="auto"/>
+        </w:rPr>
+        <w:t>)</w:t>
       </w:r>
     </w:p>
     <w:p>
@@ -10521,7 +11790,32 @@
           <w:rFonts w:ascii="Times New Roman" w:hAnsi="Times New Roman" w:cs="Times New Roman"/>
           <w:color w:val="auto"/>
         </w:rPr>
-        <w:t xml:space="preserve">        REFERENCES Appointment(AppointmentID)</w:t>
+        <w:t xml:space="preserve">        REFERENCES </w:t>
+      </w:r>
+      <w:proofErr w:type="gramStart"/>
+      <w:r>
+        <w:rPr>
+          <w:rFonts w:ascii="Times New Roman" w:hAnsi="Times New Roman" w:cs="Times New Roman"/>
+          <w:color w:val="auto"/>
+        </w:rPr>
+        <w:t>Appointment(</w:t>
+      </w:r>
+      <w:proofErr w:type="spellStart"/>
+      <w:proofErr w:type="gramEnd"/>
+      <w:r>
+        <w:rPr>
+          <w:rFonts w:ascii="Times New Roman" w:hAnsi="Times New Roman" w:cs="Times New Roman"/>
+          <w:color w:val="auto"/>
+        </w:rPr>
+        <w:t>AppointmentID</w:t>
+      </w:r>
+      <w:proofErr w:type="spellEnd"/>
+      <w:r>
+        <w:rPr>
+          <w:rFonts w:ascii="Times New Roman" w:hAnsi="Times New Roman" w:cs="Times New Roman"/>
+          <w:color w:val="auto"/>
+        </w:rPr>
+        <w:t>)</w:t>
       </w:r>
     </w:p>
     <w:p>
@@ -10640,7 +11934,23 @@
           <w:rFonts w:ascii="Times New Roman" w:hAnsi="Times New Roman" w:cs="Times New Roman"/>
           <w:color w:val="auto"/>
         </w:rPr>
-        <w:t xml:space="preserve">    PaymentID INT PRIMARY KEY,</w:t>
+        <w:t xml:space="preserve">    </w:t>
+      </w:r>
+      <w:proofErr w:type="spellStart"/>
+      <w:r>
+        <w:rPr>
+          <w:rFonts w:ascii="Times New Roman" w:hAnsi="Times New Roman" w:cs="Times New Roman"/>
+          <w:color w:val="auto"/>
+        </w:rPr>
+        <w:t>PaymentID</w:t>
+      </w:r>
+      <w:proofErr w:type="spellEnd"/>
+      <w:r>
+        <w:rPr>
+          <w:rFonts w:ascii="Times New Roman" w:hAnsi="Times New Roman" w:cs="Times New Roman"/>
+          <w:color w:val="auto"/>
+        </w:rPr>
+        <w:t xml:space="preserve"> INT PRIMARY KEY,</w:t>
       </w:r>
     </w:p>
     <w:p>
@@ -10661,7 +11971,23 @@
           <w:rFonts w:ascii="Times New Roman" w:hAnsi="Times New Roman" w:cs="Times New Roman"/>
           <w:color w:val="auto"/>
         </w:rPr>
-        <w:t xml:space="preserve">    Amount DECIMAL(8,2) NOT NULL,</w:t>
+        <w:t xml:space="preserve">    Amount </w:t>
+      </w:r>
+      <w:proofErr w:type="gramStart"/>
+      <w:r>
+        <w:rPr>
+          <w:rFonts w:ascii="Times New Roman" w:hAnsi="Times New Roman" w:cs="Times New Roman"/>
+          <w:color w:val="auto"/>
+        </w:rPr>
+        <w:t>DECIMAL(</w:t>
+      </w:r>
+      <w:proofErr w:type="gramEnd"/>
+      <w:r>
+        <w:rPr>
+          <w:rFonts w:ascii="Times New Roman" w:hAnsi="Times New Roman" w:cs="Times New Roman"/>
+          <w:color w:val="auto"/>
+        </w:rPr>
+        <w:t>8,2) NOT NULL,</w:t>
       </w:r>
     </w:p>
     <w:p>
@@ -10682,7 +12008,39 @@
           <w:rFonts w:ascii="Times New Roman" w:hAnsi="Times New Roman" w:cs="Times New Roman"/>
           <w:color w:val="auto"/>
         </w:rPr>
-        <w:t xml:space="preserve">    PaymentMethod VARCHAR(20) NOT NULL,</w:t>
+        <w:t xml:space="preserve">    </w:t>
+      </w:r>
+      <w:proofErr w:type="spellStart"/>
+      <w:r>
+        <w:rPr>
+          <w:rFonts w:ascii="Times New Roman" w:hAnsi="Times New Roman" w:cs="Times New Roman"/>
+          <w:color w:val="auto"/>
+        </w:rPr>
+        <w:t>PaymentMethod</w:t>
+      </w:r>
+      <w:proofErr w:type="spellEnd"/>
+      <w:r>
+        <w:rPr>
+          <w:rFonts w:ascii="Times New Roman" w:hAnsi="Times New Roman" w:cs="Times New Roman"/>
+          <w:color w:val="auto"/>
+        </w:rPr>
+        <w:t xml:space="preserve"> </w:t>
+      </w:r>
+      <w:proofErr w:type="gramStart"/>
+      <w:r>
+        <w:rPr>
+          <w:rFonts w:ascii="Times New Roman" w:hAnsi="Times New Roman" w:cs="Times New Roman"/>
+          <w:color w:val="auto"/>
+        </w:rPr>
+        <w:t>VARCHAR(</w:t>
+      </w:r>
+      <w:proofErr w:type="gramEnd"/>
+      <w:r>
+        <w:rPr>
+          <w:rFonts w:ascii="Times New Roman" w:hAnsi="Times New Roman" w:cs="Times New Roman"/>
+          <w:color w:val="auto"/>
+        </w:rPr>
+        <w:t>20) NOT NULL,</w:t>
       </w:r>
     </w:p>
     <w:p>
@@ -10703,7 +12061,23 @@
           <w:rFonts w:ascii="Times New Roman" w:hAnsi="Times New Roman" w:cs="Times New Roman"/>
           <w:color w:val="auto"/>
         </w:rPr>
-        <w:t xml:space="preserve">    AppointmentID INT UNIQUE,</w:t>
+        <w:t xml:space="preserve">    </w:t>
+      </w:r>
+      <w:proofErr w:type="spellStart"/>
+      <w:r>
+        <w:rPr>
+          <w:rFonts w:ascii="Times New Roman" w:hAnsi="Times New Roman" w:cs="Times New Roman"/>
+          <w:color w:val="auto"/>
+        </w:rPr>
+        <w:t>AppointmentID</w:t>
+      </w:r>
+      <w:proofErr w:type="spellEnd"/>
+      <w:r>
+        <w:rPr>
+          <w:rFonts w:ascii="Times New Roman" w:hAnsi="Times New Roman" w:cs="Times New Roman"/>
+          <w:color w:val="auto"/>
+        </w:rPr>
+        <w:t xml:space="preserve"> INT UNIQUE,</w:t>
       </w:r>
     </w:p>
     <w:p>
@@ -10724,7 +12098,23 @@
           <w:rFonts w:ascii="Times New Roman" w:hAnsi="Times New Roman" w:cs="Times New Roman"/>
           <w:color w:val="auto"/>
         </w:rPr>
-        <w:t xml:space="preserve">    FOREIGN KEY (AppointmentID)</w:t>
+        <w:t xml:space="preserve">    FOREIGN KEY (</w:t>
+      </w:r>
+      <w:proofErr w:type="spellStart"/>
+      <w:r>
+        <w:rPr>
+          <w:rFonts w:ascii="Times New Roman" w:hAnsi="Times New Roman" w:cs="Times New Roman"/>
+          <w:color w:val="auto"/>
+        </w:rPr>
+        <w:t>AppointmentID</w:t>
+      </w:r>
+      <w:proofErr w:type="spellEnd"/>
+      <w:r>
+        <w:rPr>
+          <w:rFonts w:ascii="Times New Roman" w:hAnsi="Times New Roman" w:cs="Times New Roman"/>
+          <w:color w:val="auto"/>
+        </w:rPr>
+        <w:t>)</w:t>
       </w:r>
     </w:p>
     <w:p>
@@ -10745,7 +12135,32 @@
           <w:rFonts w:ascii="Times New Roman" w:hAnsi="Times New Roman" w:cs="Times New Roman"/>
           <w:color w:val="auto"/>
         </w:rPr>
-        <w:t xml:space="preserve">        REFERENCES Appointment(AppointmentID)</w:t>
+        <w:t xml:space="preserve">        REFERENCES </w:t>
+      </w:r>
+      <w:proofErr w:type="gramStart"/>
+      <w:r>
+        <w:rPr>
+          <w:rFonts w:ascii="Times New Roman" w:hAnsi="Times New Roman" w:cs="Times New Roman"/>
+          <w:color w:val="auto"/>
+        </w:rPr>
+        <w:t>Appointment(</w:t>
+      </w:r>
+      <w:proofErr w:type="spellStart"/>
+      <w:proofErr w:type="gramEnd"/>
+      <w:r>
+        <w:rPr>
+          <w:rFonts w:ascii="Times New Roman" w:hAnsi="Times New Roman" w:cs="Times New Roman"/>
+          <w:color w:val="auto"/>
+        </w:rPr>
+        <w:t>AppointmentID</w:t>
+      </w:r>
+      <w:proofErr w:type="spellEnd"/>
+      <w:r>
+        <w:rPr>
+          <w:rFonts w:ascii="Times New Roman" w:hAnsi="Times New Roman" w:cs="Times New Roman"/>
+          <w:color w:val="auto"/>
+        </w:rPr>
+        <w:t>)</w:t>
       </w:r>
     </w:p>
     <w:p>
@@ -10923,7 +12338,47 @@
           <w:sz w:val="24"/>
           <w:szCs w:val="24"/>
         </w:rPr>
-        <w:t>INSERT INTO Department (DepartmentID, DepartmentName)</w:t>
+        <w:t>INSERT INTO Department (</w:t>
+      </w:r>
+      <w:proofErr w:type="spellStart"/>
+      <w:r>
+        <w:rPr>
+          <w:rFonts w:ascii="Times New Roman" w:hAnsi="Times New Roman" w:cs="Times New Roman"/>
+          <w:color w:val="auto"/>
+          <w:sz w:val="24"/>
+          <w:szCs w:val="24"/>
+        </w:rPr>
+        <w:t>DepartmentID</w:t>
+      </w:r>
+      <w:proofErr w:type="spellEnd"/>
+      <w:r>
+        <w:rPr>
+          <w:rFonts w:ascii="Times New Roman" w:hAnsi="Times New Roman" w:cs="Times New Roman"/>
+          <w:color w:val="auto"/>
+          <w:sz w:val="24"/>
+          <w:szCs w:val="24"/>
+        </w:rPr>
+        <w:t xml:space="preserve">, </w:t>
+      </w:r>
+      <w:proofErr w:type="spellStart"/>
+      <w:r>
+        <w:rPr>
+          <w:rFonts w:ascii="Times New Roman" w:hAnsi="Times New Roman" w:cs="Times New Roman"/>
+          <w:color w:val="auto"/>
+          <w:sz w:val="24"/>
+          <w:szCs w:val="24"/>
+        </w:rPr>
+        <w:t>DepartmentName</w:t>
+      </w:r>
+      <w:proofErr w:type="spellEnd"/>
+      <w:r>
+        <w:rPr>
+          <w:rFonts w:ascii="Times New Roman" w:hAnsi="Times New Roman" w:cs="Times New Roman"/>
+          <w:color w:val="auto"/>
+          <w:sz w:val="24"/>
+          <w:szCs w:val="24"/>
+        </w:rPr>
+        <w:t>)</w:t>
       </w:r>
     </w:p>
     <w:p>
@@ -11113,7 +12568,27 @@
           <w:sz w:val="24"/>
           <w:szCs w:val="24"/>
         </w:rPr>
-        <w:t>INSERT INTO Patient (PatientID, FirstName, LastName, Gender, Phone)</w:t>
+        <w:t>INSERT INTO Patient (</w:t>
+      </w:r>
+      <w:proofErr w:type="spellStart"/>
+      <w:r>
+        <w:rPr>
+          <w:rFonts w:ascii="Times New Roman" w:hAnsi="Times New Roman" w:cs="Times New Roman"/>
+          <w:color w:val="auto"/>
+          <w:sz w:val="24"/>
+          <w:szCs w:val="24"/>
+        </w:rPr>
+        <w:t>PatientID</w:t>
+      </w:r>
+      <w:proofErr w:type="spellEnd"/>
+      <w:r>
+        <w:rPr>
+          <w:rFonts w:ascii="Times New Roman" w:hAnsi="Times New Roman" w:cs="Times New Roman"/>
+          <w:color w:val="auto"/>
+          <w:sz w:val="24"/>
+          <w:szCs w:val="24"/>
+        </w:rPr>
+        <w:t>, FirstName, LastName, Gender, Phone)</w:t>
       </w:r>
     </w:p>
     <w:p>
@@ -11304,6 +12779,745 @@
     </w:p>
     <w:p>
       <w:pPr>
+        <w:pStyle w:val="ListBullet"/>
+        <w:numPr>
+          <w:ilvl w:val="0"/>
+          <w:numId w:val="0"/>
+        </w:numPr>
+        <w:ind w:left="576"/>
+        <w:rPr>
+          <w:rFonts w:ascii="Times New Roman" w:hAnsi="Times New Roman" w:cs="Times New Roman"/>
+          <w:color w:val="auto"/>
+          <w:sz w:val="24"/>
+          <w:szCs w:val="24"/>
+        </w:rPr>
+      </w:pPr>
+    </w:p>
+    <w:p>
+      <w:pPr>
+        <w:pStyle w:val="ListBullet"/>
+        <w:numPr>
+          <w:ilvl w:val="0"/>
+          <w:numId w:val="0"/>
+        </w:numPr>
+        <w:ind w:left="576"/>
+        <w:rPr>
+          <w:rFonts w:ascii="Times New Roman" w:hAnsi="Times New Roman" w:cs="Times New Roman"/>
+          <w:color w:val="auto"/>
+          <w:sz w:val="24"/>
+          <w:szCs w:val="24"/>
+        </w:rPr>
+      </w:pPr>
+    </w:p>
+    <w:p>
+      <w:pPr>
+        <w:pStyle w:val="ListBullet"/>
+        <w:numPr>
+          <w:ilvl w:val="0"/>
+          <w:numId w:val="0"/>
+        </w:numPr>
+        <w:ind w:left="576"/>
+        <w:rPr>
+          <w:rFonts w:ascii="Times New Roman" w:hAnsi="Times New Roman" w:cs="Times New Roman"/>
+          <w:color w:val="auto"/>
+          <w:sz w:val="24"/>
+          <w:szCs w:val="24"/>
+        </w:rPr>
+      </w:pPr>
+    </w:p>
+    <w:p>
+      <w:pPr>
+        <w:pStyle w:val="ListBullet"/>
+        <w:numPr>
+          <w:ilvl w:val="0"/>
+          <w:numId w:val="0"/>
+        </w:numPr>
+        <w:ind w:left="576"/>
+        <w:rPr>
+          <w:rFonts w:ascii="Times New Roman" w:hAnsi="Times New Roman" w:cs="Times New Roman"/>
+          <w:color w:val="auto"/>
+          <w:sz w:val="24"/>
+          <w:szCs w:val="24"/>
+        </w:rPr>
+      </w:pPr>
+    </w:p>
+    <w:p>
+      <w:pPr>
+        <w:pStyle w:val="ListBullet"/>
+        <w:numPr>
+          <w:ilvl w:val="0"/>
+          <w:numId w:val="0"/>
+        </w:numPr>
+        <w:ind w:left="576"/>
+        <w:rPr>
+          <w:rFonts w:ascii="Times New Roman" w:hAnsi="Times New Roman" w:cs="Times New Roman"/>
+          <w:color w:val="auto"/>
+          <w:sz w:val="24"/>
+          <w:szCs w:val="24"/>
+        </w:rPr>
+      </w:pPr>
+    </w:p>
+    <w:p>
+      <w:pPr>
+        <w:pStyle w:val="ListBullet"/>
+        <w:numPr>
+          <w:ilvl w:val="0"/>
+          <w:numId w:val="0"/>
+        </w:numPr>
+        <w:ind w:left="576"/>
+        <w:rPr>
+          <w:rFonts w:ascii="Times New Roman" w:hAnsi="Times New Roman" w:cs="Times New Roman"/>
+          <w:color w:val="auto"/>
+          <w:sz w:val="24"/>
+          <w:szCs w:val="24"/>
+        </w:rPr>
+      </w:pPr>
+    </w:p>
+    <w:p>
+      <w:pPr>
+        <w:pStyle w:val="ListBullet"/>
+        <w:numPr>
+          <w:ilvl w:val="0"/>
+          <w:numId w:val="0"/>
+        </w:numPr>
+        <w:ind w:left="576"/>
+        <w:rPr>
+          <w:rFonts w:ascii="Times New Roman" w:hAnsi="Times New Roman" w:cs="Times New Roman"/>
+          <w:color w:val="auto"/>
+          <w:sz w:val="24"/>
+          <w:szCs w:val="24"/>
+        </w:rPr>
+      </w:pPr>
+    </w:p>
+    <w:p>
+      <w:pPr>
+        <w:pStyle w:val="ListBullet"/>
+        <w:numPr>
+          <w:ilvl w:val="0"/>
+          <w:numId w:val="0"/>
+        </w:numPr>
+        <w:ind w:left="576"/>
+        <w:rPr>
+          <w:rFonts w:ascii="Times New Roman" w:hAnsi="Times New Roman" w:cs="Times New Roman"/>
+          <w:color w:val="auto"/>
+          <w:sz w:val="24"/>
+          <w:szCs w:val="24"/>
+        </w:rPr>
+      </w:pPr>
+    </w:p>
+    <w:p>
+      <w:pPr>
+        <w:pStyle w:val="ListBullet"/>
+        <w:numPr>
+          <w:ilvl w:val="0"/>
+          <w:numId w:val="0"/>
+        </w:numPr>
+        <w:ind w:left="576"/>
+        <w:rPr>
+          <w:rFonts w:ascii="Times New Roman" w:hAnsi="Times New Roman" w:cs="Times New Roman"/>
+          <w:color w:val="auto"/>
+          <w:sz w:val="24"/>
+          <w:szCs w:val="24"/>
+        </w:rPr>
+      </w:pPr>
+    </w:p>
+    <w:p>
+      <w:pPr>
+        <w:pStyle w:val="ListBullet"/>
+        <w:numPr>
+          <w:ilvl w:val="0"/>
+          <w:numId w:val="45"/>
+        </w:numPr>
+        <w:rPr>
+          <w:rFonts w:ascii="Times New Roman" w:hAnsi="Times New Roman" w:cs="Times New Roman"/>
+          <w:b/>
+          <w:bCs/>
+          <w:color w:val="auto"/>
+          <w:sz w:val="24"/>
+          <w:szCs w:val="24"/>
+        </w:rPr>
+      </w:pPr>
+      <w:r>
+        <w:rPr>
+          <w:rFonts w:ascii="Times New Roman" w:hAnsi="Times New Roman" w:cs="Times New Roman"/>
+          <w:b/>
+          <w:bCs/>
+          <w:color w:val="auto"/>
+          <w:sz w:val="24"/>
+          <w:szCs w:val="24"/>
+        </w:rPr>
+        <w:lastRenderedPageBreak/>
+        <w:t>Doctor</w:t>
+      </w:r>
+    </w:p>
+    <w:p>
+      <w:pPr>
+        <w:pStyle w:val="ListBullet"/>
+        <w:numPr>
+          <w:ilvl w:val="0"/>
+          <w:numId w:val="0"/>
+        </w:numPr>
+        <w:ind w:left="288"/>
+        <w:rPr>
+          <w:rFonts w:ascii="Times New Roman" w:hAnsi="Times New Roman" w:cs="Times New Roman"/>
+          <w:color w:val="auto"/>
+          <w:sz w:val="24"/>
+          <w:szCs w:val="24"/>
+        </w:rPr>
+      </w:pPr>
+    </w:p>
+    <w:p>
+      <w:pPr>
+        <w:pStyle w:val="ListBullet"/>
+        <w:numPr>
+          <w:ilvl w:val="0"/>
+          <w:numId w:val="0"/>
+        </w:numPr>
+        <w:ind w:left="288"/>
+        <w:rPr>
+          <w:rFonts w:ascii="Times New Roman" w:hAnsi="Times New Roman" w:cs="Times New Roman"/>
+          <w:color w:val="auto"/>
+          <w:sz w:val="24"/>
+          <w:szCs w:val="24"/>
+        </w:rPr>
+      </w:pPr>
+      <w:r>
+        <w:rPr>
+          <w:rFonts w:ascii="Times New Roman" w:hAnsi="Times New Roman" w:cs="Times New Roman"/>
+          <w:color w:val="auto"/>
+          <w:sz w:val="24"/>
+          <w:szCs w:val="24"/>
+        </w:rPr>
+        <w:t>INSERT INTO Doctor (</w:t>
+      </w:r>
+      <w:proofErr w:type="spellStart"/>
+      <w:r>
+        <w:rPr>
+          <w:rFonts w:ascii="Times New Roman" w:hAnsi="Times New Roman" w:cs="Times New Roman"/>
+          <w:color w:val="auto"/>
+          <w:sz w:val="24"/>
+          <w:szCs w:val="24"/>
+        </w:rPr>
+        <w:t>DoctorID</w:t>
+      </w:r>
+      <w:proofErr w:type="spellEnd"/>
+      <w:r>
+        <w:rPr>
+          <w:rFonts w:ascii="Times New Roman" w:hAnsi="Times New Roman" w:cs="Times New Roman"/>
+          <w:color w:val="auto"/>
+          <w:sz w:val="24"/>
+          <w:szCs w:val="24"/>
+        </w:rPr>
+        <w:t xml:space="preserve">, FirstName, LastName, Phone, </w:t>
+      </w:r>
+      <w:proofErr w:type="spellStart"/>
+      <w:r>
+        <w:rPr>
+          <w:rFonts w:ascii="Times New Roman" w:hAnsi="Times New Roman" w:cs="Times New Roman"/>
+          <w:color w:val="auto"/>
+          <w:sz w:val="24"/>
+          <w:szCs w:val="24"/>
+        </w:rPr>
+        <w:t>DepartmentID</w:t>
+      </w:r>
+      <w:proofErr w:type="spellEnd"/>
+      <w:r>
+        <w:rPr>
+          <w:rFonts w:ascii="Times New Roman" w:hAnsi="Times New Roman" w:cs="Times New Roman"/>
+          <w:color w:val="auto"/>
+          <w:sz w:val="24"/>
+          <w:szCs w:val="24"/>
+        </w:rPr>
+        <w:t>)</w:t>
+      </w:r>
+    </w:p>
+    <w:p>
+      <w:pPr>
+        <w:pStyle w:val="ListBullet"/>
+        <w:numPr>
+          <w:ilvl w:val="0"/>
+          <w:numId w:val="0"/>
+        </w:numPr>
+        <w:ind w:left="288"/>
+        <w:rPr>
+          <w:rFonts w:ascii="Times New Roman" w:hAnsi="Times New Roman" w:cs="Times New Roman"/>
+          <w:color w:val="auto"/>
+          <w:sz w:val="24"/>
+          <w:szCs w:val="24"/>
+        </w:rPr>
+      </w:pPr>
+      <w:r>
+        <w:rPr>
+          <w:rFonts w:ascii="Times New Roman" w:hAnsi="Times New Roman" w:cs="Times New Roman"/>
+          <w:color w:val="auto"/>
+          <w:sz w:val="24"/>
+          <w:szCs w:val="24"/>
+        </w:rPr>
+        <w:t>VALUES</w:t>
+      </w:r>
+    </w:p>
+    <w:p>
+      <w:pPr>
+        <w:pStyle w:val="ListBullet"/>
+        <w:numPr>
+          <w:ilvl w:val="0"/>
+          <w:numId w:val="0"/>
+        </w:numPr>
+        <w:ind w:left="288"/>
+        <w:rPr>
+          <w:rFonts w:ascii="Times New Roman" w:hAnsi="Times New Roman" w:cs="Times New Roman"/>
+          <w:color w:val="auto"/>
+          <w:sz w:val="24"/>
+          <w:szCs w:val="24"/>
+        </w:rPr>
+      </w:pPr>
+      <w:r>
+        <w:rPr>
+          <w:rFonts w:ascii="Times New Roman" w:hAnsi="Times New Roman" w:cs="Times New Roman"/>
+          <w:color w:val="auto"/>
+          <w:sz w:val="24"/>
+          <w:szCs w:val="24"/>
+        </w:rPr>
+        <w:t>(240050857, 'Ramadan', 'Hakami', '0501234560', 1),</w:t>
+      </w:r>
+    </w:p>
+    <w:p>
+      <w:pPr>
+        <w:pStyle w:val="ListBullet"/>
+        <w:numPr>
+          <w:ilvl w:val="0"/>
+          <w:numId w:val="0"/>
+        </w:numPr>
+        <w:ind w:left="288"/>
+        <w:rPr>
+          <w:rFonts w:ascii="Times New Roman" w:hAnsi="Times New Roman" w:cs="Times New Roman"/>
+          <w:color w:val="auto"/>
+          <w:sz w:val="24"/>
+          <w:szCs w:val="24"/>
+        </w:rPr>
+      </w:pPr>
+      <w:r>
+        <w:rPr>
+          <w:rFonts w:ascii="Times New Roman" w:hAnsi="Times New Roman" w:cs="Times New Roman"/>
+          <w:color w:val="auto"/>
+          <w:sz w:val="24"/>
+          <w:szCs w:val="24"/>
+        </w:rPr>
+        <w:t>(240024427, 'Mohammed', '</w:t>
+      </w:r>
+      <w:proofErr w:type="spellStart"/>
+      <w:r>
+        <w:rPr>
+          <w:rFonts w:ascii="Times New Roman" w:hAnsi="Times New Roman" w:cs="Times New Roman"/>
+          <w:color w:val="auto"/>
+          <w:sz w:val="24"/>
+          <w:szCs w:val="24"/>
+        </w:rPr>
+        <w:t>Alshuaibi</w:t>
+      </w:r>
+      <w:proofErr w:type="spellEnd"/>
+      <w:r>
+        <w:rPr>
+          <w:rFonts w:ascii="Times New Roman" w:hAnsi="Times New Roman" w:cs="Times New Roman"/>
+          <w:color w:val="auto"/>
+          <w:sz w:val="24"/>
+          <w:szCs w:val="24"/>
+        </w:rPr>
+        <w:t>', '0501234561', 2),</w:t>
+      </w:r>
+    </w:p>
+    <w:p>
+      <w:pPr>
+        <w:pStyle w:val="ListBullet"/>
+        <w:numPr>
+          <w:ilvl w:val="0"/>
+          <w:numId w:val="0"/>
+        </w:numPr>
+        <w:ind w:left="288"/>
+        <w:rPr>
+          <w:rFonts w:ascii="Times New Roman" w:hAnsi="Times New Roman" w:cs="Times New Roman"/>
+          <w:color w:val="auto"/>
+          <w:sz w:val="24"/>
+          <w:szCs w:val="24"/>
+        </w:rPr>
+      </w:pPr>
+      <w:r>
+        <w:rPr>
+          <w:rFonts w:ascii="Times New Roman" w:hAnsi="Times New Roman" w:cs="Times New Roman"/>
+          <w:color w:val="auto"/>
+          <w:sz w:val="24"/>
+          <w:szCs w:val="24"/>
+        </w:rPr>
+        <w:t>(240048280, 'Rakan', '</w:t>
+      </w:r>
+      <w:proofErr w:type="spellStart"/>
+      <w:r>
+        <w:rPr>
+          <w:rFonts w:ascii="Times New Roman" w:hAnsi="Times New Roman" w:cs="Times New Roman"/>
+          <w:color w:val="auto"/>
+          <w:sz w:val="24"/>
+          <w:szCs w:val="24"/>
+        </w:rPr>
+        <w:t>Alqu</w:t>
+      </w:r>
+      <w:proofErr w:type="spellEnd"/>
+      <w:r>
+        <w:rPr>
+          <w:rFonts w:ascii="Times New Roman" w:hAnsi="Times New Roman" w:cs="Times New Roman"/>
+          <w:color w:val="auto"/>
+          <w:sz w:val="24"/>
+          <w:szCs w:val="24"/>
+        </w:rPr>
+        <w:t>', '0501234562', 3),</w:t>
+      </w:r>
+    </w:p>
+    <w:p>
+      <w:pPr>
+        <w:pStyle w:val="ListBullet"/>
+        <w:numPr>
+          <w:ilvl w:val="0"/>
+          <w:numId w:val="0"/>
+        </w:numPr>
+        <w:ind w:left="288"/>
+        <w:rPr>
+          <w:rFonts w:ascii="Times New Roman" w:hAnsi="Times New Roman" w:cs="Times New Roman"/>
+          <w:color w:val="auto"/>
+          <w:sz w:val="24"/>
+          <w:szCs w:val="24"/>
+        </w:rPr>
+      </w:pPr>
+      <w:r>
+        <w:rPr>
+          <w:rFonts w:ascii="Times New Roman" w:hAnsi="Times New Roman" w:cs="Times New Roman"/>
+          <w:color w:val="auto"/>
+          <w:sz w:val="24"/>
+          <w:szCs w:val="24"/>
+        </w:rPr>
+        <w:t>(210024447, 'Ahmed', '</w:t>
+      </w:r>
+      <w:proofErr w:type="spellStart"/>
+      <w:r>
+        <w:rPr>
+          <w:rFonts w:ascii="Times New Roman" w:hAnsi="Times New Roman" w:cs="Times New Roman"/>
+          <w:color w:val="auto"/>
+          <w:sz w:val="24"/>
+          <w:szCs w:val="24"/>
+        </w:rPr>
+        <w:t>Almuqrin</w:t>
+      </w:r>
+      <w:proofErr w:type="spellEnd"/>
+      <w:r>
+        <w:rPr>
+          <w:rFonts w:ascii="Times New Roman" w:hAnsi="Times New Roman" w:cs="Times New Roman"/>
+          <w:color w:val="auto"/>
+          <w:sz w:val="24"/>
+          <w:szCs w:val="24"/>
+        </w:rPr>
+        <w:t>', '0501234563', 4),</w:t>
+      </w:r>
+    </w:p>
+    <w:p>
+      <w:pPr>
+        <w:pStyle w:val="ListBullet"/>
+        <w:numPr>
+          <w:ilvl w:val="0"/>
+          <w:numId w:val="0"/>
+        </w:numPr>
+        <w:ind w:left="288"/>
+        <w:rPr>
+          <w:rFonts w:ascii="Times New Roman" w:hAnsi="Times New Roman" w:cs="Times New Roman"/>
+          <w:color w:val="auto"/>
+          <w:sz w:val="24"/>
+          <w:szCs w:val="24"/>
+        </w:rPr>
+      </w:pPr>
+      <w:r>
+        <w:rPr>
+          <w:rFonts w:ascii="Times New Roman" w:hAnsi="Times New Roman" w:cs="Times New Roman"/>
+          <w:color w:val="auto"/>
+          <w:sz w:val="24"/>
+          <w:szCs w:val="24"/>
+        </w:rPr>
+        <w:t>(210020000, 'Saeed', 'Alqarni', '0501234564', 5);</w:t>
+      </w:r>
+    </w:p>
+    <w:p>
+      <w:pPr>
+        <w:pStyle w:val="ListBullet"/>
+        <w:numPr>
+          <w:ilvl w:val="0"/>
+          <w:numId w:val="0"/>
+        </w:numPr>
+        <w:ind w:left="288"/>
+        <w:rPr>
+          <w:rFonts w:ascii="Times New Roman" w:hAnsi="Times New Roman" w:cs="Times New Roman"/>
+          <w:color w:val="auto"/>
+          <w:sz w:val="24"/>
+          <w:szCs w:val="24"/>
+        </w:rPr>
+      </w:pPr>
+    </w:p>
+    <w:p>
+      <w:pPr>
+        <w:pStyle w:val="ListBullet"/>
+        <w:numPr>
+          <w:ilvl w:val="0"/>
+          <w:numId w:val="45"/>
+        </w:numPr>
+        <w:rPr>
+          <w:rFonts w:ascii="Times New Roman" w:hAnsi="Times New Roman" w:cs="Times New Roman"/>
+          <w:b/>
+          <w:bCs/>
+          <w:color w:val="auto"/>
+          <w:sz w:val="24"/>
+          <w:szCs w:val="24"/>
+        </w:rPr>
+      </w:pPr>
+      <w:r>
+        <w:rPr>
+          <w:rFonts w:ascii="Times New Roman" w:hAnsi="Times New Roman" w:cs="Times New Roman"/>
+          <w:b/>
+          <w:bCs/>
+          <w:color w:val="auto"/>
+          <w:sz w:val="24"/>
+          <w:szCs w:val="24"/>
+        </w:rPr>
+        <w:t>General Practitioner</w:t>
+      </w:r>
+    </w:p>
+    <w:p>
+      <w:pPr>
+        <w:pStyle w:val="ListBullet"/>
+        <w:numPr>
+          <w:ilvl w:val="0"/>
+          <w:numId w:val="0"/>
+        </w:numPr>
+        <w:ind w:left="288"/>
+        <w:rPr>
+          <w:rFonts w:ascii="Times New Roman" w:hAnsi="Times New Roman" w:cs="Times New Roman"/>
+          <w:color w:val="auto"/>
+          <w:sz w:val="24"/>
+          <w:szCs w:val="24"/>
+        </w:rPr>
+      </w:pPr>
+    </w:p>
+    <w:p>
+      <w:pPr>
+        <w:pStyle w:val="ListBullet"/>
+        <w:numPr>
+          <w:ilvl w:val="0"/>
+          <w:numId w:val="0"/>
+        </w:numPr>
+        <w:ind w:left="288"/>
+        <w:rPr>
+          <w:rFonts w:ascii="Times New Roman" w:hAnsi="Times New Roman" w:cs="Times New Roman"/>
+          <w:color w:val="auto"/>
+          <w:sz w:val="24"/>
+          <w:szCs w:val="24"/>
+        </w:rPr>
+      </w:pPr>
+      <w:r>
+        <w:rPr>
+          <w:rFonts w:ascii="Times New Roman" w:hAnsi="Times New Roman" w:cs="Times New Roman"/>
+          <w:color w:val="auto"/>
+          <w:sz w:val="24"/>
+          <w:szCs w:val="24"/>
+        </w:rPr>
+        <w:t xml:space="preserve">INSERT INTO </w:t>
+      </w:r>
+      <w:proofErr w:type="spellStart"/>
+      <w:r>
+        <w:rPr>
+          <w:rFonts w:ascii="Times New Roman" w:hAnsi="Times New Roman" w:cs="Times New Roman"/>
+          <w:color w:val="auto"/>
+          <w:sz w:val="24"/>
+          <w:szCs w:val="24"/>
+        </w:rPr>
+        <w:t>GeneralPractitioner</w:t>
+      </w:r>
+      <w:proofErr w:type="spellEnd"/>
+      <w:r>
+        <w:rPr>
+          <w:rFonts w:ascii="Times New Roman" w:hAnsi="Times New Roman" w:cs="Times New Roman"/>
+          <w:color w:val="auto"/>
+          <w:sz w:val="24"/>
+          <w:szCs w:val="24"/>
+        </w:rPr>
+        <w:t xml:space="preserve"> (</w:t>
+      </w:r>
+      <w:proofErr w:type="spellStart"/>
+      <w:r>
+        <w:rPr>
+          <w:rFonts w:ascii="Times New Roman" w:hAnsi="Times New Roman" w:cs="Times New Roman"/>
+          <w:color w:val="auto"/>
+          <w:sz w:val="24"/>
+          <w:szCs w:val="24"/>
+        </w:rPr>
+        <w:t>DoctorID</w:t>
+      </w:r>
+      <w:proofErr w:type="spellEnd"/>
+      <w:r>
+        <w:rPr>
+          <w:rFonts w:ascii="Times New Roman" w:hAnsi="Times New Roman" w:cs="Times New Roman"/>
+          <w:color w:val="auto"/>
+          <w:sz w:val="24"/>
+          <w:szCs w:val="24"/>
+        </w:rPr>
+        <w:t>)</w:t>
+      </w:r>
+    </w:p>
+    <w:p>
+      <w:pPr>
+        <w:pStyle w:val="ListBullet"/>
+        <w:numPr>
+          <w:ilvl w:val="0"/>
+          <w:numId w:val="0"/>
+        </w:numPr>
+        <w:ind w:left="288"/>
+        <w:rPr>
+          <w:rFonts w:ascii="Times New Roman" w:hAnsi="Times New Roman" w:cs="Times New Roman"/>
+          <w:color w:val="auto"/>
+          <w:sz w:val="24"/>
+          <w:szCs w:val="24"/>
+        </w:rPr>
+      </w:pPr>
+      <w:r>
+        <w:rPr>
+          <w:rFonts w:ascii="Times New Roman" w:hAnsi="Times New Roman" w:cs="Times New Roman"/>
+          <w:color w:val="auto"/>
+          <w:sz w:val="24"/>
+          <w:szCs w:val="24"/>
+        </w:rPr>
+        <w:t>VALUES</w:t>
+      </w:r>
+    </w:p>
+    <w:p>
+      <w:pPr>
+        <w:pStyle w:val="ListBullet"/>
+        <w:numPr>
+          <w:ilvl w:val="0"/>
+          <w:numId w:val="0"/>
+        </w:numPr>
+        <w:ind w:left="288"/>
+        <w:rPr>
+          <w:rFonts w:ascii="Times New Roman" w:hAnsi="Times New Roman" w:cs="Times New Roman"/>
+          <w:color w:val="auto"/>
+          <w:sz w:val="24"/>
+          <w:szCs w:val="24"/>
+        </w:rPr>
+      </w:pPr>
+      <w:r>
+        <w:rPr>
+          <w:rFonts w:ascii="Times New Roman" w:hAnsi="Times New Roman" w:cs="Times New Roman"/>
+          <w:color w:val="auto"/>
+          <w:sz w:val="24"/>
+          <w:szCs w:val="24"/>
+        </w:rPr>
+        <w:t>(240050857),</w:t>
+      </w:r>
+    </w:p>
+    <w:p>
+      <w:pPr>
+        <w:pStyle w:val="ListBullet"/>
+        <w:numPr>
+          <w:ilvl w:val="0"/>
+          <w:numId w:val="0"/>
+        </w:numPr>
+        <w:ind w:left="288"/>
+        <w:rPr>
+          <w:rFonts w:ascii="Times New Roman" w:hAnsi="Times New Roman" w:cs="Times New Roman"/>
+          <w:color w:val="auto"/>
+          <w:sz w:val="24"/>
+          <w:szCs w:val="24"/>
+          <w:rtl/>
+        </w:rPr>
+      </w:pPr>
+      <w:r>
+        <w:rPr>
+          <w:rFonts w:ascii="Times New Roman" w:hAnsi="Times New Roman" w:cs="Times New Roman"/>
+          <w:color w:val="auto"/>
+          <w:sz w:val="24"/>
+          <w:szCs w:val="24"/>
+        </w:rPr>
+        <w:t>(240024427);</w:t>
+      </w:r>
+    </w:p>
+    <w:p>
+      <w:pPr>
+        <w:pStyle w:val="ListBullet"/>
+        <w:numPr>
+          <w:ilvl w:val="0"/>
+          <w:numId w:val="0"/>
+        </w:numPr>
+        <w:ind w:left="288"/>
+        <w:rPr>
+          <w:rFonts w:ascii="Times New Roman" w:hAnsi="Times New Roman" w:cs="Times New Roman"/>
+          <w:color w:val="auto"/>
+          <w:sz w:val="24"/>
+          <w:szCs w:val="24"/>
+        </w:rPr>
+      </w:pPr>
+    </w:p>
+    <w:p>
+      <w:pPr>
+        <w:pStyle w:val="ListBullet"/>
+        <w:numPr>
+          <w:ilvl w:val="0"/>
+          <w:numId w:val="0"/>
+        </w:numPr>
+        <w:ind w:left="576"/>
+        <w:rPr>
+          <w:rFonts w:ascii="Times New Roman" w:hAnsi="Times New Roman" w:cs="Times New Roman"/>
+          <w:color w:val="auto"/>
+          <w:sz w:val="24"/>
+          <w:szCs w:val="24"/>
+        </w:rPr>
+      </w:pPr>
+      <w:r>
+        <w:rPr>
+          <w:noProof/>
+        </w:rPr>
+        <w:drawing>
+          <wp:inline distT="0" distB="0" distL="0" distR="0" wp14:anchorId="6013E7E3" wp14:editId="20011230">
+            <wp:extent cx="5349240" cy="3124835"/>
+            <wp:effectExtent l="0" t="0" r="3810" b="0"/>
+            <wp:docPr id="419685817" name="Picture 1"/>
+            <wp:cNvGraphicFramePr>
+              <a:graphicFrameLocks xmlns:a="http://schemas.openxmlformats.org/drawingml/2006/main" noChangeAspect="1"/>
+            </wp:cNvGraphicFramePr>
+            <a:graphic xmlns:a="http://schemas.openxmlformats.org/drawingml/2006/main">
+              <a:graphicData uri="http://schemas.openxmlformats.org/drawingml/2006/picture">
+                <pic:pic xmlns:pic="http://schemas.openxmlformats.org/drawingml/2006/picture">
+                  <pic:nvPicPr>
+                    <pic:cNvPr id="419685817" name="Picture 1"/>
+                    <pic:cNvPicPr>
+                      <a:picLocks noChangeAspect="1"/>
+                    </pic:cNvPicPr>
+                  </pic:nvPicPr>
+                  <pic:blipFill>
+                    <a:blip r:embed="rId22"/>
+                    <a:stretch>
+                      <a:fillRect/>
+                    </a:stretch>
+                  </pic:blipFill>
+                  <pic:spPr>
+                    <a:xfrm>
+                      <a:off x="0" y="0"/>
+                      <a:ext cx="5349240" cy="3124835"/>
+                    </a:xfrm>
+                    <a:prstGeom prst="rect">
+                      <a:avLst/>
+                    </a:prstGeom>
+                  </pic:spPr>
+                </pic:pic>
+              </a:graphicData>
+            </a:graphic>
+          </wp:inline>
+        </w:drawing>
+      </w:r>
+    </w:p>
+    <w:p>
+      <w:pPr>
         <w:pStyle w:val="Heading1"/>
       </w:pPr>
       <w:r>
@@ -11759,30 +13973,9 @@
           <w:sz w:val="24"/>
           <w:szCs w:val="24"/>
         </w:rPr>
-        <w:t>SQL Script (.sql)</w:t>
-      </w:r>
-      <w:r>
-        <w:rPr>
-          <w:rFonts w:ascii="Times New Roman" w:hAnsi="Times New Roman" w:cs="Times New Roman"/>
-          <w:sz w:val="24"/>
-          <w:szCs w:val="24"/>
-        </w:rPr>
-        <w:t xml:space="preserve"> – Complete SQL implementation of the project. </w:t>
-      </w:r>
-    </w:p>
-    <w:p>
-      <w:pPr>
-        <w:numPr>
-          <w:ilvl w:val="0"/>
-          <w:numId w:val="22"/>
-        </w:numPr>
-        <w:spacing w:after="200" w:line="276" w:lineRule="auto"/>
-        <w:rPr>
-          <w:rFonts w:ascii="Times New Roman" w:hAnsi="Times New Roman" w:cs="Times New Roman"/>
-          <w:sz w:val="24"/>
-          <w:szCs w:val="24"/>
-        </w:rPr>
-      </w:pPr>
+        <w:t>SQL Script (.</w:t>
+      </w:r>
+      <w:proofErr w:type="spellStart"/>
       <w:r>
         <w:rPr>
           <w:rFonts w:ascii="Times New Roman" w:hAnsi="Times New Roman" w:cs="Times New Roman"/>
@@ -11791,30 +13984,9 @@
           <w:sz w:val="24"/>
           <w:szCs w:val="24"/>
         </w:rPr>
-        <w:t>GitHub Repository</w:t>
-      </w:r>
-      <w:r>
-        <w:rPr>
-          <w:rFonts w:ascii="Times New Roman" w:hAnsi="Times New Roman" w:cs="Times New Roman"/>
-          <w:sz w:val="24"/>
-          <w:szCs w:val="24"/>
-        </w:rPr>
-        <w:t xml:space="preserve"> – Repository link with the complete project and commit history. </w:t>
-      </w:r>
-    </w:p>
-    <w:p>
-      <w:pPr>
-        <w:numPr>
-          <w:ilvl w:val="0"/>
-          <w:numId w:val="22"/>
-        </w:numPr>
-        <w:spacing w:after="200" w:line="276" w:lineRule="auto"/>
-        <w:rPr>
-          <w:rFonts w:ascii="Times New Roman" w:hAnsi="Times New Roman" w:cs="Times New Roman"/>
-          <w:sz w:val="24"/>
-          <w:szCs w:val="24"/>
-        </w:rPr>
-      </w:pPr>
+        <w:t>sql</w:t>
+      </w:r>
+      <w:proofErr w:type="spellEnd"/>
       <w:r>
         <w:rPr>
           <w:rFonts w:ascii="Times New Roman" w:hAnsi="Times New Roman" w:cs="Times New Roman"/>
@@ -11823,15 +13995,15 @@
           <w:sz w:val="24"/>
           <w:szCs w:val="24"/>
         </w:rPr>
-        <w:t>Mid-Project Progress Report</w:t>
-      </w:r>
-      <w:r>
-        <w:rPr>
-          <w:rFonts w:ascii="Times New Roman" w:hAnsi="Times New Roman" w:cs="Times New Roman"/>
-          <w:sz w:val="24"/>
-          <w:szCs w:val="24"/>
-        </w:rPr>
-        <w:t xml:space="preserve"> – Summary of progress, challenges, decisions, and team contributions. </w:t>
+        <w:t>)</w:t>
+      </w:r>
+      <w:r>
+        <w:rPr>
+          <w:rFonts w:ascii="Times New Roman" w:hAnsi="Times New Roman" w:cs="Times New Roman"/>
+          <w:sz w:val="24"/>
+          <w:szCs w:val="24"/>
+        </w:rPr>
+        <w:t xml:space="preserve"> – Complete SQL implementation of the project. </w:t>
       </w:r>
     </w:p>
     <w:p>
@@ -11855,6 +14027,70 @@
           <w:sz w:val="24"/>
           <w:szCs w:val="24"/>
         </w:rPr>
+        <w:t>GitHub Repository</w:t>
+      </w:r>
+      <w:r>
+        <w:rPr>
+          <w:rFonts w:ascii="Times New Roman" w:hAnsi="Times New Roman" w:cs="Times New Roman"/>
+          <w:sz w:val="24"/>
+          <w:szCs w:val="24"/>
+        </w:rPr>
+        <w:t xml:space="preserve"> – Repository link with the complete project and commit history. </w:t>
+      </w:r>
+    </w:p>
+    <w:p>
+      <w:pPr>
+        <w:numPr>
+          <w:ilvl w:val="0"/>
+          <w:numId w:val="22"/>
+        </w:numPr>
+        <w:spacing w:after="200" w:line="276" w:lineRule="auto"/>
+        <w:rPr>
+          <w:rFonts w:ascii="Times New Roman" w:hAnsi="Times New Roman" w:cs="Times New Roman"/>
+          <w:sz w:val="24"/>
+          <w:szCs w:val="24"/>
+        </w:rPr>
+      </w:pPr>
+      <w:r>
+        <w:rPr>
+          <w:rFonts w:ascii="Times New Roman" w:hAnsi="Times New Roman" w:cs="Times New Roman"/>
+          <w:b/>
+          <w:bCs/>
+          <w:sz w:val="24"/>
+          <w:szCs w:val="24"/>
+        </w:rPr>
+        <w:t>Mid-Project Progress Report</w:t>
+      </w:r>
+      <w:r>
+        <w:rPr>
+          <w:rFonts w:ascii="Times New Roman" w:hAnsi="Times New Roman" w:cs="Times New Roman"/>
+          <w:sz w:val="24"/>
+          <w:szCs w:val="24"/>
+        </w:rPr>
+        <w:t xml:space="preserve"> – Summary of progress, challenges, decisions, and team contributions. </w:t>
+      </w:r>
+    </w:p>
+    <w:p>
+      <w:pPr>
+        <w:numPr>
+          <w:ilvl w:val="0"/>
+          <w:numId w:val="22"/>
+        </w:numPr>
+        <w:spacing w:after="200" w:line="276" w:lineRule="auto"/>
+        <w:rPr>
+          <w:rFonts w:ascii="Times New Roman" w:hAnsi="Times New Roman" w:cs="Times New Roman"/>
+          <w:sz w:val="24"/>
+          <w:szCs w:val="24"/>
+        </w:rPr>
+      </w:pPr>
+      <w:r>
+        <w:rPr>
+          <w:rFonts w:ascii="Times New Roman" w:hAnsi="Times New Roman" w:cs="Times New Roman"/>
+          <w:b/>
+          <w:bCs/>
+          <w:sz w:val="24"/>
+          <w:szCs w:val="24"/>
+        </w:rPr>
         <w:t>Project Artifacts</w:t>
       </w:r>
       <w:r>
@@ -11929,7 +14165,25 @@
           <w:sz w:val="24"/>
           <w:szCs w:val="24"/>
         </w:rPr>
-        <w:t>Google Colab notebook (if applicable): [link]</w:t>
+        <w:t xml:space="preserve">Google </w:t>
+      </w:r>
+      <w:proofErr w:type="spellStart"/>
+      <w:r>
+        <w:rPr>
+          <w:rFonts w:ascii="Times New Roman" w:hAnsi="Times New Roman" w:cs="Times New Roman"/>
+          <w:sz w:val="24"/>
+          <w:szCs w:val="24"/>
+        </w:rPr>
+        <w:t>Colab</w:t>
+      </w:r>
+      <w:proofErr w:type="spellEnd"/>
+      <w:r>
+        <w:rPr>
+          <w:rFonts w:ascii="Times New Roman" w:hAnsi="Times New Roman" w:cs="Times New Roman"/>
+          <w:sz w:val="24"/>
+          <w:szCs w:val="24"/>
+        </w:rPr>
+        <w:t xml:space="preserve"> notebook (if applicable): [link]</w:t>
       </w:r>
     </w:p>
     <w:p>
@@ -11962,7 +14216,7 @@
       </w:pPr>
     </w:p>
     <w:sectPr>
-      <w:headerReference w:type="default" r:id="rId22"/>
+      <w:headerReference w:type="default" r:id="rId23"/>
       <w:pgSz w:w="12240" w:h="15840" w:code="1"/>
       <w:pgMar w:top="1080" w:right="720" w:bottom="1800" w:left="3096" w:header="1080" w:footer="720" w:gutter="0"/>
       <w:pgNumType w:start="1"/>
@@ -12884,7 +15138,7 @@
             <w:rPr>
               <w:noProof/>
             </w:rPr>
-            <w:instrText>Task 2 – Database Implementation (6 Marks)</w:instrText>
+            <w:instrText>Task 3 – SQL Operations (6 Marks)</w:instrText>
           </w:r>
           <w:r>
             <w:rPr>
@@ -12917,7 +15171,7 @@
             <w:rPr>
               <w:noProof/>
             </w:rPr>
-            <w:instrText>Task 2 – Database Implementation (6 Marks)</w:instrText>
+            <w:instrText>Task 3 – SQL Operations (6 Marks)</w:instrText>
           </w:r>
           <w:r>
             <w:rPr>
@@ -12935,7 +15189,7 @@
             <w:rPr>
               <w:noProof/>
             </w:rPr>
-            <w:t xml:space="preserve">Task 2 – Database Implementation (6 Marks) </w:t>
+            <w:t xml:space="preserve">Task 3 – SQL Operations (6 Marks) </w:t>
           </w:r>
           <w:r>
             <w:fldChar w:fldCharType="end"/>
@@ -16665,17 +18919,11 @@
   </w:num>
   <w:num w:numId="43" w16cid:durableId="973483563">
     <w:abstractNumId w:val="7"/>
-    <w:lvlOverride w:ilvl="0"/>
-    <w:lvlOverride w:ilvl="1"/>
-    <w:lvlOverride w:ilvl="2"/>
-    <w:lvlOverride w:ilvl="3"/>
-    <w:lvlOverride w:ilvl="4"/>
-    <w:lvlOverride w:ilvl="5"/>
-    <w:lvlOverride w:ilvl="6"/>
-    <w:lvlOverride w:ilvl="7"/>
-    <w:lvlOverride w:ilvl="8"/>
   </w:num>
   <w:num w:numId="44" w16cid:durableId="501555736">
+    <w:abstractNumId w:val="4"/>
+  </w:num>
+  <w:num w:numId="45" w16cid:durableId="1632443125">
     <w:abstractNumId w:val="4"/>
     <w:lvlOverride w:ilvl="0"/>
     <w:lvlOverride w:ilvl="1"/>
@@ -18230,6 +20478,7 @@
     <w:rsid w:val="003E5691"/>
     <w:rsid w:val="0040517B"/>
     <w:rsid w:val="00415C82"/>
+    <w:rsid w:val="00445DA8"/>
     <w:rsid w:val="004A7EE6"/>
     <w:rsid w:val="004E5C8C"/>
     <w:rsid w:val="005443A0"/>
@@ -18256,6 +20505,7 @@
     <w:rsid w:val="008C7F6D"/>
     <w:rsid w:val="00900C2A"/>
     <w:rsid w:val="00902777"/>
+    <w:rsid w:val="00941EA5"/>
     <w:rsid w:val="00977680"/>
     <w:rsid w:val="009955B4"/>
     <w:rsid w:val="009A2761"/>
@@ -19123,16 +21373,16 @@
 </file>
 
 <file path=customXml/item2.xml><?xml version="1.0" encoding="utf-8"?>
-<b:Sources xmlns:b="http://schemas.openxmlformats.org/officeDocument/2006/bibliography" SelectedStyle="\APA.XSL" StyleName="APA"/>
-</file>
-
-<file path=customXml/item3.xml><?xml version="1.0" encoding="utf-8"?>
 <?mso-contentType ?>
 <FormTemplates xmlns="http://schemas.microsoft.com/sharepoint/v3/contenttype/forms">
   <Display>DocumentLibraryForm</Display>
   <Edit>AssetEditForm</Edit>
   <New>DocumentLibraryForm</New>
 </FormTemplates>
+</file>
+
+<file path=customXml/item3.xml><?xml version="1.0" encoding="utf-8"?>
+<b:Sources xmlns:b="http://schemas.openxmlformats.org/officeDocument/2006/bibliography" SelectedStyle="\APA.XSL" StyleName="APA"/>
 </file>
 
 <file path=customXml/itemProps1.xml><?xml version="1.0" encoding="utf-8"?>
@@ -19144,17 +21394,17 @@
 </file>
 
 <file path=customXml/itemProps2.xml><?xml version="1.0" encoding="utf-8"?>
+<ds:datastoreItem xmlns:ds="http://schemas.openxmlformats.org/officeDocument/2006/customXml" ds:itemID="{E34C63B7-A026-4A37-9535-4FBB4C03A11D}">
+  <ds:schemaRefs>
+    <ds:schemaRef ds:uri="http://schemas.microsoft.com/sharepoint/v3/contenttype/forms"/>
+  </ds:schemaRefs>
+</ds:datastoreItem>
+</file>
+
+<file path=customXml/itemProps3.xml><?xml version="1.0" encoding="utf-8"?>
 <ds:datastoreItem xmlns:ds="http://schemas.openxmlformats.org/officeDocument/2006/customXml" ds:itemID="{355C5113-D031-41DB-A6D8-43CE1A0E6695}">
   <ds:schemaRefs>
     <ds:schemaRef ds:uri="http://schemas.openxmlformats.org/officeDocument/2006/bibliography"/>
   </ds:schemaRefs>
 </ds:datastoreItem>
-</file>
-
-<file path=customXml/itemProps3.xml><?xml version="1.0" encoding="utf-8"?>
-<ds:datastoreItem xmlns:ds="http://schemas.openxmlformats.org/officeDocument/2006/customXml" ds:itemID="{E34C63B7-A026-4A37-9535-4FBB4C03A11D}">
-  <ds:schemaRefs>
-    <ds:schemaRef ds:uri="http://schemas.microsoft.com/sharepoint/v3/contenttype/forms"/>
-  </ds:schemaRefs>
-</ds:datastoreItem>
 </file>
</xml_diff>

<commit_message>
5 records into Specialist and Appointment Tables
</commit_message>
<xml_diff>
--- a/Introduction to DB-CS350 Project.docx
+++ b/Introduction to DB-CS350 Project.docx
@@ -3871,25 +3871,7 @@
           <w:sz w:val="24"/>
           <w:szCs w:val="24"/>
         </w:rPr>
-        <w:t xml:space="preserve">Task </w:t>
-      </w:r>
-      <w:proofErr w:type="gramStart"/>
-      <w:r>
-        <w:rPr>
-          <w:rFonts w:ascii="Times New Roman" w:hAnsi="Times New Roman" w:cs="Times New Roman"/>
-          <w:sz w:val="24"/>
-          <w:szCs w:val="24"/>
-        </w:rPr>
-        <w:t>1 :</w:t>
-      </w:r>
-      <w:proofErr w:type="gramEnd"/>
-      <w:r>
-        <w:rPr>
-          <w:rFonts w:ascii="Times New Roman" w:hAnsi="Times New Roman" w:cs="Times New Roman"/>
-          <w:sz w:val="24"/>
-          <w:szCs w:val="24"/>
-        </w:rPr>
-        <w:t xml:space="preserve"> database design</w:t>
+        <w:t>Task 1 : database design</w:t>
       </w:r>
     </w:p>
     <w:p>
@@ -4218,25 +4200,7 @@
           <w:sz w:val="24"/>
           <w:szCs w:val="24"/>
         </w:rPr>
-        <w:t xml:space="preserve"> to the live report document, GitHub/GitLab repository, and Google </w:t>
-      </w:r>
-      <w:proofErr w:type="spellStart"/>
-      <w:r>
-        <w:rPr>
-          <w:rFonts w:ascii="Times New Roman" w:hAnsi="Times New Roman" w:cs="Times New Roman"/>
-          <w:sz w:val="24"/>
-          <w:szCs w:val="24"/>
-        </w:rPr>
-        <w:t>Colab</w:t>
-      </w:r>
-      <w:proofErr w:type="spellEnd"/>
-      <w:r>
-        <w:rPr>
-          <w:rFonts w:ascii="Times New Roman" w:hAnsi="Times New Roman" w:cs="Times New Roman"/>
-          <w:sz w:val="24"/>
-          <w:szCs w:val="24"/>
-        </w:rPr>
-        <w:t xml:space="preserve"> notebook (if applicable) in the </w:t>
+        <w:t xml:space="preserve"> to the live report document, GitHub/GitLab repository, and Google Colab notebook (if applicable) in the </w:t>
       </w:r>
       <w:r>
         <w:rPr>
@@ -4992,27 +4956,7 @@
           <w:szCs w:val="24"/>
           <w:lang w:val="es-ES"/>
         </w:rPr>
-        <w:t xml:space="preserve">A complete ER/EER </w:t>
-      </w:r>
-      <w:proofErr w:type="spellStart"/>
-      <w:r>
-        <w:rPr>
-          <w:rFonts w:ascii="Times New Roman" w:hAnsi="Times New Roman" w:cs="Times New Roman"/>
-          <w:sz w:val="24"/>
-          <w:szCs w:val="24"/>
-          <w:lang w:val="es-ES"/>
-        </w:rPr>
-        <w:t>diagram</w:t>
-      </w:r>
-      <w:proofErr w:type="spellEnd"/>
-      <w:r>
-        <w:rPr>
-          <w:rFonts w:ascii="Times New Roman" w:hAnsi="Times New Roman" w:cs="Times New Roman"/>
-          <w:sz w:val="24"/>
-          <w:szCs w:val="24"/>
-          <w:lang w:val="es-ES"/>
-        </w:rPr>
-        <w:t>.</w:t>
+        <w:t>A complete ER/EER diagram.</w:t>
       </w:r>
     </w:p>
     <w:p>
@@ -5526,7 +5470,6 @@
           <w:szCs w:val="24"/>
         </w:rPr>
       </w:pPr>
-      <w:proofErr w:type="spellStart"/>
       <w:r>
         <w:rPr>
           <w:rFonts w:ascii="Times New Roman" w:hAnsi="Times New Roman" w:cs="Times New Roman"/>
@@ -5536,7 +5479,6 @@
         </w:rPr>
         <w:t>GeneralPractitioner</w:t>
       </w:r>
-      <w:proofErr w:type="spellEnd"/>
     </w:p>
     <w:p>
       <w:pPr>
@@ -5755,7 +5697,6 @@
           <w:szCs w:val="24"/>
         </w:rPr>
       </w:pPr>
-      <w:proofErr w:type="spellStart"/>
       <w:r>
         <w:rPr>
           <w:rFonts w:ascii="Times New Roman" w:hAnsi="Times New Roman" w:cs="Times New Roman"/>
@@ -5765,7 +5706,6 @@
         </w:rPr>
         <w:t>GeneralPractitioner</w:t>
       </w:r>
-      <w:proofErr w:type="spellEnd"/>
     </w:p>
     <w:p>
       <w:pPr>
@@ -5994,7 +5934,6 @@
                 <w:color w:val="auto"/>
               </w:rPr>
             </w:pPr>
-            <w:proofErr w:type="spellStart"/>
             <w:r>
               <w:rPr>
                 <w:rFonts w:ascii="Times New Roman" w:hAnsi="Times New Roman" w:cs="Times New Roman"/>
@@ -6002,17 +5941,7 @@
                 <w:bCs/>
                 <w:color w:val="auto"/>
               </w:rPr>
-              <w:t>PatientID</w:t>
-            </w:r>
-            <w:proofErr w:type="spellEnd"/>
-            <w:r>
-              <w:rPr>
-                <w:rFonts w:ascii="Times New Roman" w:hAnsi="Times New Roman" w:cs="Times New Roman"/>
-                <w:b/>
-                <w:bCs/>
-                <w:color w:val="auto"/>
-              </w:rPr>
-              <w:t xml:space="preserve"> (PK)</w:t>
+              <w:t>PatientID (PK)</w:t>
             </w:r>
             <w:r>
               <w:rPr>
@@ -6069,7 +5998,6 @@
                 <w:color w:val="auto"/>
               </w:rPr>
             </w:pPr>
-            <w:proofErr w:type="spellStart"/>
             <w:r>
               <w:rPr>
                 <w:rFonts w:ascii="Times New Roman" w:hAnsi="Times New Roman" w:cs="Times New Roman"/>
@@ -6077,34 +6005,15 @@
                 <w:bCs/>
                 <w:color w:val="auto"/>
               </w:rPr>
-              <w:t>DepartmentID</w:t>
-            </w:r>
-            <w:proofErr w:type="spellEnd"/>
-            <w:r>
-              <w:rPr>
-                <w:rFonts w:ascii="Times New Roman" w:hAnsi="Times New Roman" w:cs="Times New Roman"/>
-                <w:b/>
-                <w:bCs/>
-                <w:color w:val="auto"/>
-              </w:rPr>
-              <w:t xml:space="preserve"> (PK)</w:t>
+              <w:t>DepartmentID (PK)</w:t>
             </w:r>
             <w:r>
               <w:rPr>
                 <w:rFonts w:ascii="Times New Roman" w:hAnsi="Times New Roman" w:cs="Times New Roman"/>
                 <w:color w:val="auto"/>
               </w:rPr>
-              <w:t xml:space="preserve">, </w:t>
+              <w:t>, DepartmentName</w:t>
             </w:r>
-            <w:proofErr w:type="spellStart"/>
-            <w:r>
-              <w:rPr>
-                <w:rFonts w:ascii="Times New Roman" w:hAnsi="Times New Roman" w:cs="Times New Roman"/>
-                <w:color w:val="auto"/>
-              </w:rPr>
-              <w:t>DepartmentName</w:t>
-            </w:r>
-            <w:proofErr w:type="spellEnd"/>
           </w:p>
         </w:tc>
       </w:tr>
@@ -6153,7 +6062,6 @@
                 <w:color w:val="auto"/>
               </w:rPr>
             </w:pPr>
-            <w:proofErr w:type="spellStart"/>
             <w:r>
               <w:rPr>
                 <w:rFonts w:ascii="Times New Roman" w:hAnsi="Times New Roman" w:cs="Times New Roman"/>
@@ -6161,17 +6069,7 @@
                 <w:bCs/>
                 <w:color w:val="auto"/>
               </w:rPr>
-              <w:t>DoctorID</w:t>
-            </w:r>
-            <w:proofErr w:type="spellEnd"/>
-            <w:r>
-              <w:rPr>
-                <w:rFonts w:ascii="Times New Roman" w:hAnsi="Times New Roman" w:cs="Times New Roman"/>
-                <w:b/>
-                <w:bCs/>
-                <w:color w:val="auto"/>
-              </w:rPr>
-              <w:t xml:space="preserve"> (PK)</w:t>
+              <w:t>DoctorID (PK)</w:t>
             </w:r>
             <w:r>
               <w:rPr>
@@ -6180,7 +6078,6 @@
               </w:rPr>
               <w:t xml:space="preserve">, FirstName, LastName, Phone, </w:t>
             </w:r>
-            <w:proofErr w:type="spellStart"/>
             <w:r>
               <w:rPr>
                 <w:rFonts w:ascii="Times New Roman" w:hAnsi="Times New Roman" w:cs="Times New Roman"/>
@@ -6188,17 +6085,7 @@
                 <w:bCs/>
                 <w:color w:val="auto"/>
               </w:rPr>
-              <w:t>DepartmentID</w:t>
-            </w:r>
-            <w:proofErr w:type="spellEnd"/>
-            <w:r>
-              <w:rPr>
-                <w:rFonts w:ascii="Times New Roman" w:hAnsi="Times New Roman" w:cs="Times New Roman"/>
-                <w:b/>
-                <w:bCs/>
-                <w:color w:val="auto"/>
-              </w:rPr>
-              <w:t xml:space="preserve"> (FK)</w:t>
+              <w:t>DepartmentID (FK)</w:t>
             </w:r>
           </w:p>
         </w:tc>
@@ -6222,7 +6109,6 @@
                 <w:color w:val="auto"/>
               </w:rPr>
             </w:pPr>
-            <w:proofErr w:type="spellStart"/>
             <w:r>
               <w:rPr>
                 <w:rFonts w:ascii="Times New Roman" w:hAnsi="Times New Roman" w:cs="Times New Roman"/>
@@ -6230,7 +6116,6 @@
               </w:rPr>
               <w:t>GeneralPractitioner</w:t>
             </w:r>
-            <w:proofErr w:type="spellEnd"/>
           </w:p>
         </w:tc>
         <w:tc>
@@ -6252,7 +6137,6 @@
                 <w:color w:val="auto"/>
               </w:rPr>
             </w:pPr>
-            <w:proofErr w:type="spellStart"/>
             <w:r>
               <w:rPr>
                 <w:rFonts w:ascii="Times New Roman" w:hAnsi="Times New Roman" w:cs="Times New Roman"/>
@@ -6260,17 +6144,7 @@
                 <w:bCs/>
                 <w:color w:val="auto"/>
               </w:rPr>
-              <w:t>DoctorID</w:t>
-            </w:r>
-            <w:proofErr w:type="spellEnd"/>
-            <w:r>
-              <w:rPr>
-                <w:rFonts w:ascii="Times New Roman" w:hAnsi="Times New Roman" w:cs="Times New Roman"/>
-                <w:b/>
-                <w:bCs/>
-                <w:color w:val="auto"/>
-              </w:rPr>
-              <w:t xml:space="preserve"> (PK, FK)</w:t>
+              <w:t>DoctorID (PK, FK)</w:t>
             </w:r>
           </w:p>
         </w:tc>
@@ -6320,7 +6194,6 @@
                 <w:color w:val="auto"/>
               </w:rPr>
             </w:pPr>
-            <w:proofErr w:type="spellStart"/>
             <w:r>
               <w:rPr>
                 <w:rFonts w:ascii="Times New Roman" w:hAnsi="Times New Roman" w:cs="Times New Roman"/>
@@ -6328,17 +6201,7 @@
                 <w:bCs/>
                 <w:color w:val="auto"/>
               </w:rPr>
-              <w:t>DoctorID</w:t>
-            </w:r>
-            <w:proofErr w:type="spellEnd"/>
-            <w:r>
-              <w:rPr>
-                <w:rFonts w:ascii="Times New Roman" w:hAnsi="Times New Roman" w:cs="Times New Roman"/>
-                <w:b/>
-                <w:bCs/>
-                <w:color w:val="auto"/>
-              </w:rPr>
-              <w:t xml:space="preserve"> (PK, FK)</w:t>
+              <w:t>DoctorID (PK, FK)</w:t>
             </w:r>
             <w:r>
               <w:rPr>
@@ -6395,7 +6258,6 @@
                 <w:color w:val="auto"/>
               </w:rPr>
             </w:pPr>
-            <w:proofErr w:type="spellStart"/>
             <w:r>
               <w:rPr>
                 <w:rFonts w:ascii="Times New Roman" w:hAnsi="Times New Roman" w:cs="Times New Roman"/>
@@ -6403,9 +6265,15 @@
                 <w:bCs/>
                 <w:color w:val="auto"/>
               </w:rPr>
-              <w:t>AppointmentID</w:t>
+              <w:t>AppointmentID (PK)</w:t>
             </w:r>
-            <w:proofErr w:type="spellEnd"/>
+            <w:r>
+              <w:rPr>
+                <w:rFonts w:ascii="Times New Roman" w:hAnsi="Times New Roman" w:cs="Times New Roman"/>
+                <w:color w:val="auto"/>
+              </w:rPr>
+              <w:t xml:space="preserve">, AppointmentDate, Status, </w:t>
+            </w:r>
             <w:r>
               <w:rPr>
                 <w:rFonts w:ascii="Times New Roman" w:hAnsi="Times New Roman" w:cs="Times New Roman"/>
@@ -6413,7 +6281,7 @@
                 <w:bCs/>
                 <w:color w:val="auto"/>
               </w:rPr>
-              <w:t xml:space="preserve"> (PK)</w:t>
+              <w:t>PatientID (FK)</w:t>
             </w:r>
             <w:r>
               <w:rPr>
@@ -6422,23 +6290,6 @@
               </w:rPr>
               <w:t xml:space="preserve">, </w:t>
             </w:r>
-            <w:proofErr w:type="spellStart"/>
-            <w:r>
-              <w:rPr>
-                <w:rFonts w:ascii="Times New Roman" w:hAnsi="Times New Roman" w:cs="Times New Roman"/>
-                <w:color w:val="auto"/>
-              </w:rPr>
-              <w:t>AppointmentDate</w:t>
-            </w:r>
-            <w:proofErr w:type="spellEnd"/>
-            <w:r>
-              <w:rPr>
-                <w:rFonts w:ascii="Times New Roman" w:hAnsi="Times New Roman" w:cs="Times New Roman"/>
-                <w:color w:val="auto"/>
-              </w:rPr>
-              <w:t xml:space="preserve">, Status, </w:t>
-            </w:r>
-            <w:proofErr w:type="spellStart"/>
             <w:r>
               <w:rPr>
                 <w:rFonts w:ascii="Times New Roman" w:hAnsi="Times New Roman" w:cs="Times New Roman"/>
@@ -6446,44 +6297,7 @@
                 <w:bCs/>
                 <w:color w:val="auto"/>
               </w:rPr>
-              <w:t>PatientID</w:t>
-            </w:r>
-            <w:proofErr w:type="spellEnd"/>
-            <w:r>
-              <w:rPr>
-                <w:rFonts w:ascii="Times New Roman" w:hAnsi="Times New Roman" w:cs="Times New Roman"/>
-                <w:b/>
-                <w:bCs/>
-                <w:color w:val="auto"/>
-              </w:rPr>
-              <w:t xml:space="preserve"> (FK)</w:t>
-            </w:r>
-            <w:r>
-              <w:rPr>
-                <w:rFonts w:ascii="Times New Roman" w:hAnsi="Times New Roman" w:cs="Times New Roman"/>
-                <w:color w:val="auto"/>
-              </w:rPr>
-              <w:t xml:space="preserve">, </w:t>
-            </w:r>
-            <w:proofErr w:type="spellStart"/>
-            <w:r>
-              <w:rPr>
-                <w:rFonts w:ascii="Times New Roman" w:hAnsi="Times New Roman" w:cs="Times New Roman"/>
-                <w:b/>
-                <w:bCs/>
-                <w:color w:val="auto"/>
-              </w:rPr>
-              <w:t>DoctorID</w:t>
-            </w:r>
-            <w:proofErr w:type="spellEnd"/>
-            <w:r>
-              <w:rPr>
-                <w:rFonts w:ascii="Times New Roman" w:hAnsi="Times New Roman" w:cs="Times New Roman"/>
-                <w:b/>
-                <w:bCs/>
-                <w:color w:val="auto"/>
-              </w:rPr>
-              <w:t xml:space="preserve"> (FK)</w:t>
+              <w:t>DoctorID (FK)</w:t>
             </w:r>
           </w:p>
         </w:tc>
@@ -6533,7 +6347,6 @@
                 <w:color w:val="auto"/>
               </w:rPr>
             </w:pPr>
-            <w:proofErr w:type="spellStart"/>
             <w:r>
               <w:rPr>
                 <w:rFonts w:ascii="Times New Roman" w:hAnsi="Times New Roman" w:cs="Times New Roman"/>
@@ -6541,17 +6354,7 @@
                 <w:bCs/>
                 <w:color w:val="auto"/>
               </w:rPr>
-              <w:t>TreatmentID</w:t>
-            </w:r>
-            <w:proofErr w:type="spellEnd"/>
-            <w:r>
-              <w:rPr>
-                <w:rFonts w:ascii="Times New Roman" w:hAnsi="Times New Roman" w:cs="Times New Roman"/>
-                <w:b/>
-                <w:bCs/>
-                <w:color w:val="auto"/>
-              </w:rPr>
-              <w:t xml:space="preserve"> (PK)</w:t>
+              <w:t>TreatmentID (PK)</w:t>
             </w:r>
             <w:r>
               <w:rPr>
@@ -6560,7 +6363,6 @@
               </w:rPr>
               <w:t xml:space="preserve">, Diagnosis, </w:t>
             </w:r>
-            <w:proofErr w:type="spellStart"/>
             <w:r>
               <w:rPr>
                 <w:rFonts w:ascii="Times New Roman" w:hAnsi="Times New Roman" w:cs="Times New Roman"/>
@@ -6568,17 +6370,7 @@
                 <w:bCs/>
                 <w:color w:val="auto"/>
               </w:rPr>
-              <w:t>AppointmentID</w:t>
-            </w:r>
-            <w:proofErr w:type="spellEnd"/>
-            <w:r>
-              <w:rPr>
-                <w:rFonts w:ascii="Times New Roman" w:hAnsi="Times New Roman" w:cs="Times New Roman"/>
-                <w:b/>
-                <w:bCs/>
-                <w:color w:val="auto"/>
-              </w:rPr>
-              <w:t xml:space="preserve"> (FK)</w:t>
+              <w:t>AppointmentID (FK)</w:t>
             </w:r>
           </w:p>
         </w:tc>
@@ -6628,7 +6420,6 @@
                 <w:color w:val="auto"/>
               </w:rPr>
             </w:pPr>
-            <w:proofErr w:type="spellStart"/>
             <w:r>
               <w:rPr>
                 <w:rFonts w:ascii="Times New Roman" w:hAnsi="Times New Roman" w:cs="Times New Roman"/>
@@ -6636,9 +6427,15 @@
                 <w:bCs/>
                 <w:color w:val="auto"/>
               </w:rPr>
-              <w:t>PaymentID</w:t>
+              <w:t>PaymentID (PK)</w:t>
             </w:r>
-            <w:proofErr w:type="spellEnd"/>
+            <w:r>
+              <w:rPr>
+                <w:rFonts w:ascii="Times New Roman" w:hAnsi="Times New Roman" w:cs="Times New Roman"/>
+                <w:color w:val="auto"/>
+              </w:rPr>
+              <w:t xml:space="preserve">, Amount, PaymentMethod, </w:t>
+            </w:r>
             <w:r>
               <w:rPr>
                 <w:rFonts w:ascii="Times New Roman" w:hAnsi="Times New Roman" w:cs="Times New Roman"/>
@@ -6646,50 +6443,7 @@
                 <w:bCs/>
                 <w:color w:val="auto"/>
               </w:rPr>
-              <w:t xml:space="preserve"> (PK)</w:t>
-            </w:r>
-            <w:r>
-              <w:rPr>
-                <w:rFonts w:ascii="Times New Roman" w:hAnsi="Times New Roman" w:cs="Times New Roman"/>
-                <w:color w:val="auto"/>
-              </w:rPr>
-              <w:t xml:space="preserve">, Amount, </w:t>
-            </w:r>
-            <w:proofErr w:type="spellStart"/>
-            <w:r>
-              <w:rPr>
-                <w:rFonts w:ascii="Times New Roman" w:hAnsi="Times New Roman" w:cs="Times New Roman"/>
-                <w:color w:val="auto"/>
-              </w:rPr>
-              <w:t>PaymentMethod</w:t>
-            </w:r>
-            <w:proofErr w:type="spellEnd"/>
-            <w:r>
-              <w:rPr>
-                <w:rFonts w:ascii="Times New Roman" w:hAnsi="Times New Roman" w:cs="Times New Roman"/>
-                <w:color w:val="auto"/>
-              </w:rPr>
-              <w:t xml:space="preserve">, </w:t>
-            </w:r>
-            <w:proofErr w:type="spellStart"/>
-            <w:r>
-              <w:rPr>
-                <w:rFonts w:ascii="Times New Roman" w:hAnsi="Times New Roman" w:cs="Times New Roman"/>
-                <w:b/>
-                <w:bCs/>
-                <w:color w:val="auto"/>
-              </w:rPr>
-              <w:t>AppointmentID</w:t>
-            </w:r>
-            <w:proofErr w:type="spellEnd"/>
-            <w:r>
-              <w:rPr>
-                <w:rFonts w:ascii="Times New Roman" w:hAnsi="Times New Roman" w:cs="Times New Roman"/>
-                <w:b/>
-                <w:bCs/>
-                <w:color w:val="auto"/>
-              </w:rPr>
-              <w:t xml:space="preserve"> (FK</w:t>
+              <w:t>AppointmentID (FK</w:t>
             </w:r>
             <w:r>
               <w:rPr>
@@ -8017,27 +7771,7 @@
           <w:sz w:val="24"/>
           <w:szCs w:val="24"/>
         </w:rPr>
-        <w:t>(</w:t>
-      </w:r>
-      <w:proofErr w:type="spellStart"/>
-      <w:r>
-        <w:rPr>
-          <w:rFonts w:ascii="Times New Roman" w:hAnsi="Times New Roman" w:cs="Times New Roman"/>
-          <w:color w:val="auto"/>
-          <w:sz w:val="24"/>
-          <w:szCs w:val="24"/>
-        </w:rPr>
-        <w:t>DepartmentID</w:t>
-      </w:r>
-      <w:proofErr w:type="spellEnd"/>
-      <w:r>
-        <w:rPr>
-          <w:rFonts w:ascii="Times New Roman" w:hAnsi="Times New Roman" w:cs="Times New Roman"/>
-          <w:color w:val="auto"/>
-          <w:sz w:val="24"/>
-          <w:szCs w:val="24"/>
-        </w:rPr>
-        <w:t xml:space="preserve"> </w:t>
+        <w:t xml:space="preserve">(DepartmentID </w:t>
       </w:r>
       <w:r>
         <w:rPr>
@@ -8057,27 +7791,7 @@
           <w:sz w:val="24"/>
           <w:szCs w:val="24"/>
         </w:rPr>
-        <w:t xml:space="preserve">, </w:t>
-      </w:r>
-      <w:proofErr w:type="spellStart"/>
-      <w:r>
-        <w:rPr>
-          <w:rFonts w:ascii="Times New Roman" w:hAnsi="Times New Roman" w:cs="Times New Roman"/>
-          <w:color w:val="auto"/>
-          <w:sz w:val="24"/>
-          <w:szCs w:val="24"/>
-        </w:rPr>
-        <w:t>DepartmentName</w:t>
-      </w:r>
-      <w:proofErr w:type="spellEnd"/>
-      <w:r>
-        <w:rPr>
-          <w:rFonts w:ascii="Times New Roman" w:hAnsi="Times New Roman" w:cs="Times New Roman"/>
-          <w:color w:val="auto"/>
-          <w:sz w:val="24"/>
-          <w:szCs w:val="24"/>
-        </w:rPr>
-        <w:t>)</w:t>
+        <w:t>, DepartmentName)</w:t>
       </w:r>
     </w:p>
     <w:p>
@@ -8128,27 +7842,7 @@
           <w:sz w:val="24"/>
           <w:szCs w:val="24"/>
         </w:rPr>
-        <w:t xml:space="preserve"> (</w:t>
-      </w:r>
-      <w:proofErr w:type="spellStart"/>
-      <w:r>
-        <w:rPr>
-          <w:rFonts w:ascii="Times New Roman" w:hAnsi="Times New Roman" w:cs="Times New Roman"/>
-          <w:color w:val="auto"/>
-          <w:sz w:val="24"/>
-          <w:szCs w:val="24"/>
-        </w:rPr>
-        <w:t>PatientID</w:t>
-      </w:r>
-      <w:proofErr w:type="spellEnd"/>
-      <w:r>
-        <w:rPr>
-          <w:rFonts w:ascii="Times New Roman" w:hAnsi="Times New Roman" w:cs="Times New Roman"/>
-          <w:color w:val="auto"/>
-          <w:sz w:val="24"/>
-          <w:szCs w:val="24"/>
-        </w:rPr>
-        <w:t xml:space="preserve"> </w:t>
+        <w:t xml:space="preserve"> (PatientID </w:t>
       </w:r>
       <w:r>
         <w:rPr>
@@ -8219,27 +7913,7 @@
           <w:sz w:val="24"/>
           <w:szCs w:val="24"/>
         </w:rPr>
-        <w:t xml:space="preserve"> (</w:t>
-      </w:r>
-      <w:proofErr w:type="spellStart"/>
-      <w:r>
-        <w:rPr>
-          <w:rFonts w:ascii="Times New Roman" w:hAnsi="Times New Roman" w:cs="Times New Roman"/>
-          <w:color w:val="auto"/>
-          <w:sz w:val="24"/>
-          <w:szCs w:val="24"/>
-        </w:rPr>
-        <w:t>DoctorID</w:t>
-      </w:r>
-      <w:proofErr w:type="spellEnd"/>
-      <w:r>
-        <w:rPr>
-          <w:rFonts w:ascii="Times New Roman" w:hAnsi="Times New Roman" w:cs="Times New Roman"/>
-          <w:color w:val="auto"/>
-          <w:sz w:val="24"/>
-          <w:szCs w:val="24"/>
-        </w:rPr>
-        <w:t xml:space="preserve"> </w:t>
+        <w:t xml:space="preserve"> (DoctorID </w:t>
       </w:r>
       <w:r>
         <w:rPr>
@@ -8259,27 +7933,7 @@
           <w:sz w:val="24"/>
           <w:szCs w:val="24"/>
         </w:rPr>
-        <w:t xml:space="preserve">, FirstName, LastName, Phone, </w:t>
-      </w:r>
-      <w:proofErr w:type="spellStart"/>
-      <w:r>
-        <w:rPr>
-          <w:rFonts w:ascii="Times New Roman" w:hAnsi="Times New Roman" w:cs="Times New Roman"/>
-          <w:color w:val="auto"/>
-          <w:sz w:val="24"/>
-          <w:szCs w:val="24"/>
-        </w:rPr>
-        <w:t>DepartmentID</w:t>
-      </w:r>
-      <w:proofErr w:type="spellEnd"/>
-      <w:r>
-        <w:rPr>
-          <w:rFonts w:ascii="Times New Roman" w:hAnsi="Times New Roman" w:cs="Times New Roman"/>
-          <w:color w:val="auto"/>
-          <w:sz w:val="24"/>
-          <w:szCs w:val="24"/>
-        </w:rPr>
-        <w:t xml:space="preserve"> </w:t>
+        <w:t xml:space="preserve">, FirstName, LastName, Phone, DepartmentID </w:t>
       </w:r>
       <w:r>
         <w:rPr>
@@ -8332,7 +7986,6 @@
           <w:szCs w:val="24"/>
         </w:rPr>
       </w:pPr>
-      <w:proofErr w:type="spellStart"/>
       <w:r>
         <w:rPr>
           <w:rFonts w:ascii="Times New Roman" w:hAnsi="Times New Roman" w:cs="Times New Roman"/>
@@ -8344,35 +7997,14 @@
         </w:rPr>
         <w:t>GeneralPractitioner</w:t>
       </w:r>
-      <w:proofErr w:type="spellEnd"/>
-      <w:r>
-        <w:rPr>
-          <w:rFonts w:ascii="Times New Roman" w:hAnsi="Times New Roman" w:cs="Times New Roman"/>
-          <w:color w:val="auto"/>
-          <w:sz w:val="24"/>
-          <w:szCs w:val="24"/>
-        </w:rPr>
-        <w:t xml:space="preserve"> (</w:t>
-      </w:r>
-      <w:proofErr w:type="spellStart"/>
-      <w:r>
-        <w:rPr>
-          <w:rFonts w:ascii="Times New Roman" w:hAnsi="Times New Roman" w:cs="Times New Roman"/>
-          <w:color w:val="auto"/>
-          <w:sz w:val="24"/>
-          <w:szCs w:val="24"/>
-        </w:rPr>
-        <w:t>DoctorID</w:t>
-      </w:r>
-      <w:proofErr w:type="spellEnd"/>
-      <w:r>
-        <w:rPr>
-          <w:rFonts w:ascii="Times New Roman" w:hAnsi="Times New Roman" w:cs="Times New Roman"/>
-          <w:color w:val="auto"/>
-          <w:sz w:val="24"/>
-          <w:szCs w:val="24"/>
-        </w:rPr>
-        <w:t xml:space="preserve"> </w:t>
+      <w:r>
+        <w:rPr>
+          <w:rFonts w:ascii="Times New Roman" w:hAnsi="Times New Roman" w:cs="Times New Roman"/>
+          <w:color w:val="auto"/>
+          <w:sz w:val="24"/>
+          <w:szCs w:val="24"/>
+        </w:rPr>
+        <w:t xml:space="preserve"> (DoctorID </w:t>
       </w:r>
       <w:r>
         <w:rPr>
@@ -8443,27 +8075,7 @@
           <w:sz w:val="24"/>
           <w:szCs w:val="24"/>
         </w:rPr>
-        <w:t xml:space="preserve"> (</w:t>
-      </w:r>
-      <w:proofErr w:type="spellStart"/>
-      <w:r>
-        <w:rPr>
-          <w:rFonts w:ascii="Times New Roman" w:hAnsi="Times New Roman" w:cs="Times New Roman"/>
-          <w:color w:val="auto"/>
-          <w:sz w:val="24"/>
-          <w:szCs w:val="24"/>
-        </w:rPr>
-        <w:t>DoctorID</w:t>
-      </w:r>
-      <w:proofErr w:type="spellEnd"/>
-      <w:r>
-        <w:rPr>
-          <w:rFonts w:ascii="Times New Roman" w:hAnsi="Times New Roman" w:cs="Times New Roman"/>
-          <w:color w:val="auto"/>
-          <w:sz w:val="24"/>
-          <w:szCs w:val="24"/>
-        </w:rPr>
-        <w:t xml:space="preserve"> </w:t>
+        <w:t xml:space="preserve"> (DoctorID </w:t>
       </w:r>
       <w:r>
         <w:rPr>
@@ -8534,27 +8146,7 @@
           <w:sz w:val="24"/>
           <w:szCs w:val="24"/>
         </w:rPr>
-        <w:t xml:space="preserve"> (</w:t>
-      </w:r>
-      <w:proofErr w:type="spellStart"/>
-      <w:r>
-        <w:rPr>
-          <w:rFonts w:ascii="Times New Roman" w:hAnsi="Times New Roman" w:cs="Times New Roman"/>
-          <w:color w:val="auto"/>
-          <w:sz w:val="24"/>
-          <w:szCs w:val="24"/>
-        </w:rPr>
-        <w:t>AppointmentID</w:t>
-      </w:r>
-      <w:proofErr w:type="spellEnd"/>
-      <w:r>
-        <w:rPr>
-          <w:rFonts w:ascii="Times New Roman" w:hAnsi="Times New Roman" w:cs="Times New Roman"/>
-          <w:color w:val="auto"/>
-          <w:sz w:val="24"/>
-          <w:szCs w:val="24"/>
-        </w:rPr>
-        <w:t xml:space="preserve"> </w:t>
+        <w:t xml:space="preserve"> (AppointmentID </w:t>
       </w:r>
       <w:r>
         <w:rPr>
@@ -8574,47 +8166,7 @@
           <w:sz w:val="24"/>
           <w:szCs w:val="24"/>
         </w:rPr>
-        <w:t xml:space="preserve">, </w:t>
-      </w:r>
-      <w:proofErr w:type="spellStart"/>
-      <w:r>
-        <w:rPr>
-          <w:rFonts w:ascii="Times New Roman" w:hAnsi="Times New Roman" w:cs="Times New Roman"/>
-          <w:color w:val="auto"/>
-          <w:sz w:val="24"/>
-          <w:szCs w:val="24"/>
-        </w:rPr>
-        <w:t>AppointmentDate</w:t>
-      </w:r>
-      <w:proofErr w:type="spellEnd"/>
-      <w:r>
-        <w:rPr>
-          <w:rFonts w:ascii="Times New Roman" w:hAnsi="Times New Roman" w:cs="Times New Roman"/>
-          <w:color w:val="auto"/>
-          <w:sz w:val="24"/>
-          <w:szCs w:val="24"/>
-        </w:rPr>
-        <w:t xml:space="preserve">, Status, </w:t>
-      </w:r>
-      <w:proofErr w:type="spellStart"/>
-      <w:r>
-        <w:rPr>
-          <w:rFonts w:ascii="Times New Roman" w:hAnsi="Times New Roman" w:cs="Times New Roman"/>
-          <w:color w:val="auto"/>
-          <w:sz w:val="24"/>
-          <w:szCs w:val="24"/>
-        </w:rPr>
-        <w:t>PatientID</w:t>
-      </w:r>
-      <w:proofErr w:type="spellEnd"/>
-      <w:r>
-        <w:rPr>
-          <w:rFonts w:ascii="Times New Roman" w:hAnsi="Times New Roman" w:cs="Times New Roman"/>
-          <w:color w:val="auto"/>
-          <w:sz w:val="24"/>
-          <w:szCs w:val="24"/>
-        </w:rPr>
-        <w:t xml:space="preserve"> </w:t>
+        <w:t xml:space="preserve">, AppointmentDate, Status, PatientID </w:t>
       </w:r>
       <w:r>
         <w:rPr>
@@ -8634,27 +8186,7 @@
           <w:sz w:val="24"/>
           <w:szCs w:val="24"/>
         </w:rPr>
-        <w:t xml:space="preserve">, </w:t>
-      </w:r>
-      <w:proofErr w:type="spellStart"/>
-      <w:r>
-        <w:rPr>
-          <w:rFonts w:ascii="Times New Roman" w:hAnsi="Times New Roman" w:cs="Times New Roman"/>
-          <w:color w:val="auto"/>
-          <w:sz w:val="24"/>
-          <w:szCs w:val="24"/>
-        </w:rPr>
-        <w:t>DoctorID</w:t>
-      </w:r>
-      <w:proofErr w:type="spellEnd"/>
-      <w:r>
-        <w:rPr>
-          <w:rFonts w:ascii="Times New Roman" w:hAnsi="Times New Roman" w:cs="Times New Roman"/>
-          <w:color w:val="auto"/>
-          <w:sz w:val="24"/>
-          <w:szCs w:val="24"/>
-        </w:rPr>
-        <w:t xml:space="preserve"> FK)</w:t>
+        <w:t>, DoctorID FK)</w:t>
       </w:r>
     </w:p>
     <w:p>
@@ -8705,27 +8237,7 @@
           <w:sz w:val="24"/>
           <w:szCs w:val="24"/>
         </w:rPr>
-        <w:t xml:space="preserve"> (</w:t>
-      </w:r>
-      <w:proofErr w:type="spellStart"/>
-      <w:r>
-        <w:rPr>
-          <w:rFonts w:ascii="Times New Roman" w:hAnsi="Times New Roman" w:cs="Times New Roman"/>
-          <w:color w:val="auto"/>
-          <w:sz w:val="24"/>
-          <w:szCs w:val="24"/>
-        </w:rPr>
-        <w:t>TreatmentID</w:t>
-      </w:r>
-      <w:proofErr w:type="spellEnd"/>
-      <w:r>
-        <w:rPr>
-          <w:rFonts w:ascii="Times New Roman" w:hAnsi="Times New Roman" w:cs="Times New Roman"/>
-          <w:color w:val="auto"/>
-          <w:sz w:val="24"/>
-          <w:szCs w:val="24"/>
-        </w:rPr>
-        <w:t xml:space="preserve"> </w:t>
+        <w:t xml:space="preserve"> (TreatmentID </w:t>
       </w:r>
       <w:r>
         <w:rPr>
@@ -8745,27 +8257,7 @@
           <w:sz w:val="24"/>
           <w:szCs w:val="24"/>
         </w:rPr>
-        <w:t xml:space="preserve">, Diagnosis, </w:t>
-      </w:r>
-      <w:proofErr w:type="spellStart"/>
-      <w:r>
-        <w:rPr>
-          <w:rFonts w:ascii="Times New Roman" w:hAnsi="Times New Roman" w:cs="Times New Roman"/>
-          <w:color w:val="auto"/>
-          <w:sz w:val="24"/>
-          <w:szCs w:val="24"/>
-        </w:rPr>
-        <w:t>AppointmentID</w:t>
-      </w:r>
-      <w:proofErr w:type="spellEnd"/>
-      <w:r>
-        <w:rPr>
-          <w:rFonts w:ascii="Times New Roman" w:hAnsi="Times New Roman" w:cs="Times New Roman"/>
-          <w:color w:val="auto"/>
-          <w:sz w:val="24"/>
-          <w:szCs w:val="24"/>
-        </w:rPr>
-        <w:t xml:space="preserve"> </w:t>
+        <w:t xml:space="preserve">, Diagnosis, AppointmentID </w:t>
       </w:r>
       <w:r>
         <w:rPr>
@@ -8836,27 +8328,7 @@
           <w:sz w:val="24"/>
           <w:szCs w:val="24"/>
         </w:rPr>
-        <w:t xml:space="preserve"> (</w:t>
-      </w:r>
-      <w:proofErr w:type="spellStart"/>
-      <w:r>
-        <w:rPr>
-          <w:rFonts w:ascii="Times New Roman" w:hAnsi="Times New Roman" w:cs="Times New Roman"/>
-          <w:color w:val="auto"/>
-          <w:sz w:val="24"/>
-          <w:szCs w:val="24"/>
-        </w:rPr>
-        <w:t>PaymentID</w:t>
-      </w:r>
-      <w:proofErr w:type="spellEnd"/>
-      <w:r>
-        <w:rPr>
-          <w:rFonts w:ascii="Times New Roman" w:hAnsi="Times New Roman" w:cs="Times New Roman"/>
-          <w:color w:val="auto"/>
-          <w:sz w:val="24"/>
-          <w:szCs w:val="24"/>
-        </w:rPr>
-        <w:t xml:space="preserve"> </w:t>
+        <w:t xml:space="preserve"> (PaymentID </w:t>
       </w:r>
       <w:r>
         <w:rPr>
@@ -8876,47 +8348,7 @@
           <w:sz w:val="24"/>
           <w:szCs w:val="24"/>
         </w:rPr>
-        <w:t xml:space="preserve">, Amount, </w:t>
-      </w:r>
-      <w:proofErr w:type="spellStart"/>
-      <w:r>
-        <w:rPr>
-          <w:rFonts w:ascii="Times New Roman" w:hAnsi="Times New Roman" w:cs="Times New Roman"/>
-          <w:color w:val="auto"/>
-          <w:sz w:val="24"/>
-          <w:szCs w:val="24"/>
-        </w:rPr>
-        <w:t>PaymentMethod</w:t>
-      </w:r>
-      <w:proofErr w:type="spellEnd"/>
-      <w:r>
-        <w:rPr>
-          <w:rFonts w:ascii="Times New Roman" w:hAnsi="Times New Roman" w:cs="Times New Roman"/>
-          <w:color w:val="auto"/>
-          <w:sz w:val="24"/>
-          <w:szCs w:val="24"/>
-        </w:rPr>
-        <w:t xml:space="preserve">, </w:t>
-      </w:r>
-      <w:proofErr w:type="spellStart"/>
-      <w:r>
-        <w:rPr>
-          <w:rFonts w:ascii="Times New Roman" w:hAnsi="Times New Roman" w:cs="Times New Roman"/>
-          <w:color w:val="auto"/>
-          <w:sz w:val="24"/>
-          <w:szCs w:val="24"/>
-        </w:rPr>
-        <w:t>AppointmentID</w:t>
-      </w:r>
-      <w:proofErr w:type="spellEnd"/>
-      <w:r>
-        <w:rPr>
-          <w:rFonts w:ascii="Times New Roman" w:hAnsi="Times New Roman" w:cs="Times New Roman"/>
-          <w:color w:val="auto"/>
-          <w:sz w:val="24"/>
-          <w:szCs w:val="24"/>
-        </w:rPr>
-        <w:t xml:space="preserve"> </w:t>
+        <w:t xml:space="preserve">, Amount, PaymentMethod, AppointmentID </w:t>
       </w:r>
       <w:r>
         <w:rPr>
@@ -9228,27 +8660,7 @@
           <w:sz w:val="24"/>
           <w:szCs w:val="24"/>
         </w:rPr>
-        <w:t xml:space="preserve">CREATE DATABASE </w:t>
-      </w:r>
-      <w:proofErr w:type="spellStart"/>
-      <w:r>
-        <w:rPr>
-          <w:rFonts w:ascii="Times New Roman" w:hAnsi="Times New Roman" w:cs="Times New Roman"/>
-          <w:color w:val="auto"/>
-          <w:sz w:val="24"/>
-          <w:szCs w:val="24"/>
-        </w:rPr>
-        <w:t>SmartClinic</w:t>
-      </w:r>
-      <w:proofErr w:type="spellEnd"/>
-      <w:r>
-        <w:rPr>
-          <w:rFonts w:ascii="Times New Roman" w:hAnsi="Times New Roman" w:cs="Times New Roman"/>
-          <w:color w:val="auto"/>
-          <w:sz w:val="24"/>
-          <w:szCs w:val="24"/>
-        </w:rPr>
-        <w:t>;</w:t>
+        <w:t>CREATE DATABASE SmartClinic;</w:t>
       </w:r>
     </w:p>
     <w:p>
@@ -9273,27 +8685,7 @@
           <w:sz w:val="24"/>
           <w:szCs w:val="24"/>
         </w:rPr>
-        <w:t xml:space="preserve">USE </w:t>
-      </w:r>
-      <w:proofErr w:type="spellStart"/>
-      <w:r>
-        <w:rPr>
-          <w:rFonts w:ascii="Times New Roman" w:hAnsi="Times New Roman" w:cs="Times New Roman"/>
-          <w:color w:val="auto"/>
-          <w:sz w:val="24"/>
-          <w:szCs w:val="24"/>
-        </w:rPr>
-        <w:t>SmartClinic</w:t>
-      </w:r>
-      <w:proofErr w:type="spellEnd"/>
-      <w:r>
-        <w:rPr>
-          <w:rFonts w:ascii="Times New Roman" w:hAnsi="Times New Roman" w:cs="Times New Roman"/>
-          <w:color w:val="auto"/>
-          <w:sz w:val="24"/>
-          <w:szCs w:val="24"/>
-        </w:rPr>
-        <w:t>;</w:t>
+        <w:t>USE SmartClinic;</w:t>
       </w:r>
     </w:p>
     <w:p>
@@ -9531,25 +8923,7 @@
           <w:color w:val="auto"/>
           <w:kern w:val="20"/>
         </w:rPr>
-        <w:t xml:space="preserve">    </w:t>
-      </w:r>
-      <w:proofErr w:type="spellStart"/>
-      <w:r>
-        <w:rPr>
-          <w:rFonts w:ascii="Times New Roman" w:hAnsi="Times New Roman" w:cs="Times New Roman"/>
-          <w:color w:val="auto"/>
-          <w:kern w:val="20"/>
-        </w:rPr>
-        <w:t>DepartmentID</w:t>
-      </w:r>
-      <w:proofErr w:type="spellEnd"/>
-      <w:r>
-        <w:rPr>
-          <w:rFonts w:ascii="Times New Roman" w:hAnsi="Times New Roman" w:cs="Times New Roman"/>
-          <w:color w:val="auto"/>
-          <w:kern w:val="20"/>
-        </w:rPr>
-        <w:t xml:space="preserve"> INT PRIMARY KEY,</w:t>
+        <w:t xml:space="preserve">    DepartmentID INT PRIMARY KEY,</w:t>
       </w:r>
     </w:p>
     <w:p>
@@ -9568,43 +8942,7 @@
           <w:color w:val="auto"/>
           <w:kern w:val="20"/>
         </w:rPr>
-        <w:t xml:space="preserve">    </w:t>
-      </w:r>
-      <w:proofErr w:type="spellStart"/>
-      <w:r>
-        <w:rPr>
-          <w:rFonts w:ascii="Times New Roman" w:hAnsi="Times New Roman" w:cs="Times New Roman"/>
-          <w:color w:val="auto"/>
-          <w:kern w:val="20"/>
-        </w:rPr>
-        <w:t>DepartmentName</w:t>
-      </w:r>
-      <w:proofErr w:type="spellEnd"/>
-      <w:r>
-        <w:rPr>
-          <w:rFonts w:ascii="Times New Roman" w:hAnsi="Times New Roman" w:cs="Times New Roman"/>
-          <w:color w:val="auto"/>
-          <w:kern w:val="20"/>
-        </w:rPr>
-        <w:t xml:space="preserve"> </w:t>
-      </w:r>
-      <w:proofErr w:type="gramStart"/>
-      <w:r>
-        <w:rPr>
-          <w:rFonts w:ascii="Times New Roman" w:hAnsi="Times New Roman" w:cs="Times New Roman"/>
-          <w:color w:val="auto"/>
-          <w:kern w:val="20"/>
-        </w:rPr>
-        <w:t>VARCHAR(</w:t>
-      </w:r>
-      <w:proofErr w:type="gramEnd"/>
-      <w:r>
-        <w:rPr>
-          <w:rFonts w:ascii="Times New Roman" w:hAnsi="Times New Roman" w:cs="Times New Roman"/>
-          <w:color w:val="auto"/>
-          <w:kern w:val="20"/>
-        </w:rPr>
-        <w:t>50) NOT NULL UNIQUE</w:t>
+        <w:t xml:space="preserve">    DepartmentName VARCHAR(50) NOT NULL UNIQUE</w:t>
       </w:r>
     </w:p>
     <w:p>
@@ -9717,25 +9055,7 @@
           <w:color w:val="auto"/>
           <w:kern w:val="20"/>
         </w:rPr>
-        <w:t xml:space="preserve">    </w:t>
-      </w:r>
-      <w:proofErr w:type="spellStart"/>
-      <w:r>
-        <w:rPr>
-          <w:rFonts w:ascii="Times New Roman" w:hAnsi="Times New Roman" w:cs="Times New Roman"/>
-          <w:color w:val="auto"/>
-          <w:kern w:val="20"/>
-        </w:rPr>
-        <w:t>PatientID</w:t>
-      </w:r>
-      <w:proofErr w:type="spellEnd"/>
-      <w:r>
-        <w:rPr>
-          <w:rFonts w:ascii="Times New Roman" w:hAnsi="Times New Roman" w:cs="Times New Roman"/>
-          <w:color w:val="auto"/>
-          <w:kern w:val="20"/>
-        </w:rPr>
-        <w:t xml:space="preserve"> INT PRIMARY KEY,</w:t>
+        <w:t xml:space="preserve">    PatientID INT PRIMARY KEY,</w:t>
       </w:r>
     </w:p>
     <w:p>
@@ -9754,25 +9074,7 @@
           <w:color w:val="auto"/>
           <w:kern w:val="20"/>
         </w:rPr>
-        <w:t xml:space="preserve">    FirstName </w:t>
-      </w:r>
-      <w:proofErr w:type="gramStart"/>
-      <w:r>
-        <w:rPr>
-          <w:rFonts w:ascii="Times New Roman" w:hAnsi="Times New Roman" w:cs="Times New Roman"/>
-          <w:color w:val="auto"/>
-          <w:kern w:val="20"/>
-        </w:rPr>
-        <w:t>VARCHAR(</w:t>
-      </w:r>
-      <w:proofErr w:type="gramEnd"/>
-      <w:r>
-        <w:rPr>
-          <w:rFonts w:ascii="Times New Roman" w:hAnsi="Times New Roman" w:cs="Times New Roman"/>
-          <w:color w:val="auto"/>
-          <w:kern w:val="20"/>
-        </w:rPr>
-        <w:t>30) NOT NULL,</w:t>
+        <w:t xml:space="preserve">    FirstName VARCHAR(30) NOT NULL,</w:t>
       </w:r>
     </w:p>
     <w:p>
@@ -9791,25 +9093,7 @@
           <w:color w:val="auto"/>
           <w:kern w:val="20"/>
         </w:rPr>
-        <w:t xml:space="preserve">    LastName </w:t>
-      </w:r>
-      <w:proofErr w:type="gramStart"/>
-      <w:r>
-        <w:rPr>
-          <w:rFonts w:ascii="Times New Roman" w:hAnsi="Times New Roman" w:cs="Times New Roman"/>
-          <w:color w:val="auto"/>
-          <w:kern w:val="20"/>
-        </w:rPr>
-        <w:t>VARCHAR(</w:t>
-      </w:r>
-      <w:proofErr w:type="gramEnd"/>
-      <w:r>
-        <w:rPr>
-          <w:rFonts w:ascii="Times New Roman" w:hAnsi="Times New Roman" w:cs="Times New Roman"/>
-          <w:color w:val="auto"/>
-          <w:kern w:val="20"/>
-        </w:rPr>
-        <w:t>30) NOT NULL,</w:t>
+        <w:t xml:space="preserve">    LastName VARCHAR(30) NOT NULL,</w:t>
       </w:r>
     </w:p>
     <w:p>
@@ -9828,25 +9112,7 @@
           <w:color w:val="auto"/>
           <w:kern w:val="20"/>
         </w:rPr>
-        <w:t xml:space="preserve">    Gender </w:t>
-      </w:r>
-      <w:proofErr w:type="gramStart"/>
-      <w:r>
-        <w:rPr>
-          <w:rFonts w:ascii="Times New Roman" w:hAnsi="Times New Roman" w:cs="Times New Roman"/>
-          <w:color w:val="auto"/>
-          <w:kern w:val="20"/>
-        </w:rPr>
-        <w:t>VARCHAR(</w:t>
-      </w:r>
-      <w:proofErr w:type="gramEnd"/>
-      <w:r>
-        <w:rPr>
-          <w:rFonts w:ascii="Times New Roman" w:hAnsi="Times New Roman" w:cs="Times New Roman"/>
-          <w:color w:val="auto"/>
-          <w:kern w:val="20"/>
-        </w:rPr>
-        <w:t>10) NOT NULL,</w:t>
+        <w:t xml:space="preserve">    Gender VARCHAR(10) NOT NULL,</w:t>
       </w:r>
     </w:p>
     <w:p>
@@ -9865,25 +9131,7 @@
           <w:color w:val="auto"/>
           <w:kern w:val="20"/>
         </w:rPr>
-        <w:t xml:space="preserve">    Phone </w:t>
-      </w:r>
-      <w:proofErr w:type="gramStart"/>
-      <w:r>
-        <w:rPr>
-          <w:rFonts w:ascii="Times New Roman" w:hAnsi="Times New Roman" w:cs="Times New Roman"/>
-          <w:color w:val="auto"/>
-          <w:kern w:val="20"/>
-        </w:rPr>
-        <w:t>VARCHAR(</w:t>
-      </w:r>
-      <w:proofErr w:type="gramEnd"/>
-      <w:r>
-        <w:rPr>
-          <w:rFonts w:ascii="Times New Roman" w:hAnsi="Times New Roman" w:cs="Times New Roman"/>
-          <w:color w:val="auto"/>
-          <w:kern w:val="20"/>
-        </w:rPr>
-        <w:t>15) NOT NULL UNIQUE</w:t>
+        <w:t xml:space="preserve">    Phone VARCHAR(15) NOT NULL UNIQUE</w:t>
       </w:r>
     </w:p>
     <w:p>
@@ -10161,23 +9409,7 @@
           <w:rFonts w:ascii="Times New Roman" w:hAnsi="Times New Roman" w:cs="Times New Roman"/>
           <w:color w:val="auto"/>
         </w:rPr>
-        <w:t xml:space="preserve">    </w:t>
-      </w:r>
-      <w:proofErr w:type="spellStart"/>
-      <w:r>
-        <w:rPr>
-          <w:rFonts w:ascii="Times New Roman" w:hAnsi="Times New Roman" w:cs="Times New Roman"/>
-          <w:color w:val="auto"/>
-        </w:rPr>
-        <w:t>DoctorID</w:t>
-      </w:r>
-      <w:proofErr w:type="spellEnd"/>
-      <w:r>
-        <w:rPr>
-          <w:rFonts w:ascii="Times New Roman" w:hAnsi="Times New Roman" w:cs="Times New Roman"/>
-          <w:color w:val="auto"/>
-        </w:rPr>
-        <w:t xml:space="preserve"> INT PRIMARY KEY,</w:t>
+        <w:t xml:space="preserve">    DoctorID INT PRIMARY KEY,</w:t>
       </w:r>
     </w:p>
     <w:p>
@@ -10198,23 +9430,7 @@
           <w:rFonts w:ascii="Times New Roman" w:hAnsi="Times New Roman" w:cs="Times New Roman"/>
           <w:color w:val="auto"/>
         </w:rPr>
-        <w:t xml:space="preserve">    FirstName </w:t>
-      </w:r>
-      <w:proofErr w:type="gramStart"/>
-      <w:r>
-        <w:rPr>
-          <w:rFonts w:ascii="Times New Roman" w:hAnsi="Times New Roman" w:cs="Times New Roman"/>
-          <w:color w:val="auto"/>
-        </w:rPr>
-        <w:t>VARCHAR(</w:t>
-      </w:r>
-      <w:proofErr w:type="gramEnd"/>
-      <w:r>
-        <w:rPr>
-          <w:rFonts w:ascii="Times New Roman" w:hAnsi="Times New Roman" w:cs="Times New Roman"/>
-          <w:color w:val="auto"/>
-        </w:rPr>
-        <w:t>30) NOT NULL,</w:t>
+        <w:t xml:space="preserve">    FirstName VARCHAR(30) NOT NULL,</w:t>
       </w:r>
     </w:p>
     <w:p>
@@ -10235,23 +9451,7 @@
           <w:rFonts w:ascii="Times New Roman" w:hAnsi="Times New Roman" w:cs="Times New Roman"/>
           <w:color w:val="auto"/>
         </w:rPr>
-        <w:t xml:space="preserve">    LastName </w:t>
-      </w:r>
-      <w:proofErr w:type="gramStart"/>
-      <w:r>
-        <w:rPr>
-          <w:rFonts w:ascii="Times New Roman" w:hAnsi="Times New Roman" w:cs="Times New Roman"/>
-          <w:color w:val="auto"/>
-        </w:rPr>
-        <w:t>VARCHAR(</w:t>
-      </w:r>
-      <w:proofErr w:type="gramEnd"/>
-      <w:r>
-        <w:rPr>
-          <w:rFonts w:ascii="Times New Roman" w:hAnsi="Times New Roman" w:cs="Times New Roman"/>
-          <w:color w:val="auto"/>
-        </w:rPr>
-        <w:t>30) NOT NULL,</w:t>
+        <w:t xml:space="preserve">    LastName VARCHAR(30) NOT NULL,</w:t>
       </w:r>
     </w:p>
     <w:p>
@@ -10272,23 +9472,7 @@
           <w:rFonts w:ascii="Times New Roman" w:hAnsi="Times New Roman" w:cs="Times New Roman"/>
           <w:color w:val="auto"/>
         </w:rPr>
-        <w:t xml:space="preserve">    Phone </w:t>
-      </w:r>
-      <w:proofErr w:type="gramStart"/>
-      <w:r>
-        <w:rPr>
-          <w:rFonts w:ascii="Times New Roman" w:hAnsi="Times New Roman" w:cs="Times New Roman"/>
-          <w:color w:val="auto"/>
-        </w:rPr>
-        <w:t>VARCHAR(</w:t>
-      </w:r>
-      <w:proofErr w:type="gramEnd"/>
-      <w:r>
-        <w:rPr>
-          <w:rFonts w:ascii="Times New Roman" w:hAnsi="Times New Roman" w:cs="Times New Roman"/>
-          <w:color w:val="auto"/>
-        </w:rPr>
-        <w:t>15) NOT NULL UNIQUE,</w:t>
+        <w:t xml:space="preserve">    Phone VARCHAR(15) NOT NULL UNIQUE,</w:t>
       </w:r>
     </w:p>
     <w:p>
@@ -10309,23 +9493,7 @@
           <w:rFonts w:ascii="Times New Roman" w:hAnsi="Times New Roman" w:cs="Times New Roman"/>
           <w:color w:val="auto"/>
         </w:rPr>
-        <w:t xml:space="preserve">    </w:t>
-      </w:r>
-      <w:proofErr w:type="spellStart"/>
-      <w:r>
-        <w:rPr>
-          <w:rFonts w:ascii="Times New Roman" w:hAnsi="Times New Roman" w:cs="Times New Roman"/>
-          <w:color w:val="auto"/>
-        </w:rPr>
-        <w:t>DepartmentID</w:t>
-      </w:r>
-      <w:proofErr w:type="spellEnd"/>
-      <w:r>
-        <w:rPr>
-          <w:rFonts w:ascii="Times New Roman" w:hAnsi="Times New Roman" w:cs="Times New Roman"/>
-          <w:color w:val="auto"/>
-        </w:rPr>
-        <w:t xml:space="preserve"> INT NOT NULL,</w:t>
+        <w:t xml:space="preserve">    DepartmentID INT NOT NULL,</w:t>
       </w:r>
     </w:p>
     <w:p>
@@ -10346,23 +9514,7 @@
           <w:rFonts w:ascii="Times New Roman" w:hAnsi="Times New Roman" w:cs="Times New Roman"/>
           <w:color w:val="auto"/>
         </w:rPr>
-        <w:t xml:space="preserve">    FOREIGN KEY (</w:t>
-      </w:r>
-      <w:proofErr w:type="spellStart"/>
-      <w:r>
-        <w:rPr>
-          <w:rFonts w:ascii="Times New Roman" w:hAnsi="Times New Roman" w:cs="Times New Roman"/>
-          <w:color w:val="auto"/>
-        </w:rPr>
-        <w:t>DepartmentID</w:t>
-      </w:r>
-      <w:proofErr w:type="spellEnd"/>
-      <w:r>
-        <w:rPr>
-          <w:rFonts w:ascii="Times New Roman" w:hAnsi="Times New Roman" w:cs="Times New Roman"/>
-          <w:color w:val="auto"/>
-        </w:rPr>
-        <w:t>)</w:t>
+        <w:t xml:space="preserve">    FOREIGN KEY (DepartmentID)</w:t>
       </w:r>
     </w:p>
     <w:p>
@@ -10383,32 +9535,7 @@
           <w:rFonts w:ascii="Times New Roman" w:hAnsi="Times New Roman" w:cs="Times New Roman"/>
           <w:color w:val="auto"/>
         </w:rPr>
-        <w:t xml:space="preserve">        REFERENCES </w:t>
-      </w:r>
-      <w:proofErr w:type="gramStart"/>
-      <w:r>
-        <w:rPr>
-          <w:rFonts w:ascii="Times New Roman" w:hAnsi="Times New Roman" w:cs="Times New Roman"/>
-          <w:color w:val="auto"/>
-        </w:rPr>
-        <w:t>Department(</w:t>
-      </w:r>
-      <w:proofErr w:type="spellStart"/>
-      <w:proofErr w:type="gramEnd"/>
-      <w:r>
-        <w:rPr>
-          <w:rFonts w:ascii="Times New Roman" w:hAnsi="Times New Roman" w:cs="Times New Roman"/>
-          <w:color w:val="auto"/>
-        </w:rPr>
-        <w:t>DepartmentID</w:t>
-      </w:r>
-      <w:proofErr w:type="spellEnd"/>
-      <w:r>
-        <w:rPr>
-          <w:rFonts w:ascii="Times New Roman" w:hAnsi="Times New Roman" w:cs="Times New Roman"/>
-          <w:color w:val="auto"/>
-        </w:rPr>
-        <w:t>)</w:t>
+        <w:t xml:space="preserve">        REFERENCES Department(DepartmentID)</w:t>
       </w:r>
     </w:p>
     <w:p>
@@ -10473,31 +9600,7 @@
           <w:sz w:val="24"/>
           <w:szCs w:val="24"/>
         </w:rPr>
-        <w:t xml:space="preserve">Create </w:t>
-      </w:r>
-      <w:proofErr w:type="spellStart"/>
-      <w:r>
-        <w:rPr>
-          <w:rFonts w:ascii="Times New Roman" w:hAnsi="Times New Roman" w:cs="Times New Roman"/>
-          <w:b/>
-          <w:bCs/>
-          <w:color w:val="auto"/>
-          <w:sz w:val="24"/>
-          <w:szCs w:val="24"/>
-        </w:rPr>
-        <w:t>GeneralPractitioner</w:t>
-      </w:r>
-      <w:proofErr w:type="spellEnd"/>
-      <w:r>
-        <w:rPr>
-          <w:rFonts w:ascii="Times New Roman" w:hAnsi="Times New Roman" w:cs="Times New Roman"/>
-          <w:b/>
-          <w:bCs/>
-          <w:color w:val="auto"/>
-          <w:sz w:val="24"/>
-          <w:szCs w:val="24"/>
-        </w:rPr>
-        <w:t xml:space="preserve"> Table</w:t>
+        <w:t>Create GeneralPractitioner Table</w:t>
       </w:r>
     </w:p>
     <w:p>
@@ -10534,23 +9637,7 @@
           <w:rFonts w:ascii="Times New Roman" w:hAnsi="Times New Roman" w:cs="Times New Roman"/>
           <w:color w:val="auto"/>
         </w:rPr>
-        <w:t xml:space="preserve">CREATE TABLE </w:t>
-      </w:r>
-      <w:proofErr w:type="spellStart"/>
-      <w:r>
-        <w:rPr>
-          <w:rFonts w:ascii="Times New Roman" w:hAnsi="Times New Roman" w:cs="Times New Roman"/>
-          <w:color w:val="auto"/>
-        </w:rPr>
-        <w:t>GeneralPractitioner</w:t>
-      </w:r>
-      <w:proofErr w:type="spellEnd"/>
-      <w:r>
-        <w:rPr>
-          <w:rFonts w:ascii="Times New Roman" w:hAnsi="Times New Roman" w:cs="Times New Roman"/>
-          <w:color w:val="auto"/>
-        </w:rPr>
-        <w:t xml:space="preserve"> (</w:t>
+        <w:t>CREATE TABLE GeneralPractitioner (</w:t>
       </w:r>
     </w:p>
     <w:p>
@@ -10571,23 +9658,7 @@
           <w:rFonts w:ascii="Times New Roman" w:hAnsi="Times New Roman" w:cs="Times New Roman"/>
           <w:color w:val="auto"/>
         </w:rPr>
-        <w:t xml:space="preserve">    </w:t>
-      </w:r>
-      <w:proofErr w:type="spellStart"/>
-      <w:r>
-        <w:rPr>
-          <w:rFonts w:ascii="Times New Roman" w:hAnsi="Times New Roman" w:cs="Times New Roman"/>
-          <w:color w:val="auto"/>
-        </w:rPr>
-        <w:t>DoctorID</w:t>
-      </w:r>
-      <w:proofErr w:type="spellEnd"/>
-      <w:r>
-        <w:rPr>
-          <w:rFonts w:ascii="Times New Roman" w:hAnsi="Times New Roman" w:cs="Times New Roman"/>
-          <w:color w:val="auto"/>
-        </w:rPr>
-        <w:t xml:space="preserve"> INT PRIMARY KEY,</w:t>
+        <w:t xml:space="preserve">    DoctorID INT PRIMARY KEY,</w:t>
       </w:r>
     </w:p>
     <w:p>
@@ -10608,23 +9679,7 @@
           <w:rFonts w:ascii="Times New Roman" w:hAnsi="Times New Roman" w:cs="Times New Roman"/>
           <w:color w:val="auto"/>
         </w:rPr>
-        <w:t xml:space="preserve">    FOREIGN KEY (</w:t>
-      </w:r>
-      <w:proofErr w:type="spellStart"/>
-      <w:r>
-        <w:rPr>
-          <w:rFonts w:ascii="Times New Roman" w:hAnsi="Times New Roman" w:cs="Times New Roman"/>
-          <w:color w:val="auto"/>
-        </w:rPr>
-        <w:t>DoctorID</w:t>
-      </w:r>
-      <w:proofErr w:type="spellEnd"/>
-      <w:r>
-        <w:rPr>
-          <w:rFonts w:ascii="Times New Roman" w:hAnsi="Times New Roman" w:cs="Times New Roman"/>
-          <w:color w:val="auto"/>
-        </w:rPr>
-        <w:t>)</w:t>
+        <w:t xml:space="preserve">    FOREIGN KEY (DoctorID)</w:t>
       </w:r>
     </w:p>
     <w:p>
@@ -10645,32 +9700,7 @@
           <w:rFonts w:ascii="Times New Roman" w:hAnsi="Times New Roman" w:cs="Times New Roman"/>
           <w:color w:val="auto"/>
         </w:rPr>
-        <w:t xml:space="preserve">        REFERENCES </w:t>
-      </w:r>
-      <w:proofErr w:type="gramStart"/>
-      <w:r>
-        <w:rPr>
-          <w:rFonts w:ascii="Times New Roman" w:hAnsi="Times New Roman" w:cs="Times New Roman"/>
-          <w:color w:val="auto"/>
-        </w:rPr>
-        <w:t>Doctor(</w:t>
-      </w:r>
-      <w:proofErr w:type="spellStart"/>
-      <w:proofErr w:type="gramEnd"/>
-      <w:r>
-        <w:rPr>
-          <w:rFonts w:ascii="Times New Roman" w:hAnsi="Times New Roman" w:cs="Times New Roman"/>
-          <w:color w:val="auto"/>
-        </w:rPr>
-        <w:t>DoctorID</w:t>
-      </w:r>
-      <w:proofErr w:type="spellEnd"/>
-      <w:r>
-        <w:rPr>
-          <w:rFonts w:ascii="Times New Roman" w:hAnsi="Times New Roman" w:cs="Times New Roman"/>
-          <w:color w:val="auto"/>
-        </w:rPr>
-        <w:t>)</w:t>
+        <w:t xml:space="preserve">        REFERENCES Doctor(DoctorID)</w:t>
       </w:r>
     </w:p>
     <w:p>
@@ -10885,23 +9915,7 @@
           <w:rFonts w:ascii="Times New Roman" w:hAnsi="Times New Roman" w:cs="Times New Roman"/>
           <w:color w:val="auto"/>
         </w:rPr>
-        <w:t xml:space="preserve">    </w:t>
-      </w:r>
-      <w:proofErr w:type="spellStart"/>
-      <w:r>
-        <w:rPr>
-          <w:rFonts w:ascii="Times New Roman" w:hAnsi="Times New Roman" w:cs="Times New Roman"/>
-          <w:color w:val="auto"/>
-        </w:rPr>
-        <w:t>DoctorID</w:t>
-      </w:r>
-      <w:proofErr w:type="spellEnd"/>
-      <w:r>
-        <w:rPr>
-          <w:rFonts w:ascii="Times New Roman" w:hAnsi="Times New Roman" w:cs="Times New Roman"/>
-          <w:color w:val="auto"/>
-        </w:rPr>
-        <w:t xml:space="preserve"> INT PRIMARY KEY,</w:t>
+        <w:t xml:space="preserve">    DoctorID INT PRIMARY KEY,</w:t>
       </w:r>
     </w:p>
     <w:p>
@@ -10922,23 +9936,7 @@
           <w:rFonts w:ascii="Times New Roman" w:hAnsi="Times New Roman" w:cs="Times New Roman"/>
           <w:color w:val="auto"/>
         </w:rPr>
-        <w:t xml:space="preserve">    Specialty </w:t>
-      </w:r>
-      <w:proofErr w:type="gramStart"/>
-      <w:r>
-        <w:rPr>
-          <w:rFonts w:ascii="Times New Roman" w:hAnsi="Times New Roman" w:cs="Times New Roman"/>
-          <w:color w:val="auto"/>
-        </w:rPr>
-        <w:t>VARCHAR(</w:t>
-      </w:r>
-      <w:proofErr w:type="gramEnd"/>
-      <w:r>
-        <w:rPr>
-          <w:rFonts w:ascii="Times New Roman" w:hAnsi="Times New Roman" w:cs="Times New Roman"/>
-          <w:color w:val="auto"/>
-        </w:rPr>
-        <w:t>50) NOT NULL,</w:t>
+        <w:t xml:space="preserve">    Specialty VARCHAR(50) NOT NULL,</w:t>
       </w:r>
     </w:p>
     <w:p>
@@ -10959,23 +9957,7 @@
           <w:rFonts w:ascii="Times New Roman" w:hAnsi="Times New Roman" w:cs="Times New Roman"/>
           <w:color w:val="auto"/>
         </w:rPr>
-        <w:t xml:space="preserve">    FOREIGN KEY (</w:t>
-      </w:r>
-      <w:proofErr w:type="spellStart"/>
-      <w:r>
-        <w:rPr>
-          <w:rFonts w:ascii="Times New Roman" w:hAnsi="Times New Roman" w:cs="Times New Roman"/>
-          <w:color w:val="auto"/>
-        </w:rPr>
-        <w:t>DoctorID</w:t>
-      </w:r>
-      <w:proofErr w:type="spellEnd"/>
-      <w:r>
-        <w:rPr>
-          <w:rFonts w:ascii="Times New Roman" w:hAnsi="Times New Roman" w:cs="Times New Roman"/>
-          <w:color w:val="auto"/>
-        </w:rPr>
-        <w:t>)</w:t>
+        <w:t xml:space="preserve">    FOREIGN KEY (DoctorID)</w:t>
       </w:r>
     </w:p>
     <w:p>
@@ -10996,32 +9978,7 @@
           <w:rFonts w:ascii="Times New Roman" w:hAnsi="Times New Roman" w:cs="Times New Roman"/>
           <w:color w:val="auto"/>
         </w:rPr>
-        <w:t xml:space="preserve">        REFERENCES </w:t>
-      </w:r>
-      <w:proofErr w:type="gramStart"/>
-      <w:r>
-        <w:rPr>
-          <w:rFonts w:ascii="Times New Roman" w:hAnsi="Times New Roman" w:cs="Times New Roman"/>
-          <w:color w:val="auto"/>
-        </w:rPr>
-        <w:t>Doctor(</w:t>
-      </w:r>
-      <w:proofErr w:type="spellStart"/>
-      <w:proofErr w:type="gramEnd"/>
-      <w:r>
-        <w:rPr>
-          <w:rFonts w:ascii="Times New Roman" w:hAnsi="Times New Roman" w:cs="Times New Roman"/>
-          <w:color w:val="auto"/>
-        </w:rPr>
-        <w:t>DoctorID</w:t>
-      </w:r>
-      <w:proofErr w:type="spellEnd"/>
-      <w:r>
-        <w:rPr>
-          <w:rFonts w:ascii="Times New Roman" w:hAnsi="Times New Roman" w:cs="Times New Roman"/>
-          <w:color w:val="auto"/>
-        </w:rPr>
-        <w:t>)</w:t>
+        <w:t xml:space="preserve">        REFERENCES Doctor(DoctorID)</w:t>
       </w:r>
     </w:p>
     <w:p>
@@ -11143,23 +10100,7 @@
           <w:rFonts w:ascii="Times New Roman" w:hAnsi="Times New Roman" w:cs="Times New Roman"/>
           <w:color w:val="auto"/>
         </w:rPr>
-        <w:t xml:space="preserve">    </w:t>
-      </w:r>
-      <w:proofErr w:type="spellStart"/>
-      <w:r>
-        <w:rPr>
-          <w:rFonts w:ascii="Times New Roman" w:hAnsi="Times New Roman" w:cs="Times New Roman"/>
-          <w:color w:val="auto"/>
-        </w:rPr>
-        <w:t>AppointmentID</w:t>
-      </w:r>
-      <w:proofErr w:type="spellEnd"/>
-      <w:r>
-        <w:rPr>
-          <w:rFonts w:ascii="Times New Roman" w:hAnsi="Times New Roman" w:cs="Times New Roman"/>
-          <w:color w:val="auto"/>
-        </w:rPr>
-        <w:t xml:space="preserve"> INT PRIMARY KEY,</w:t>
+        <w:t xml:space="preserve">    AppointmentID INT PRIMARY KEY,</w:t>
       </w:r>
     </w:p>
     <w:p>
@@ -11180,23 +10121,7 @@
           <w:rFonts w:ascii="Times New Roman" w:hAnsi="Times New Roman" w:cs="Times New Roman"/>
           <w:color w:val="auto"/>
         </w:rPr>
-        <w:t xml:space="preserve">    </w:t>
-      </w:r>
-      <w:proofErr w:type="spellStart"/>
-      <w:r>
-        <w:rPr>
-          <w:rFonts w:ascii="Times New Roman" w:hAnsi="Times New Roman" w:cs="Times New Roman"/>
-          <w:color w:val="auto"/>
-        </w:rPr>
-        <w:t>AppointmentDate</w:t>
-      </w:r>
-      <w:proofErr w:type="spellEnd"/>
-      <w:r>
-        <w:rPr>
-          <w:rFonts w:ascii="Times New Roman" w:hAnsi="Times New Roman" w:cs="Times New Roman"/>
-          <w:color w:val="auto"/>
-        </w:rPr>
-        <w:t xml:space="preserve"> DATE NOT NULL,</w:t>
+        <w:t xml:space="preserve">    AppointmentDate DATE NOT NULL,</w:t>
       </w:r>
     </w:p>
     <w:p>
@@ -11217,23 +10142,7 @@
           <w:rFonts w:ascii="Times New Roman" w:hAnsi="Times New Roman" w:cs="Times New Roman"/>
           <w:color w:val="auto"/>
         </w:rPr>
-        <w:t xml:space="preserve">    Status </w:t>
-      </w:r>
-      <w:proofErr w:type="gramStart"/>
-      <w:r>
-        <w:rPr>
-          <w:rFonts w:ascii="Times New Roman" w:hAnsi="Times New Roman" w:cs="Times New Roman"/>
-          <w:color w:val="auto"/>
-        </w:rPr>
-        <w:t>VARCHAR(</w:t>
-      </w:r>
-      <w:proofErr w:type="gramEnd"/>
-      <w:r>
-        <w:rPr>
-          <w:rFonts w:ascii="Times New Roman" w:hAnsi="Times New Roman" w:cs="Times New Roman"/>
-          <w:color w:val="auto"/>
-        </w:rPr>
-        <w:t>20) NOT NULL,</w:t>
+        <w:t xml:space="preserve">    Status VARCHAR(20) NOT NULL,</w:t>
       </w:r>
     </w:p>
     <w:p>
@@ -11254,23 +10163,7 @@
           <w:rFonts w:ascii="Times New Roman" w:hAnsi="Times New Roman" w:cs="Times New Roman"/>
           <w:color w:val="auto"/>
         </w:rPr>
-        <w:t xml:space="preserve">    </w:t>
-      </w:r>
-      <w:proofErr w:type="spellStart"/>
-      <w:r>
-        <w:rPr>
-          <w:rFonts w:ascii="Times New Roman" w:hAnsi="Times New Roman" w:cs="Times New Roman"/>
-          <w:color w:val="auto"/>
-        </w:rPr>
-        <w:t>PatientID</w:t>
-      </w:r>
-      <w:proofErr w:type="spellEnd"/>
-      <w:r>
-        <w:rPr>
-          <w:rFonts w:ascii="Times New Roman" w:hAnsi="Times New Roman" w:cs="Times New Roman"/>
-          <w:color w:val="auto"/>
-        </w:rPr>
-        <w:t xml:space="preserve"> INT NOT NULL,</w:t>
+        <w:t xml:space="preserve">    PatientID INT NOT NULL,</w:t>
       </w:r>
     </w:p>
     <w:p>
@@ -11291,23 +10184,7 @@
           <w:rFonts w:ascii="Times New Roman" w:hAnsi="Times New Roman" w:cs="Times New Roman"/>
           <w:color w:val="auto"/>
         </w:rPr>
-        <w:t xml:space="preserve">    </w:t>
-      </w:r>
-      <w:proofErr w:type="spellStart"/>
-      <w:r>
-        <w:rPr>
-          <w:rFonts w:ascii="Times New Roman" w:hAnsi="Times New Roman" w:cs="Times New Roman"/>
-          <w:color w:val="auto"/>
-        </w:rPr>
-        <w:t>DoctorID</w:t>
-      </w:r>
-      <w:proofErr w:type="spellEnd"/>
-      <w:r>
-        <w:rPr>
-          <w:rFonts w:ascii="Times New Roman" w:hAnsi="Times New Roman" w:cs="Times New Roman"/>
-          <w:color w:val="auto"/>
-        </w:rPr>
-        <w:t xml:space="preserve"> INT NOT NULL,</w:t>
+        <w:t xml:space="preserve">    DoctorID INT NOT NULL,</w:t>
       </w:r>
     </w:p>
     <w:p>
@@ -11328,23 +10205,7 @@
           <w:rFonts w:ascii="Times New Roman" w:hAnsi="Times New Roman" w:cs="Times New Roman"/>
           <w:color w:val="auto"/>
         </w:rPr>
-        <w:t xml:space="preserve">    FOREIGN KEY (</w:t>
-      </w:r>
-      <w:proofErr w:type="spellStart"/>
-      <w:r>
-        <w:rPr>
-          <w:rFonts w:ascii="Times New Roman" w:hAnsi="Times New Roman" w:cs="Times New Roman"/>
-          <w:color w:val="auto"/>
-        </w:rPr>
-        <w:t>PatientID</w:t>
-      </w:r>
-      <w:proofErr w:type="spellEnd"/>
-      <w:r>
-        <w:rPr>
-          <w:rFonts w:ascii="Times New Roman" w:hAnsi="Times New Roman" w:cs="Times New Roman"/>
-          <w:color w:val="auto"/>
-        </w:rPr>
-        <w:t>)</w:t>
+        <w:t xml:space="preserve">    FOREIGN KEY (PatientID)</w:t>
       </w:r>
     </w:p>
     <w:p>
@@ -11365,32 +10226,7 @@
           <w:rFonts w:ascii="Times New Roman" w:hAnsi="Times New Roman" w:cs="Times New Roman"/>
           <w:color w:val="auto"/>
         </w:rPr>
-        <w:t xml:space="preserve">        REFERENCES </w:t>
-      </w:r>
-      <w:proofErr w:type="gramStart"/>
-      <w:r>
-        <w:rPr>
-          <w:rFonts w:ascii="Times New Roman" w:hAnsi="Times New Roman" w:cs="Times New Roman"/>
-          <w:color w:val="auto"/>
-        </w:rPr>
-        <w:t>Patient(</w:t>
-      </w:r>
-      <w:proofErr w:type="spellStart"/>
-      <w:proofErr w:type="gramEnd"/>
-      <w:r>
-        <w:rPr>
-          <w:rFonts w:ascii="Times New Roman" w:hAnsi="Times New Roman" w:cs="Times New Roman"/>
-          <w:color w:val="auto"/>
-        </w:rPr>
-        <w:t>PatientID</w:t>
-      </w:r>
-      <w:proofErr w:type="spellEnd"/>
-      <w:r>
-        <w:rPr>
-          <w:rFonts w:ascii="Times New Roman" w:hAnsi="Times New Roman" w:cs="Times New Roman"/>
-          <w:color w:val="auto"/>
-        </w:rPr>
-        <w:t>),</w:t>
+        <w:t xml:space="preserve">        REFERENCES Patient(PatientID),</w:t>
       </w:r>
     </w:p>
     <w:p>
@@ -11411,23 +10247,7 @@
           <w:rFonts w:ascii="Times New Roman" w:hAnsi="Times New Roman" w:cs="Times New Roman"/>
           <w:color w:val="auto"/>
         </w:rPr>
-        <w:t xml:space="preserve">    FOREIGN KEY (</w:t>
-      </w:r>
-      <w:proofErr w:type="spellStart"/>
-      <w:r>
-        <w:rPr>
-          <w:rFonts w:ascii="Times New Roman" w:hAnsi="Times New Roman" w:cs="Times New Roman"/>
-          <w:color w:val="auto"/>
-        </w:rPr>
-        <w:t>DoctorID</w:t>
-      </w:r>
-      <w:proofErr w:type="spellEnd"/>
-      <w:r>
-        <w:rPr>
-          <w:rFonts w:ascii="Times New Roman" w:hAnsi="Times New Roman" w:cs="Times New Roman"/>
-          <w:color w:val="auto"/>
-        </w:rPr>
-        <w:t>)</w:t>
+        <w:t xml:space="preserve">    FOREIGN KEY (DoctorID)</w:t>
       </w:r>
     </w:p>
     <w:p>
@@ -11448,32 +10268,7 @@
           <w:rFonts w:ascii="Times New Roman" w:hAnsi="Times New Roman" w:cs="Times New Roman"/>
           <w:color w:val="auto"/>
         </w:rPr>
-        <w:t xml:space="preserve">        REFERENCES </w:t>
-      </w:r>
-      <w:proofErr w:type="gramStart"/>
-      <w:r>
-        <w:rPr>
-          <w:rFonts w:ascii="Times New Roman" w:hAnsi="Times New Roman" w:cs="Times New Roman"/>
-          <w:color w:val="auto"/>
-        </w:rPr>
-        <w:t>Doctor(</w:t>
-      </w:r>
-      <w:proofErr w:type="spellStart"/>
-      <w:proofErr w:type="gramEnd"/>
-      <w:r>
-        <w:rPr>
-          <w:rFonts w:ascii="Times New Roman" w:hAnsi="Times New Roman" w:cs="Times New Roman"/>
-          <w:color w:val="auto"/>
-        </w:rPr>
-        <w:t>DoctorID</w:t>
-      </w:r>
-      <w:proofErr w:type="spellEnd"/>
-      <w:r>
-        <w:rPr>
-          <w:rFonts w:ascii="Times New Roman" w:hAnsi="Times New Roman" w:cs="Times New Roman"/>
-          <w:color w:val="auto"/>
-        </w:rPr>
-        <w:t>)</w:t>
+        <w:t xml:space="preserve">        REFERENCES Doctor(DoctorID)</w:t>
       </w:r>
     </w:p>
     <w:p>
@@ -11642,23 +10437,7 @@
           <w:rFonts w:ascii="Times New Roman" w:hAnsi="Times New Roman" w:cs="Times New Roman"/>
           <w:color w:val="auto"/>
         </w:rPr>
-        <w:t xml:space="preserve">    </w:t>
-      </w:r>
-      <w:proofErr w:type="spellStart"/>
-      <w:r>
-        <w:rPr>
-          <w:rFonts w:ascii="Times New Roman" w:hAnsi="Times New Roman" w:cs="Times New Roman"/>
-          <w:color w:val="auto"/>
-        </w:rPr>
-        <w:t>TreatmentID</w:t>
-      </w:r>
-      <w:proofErr w:type="spellEnd"/>
-      <w:r>
-        <w:rPr>
-          <w:rFonts w:ascii="Times New Roman" w:hAnsi="Times New Roman" w:cs="Times New Roman"/>
-          <w:color w:val="auto"/>
-        </w:rPr>
-        <w:t xml:space="preserve"> INT PRIMARY KEY,</w:t>
+        <w:t xml:space="preserve">    TreatmentID INT PRIMARY KEY,</w:t>
       </w:r>
     </w:p>
     <w:p>
@@ -11679,23 +10458,7 @@
           <w:rFonts w:ascii="Times New Roman" w:hAnsi="Times New Roman" w:cs="Times New Roman"/>
           <w:color w:val="auto"/>
         </w:rPr>
-        <w:t xml:space="preserve">    Diagnosis </w:t>
-      </w:r>
-      <w:proofErr w:type="gramStart"/>
-      <w:r>
-        <w:rPr>
-          <w:rFonts w:ascii="Times New Roman" w:hAnsi="Times New Roman" w:cs="Times New Roman"/>
-          <w:color w:val="auto"/>
-        </w:rPr>
-        <w:t>VARCHAR(</w:t>
-      </w:r>
-      <w:proofErr w:type="gramEnd"/>
-      <w:r>
-        <w:rPr>
-          <w:rFonts w:ascii="Times New Roman" w:hAnsi="Times New Roman" w:cs="Times New Roman"/>
-          <w:color w:val="auto"/>
-        </w:rPr>
-        <w:t>100) NOT NULL,</w:t>
+        <w:t xml:space="preserve">    Diagnosis VARCHAR(100) NOT NULL,</w:t>
       </w:r>
     </w:p>
     <w:p>
@@ -11716,23 +10479,7 @@
           <w:rFonts w:ascii="Times New Roman" w:hAnsi="Times New Roman" w:cs="Times New Roman"/>
           <w:color w:val="auto"/>
         </w:rPr>
-        <w:t xml:space="preserve">    </w:t>
-      </w:r>
-      <w:proofErr w:type="spellStart"/>
-      <w:r>
-        <w:rPr>
-          <w:rFonts w:ascii="Times New Roman" w:hAnsi="Times New Roman" w:cs="Times New Roman"/>
-          <w:color w:val="auto"/>
-        </w:rPr>
-        <w:t>AppointmentID</w:t>
-      </w:r>
-      <w:proofErr w:type="spellEnd"/>
-      <w:r>
-        <w:rPr>
-          <w:rFonts w:ascii="Times New Roman" w:hAnsi="Times New Roman" w:cs="Times New Roman"/>
-          <w:color w:val="auto"/>
-        </w:rPr>
-        <w:t xml:space="preserve"> INT UNIQUE,</w:t>
+        <w:t xml:space="preserve">    AppointmentID INT UNIQUE,</w:t>
       </w:r>
     </w:p>
     <w:p>
@@ -11753,23 +10500,7 @@
           <w:rFonts w:ascii="Times New Roman" w:hAnsi="Times New Roman" w:cs="Times New Roman"/>
           <w:color w:val="auto"/>
         </w:rPr>
-        <w:t xml:space="preserve">    FOREIGN KEY (</w:t>
-      </w:r>
-      <w:proofErr w:type="spellStart"/>
-      <w:r>
-        <w:rPr>
-          <w:rFonts w:ascii="Times New Roman" w:hAnsi="Times New Roman" w:cs="Times New Roman"/>
-          <w:color w:val="auto"/>
-        </w:rPr>
-        <w:t>AppointmentID</w:t>
-      </w:r>
-      <w:proofErr w:type="spellEnd"/>
-      <w:r>
-        <w:rPr>
-          <w:rFonts w:ascii="Times New Roman" w:hAnsi="Times New Roman" w:cs="Times New Roman"/>
-          <w:color w:val="auto"/>
-        </w:rPr>
-        <w:t>)</w:t>
+        <w:t xml:space="preserve">    FOREIGN KEY (AppointmentID)</w:t>
       </w:r>
     </w:p>
     <w:p>
@@ -11790,32 +10521,7 @@
           <w:rFonts w:ascii="Times New Roman" w:hAnsi="Times New Roman" w:cs="Times New Roman"/>
           <w:color w:val="auto"/>
         </w:rPr>
-        <w:t xml:space="preserve">        REFERENCES </w:t>
-      </w:r>
-      <w:proofErr w:type="gramStart"/>
-      <w:r>
-        <w:rPr>
-          <w:rFonts w:ascii="Times New Roman" w:hAnsi="Times New Roman" w:cs="Times New Roman"/>
-          <w:color w:val="auto"/>
-        </w:rPr>
-        <w:t>Appointment(</w:t>
-      </w:r>
-      <w:proofErr w:type="spellStart"/>
-      <w:proofErr w:type="gramEnd"/>
-      <w:r>
-        <w:rPr>
-          <w:rFonts w:ascii="Times New Roman" w:hAnsi="Times New Roman" w:cs="Times New Roman"/>
-          <w:color w:val="auto"/>
-        </w:rPr>
-        <w:t>AppointmentID</w:t>
-      </w:r>
-      <w:proofErr w:type="spellEnd"/>
-      <w:r>
-        <w:rPr>
-          <w:rFonts w:ascii="Times New Roman" w:hAnsi="Times New Roman" w:cs="Times New Roman"/>
-          <w:color w:val="auto"/>
-        </w:rPr>
-        <w:t>)</w:t>
+        <w:t xml:space="preserve">        REFERENCES Appointment(AppointmentID)</w:t>
       </w:r>
     </w:p>
     <w:p>
@@ -11934,23 +10640,7 @@
           <w:rFonts w:ascii="Times New Roman" w:hAnsi="Times New Roman" w:cs="Times New Roman"/>
           <w:color w:val="auto"/>
         </w:rPr>
-        <w:t xml:space="preserve">    </w:t>
-      </w:r>
-      <w:proofErr w:type="spellStart"/>
-      <w:r>
-        <w:rPr>
-          <w:rFonts w:ascii="Times New Roman" w:hAnsi="Times New Roman" w:cs="Times New Roman"/>
-          <w:color w:val="auto"/>
-        </w:rPr>
-        <w:t>PaymentID</w:t>
-      </w:r>
-      <w:proofErr w:type="spellEnd"/>
-      <w:r>
-        <w:rPr>
-          <w:rFonts w:ascii="Times New Roman" w:hAnsi="Times New Roman" w:cs="Times New Roman"/>
-          <w:color w:val="auto"/>
-        </w:rPr>
-        <w:t xml:space="preserve"> INT PRIMARY KEY,</w:t>
+        <w:t xml:space="preserve">    PaymentID INT PRIMARY KEY,</w:t>
       </w:r>
     </w:p>
     <w:p>
@@ -11971,23 +10661,7 @@
           <w:rFonts w:ascii="Times New Roman" w:hAnsi="Times New Roman" w:cs="Times New Roman"/>
           <w:color w:val="auto"/>
         </w:rPr>
-        <w:t xml:space="preserve">    Amount </w:t>
-      </w:r>
-      <w:proofErr w:type="gramStart"/>
-      <w:r>
-        <w:rPr>
-          <w:rFonts w:ascii="Times New Roman" w:hAnsi="Times New Roman" w:cs="Times New Roman"/>
-          <w:color w:val="auto"/>
-        </w:rPr>
-        <w:t>DECIMAL(</w:t>
-      </w:r>
-      <w:proofErr w:type="gramEnd"/>
-      <w:r>
-        <w:rPr>
-          <w:rFonts w:ascii="Times New Roman" w:hAnsi="Times New Roman" w:cs="Times New Roman"/>
-          <w:color w:val="auto"/>
-        </w:rPr>
-        <w:t>8,2) NOT NULL,</w:t>
+        <w:t xml:space="preserve">    Amount DECIMAL(8,2) NOT NULL,</w:t>
       </w:r>
     </w:p>
     <w:p>
@@ -12008,39 +10682,7 @@
           <w:rFonts w:ascii="Times New Roman" w:hAnsi="Times New Roman" w:cs="Times New Roman"/>
           <w:color w:val="auto"/>
         </w:rPr>
-        <w:t xml:space="preserve">    </w:t>
-      </w:r>
-      <w:proofErr w:type="spellStart"/>
-      <w:r>
-        <w:rPr>
-          <w:rFonts w:ascii="Times New Roman" w:hAnsi="Times New Roman" w:cs="Times New Roman"/>
-          <w:color w:val="auto"/>
-        </w:rPr>
-        <w:t>PaymentMethod</w:t>
-      </w:r>
-      <w:proofErr w:type="spellEnd"/>
-      <w:r>
-        <w:rPr>
-          <w:rFonts w:ascii="Times New Roman" w:hAnsi="Times New Roman" w:cs="Times New Roman"/>
-          <w:color w:val="auto"/>
-        </w:rPr>
-        <w:t xml:space="preserve"> </w:t>
-      </w:r>
-      <w:proofErr w:type="gramStart"/>
-      <w:r>
-        <w:rPr>
-          <w:rFonts w:ascii="Times New Roman" w:hAnsi="Times New Roman" w:cs="Times New Roman"/>
-          <w:color w:val="auto"/>
-        </w:rPr>
-        <w:t>VARCHAR(</w:t>
-      </w:r>
-      <w:proofErr w:type="gramEnd"/>
-      <w:r>
-        <w:rPr>
-          <w:rFonts w:ascii="Times New Roman" w:hAnsi="Times New Roman" w:cs="Times New Roman"/>
-          <w:color w:val="auto"/>
-        </w:rPr>
-        <w:t>20) NOT NULL,</w:t>
+        <w:t xml:space="preserve">    PaymentMethod VARCHAR(20) NOT NULL,</w:t>
       </w:r>
     </w:p>
     <w:p>
@@ -12061,23 +10703,7 @@
           <w:rFonts w:ascii="Times New Roman" w:hAnsi="Times New Roman" w:cs="Times New Roman"/>
           <w:color w:val="auto"/>
         </w:rPr>
-        <w:t xml:space="preserve">    </w:t>
-      </w:r>
-      <w:proofErr w:type="spellStart"/>
-      <w:r>
-        <w:rPr>
-          <w:rFonts w:ascii="Times New Roman" w:hAnsi="Times New Roman" w:cs="Times New Roman"/>
-          <w:color w:val="auto"/>
-        </w:rPr>
-        <w:t>AppointmentID</w:t>
-      </w:r>
-      <w:proofErr w:type="spellEnd"/>
-      <w:r>
-        <w:rPr>
-          <w:rFonts w:ascii="Times New Roman" w:hAnsi="Times New Roman" w:cs="Times New Roman"/>
-          <w:color w:val="auto"/>
-        </w:rPr>
-        <w:t xml:space="preserve"> INT UNIQUE,</w:t>
+        <w:t xml:space="preserve">    AppointmentID INT UNIQUE,</w:t>
       </w:r>
     </w:p>
     <w:p>
@@ -12098,23 +10724,7 @@
           <w:rFonts w:ascii="Times New Roman" w:hAnsi="Times New Roman" w:cs="Times New Roman"/>
           <w:color w:val="auto"/>
         </w:rPr>
-        <w:t xml:space="preserve">    FOREIGN KEY (</w:t>
-      </w:r>
-      <w:proofErr w:type="spellStart"/>
-      <w:r>
-        <w:rPr>
-          <w:rFonts w:ascii="Times New Roman" w:hAnsi="Times New Roman" w:cs="Times New Roman"/>
-          <w:color w:val="auto"/>
-        </w:rPr>
-        <w:t>AppointmentID</w:t>
-      </w:r>
-      <w:proofErr w:type="spellEnd"/>
-      <w:r>
-        <w:rPr>
-          <w:rFonts w:ascii="Times New Roman" w:hAnsi="Times New Roman" w:cs="Times New Roman"/>
-          <w:color w:val="auto"/>
-        </w:rPr>
-        <w:t>)</w:t>
+        <w:t xml:space="preserve">    FOREIGN KEY (AppointmentID)</w:t>
       </w:r>
     </w:p>
     <w:p>
@@ -12135,32 +10745,7 @@
           <w:rFonts w:ascii="Times New Roman" w:hAnsi="Times New Roman" w:cs="Times New Roman"/>
           <w:color w:val="auto"/>
         </w:rPr>
-        <w:t xml:space="preserve">        REFERENCES </w:t>
-      </w:r>
-      <w:proofErr w:type="gramStart"/>
-      <w:r>
-        <w:rPr>
-          <w:rFonts w:ascii="Times New Roman" w:hAnsi="Times New Roman" w:cs="Times New Roman"/>
-          <w:color w:val="auto"/>
-        </w:rPr>
-        <w:t>Appointment(</w:t>
-      </w:r>
-      <w:proofErr w:type="spellStart"/>
-      <w:proofErr w:type="gramEnd"/>
-      <w:r>
-        <w:rPr>
-          <w:rFonts w:ascii="Times New Roman" w:hAnsi="Times New Roman" w:cs="Times New Roman"/>
-          <w:color w:val="auto"/>
-        </w:rPr>
-        <w:t>AppointmentID</w:t>
-      </w:r>
-      <w:proofErr w:type="spellEnd"/>
-      <w:r>
-        <w:rPr>
-          <w:rFonts w:ascii="Times New Roman" w:hAnsi="Times New Roman" w:cs="Times New Roman"/>
-          <w:color w:val="auto"/>
-        </w:rPr>
-        <w:t>)</w:t>
+        <w:t xml:space="preserve">        REFERENCES Appointment(AppointmentID)</w:t>
       </w:r>
     </w:p>
     <w:p>
@@ -12338,47 +10923,7 @@
           <w:sz w:val="24"/>
           <w:szCs w:val="24"/>
         </w:rPr>
-        <w:t>INSERT INTO Department (</w:t>
-      </w:r>
-      <w:proofErr w:type="spellStart"/>
-      <w:r>
-        <w:rPr>
-          <w:rFonts w:ascii="Times New Roman" w:hAnsi="Times New Roman" w:cs="Times New Roman"/>
-          <w:color w:val="auto"/>
-          <w:sz w:val="24"/>
-          <w:szCs w:val="24"/>
-        </w:rPr>
-        <w:t>DepartmentID</w:t>
-      </w:r>
-      <w:proofErr w:type="spellEnd"/>
-      <w:r>
-        <w:rPr>
-          <w:rFonts w:ascii="Times New Roman" w:hAnsi="Times New Roman" w:cs="Times New Roman"/>
-          <w:color w:val="auto"/>
-          <w:sz w:val="24"/>
-          <w:szCs w:val="24"/>
-        </w:rPr>
-        <w:t xml:space="preserve">, </w:t>
-      </w:r>
-      <w:proofErr w:type="spellStart"/>
-      <w:r>
-        <w:rPr>
-          <w:rFonts w:ascii="Times New Roman" w:hAnsi="Times New Roman" w:cs="Times New Roman"/>
-          <w:color w:val="auto"/>
-          <w:sz w:val="24"/>
-          <w:szCs w:val="24"/>
-        </w:rPr>
-        <w:t>DepartmentName</w:t>
-      </w:r>
-      <w:proofErr w:type="spellEnd"/>
-      <w:r>
-        <w:rPr>
-          <w:rFonts w:ascii="Times New Roman" w:hAnsi="Times New Roman" w:cs="Times New Roman"/>
-          <w:color w:val="auto"/>
-          <w:sz w:val="24"/>
-          <w:szCs w:val="24"/>
-        </w:rPr>
-        <w:t>)</w:t>
+        <w:t>INSERT INTO Department (DepartmentID, DepartmentName)</w:t>
       </w:r>
     </w:p>
     <w:p>
@@ -12568,27 +11113,7 @@
           <w:sz w:val="24"/>
           <w:szCs w:val="24"/>
         </w:rPr>
-        <w:t>INSERT INTO Patient (</w:t>
-      </w:r>
-      <w:proofErr w:type="spellStart"/>
-      <w:r>
-        <w:rPr>
-          <w:rFonts w:ascii="Times New Roman" w:hAnsi="Times New Roman" w:cs="Times New Roman"/>
-          <w:color w:val="auto"/>
-          <w:sz w:val="24"/>
-          <w:szCs w:val="24"/>
-        </w:rPr>
-        <w:t>PatientID</w:t>
-      </w:r>
-      <w:proofErr w:type="spellEnd"/>
-      <w:r>
-        <w:rPr>
-          <w:rFonts w:ascii="Times New Roman" w:hAnsi="Times New Roman" w:cs="Times New Roman"/>
-          <w:color w:val="auto"/>
-          <w:sz w:val="24"/>
-          <w:szCs w:val="24"/>
-        </w:rPr>
-        <w:t>, FirstName, LastName, Gender, Phone)</w:t>
+        <w:t>INSERT INTO Patient (PatientID, FirstName, LastName, Gender, Phone)</w:t>
       </w:r>
     </w:p>
     <w:p>
@@ -12988,47 +11513,7 @@
           <w:sz w:val="24"/>
           <w:szCs w:val="24"/>
         </w:rPr>
-        <w:t>INSERT INTO Doctor (</w:t>
-      </w:r>
-      <w:proofErr w:type="spellStart"/>
-      <w:r>
-        <w:rPr>
-          <w:rFonts w:ascii="Times New Roman" w:hAnsi="Times New Roman" w:cs="Times New Roman"/>
-          <w:color w:val="auto"/>
-          <w:sz w:val="24"/>
-          <w:szCs w:val="24"/>
-        </w:rPr>
-        <w:t>DoctorID</w:t>
-      </w:r>
-      <w:proofErr w:type="spellEnd"/>
-      <w:r>
-        <w:rPr>
-          <w:rFonts w:ascii="Times New Roman" w:hAnsi="Times New Roman" w:cs="Times New Roman"/>
-          <w:color w:val="auto"/>
-          <w:sz w:val="24"/>
-          <w:szCs w:val="24"/>
-        </w:rPr>
-        <w:t xml:space="preserve">, FirstName, LastName, Phone, </w:t>
-      </w:r>
-      <w:proofErr w:type="spellStart"/>
-      <w:r>
-        <w:rPr>
-          <w:rFonts w:ascii="Times New Roman" w:hAnsi="Times New Roman" w:cs="Times New Roman"/>
-          <w:color w:val="auto"/>
-          <w:sz w:val="24"/>
-          <w:szCs w:val="24"/>
-        </w:rPr>
-        <w:t>DepartmentID</w:t>
-      </w:r>
-      <w:proofErr w:type="spellEnd"/>
-      <w:r>
-        <w:rPr>
-          <w:rFonts w:ascii="Times New Roman" w:hAnsi="Times New Roman" w:cs="Times New Roman"/>
-          <w:color w:val="auto"/>
-          <w:sz w:val="24"/>
-          <w:szCs w:val="24"/>
-        </w:rPr>
-        <w:t>)</w:t>
+        <w:t>INSERT INTO Doctor (DoctorID, FirstName, LastName, Phone, DepartmentID)</w:t>
       </w:r>
     </w:p>
     <w:p>
@@ -13103,27 +11588,7 @@
           <w:sz w:val="24"/>
           <w:szCs w:val="24"/>
         </w:rPr>
-        <w:t>(240024427, 'Mohammed', '</w:t>
-      </w:r>
-      <w:proofErr w:type="spellStart"/>
-      <w:r>
-        <w:rPr>
-          <w:rFonts w:ascii="Times New Roman" w:hAnsi="Times New Roman" w:cs="Times New Roman"/>
-          <w:color w:val="auto"/>
-          <w:sz w:val="24"/>
-          <w:szCs w:val="24"/>
-        </w:rPr>
-        <w:t>Alshuaibi</w:t>
-      </w:r>
-      <w:proofErr w:type="spellEnd"/>
-      <w:r>
-        <w:rPr>
-          <w:rFonts w:ascii="Times New Roman" w:hAnsi="Times New Roman" w:cs="Times New Roman"/>
-          <w:color w:val="auto"/>
-          <w:sz w:val="24"/>
-          <w:szCs w:val="24"/>
-        </w:rPr>
-        <w:t>', '0501234561', 2),</w:t>
+        <w:t>(240024427, 'Mohammed', 'Alshuaibi', '0501234561', 2),</w:t>
       </w:r>
     </w:p>
     <w:p>
@@ -13148,27 +11613,7 @@
           <w:sz w:val="24"/>
           <w:szCs w:val="24"/>
         </w:rPr>
-        <w:t>(240048280, 'Rakan', '</w:t>
-      </w:r>
-      <w:proofErr w:type="spellStart"/>
-      <w:r>
-        <w:rPr>
-          <w:rFonts w:ascii="Times New Roman" w:hAnsi="Times New Roman" w:cs="Times New Roman"/>
-          <w:color w:val="auto"/>
-          <w:sz w:val="24"/>
-          <w:szCs w:val="24"/>
-        </w:rPr>
-        <w:t>Alqu</w:t>
-      </w:r>
-      <w:proofErr w:type="spellEnd"/>
-      <w:r>
-        <w:rPr>
-          <w:rFonts w:ascii="Times New Roman" w:hAnsi="Times New Roman" w:cs="Times New Roman"/>
-          <w:color w:val="auto"/>
-          <w:sz w:val="24"/>
-          <w:szCs w:val="24"/>
-        </w:rPr>
-        <w:t>', '0501234562', 3),</w:t>
+        <w:t>(240048280, 'Rakan', 'Alqu', '0501234562', 3),</w:t>
       </w:r>
     </w:p>
     <w:p>
@@ -13193,27 +11638,7 @@
           <w:sz w:val="24"/>
           <w:szCs w:val="24"/>
         </w:rPr>
-        <w:t>(210024447, 'Ahmed', '</w:t>
-      </w:r>
-      <w:proofErr w:type="spellStart"/>
-      <w:r>
-        <w:rPr>
-          <w:rFonts w:ascii="Times New Roman" w:hAnsi="Times New Roman" w:cs="Times New Roman"/>
-          <w:color w:val="auto"/>
-          <w:sz w:val="24"/>
-          <w:szCs w:val="24"/>
-        </w:rPr>
-        <w:t>Almuqrin</w:t>
-      </w:r>
-      <w:proofErr w:type="spellEnd"/>
-      <w:r>
-        <w:rPr>
-          <w:rFonts w:ascii="Times New Roman" w:hAnsi="Times New Roman" w:cs="Times New Roman"/>
-          <w:color w:val="auto"/>
-          <w:sz w:val="24"/>
-          <w:szCs w:val="24"/>
-        </w:rPr>
-        <w:t>', '0501234563', 4),</w:t>
+        <w:t>(210024447, 'Ahmed', 'Almuqrin', '0501234563', 4),</w:t>
       </w:r>
     </w:p>
     <w:p>
@@ -13323,47 +11748,7 @@
           <w:sz w:val="24"/>
           <w:szCs w:val="24"/>
         </w:rPr>
-        <w:t xml:space="preserve">INSERT INTO </w:t>
-      </w:r>
-      <w:proofErr w:type="spellStart"/>
-      <w:r>
-        <w:rPr>
-          <w:rFonts w:ascii="Times New Roman" w:hAnsi="Times New Roman" w:cs="Times New Roman"/>
-          <w:color w:val="auto"/>
-          <w:sz w:val="24"/>
-          <w:szCs w:val="24"/>
-        </w:rPr>
-        <w:t>GeneralPractitioner</w:t>
-      </w:r>
-      <w:proofErr w:type="spellEnd"/>
-      <w:r>
-        <w:rPr>
-          <w:rFonts w:ascii="Times New Roman" w:hAnsi="Times New Roman" w:cs="Times New Roman"/>
-          <w:color w:val="auto"/>
-          <w:sz w:val="24"/>
-          <w:szCs w:val="24"/>
-        </w:rPr>
-        <w:t xml:space="preserve"> (</w:t>
-      </w:r>
-      <w:proofErr w:type="spellStart"/>
-      <w:r>
-        <w:rPr>
-          <w:rFonts w:ascii="Times New Roman" w:hAnsi="Times New Roman" w:cs="Times New Roman"/>
-          <w:color w:val="auto"/>
-          <w:sz w:val="24"/>
-          <w:szCs w:val="24"/>
-        </w:rPr>
-        <w:t>DoctorID</w:t>
-      </w:r>
-      <w:proofErr w:type="spellEnd"/>
-      <w:r>
-        <w:rPr>
-          <w:rFonts w:ascii="Times New Roman" w:hAnsi="Times New Roman" w:cs="Times New Roman"/>
-          <w:color w:val="auto"/>
-          <w:sz w:val="24"/>
-          <w:szCs w:val="24"/>
-        </w:rPr>
-        <w:t>)</w:t>
+        <w:t>INSERT INTO GeneralPractitioner (DoctorID)</w:t>
       </w:r>
     </w:p>
     <w:p>
@@ -13518,6 +11903,480 @@
     </w:p>
     <w:p>
       <w:pPr>
+        <w:pStyle w:val="ListBullet"/>
+        <w:numPr>
+          <w:ilvl w:val="0"/>
+          <w:numId w:val="0"/>
+        </w:numPr>
+        <w:ind w:left="576"/>
+        <w:rPr>
+          <w:rFonts w:ascii="Times New Roman" w:hAnsi="Times New Roman" w:cs="Times New Roman"/>
+          <w:color w:val="auto"/>
+          <w:sz w:val="24"/>
+          <w:szCs w:val="24"/>
+        </w:rPr>
+      </w:pPr>
+    </w:p>
+    <w:p>
+      <w:pPr>
+        <w:pStyle w:val="ListBullet"/>
+        <w:numPr>
+          <w:ilvl w:val="0"/>
+          <w:numId w:val="42"/>
+        </w:numPr>
+        <w:rPr>
+          <w:rFonts w:ascii="Times New Roman" w:hAnsi="Times New Roman" w:cs="Times New Roman"/>
+          <w:b/>
+          <w:bCs/>
+          <w:color w:val="auto"/>
+          <w:sz w:val="24"/>
+          <w:szCs w:val="24"/>
+        </w:rPr>
+      </w:pPr>
+      <w:r>
+        <w:rPr>
+          <w:rFonts w:ascii="Times New Roman" w:hAnsi="Times New Roman" w:cs="Times New Roman"/>
+          <w:b/>
+          <w:bCs/>
+          <w:color w:val="auto"/>
+          <w:sz w:val="24"/>
+          <w:szCs w:val="24"/>
+        </w:rPr>
+        <w:lastRenderedPageBreak/>
+        <w:t>Specialist</w:t>
+      </w:r>
+    </w:p>
+    <w:p>
+      <w:pPr>
+        <w:pStyle w:val="ListBullet"/>
+        <w:numPr>
+          <w:ilvl w:val="0"/>
+          <w:numId w:val="0"/>
+        </w:numPr>
+        <w:ind w:left="288"/>
+        <w:rPr>
+          <w:rFonts w:ascii="Times New Roman" w:hAnsi="Times New Roman" w:cs="Times New Roman"/>
+          <w:color w:val="auto"/>
+        </w:rPr>
+      </w:pPr>
+    </w:p>
+    <w:p>
+      <w:pPr>
+        <w:pStyle w:val="ListBullet"/>
+        <w:numPr>
+          <w:ilvl w:val="0"/>
+          <w:numId w:val="0"/>
+        </w:numPr>
+        <w:ind w:left="288"/>
+        <w:rPr>
+          <w:rFonts w:ascii="Times New Roman" w:hAnsi="Times New Roman" w:cs="Times New Roman"/>
+          <w:color w:val="auto"/>
+        </w:rPr>
+      </w:pPr>
+      <w:r>
+        <w:rPr>
+          <w:rFonts w:ascii="Times New Roman" w:hAnsi="Times New Roman" w:cs="Times New Roman"/>
+          <w:color w:val="auto"/>
+        </w:rPr>
+        <w:t>INSERT INTO Specialist (DoctorID, Specialty)</w:t>
+      </w:r>
+    </w:p>
+    <w:p>
+      <w:pPr>
+        <w:pStyle w:val="ListBullet"/>
+        <w:numPr>
+          <w:ilvl w:val="0"/>
+          <w:numId w:val="0"/>
+        </w:numPr>
+        <w:ind w:left="288"/>
+        <w:rPr>
+          <w:rFonts w:ascii="Times New Roman" w:hAnsi="Times New Roman" w:cs="Times New Roman"/>
+          <w:color w:val="auto"/>
+        </w:rPr>
+      </w:pPr>
+      <w:r>
+        <w:rPr>
+          <w:rFonts w:ascii="Times New Roman" w:hAnsi="Times New Roman" w:cs="Times New Roman"/>
+          <w:color w:val="auto"/>
+        </w:rPr>
+        <w:t>VALUES</w:t>
+      </w:r>
+    </w:p>
+    <w:p>
+      <w:pPr>
+        <w:pStyle w:val="ListBullet"/>
+        <w:numPr>
+          <w:ilvl w:val="0"/>
+          <w:numId w:val="0"/>
+        </w:numPr>
+        <w:ind w:left="288"/>
+        <w:rPr>
+          <w:rFonts w:ascii="Times New Roman" w:hAnsi="Times New Roman" w:cs="Times New Roman"/>
+          <w:color w:val="auto"/>
+        </w:rPr>
+      </w:pPr>
+      <w:r>
+        <w:rPr>
+          <w:rFonts w:ascii="Times New Roman" w:hAnsi="Times New Roman" w:cs="Times New Roman"/>
+          <w:color w:val="auto"/>
+        </w:rPr>
+        <w:t>(240048280, 'Cardiology'),</w:t>
+      </w:r>
+    </w:p>
+    <w:p>
+      <w:pPr>
+        <w:pStyle w:val="ListBullet"/>
+        <w:numPr>
+          <w:ilvl w:val="0"/>
+          <w:numId w:val="0"/>
+        </w:numPr>
+        <w:ind w:left="288"/>
+        <w:rPr>
+          <w:rFonts w:ascii="Times New Roman" w:hAnsi="Times New Roman" w:cs="Times New Roman"/>
+          <w:color w:val="auto"/>
+        </w:rPr>
+      </w:pPr>
+      <w:r>
+        <w:rPr>
+          <w:rFonts w:ascii="Times New Roman" w:hAnsi="Times New Roman" w:cs="Times New Roman"/>
+          <w:color w:val="auto"/>
+        </w:rPr>
+        <w:t>(210024447, 'Dermatology'),</w:t>
+      </w:r>
+    </w:p>
+    <w:p>
+      <w:pPr>
+        <w:pStyle w:val="ListBullet"/>
+        <w:numPr>
+          <w:ilvl w:val="0"/>
+          <w:numId w:val="0"/>
+        </w:numPr>
+        <w:ind w:left="288"/>
+        <w:rPr>
+          <w:rFonts w:ascii="Times New Roman" w:hAnsi="Times New Roman" w:cs="Times New Roman"/>
+          <w:color w:val="auto"/>
+        </w:rPr>
+      </w:pPr>
+      <w:r>
+        <w:rPr>
+          <w:rFonts w:ascii="Times New Roman" w:hAnsi="Times New Roman" w:cs="Times New Roman"/>
+          <w:color w:val="auto"/>
+        </w:rPr>
+        <w:t>(210020000, 'Orthopedics');</w:t>
+      </w:r>
+    </w:p>
+    <w:p>
+      <w:pPr>
+        <w:pStyle w:val="ListBullet"/>
+        <w:numPr>
+          <w:ilvl w:val="0"/>
+          <w:numId w:val="0"/>
+        </w:numPr>
+        <w:ind w:left="288"/>
+        <w:rPr>
+          <w:rFonts w:ascii="Times New Roman" w:hAnsi="Times New Roman" w:cs="Times New Roman"/>
+          <w:color w:val="auto"/>
+        </w:rPr>
+      </w:pPr>
+    </w:p>
+    <w:p>
+      <w:pPr>
+        <w:pStyle w:val="ListBullet"/>
+        <w:numPr>
+          <w:ilvl w:val="0"/>
+          <w:numId w:val="42"/>
+        </w:numPr>
+        <w:rPr>
+          <w:rFonts w:ascii="Times New Roman" w:hAnsi="Times New Roman" w:cs="Times New Roman"/>
+          <w:b/>
+          <w:bCs/>
+          <w:color w:val="auto"/>
+          <w:sz w:val="24"/>
+          <w:szCs w:val="24"/>
+        </w:rPr>
+      </w:pPr>
+      <w:r>
+        <w:rPr>
+          <w:rFonts w:ascii="Times New Roman" w:hAnsi="Times New Roman" w:cs="Times New Roman"/>
+          <w:b/>
+          <w:bCs/>
+          <w:color w:val="auto"/>
+          <w:sz w:val="24"/>
+          <w:szCs w:val="24"/>
+        </w:rPr>
+        <w:t>Appointment</w:t>
+      </w:r>
+    </w:p>
+    <w:p>
+      <w:pPr>
+        <w:pStyle w:val="ListBullet"/>
+        <w:numPr>
+          <w:ilvl w:val="0"/>
+          <w:numId w:val="0"/>
+        </w:numPr>
+        <w:ind w:left="288"/>
+        <w:rPr>
+          <w:rFonts w:ascii="Times New Roman" w:hAnsi="Times New Roman" w:cs="Times New Roman"/>
+          <w:color w:val="auto"/>
+        </w:rPr>
+      </w:pPr>
+    </w:p>
+    <w:p>
+      <w:pPr>
+        <w:pStyle w:val="ListBullet"/>
+        <w:numPr>
+          <w:ilvl w:val="0"/>
+          <w:numId w:val="0"/>
+        </w:numPr>
+        <w:ind w:left="288"/>
+        <w:rPr>
+          <w:rFonts w:ascii="Times New Roman" w:hAnsi="Times New Roman" w:cs="Times New Roman"/>
+          <w:color w:val="auto"/>
+        </w:rPr>
+      </w:pPr>
+      <w:r>
+        <w:rPr>
+          <w:rFonts w:ascii="Times New Roman" w:hAnsi="Times New Roman" w:cs="Times New Roman"/>
+          <w:color w:val="auto"/>
+        </w:rPr>
+        <w:t>INSERT INTO Appointment</w:t>
+      </w:r>
+    </w:p>
+    <w:p>
+      <w:pPr>
+        <w:pStyle w:val="ListBullet"/>
+        <w:numPr>
+          <w:ilvl w:val="0"/>
+          <w:numId w:val="0"/>
+        </w:numPr>
+        <w:ind w:left="288"/>
+        <w:rPr>
+          <w:rFonts w:ascii="Times New Roman" w:hAnsi="Times New Roman" w:cs="Times New Roman"/>
+          <w:color w:val="auto"/>
+        </w:rPr>
+      </w:pPr>
+      <w:r>
+        <w:rPr>
+          <w:rFonts w:ascii="Times New Roman" w:hAnsi="Times New Roman" w:cs="Times New Roman"/>
+          <w:color w:val="auto"/>
+        </w:rPr>
+        <w:t>(AppointmentID, AppointmentDate, Status, PatientID, DoctorID)</w:t>
+      </w:r>
+    </w:p>
+    <w:p>
+      <w:pPr>
+        <w:pStyle w:val="ListBullet"/>
+        <w:numPr>
+          <w:ilvl w:val="0"/>
+          <w:numId w:val="0"/>
+        </w:numPr>
+        <w:ind w:left="288"/>
+        <w:rPr>
+          <w:rFonts w:ascii="Times New Roman" w:hAnsi="Times New Roman" w:cs="Times New Roman"/>
+          <w:color w:val="auto"/>
+        </w:rPr>
+      </w:pPr>
+      <w:r>
+        <w:rPr>
+          <w:rFonts w:ascii="Times New Roman" w:hAnsi="Times New Roman" w:cs="Times New Roman"/>
+          <w:color w:val="auto"/>
+        </w:rPr>
+        <w:t>VALUES</w:t>
+      </w:r>
+    </w:p>
+    <w:p>
+      <w:pPr>
+        <w:pStyle w:val="ListBullet"/>
+        <w:numPr>
+          <w:ilvl w:val="0"/>
+          <w:numId w:val="0"/>
+        </w:numPr>
+        <w:ind w:left="288"/>
+        <w:rPr>
+          <w:rFonts w:ascii="Times New Roman" w:hAnsi="Times New Roman" w:cs="Times New Roman"/>
+          <w:color w:val="auto"/>
+        </w:rPr>
+      </w:pPr>
+      <w:r>
+        <w:rPr>
+          <w:rFonts w:ascii="Times New Roman" w:hAnsi="Times New Roman" w:cs="Times New Roman"/>
+          <w:color w:val="auto"/>
+        </w:rPr>
+        <w:t>(30001, '2026-02-18', 'Scheduled', 10001, 240050857),</w:t>
+      </w:r>
+    </w:p>
+    <w:p>
+      <w:pPr>
+        <w:pStyle w:val="ListBullet"/>
+        <w:numPr>
+          <w:ilvl w:val="0"/>
+          <w:numId w:val="0"/>
+        </w:numPr>
+        <w:ind w:left="288"/>
+        <w:rPr>
+          <w:rFonts w:ascii="Times New Roman" w:hAnsi="Times New Roman" w:cs="Times New Roman"/>
+          <w:color w:val="auto"/>
+        </w:rPr>
+      </w:pPr>
+      <w:r>
+        <w:rPr>
+          <w:rFonts w:ascii="Times New Roman" w:hAnsi="Times New Roman" w:cs="Times New Roman"/>
+          <w:color w:val="auto"/>
+        </w:rPr>
+        <w:t>(30002, '2026-03-05', 'Completed', 10002, 240024427),</w:t>
+      </w:r>
+    </w:p>
+    <w:p>
+      <w:pPr>
+        <w:pStyle w:val="ListBullet"/>
+        <w:numPr>
+          <w:ilvl w:val="0"/>
+          <w:numId w:val="0"/>
+        </w:numPr>
+        <w:ind w:left="288"/>
+        <w:rPr>
+          <w:rFonts w:ascii="Times New Roman" w:hAnsi="Times New Roman" w:cs="Times New Roman"/>
+          <w:color w:val="auto"/>
+        </w:rPr>
+      </w:pPr>
+      <w:r>
+        <w:rPr>
+          <w:rFonts w:ascii="Times New Roman" w:hAnsi="Times New Roman" w:cs="Times New Roman"/>
+          <w:color w:val="auto"/>
+        </w:rPr>
+        <w:t>(30003, '2026-03-21', 'Completed', 10003, 240048280),</w:t>
+      </w:r>
+    </w:p>
+    <w:p>
+      <w:pPr>
+        <w:pStyle w:val="ListBullet"/>
+        <w:numPr>
+          <w:ilvl w:val="0"/>
+          <w:numId w:val="0"/>
+        </w:numPr>
+        <w:ind w:left="288"/>
+        <w:rPr>
+          <w:rFonts w:ascii="Times New Roman" w:hAnsi="Times New Roman" w:cs="Times New Roman"/>
+          <w:color w:val="auto"/>
+        </w:rPr>
+      </w:pPr>
+      <w:r>
+        <w:rPr>
+          <w:rFonts w:ascii="Times New Roman" w:hAnsi="Times New Roman" w:cs="Times New Roman"/>
+          <w:color w:val="auto"/>
+        </w:rPr>
+        <w:t>(30004, '2026-04-10', 'Cancelled', 10004, 210024447),</w:t>
+      </w:r>
+    </w:p>
+    <w:p>
+      <w:pPr>
+        <w:pStyle w:val="ListBullet"/>
+        <w:numPr>
+          <w:ilvl w:val="0"/>
+          <w:numId w:val="0"/>
+        </w:numPr>
+        <w:ind w:left="288"/>
+        <w:rPr>
+          <w:rFonts w:ascii="Times New Roman" w:hAnsi="Times New Roman" w:cs="Times New Roman"/>
+          <w:color w:val="auto"/>
+        </w:rPr>
+      </w:pPr>
+      <w:r>
+        <w:rPr>
+          <w:rFonts w:ascii="Times New Roman" w:hAnsi="Times New Roman" w:cs="Times New Roman"/>
+          <w:color w:val="auto"/>
+        </w:rPr>
+        <w:t>(30005, '2026-04-28', 'Scheduled', 10005, 210020000);</w:t>
+      </w:r>
+    </w:p>
+    <w:p>
+      <w:pPr>
+        <w:pStyle w:val="ListBullet"/>
+        <w:numPr>
+          <w:ilvl w:val="0"/>
+          <w:numId w:val="0"/>
+        </w:numPr>
+        <w:ind w:left="288"/>
+        <w:rPr>
+          <w:rFonts w:ascii="Times New Roman" w:hAnsi="Times New Roman" w:cs="Times New Roman"/>
+          <w:color w:val="auto"/>
+        </w:rPr>
+      </w:pPr>
+    </w:p>
+    <w:p>
+      <w:pPr>
+        <w:pStyle w:val="ListBullet"/>
+        <w:numPr>
+          <w:ilvl w:val="0"/>
+          <w:numId w:val="0"/>
+        </w:numPr>
+        <w:ind w:left="288"/>
+        <w:rPr>
+          <w:rFonts w:ascii="Times New Roman" w:hAnsi="Times New Roman" w:cs="Times New Roman"/>
+          <w:color w:val="auto"/>
+        </w:rPr>
+      </w:pPr>
+      <w:r>
+        <w:rPr>
+          <w:rFonts w:ascii="Times New Roman" w:hAnsi="Times New Roman" w:cs="Times New Roman"/>
+          <w:noProof/>
+          <w:color w:val="auto"/>
+        </w:rPr>
+        <w:drawing>
+          <wp:inline distT="0" distB="0" distL="0" distR="0" wp14:anchorId="4CED6E24" wp14:editId="4BA74A6C">
+            <wp:extent cx="5349240" cy="3260725"/>
+            <wp:effectExtent l="0" t="0" r="3810" b="0"/>
+            <wp:docPr id="1678511794" name="Picture 1"/>
+            <wp:cNvGraphicFramePr>
+              <a:graphicFrameLocks xmlns:a="http://schemas.openxmlformats.org/drawingml/2006/main" noChangeAspect="1"/>
+            </wp:cNvGraphicFramePr>
+            <a:graphic xmlns:a="http://schemas.openxmlformats.org/drawingml/2006/main">
+              <a:graphicData uri="http://schemas.openxmlformats.org/drawingml/2006/picture">
+                <pic:pic xmlns:pic="http://schemas.openxmlformats.org/drawingml/2006/picture">
+                  <pic:nvPicPr>
+                    <pic:cNvPr id="1678511794" name=""/>
+                    <pic:cNvPicPr/>
+                  </pic:nvPicPr>
+                  <pic:blipFill>
+                    <a:blip r:embed="rId23"/>
+                    <a:stretch>
+                      <a:fillRect/>
+                    </a:stretch>
+                  </pic:blipFill>
+                  <pic:spPr>
+                    <a:xfrm>
+                      <a:off x="0" y="0"/>
+                      <a:ext cx="5349240" cy="3260725"/>
+                    </a:xfrm>
+                    <a:prstGeom prst="rect">
+                      <a:avLst/>
+                    </a:prstGeom>
+                  </pic:spPr>
+                </pic:pic>
+              </a:graphicData>
+            </a:graphic>
+          </wp:inline>
+        </w:drawing>
+      </w:r>
+    </w:p>
+    <w:p>
+      <w:pPr>
+        <w:pStyle w:val="ListBullet"/>
+        <w:numPr>
+          <w:ilvl w:val="0"/>
+          <w:numId w:val="0"/>
+        </w:numPr>
+        <w:ind w:left="576"/>
+        <w:rPr>
+          <w:rFonts w:ascii="Times New Roman" w:hAnsi="Times New Roman" w:cs="Times New Roman"/>
+          <w:color w:val="auto"/>
+          <w:sz w:val="24"/>
+          <w:szCs w:val="24"/>
+        </w:rPr>
+      </w:pPr>
+    </w:p>
+    <w:p>
+      <w:pPr>
         <w:pStyle w:val="Heading1"/>
       </w:pPr>
       <w:r>
@@ -13973,9 +12832,30 @@
           <w:sz w:val="24"/>
           <w:szCs w:val="24"/>
         </w:rPr>
-        <w:t>SQL Script (.</w:t>
-      </w:r>
-      <w:proofErr w:type="spellStart"/>
+        <w:t>SQL Script (.sql)</w:t>
+      </w:r>
+      <w:r>
+        <w:rPr>
+          <w:rFonts w:ascii="Times New Roman" w:hAnsi="Times New Roman" w:cs="Times New Roman"/>
+          <w:sz w:val="24"/>
+          <w:szCs w:val="24"/>
+        </w:rPr>
+        <w:t xml:space="preserve"> – Complete SQL implementation of the project. </w:t>
+      </w:r>
+    </w:p>
+    <w:p>
+      <w:pPr>
+        <w:numPr>
+          <w:ilvl w:val="0"/>
+          <w:numId w:val="22"/>
+        </w:numPr>
+        <w:spacing w:after="200" w:line="276" w:lineRule="auto"/>
+        <w:rPr>
+          <w:rFonts w:ascii="Times New Roman" w:hAnsi="Times New Roman" w:cs="Times New Roman"/>
+          <w:sz w:val="24"/>
+          <w:szCs w:val="24"/>
+        </w:rPr>
+      </w:pPr>
       <w:r>
         <w:rPr>
           <w:rFonts w:ascii="Times New Roman" w:hAnsi="Times New Roman" w:cs="Times New Roman"/>
@@ -13984,9 +12864,30 @@
           <w:sz w:val="24"/>
           <w:szCs w:val="24"/>
         </w:rPr>
-        <w:t>sql</w:t>
-      </w:r>
-      <w:proofErr w:type="spellEnd"/>
+        <w:t>GitHub Repository</w:t>
+      </w:r>
+      <w:r>
+        <w:rPr>
+          <w:rFonts w:ascii="Times New Roman" w:hAnsi="Times New Roman" w:cs="Times New Roman"/>
+          <w:sz w:val="24"/>
+          <w:szCs w:val="24"/>
+        </w:rPr>
+        <w:t xml:space="preserve"> – Repository link with the complete project and commit history. </w:t>
+      </w:r>
+    </w:p>
+    <w:p>
+      <w:pPr>
+        <w:numPr>
+          <w:ilvl w:val="0"/>
+          <w:numId w:val="22"/>
+        </w:numPr>
+        <w:spacing w:after="200" w:line="276" w:lineRule="auto"/>
+        <w:rPr>
+          <w:rFonts w:ascii="Times New Roman" w:hAnsi="Times New Roman" w:cs="Times New Roman"/>
+          <w:sz w:val="24"/>
+          <w:szCs w:val="24"/>
+        </w:rPr>
+      </w:pPr>
       <w:r>
         <w:rPr>
           <w:rFonts w:ascii="Times New Roman" w:hAnsi="Times New Roman" w:cs="Times New Roman"/>
@@ -13995,15 +12896,15 @@
           <w:sz w:val="24"/>
           <w:szCs w:val="24"/>
         </w:rPr>
-        <w:t>)</w:t>
-      </w:r>
-      <w:r>
-        <w:rPr>
-          <w:rFonts w:ascii="Times New Roman" w:hAnsi="Times New Roman" w:cs="Times New Roman"/>
-          <w:sz w:val="24"/>
-          <w:szCs w:val="24"/>
-        </w:rPr>
-        <w:t xml:space="preserve"> – Complete SQL implementation of the project. </w:t>
+        <w:t>Mid-Project Progress Report</w:t>
+      </w:r>
+      <w:r>
+        <w:rPr>
+          <w:rFonts w:ascii="Times New Roman" w:hAnsi="Times New Roman" w:cs="Times New Roman"/>
+          <w:sz w:val="24"/>
+          <w:szCs w:val="24"/>
+        </w:rPr>
+        <w:t xml:space="preserve"> – Summary of progress, challenges, decisions, and team contributions. </w:t>
       </w:r>
     </w:p>
     <w:p>
@@ -14027,70 +12928,6 @@
           <w:sz w:val="24"/>
           <w:szCs w:val="24"/>
         </w:rPr>
-        <w:t>GitHub Repository</w:t>
-      </w:r>
-      <w:r>
-        <w:rPr>
-          <w:rFonts w:ascii="Times New Roman" w:hAnsi="Times New Roman" w:cs="Times New Roman"/>
-          <w:sz w:val="24"/>
-          <w:szCs w:val="24"/>
-        </w:rPr>
-        <w:t xml:space="preserve"> – Repository link with the complete project and commit history. </w:t>
-      </w:r>
-    </w:p>
-    <w:p>
-      <w:pPr>
-        <w:numPr>
-          <w:ilvl w:val="0"/>
-          <w:numId w:val="22"/>
-        </w:numPr>
-        <w:spacing w:after="200" w:line="276" w:lineRule="auto"/>
-        <w:rPr>
-          <w:rFonts w:ascii="Times New Roman" w:hAnsi="Times New Roman" w:cs="Times New Roman"/>
-          <w:sz w:val="24"/>
-          <w:szCs w:val="24"/>
-        </w:rPr>
-      </w:pPr>
-      <w:r>
-        <w:rPr>
-          <w:rFonts w:ascii="Times New Roman" w:hAnsi="Times New Roman" w:cs="Times New Roman"/>
-          <w:b/>
-          <w:bCs/>
-          <w:sz w:val="24"/>
-          <w:szCs w:val="24"/>
-        </w:rPr>
-        <w:t>Mid-Project Progress Report</w:t>
-      </w:r>
-      <w:r>
-        <w:rPr>
-          <w:rFonts w:ascii="Times New Roman" w:hAnsi="Times New Roman" w:cs="Times New Roman"/>
-          <w:sz w:val="24"/>
-          <w:szCs w:val="24"/>
-        </w:rPr>
-        <w:t xml:space="preserve"> – Summary of progress, challenges, decisions, and team contributions. </w:t>
-      </w:r>
-    </w:p>
-    <w:p>
-      <w:pPr>
-        <w:numPr>
-          <w:ilvl w:val="0"/>
-          <w:numId w:val="22"/>
-        </w:numPr>
-        <w:spacing w:after="200" w:line="276" w:lineRule="auto"/>
-        <w:rPr>
-          <w:rFonts w:ascii="Times New Roman" w:hAnsi="Times New Roman" w:cs="Times New Roman"/>
-          <w:sz w:val="24"/>
-          <w:szCs w:val="24"/>
-        </w:rPr>
-      </w:pPr>
-      <w:r>
-        <w:rPr>
-          <w:rFonts w:ascii="Times New Roman" w:hAnsi="Times New Roman" w:cs="Times New Roman"/>
-          <w:b/>
-          <w:bCs/>
-          <w:sz w:val="24"/>
-          <w:szCs w:val="24"/>
-        </w:rPr>
         <w:t>Project Artifacts</w:t>
       </w:r>
       <w:r>
@@ -14165,25 +13002,7 @@
           <w:sz w:val="24"/>
           <w:szCs w:val="24"/>
         </w:rPr>
-        <w:t xml:space="preserve">Google </w:t>
-      </w:r>
-      <w:proofErr w:type="spellStart"/>
-      <w:r>
-        <w:rPr>
-          <w:rFonts w:ascii="Times New Roman" w:hAnsi="Times New Roman" w:cs="Times New Roman"/>
-          <w:sz w:val="24"/>
-          <w:szCs w:val="24"/>
-        </w:rPr>
-        <w:t>Colab</w:t>
-      </w:r>
-      <w:proofErr w:type="spellEnd"/>
-      <w:r>
-        <w:rPr>
-          <w:rFonts w:ascii="Times New Roman" w:hAnsi="Times New Roman" w:cs="Times New Roman"/>
-          <w:sz w:val="24"/>
-          <w:szCs w:val="24"/>
-        </w:rPr>
-        <w:t xml:space="preserve"> notebook (if applicable): [link]</w:t>
+        <w:t>Google Colab notebook (if applicable): [link]</w:t>
       </w:r>
     </w:p>
     <w:p>
@@ -14216,7 +13035,7 @@
       </w:pPr>
     </w:p>
     <w:sectPr>
-      <w:headerReference w:type="default" r:id="rId23"/>
+      <w:headerReference w:type="default" r:id="rId24"/>
       <w:pgSz w:w="12240" w:h="15840" w:code="1"/>
       <w:pgMar w:top="1080" w:right="720" w:bottom="1800" w:left="3096" w:header="1080" w:footer="720" w:gutter="0"/>
       <w:pgNumType w:start="1"/>
@@ -15138,7 +13957,7 @@
             <w:rPr>
               <w:noProof/>
             </w:rPr>
-            <w:instrText>Task 3 – SQL Operations (6 Marks)</w:instrText>
+            <w:instrText>Task 1 – Database Design (6 Marks)</w:instrText>
           </w:r>
           <w:r>
             <w:rPr>
@@ -15171,7 +13990,7 @@
             <w:rPr>
               <w:noProof/>
             </w:rPr>
-            <w:instrText>Task 3 – SQL Operations (6 Marks)</w:instrText>
+            <w:instrText>Task 1 – Database Design (6 Marks)</w:instrText>
           </w:r>
           <w:r>
             <w:rPr>
@@ -15189,7 +14008,7 @@
             <w:rPr>
               <w:noProof/>
             </w:rPr>
-            <w:t xml:space="preserve">Task 3 – SQL Operations (6 Marks) </w:t>
+            <w:t xml:space="preserve">Task 1 – Database Design (6 Marks) </w:t>
           </w:r>
           <w:r>
             <w:fldChar w:fldCharType="end"/>
@@ -18925,15 +17744,6 @@
   </w:num>
   <w:num w:numId="45" w16cid:durableId="1632443125">
     <w:abstractNumId w:val="4"/>
-    <w:lvlOverride w:ilvl="0"/>
-    <w:lvlOverride w:ilvl="1"/>
-    <w:lvlOverride w:ilvl="2"/>
-    <w:lvlOverride w:ilvl="3"/>
-    <w:lvlOverride w:ilvl="4"/>
-    <w:lvlOverride w:ilvl="5"/>
-    <w:lvlOverride w:ilvl="6"/>
-    <w:lvlOverride w:ilvl="7"/>
-    <w:lvlOverride w:ilvl="8"/>
   </w:num>
 </w:numbering>
 </file>
@@ -19385,6 +18195,7 @@
   <w:style w:type="character" w:default="1" w:styleId="DefaultParagraphFont">
     <w:name w:val="Default Paragraph Font"/>
     <w:uiPriority w:val="1"/>
+    <w:semiHidden/>
     <w:unhideWhenUsed/>
   </w:style>
   <w:style w:type="table" w:default="1" w:styleId="TableNormal">
@@ -20383,13 +19194,6 @@
     <w:pitch w:val="variable"/>
     <w:sig w:usb0="20000287" w:usb1="00000003" w:usb2="00000000" w:usb3="00000000" w:csb0="0000019F" w:csb1="00000000"/>
   </w:font>
-  <w:font w:name="Calibri">
-    <w:panose1 w:val="020F0502020204030204"/>
-    <w:charset w:val="00"/>
-    <w:family w:val="swiss"/>
-    <w:pitch w:val="variable"/>
-    <w:sig w:usb0="E4002EFF" w:usb1="C200247B" w:usb2="00000009" w:usb3="00000000" w:csb0="000001FF" w:csb1="00000000"/>
-  </w:font>
   <w:font w:name="Yu Mincho">
     <w:charset w:val="80"/>
     <w:family w:val="roman"/>
@@ -20404,12 +19208,11 @@
     <w:pitch w:val="variable"/>
     <w:sig w:usb0="E00002FF" w:usb1="2AC7FDFF" w:usb2="00000016" w:usb3="00000000" w:csb0="0002009F" w:csb1="00000000"/>
   </w:font>
-  <w:font w:name="Calibri Light">
-    <w:panose1 w:val="020F0302020204030204"/>
+  <w:font w:name="Aptos Display">
     <w:charset w:val="00"/>
     <w:family w:val="swiss"/>
     <w:pitch w:val="variable"/>
-    <w:sig w:usb0="E4002EFF" w:usb1="C200247B" w:usb2="00000009" w:usb3="00000000" w:csb0="000001FF" w:csb1="00000000"/>
+    <w:sig w:usb0="20000287" w:usb1="00000003" w:usb2="00000000" w:usb3="00000000" w:csb0="0000019F" w:csb1="00000000"/>
   </w:font>
 </w:fonts>
 </file>
@@ -20431,7 +19234,7 @@
       </w:pPr>
       <w:rPr>
         <w:rFonts w:ascii="Cambria" w:hAnsi="Cambria" w:hint="default"/>
-        <w:color w:val="4472C4" w:themeColor="accent1"/>
+        <w:color w:val="156082" w:themeColor="accent1"/>
       </w:rPr>
     </w:lvl>
   </w:abstractNum>
@@ -20469,6 +19272,7 @@
     <w:rsid w:val="0019723D"/>
     <w:rsid w:val="001A632E"/>
     <w:rsid w:val="0022537A"/>
+    <w:rsid w:val="002771E3"/>
     <w:rsid w:val="002A69BE"/>
     <w:rsid w:val="00324ACF"/>
     <w:rsid w:val="00341804"/>
@@ -20492,6 +19296,7 @@
     <w:rsid w:val="005E6AEF"/>
     <w:rsid w:val="0060379F"/>
     <w:rsid w:val="006400C0"/>
+    <w:rsid w:val="00654FE9"/>
     <w:rsid w:val="00660EF5"/>
     <w:rsid w:val="00684051"/>
     <w:rsid w:val="00695677"/>
@@ -20566,7 +19371,7 @@
   <w:themeFontLang w:val="en-GB" w:eastAsia="ja-JP" w:bidi="ar-SA"/>
   <w:clrSchemeMapping w:bg1="light1" w:t1="dark1" w:bg2="light2" w:t2="dark2" w:accent1="accent1" w:accent2="accent2" w:accent3="accent3" w:accent4="accent4" w:accent5="accent5" w:accent6="accent6" w:hyperlink="hyperlink" w:followedHyperlink="followedHyperlink"/>
   <w:decimalSymbol w:val="."/>
-  <w:listSeparator w:val=","/>
+  <w:listSeparator w:val=";"/>
   <w15:chartTrackingRefBased/>
 </w:settings>
 </file>
@@ -21373,16 +20178,16 @@
 </file>
 
 <file path=customXml/item2.xml><?xml version="1.0" encoding="utf-8"?>
+<b:Sources xmlns:b="http://schemas.openxmlformats.org/officeDocument/2006/bibliography" SelectedStyle="\APA.XSL" StyleName="APA"/>
+</file>
+
+<file path=customXml/item3.xml><?xml version="1.0" encoding="utf-8"?>
 <?mso-contentType ?>
 <FormTemplates xmlns="http://schemas.microsoft.com/sharepoint/v3/contenttype/forms">
   <Display>DocumentLibraryForm</Display>
   <Edit>AssetEditForm</Edit>
   <New>DocumentLibraryForm</New>
 </FormTemplates>
-</file>
-
-<file path=customXml/item3.xml><?xml version="1.0" encoding="utf-8"?>
-<b:Sources xmlns:b="http://schemas.openxmlformats.org/officeDocument/2006/bibliography" SelectedStyle="\APA.XSL" StyleName="APA"/>
 </file>
 
 <file path=customXml/itemProps1.xml><?xml version="1.0" encoding="utf-8"?>
@@ -21394,17 +20199,17 @@
 </file>
 
 <file path=customXml/itemProps2.xml><?xml version="1.0" encoding="utf-8"?>
+<ds:datastoreItem xmlns:ds="http://schemas.openxmlformats.org/officeDocument/2006/customXml" ds:itemID="{355C5113-D031-41DB-A6D8-43CE1A0E6695}">
+  <ds:schemaRefs>
+    <ds:schemaRef ds:uri="http://schemas.openxmlformats.org/officeDocument/2006/bibliography"/>
+  </ds:schemaRefs>
+</ds:datastoreItem>
+</file>
+
+<file path=customXml/itemProps3.xml><?xml version="1.0" encoding="utf-8"?>
 <ds:datastoreItem xmlns:ds="http://schemas.openxmlformats.org/officeDocument/2006/customXml" ds:itemID="{E34C63B7-A026-4A37-9535-4FBB4C03A11D}">
   <ds:schemaRefs>
     <ds:schemaRef ds:uri="http://schemas.microsoft.com/sharepoint/v3/contenttype/forms"/>
   </ds:schemaRefs>
 </ds:datastoreItem>
-</file>
-
-<file path=customXml/itemProps3.xml><?xml version="1.0" encoding="utf-8"?>
-<ds:datastoreItem xmlns:ds="http://schemas.openxmlformats.org/officeDocument/2006/customXml" ds:itemID="{355C5113-D031-41DB-A6D8-43CE1A0E6695}">
-  <ds:schemaRefs>
-    <ds:schemaRef ds:uri="http://schemas.openxmlformats.org/officeDocument/2006/bibliography"/>
-  </ds:schemaRefs>
-</ds:datastoreItem>
 </file>
</xml_diff>

<commit_message>
5 Records into Treatment and Payment tables
</commit_message>
<xml_diff>
--- a/Introduction to DB-CS350 Project.docx
+++ b/Introduction to DB-CS350 Project.docx
@@ -3309,6 +3309,7 @@
         </w:rPr>
         <w:t xml:space="preserve">This project </w:t>
       </w:r>
+      <w:proofErr w:type="gramStart"/>
       <w:r>
         <w:rPr>
           <w:rFonts w:ascii="Times New Roman" w:hAnsi="Times New Roman" w:cs="Times New Roman"/>
@@ -3318,7 +3319,19 @@
           <w:sz w:val="24"/>
           <w:szCs w:val="24"/>
         </w:rPr>
-        <w:t xml:space="preserve">worth </w:t>
+        <w:t>worth</w:t>
+      </w:r>
+      <w:proofErr w:type="gramEnd"/>
+      <w:r>
+        <w:rPr>
+          <w:rFonts w:ascii="Times New Roman" w:hAnsi="Times New Roman" w:cs="Times New Roman"/>
+          <w:b/>
+          <w:bCs/>
+          <w:color w:val="auto"/>
+          <w:sz w:val="24"/>
+          <w:szCs w:val="24"/>
+        </w:rPr>
+        <w:t xml:space="preserve"> </w:t>
       </w:r>
       <w:r>
         <w:rPr>
@@ -4157,7 +4170,25 @@
           <w:sz w:val="24"/>
           <w:szCs w:val="24"/>
         </w:rPr>
-        <w:t xml:space="preserve"> describing the completed work, key decisions, challenges, future plan, and contribution of each group member.</w:t>
+        <w:t xml:space="preserve"> describing the completed work, key decisions, challenges, </w:t>
+      </w:r>
+      <w:proofErr w:type="gramStart"/>
+      <w:r>
+        <w:rPr>
+          <w:rFonts w:ascii="Times New Roman" w:hAnsi="Times New Roman" w:cs="Times New Roman"/>
+          <w:sz w:val="24"/>
+          <w:szCs w:val="24"/>
+        </w:rPr>
+        <w:t>future plan</w:t>
+      </w:r>
+      <w:proofErr w:type="gramEnd"/>
+      <w:r>
+        <w:rPr>
+          <w:rFonts w:ascii="Times New Roman" w:hAnsi="Times New Roman" w:cs="Times New Roman"/>
+          <w:sz w:val="24"/>
+          <w:szCs w:val="24"/>
+        </w:rPr>
+        <w:t>, and contribution of each group member.</w:t>
       </w:r>
     </w:p>
     <w:p>
@@ -4200,7 +4231,25 @@
           <w:sz w:val="24"/>
           <w:szCs w:val="24"/>
         </w:rPr>
-        <w:t xml:space="preserve"> to the live report document, GitHub/GitLab repository, and Google Colab notebook (if applicable) in the </w:t>
+        <w:t xml:space="preserve"> to the live report document, GitHub/GitLab repository, and Google </w:t>
+      </w:r>
+      <w:proofErr w:type="spellStart"/>
+      <w:r>
+        <w:rPr>
+          <w:rFonts w:ascii="Times New Roman" w:hAnsi="Times New Roman" w:cs="Times New Roman"/>
+          <w:sz w:val="24"/>
+          <w:szCs w:val="24"/>
+        </w:rPr>
+        <w:t>Colab</w:t>
+      </w:r>
+      <w:proofErr w:type="spellEnd"/>
+      <w:r>
+        <w:rPr>
+          <w:rFonts w:ascii="Times New Roman" w:hAnsi="Times New Roman" w:cs="Times New Roman"/>
+          <w:sz w:val="24"/>
+          <w:szCs w:val="24"/>
+        </w:rPr>
+        <w:t xml:space="preserve"> notebook (if applicable) in the </w:t>
       </w:r>
       <w:r>
         <w:rPr>
@@ -4890,7 +4939,25 @@
           <w:sz w:val="24"/>
           <w:szCs w:val="24"/>
         </w:rPr>
-        <w:t>A private clinic currently manages its patient information manually, making it difficult to organize appointments, treatments, and payments. The clinic has decided to develop a database system to improve data organization and retrieval.</w:t>
+        <w:t xml:space="preserve">A private clinic currently manages </w:t>
+      </w:r>
+      <w:proofErr w:type="gramStart"/>
+      <w:r>
+        <w:rPr>
+          <w:rFonts w:ascii="Times New Roman" w:hAnsi="Times New Roman" w:cs="Times New Roman"/>
+          <w:sz w:val="24"/>
+          <w:szCs w:val="24"/>
+        </w:rPr>
+        <w:t>its patient</w:t>
+      </w:r>
+      <w:proofErr w:type="gramEnd"/>
+      <w:r>
+        <w:rPr>
+          <w:rFonts w:ascii="Times New Roman" w:hAnsi="Times New Roman" w:cs="Times New Roman"/>
+          <w:sz w:val="24"/>
+          <w:szCs w:val="24"/>
+        </w:rPr>
+        <w:t xml:space="preserve"> information manually, making it difficult to organize appointments, treatments, and payments. The clinic has decided to develop a database system to improve data organization and retrieval.</w:t>
       </w:r>
     </w:p>
     <w:p>
@@ -4956,7 +5023,27 @@
           <w:szCs w:val="24"/>
           <w:lang w:val="es-ES"/>
         </w:rPr>
-        <w:t>A complete ER/EER diagram.</w:t>
+        <w:t xml:space="preserve">A complete ER/EER </w:t>
+      </w:r>
+      <w:proofErr w:type="spellStart"/>
+      <w:r>
+        <w:rPr>
+          <w:rFonts w:ascii="Times New Roman" w:hAnsi="Times New Roman" w:cs="Times New Roman"/>
+          <w:sz w:val="24"/>
+          <w:szCs w:val="24"/>
+          <w:lang w:val="es-ES"/>
+        </w:rPr>
+        <w:t>diagram</w:t>
+      </w:r>
+      <w:proofErr w:type="spellEnd"/>
+      <w:r>
+        <w:rPr>
+          <w:rFonts w:ascii="Times New Roman" w:hAnsi="Times New Roman" w:cs="Times New Roman"/>
+          <w:sz w:val="24"/>
+          <w:szCs w:val="24"/>
+          <w:lang w:val="es-ES"/>
+        </w:rPr>
+        <w:t>.</w:t>
       </w:r>
     </w:p>
     <w:p>
@@ -5470,6 +5557,8 @@
           <w:szCs w:val="24"/>
         </w:rPr>
       </w:pPr>
+      <w:proofErr w:type="spellStart"/>
+      <w:proofErr w:type="gramStart"/>
       <w:r>
         <w:rPr>
           <w:rFonts w:ascii="Times New Roman" w:hAnsi="Times New Roman" w:cs="Times New Roman"/>
@@ -5479,6 +5568,8 @@
         </w:rPr>
         <w:t>GeneralPractitioner</w:t>
       </w:r>
+      <w:proofErr w:type="spellEnd"/>
+      <w:proofErr w:type="gramEnd"/>
     </w:p>
     <w:p>
       <w:pPr>
@@ -5680,7 +5771,47 @@
           <w:sz w:val="24"/>
           <w:szCs w:val="24"/>
         </w:rPr>
-        <w:t>The Doctor entity is specialized into two subtypes:</w:t>
+        <w:t xml:space="preserve">The Doctor entity </w:t>
+      </w:r>
+      <w:proofErr w:type="gramStart"/>
+      <w:r>
+        <w:rPr>
+          <w:rFonts w:ascii="Times New Roman" w:hAnsi="Times New Roman" w:cs="Times New Roman"/>
+          <w:color w:val="262626" w:themeColor="accent6" w:themeShade="80"/>
+          <w:sz w:val="24"/>
+          <w:szCs w:val="24"/>
+        </w:rPr>
+        <w:t>is specialized</w:t>
+      </w:r>
+      <w:proofErr w:type="gramEnd"/>
+      <w:r>
+        <w:rPr>
+          <w:rFonts w:ascii="Times New Roman" w:hAnsi="Times New Roman" w:cs="Times New Roman"/>
+          <w:color w:val="262626" w:themeColor="accent6" w:themeShade="80"/>
+          <w:sz w:val="24"/>
+          <w:szCs w:val="24"/>
+        </w:rPr>
+        <w:t xml:space="preserve"> </w:t>
+      </w:r>
+      <w:proofErr w:type="gramStart"/>
+      <w:r>
+        <w:rPr>
+          <w:rFonts w:ascii="Times New Roman" w:hAnsi="Times New Roman" w:cs="Times New Roman"/>
+          <w:color w:val="262626" w:themeColor="accent6" w:themeShade="80"/>
+          <w:sz w:val="24"/>
+          <w:szCs w:val="24"/>
+        </w:rPr>
+        <w:t>into</w:t>
+      </w:r>
+      <w:proofErr w:type="gramEnd"/>
+      <w:r>
+        <w:rPr>
+          <w:rFonts w:ascii="Times New Roman" w:hAnsi="Times New Roman" w:cs="Times New Roman"/>
+          <w:color w:val="262626" w:themeColor="accent6" w:themeShade="80"/>
+          <w:sz w:val="24"/>
+          <w:szCs w:val="24"/>
+        </w:rPr>
+        <w:t xml:space="preserve"> two subtypes:</w:t>
       </w:r>
     </w:p>
     <w:p>
@@ -5697,6 +5828,8 @@
           <w:szCs w:val="24"/>
         </w:rPr>
       </w:pPr>
+      <w:proofErr w:type="spellStart"/>
+      <w:proofErr w:type="gramStart"/>
       <w:r>
         <w:rPr>
           <w:rFonts w:ascii="Times New Roman" w:hAnsi="Times New Roman" w:cs="Times New Roman"/>
@@ -5706,6 +5839,8 @@
         </w:rPr>
         <w:t>GeneralPractitioner</w:t>
       </w:r>
+      <w:proofErr w:type="spellEnd"/>
+      <w:proofErr w:type="gramEnd"/>
     </w:p>
     <w:p>
       <w:pPr>
@@ -5934,6 +6069,7 @@
                 <w:color w:val="auto"/>
               </w:rPr>
             </w:pPr>
+            <w:proofErr w:type="spellStart"/>
             <w:r>
               <w:rPr>
                 <w:rFonts w:ascii="Times New Roman" w:hAnsi="Times New Roman" w:cs="Times New Roman"/>
@@ -5941,7 +6077,17 @@
                 <w:bCs/>
                 <w:color w:val="auto"/>
               </w:rPr>
-              <w:t>PatientID (PK)</w:t>
+              <w:t>PatientID</w:t>
+            </w:r>
+            <w:proofErr w:type="spellEnd"/>
+            <w:r>
+              <w:rPr>
+                <w:rFonts w:ascii="Times New Roman" w:hAnsi="Times New Roman" w:cs="Times New Roman"/>
+                <w:b/>
+                <w:bCs/>
+                <w:color w:val="auto"/>
+              </w:rPr>
+              <w:t xml:space="preserve"> (PK)</w:t>
             </w:r>
             <w:r>
               <w:rPr>
@@ -5998,6 +6144,7 @@
                 <w:color w:val="auto"/>
               </w:rPr>
             </w:pPr>
+            <w:proofErr w:type="spellStart"/>
             <w:r>
               <w:rPr>
                 <w:rFonts w:ascii="Times New Roman" w:hAnsi="Times New Roman" w:cs="Times New Roman"/>
@@ -6005,15 +6152,34 @@
                 <w:bCs/>
                 <w:color w:val="auto"/>
               </w:rPr>
-              <w:t>DepartmentID (PK)</w:t>
+              <w:t>DepartmentID</w:t>
+            </w:r>
+            <w:proofErr w:type="spellEnd"/>
+            <w:r>
+              <w:rPr>
+                <w:rFonts w:ascii="Times New Roman" w:hAnsi="Times New Roman" w:cs="Times New Roman"/>
+                <w:b/>
+                <w:bCs/>
+                <w:color w:val="auto"/>
+              </w:rPr>
+              <w:t xml:space="preserve"> (PK)</w:t>
             </w:r>
             <w:r>
               <w:rPr>
                 <w:rFonts w:ascii="Times New Roman" w:hAnsi="Times New Roman" w:cs="Times New Roman"/>
                 <w:color w:val="auto"/>
               </w:rPr>
-              <w:t>, DepartmentName</w:t>
+              <w:t xml:space="preserve">, </w:t>
             </w:r>
+            <w:proofErr w:type="spellStart"/>
+            <w:r>
+              <w:rPr>
+                <w:rFonts w:ascii="Times New Roman" w:hAnsi="Times New Roman" w:cs="Times New Roman"/>
+                <w:color w:val="auto"/>
+              </w:rPr>
+              <w:t>DepartmentName</w:t>
+            </w:r>
+            <w:proofErr w:type="spellEnd"/>
           </w:p>
         </w:tc>
       </w:tr>
@@ -6062,6 +6228,7 @@
                 <w:color w:val="auto"/>
               </w:rPr>
             </w:pPr>
+            <w:proofErr w:type="spellStart"/>
             <w:r>
               <w:rPr>
                 <w:rFonts w:ascii="Times New Roman" w:hAnsi="Times New Roman" w:cs="Times New Roman"/>
@@ -6069,7 +6236,17 @@
                 <w:bCs/>
                 <w:color w:val="auto"/>
               </w:rPr>
-              <w:t>DoctorID (PK)</w:t>
+              <w:t>DoctorID</w:t>
+            </w:r>
+            <w:proofErr w:type="spellEnd"/>
+            <w:r>
+              <w:rPr>
+                <w:rFonts w:ascii="Times New Roman" w:hAnsi="Times New Roman" w:cs="Times New Roman"/>
+                <w:b/>
+                <w:bCs/>
+                <w:color w:val="auto"/>
+              </w:rPr>
+              <w:t xml:space="preserve"> (PK)</w:t>
             </w:r>
             <w:r>
               <w:rPr>
@@ -6078,6 +6255,7 @@
               </w:rPr>
               <w:t xml:space="preserve">, FirstName, LastName, Phone, </w:t>
             </w:r>
+            <w:proofErr w:type="spellStart"/>
             <w:r>
               <w:rPr>
                 <w:rFonts w:ascii="Times New Roman" w:hAnsi="Times New Roman" w:cs="Times New Roman"/>
@@ -6085,7 +6263,17 @@
                 <w:bCs/>
                 <w:color w:val="auto"/>
               </w:rPr>
-              <w:t>DepartmentID (FK)</w:t>
+              <w:t>DepartmentID</w:t>
+            </w:r>
+            <w:proofErr w:type="spellEnd"/>
+            <w:r>
+              <w:rPr>
+                <w:rFonts w:ascii="Times New Roman" w:hAnsi="Times New Roman" w:cs="Times New Roman"/>
+                <w:b/>
+                <w:bCs/>
+                <w:color w:val="auto"/>
+              </w:rPr>
+              <w:t xml:space="preserve"> (FK)</w:t>
             </w:r>
           </w:p>
         </w:tc>
@@ -6109,6 +6297,7 @@
                 <w:color w:val="auto"/>
               </w:rPr>
             </w:pPr>
+            <w:proofErr w:type="spellStart"/>
             <w:r>
               <w:rPr>
                 <w:rFonts w:ascii="Times New Roman" w:hAnsi="Times New Roman" w:cs="Times New Roman"/>
@@ -6116,6 +6305,7 @@
               </w:rPr>
               <w:t>GeneralPractitioner</w:t>
             </w:r>
+            <w:proofErr w:type="spellEnd"/>
           </w:p>
         </w:tc>
         <w:tc>
@@ -6137,6 +6327,7 @@
                 <w:color w:val="auto"/>
               </w:rPr>
             </w:pPr>
+            <w:proofErr w:type="spellStart"/>
             <w:r>
               <w:rPr>
                 <w:rFonts w:ascii="Times New Roman" w:hAnsi="Times New Roman" w:cs="Times New Roman"/>
@@ -6144,7 +6335,17 @@
                 <w:bCs/>
                 <w:color w:val="auto"/>
               </w:rPr>
-              <w:t>DoctorID (PK, FK)</w:t>
+              <w:t>DoctorID</w:t>
+            </w:r>
+            <w:proofErr w:type="spellEnd"/>
+            <w:r>
+              <w:rPr>
+                <w:rFonts w:ascii="Times New Roman" w:hAnsi="Times New Roman" w:cs="Times New Roman"/>
+                <w:b/>
+                <w:bCs/>
+                <w:color w:val="auto"/>
+              </w:rPr>
+              <w:t xml:space="preserve"> (PK, FK)</w:t>
             </w:r>
           </w:p>
         </w:tc>
@@ -6194,6 +6395,7 @@
                 <w:color w:val="auto"/>
               </w:rPr>
             </w:pPr>
+            <w:proofErr w:type="spellStart"/>
             <w:r>
               <w:rPr>
                 <w:rFonts w:ascii="Times New Roman" w:hAnsi="Times New Roman" w:cs="Times New Roman"/>
@@ -6201,7 +6403,17 @@
                 <w:bCs/>
                 <w:color w:val="auto"/>
               </w:rPr>
-              <w:t>DoctorID (PK, FK)</w:t>
+              <w:t>DoctorID</w:t>
+            </w:r>
+            <w:proofErr w:type="spellEnd"/>
+            <w:r>
+              <w:rPr>
+                <w:rFonts w:ascii="Times New Roman" w:hAnsi="Times New Roman" w:cs="Times New Roman"/>
+                <w:b/>
+                <w:bCs/>
+                <w:color w:val="auto"/>
+              </w:rPr>
+              <w:t xml:space="preserve"> (PK, FK)</w:t>
             </w:r>
             <w:r>
               <w:rPr>
@@ -6258,6 +6470,7 @@
                 <w:color w:val="auto"/>
               </w:rPr>
             </w:pPr>
+            <w:proofErr w:type="spellStart"/>
             <w:r>
               <w:rPr>
                 <w:rFonts w:ascii="Times New Roman" w:hAnsi="Times New Roman" w:cs="Times New Roman"/>
@@ -6265,15 +6478,9 @@
                 <w:bCs/>
                 <w:color w:val="auto"/>
               </w:rPr>
-              <w:t>AppointmentID (PK)</w:t>
+              <w:t>AppointmentID</w:t>
             </w:r>
-            <w:r>
-              <w:rPr>
-                <w:rFonts w:ascii="Times New Roman" w:hAnsi="Times New Roman" w:cs="Times New Roman"/>
-                <w:color w:val="auto"/>
-              </w:rPr>
-              <w:t xml:space="preserve">, AppointmentDate, Status, </w:t>
-            </w:r>
+            <w:proofErr w:type="spellEnd"/>
             <w:r>
               <w:rPr>
                 <w:rFonts w:ascii="Times New Roman" w:hAnsi="Times New Roman" w:cs="Times New Roman"/>
@@ -6281,7 +6488,7 @@
                 <w:bCs/>
                 <w:color w:val="auto"/>
               </w:rPr>
-              <w:t>PatientID (FK)</w:t>
+              <w:t xml:space="preserve"> (PK)</w:t>
             </w:r>
             <w:r>
               <w:rPr>
@@ -6290,6 +6497,23 @@
               </w:rPr>
               <w:t xml:space="preserve">, </w:t>
             </w:r>
+            <w:proofErr w:type="spellStart"/>
+            <w:r>
+              <w:rPr>
+                <w:rFonts w:ascii="Times New Roman" w:hAnsi="Times New Roman" w:cs="Times New Roman"/>
+                <w:color w:val="auto"/>
+              </w:rPr>
+              <w:t>AppointmentDate</w:t>
+            </w:r>
+            <w:proofErr w:type="spellEnd"/>
+            <w:r>
+              <w:rPr>
+                <w:rFonts w:ascii="Times New Roman" w:hAnsi="Times New Roman" w:cs="Times New Roman"/>
+                <w:color w:val="auto"/>
+              </w:rPr>
+              <w:t xml:space="preserve">, Status, </w:t>
+            </w:r>
+            <w:proofErr w:type="spellStart"/>
             <w:r>
               <w:rPr>
                 <w:rFonts w:ascii="Times New Roman" w:hAnsi="Times New Roman" w:cs="Times New Roman"/>
@@ -6297,7 +6521,44 @@
                 <w:bCs/>
                 <w:color w:val="auto"/>
               </w:rPr>
-              <w:t>DoctorID (FK)</w:t>
+              <w:t>PatientID</w:t>
+            </w:r>
+            <w:proofErr w:type="spellEnd"/>
+            <w:r>
+              <w:rPr>
+                <w:rFonts w:ascii="Times New Roman" w:hAnsi="Times New Roman" w:cs="Times New Roman"/>
+                <w:b/>
+                <w:bCs/>
+                <w:color w:val="auto"/>
+              </w:rPr>
+              <w:t xml:space="preserve"> (FK)</w:t>
+            </w:r>
+            <w:r>
+              <w:rPr>
+                <w:rFonts w:ascii="Times New Roman" w:hAnsi="Times New Roman" w:cs="Times New Roman"/>
+                <w:color w:val="auto"/>
+              </w:rPr>
+              <w:t xml:space="preserve">, </w:t>
+            </w:r>
+            <w:proofErr w:type="spellStart"/>
+            <w:r>
+              <w:rPr>
+                <w:rFonts w:ascii="Times New Roman" w:hAnsi="Times New Roman" w:cs="Times New Roman"/>
+                <w:b/>
+                <w:bCs/>
+                <w:color w:val="auto"/>
+              </w:rPr>
+              <w:t>DoctorID</w:t>
+            </w:r>
+            <w:proofErr w:type="spellEnd"/>
+            <w:r>
+              <w:rPr>
+                <w:rFonts w:ascii="Times New Roman" w:hAnsi="Times New Roman" w:cs="Times New Roman"/>
+                <w:b/>
+                <w:bCs/>
+                <w:color w:val="auto"/>
+              </w:rPr>
+              <w:t xml:space="preserve"> (FK)</w:t>
             </w:r>
           </w:p>
         </w:tc>
@@ -6347,6 +6608,7 @@
                 <w:color w:val="auto"/>
               </w:rPr>
             </w:pPr>
+            <w:proofErr w:type="spellStart"/>
             <w:r>
               <w:rPr>
                 <w:rFonts w:ascii="Times New Roman" w:hAnsi="Times New Roman" w:cs="Times New Roman"/>
@@ -6354,7 +6616,17 @@
                 <w:bCs/>
                 <w:color w:val="auto"/>
               </w:rPr>
-              <w:t>TreatmentID (PK)</w:t>
+              <w:t>TreatmentID</w:t>
+            </w:r>
+            <w:proofErr w:type="spellEnd"/>
+            <w:r>
+              <w:rPr>
+                <w:rFonts w:ascii="Times New Roman" w:hAnsi="Times New Roman" w:cs="Times New Roman"/>
+                <w:b/>
+                <w:bCs/>
+                <w:color w:val="auto"/>
+              </w:rPr>
+              <w:t xml:space="preserve"> (PK)</w:t>
             </w:r>
             <w:r>
               <w:rPr>
@@ -6363,6 +6635,7 @@
               </w:rPr>
               <w:t xml:space="preserve">, Diagnosis, </w:t>
             </w:r>
+            <w:proofErr w:type="spellStart"/>
             <w:r>
               <w:rPr>
                 <w:rFonts w:ascii="Times New Roman" w:hAnsi="Times New Roman" w:cs="Times New Roman"/>
@@ -6370,7 +6643,17 @@
                 <w:bCs/>
                 <w:color w:val="auto"/>
               </w:rPr>
-              <w:t>AppointmentID (FK)</w:t>
+              <w:t>AppointmentID</w:t>
+            </w:r>
+            <w:proofErr w:type="spellEnd"/>
+            <w:r>
+              <w:rPr>
+                <w:rFonts w:ascii="Times New Roman" w:hAnsi="Times New Roman" w:cs="Times New Roman"/>
+                <w:b/>
+                <w:bCs/>
+                <w:color w:val="auto"/>
+              </w:rPr>
+              <w:t xml:space="preserve"> (FK)</w:t>
             </w:r>
           </w:p>
         </w:tc>
@@ -6420,6 +6703,7 @@
                 <w:color w:val="auto"/>
               </w:rPr>
             </w:pPr>
+            <w:proofErr w:type="spellStart"/>
             <w:r>
               <w:rPr>
                 <w:rFonts w:ascii="Times New Roman" w:hAnsi="Times New Roman" w:cs="Times New Roman"/>
@@ -6427,15 +6711,9 @@
                 <w:bCs/>
                 <w:color w:val="auto"/>
               </w:rPr>
-              <w:t>PaymentID (PK)</w:t>
+              <w:t>PaymentID</w:t>
             </w:r>
-            <w:r>
-              <w:rPr>
-                <w:rFonts w:ascii="Times New Roman" w:hAnsi="Times New Roman" w:cs="Times New Roman"/>
-                <w:color w:val="auto"/>
-              </w:rPr>
-              <w:t xml:space="preserve">, Amount, PaymentMethod, </w:t>
-            </w:r>
+            <w:proofErr w:type="spellEnd"/>
             <w:r>
               <w:rPr>
                 <w:rFonts w:ascii="Times New Roman" w:hAnsi="Times New Roman" w:cs="Times New Roman"/>
@@ -6443,7 +6721,50 @@
                 <w:bCs/>
                 <w:color w:val="auto"/>
               </w:rPr>
-              <w:t>AppointmentID (FK</w:t>
+              <w:t xml:space="preserve"> (PK)</w:t>
+            </w:r>
+            <w:r>
+              <w:rPr>
+                <w:rFonts w:ascii="Times New Roman" w:hAnsi="Times New Roman" w:cs="Times New Roman"/>
+                <w:color w:val="auto"/>
+              </w:rPr>
+              <w:t xml:space="preserve">, Amount, </w:t>
+            </w:r>
+            <w:proofErr w:type="spellStart"/>
+            <w:r>
+              <w:rPr>
+                <w:rFonts w:ascii="Times New Roman" w:hAnsi="Times New Roman" w:cs="Times New Roman"/>
+                <w:color w:val="auto"/>
+              </w:rPr>
+              <w:t>PaymentMethod</w:t>
+            </w:r>
+            <w:proofErr w:type="spellEnd"/>
+            <w:r>
+              <w:rPr>
+                <w:rFonts w:ascii="Times New Roman" w:hAnsi="Times New Roman" w:cs="Times New Roman"/>
+                <w:color w:val="auto"/>
+              </w:rPr>
+              <w:t xml:space="preserve">, </w:t>
+            </w:r>
+            <w:proofErr w:type="spellStart"/>
+            <w:r>
+              <w:rPr>
+                <w:rFonts w:ascii="Times New Roman" w:hAnsi="Times New Roman" w:cs="Times New Roman"/>
+                <w:b/>
+                <w:bCs/>
+                <w:color w:val="auto"/>
+              </w:rPr>
+              <w:t>AppointmentID</w:t>
+            </w:r>
+            <w:proofErr w:type="spellEnd"/>
+            <w:r>
+              <w:rPr>
+                <w:rFonts w:ascii="Times New Roman" w:hAnsi="Times New Roman" w:cs="Times New Roman"/>
+                <w:b/>
+                <w:bCs/>
+                <w:color w:val="auto"/>
+              </w:rPr>
+              <w:t xml:space="preserve"> (FK</w:t>
             </w:r>
             <w:r>
               <w:rPr>
@@ -7771,7 +8092,27 @@
           <w:sz w:val="24"/>
           <w:szCs w:val="24"/>
         </w:rPr>
-        <w:t xml:space="preserve">(DepartmentID </w:t>
+        <w:t>(</w:t>
+      </w:r>
+      <w:proofErr w:type="spellStart"/>
+      <w:r>
+        <w:rPr>
+          <w:rFonts w:ascii="Times New Roman" w:hAnsi="Times New Roman" w:cs="Times New Roman"/>
+          <w:color w:val="auto"/>
+          <w:sz w:val="24"/>
+          <w:szCs w:val="24"/>
+        </w:rPr>
+        <w:t>DepartmentID</w:t>
+      </w:r>
+      <w:proofErr w:type="spellEnd"/>
+      <w:r>
+        <w:rPr>
+          <w:rFonts w:ascii="Times New Roman" w:hAnsi="Times New Roman" w:cs="Times New Roman"/>
+          <w:color w:val="auto"/>
+          <w:sz w:val="24"/>
+          <w:szCs w:val="24"/>
+        </w:rPr>
+        <w:t xml:space="preserve"> </w:t>
       </w:r>
       <w:r>
         <w:rPr>
@@ -7791,7 +8132,27 @@
           <w:sz w:val="24"/>
           <w:szCs w:val="24"/>
         </w:rPr>
-        <w:t>, DepartmentName)</w:t>
+        <w:t xml:space="preserve">, </w:t>
+      </w:r>
+      <w:proofErr w:type="spellStart"/>
+      <w:r>
+        <w:rPr>
+          <w:rFonts w:ascii="Times New Roman" w:hAnsi="Times New Roman" w:cs="Times New Roman"/>
+          <w:color w:val="auto"/>
+          <w:sz w:val="24"/>
+          <w:szCs w:val="24"/>
+        </w:rPr>
+        <w:t>DepartmentName</w:t>
+      </w:r>
+      <w:proofErr w:type="spellEnd"/>
+      <w:r>
+        <w:rPr>
+          <w:rFonts w:ascii="Times New Roman" w:hAnsi="Times New Roman" w:cs="Times New Roman"/>
+          <w:color w:val="auto"/>
+          <w:sz w:val="24"/>
+          <w:szCs w:val="24"/>
+        </w:rPr>
+        <w:t>)</w:t>
       </w:r>
     </w:p>
     <w:p>
@@ -7842,7 +8203,27 @@
           <w:sz w:val="24"/>
           <w:szCs w:val="24"/>
         </w:rPr>
-        <w:t xml:space="preserve"> (PatientID </w:t>
+        <w:t xml:space="preserve"> (</w:t>
+      </w:r>
+      <w:proofErr w:type="spellStart"/>
+      <w:r>
+        <w:rPr>
+          <w:rFonts w:ascii="Times New Roman" w:hAnsi="Times New Roman" w:cs="Times New Roman"/>
+          <w:color w:val="auto"/>
+          <w:sz w:val="24"/>
+          <w:szCs w:val="24"/>
+        </w:rPr>
+        <w:t>PatientID</w:t>
+      </w:r>
+      <w:proofErr w:type="spellEnd"/>
+      <w:r>
+        <w:rPr>
+          <w:rFonts w:ascii="Times New Roman" w:hAnsi="Times New Roman" w:cs="Times New Roman"/>
+          <w:color w:val="auto"/>
+          <w:sz w:val="24"/>
+          <w:szCs w:val="24"/>
+        </w:rPr>
+        <w:t xml:space="preserve"> </w:t>
       </w:r>
       <w:r>
         <w:rPr>
@@ -7913,7 +8294,27 @@
           <w:sz w:val="24"/>
           <w:szCs w:val="24"/>
         </w:rPr>
-        <w:t xml:space="preserve"> (DoctorID </w:t>
+        <w:t xml:space="preserve"> (</w:t>
+      </w:r>
+      <w:proofErr w:type="spellStart"/>
+      <w:r>
+        <w:rPr>
+          <w:rFonts w:ascii="Times New Roman" w:hAnsi="Times New Roman" w:cs="Times New Roman"/>
+          <w:color w:val="auto"/>
+          <w:sz w:val="24"/>
+          <w:szCs w:val="24"/>
+        </w:rPr>
+        <w:t>DoctorID</w:t>
+      </w:r>
+      <w:proofErr w:type="spellEnd"/>
+      <w:r>
+        <w:rPr>
+          <w:rFonts w:ascii="Times New Roman" w:hAnsi="Times New Roman" w:cs="Times New Roman"/>
+          <w:color w:val="auto"/>
+          <w:sz w:val="24"/>
+          <w:szCs w:val="24"/>
+        </w:rPr>
+        <w:t xml:space="preserve"> </w:t>
       </w:r>
       <w:r>
         <w:rPr>
@@ -7933,7 +8334,27 @@
           <w:sz w:val="24"/>
           <w:szCs w:val="24"/>
         </w:rPr>
-        <w:t xml:space="preserve">, FirstName, LastName, Phone, DepartmentID </w:t>
+        <w:t xml:space="preserve">, FirstName, LastName, Phone, </w:t>
+      </w:r>
+      <w:proofErr w:type="spellStart"/>
+      <w:r>
+        <w:rPr>
+          <w:rFonts w:ascii="Times New Roman" w:hAnsi="Times New Roman" w:cs="Times New Roman"/>
+          <w:color w:val="auto"/>
+          <w:sz w:val="24"/>
+          <w:szCs w:val="24"/>
+        </w:rPr>
+        <w:t>DepartmentID</w:t>
+      </w:r>
+      <w:proofErr w:type="spellEnd"/>
+      <w:r>
+        <w:rPr>
+          <w:rFonts w:ascii="Times New Roman" w:hAnsi="Times New Roman" w:cs="Times New Roman"/>
+          <w:color w:val="auto"/>
+          <w:sz w:val="24"/>
+          <w:szCs w:val="24"/>
+        </w:rPr>
+        <w:t xml:space="preserve"> </w:t>
       </w:r>
       <w:r>
         <w:rPr>
@@ -7986,6 +8407,7 @@
           <w:szCs w:val="24"/>
         </w:rPr>
       </w:pPr>
+      <w:proofErr w:type="spellStart"/>
       <w:r>
         <w:rPr>
           <w:rFonts w:ascii="Times New Roman" w:hAnsi="Times New Roman" w:cs="Times New Roman"/>
@@ -7997,14 +8419,35 @@
         </w:rPr>
         <w:t>GeneralPractitioner</w:t>
       </w:r>
-      <w:r>
-        <w:rPr>
-          <w:rFonts w:ascii="Times New Roman" w:hAnsi="Times New Roman" w:cs="Times New Roman"/>
-          <w:color w:val="auto"/>
-          <w:sz w:val="24"/>
-          <w:szCs w:val="24"/>
-        </w:rPr>
-        <w:t xml:space="preserve"> (DoctorID </w:t>
+      <w:proofErr w:type="spellEnd"/>
+      <w:r>
+        <w:rPr>
+          <w:rFonts w:ascii="Times New Roman" w:hAnsi="Times New Roman" w:cs="Times New Roman"/>
+          <w:color w:val="auto"/>
+          <w:sz w:val="24"/>
+          <w:szCs w:val="24"/>
+        </w:rPr>
+        <w:t xml:space="preserve"> (</w:t>
+      </w:r>
+      <w:proofErr w:type="spellStart"/>
+      <w:r>
+        <w:rPr>
+          <w:rFonts w:ascii="Times New Roman" w:hAnsi="Times New Roman" w:cs="Times New Roman"/>
+          <w:color w:val="auto"/>
+          <w:sz w:val="24"/>
+          <w:szCs w:val="24"/>
+        </w:rPr>
+        <w:t>DoctorID</w:t>
+      </w:r>
+      <w:proofErr w:type="spellEnd"/>
+      <w:r>
+        <w:rPr>
+          <w:rFonts w:ascii="Times New Roman" w:hAnsi="Times New Roman" w:cs="Times New Roman"/>
+          <w:color w:val="auto"/>
+          <w:sz w:val="24"/>
+          <w:szCs w:val="24"/>
+        </w:rPr>
+        <w:t xml:space="preserve"> </w:t>
       </w:r>
       <w:r>
         <w:rPr>
@@ -8075,7 +8518,27 @@
           <w:sz w:val="24"/>
           <w:szCs w:val="24"/>
         </w:rPr>
-        <w:t xml:space="preserve"> (DoctorID </w:t>
+        <w:t xml:space="preserve"> (</w:t>
+      </w:r>
+      <w:proofErr w:type="spellStart"/>
+      <w:r>
+        <w:rPr>
+          <w:rFonts w:ascii="Times New Roman" w:hAnsi="Times New Roman" w:cs="Times New Roman"/>
+          <w:color w:val="auto"/>
+          <w:sz w:val="24"/>
+          <w:szCs w:val="24"/>
+        </w:rPr>
+        <w:t>DoctorID</w:t>
+      </w:r>
+      <w:proofErr w:type="spellEnd"/>
+      <w:r>
+        <w:rPr>
+          <w:rFonts w:ascii="Times New Roman" w:hAnsi="Times New Roman" w:cs="Times New Roman"/>
+          <w:color w:val="auto"/>
+          <w:sz w:val="24"/>
+          <w:szCs w:val="24"/>
+        </w:rPr>
+        <w:t xml:space="preserve"> </w:t>
       </w:r>
       <w:r>
         <w:rPr>
@@ -8146,7 +8609,27 @@
           <w:sz w:val="24"/>
           <w:szCs w:val="24"/>
         </w:rPr>
-        <w:t xml:space="preserve"> (AppointmentID </w:t>
+        <w:t xml:space="preserve"> (</w:t>
+      </w:r>
+      <w:proofErr w:type="spellStart"/>
+      <w:r>
+        <w:rPr>
+          <w:rFonts w:ascii="Times New Roman" w:hAnsi="Times New Roman" w:cs="Times New Roman"/>
+          <w:color w:val="auto"/>
+          <w:sz w:val="24"/>
+          <w:szCs w:val="24"/>
+        </w:rPr>
+        <w:t>AppointmentID</w:t>
+      </w:r>
+      <w:proofErr w:type="spellEnd"/>
+      <w:r>
+        <w:rPr>
+          <w:rFonts w:ascii="Times New Roman" w:hAnsi="Times New Roman" w:cs="Times New Roman"/>
+          <w:color w:val="auto"/>
+          <w:sz w:val="24"/>
+          <w:szCs w:val="24"/>
+        </w:rPr>
+        <w:t xml:space="preserve"> </w:t>
       </w:r>
       <w:r>
         <w:rPr>
@@ -8166,7 +8649,47 @@
           <w:sz w:val="24"/>
           <w:szCs w:val="24"/>
         </w:rPr>
-        <w:t xml:space="preserve">, AppointmentDate, Status, PatientID </w:t>
+        <w:t xml:space="preserve">, </w:t>
+      </w:r>
+      <w:proofErr w:type="spellStart"/>
+      <w:r>
+        <w:rPr>
+          <w:rFonts w:ascii="Times New Roman" w:hAnsi="Times New Roman" w:cs="Times New Roman"/>
+          <w:color w:val="auto"/>
+          <w:sz w:val="24"/>
+          <w:szCs w:val="24"/>
+        </w:rPr>
+        <w:t>AppointmentDate</w:t>
+      </w:r>
+      <w:proofErr w:type="spellEnd"/>
+      <w:r>
+        <w:rPr>
+          <w:rFonts w:ascii="Times New Roman" w:hAnsi="Times New Roman" w:cs="Times New Roman"/>
+          <w:color w:val="auto"/>
+          <w:sz w:val="24"/>
+          <w:szCs w:val="24"/>
+        </w:rPr>
+        <w:t xml:space="preserve">, Status, </w:t>
+      </w:r>
+      <w:proofErr w:type="spellStart"/>
+      <w:r>
+        <w:rPr>
+          <w:rFonts w:ascii="Times New Roman" w:hAnsi="Times New Roman" w:cs="Times New Roman"/>
+          <w:color w:val="auto"/>
+          <w:sz w:val="24"/>
+          <w:szCs w:val="24"/>
+        </w:rPr>
+        <w:t>PatientID</w:t>
+      </w:r>
+      <w:proofErr w:type="spellEnd"/>
+      <w:r>
+        <w:rPr>
+          <w:rFonts w:ascii="Times New Roman" w:hAnsi="Times New Roman" w:cs="Times New Roman"/>
+          <w:color w:val="auto"/>
+          <w:sz w:val="24"/>
+          <w:szCs w:val="24"/>
+        </w:rPr>
+        <w:t xml:space="preserve"> </w:t>
       </w:r>
       <w:r>
         <w:rPr>
@@ -8186,7 +8709,27 @@
           <w:sz w:val="24"/>
           <w:szCs w:val="24"/>
         </w:rPr>
-        <w:t>, DoctorID FK)</w:t>
+        <w:t xml:space="preserve">, </w:t>
+      </w:r>
+      <w:proofErr w:type="spellStart"/>
+      <w:r>
+        <w:rPr>
+          <w:rFonts w:ascii="Times New Roman" w:hAnsi="Times New Roman" w:cs="Times New Roman"/>
+          <w:color w:val="auto"/>
+          <w:sz w:val="24"/>
+          <w:szCs w:val="24"/>
+        </w:rPr>
+        <w:t>DoctorID</w:t>
+      </w:r>
+      <w:proofErr w:type="spellEnd"/>
+      <w:r>
+        <w:rPr>
+          <w:rFonts w:ascii="Times New Roman" w:hAnsi="Times New Roman" w:cs="Times New Roman"/>
+          <w:color w:val="auto"/>
+          <w:sz w:val="24"/>
+          <w:szCs w:val="24"/>
+        </w:rPr>
+        <w:t xml:space="preserve"> FK)</w:t>
       </w:r>
     </w:p>
     <w:p>
@@ -8237,7 +8780,27 @@
           <w:sz w:val="24"/>
           <w:szCs w:val="24"/>
         </w:rPr>
-        <w:t xml:space="preserve"> (TreatmentID </w:t>
+        <w:t xml:space="preserve"> (</w:t>
+      </w:r>
+      <w:proofErr w:type="spellStart"/>
+      <w:r>
+        <w:rPr>
+          <w:rFonts w:ascii="Times New Roman" w:hAnsi="Times New Roman" w:cs="Times New Roman"/>
+          <w:color w:val="auto"/>
+          <w:sz w:val="24"/>
+          <w:szCs w:val="24"/>
+        </w:rPr>
+        <w:t>TreatmentID</w:t>
+      </w:r>
+      <w:proofErr w:type="spellEnd"/>
+      <w:r>
+        <w:rPr>
+          <w:rFonts w:ascii="Times New Roman" w:hAnsi="Times New Roman" w:cs="Times New Roman"/>
+          <w:color w:val="auto"/>
+          <w:sz w:val="24"/>
+          <w:szCs w:val="24"/>
+        </w:rPr>
+        <w:t xml:space="preserve"> </w:t>
       </w:r>
       <w:r>
         <w:rPr>
@@ -8257,7 +8820,27 @@
           <w:sz w:val="24"/>
           <w:szCs w:val="24"/>
         </w:rPr>
-        <w:t xml:space="preserve">, Diagnosis, AppointmentID </w:t>
+        <w:t xml:space="preserve">, Diagnosis, </w:t>
+      </w:r>
+      <w:proofErr w:type="spellStart"/>
+      <w:r>
+        <w:rPr>
+          <w:rFonts w:ascii="Times New Roman" w:hAnsi="Times New Roman" w:cs="Times New Roman"/>
+          <w:color w:val="auto"/>
+          <w:sz w:val="24"/>
+          <w:szCs w:val="24"/>
+        </w:rPr>
+        <w:t>AppointmentID</w:t>
+      </w:r>
+      <w:proofErr w:type="spellEnd"/>
+      <w:r>
+        <w:rPr>
+          <w:rFonts w:ascii="Times New Roman" w:hAnsi="Times New Roman" w:cs="Times New Roman"/>
+          <w:color w:val="auto"/>
+          <w:sz w:val="24"/>
+          <w:szCs w:val="24"/>
+        </w:rPr>
+        <w:t xml:space="preserve"> </w:t>
       </w:r>
       <w:r>
         <w:rPr>
@@ -8328,7 +8911,27 @@
           <w:sz w:val="24"/>
           <w:szCs w:val="24"/>
         </w:rPr>
-        <w:t xml:space="preserve"> (PaymentID </w:t>
+        <w:t xml:space="preserve"> (</w:t>
+      </w:r>
+      <w:proofErr w:type="spellStart"/>
+      <w:r>
+        <w:rPr>
+          <w:rFonts w:ascii="Times New Roman" w:hAnsi="Times New Roman" w:cs="Times New Roman"/>
+          <w:color w:val="auto"/>
+          <w:sz w:val="24"/>
+          <w:szCs w:val="24"/>
+        </w:rPr>
+        <w:t>PaymentID</w:t>
+      </w:r>
+      <w:proofErr w:type="spellEnd"/>
+      <w:r>
+        <w:rPr>
+          <w:rFonts w:ascii="Times New Roman" w:hAnsi="Times New Roman" w:cs="Times New Roman"/>
+          <w:color w:val="auto"/>
+          <w:sz w:val="24"/>
+          <w:szCs w:val="24"/>
+        </w:rPr>
+        <w:t xml:space="preserve"> </w:t>
       </w:r>
       <w:r>
         <w:rPr>
@@ -8348,7 +8951,47 @@
           <w:sz w:val="24"/>
           <w:szCs w:val="24"/>
         </w:rPr>
-        <w:t xml:space="preserve">, Amount, PaymentMethod, AppointmentID </w:t>
+        <w:t xml:space="preserve">, Amount, </w:t>
+      </w:r>
+      <w:proofErr w:type="spellStart"/>
+      <w:r>
+        <w:rPr>
+          <w:rFonts w:ascii="Times New Roman" w:hAnsi="Times New Roman" w:cs="Times New Roman"/>
+          <w:color w:val="auto"/>
+          <w:sz w:val="24"/>
+          <w:szCs w:val="24"/>
+        </w:rPr>
+        <w:t>PaymentMethod</w:t>
+      </w:r>
+      <w:proofErr w:type="spellEnd"/>
+      <w:r>
+        <w:rPr>
+          <w:rFonts w:ascii="Times New Roman" w:hAnsi="Times New Roman" w:cs="Times New Roman"/>
+          <w:color w:val="auto"/>
+          <w:sz w:val="24"/>
+          <w:szCs w:val="24"/>
+        </w:rPr>
+        <w:t xml:space="preserve">, </w:t>
+      </w:r>
+      <w:proofErr w:type="spellStart"/>
+      <w:r>
+        <w:rPr>
+          <w:rFonts w:ascii="Times New Roman" w:hAnsi="Times New Roman" w:cs="Times New Roman"/>
+          <w:color w:val="auto"/>
+          <w:sz w:val="24"/>
+          <w:szCs w:val="24"/>
+        </w:rPr>
+        <w:t>AppointmentID</w:t>
+      </w:r>
+      <w:proofErr w:type="spellEnd"/>
+      <w:r>
+        <w:rPr>
+          <w:rFonts w:ascii="Times New Roman" w:hAnsi="Times New Roman" w:cs="Times New Roman"/>
+          <w:color w:val="auto"/>
+          <w:sz w:val="24"/>
+          <w:szCs w:val="24"/>
+        </w:rPr>
+        <w:t xml:space="preserve"> </w:t>
       </w:r>
       <w:r>
         <w:rPr>
@@ -8660,7 +9303,27 @@
           <w:sz w:val="24"/>
           <w:szCs w:val="24"/>
         </w:rPr>
-        <w:t>CREATE DATABASE SmartClinic;</w:t>
+        <w:t xml:space="preserve">CREATE DATABASE </w:t>
+      </w:r>
+      <w:proofErr w:type="spellStart"/>
+      <w:r>
+        <w:rPr>
+          <w:rFonts w:ascii="Times New Roman" w:hAnsi="Times New Roman" w:cs="Times New Roman"/>
+          <w:color w:val="auto"/>
+          <w:sz w:val="24"/>
+          <w:szCs w:val="24"/>
+        </w:rPr>
+        <w:t>SmartClinic</w:t>
+      </w:r>
+      <w:proofErr w:type="spellEnd"/>
+      <w:r>
+        <w:rPr>
+          <w:rFonts w:ascii="Times New Roman" w:hAnsi="Times New Roman" w:cs="Times New Roman"/>
+          <w:color w:val="auto"/>
+          <w:sz w:val="24"/>
+          <w:szCs w:val="24"/>
+        </w:rPr>
+        <w:t>;</w:t>
       </w:r>
     </w:p>
     <w:p>
@@ -8685,7 +9348,27 @@
           <w:sz w:val="24"/>
           <w:szCs w:val="24"/>
         </w:rPr>
-        <w:t>USE SmartClinic;</w:t>
+        <w:t xml:space="preserve">USE </w:t>
+      </w:r>
+      <w:proofErr w:type="spellStart"/>
+      <w:r>
+        <w:rPr>
+          <w:rFonts w:ascii="Times New Roman" w:hAnsi="Times New Roman" w:cs="Times New Roman"/>
+          <w:color w:val="auto"/>
+          <w:sz w:val="24"/>
+          <w:szCs w:val="24"/>
+        </w:rPr>
+        <w:t>SmartClinic</w:t>
+      </w:r>
+      <w:proofErr w:type="spellEnd"/>
+      <w:r>
+        <w:rPr>
+          <w:rFonts w:ascii="Times New Roman" w:hAnsi="Times New Roman" w:cs="Times New Roman"/>
+          <w:color w:val="auto"/>
+          <w:sz w:val="24"/>
+          <w:szCs w:val="24"/>
+        </w:rPr>
+        <w:t>;</w:t>
       </w:r>
     </w:p>
     <w:p>
@@ -8923,7 +9606,25 @@
           <w:color w:val="auto"/>
           <w:kern w:val="20"/>
         </w:rPr>
-        <w:t xml:space="preserve">    DepartmentID INT PRIMARY KEY,</w:t>
+        <w:t xml:space="preserve">    </w:t>
+      </w:r>
+      <w:proofErr w:type="spellStart"/>
+      <w:r>
+        <w:rPr>
+          <w:rFonts w:ascii="Times New Roman" w:hAnsi="Times New Roman" w:cs="Times New Roman"/>
+          <w:color w:val="auto"/>
+          <w:kern w:val="20"/>
+        </w:rPr>
+        <w:t>DepartmentID</w:t>
+      </w:r>
+      <w:proofErr w:type="spellEnd"/>
+      <w:r>
+        <w:rPr>
+          <w:rFonts w:ascii="Times New Roman" w:hAnsi="Times New Roman" w:cs="Times New Roman"/>
+          <w:color w:val="auto"/>
+          <w:kern w:val="20"/>
+        </w:rPr>
+        <w:t xml:space="preserve"> INT PRIMARY KEY,</w:t>
       </w:r>
     </w:p>
     <w:p>
@@ -8942,7 +9643,25 @@
           <w:color w:val="auto"/>
           <w:kern w:val="20"/>
         </w:rPr>
-        <w:t xml:space="preserve">    DepartmentName VARCHAR(50) NOT NULL UNIQUE</w:t>
+        <w:t xml:space="preserve">    </w:t>
+      </w:r>
+      <w:proofErr w:type="spellStart"/>
+      <w:r>
+        <w:rPr>
+          <w:rFonts w:ascii="Times New Roman" w:hAnsi="Times New Roman" w:cs="Times New Roman"/>
+          <w:color w:val="auto"/>
+          <w:kern w:val="20"/>
+        </w:rPr>
+        <w:t>DepartmentName</w:t>
+      </w:r>
+      <w:proofErr w:type="spellEnd"/>
+      <w:r>
+        <w:rPr>
+          <w:rFonts w:ascii="Times New Roman" w:hAnsi="Times New Roman" w:cs="Times New Roman"/>
+          <w:color w:val="auto"/>
+          <w:kern w:val="20"/>
+        </w:rPr>
+        <w:t xml:space="preserve"> VARCHAR(50) NOT NULL UNIQUE</w:t>
       </w:r>
     </w:p>
     <w:p>
@@ -9055,7 +9774,25 @@
           <w:color w:val="auto"/>
           <w:kern w:val="20"/>
         </w:rPr>
-        <w:t xml:space="preserve">    PatientID INT PRIMARY KEY,</w:t>
+        <w:t xml:space="preserve">    </w:t>
+      </w:r>
+      <w:proofErr w:type="spellStart"/>
+      <w:r>
+        <w:rPr>
+          <w:rFonts w:ascii="Times New Roman" w:hAnsi="Times New Roman" w:cs="Times New Roman"/>
+          <w:color w:val="auto"/>
+          <w:kern w:val="20"/>
+        </w:rPr>
+        <w:t>PatientID</w:t>
+      </w:r>
+      <w:proofErr w:type="spellEnd"/>
+      <w:r>
+        <w:rPr>
+          <w:rFonts w:ascii="Times New Roman" w:hAnsi="Times New Roman" w:cs="Times New Roman"/>
+          <w:color w:val="auto"/>
+          <w:kern w:val="20"/>
+        </w:rPr>
+        <w:t xml:space="preserve"> INT PRIMARY KEY,</w:t>
       </w:r>
     </w:p>
     <w:p>
@@ -9409,7 +10146,23 @@
           <w:rFonts w:ascii="Times New Roman" w:hAnsi="Times New Roman" w:cs="Times New Roman"/>
           <w:color w:val="auto"/>
         </w:rPr>
-        <w:t xml:space="preserve">    DoctorID INT PRIMARY KEY,</w:t>
+        <w:t xml:space="preserve">    </w:t>
+      </w:r>
+      <w:proofErr w:type="spellStart"/>
+      <w:r>
+        <w:rPr>
+          <w:rFonts w:ascii="Times New Roman" w:hAnsi="Times New Roman" w:cs="Times New Roman"/>
+          <w:color w:val="auto"/>
+        </w:rPr>
+        <w:t>DoctorID</w:t>
+      </w:r>
+      <w:proofErr w:type="spellEnd"/>
+      <w:r>
+        <w:rPr>
+          <w:rFonts w:ascii="Times New Roman" w:hAnsi="Times New Roman" w:cs="Times New Roman"/>
+          <w:color w:val="auto"/>
+        </w:rPr>
+        <w:t xml:space="preserve"> INT PRIMARY KEY,</w:t>
       </w:r>
     </w:p>
     <w:p>
@@ -9493,7 +10246,23 @@
           <w:rFonts w:ascii="Times New Roman" w:hAnsi="Times New Roman" w:cs="Times New Roman"/>
           <w:color w:val="auto"/>
         </w:rPr>
-        <w:t xml:space="preserve">    DepartmentID INT NOT NULL,</w:t>
+        <w:t xml:space="preserve">    </w:t>
+      </w:r>
+      <w:proofErr w:type="spellStart"/>
+      <w:r>
+        <w:rPr>
+          <w:rFonts w:ascii="Times New Roman" w:hAnsi="Times New Roman" w:cs="Times New Roman"/>
+          <w:color w:val="auto"/>
+        </w:rPr>
+        <w:t>DepartmentID</w:t>
+      </w:r>
+      <w:proofErr w:type="spellEnd"/>
+      <w:r>
+        <w:rPr>
+          <w:rFonts w:ascii="Times New Roman" w:hAnsi="Times New Roman" w:cs="Times New Roman"/>
+          <w:color w:val="auto"/>
+        </w:rPr>
+        <w:t xml:space="preserve"> INT NOT NULL,</w:t>
       </w:r>
     </w:p>
     <w:p>
@@ -9514,7 +10283,23 @@
           <w:rFonts w:ascii="Times New Roman" w:hAnsi="Times New Roman" w:cs="Times New Roman"/>
           <w:color w:val="auto"/>
         </w:rPr>
-        <w:t xml:space="preserve">    FOREIGN KEY (DepartmentID)</w:t>
+        <w:t xml:space="preserve">    FOREIGN KEY (</w:t>
+      </w:r>
+      <w:proofErr w:type="spellStart"/>
+      <w:r>
+        <w:rPr>
+          <w:rFonts w:ascii="Times New Roman" w:hAnsi="Times New Roman" w:cs="Times New Roman"/>
+          <w:color w:val="auto"/>
+        </w:rPr>
+        <w:t>DepartmentID</w:t>
+      </w:r>
+      <w:proofErr w:type="spellEnd"/>
+      <w:r>
+        <w:rPr>
+          <w:rFonts w:ascii="Times New Roman" w:hAnsi="Times New Roman" w:cs="Times New Roman"/>
+          <w:color w:val="auto"/>
+        </w:rPr>
+        <w:t>)</w:t>
       </w:r>
     </w:p>
     <w:p>
@@ -9535,7 +10320,23 @@
           <w:rFonts w:ascii="Times New Roman" w:hAnsi="Times New Roman" w:cs="Times New Roman"/>
           <w:color w:val="auto"/>
         </w:rPr>
-        <w:t xml:space="preserve">        REFERENCES Department(DepartmentID)</w:t>
+        <w:t xml:space="preserve">        REFERENCES Department(</w:t>
+      </w:r>
+      <w:proofErr w:type="spellStart"/>
+      <w:r>
+        <w:rPr>
+          <w:rFonts w:ascii="Times New Roman" w:hAnsi="Times New Roman" w:cs="Times New Roman"/>
+          <w:color w:val="auto"/>
+        </w:rPr>
+        <w:t>DepartmentID</w:t>
+      </w:r>
+      <w:proofErr w:type="spellEnd"/>
+      <w:r>
+        <w:rPr>
+          <w:rFonts w:ascii="Times New Roman" w:hAnsi="Times New Roman" w:cs="Times New Roman"/>
+          <w:color w:val="auto"/>
+        </w:rPr>
+        <w:t>)</w:t>
       </w:r>
     </w:p>
     <w:p>
@@ -9600,7 +10401,31 @@
           <w:sz w:val="24"/>
           <w:szCs w:val="24"/>
         </w:rPr>
-        <w:t>Create GeneralPractitioner Table</w:t>
+        <w:t xml:space="preserve">Create </w:t>
+      </w:r>
+      <w:proofErr w:type="spellStart"/>
+      <w:r>
+        <w:rPr>
+          <w:rFonts w:ascii="Times New Roman" w:hAnsi="Times New Roman" w:cs="Times New Roman"/>
+          <w:b/>
+          <w:bCs/>
+          <w:color w:val="auto"/>
+          <w:sz w:val="24"/>
+          <w:szCs w:val="24"/>
+        </w:rPr>
+        <w:t>GeneralPractitioner</w:t>
+      </w:r>
+      <w:proofErr w:type="spellEnd"/>
+      <w:r>
+        <w:rPr>
+          <w:rFonts w:ascii="Times New Roman" w:hAnsi="Times New Roman" w:cs="Times New Roman"/>
+          <w:b/>
+          <w:bCs/>
+          <w:color w:val="auto"/>
+          <w:sz w:val="24"/>
+          <w:szCs w:val="24"/>
+        </w:rPr>
+        <w:t xml:space="preserve"> Table</w:t>
       </w:r>
     </w:p>
     <w:p>
@@ -9637,7 +10462,23 @@
           <w:rFonts w:ascii="Times New Roman" w:hAnsi="Times New Roman" w:cs="Times New Roman"/>
           <w:color w:val="auto"/>
         </w:rPr>
-        <w:t>CREATE TABLE GeneralPractitioner (</w:t>
+        <w:t xml:space="preserve">CREATE TABLE </w:t>
+      </w:r>
+      <w:proofErr w:type="spellStart"/>
+      <w:r>
+        <w:rPr>
+          <w:rFonts w:ascii="Times New Roman" w:hAnsi="Times New Roman" w:cs="Times New Roman"/>
+          <w:color w:val="auto"/>
+        </w:rPr>
+        <w:t>GeneralPractitioner</w:t>
+      </w:r>
+      <w:proofErr w:type="spellEnd"/>
+      <w:r>
+        <w:rPr>
+          <w:rFonts w:ascii="Times New Roman" w:hAnsi="Times New Roman" w:cs="Times New Roman"/>
+          <w:color w:val="auto"/>
+        </w:rPr>
+        <w:t xml:space="preserve"> (</w:t>
       </w:r>
     </w:p>
     <w:p>
@@ -9658,7 +10499,23 @@
           <w:rFonts w:ascii="Times New Roman" w:hAnsi="Times New Roman" w:cs="Times New Roman"/>
           <w:color w:val="auto"/>
         </w:rPr>
-        <w:t xml:space="preserve">    DoctorID INT PRIMARY KEY,</w:t>
+        <w:t xml:space="preserve">    </w:t>
+      </w:r>
+      <w:proofErr w:type="spellStart"/>
+      <w:r>
+        <w:rPr>
+          <w:rFonts w:ascii="Times New Roman" w:hAnsi="Times New Roman" w:cs="Times New Roman"/>
+          <w:color w:val="auto"/>
+        </w:rPr>
+        <w:t>DoctorID</w:t>
+      </w:r>
+      <w:proofErr w:type="spellEnd"/>
+      <w:r>
+        <w:rPr>
+          <w:rFonts w:ascii="Times New Roman" w:hAnsi="Times New Roman" w:cs="Times New Roman"/>
+          <w:color w:val="auto"/>
+        </w:rPr>
+        <w:t xml:space="preserve"> INT PRIMARY KEY,</w:t>
       </w:r>
     </w:p>
     <w:p>
@@ -9679,7 +10536,23 @@
           <w:rFonts w:ascii="Times New Roman" w:hAnsi="Times New Roman" w:cs="Times New Roman"/>
           <w:color w:val="auto"/>
         </w:rPr>
-        <w:t xml:space="preserve">    FOREIGN KEY (DoctorID)</w:t>
+        <w:t xml:space="preserve">    FOREIGN KEY (</w:t>
+      </w:r>
+      <w:proofErr w:type="spellStart"/>
+      <w:r>
+        <w:rPr>
+          <w:rFonts w:ascii="Times New Roman" w:hAnsi="Times New Roman" w:cs="Times New Roman"/>
+          <w:color w:val="auto"/>
+        </w:rPr>
+        <w:t>DoctorID</w:t>
+      </w:r>
+      <w:proofErr w:type="spellEnd"/>
+      <w:r>
+        <w:rPr>
+          <w:rFonts w:ascii="Times New Roman" w:hAnsi="Times New Roman" w:cs="Times New Roman"/>
+          <w:color w:val="auto"/>
+        </w:rPr>
+        <w:t>)</w:t>
       </w:r>
     </w:p>
     <w:p>
@@ -9700,7 +10573,23 @@
           <w:rFonts w:ascii="Times New Roman" w:hAnsi="Times New Roman" w:cs="Times New Roman"/>
           <w:color w:val="auto"/>
         </w:rPr>
-        <w:t xml:space="preserve">        REFERENCES Doctor(DoctorID)</w:t>
+        <w:t xml:space="preserve">        REFERENCES Doctor(</w:t>
+      </w:r>
+      <w:proofErr w:type="spellStart"/>
+      <w:r>
+        <w:rPr>
+          <w:rFonts w:ascii="Times New Roman" w:hAnsi="Times New Roman" w:cs="Times New Roman"/>
+          <w:color w:val="auto"/>
+        </w:rPr>
+        <w:t>DoctorID</w:t>
+      </w:r>
+      <w:proofErr w:type="spellEnd"/>
+      <w:r>
+        <w:rPr>
+          <w:rFonts w:ascii="Times New Roman" w:hAnsi="Times New Roman" w:cs="Times New Roman"/>
+          <w:color w:val="auto"/>
+        </w:rPr>
+        <w:t>)</w:t>
       </w:r>
     </w:p>
     <w:p>
@@ -9915,7 +10804,23 @@
           <w:rFonts w:ascii="Times New Roman" w:hAnsi="Times New Roman" w:cs="Times New Roman"/>
           <w:color w:val="auto"/>
         </w:rPr>
-        <w:t xml:space="preserve">    DoctorID INT PRIMARY KEY,</w:t>
+        <w:t xml:space="preserve">    </w:t>
+      </w:r>
+      <w:proofErr w:type="spellStart"/>
+      <w:r>
+        <w:rPr>
+          <w:rFonts w:ascii="Times New Roman" w:hAnsi="Times New Roman" w:cs="Times New Roman"/>
+          <w:color w:val="auto"/>
+        </w:rPr>
+        <w:t>DoctorID</w:t>
+      </w:r>
+      <w:proofErr w:type="spellEnd"/>
+      <w:r>
+        <w:rPr>
+          <w:rFonts w:ascii="Times New Roman" w:hAnsi="Times New Roman" w:cs="Times New Roman"/>
+          <w:color w:val="auto"/>
+        </w:rPr>
+        <w:t xml:space="preserve"> INT PRIMARY KEY,</w:t>
       </w:r>
     </w:p>
     <w:p>
@@ -9957,7 +10862,23 @@
           <w:rFonts w:ascii="Times New Roman" w:hAnsi="Times New Roman" w:cs="Times New Roman"/>
           <w:color w:val="auto"/>
         </w:rPr>
-        <w:t xml:space="preserve">    FOREIGN KEY (DoctorID)</w:t>
+        <w:t xml:space="preserve">    FOREIGN KEY (</w:t>
+      </w:r>
+      <w:proofErr w:type="spellStart"/>
+      <w:r>
+        <w:rPr>
+          <w:rFonts w:ascii="Times New Roman" w:hAnsi="Times New Roman" w:cs="Times New Roman"/>
+          <w:color w:val="auto"/>
+        </w:rPr>
+        <w:t>DoctorID</w:t>
+      </w:r>
+      <w:proofErr w:type="spellEnd"/>
+      <w:r>
+        <w:rPr>
+          <w:rFonts w:ascii="Times New Roman" w:hAnsi="Times New Roman" w:cs="Times New Roman"/>
+          <w:color w:val="auto"/>
+        </w:rPr>
+        <w:t>)</w:t>
       </w:r>
     </w:p>
     <w:p>
@@ -9978,7 +10899,23 @@
           <w:rFonts w:ascii="Times New Roman" w:hAnsi="Times New Roman" w:cs="Times New Roman"/>
           <w:color w:val="auto"/>
         </w:rPr>
-        <w:t xml:space="preserve">        REFERENCES Doctor(DoctorID)</w:t>
+        <w:t xml:space="preserve">        REFERENCES Doctor(</w:t>
+      </w:r>
+      <w:proofErr w:type="spellStart"/>
+      <w:r>
+        <w:rPr>
+          <w:rFonts w:ascii="Times New Roman" w:hAnsi="Times New Roman" w:cs="Times New Roman"/>
+          <w:color w:val="auto"/>
+        </w:rPr>
+        <w:t>DoctorID</w:t>
+      </w:r>
+      <w:proofErr w:type="spellEnd"/>
+      <w:r>
+        <w:rPr>
+          <w:rFonts w:ascii="Times New Roman" w:hAnsi="Times New Roman" w:cs="Times New Roman"/>
+          <w:color w:val="auto"/>
+        </w:rPr>
+        <w:t>)</w:t>
       </w:r>
     </w:p>
     <w:p>
@@ -10100,7 +11037,23 @@
           <w:rFonts w:ascii="Times New Roman" w:hAnsi="Times New Roman" w:cs="Times New Roman"/>
           <w:color w:val="auto"/>
         </w:rPr>
-        <w:t xml:space="preserve">    AppointmentID INT PRIMARY KEY,</w:t>
+        <w:t xml:space="preserve">    </w:t>
+      </w:r>
+      <w:proofErr w:type="spellStart"/>
+      <w:r>
+        <w:rPr>
+          <w:rFonts w:ascii="Times New Roman" w:hAnsi="Times New Roman" w:cs="Times New Roman"/>
+          <w:color w:val="auto"/>
+        </w:rPr>
+        <w:t>AppointmentID</w:t>
+      </w:r>
+      <w:proofErr w:type="spellEnd"/>
+      <w:r>
+        <w:rPr>
+          <w:rFonts w:ascii="Times New Roman" w:hAnsi="Times New Roman" w:cs="Times New Roman"/>
+          <w:color w:val="auto"/>
+        </w:rPr>
+        <w:t xml:space="preserve"> INT PRIMARY KEY,</w:t>
       </w:r>
     </w:p>
     <w:p>
@@ -10121,7 +11074,23 @@
           <w:rFonts w:ascii="Times New Roman" w:hAnsi="Times New Roman" w:cs="Times New Roman"/>
           <w:color w:val="auto"/>
         </w:rPr>
-        <w:t xml:space="preserve">    AppointmentDate DATE NOT NULL,</w:t>
+        <w:t xml:space="preserve">    </w:t>
+      </w:r>
+      <w:proofErr w:type="spellStart"/>
+      <w:r>
+        <w:rPr>
+          <w:rFonts w:ascii="Times New Roman" w:hAnsi="Times New Roman" w:cs="Times New Roman"/>
+          <w:color w:val="auto"/>
+        </w:rPr>
+        <w:t>AppointmentDate</w:t>
+      </w:r>
+      <w:proofErr w:type="spellEnd"/>
+      <w:r>
+        <w:rPr>
+          <w:rFonts w:ascii="Times New Roman" w:hAnsi="Times New Roman" w:cs="Times New Roman"/>
+          <w:color w:val="auto"/>
+        </w:rPr>
+        <w:t xml:space="preserve"> DATE NOT NULL,</w:t>
       </w:r>
     </w:p>
     <w:p>
@@ -10163,7 +11132,23 @@
           <w:rFonts w:ascii="Times New Roman" w:hAnsi="Times New Roman" w:cs="Times New Roman"/>
           <w:color w:val="auto"/>
         </w:rPr>
-        <w:t xml:space="preserve">    PatientID INT NOT NULL,</w:t>
+        <w:t xml:space="preserve">    </w:t>
+      </w:r>
+      <w:proofErr w:type="spellStart"/>
+      <w:r>
+        <w:rPr>
+          <w:rFonts w:ascii="Times New Roman" w:hAnsi="Times New Roman" w:cs="Times New Roman"/>
+          <w:color w:val="auto"/>
+        </w:rPr>
+        <w:t>PatientID</w:t>
+      </w:r>
+      <w:proofErr w:type="spellEnd"/>
+      <w:r>
+        <w:rPr>
+          <w:rFonts w:ascii="Times New Roman" w:hAnsi="Times New Roman" w:cs="Times New Roman"/>
+          <w:color w:val="auto"/>
+        </w:rPr>
+        <w:t xml:space="preserve"> INT NOT NULL,</w:t>
       </w:r>
     </w:p>
     <w:p>
@@ -10184,7 +11169,23 @@
           <w:rFonts w:ascii="Times New Roman" w:hAnsi="Times New Roman" w:cs="Times New Roman"/>
           <w:color w:val="auto"/>
         </w:rPr>
-        <w:t xml:space="preserve">    DoctorID INT NOT NULL,</w:t>
+        <w:t xml:space="preserve">    </w:t>
+      </w:r>
+      <w:proofErr w:type="spellStart"/>
+      <w:r>
+        <w:rPr>
+          <w:rFonts w:ascii="Times New Roman" w:hAnsi="Times New Roman" w:cs="Times New Roman"/>
+          <w:color w:val="auto"/>
+        </w:rPr>
+        <w:t>DoctorID</w:t>
+      </w:r>
+      <w:proofErr w:type="spellEnd"/>
+      <w:r>
+        <w:rPr>
+          <w:rFonts w:ascii="Times New Roman" w:hAnsi="Times New Roman" w:cs="Times New Roman"/>
+          <w:color w:val="auto"/>
+        </w:rPr>
+        <w:t xml:space="preserve"> INT NOT NULL,</w:t>
       </w:r>
     </w:p>
     <w:p>
@@ -10205,7 +11206,23 @@
           <w:rFonts w:ascii="Times New Roman" w:hAnsi="Times New Roman" w:cs="Times New Roman"/>
           <w:color w:val="auto"/>
         </w:rPr>
-        <w:t xml:space="preserve">    FOREIGN KEY (PatientID)</w:t>
+        <w:t xml:space="preserve">    FOREIGN KEY (</w:t>
+      </w:r>
+      <w:proofErr w:type="spellStart"/>
+      <w:r>
+        <w:rPr>
+          <w:rFonts w:ascii="Times New Roman" w:hAnsi="Times New Roman" w:cs="Times New Roman"/>
+          <w:color w:val="auto"/>
+        </w:rPr>
+        <w:t>PatientID</w:t>
+      </w:r>
+      <w:proofErr w:type="spellEnd"/>
+      <w:r>
+        <w:rPr>
+          <w:rFonts w:ascii="Times New Roman" w:hAnsi="Times New Roman" w:cs="Times New Roman"/>
+          <w:color w:val="auto"/>
+        </w:rPr>
+        <w:t>)</w:t>
       </w:r>
     </w:p>
     <w:p>
@@ -10226,7 +11243,23 @@
           <w:rFonts w:ascii="Times New Roman" w:hAnsi="Times New Roman" w:cs="Times New Roman"/>
           <w:color w:val="auto"/>
         </w:rPr>
-        <w:t xml:space="preserve">        REFERENCES Patient(PatientID),</w:t>
+        <w:t xml:space="preserve">        REFERENCES Patient(</w:t>
+      </w:r>
+      <w:proofErr w:type="spellStart"/>
+      <w:r>
+        <w:rPr>
+          <w:rFonts w:ascii="Times New Roman" w:hAnsi="Times New Roman" w:cs="Times New Roman"/>
+          <w:color w:val="auto"/>
+        </w:rPr>
+        <w:t>PatientID</w:t>
+      </w:r>
+      <w:proofErr w:type="spellEnd"/>
+      <w:r>
+        <w:rPr>
+          <w:rFonts w:ascii="Times New Roman" w:hAnsi="Times New Roman" w:cs="Times New Roman"/>
+          <w:color w:val="auto"/>
+        </w:rPr>
+        <w:t>),</w:t>
       </w:r>
     </w:p>
     <w:p>
@@ -10247,7 +11280,23 @@
           <w:rFonts w:ascii="Times New Roman" w:hAnsi="Times New Roman" w:cs="Times New Roman"/>
           <w:color w:val="auto"/>
         </w:rPr>
-        <w:t xml:space="preserve">    FOREIGN KEY (DoctorID)</w:t>
+        <w:t xml:space="preserve">    FOREIGN KEY (</w:t>
+      </w:r>
+      <w:proofErr w:type="spellStart"/>
+      <w:r>
+        <w:rPr>
+          <w:rFonts w:ascii="Times New Roman" w:hAnsi="Times New Roman" w:cs="Times New Roman"/>
+          <w:color w:val="auto"/>
+        </w:rPr>
+        <w:t>DoctorID</w:t>
+      </w:r>
+      <w:proofErr w:type="spellEnd"/>
+      <w:r>
+        <w:rPr>
+          <w:rFonts w:ascii="Times New Roman" w:hAnsi="Times New Roman" w:cs="Times New Roman"/>
+          <w:color w:val="auto"/>
+        </w:rPr>
+        <w:t>)</w:t>
       </w:r>
     </w:p>
     <w:p>
@@ -10268,7 +11317,23 @@
           <w:rFonts w:ascii="Times New Roman" w:hAnsi="Times New Roman" w:cs="Times New Roman"/>
           <w:color w:val="auto"/>
         </w:rPr>
-        <w:t xml:space="preserve">        REFERENCES Doctor(DoctorID)</w:t>
+        <w:t xml:space="preserve">        REFERENCES Doctor(</w:t>
+      </w:r>
+      <w:proofErr w:type="spellStart"/>
+      <w:r>
+        <w:rPr>
+          <w:rFonts w:ascii="Times New Roman" w:hAnsi="Times New Roman" w:cs="Times New Roman"/>
+          <w:color w:val="auto"/>
+        </w:rPr>
+        <w:t>DoctorID</w:t>
+      </w:r>
+      <w:proofErr w:type="spellEnd"/>
+      <w:r>
+        <w:rPr>
+          <w:rFonts w:ascii="Times New Roman" w:hAnsi="Times New Roman" w:cs="Times New Roman"/>
+          <w:color w:val="auto"/>
+        </w:rPr>
+        <w:t>)</w:t>
       </w:r>
     </w:p>
     <w:p>
@@ -10437,7 +11502,23 @@
           <w:rFonts w:ascii="Times New Roman" w:hAnsi="Times New Roman" w:cs="Times New Roman"/>
           <w:color w:val="auto"/>
         </w:rPr>
-        <w:t xml:space="preserve">    TreatmentID INT PRIMARY KEY,</w:t>
+        <w:t xml:space="preserve">    </w:t>
+      </w:r>
+      <w:proofErr w:type="spellStart"/>
+      <w:r>
+        <w:rPr>
+          <w:rFonts w:ascii="Times New Roman" w:hAnsi="Times New Roman" w:cs="Times New Roman"/>
+          <w:color w:val="auto"/>
+        </w:rPr>
+        <w:t>TreatmentID</w:t>
+      </w:r>
+      <w:proofErr w:type="spellEnd"/>
+      <w:r>
+        <w:rPr>
+          <w:rFonts w:ascii="Times New Roman" w:hAnsi="Times New Roman" w:cs="Times New Roman"/>
+          <w:color w:val="auto"/>
+        </w:rPr>
+        <w:t xml:space="preserve"> INT PRIMARY KEY,</w:t>
       </w:r>
     </w:p>
     <w:p>
@@ -10479,7 +11560,23 @@
           <w:rFonts w:ascii="Times New Roman" w:hAnsi="Times New Roman" w:cs="Times New Roman"/>
           <w:color w:val="auto"/>
         </w:rPr>
-        <w:t xml:space="preserve">    AppointmentID INT UNIQUE,</w:t>
+        <w:t xml:space="preserve">    </w:t>
+      </w:r>
+      <w:proofErr w:type="spellStart"/>
+      <w:r>
+        <w:rPr>
+          <w:rFonts w:ascii="Times New Roman" w:hAnsi="Times New Roman" w:cs="Times New Roman"/>
+          <w:color w:val="auto"/>
+        </w:rPr>
+        <w:t>AppointmentID</w:t>
+      </w:r>
+      <w:proofErr w:type="spellEnd"/>
+      <w:r>
+        <w:rPr>
+          <w:rFonts w:ascii="Times New Roman" w:hAnsi="Times New Roman" w:cs="Times New Roman"/>
+          <w:color w:val="auto"/>
+        </w:rPr>
+        <w:t xml:space="preserve"> INT UNIQUE,</w:t>
       </w:r>
     </w:p>
     <w:p>
@@ -10500,7 +11597,23 @@
           <w:rFonts w:ascii="Times New Roman" w:hAnsi="Times New Roman" w:cs="Times New Roman"/>
           <w:color w:val="auto"/>
         </w:rPr>
-        <w:t xml:space="preserve">    FOREIGN KEY (AppointmentID)</w:t>
+        <w:t xml:space="preserve">    FOREIGN KEY (</w:t>
+      </w:r>
+      <w:proofErr w:type="spellStart"/>
+      <w:r>
+        <w:rPr>
+          <w:rFonts w:ascii="Times New Roman" w:hAnsi="Times New Roman" w:cs="Times New Roman"/>
+          <w:color w:val="auto"/>
+        </w:rPr>
+        <w:t>AppointmentID</w:t>
+      </w:r>
+      <w:proofErr w:type="spellEnd"/>
+      <w:r>
+        <w:rPr>
+          <w:rFonts w:ascii="Times New Roman" w:hAnsi="Times New Roman" w:cs="Times New Roman"/>
+          <w:color w:val="auto"/>
+        </w:rPr>
+        <w:t>)</w:t>
       </w:r>
     </w:p>
     <w:p>
@@ -10521,7 +11634,23 @@
           <w:rFonts w:ascii="Times New Roman" w:hAnsi="Times New Roman" w:cs="Times New Roman"/>
           <w:color w:val="auto"/>
         </w:rPr>
-        <w:t xml:space="preserve">        REFERENCES Appointment(AppointmentID)</w:t>
+        <w:t xml:space="preserve">        REFERENCES Appointment(</w:t>
+      </w:r>
+      <w:proofErr w:type="spellStart"/>
+      <w:r>
+        <w:rPr>
+          <w:rFonts w:ascii="Times New Roman" w:hAnsi="Times New Roman" w:cs="Times New Roman"/>
+          <w:color w:val="auto"/>
+        </w:rPr>
+        <w:t>AppointmentID</w:t>
+      </w:r>
+      <w:proofErr w:type="spellEnd"/>
+      <w:r>
+        <w:rPr>
+          <w:rFonts w:ascii="Times New Roman" w:hAnsi="Times New Roman" w:cs="Times New Roman"/>
+          <w:color w:val="auto"/>
+        </w:rPr>
+        <w:t>)</w:t>
       </w:r>
     </w:p>
     <w:p>
@@ -10640,7 +11769,23 @@
           <w:rFonts w:ascii="Times New Roman" w:hAnsi="Times New Roman" w:cs="Times New Roman"/>
           <w:color w:val="auto"/>
         </w:rPr>
-        <w:t xml:space="preserve">    PaymentID INT PRIMARY KEY,</w:t>
+        <w:t xml:space="preserve">    </w:t>
+      </w:r>
+      <w:proofErr w:type="spellStart"/>
+      <w:r>
+        <w:rPr>
+          <w:rFonts w:ascii="Times New Roman" w:hAnsi="Times New Roman" w:cs="Times New Roman"/>
+          <w:color w:val="auto"/>
+        </w:rPr>
+        <w:t>PaymentID</w:t>
+      </w:r>
+      <w:proofErr w:type="spellEnd"/>
+      <w:r>
+        <w:rPr>
+          <w:rFonts w:ascii="Times New Roman" w:hAnsi="Times New Roman" w:cs="Times New Roman"/>
+          <w:color w:val="auto"/>
+        </w:rPr>
+        <w:t xml:space="preserve"> INT PRIMARY KEY,</w:t>
       </w:r>
     </w:p>
     <w:p>
@@ -10682,7 +11827,23 @@
           <w:rFonts w:ascii="Times New Roman" w:hAnsi="Times New Roman" w:cs="Times New Roman"/>
           <w:color w:val="auto"/>
         </w:rPr>
-        <w:t xml:space="preserve">    PaymentMethod VARCHAR(20) NOT NULL,</w:t>
+        <w:t xml:space="preserve">    </w:t>
+      </w:r>
+      <w:proofErr w:type="spellStart"/>
+      <w:r>
+        <w:rPr>
+          <w:rFonts w:ascii="Times New Roman" w:hAnsi="Times New Roman" w:cs="Times New Roman"/>
+          <w:color w:val="auto"/>
+        </w:rPr>
+        <w:t>PaymentMethod</w:t>
+      </w:r>
+      <w:proofErr w:type="spellEnd"/>
+      <w:r>
+        <w:rPr>
+          <w:rFonts w:ascii="Times New Roman" w:hAnsi="Times New Roman" w:cs="Times New Roman"/>
+          <w:color w:val="auto"/>
+        </w:rPr>
+        <w:t xml:space="preserve"> VARCHAR(20) NOT NULL,</w:t>
       </w:r>
     </w:p>
     <w:p>
@@ -10703,7 +11864,23 @@
           <w:rFonts w:ascii="Times New Roman" w:hAnsi="Times New Roman" w:cs="Times New Roman"/>
           <w:color w:val="auto"/>
         </w:rPr>
-        <w:t xml:space="preserve">    AppointmentID INT UNIQUE,</w:t>
+        <w:t xml:space="preserve">    </w:t>
+      </w:r>
+      <w:proofErr w:type="spellStart"/>
+      <w:r>
+        <w:rPr>
+          <w:rFonts w:ascii="Times New Roman" w:hAnsi="Times New Roman" w:cs="Times New Roman"/>
+          <w:color w:val="auto"/>
+        </w:rPr>
+        <w:t>AppointmentID</w:t>
+      </w:r>
+      <w:proofErr w:type="spellEnd"/>
+      <w:r>
+        <w:rPr>
+          <w:rFonts w:ascii="Times New Roman" w:hAnsi="Times New Roman" w:cs="Times New Roman"/>
+          <w:color w:val="auto"/>
+        </w:rPr>
+        <w:t xml:space="preserve"> INT UNIQUE,</w:t>
       </w:r>
     </w:p>
     <w:p>
@@ -10724,7 +11901,23 @@
           <w:rFonts w:ascii="Times New Roman" w:hAnsi="Times New Roman" w:cs="Times New Roman"/>
           <w:color w:val="auto"/>
         </w:rPr>
-        <w:t xml:space="preserve">    FOREIGN KEY (AppointmentID)</w:t>
+        <w:t xml:space="preserve">    FOREIGN KEY (</w:t>
+      </w:r>
+      <w:proofErr w:type="spellStart"/>
+      <w:r>
+        <w:rPr>
+          <w:rFonts w:ascii="Times New Roman" w:hAnsi="Times New Roman" w:cs="Times New Roman"/>
+          <w:color w:val="auto"/>
+        </w:rPr>
+        <w:t>AppointmentID</w:t>
+      </w:r>
+      <w:proofErr w:type="spellEnd"/>
+      <w:r>
+        <w:rPr>
+          <w:rFonts w:ascii="Times New Roman" w:hAnsi="Times New Roman" w:cs="Times New Roman"/>
+          <w:color w:val="auto"/>
+        </w:rPr>
+        <w:t>)</w:t>
       </w:r>
     </w:p>
     <w:p>
@@ -10745,7 +11938,23 @@
           <w:rFonts w:ascii="Times New Roman" w:hAnsi="Times New Roman" w:cs="Times New Roman"/>
           <w:color w:val="auto"/>
         </w:rPr>
-        <w:t xml:space="preserve">        REFERENCES Appointment(AppointmentID)</w:t>
+        <w:t xml:space="preserve">        REFERENCES Appointment(</w:t>
+      </w:r>
+      <w:proofErr w:type="spellStart"/>
+      <w:r>
+        <w:rPr>
+          <w:rFonts w:ascii="Times New Roman" w:hAnsi="Times New Roman" w:cs="Times New Roman"/>
+          <w:color w:val="auto"/>
+        </w:rPr>
+        <w:t>AppointmentID</w:t>
+      </w:r>
+      <w:proofErr w:type="spellEnd"/>
+      <w:r>
+        <w:rPr>
+          <w:rFonts w:ascii="Times New Roman" w:hAnsi="Times New Roman" w:cs="Times New Roman"/>
+          <w:color w:val="auto"/>
+        </w:rPr>
+        <w:t>)</w:t>
       </w:r>
     </w:p>
     <w:p>
@@ -10857,6 +12066,11 @@
     <w:p>
       <w:pPr>
         <w:pStyle w:val="ListBullet"/>
+        <w:numPr>
+          <w:ilvl w:val="0"/>
+          <w:numId w:val="0"/>
+        </w:numPr>
+        <w:ind w:left="576" w:hanging="288"/>
         <w:rPr>
           <w:rFonts w:ascii="Times New Roman" w:hAnsi="Times New Roman" w:cs="Times New Roman"/>
           <w:b/>
@@ -10898,32 +12112,77 @@
     <w:p>
       <w:pPr>
         <w:pStyle w:val="ListBullet"/>
-        <w:rPr>
-          <w:rFonts w:ascii="Times New Roman" w:hAnsi="Times New Roman" w:cs="Times New Roman"/>
-          <w:color w:val="auto"/>
-          <w:sz w:val="24"/>
-          <w:szCs w:val="24"/>
-        </w:rPr>
-      </w:pPr>
-    </w:p>
-    <w:p>
-      <w:pPr>
-        <w:pStyle w:val="ListBullet"/>
-        <w:rPr>
-          <w:rFonts w:ascii="Times New Roman" w:hAnsi="Times New Roman" w:cs="Times New Roman"/>
-          <w:color w:val="auto"/>
-          <w:sz w:val="24"/>
-          <w:szCs w:val="24"/>
-        </w:rPr>
-      </w:pPr>
-      <w:r>
-        <w:rPr>
-          <w:rFonts w:ascii="Times New Roman" w:hAnsi="Times New Roman" w:cs="Times New Roman"/>
-          <w:color w:val="auto"/>
-          <w:sz w:val="24"/>
-          <w:szCs w:val="24"/>
-        </w:rPr>
-        <w:t>INSERT INTO Department (DepartmentID, DepartmentName)</w:t>
+        <w:numPr>
+          <w:ilvl w:val="0"/>
+          <w:numId w:val="0"/>
+        </w:numPr>
+        <w:ind w:left="576" w:hanging="288"/>
+        <w:rPr>
+          <w:rFonts w:ascii="Times New Roman" w:hAnsi="Times New Roman" w:cs="Times New Roman"/>
+          <w:color w:val="auto"/>
+          <w:sz w:val="24"/>
+          <w:szCs w:val="24"/>
+        </w:rPr>
+      </w:pPr>
+    </w:p>
+    <w:p>
+      <w:pPr>
+        <w:pStyle w:val="ListBullet"/>
+        <w:rPr>
+          <w:rFonts w:ascii="Times New Roman" w:hAnsi="Times New Roman" w:cs="Times New Roman"/>
+          <w:color w:val="auto"/>
+          <w:sz w:val="24"/>
+          <w:szCs w:val="24"/>
+        </w:rPr>
+      </w:pPr>
+      <w:r>
+        <w:rPr>
+          <w:rFonts w:ascii="Times New Roman" w:hAnsi="Times New Roman" w:cs="Times New Roman"/>
+          <w:color w:val="auto"/>
+          <w:sz w:val="24"/>
+          <w:szCs w:val="24"/>
+        </w:rPr>
+        <w:t>INSERT INTO Department (</w:t>
+      </w:r>
+      <w:proofErr w:type="spellStart"/>
+      <w:r>
+        <w:rPr>
+          <w:rFonts w:ascii="Times New Roman" w:hAnsi="Times New Roman" w:cs="Times New Roman"/>
+          <w:color w:val="auto"/>
+          <w:sz w:val="24"/>
+          <w:szCs w:val="24"/>
+        </w:rPr>
+        <w:t>DepartmentID</w:t>
+      </w:r>
+      <w:proofErr w:type="spellEnd"/>
+      <w:r>
+        <w:rPr>
+          <w:rFonts w:ascii="Times New Roman" w:hAnsi="Times New Roman" w:cs="Times New Roman"/>
+          <w:color w:val="auto"/>
+          <w:sz w:val="24"/>
+          <w:szCs w:val="24"/>
+        </w:rPr>
+        <w:t xml:space="preserve">, </w:t>
+      </w:r>
+      <w:proofErr w:type="spellStart"/>
+      <w:r>
+        <w:rPr>
+          <w:rFonts w:ascii="Times New Roman" w:hAnsi="Times New Roman" w:cs="Times New Roman"/>
+          <w:color w:val="auto"/>
+          <w:sz w:val="24"/>
+          <w:szCs w:val="24"/>
+        </w:rPr>
+        <w:t>DepartmentName</w:t>
+      </w:r>
+      <w:proofErr w:type="spellEnd"/>
+      <w:r>
+        <w:rPr>
+          <w:rFonts w:ascii="Times New Roman" w:hAnsi="Times New Roman" w:cs="Times New Roman"/>
+          <w:color w:val="auto"/>
+          <w:sz w:val="24"/>
+          <w:szCs w:val="24"/>
+        </w:rPr>
+        <w:t>)</w:t>
       </w:r>
     </w:p>
     <w:p>
@@ -11049,6 +12308,11 @@
     <w:p>
       <w:pPr>
         <w:pStyle w:val="ListBullet"/>
+        <w:numPr>
+          <w:ilvl w:val="0"/>
+          <w:numId w:val="0"/>
+        </w:numPr>
+        <w:ind w:left="288"/>
         <w:rPr>
           <w:rFonts w:ascii="Times New Roman" w:hAnsi="Times New Roman" w:cs="Times New Roman"/>
           <w:color w:val="auto"/>
@@ -11088,32 +12352,57 @@
     <w:p>
       <w:pPr>
         <w:pStyle w:val="ListBullet"/>
-        <w:rPr>
-          <w:rFonts w:ascii="Times New Roman" w:hAnsi="Times New Roman" w:cs="Times New Roman"/>
-          <w:color w:val="auto"/>
-          <w:sz w:val="24"/>
-          <w:szCs w:val="24"/>
-        </w:rPr>
-      </w:pPr>
-    </w:p>
-    <w:p>
-      <w:pPr>
-        <w:pStyle w:val="ListBullet"/>
-        <w:rPr>
-          <w:rFonts w:ascii="Times New Roman" w:hAnsi="Times New Roman" w:cs="Times New Roman"/>
-          <w:color w:val="auto"/>
-          <w:sz w:val="24"/>
-          <w:szCs w:val="24"/>
-        </w:rPr>
-      </w:pPr>
-      <w:r>
-        <w:rPr>
-          <w:rFonts w:ascii="Times New Roman" w:hAnsi="Times New Roman" w:cs="Times New Roman"/>
-          <w:color w:val="auto"/>
-          <w:sz w:val="24"/>
-          <w:szCs w:val="24"/>
-        </w:rPr>
-        <w:t>INSERT INTO Patient (PatientID, FirstName, LastName, Gender, Phone)</w:t>
+        <w:numPr>
+          <w:ilvl w:val="0"/>
+          <w:numId w:val="0"/>
+        </w:numPr>
+        <w:ind w:left="576" w:hanging="288"/>
+        <w:rPr>
+          <w:rFonts w:ascii="Times New Roman" w:hAnsi="Times New Roman" w:cs="Times New Roman"/>
+          <w:color w:val="auto"/>
+          <w:sz w:val="24"/>
+          <w:szCs w:val="24"/>
+        </w:rPr>
+      </w:pPr>
+    </w:p>
+    <w:p>
+      <w:pPr>
+        <w:pStyle w:val="ListBullet"/>
+        <w:rPr>
+          <w:rFonts w:ascii="Times New Roman" w:hAnsi="Times New Roman" w:cs="Times New Roman"/>
+          <w:color w:val="auto"/>
+          <w:sz w:val="24"/>
+          <w:szCs w:val="24"/>
+        </w:rPr>
+      </w:pPr>
+      <w:r>
+        <w:rPr>
+          <w:rFonts w:ascii="Times New Roman" w:hAnsi="Times New Roman" w:cs="Times New Roman"/>
+          <w:color w:val="auto"/>
+          <w:sz w:val="24"/>
+          <w:szCs w:val="24"/>
+        </w:rPr>
+        <w:t>INSERT INTO Patient (</w:t>
+      </w:r>
+      <w:proofErr w:type="spellStart"/>
+      <w:r>
+        <w:rPr>
+          <w:rFonts w:ascii="Times New Roman" w:hAnsi="Times New Roman" w:cs="Times New Roman"/>
+          <w:color w:val="auto"/>
+          <w:sz w:val="24"/>
+          <w:szCs w:val="24"/>
+        </w:rPr>
+        <w:t>PatientID</w:t>
+      </w:r>
+      <w:proofErr w:type="spellEnd"/>
+      <w:r>
+        <w:rPr>
+          <w:rFonts w:ascii="Times New Roman" w:hAnsi="Times New Roman" w:cs="Times New Roman"/>
+          <w:color w:val="auto"/>
+          <w:sz w:val="24"/>
+          <w:szCs w:val="24"/>
+        </w:rPr>
+        <w:t>, FirstName, LastName, Gender, Phone)</w:t>
       </w:r>
     </w:p>
     <w:p>
@@ -11513,7 +12802,47 @@
           <w:sz w:val="24"/>
           <w:szCs w:val="24"/>
         </w:rPr>
-        <w:t>INSERT INTO Doctor (DoctorID, FirstName, LastName, Phone, DepartmentID)</w:t>
+        <w:t>INSERT INTO Doctor (</w:t>
+      </w:r>
+      <w:proofErr w:type="spellStart"/>
+      <w:r>
+        <w:rPr>
+          <w:rFonts w:ascii="Times New Roman" w:hAnsi="Times New Roman" w:cs="Times New Roman"/>
+          <w:color w:val="auto"/>
+          <w:sz w:val="24"/>
+          <w:szCs w:val="24"/>
+        </w:rPr>
+        <w:t>DoctorID</w:t>
+      </w:r>
+      <w:proofErr w:type="spellEnd"/>
+      <w:r>
+        <w:rPr>
+          <w:rFonts w:ascii="Times New Roman" w:hAnsi="Times New Roman" w:cs="Times New Roman"/>
+          <w:color w:val="auto"/>
+          <w:sz w:val="24"/>
+          <w:szCs w:val="24"/>
+        </w:rPr>
+        <w:t xml:space="preserve">, FirstName, LastName, Phone, </w:t>
+      </w:r>
+      <w:proofErr w:type="spellStart"/>
+      <w:r>
+        <w:rPr>
+          <w:rFonts w:ascii="Times New Roman" w:hAnsi="Times New Roman" w:cs="Times New Roman"/>
+          <w:color w:val="auto"/>
+          <w:sz w:val="24"/>
+          <w:szCs w:val="24"/>
+        </w:rPr>
+        <w:t>DepartmentID</w:t>
+      </w:r>
+      <w:proofErr w:type="spellEnd"/>
+      <w:r>
+        <w:rPr>
+          <w:rFonts w:ascii="Times New Roman" w:hAnsi="Times New Roman" w:cs="Times New Roman"/>
+          <w:color w:val="auto"/>
+          <w:sz w:val="24"/>
+          <w:szCs w:val="24"/>
+        </w:rPr>
+        <w:t>)</w:t>
       </w:r>
     </w:p>
     <w:p>
@@ -11588,7 +12917,27 @@
           <w:sz w:val="24"/>
           <w:szCs w:val="24"/>
         </w:rPr>
-        <w:t>(240024427, 'Mohammed', 'Alshuaibi', '0501234561', 2),</w:t>
+        <w:t>(240024427, 'Mohammed', '</w:t>
+      </w:r>
+      <w:proofErr w:type="spellStart"/>
+      <w:r>
+        <w:rPr>
+          <w:rFonts w:ascii="Times New Roman" w:hAnsi="Times New Roman" w:cs="Times New Roman"/>
+          <w:color w:val="auto"/>
+          <w:sz w:val="24"/>
+          <w:szCs w:val="24"/>
+        </w:rPr>
+        <w:t>Alshuaibi</w:t>
+      </w:r>
+      <w:proofErr w:type="spellEnd"/>
+      <w:r>
+        <w:rPr>
+          <w:rFonts w:ascii="Times New Roman" w:hAnsi="Times New Roman" w:cs="Times New Roman"/>
+          <w:color w:val="auto"/>
+          <w:sz w:val="24"/>
+          <w:szCs w:val="24"/>
+        </w:rPr>
+        <w:t>', '0501234561', 2),</w:t>
       </w:r>
     </w:p>
     <w:p>
@@ -11613,7 +12962,27 @@
           <w:sz w:val="24"/>
           <w:szCs w:val="24"/>
         </w:rPr>
-        <w:t>(240048280, 'Rakan', 'Alqu', '0501234562', 3),</w:t>
+        <w:t>(240048280, 'Rakan', '</w:t>
+      </w:r>
+      <w:proofErr w:type="spellStart"/>
+      <w:r>
+        <w:rPr>
+          <w:rFonts w:ascii="Times New Roman" w:hAnsi="Times New Roman" w:cs="Times New Roman"/>
+          <w:color w:val="auto"/>
+          <w:sz w:val="24"/>
+          <w:szCs w:val="24"/>
+        </w:rPr>
+        <w:t>Alqu</w:t>
+      </w:r>
+      <w:proofErr w:type="spellEnd"/>
+      <w:r>
+        <w:rPr>
+          <w:rFonts w:ascii="Times New Roman" w:hAnsi="Times New Roman" w:cs="Times New Roman"/>
+          <w:color w:val="auto"/>
+          <w:sz w:val="24"/>
+          <w:szCs w:val="24"/>
+        </w:rPr>
+        <w:t>', '0501234562', 3),</w:t>
       </w:r>
     </w:p>
     <w:p>
@@ -11638,7 +13007,27 @@
           <w:sz w:val="24"/>
           <w:szCs w:val="24"/>
         </w:rPr>
-        <w:t>(210024447, 'Ahmed', 'Almuqrin', '0501234563', 4),</w:t>
+        <w:t>(210024447, 'Ahmed', '</w:t>
+      </w:r>
+      <w:proofErr w:type="spellStart"/>
+      <w:r>
+        <w:rPr>
+          <w:rFonts w:ascii="Times New Roman" w:hAnsi="Times New Roman" w:cs="Times New Roman"/>
+          <w:color w:val="auto"/>
+          <w:sz w:val="24"/>
+          <w:szCs w:val="24"/>
+        </w:rPr>
+        <w:t>Almuqrin</w:t>
+      </w:r>
+      <w:proofErr w:type="spellEnd"/>
+      <w:r>
+        <w:rPr>
+          <w:rFonts w:ascii="Times New Roman" w:hAnsi="Times New Roman" w:cs="Times New Roman"/>
+          <w:color w:val="auto"/>
+          <w:sz w:val="24"/>
+          <w:szCs w:val="24"/>
+        </w:rPr>
+        <w:t>', '0501234563', 4),</w:t>
       </w:r>
     </w:p>
     <w:p>
@@ -11748,7 +13137,47 @@
           <w:sz w:val="24"/>
           <w:szCs w:val="24"/>
         </w:rPr>
-        <w:t>INSERT INTO GeneralPractitioner (DoctorID)</w:t>
+        <w:t xml:space="preserve">INSERT INTO </w:t>
+      </w:r>
+      <w:proofErr w:type="spellStart"/>
+      <w:r>
+        <w:rPr>
+          <w:rFonts w:ascii="Times New Roman" w:hAnsi="Times New Roman" w:cs="Times New Roman"/>
+          <w:color w:val="auto"/>
+          <w:sz w:val="24"/>
+          <w:szCs w:val="24"/>
+        </w:rPr>
+        <w:t>GeneralPractitioner</w:t>
+      </w:r>
+      <w:proofErr w:type="spellEnd"/>
+      <w:r>
+        <w:rPr>
+          <w:rFonts w:ascii="Times New Roman" w:hAnsi="Times New Roman" w:cs="Times New Roman"/>
+          <w:color w:val="auto"/>
+          <w:sz w:val="24"/>
+          <w:szCs w:val="24"/>
+        </w:rPr>
+        <w:t xml:space="preserve"> (</w:t>
+      </w:r>
+      <w:proofErr w:type="spellStart"/>
+      <w:r>
+        <w:rPr>
+          <w:rFonts w:ascii="Times New Roman" w:hAnsi="Times New Roman" w:cs="Times New Roman"/>
+          <w:color w:val="auto"/>
+          <w:sz w:val="24"/>
+          <w:szCs w:val="24"/>
+        </w:rPr>
+        <w:t>DoctorID</w:t>
+      </w:r>
+      <w:proofErr w:type="spellEnd"/>
+      <w:r>
+        <w:rPr>
+          <w:rFonts w:ascii="Times New Roman" w:hAnsi="Times New Roman" w:cs="Times New Roman"/>
+          <w:color w:val="auto"/>
+          <w:sz w:val="24"/>
+          <w:szCs w:val="24"/>
+        </w:rPr>
+        <w:t>)</w:t>
       </w:r>
     </w:p>
     <w:p>
@@ -11978,7 +13407,23 @@
           <w:rFonts w:ascii="Times New Roman" w:hAnsi="Times New Roman" w:cs="Times New Roman"/>
           <w:color w:val="auto"/>
         </w:rPr>
-        <w:t>INSERT INTO Specialist (DoctorID, Specialty)</w:t>
+        <w:t>INSERT INTO Specialist (</w:t>
+      </w:r>
+      <w:proofErr w:type="spellStart"/>
+      <w:r>
+        <w:rPr>
+          <w:rFonts w:ascii="Times New Roman" w:hAnsi="Times New Roman" w:cs="Times New Roman"/>
+          <w:color w:val="auto"/>
+        </w:rPr>
+        <w:t>DoctorID</w:t>
+      </w:r>
+      <w:proofErr w:type="spellEnd"/>
+      <w:r>
+        <w:rPr>
+          <w:rFonts w:ascii="Times New Roman" w:hAnsi="Times New Roman" w:cs="Times New Roman"/>
+          <w:color w:val="auto"/>
+        </w:rPr>
+        <w:t>, Specialty)</w:t>
       </w:r>
     </w:p>
     <w:p>
@@ -12160,7 +13605,71 @@
           <w:rFonts w:ascii="Times New Roman" w:hAnsi="Times New Roman" w:cs="Times New Roman"/>
           <w:color w:val="auto"/>
         </w:rPr>
-        <w:t>(AppointmentID, AppointmentDate, Status, PatientID, DoctorID)</w:t>
+        <w:t>(</w:t>
+      </w:r>
+      <w:proofErr w:type="spellStart"/>
+      <w:r>
+        <w:rPr>
+          <w:rFonts w:ascii="Times New Roman" w:hAnsi="Times New Roman" w:cs="Times New Roman"/>
+          <w:color w:val="auto"/>
+        </w:rPr>
+        <w:t>AppointmentID</w:t>
+      </w:r>
+      <w:proofErr w:type="spellEnd"/>
+      <w:r>
+        <w:rPr>
+          <w:rFonts w:ascii="Times New Roman" w:hAnsi="Times New Roman" w:cs="Times New Roman"/>
+          <w:color w:val="auto"/>
+        </w:rPr>
+        <w:t xml:space="preserve">, </w:t>
+      </w:r>
+      <w:proofErr w:type="spellStart"/>
+      <w:r>
+        <w:rPr>
+          <w:rFonts w:ascii="Times New Roman" w:hAnsi="Times New Roman" w:cs="Times New Roman"/>
+          <w:color w:val="auto"/>
+        </w:rPr>
+        <w:t>AppointmentDate</w:t>
+      </w:r>
+      <w:proofErr w:type="spellEnd"/>
+      <w:r>
+        <w:rPr>
+          <w:rFonts w:ascii="Times New Roman" w:hAnsi="Times New Roman" w:cs="Times New Roman"/>
+          <w:color w:val="auto"/>
+        </w:rPr>
+        <w:t xml:space="preserve">, Status, </w:t>
+      </w:r>
+      <w:proofErr w:type="spellStart"/>
+      <w:r>
+        <w:rPr>
+          <w:rFonts w:ascii="Times New Roman" w:hAnsi="Times New Roman" w:cs="Times New Roman"/>
+          <w:color w:val="auto"/>
+        </w:rPr>
+        <w:t>PatientID</w:t>
+      </w:r>
+      <w:proofErr w:type="spellEnd"/>
+      <w:r>
+        <w:rPr>
+          <w:rFonts w:ascii="Times New Roman" w:hAnsi="Times New Roman" w:cs="Times New Roman"/>
+          <w:color w:val="auto"/>
+        </w:rPr>
+        <w:t xml:space="preserve">, </w:t>
+      </w:r>
+      <w:proofErr w:type="spellStart"/>
+      <w:r>
+        <w:rPr>
+          <w:rFonts w:ascii="Times New Roman" w:hAnsi="Times New Roman" w:cs="Times New Roman"/>
+          <w:color w:val="auto"/>
+        </w:rPr>
+        <w:t>DoctorID</w:t>
+      </w:r>
+      <w:proofErr w:type="spellEnd"/>
+      <w:r>
+        <w:rPr>
+          <w:rFonts w:ascii="Times New Roman" w:hAnsi="Times New Roman" w:cs="Times New Roman"/>
+          <w:color w:val="auto"/>
+        </w:rPr>
+        <w:t>)</w:t>
       </w:r>
     </w:p>
     <w:p>
@@ -12314,6 +13823,7 @@
         <w:rPr>
           <w:rFonts w:ascii="Times New Roman" w:hAnsi="Times New Roman" w:cs="Times New Roman"/>
           <w:color w:val="auto"/>
+          <w:rtl/>
         </w:rPr>
       </w:pPr>
       <w:r>
@@ -12366,14 +13876,587 @@
           <w:ilvl w:val="0"/>
           <w:numId w:val="0"/>
         </w:numPr>
-        <w:ind w:left="576"/>
-        <w:rPr>
-          <w:rFonts w:ascii="Times New Roman" w:hAnsi="Times New Roman" w:cs="Times New Roman"/>
-          <w:color w:val="auto"/>
-          <w:sz w:val="24"/>
-          <w:szCs w:val="24"/>
-        </w:rPr>
-      </w:pPr>
+        <w:ind w:left="288"/>
+        <w:rPr>
+          <w:rFonts w:ascii="Times New Roman" w:hAnsi="Times New Roman" w:cs="Times New Roman"/>
+          <w:color w:val="auto"/>
+        </w:rPr>
+      </w:pPr>
+    </w:p>
+    <w:p>
+      <w:pPr>
+        <w:pStyle w:val="ListBullet"/>
+        <w:numPr>
+          <w:ilvl w:val="0"/>
+          <w:numId w:val="42"/>
+        </w:numPr>
+        <w:rPr>
+          <w:rFonts w:ascii="Times New Roman" w:hAnsi="Times New Roman" w:cs="Times New Roman"/>
+          <w:b/>
+          <w:bCs/>
+          <w:color w:val="auto"/>
+          <w:sz w:val="24"/>
+          <w:szCs w:val="24"/>
+        </w:rPr>
+      </w:pPr>
+      <w:r>
+        <w:rPr>
+          <w:rFonts w:ascii="Times New Roman" w:hAnsi="Times New Roman" w:cs="Times New Roman"/>
+          <w:b/>
+          <w:bCs/>
+          <w:color w:val="auto"/>
+          <w:sz w:val="24"/>
+          <w:szCs w:val="24"/>
+        </w:rPr>
+        <w:lastRenderedPageBreak/>
+        <w:t>Treatment</w:t>
+      </w:r>
+    </w:p>
+    <w:p>
+      <w:pPr>
+        <w:pStyle w:val="ListBullet"/>
+        <w:numPr>
+          <w:ilvl w:val="0"/>
+          <w:numId w:val="0"/>
+        </w:numPr>
+        <w:ind w:left="288"/>
+        <w:rPr>
+          <w:rFonts w:ascii="Times New Roman" w:hAnsi="Times New Roman" w:cs="Times New Roman"/>
+          <w:color w:val="auto"/>
+        </w:rPr>
+      </w:pPr>
+    </w:p>
+    <w:p>
+      <w:pPr>
+        <w:pStyle w:val="ListBullet"/>
+        <w:numPr>
+          <w:ilvl w:val="0"/>
+          <w:numId w:val="0"/>
+        </w:numPr>
+        <w:ind w:left="288"/>
+        <w:rPr>
+          <w:rFonts w:ascii="Times New Roman" w:hAnsi="Times New Roman" w:cs="Times New Roman"/>
+          <w:color w:val="auto"/>
+        </w:rPr>
+      </w:pPr>
+      <w:r>
+        <w:rPr>
+          <w:rFonts w:ascii="Times New Roman" w:hAnsi="Times New Roman" w:cs="Times New Roman"/>
+          <w:color w:val="auto"/>
+        </w:rPr>
+        <w:t>INSERT INTO Treatment</w:t>
+      </w:r>
+    </w:p>
+    <w:p>
+      <w:pPr>
+        <w:pStyle w:val="ListBullet"/>
+        <w:numPr>
+          <w:ilvl w:val="0"/>
+          <w:numId w:val="0"/>
+        </w:numPr>
+        <w:ind w:left="288"/>
+        <w:rPr>
+          <w:rFonts w:ascii="Times New Roman" w:hAnsi="Times New Roman" w:cs="Times New Roman"/>
+          <w:color w:val="auto"/>
+        </w:rPr>
+      </w:pPr>
+      <w:r>
+        <w:rPr>
+          <w:rFonts w:ascii="Times New Roman" w:hAnsi="Times New Roman" w:cs="Times New Roman"/>
+          <w:color w:val="auto"/>
+        </w:rPr>
+        <w:t>(</w:t>
+      </w:r>
+      <w:proofErr w:type="spellStart"/>
+      <w:r>
+        <w:rPr>
+          <w:rFonts w:ascii="Times New Roman" w:hAnsi="Times New Roman" w:cs="Times New Roman"/>
+          <w:color w:val="auto"/>
+        </w:rPr>
+        <w:t>TreatmentID</w:t>
+      </w:r>
+      <w:proofErr w:type="spellEnd"/>
+      <w:r>
+        <w:rPr>
+          <w:rFonts w:ascii="Times New Roman" w:hAnsi="Times New Roman" w:cs="Times New Roman"/>
+          <w:color w:val="auto"/>
+        </w:rPr>
+        <w:t xml:space="preserve">, Diagnosis, </w:t>
+      </w:r>
+      <w:proofErr w:type="spellStart"/>
+      <w:r>
+        <w:rPr>
+          <w:rFonts w:ascii="Times New Roman" w:hAnsi="Times New Roman" w:cs="Times New Roman"/>
+          <w:color w:val="auto"/>
+        </w:rPr>
+        <w:t>AppointmentID</w:t>
+      </w:r>
+      <w:proofErr w:type="spellEnd"/>
+      <w:r>
+        <w:rPr>
+          <w:rFonts w:ascii="Times New Roman" w:hAnsi="Times New Roman" w:cs="Times New Roman"/>
+          <w:color w:val="auto"/>
+        </w:rPr>
+        <w:t>)</w:t>
+      </w:r>
+    </w:p>
+    <w:p>
+      <w:pPr>
+        <w:pStyle w:val="ListBullet"/>
+        <w:numPr>
+          <w:ilvl w:val="0"/>
+          <w:numId w:val="0"/>
+        </w:numPr>
+        <w:ind w:left="288"/>
+        <w:rPr>
+          <w:rFonts w:ascii="Times New Roman" w:hAnsi="Times New Roman" w:cs="Times New Roman"/>
+          <w:color w:val="auto"/>
+        </w:rPr>
+      </w:pPr>
+      <w:r>
+        <w:rPr>
+          <w:rFonts w:ascii="Times New Roman" w:hAnsi="Times New Roman" w:cs="Times New Roman"/>
+          <w:color w:val="auto"/>
+        </w:rPr>
+        <w:t>VALUES</w:t>
+      </w:r>
+    </w:p>
+    <w:p>
+      <w:pPr>
+        <w:pStyle w:val="ListBullet"/>
+        <w:numPr>
+          <w:ilvl w:val="0"/>
+          <w:numId w:val="0"/>
+        </w:numPr>
+        <w:ind w:left="288"/>
+        <w:rPr>
+          <w:rFonts w:ascii="Times New Roman" w:hAnsi="Times New Roman" w:cs="Times New Roman"/>
+          <w:color w:val="auto"/>
+        </w:rPr>
+      </w:pPr>
+      <w:r>
+        <w:rPr>
+          <w:rFonts w:ascii="Times New Roman" w:hAnsi="Times New Roman" w:cs="Times New Roman"/>
+          <w:color w:val="auto"/>
+        </w:rPr>
+        <w:t>(40001, 'Migraine', 30001),</w:t>
+      </w:r>
+    </w:p>
+    <w:p>
+      <w:pPr>
+        <w:pStyle w:val="ListBullet"/>
+        <w:numPr>
+          <w:ilvl w:val="0"/>
+          <w:numId w:val="0"/>
+        </w:numPr>
+        <w:ind w:left="288"/>
+        <w:rPr>
+          <w:rFonts w:ascii="Times New Roman" w:hAnsi="Times New Roman" w:cs="Times New Roman"/>
+          <w:color w:val="auto"/>
+        </w:rPr>
+      </w:pPr>
+      <w:r>
+        <w:rPr>
+          <w:rFonts w:ascii="Times New Roman" w:hAnsi="Times New Roman" w:cs="Times New Roman"/>
+          <w:color w:val="auto"/>
+        </w:rPr>
+        <w:t>(40002, 'Hypertension', 30002),</w:t>
+      </w:r>
+    </w:p>
+    <w:p>
+      <w:pPr>
+        <w:pStyle w:val="ListBullet"/>
+        <w:numPr>
+          <w:ilvl w:val="0"/>
+          <w:numId w:val="0"/>
+        </w:numPr>
+        <w:ind w:left="288"/>
+        <w:rPr>
+          <w:rFonts w:ascii="Times New Roman" w:hAnsi="Times New Roman" w:cs="Times New Roman"/>
+          <w:color w:val="auto"/>
+        </w:rPr>
+      </w:pPr>
+      <w:r>
+        <w:rPr>
+          <w:rFonts w:ascii="Times New Roman" w:hAnsi="Times New Roman" w:cs="Times New Roman"/>
+          <w:color w:val="auto"/>
+        </w:rPr>
+        <w:t>(40003, 'Eczema', 30003),</w:t>
+      </w:r>
+    </w:p>
+    <w:p>
+      <w:pPr>
+        <w:pStyle w:val="ListBullet"/>
+        <w:numPr>
+          <w:ilvl w:val="0"/>
+          <w:numId w:val="0"/>
+        </w:numPr>
+        <w:ind w:left="288"/>
+        <w:rPr>
+          <w:rFonts w:ascii="Times New Roman" w:hAnsi="Times New Roman" w:cs="Times New Roman"/>
+          <w:color w:val="auto"/>
+        </w:rPr>
+      </w:pPr>
+      <w:r>
+        <w:rPr>
+          <w:rFonts w:ascii="Times New Roman" w:hAnsi="Times New Roman" w:cs="Times New Roman"/>
+          <w:color w:val="auto"/>
+        </w:rPr>
+        <w:t>(40004, 'Viral Infection', 30004),</w:t>
+      </w:r>
+    </w:p>
+    <w:p>
+      <w:pPr>
+        <w:pStyle w:val="ListBullet"/>
+        <w:numPr>
+          <w:ilvl w:val="0"/>
+          <w:numId w:val="0"/>
+        </w:numPr>
+        <w:ind w:left="288"/>
+        <w:rPr>
+          <w:rFonts w:ascii="Times New Roman" w:hAnsi="Times New Roman" w:cs="Times New Roman"/>
+          <w:color w:val="auto"/>
+        </w:rPr>
+      </w:pPr>
+      <w:r>
+        <w:rPr>
+          <w:rFonts w:ascii="Times New Roman" w:hAnsi="Times New Roman" w:cs="Times New Roman"/>
+          <w:color w:val="auto"/>
+        </w:rPr>
+        <w:t>(40005, 'Lower Back Pain', 30005);</w:t>
+      </w:r>
+    </w:p>
+    <w:p>
+      <w:pPr>
+        <w:pStyle w:val="ListBullet"/>
+        <w:numPr>
+          <w:ilvl w:val="0"/>
+          <w:numId w:val="0"/>
+        </w:numPr>
+        <w:ind w:left="288"/>
+        <w:rPr>
+          <w:rFonts w:ascii="Times New Roman" w:hAnsi="Times New Roman" w:cs="Times New Roman"/>
+          <w:color w:val="auto"/>
+          <w:rtl/>
+        </w:rPr>
+      </w:pPr>
+    </w:p>
+    <w:p>
+      <w:pPr>
+        <w:pStyle w:val="ListBullet"/>
+        <w:numPr>
+          <w:ilvl w:val="0"/>
+          <w:numId w:val="42"/>
+        </w:numPr>
+        <w:rPr>
+          <w:rFonts w:ascii="Times New Roman" w:hAnsi="Times New Roman" w:cs="Times New Roman"/>
+          <w:b/>
+          <w:bCs/>
+          <w:color w:val="auto"/>
+          <w:sz w:val="24"/>
+          <w:szCs w:val="24"/>
+        </w:rPr>
+      </w:pPr>
+      <w:r>
+        <w:rPr>
+          <w:rFonts w:ascii="Times New Roman" w:hAnsi="Times New Roman" w:cs="Times New Roman"/>
+          <w:b/>
+          <w:bCs/>
+          <w:color w:val="auto"/>
+          <w:sz w:val="24"/>
+          <w:szCs w:val="24"/>
+        </w:rPr>
+        <w:t>Payment</w:t>
+      </w:r>
+    </w:p>
+    <w:p>
+      <w:pPr>
+        <w:pStyle w:val="ListBullet"/>
+        <w:numPr>
+          <w:ilvl w:val="0"/>
+          <w:numId w:val="0"/>
+        </w:numPr>
+        <w:rPr>
+          <w:rFonts w:ascii="Times New Roman" w:hAnsi="Times New Roman" w:cs="Times New Roman"/>
+          <w:color w:val="auto"/>
+        </w:rPr>
+      </w:pPr>
+    </w:p>
+    <w:p>
+      <w:pPr>
+        <w:pStyle w:val="ListBullet"/>
+        <w:numPr>
+          <w:ilvl w:val="0"/>
+          <w:numId w:val="0"/>
+        </w:numPr>
+        <w:ind w:left="288"/>
+        <w:rPr>
+          <w:rFonts w:ascii="Times New Roman" w:hAnsi="Times New Roman" w:cs="Times New Roman"/>
+          <w:color w:val="auto"/>
+        </w:rPr>
+      </w:pPr>
+      <w:r>
+        <w:rPr>
+          <w:rFonts w:ascii="Times New Roman" w:hAnsi="Times New Roman" w:cs="Times New Roman"/>
+          <w:color w:val="auto"/>
+        </w:rPr>
+        <w:t>INSERT INTO Payment</w:t>
+      </w:r>
+    </w:p>
+    <w:p>
+      <w:pPr>
+        <w:pStyle w:val="ListBullet"/>
+        <w:numPr>
+          <w:ilvl w:val="0"/>
+          <w:numId w:val="0"/>
+        </w:numPr>
+        <w:ind w:left="288"/>
+        <w:rPr>
+          <w:rFonts w:ascii="Times New Roman" w:hAnsi="Times New Roman" w:cs="Times New Roman"/>
+          <w:color w:val="auto"/>
+        </w:rPr>
+      </w:pPr>
+      <w:r>
+        <w:rPr>
+          <w:rFonts w:ascii="Times New Roman" w:hAnsi="Times New Roman" w:cs="Times New Roman"/>
+          <w:color w:val="auto"/>
+        </w:rPr>
+        <w:t>(</w:t>
+      </w:r>
+      <w:proofErr w:type="spellStart"/>
+      <w:r>
+        <w:rPr>
+          <w:rFonts w:ascii="Times New Roman" w:hAnsi="Times New Roman" w:cs="Times New Roman"/>
+          <w:color w:val="auto"/>
+        </w:rPr>
+        <w:t>PaymentID</w:t>
+      </w:r>
+      <w:proofErr w:type="spellEnd"/>
+      <w:r>
+        <w:rPr>
+          <w:rFonts w:ascii="Times New Roman" w:hAnsi="Times New Roman" w:cs="Times New Roman"/>
+          <w:color w:val="auto"/>
+        </w:rPr>
+        <w:t xml:space="preserve">, Amount, </w:t>
+      </w:r>
+      <w:proofErr w:type="spellStart"/>
+      <w:r>
+        <w:rPr>
+          <w:rFonts w:ascii="Times New Roman" w:hAnsi="Times New Roman" w:cs="Times New Roman"/>
+          <w:color w:val="auto"/>
+        </w:rPr>
+        <w:t>PaymentMethod</w:t>
+      </w:r>
+      <w:proofErr w:type="spellEnd"/>
+      <w:r>
+        <w:rPr>
+          <w:rFonts w:ascii="Times New Roman" w:hAnsi="Times New Roman" w:cs="Times New Roman"/>
+          <w:color w:val="auto"/>
+        </w:rPr>
+        <w:t xml:space="preserve">, </w:t>
+      </w:r>
+      <w:proofErr w:type="spellStart"/>
+      <w:r>
+        <w:rPr>
+          <w:rFonts w:ascii="Times New Roman" w:hAnsi="Times New Roman" w:cs="Times New Roman"/>
+          <w:color w:val="auto"/>
+        </w:rPr>
+        <w:t>AppointmentID</w:t>
+      </w:r>
+      <w:proofErr w:type="spellEnd"/>
+      <w:r>
+        <w:rPr>
+          <w:rFonts w:ascii="Times New Roman" w:hAnsi="Times New Roman" w:cs="Times New Roman"/>
+          <w:color w:val="auto"/>
+        </w:rPr>
+        <w:t>)</w:t>
+      </w:r>
+    </w:p>
+    <w:p>
+      <w:pPr>
+        <w:pStyle w:val="ListBullet"/>
+        <w:numPr>
+          <w:ilvl w:val="0"/>
+          <w:numId w:val="0"/>
+        </w:numPr>
+        <w:ind w:left="288"/>
+        <w:rPr>
+          <w:rFonts w:ascii="Times New Roman" w:hAnsi="Times New Roman" w:cs="Times New Roman"/>
+          <w:color w:val="auto"/>
+        </w:rPr>
+      </w:pPr>
+      <w:r>
+        <w:rPr>
+          <w:rFonts w:ascii="Times New Roman" w:hAnsi="Times New Roman" w:cs="Times New Roman"/>
+          <w:color w:val="auto"/>
+        </w:rPr>
+        <w:t>VALUES</w:t>
+      </w:r>
+    </w:p>
+    <w:p>
+      <w:pPr>
+        <w:pStyle w:val="ListBullet"/>
+        <w:numPr>
+          <w:ilvl w:val="0"/>
+          <w:numId w:val="0"/>
+        </w:numPr>
+        <w:ind w:left="288"/>
+        <w:rPr>
+          <w:rFonts w:ascii="Times New Roman" w:hAnsi="Times New Roman" w:cs="Times New Roman"/>
+          <w:color w:val="auto"/>
+        </w:rPr>
+      </w:pPr>
+      <w:r>
+        <w:rPr>
+          <w:rFonts w:ascii="Times New Roman" w:hAnsi="Times New Roman" w:cs="Times New Roman"/>
+          <w:color w:val="auto"/>
+        </w:rPr>
+        <w:t>(50001, 125.00, 'Cash', 30001),</w:t>
+      </w:r>
+    </w:p>
+    <w:p>
+      <w:pPr>
+        <w:pStyle w:val="ListBullet"/>
+        <w:numPr>
+          <w:ilvl w:val="0"/>
+          <w:numId w:val="0"/>
+        </w:numPr>
+        <w:ind w:left="288"/>
+        <w:rPr>
+          <w:rFonts w:ascii="Times New Roman" w:hAnsi="Times New Roman" w:cs="Times New Roman"/>
+          <w:color w:val="auto"/>
+        </w:rPr>
+      </w:pPr>
+      <w:r>
+        <w:rPr>
+          <w:rFonts w:ascii="Times New Roman" w:hAnsi="Times New Roman" w:cs="Times New Roman"/>
+          <w:color w:val="auto"/>
+        </w:rPr>
+        <w:t>(50002, 275.00, 'Card', 30002),</w:t>
+      </w:r>
+    </w:p>
+    <w:p>
+      <w:pPr>
+        <w:pStyle w:val="ListBullet"/>
+        <w:numPr>
+          <w:ilvl w:val="0"/>
+          <w:numId w:val="0"/>
+        </w:numPr>
+        <w:ind w:left="288"/>
+        <w:rPr>
+          <w:rFonts w:ascii="Times New Roman" w:hAnsi="Times New Roman" w:cs="Times New Roman"/>
+          <w:color w:val="auto"/>
+        </w:rPr>
+      </w:pPr>
+      <w:r>
+        <w:rPr>
+          <w:rFonts w:ascii="Times New Roman" w:hAnsi="Times New Roman" w:cs="Times New Roman"/>
+          <w:color w:val="auto"/>
+        </w:rPr>
+        <w:t>(50003, 430.00, 'Online', 30003),</w:t>
+      </w:r>
+    </w:p>
+    <w:p>
+      <w:pPr>
+        <w:pStyle w:val="ListBullet"/>
+        <w:numPr>
+          <w:ilvl w:val="0"/>
+          <w:numId w:val="0"/>
+        </w:numPr>
+        <w:ind w:left="288"/>
+        <w:rPr>
+          <w:rFonts w:ascii="Times New Roman" w:hAnsi="Times New Roman" w:cs="Times New Roman"/>
+          <w:color w:val="auto"/>
+        </w:rPr>
+      </w:pPr>
+      <w:r>
+        <w:rPr>
+          <w:rFonts w:ascii="Times New Roman" w:hAnsi="Times New Roman" w:cs="Times New Roman"/>
+          <w:color w:val="auto"/>
+        </w:rPr>
+        <w:t>(50004, 180.00, 'Cash', 30004),</w:t>
+      </w:r>
+    </w:p>
+    <w:p>
+      <w:pPr>
+        <w:pStyle w:val="ListBullet"/>
+        <w:numPr>
+          <w:ilvl w:val="0"/>
+          <w:numId w:val="0"/>
+        </w:numPr>
+        <w:ind w:left="288"/>
+        <w:rPr>
+          <w:rFonts w:ascii="Times New Roman" w:hAnsi="Times New Roman" w:cs="Times New Roman"/>
+          <w:color w:val="auto"/>
+        </w:rPr>
+      </w:pPr>
+      <w:r>
+        <w:rPr>
+          <w:rFonts w:ascii="Times New Roman" w:hAnsi="Times New Roman" w:cs="Times New Roman"/>
+          <w:color w:val="auto"/>
+        </w:rPr>
+        <w:t>(50005, 320.00, 'Card', 30005);</w:t>
+      </w:r>
+    </w:p>
+    <w:p>
+      <w:pPr>
+        <w:pStyle w:val="ListBullet"/>
+        <w:numPr>
+          <w:ilvl w:val="0"/>
+          <w:numId w:val="0"/>
+        </w:numPr>
+        <w:ind w:left="288"/>
+        <w:rPr>
+          <w:rFonts w:ascii="Times New Roman" w:hAnsi="Times New Roman" w:cs="Times New Roman"/>
+          <w:color w:val="auto"/>
+          <w:sz w:val="24"/>
+          <w:szCs w:val="24"/>
+        </w:rPr>
+      </w:pPr>
+      <w:r>
+        <w:rPr>
+          <w:rFonts w:ascii="Times New Roman" w:hAnsi="Times New Roman" w:cs="Times New Roman"/>
+          <w:noProof/>
+          <w:color w:val="auto"/>
+          <w:sz w:val="22"/>
+          <w:szCs w:val="22"/>
+        </w:rPr>
+        <w:drawing>
+          <wp:inline distT="0" distB="0" distL="0" distR="0" wp14:anchorId="1DB39B15" wp14:editId="0E51379E">
+            <wp:extent cx="5057775" cy="3083057"/>
+            <wp:effectExtent l="0" t="0" r="0" b="3175"/>
+            <wp:docPr id="643150456" name="Picture 1"/>
+            <wp:cNvGraphicFramePr>
+              <a:graphicFrameLocks xmlns:a="http://schemas.openxmlformats.org/drawingml/2006/main" noChangeAspect="1"/>
+            </wp:cNvGraphicFramePr>
+            <a:graphic xmlns:a="http://schemas.openxmlformats.org/drawingml/2006/main">
+              <a:graphicData uri="http://schemas.openxmlformats.org/drawingml/2006/picture">
+                <pic:pic xmlns:pic="http://schemas.openxmlformats.org/drawingml/2006/picture">
+                  <pic:nvPicPr>
+                    <pic:cNvPr id="643150456" name=""/>
+                    <pic:cNvPicPr/>
+                  </pic:nvPicPr>
+                  <pic:blipFill>
+                    <a:blip r:embed="rId24"/>
+                    <a:stretch>
+                      <a:fillRect/>
+                    </a:stretch>
+                  </pic:blipFill>
+                  <pic:spPr>
+                    <a:xfrm>
+                      <a:off x="0" y="0"/>
+                      <a:ext cx="5061806" cy="3085514"/>
+                    </a:xfrm>
+                    <a:prstGeom prst="rect">
+                      <a:avLst/>
+                    </a:prstGeom>
+                  </pic:spPr>
+                </pic:pic>
+              </a:graphicData>
+            </a:graphic>
+          </wp:inline>
+        </w:drawing>
+      </w:r>
     </w:p>
     <w:p>
       <w:pPr>
@@ -12832,30 +14915,9 @@
           <w:sz w:val="24"/>
           <w:szCs w:val="24"/>
         </w:rPr>
-        <w:t>SQL Script (.sql)</w:t>
-      </w:r>
-      <w:r>
-        <w:rPr>
-          <w:rFonts w:ascii="Times New Roman" w:hAnsi="Times New Roman" w:cs="Times New Roman"/>
-          <w:sz w:val="24"/>
-          <w:szCs w:val="24"/>
-        </w:rPr>
-        <w:t xml:space="preserve"> – Complete SQL implementation of the project. </w:t>
-      </w:r>
-    </w:p>
-    <w:p>
-      <w:pPr>
-        <w:numPr>
-          <w:ilvl w:val="0"/>
-          <w:numId w:val="22"/>
-        </w:numPr>
-        <w:spacing w:after="200" w:line="276" w:lineRule="auto"/>
-        <w:rPr>
-          <w:rFonts w:ascii="Times New Roman" w:hAnsi="Times New Roman" w:cs="Times New Roman"/>
-          <w:sz w:val="24"/>
-          <w:szCs w:val="24"/>
-        </w:rPr>
-      </w:pPr>
+        <w:t>SQL Script (.</w:t>
+      </w:r>
+      <w:proofErr w:type="spellStart"/>
       <w:r>
         <w:rPr>
           <w:rFonts w:ascii="Times New Roman" w:hAnsi="Times New Roman" w:cs="Times New Roman"/>
@@ -12864,30 +14926,9 @@
           <w:sz w:val="24"/>
           <w:szCs w:val="24"/>
         </w:rPr>
-        <w:t>GitHub Repository</w:t>
-      </w:r>
-      <w:r>
-        <w:rPr>
-          <w:rFonts w:ascii="Times New Roman" w:hAnsi="Times New Roman" w:cs="Times New Roman"/>
-          <w:sz w:val="24"/>
-          <w:szCs w:val="24"/>
-        </w:rPr>
-        <w:t xml:space="preserve"> – Repository link with the complete project and commit history. </w:t>
-      </w:r>
-    </w:p>
-    <w:p>
-      <w:pPr>
-        <w:numPr>
-          <w:ilvl w:val="0"/>
-          <w:numId w:val="22"/>
-        </w:numPr>
-        <w:spacing w:after="200" w:line="276" w:lineRule="auto"/>
-        <w:rPr>
-          <w:rFonts w:ascii="Times New Roman" w:hAnsi="Times New Roman" w:cs="Times New Roman"/>
-          <w:sz w:val="24"/>
-          <w:szCs w:val="24"/>
-        </w:rPr>
-      </w:pPr>
+        <w:t>sql</w:t>
+      </w:r>
+      <w:proofErr w:type="spellEnd"/>
       <w:r>
         <w:rPr>
           <w:rFonts w:ascii="Times New Roman" w:hAnsi="Times New Roman" w:cs="Times New Roman"/>
@@ -12896,15 +14937,15 @@
           <w:sz w:val="24"/>
           <w:szCs w:val="24"/>
         </w:rPr>
-        <w:t>Mid-Project Progress Report</w:t>
-      </w:r>
-      <w:r>
-        <w:rPr>
-          <w:rFonts w:ascii="Times New Roman" w:hAnsi="Times New Roman" w:cs="Times New Roman"/>
-          <w:sz w:val="24"/>
-          <w:szCs w:val="24"/>
-        </w:rPr>
-        <w:t xml:space="preserve"> – Summary of progress, challenges, decisions, and team contributions. </w:t>
+        <w:t>)</w:t>
+      </w:r>
+      <w:r>
+        <w:rPr>
+          <w:rFonts w:ascii="Times New Roman" w:hAnsi="Times New Roman" w:cs="Times New Roman"/>
+          <w:sz w:val="24"/>
+          <w:szCs w:val="24"/>
+        </w:rPr>
+        <w:t xml:space="preserve"> – Complete SQL implementation of the project. </w:t>
       </w:r>
     </w:p>
     <w:p>
@@ -12928,6 +14969,70 @@
           <w:sz w:val="24"/>
           <w:szCs w:val="24"/>
         </w:rPr>
+        <w:t>GitHub Repository</w:t>
+      </w:r>
+      <w:r>
+        <w:rPr>
+          <w:rFonts w:ascii="Times New Roman" w:hAnsi="Times New Roman" w:cs="Times New Roman"/>
+          <w:sz w:val="24"/>
+          <w:szCs w:val="24"/>
+        </w:rPr>
+        <w:t xml:space="preserve"> – Repository link with the complete project and commit history. </w:t>
+      </w:r>
+    </w:p>
+    <w:p>
+      <w:pPr>
+        <w:numPr>
+          <w:ilvl w:val="0"/>
+          <w:numId w:val="22"/>
+        </w:numPr>
+        <w:spacing w:after="200" w:line="276" w:lineRule="auto"/>
+        <w:rPr>
+          <w:rFonts w:ascii="Times New Roman" w:hAnsi="Times New Roman" w:cs="Times New Roman"/>
+          <w:sz w:val="24"/>
+          <w:szCs w:val="24"/>
+        </w:rPr>
+      </w:pPr>
+      <w:r>
+        <w:rPr>
+          <w:rFonts w:ascii="Times New Roman" w:hAnsi="Times New Roman" w:cs="Times New Roman"/>
+          <w:b/>
+          <w:bCs/>
+          <w:sz w:val="24"/>
+          <w:szCs w:val="24"/>
+        </w:rPr>
+        <w:t>Mid-Project Progress Report</w:t>
+      </w:r>
+      <w:r>
+        <w:rPr>
+          <w:rFonts w:ascii="Times New Roman" w:hAnsi="Times New Roman" w:cs="Times New Roman"/>
+          <w:sz w:val="24"/>
+          <w:szCs w:val="24"/>
+        </w:rPr>
+        <w:t xml:space="preserve"> – Summary of progress, challenges, decisions, and team contributions. </w:t>
+      </w:r>
+    </w:p>
+    <w:p>
+      <w:pPr>
+        <w:numPr>
+          <w:ilvl w:val="0"/>
+          <w:numId w:val="22"/>
+        </w:numPr>
+        <w:spacing w:after="200" w:line="276" w:lineRule="auto"/>
+        <w:rPr>
+          <w:rFonts w:ascii="Times New Roman" w:hAnsi="Times New Roman" w:cs="Times New Roman"/>
+          <w:sz w:val="24"/>
+          <w:szCs w:val="24"/>
+        </w:rPr>
+      </w:pPr>
+      <w:r>
+        <w:rPr>
+          <w:rFonts w:ascii="Times New Roman" w:hAnsi="Times New Roman" w:cs="Times New Roman"/>
+          <w:b/>
+          <w:bCs/>
+          <w:sz w:val="24"/>
+          <w:szCs w:val="24"/>
+        </w:rPr>
         <w:t>Project Artifacts</w:t>
       </w:r>
       <w:r>
@@ -12958,7 +15063,47 @@
           <w:sz w:val="24"/>
           <w:szCs w:val="24"/>
         </w:rPr>
-        <w:t>Live report document (with edit history): [link]</w:t>
+        <w:t>Live report document (with edit history): [</w:t>
+      </w:r>
+      <w:hyperlink r:id="rId25" w:history="1">
+        <w:r>
+          <w:rPr>
+            <w:rStyle w:val="Hyperlink"/>
+            <w:rFonts w:ascii="Times New Roman" w:hAnsi="Times New Roman" w:cs="Times New Roman"/>
+            <w:sz w:val="24"/>
+            <w:szCs w:val="24"/>
+            <w:highlight w:val="yellow"/>
+          </w:rPr>
+          <w:t>li</w:t>
+        </w:r>
+        <w:r>
+          <w:rPr>
+            <w:rStyle w:val="Hyperlink"/>
+            <w:rFonts w:ascii="Times New Roman" w:hAnsi="Times New Roman" w:cs="Times New Roman"/>
+            <w:sz w:val="24"/>
+            <w:szCs w:val="24"/>
+            <w:highlight w:val="yellow"/>
+          </w:rPr>
+          <w:t>n</w:t>
+        </w:r>
+        <w:r>
+          <w:rPr>
+            <w:rStyle w:val="Hyperlink"/>
+            <w:rFonts w:ascii="Times New Roman" w:hAnsi="Times New Roman" w:cs="Times New Roman"/>
+            <w:sz w:val="24"/>
+            <w:szCs w:val="24"/>
+            <w:highlight w:val="yellow"/>
+          </w:rPr>
+          <w:t>k</w:t>
+        </w:r>
+      </w:hyperlink>
+      <w:r>
+        <w:rPr>
+          <w:rFonts w:ascii="Times New Roman" w:hAnsi="Times New Roman" w:cs="Times New Roman"/>
+          <w:sz w:val="24"/>
+          <w:szCs w:val="24"/>
+        </w:rPr>
+        <w:t>]</w:t>
       </w:r>
     </w:p>
     <w:p>
@@ -12980,7 +15125,47 @@
           <w:sz w:val="24"/>
           <w:szCs w:val="24"/>
         </w:rPr>
-        <w:t>GitHub/GitLab repository (with commit history): [link]</w:t>
+        <w:t>GitHub/GitLab repository (with commit history): [</w:t>
+      </w:r>
+      <w:hyperlink r:id="rId26" w:history="1">
+        <w:r>
+          <w:rPr>
+            <w:rStyle w:val="Hyperlink"/>
+            <w:rFonts w:ascii="Times New Roman" w:hAnsi="Times New Roman" w:cs="Times New Roman"/>
+            <w:sz w:val="24"/>
+            <w:szCs w:val="24"/>
+            <w:highlight w:val="yellow"/>
+          </w:rPr>
+          <w:t>li</w:t>
+        </w:r>
+        <w:r>
+          <w:rPr>
+            <w:rStyle w:val="Hyperlink"/>
+            <w:rFonts w:ascii="Times New Roman" w:hAnsi="Times New Roman" w:cs="Times New Roman"/>
+            <w:sz w:val="24"/>
+            <w:szCs w:val="24"/>
+            <w:highlight w:val="yellow"/>
+          </w:rPr>
+          <w:t>n</w:t>
+        </w:r>
+        <w:r>
+          <w:rPr>
+            <w:rStyle w:val="Hyperlink"/>
+            <w:rFonts w:ascii="Times New Roman" w:hAnsi="Times New Roman" w:cs="Times New Roman"/>
+            <w:sz w:val="24"/>
+            <w:szCs w:val="24"/>
+            <w:highlight w:val="yellow"/>
+          </w:rPr>
+          <w:t>k</w:t>
+        </w:r>
+      </w:hyperlink>
+      <w:r>
+        <w:rPr>
+          <w:rFonts w:ascii="Times New Roman" w:hAnsi="Times New Roman" w:cs="Times New Roman"/>
+          <w:sz w:val="24"/>
+          <w:szCs w:val="24"/>
+        </w:rPr>
+        <w:t>]</w:t>
       </w:r>
     </w:p>
     <w:p>
@@ -13002,7 +15187,25 @@
           <w:sz w:val="24"/>
           <w:szCs w:val="24"/>
         </w:rPr>
-        <w:t>Google Colab notebook (if applicable): [link]</w:t>
+        <w:t xml:space="preserve">Google </w:t>
+      </w:r>
+      <w:proofErr w:type="spellStart"/>
+      <w:r>
+        <w:rPr>
+          <w:rFonts w:ascii="Times New Roman" w:hAnsi="Times New Roman" w:cs="Times New Roman"/>
+          <w:sz w:val="24"/>
+          <w:szCs w:val="24"/>
+        </w:rPr>
+        <w:t>Colab</w:t>
+      </w:r>
+      <w:proofErr w:type="spellEnd"/>
+      <w:r>
+        <w:rPr>
+          <w:rFonts w:ascii="Times New Roman" w:hAnsi="Times New Roman" w:cs="Times New Roman"/>
+          <w:sz w:val="24"/>
+          <w:szCs w:val="24"/>
+        </w:rPr>
+        <w:t xml:space="preserve"> notebook (if applicable): [link]</w:t>
       </w:r>
     </w:p>
     <w:p>
@@ -13035,7 +15238,7 @@
       </w:pPr>
     </w:p>
     <w:sectPr>
-      <w:headerReference w:type="default" r:id="rId24"/>
+      <w:headerReference w:type="default" r:id="rId27"/>
       <w:pgSz w:w="12240" w:h="15840" w:code="1"/>
       <w:pgMar w:top="1080" w:right="720" w:bottom="1800" w:left="3096" w:header="1080" w:footer="720" w:gutter="0"/>
       <w:pgNumType w:start="1"/>
@@ -13957,7 +16160,7 @@
             <w:rPr>
               <w:noProof/>
             </w:rPr>
-            <w:instrText>Task 1 – Database Design (6 Marks)</w:instrText>
+            <w:instrText>Deliverables</w:instrText>
           </w:r>
           <w:r>
             <w:rPr>
@@ -13990,7 +16193,7 @@
             <w:rPr>
               <w:noProof/>
             </w:rPr>
-            <w:instrText>Task 1 – Database Design (6 Marks)</w:instrText>
+            <w:instrText>Deliverables</w:instrText>
           </w:r>
           <w:r>
             <w:rPr>
@@ -14008,7 +16211,7 @@
             <w:rPr>
               <w:noProof/>
             </w:rPr>
-            <w:t xml:space="preserve">Task 1 – Database Design (6 Marks) </w:t>
+            <w:t xml:space="preserve">Deliverables </w:t>
           </w:r>
           <w:r>
             <w:fldChar w:fldCharType="end"/>
@@ -19042,6 +21245,18 @@
       <w:lang w:eastAsia="en-US"/>
     </w:rPr>
   </w:style>
+  <w:style w:type="character" w:styleId="FollowedHyperlink">
+    <w:name w:val="FollowedHyperlink"/>
+    <w:basedOn w:val="DefaultParagraphFont"/>
+    <w:uiPriority w:val="99"/>
+    <w:semiHidden/>
+    <w:unhideWhenUsed/>
+    <w:rsid w:val="0002366C"/>
+    <w:rPr>
+      <w:color w:val="919191" w:themeColor="followedHyperlink"/>
+      <w:u w:val="single"/>
+    </w:rPr>
+  </w:style>
 </w:styles>
 </file>
 
@@ -19328,6 +21543,7 @@
     <w:rsid w:val="00B4602D"/>
     <w:rsid w:val="00B833D3"/>
     <w:rsid w:val="00BC2CBC"/>
+    <w:rsid w:val="00BF0291"/>
     <w:rsid w:val="00BF275B"/>
     <w:rsid w:val="00C346F5"/>
     <w:rsid w:val="00C40158"/>

</xml_diff>